<commit_message>
Started rewriting chapter 1
</commit_message>
<xml_diff>
--- a/Diplom_Main.docx
+++ b/Diplom_Main.docx
@@ -4786,10 +4786,16 @@
           <w:numId w:val="2"/>
         </w:numPr>
         <w:jc w:val="left"/>
+        <w:rPr>
+          <w:lang w:val="en-US"/>
+        </w:rPr>
       </w:pPr>
       <w:bookmarkStart w:id="3" w:name="_Toc198558759"/>
       <w:r>
-        <w:t xml:space="preserve">Анализ схемы работы и схемы взаимодействия с эмбоссером </w:t>
+        <w:t>Анализ</w:t>
+      </w:r>
+      <w:r>
+        <w:t xml:space="preserve"> эмбоссера </w:t>
       </w:r>
       <w:r>
         <w:rPr>
@@ -4800,6 +4806,14 @@
       <w:bookmarkEnd w:id="3"/>
     </w:p>
     <w:p>
+      <w:r>
+        <w:t xml:space="preserve">Прежде чем приступать к планированию и разработке любых проектных решений необходимо досконально проанализировать компоненты эмбоссера, с которыми и посредством которых необходимо будет взаимодействовать с ним. Анализ является необходимой частью, с которой начинается любое исследование, разработка и любая другая большая работа. Это вдвойне справедливо при осуществлении работы с любыми сложными механическими комплексами, такими как, например, эмбоссер, ведь необходимо проанализировать все методы взаимодействия с этим комплексом, порядок работы с ним, его составляющие и т.д. для </w:t>
+      </w:r>
+      <w:r>
+        <w:t xml:space="preserve">того, чтобы не упустить любые важные детали, которые могут пригодится в дальнейшей разработке. </w:t>
+      </w:r>
+    </w:p>
+    <w:p>
       <w:pPr>
         <w:pStyle w:val="Heading3"/>
       </w:pPr>
@@ -4814,8 +4828,192 @@
         <w:ind w:firstLine="420"/>
       </w:pPr>
       <w:r>
-        <w:t>Перед тем как описывать непосредственно схему работы эмбоссера, необходимо дать краткое введение в суть процесса эмбоссирования. Следует подчеркнуть, что это механический процесс, в ходе которого на пластиковой карте создается рельефное изображение – выступы или углубления, формирующие текст, цифры или символы. Этот процесс, в отличие от печати, обеспечивает тактильную идентификацию карты и защиту от подделок.</w:t>
-      </w:r>
+        <w:t xml:space="preserve">Перед тем как </w:t>
+      </w:r>
+      <w:r>
+        <w:t>приступать к анализу такого современного технического комплекса, как эмбоссер, необходимо рассмотреть</w:t>
+      </w:r>
+      <w:r>
+        <w:t xml:space="preserve"> его в </w:t>
+      </w:r>
+      <w:r>
+        <w:t>историческ</w:t>
+      </w:r>
+      <w:r>
+        <w:t>ом</w:t>
+      </w:r>
+      <w:r>
+        <w:t xml:space="preserve"> контекст</w:t>
+      </w:r>
+      <w:r>
+        <w:t xml:space="preserve">е для понимания тех </w:t>
+      </w:r>
+      <w:r>
+        <w:t>потребностей</w:t>
+      </w:r>
+      <w:r>
+        <w:t xml:space="preserve"> и процессов, которые привели к </w:t>
+      </w:r>
+      <w:r>
+        <w:t xml:space="preserve"> появлени</w:t>
+      </w:r>
+      <w:r>
+        <w:t>ю данного комплекса</w:t>
+      </w:r>
+      <w:r>
+        <w:t xml:space="preserve"> на свет в том виде, в котором мы</w:t>
+      </w:r>
+      <w:r>
+        <w:t xml:space="preserve"> можем наблюдать его на сегодняшний день.</w:t>
+      </w:r>
+    </w:p>
+    <w:p>
+      <w:pPr>
+        <w:ind w:firstLine="420"/>
+      </w:pPr>
+      <w:r>
+        <w:t>Начнем издалека, когда такого понятия как эмбоссер еще не существовало и</w:t>
+      </w:r>
+      <w:r>
+        <w:t xml:space="preserve"> о платежных картах не было речи</w:t>
+      </w:r>
+      <w:r>
+        <w:t>.</w:t>
+      </w:r>
+      <w:r>
+        <w:t xml:space="preserve"> У истоков платежных карт стояли американские курьерские компании, которые с 1841 года осуществляли перевозки грузов, людей, а также денег и ценностей. </w:t>
+      </w:r>
+      <w:r>
+        <w:t xml:space="preserve">Таким образом осуществлялся перевод денег между банками на протяжении нескольких десятилетий. В определенный момент владельцы курьерских компаний осознали насколько небезопасно переводить деньги подобным образом, ведь повозки с деньгами и ценностями часто </w:t>
+      </w:r>
+      <w:r>
+        <w:t>подвергались грабежу. В те времена был изобретен телеграф, который навел</w:t>
+      </w:r>
+      <w:r>
+        <w:t xml:space="preserve"> на мысль</w:t>
+      </w:r>
+      <w:r>
+        <w:t xml:space="preserve"> компанию </w:t>
+      </w:r>
+      <w:r>
+        <w:rPr>
+          <w:lang w:val="en-US"/>
+        </w:rPr>
+        <w:t>Wells</w:t>
+      </w:r>
+      <w:r>
+        <w:t xml:space="preserve"> </w:t>
+      </w:r>
+      <w:r>
+        <w:rPr>
+          <w:lang w:val="en-US"/>
+        </w:rPr>
+        <w:t>Fargo</w:t>
+      </w:r>
+      <w:r>
+        <w:t xml:space="preserve">, </w:t>
+      </w:r>
+      <w:r>
+        <w:t xml:space="preserve">самую популярную на тот момент курьерскую компанию, </w:t>
+      </w:r>
+      <w:r>
+        <w:t>для</w:t>
+      </w:r>
+      <w:r>
+        <w:t xml:space="preserve"> осуществлени</w:t>
+      </w:r>
+      <w:r>
+        <w:t>я</w:t>
+      </w:r>
+      <w:r>
+        <w:t xml:space="preserve"> денежных переводов через него с 1864 года, ведь никто не сможет украсть деньги, которые идут по телеграфным линиям.</w:t>
+      </w:r>
+    </w:p>
+    <w:p>
+      <w:pPr>
+        <w:ind w:firstLine="420"/>
+      </w:pPr>
+      <w:r>
+        <w:t>В те времена изобретения и открытия стремительно меняли жизнь общества. Развитие науки и техники, активная миграция населения</w:t>
+      </w:r>
+      <w:r>
+        <w:t xml:space="preserve">, переезды в поисках работы и развитие торговли обусловили появление платежных карт, дорожных чеков и почтовых переводов. Дорожные чеки </w:t>
+      </w:r>
+      <w:r>
+        <w:t>являются</w:t>
+      </w:r>
+      <w:r>
+        <w:t xml:space="preserve"> прародителями платежных карт и были великим изобретением для своего времени. </w:t>
+      </w:r>
+      <w:r>
+        <w:t xml:space="preserve"> </w:t>
+      </w:r>
+      <w:r>
+        <w:t>Изобретателем чеков является Томас Кук, основатель и владелец одноименного бюро путешествий в Лондоне. В 1868 году он начал продавать своим клиентам купоны для рассчетов в гостинницах Европы (</w:t>
+      </w:r>
+      <w:r>
+        <w:rPr>
+          <w:lang w:val="en-US"/>
+        </w:rPr>
+        <w:t>Hotel</w:t>
+      </w:r>
+      <w:r>
+        <w:t xml:space="preserve"> </w:t>
+      </w:r>
+      <w:r>
+        <w:rPr>
+          <w:lang w:val="en-US"/>
+        </w:rPr>
+        <w:t>Coupons</w:t>
+      </w:r>
+      <w:r>
+        <w:t>)</w:t>
+      </w:r>
+      <w:r>
+        <w:t xml:space="preserve">. </w:t>
+      </w:r>
+      <w:r>
+        <w:t xml:space="preserve">Через шесть лет, в 1874 году их заменили циркулярные аккредитивные письма </w:t>
+      </w:r>
+      <w:r>
+        <w:lastRenderedPageBreak/>
+        <w:t>(</w:t>
+      </w:r>
+      <w:r>
+        <w:rPr>
+          <w:lang w:val="en-US"/>
+        </w:rPr>
+        <w:t>Circular</w:t>
+      </w:r>
+      <w:r>
+        <w:t xml:space="preserve"> </w:t>
+      </w:r>
+      <w:r>
+        <w:rPr>
+          <w:lang w:val="en-US"/>
+        </w:rPr>
+        <w:t>Notes</w:t>
+      </w:r>
+      <w:r>
+        <w:t xml:space="preserve">), </w:t>
+      </w:r>
+      <w:r>
+        <w:t>которые служили как для оплаты</w:t>
+      </w:r>
+      <w:r>
+        <w:t xml:space="preserve">, так и для получения наличных в местной валюте в партнерских банках и гостиничных обменных пунктах. </w:t>
+      </w:r>
+      <w:r>
+        <w:t>Транспортная и курьерская компания American Express ввела дорожные чеки в 1891 г. Это случилось после того, как ее основатель Джеймс Фарго в 1890 г. отправился путешествовать по Европе и столкнулся с трудностями при получении наличных по своим американским банковским аккредитивам. Поскольку тогда многие американцы ездили в Европу, он поручил своему специалисту Марселлусу Берри разработать бланк дорожного чека. 7 июля 1891 г. Берри получил патент на новую услугу, которую назвал дорожным чеком (travellers cheque).</w:t>
+      </w:r>
+      <w:r>
+        <w:t xml:space="preserve"> Все такие чеки и циркуляры были выполнены из бумаги или картона и данные клиента или писались на них чернилами или же выдавливались тиснением.</w:t>
+      </w:r>
+    </w:p>
+    <w:p>
+      <w:pPr>
+        <w:ind w:firstLine="420"/>
+      </w:pPr>
     </w:p>
     <w:p>
       <w:pPr>
@@ -4885,6 +5083,7 @@
         <w:ind w:firstLine="426"/>
       </w:pPr>
       <w:r>
+        <w:lastRenderedPageBreak/>
         <w:t xml:space="preserve">Для выяснения схемы взаимодействия эмбоссера </w:t>
       </w:r>
       <w:r>
@@ -4897,11 +5096,7 @@
         <w:t xml:space="preserve"> </w:t>
       </w:r>
       <w:r>
-        <w:t xml:space="preserve">с управляющим приложением, а также выяснения схемы и алгоритма его работы </w:t>
-      </w:r>
-      <w:r>
-        <w:lastRenderedPageBreak/>
-        <w:t>использовалась внутренняя документация компании</w:t>
+        <w:t>с управляющим приложением, а также выяснения схемы и алгоритма его работы использовалась внутренняя документация компании</w:t>
       </w:r>
       <w:r>
         <w:t>-производителя</w:t>
@@ -5169,6 +5364,7 @@
         <w:ind w:firstLine="426"/>
       </w:pPr>
       <w:r>
+        <w:lastRenderedPageBreak/>
         <w:t xml:space="preserve">Схема взаимодействия эмбоссера с ПО, предоставляемым команией </w:t>
       </w:r>
       <w:r>
@@ -5207,187 +5403,186 @@
       </w:pPr>
       <w:bookmarkStart w:id="5" w:name="_Toc198558761"/>
       <w:r>
+        <w:t>1.</w:t>
+      </w:r>
+      <w:r>
+        <w:t>2</w:t>
+      </w:r>
+      <w:r>
+        <w:t xml:space="preserve"> </w:t>
+      </w:r>
+      <w:r>
+        <w:t>Изучение программной платформы</w:t>
+      </w:r>
+      <w:r>
+        <w:t xml:space="preserve"> и поддерживаемого приложения</w:t>
+      </w:r>
+      <w:bookmarkEnd w:id="5"/>
+    </w:p>
+    <w:p>
+      <w:pPr>
+        <w:ind w:firstLine="426"/>
+      </w:pPr>
+      <w:r>
+        <w:t>В первой части данной главы были рассмотрены теоретические основы процесса эмбоссирования и подробно описана схема работы эмбоссера. Мы определили ключевые механизмы и этапы, которые необходимо учитывать при разработке программного обеспечения для управления данным оборудованием. Теперь, когда мы имеем четкое представление о физических принципах работы эмбоссера, нам необходимо перейти к анализу существующего программного обеспечения, используемого для управления этими устройствами.</w:t>
+      </w:r>
+    </w:p>
+    <w:p>
+      <w:pPr>
+        <w:ind w:firstLine="426"/>
+      </w:pPr>
+      <w:r>
+        <w:t>Как правило, эмбоссеры не работают автономно и требуют программного обеспечения, которое выполняет роль посредника между пользовательским интерфейсом (например, банковской системой) и самим оборудованием. Такое программное обеспечение обычно представлено в виде драйвера, который обеспечивает необходимый интерфейс для взаимодействия с аппаратным обеспечением. Существующие драйверы могут быть разработаны производителями эмбоссеров или сторонними компаниями, и они могут отличаться по архитектуре, функциональности и производительности.</w:t>
+      </w:r>
+    </w:p>
+    <w:p>
+      <w:pPr>
+        <w:ind w:firstLine="426"/>
+      </w:pPr>
+      <w:r>
+        <w:t xml:space="preserve">Итальянская компания </w:t>
+      </w:r>
+      <w:r>
+        <w:rPr>
+          <w:lang w:val="en-US"/>
+        </w:rPr>
+        <w:t>MATICA</w:t>
+      </w:r>
+      <w:r>
+        <w:t xml:space="preserve"> поставляет драйверы и приложения для управления в комплекте с эмбоссерами, но компания «</w:t>
+      </w:r>
+      <w:r>
+        <w:rPr>
+          <w:lang w:val="en-US"/>
+        </w:rPr>
+        <w:t>Compass</w:t>
+      </w:r>
+      <w:r>
+        <w:t xml:space="preserve"> </w:t>
+      </w:r>
+      <w:r>
+        <w:rPr>
+          <w:lang w:val="en-US"/>
+        </w:rPr>
+        <w:t>Plus</w:t>
+      </w:r>
+      <w:r>
+        <w:t>»</w:t>
+      </w:r>
+      <w:r>
+        <w:t xml:space="preserve"> </w:t>
+      </w:r>
+      <w:r>
+        <w:t xml:space="preserve">имеет собственное приложение, осуществляющее работу с эмбоссером. Нас интересует драйвер, ранее разработанный </w:t>
+      </w:r>
+      <w:r>
+        <w:t xml:space="preserve">бюро продуктов персонализации внутри компании. Данный драйвер был разработан </w:t>
+      </w:r>
+      <w:r>
+        <w:t xml:space="preserve">как часть модуля </w:t>
+      </w:r>
+      <w:r>
+        <w:rPr>
+          <w:lang w:val="en-US"/>
+        </w:rPr>
+        <w:t>Embosser</w:t>
+      </w:r>
+      <w:r>
+        <w:t xml:space="preserve"> </w:t>
+      </w:r>
+      <w:r>
+        <w:rPr>
+          <w:lang w:val="en-US"/>
+        </w:rPr>
+        <w:t>Driver</w:t>
+      </w:r>
+      <w:r>
+        <w:t xml:space="preserve"> </w:t>
+      </w:r>
+      <w:r>
+        <w:t xml:space="preserve">приложения </w:t>
+      </w:r>
+      <w:proofErr w:type="spellStart"/>
+      <w:r>
+        <w:rPr>
+          <w:lang w:val="en-US"/>
+        </w:rPr>
+        <w:t>TranzWare</w:t>
+      </w:r>
+      <w:proofErr w:type="spellEnd"/>
+      <w:r>
+        <w:t xml:space="preserve"> </w:t>
+      </w:r>
+      <w:proofErr w:type="spellStart"/>
+      <w:r>
+        <w:rPr>
+          <w:lang w:val="en-US"/>
+        </w:rPr>
+        <w:t>CardFactory</w:t>
+      </w:r>
+      <w:proofErr w:type="spellEnd"/>
+      <w:r>
+        <w:t xml:space="preserve">. Данное приложение </w:t>
+      </w:r>
+      <w:r>
+        <w:t>разработан</w:t>
+      </w:r>
+      <w:r>
+        <w:t>о</w:t>
+      </w:r>
+      <w:r>
+        <w:t xml:space="preserve"> на основе программной платформы </w:t>
+      </w:r>
+      <w:proofErr w:type="spellStart"/>
+      <w:r>
+        <w:rPr>
+          <w:lang w:val="en-US"/>
+        </w:rPr>
+        <w:t>FloraWare</w:t>
+      </w:r>
+      <w:proofErr w:type="spellEnd"/>
+      <w:r>
+        <w:t xml:space="preserve">, </w:t>
+      </w:r>
+      <w:r>
+        <w:t>которая предоставляет широкие возможности для разработки программных продуктов разной сложности.</w:t>
+      </w:r>
+    </w:p>
+    <w:p>
+      <w:pPr>
+        <w:ind w:firstLine="426"/>
+      </w:pPr>
+      <w:r>
+        <w:t xml:space="preserve">Чтобы ясно понять технологическую составляющую работы, обратим свое внимание на центральное ПО, на основе которого будет проводится вся дальнейшая разработка – программная платформа </w:t>
+      </w:r>
+      <w:proofErr w:type="spellStart"/>
+      <w:r>
+        <w:rPr>
+          <w:lang w:val="en-US"/>
+        </w:rPr>
+        <w:t>FloraWare</w:t>
+      </w:r>
+      <w:proofErr w:type="spellEnd"/>
+      <w:r>
+        <w:t>.</w:t>
+      </w:r>
+      <w:r>
+        <w:t xml:space="preserve"> </w:t>
+      </w:r>
+      <w:r>
+        <w:t>Вопрос стоит в надобности данной платформы, так как для разработки приложений могут использоваться и более распространенные и современные средства разработки.</w:t>
+      </w:r>
+    </w:p>
+    <w:p>
+      <w:pPr>
+        <w:ind w:firstLine="426"/>
+      </w:pPr>
+      <w:r>
+        <w:t xml:space="preserve">Попытки создания полноценной объектной машины и замены текстового представления программы предпринимались неоднократно, однако все они ограничивались полумерами. Это можно объяснить несколькими причинами. Технология, меняющая что-то кардинально, требует отбрасывания </w:t>
+      </w:r>
+      <w:r>
         <w:lastRenderedPageBreak/>
-        <w:t>1.</w:t>
-      </w:r>
-      <w:r>
-        <w:t>2</w:t>
-      </w:r>
-      <w:r>
-        <w:t xml:space="preserve"> </w:t>
-      </w:r>
-      <w:r>
-        <w:t>Изучение программной платформы</w:t>
-      </w:r>
-      <w:r>
-        <w:t xml:space="preserve"> и поддерживаемого приложения</w:t>
-      </w:r>
-      <w:bookmarkEnd w:id="5"/>
-    </w:p>
-    <w:p>
-      <w:pPr>
-        <w:ind w:firstLine="426"/>
-      </w:pPr>
-      <w:r>
-        <w:t>В первой части данной главы были рассмотрены теоретические основы процесса эмбоссирования и подробно описана схема работы эмбоссера. Мы определили ключевые механизмы и этапы, которые необходимо учитывать при разработке программного обеспечения для управления данным оборудованием. Теперь, когда мы имеем четкое представление о физических принципах работы эмбоссера, нам необходимо перейти к анализу существующего программного обеспечения, используемого для управления этими устройствами.</w:t>
-      </w:r>
-    </w:p>
-    <w:p>
-      <w:pPr>
-        <w:ind w:firstLine="426"/>
-      </w:pPr>
-      <w:r>
-        <w:t>Как правило, эмбоссеры не работают автономно и требуют программного обеспечения, которое выполняет роль посредника между пользовательским интерфейсом (например, банковской системой) и самим оборудованием. Такое программное обеспечение обычно представлено в виде драйвера, который обеспечивает необходимый интерфейс для взаимодействия с аппаратным обеспечением. Существующие драйверы могут быть разработаны производителями эмбоссеров или сторонними компаниями, и они могут отличаться по архитектуре, функциональности и производительности.</w:t>
-      </w:r>
-    </w:p>
-    <w:p>
-      <w:pPr>
-        <w:ind w:firstLine="426"/>
-      </w:pPr>
-      <w:r>
-        <w:t xml:space="preserve">Итальянская компания </w:t>
-      </w:r>
-      <w:r>
-        <w:rPr>
-          <w:lang w:val="en-US"/>
-        </w:rPr>
-        <w:t>MATICA</w:t>
-      </w:r>
-      <w:r>
-        <w:t xml:space="preserve"> поставляет драйверы и приложения для управления в комплекте с эмбоссерами, но компания «</w:t>
-      </w:r>
-      <w:r>
-        <w:rPr>
-          <w:lang w:val="en-US"/>
-        </w:rPr>
-        <w:t>Compass</w:t>
-      </w:r>
-      <w:r>
-        <w:t xml:space="preserve"> </w:t>
-      </w:r>
-      <w:r>
-        <w:rPr>
-          <w:lang w:val="en-US"/>
-        </w:rPr>
-        <w:t>Plus</w:t>
-      </w:r>
-      <w:r>
-        <w:t>»</w:t>
-      </w:r>
-      <w:r>
-        <w:t xml:space="preserve"> </w:t>
-      </w:r>
-      <w:r>
-        <w:t xml:space="preserve">имеет собственное приложение, осуществляющее работу с эмбоссером. Нас интересует драйвер, ранее разработанный </w:t>
-      </w:r>
-      <w:r>
-        <w:t xml:space="preserve">бюро продуктов персонализации внутри компании. Данный драйвер был разработан </w:t>
-      </w:r>
-      <w:r>
-        <w:t xml:space="preserve">как часть модуля </w:t>
-      </w:r>
-      <w:r>
-        <w:rPr>
-          <w:lang w:val="en-US"/>
-        </w:rPr>
-        <w:t>Embosser</w:t>
-      </w:r>
-      <w:r>
-        <w:t xml:space="preserve"> </w:t>
-      </w:r>
-      <w:r>
-        <w:rPr>
-          <w:lang w:val="en-US"/>
-        </w:rPr>
-        <w:t>Driver</w:t>
-      </w:r>
-      <w:r>
-        <w:t xml:space="preserve"> </w:t>
-      </w:r>
-      <w:r>
-        <w:t xml:space="preserve">приложения </w:t>
-      </w:r>
-      <w:proofErr w:type="spellStart"/>
-      <w:r>
-        <w:rPr>
-          <w:lang w:val="en-US"/>
-        </w:rPr>
-        <w:t>TranzWare</w:t>
-      </w:r>
-      <w:proofErr w:type="spellEnd"/>
-      <w:r>
-        <w:t xml:space="preserve"> </w:t>
-      </w:r>
-      <w:proofErr w:type="spellStart"/>
-      <w:r>
-        <w:rPr>
-          <w:lang w:val="en-US"/>
-        </w:rPr>
-        <w:t>CardFactory</w:t>
-      </w:r>
-      <w:proofErr w:type="spellEnd"/>
-      <w:r>
-        <w:t xml:space="preserve">. Данное приложение </w:t>
-      </w:r>
-      <w:r>
-        <w:t>разработан</w:t>
-      </w:r>
-      <w:r>
-        <w:t>о</w:t>
-      </w:r>
-      <w:r>
-        <w:t xml:space="preserve"> на основе программной платформы </w:t>
-      </w:r>
-      <w:proofErr w:type="spellStart"/>
-      <w:r>
-        <w:rPr>
-          <w:lang w:val="en-US"/>
-        </w:rPr>
-        <w:t>FloraWare</w:t>
-      </w:r>
-      <w:proofErr w:type="spellEnd"/>
-      <w:r>
-        <w:t xml:space="preserve">, </w:t>
-      </w:r>
-      <w:r>
-        <w:t>которая предоставляет широкие возможности для разработки программных продуктов разной сложности.</w:t>
-      </w:r>
-    </w:p>
-    <w:p>
-      <w:pPr>
-        <w:ind w:firstLine="426"/>
-      </w:pPr>
-      <w:r>
-        <w:t xml:space="preserve">Чтобы ясно понять технологическую составляющую работы, обратим свое внимание на центральное ПО, на основе которого будет проводится вся дальнейшая разработка – программная платформа </w:t>
-      </w:r>
-      <w:proofErr w:type="spellStart"/>
-      <w:r>
-        <w:rPr>
-          <w:lang w:val="en-US"/>
-        </w:rPr>
-        <w:t>FloraWare</w:t>
-      </w:r>
-      <w:proofErr w:type="spellEnd"/>
-      <w:r>
-        <w:t>.</w:t>
-      </w:r>
-      <w:r>
-        <w:t xml:space="preserve"> </w:t>
-      </w:r>
-      <w:r>
-        <w:t>Вопрос стоит в надобности данной платформы, так как для разработки приложений могут использоваться и более распространенные и современные средства разработки.</w:t>
-      </w:r>
-    </w:p>
-    <w:p>
-      <w:pPr>
-        <w:ind w:firstLine="426"/>
-      </w:pPr>
-      <w:r>
-        <w:t xml:space="preserve">Попытки создания полноценной объектной машины и замены текстового представления программы предпринимались неоднократно, однако все они ограничивались полумерами. Это можно объяснить несколькими причинами. Технология, меняющая что-то кардинально, требует отбрасывания существующих программных компонентов, созданных по другим технологиям. Поэтому она обязана предложить весь спектр инструментальных средств, либо как запасной вариант, предоставить инструменты поддержки других технологий, и то и другое требует больших усилий. С другой стороны </w:t>
-      </w:r>
-      <w:r>
-        <w:lastRenderedPageBreak/>
-        <w:t>ОО языки программирования создавались с учетом универсальности объектов и полного контроля над ними со стороны пользовательской программы. Даже если технология предполагает наличие некой виртуальной машины, назвать ее объектной можно только с большой натяжкой, на откуп ей в лучшем случае отдается сборка мусора. Тогда как наибольшие преимущества объектной машины сказываются при максимальном ее контроле над объектами. Попытки заменить текстовое представление алгоритма, в большинстве случаев, сводятся к генерации текста части программы на основе ее графического представления с последующей трансляцией, интересным же является полное исключение теста программы. Избавиться от перечисленных недостатков можно, отказавшись от архитектуры машины с потоком команд и линейной памятью, и перейдя к архитектуре с древовидной объектной памятью, с управлением объектами собственно объектной машиной.</w:t>
+        <w:t>существующих программных компонентов, созданных по другим технологиям. Поэтому она обязана предложить весь спектр инструментальных средств, либо как запасной вариант, предоставить инструменты поддержки других технологий, и то и другое требует больших усилий. С другой стороны ОО языки программирования создавались с учетом универсальности объектов и полного контроля над ними со стороны пользовательской программы. Даже если технология предполагает наличие некой виртуальной машины, назвать ее объектной можно только с большой натяжкой, на откуп ей в лучшем случае отдается сборка мусора. Тогда как наибольшие преимущества объектной машины сказываются при максимальном ее контроле над объектами. Попытки заменить текстовое представление алгоритма, в большинстве случаев, сводятся к генерации текста части программы на основе ее графического представления с последующей трансляцией, интересным же является полное исключение теста программы. Избавиться от перечисленных недостатков можно, отказавшись от архитектуры машины с потоком команд и линейной памятью, и перейдя к архитектуре с древовидной объектной памятью, с управлением объектами собственно объектной машиной.</w:t>
       </w:r>
     </w:p>
     <w:p>
@@ -5519,7 +5714,11 @@
         <w:t>корневой контейнер</w:t>
       </w:r>
       <w:r>
-        <w:t>, в который по мере необходимости добавляются другие объекты, реализует память объектной машины представляющую собой дерево, в котором находятся все объекты, существующие в данный момент времени. Добавление всем объектам выделенного строкового свойства </w:t>
+        <w:t xml:space="preserve">, в который по мере необходимости добавляются другие объекты, реализует память объектной машины представляющую собой дерево, в котором находятся все объекты, существующие в данный момент </w:t>
+      </w:r>
+      <w:r>
+        <w:lastRenderedPageBreak/>
+        <w:t>времени. Добавление всем объектам выделенного строкового свойства </w:t>
       </w:r>
       <w:r>
         <w:rPr>
@@ -5549,11 +5748,7 @@
         <w:t>Ссылка на объект</w:t>
       </w:r>
       <w:r>
-        <w:t xml:space="preserve">, состоящее из относительного пути до объекта и указателя на объект, дает </w:t>
-      </w:r>
-      <w:r>
-        <w:lastRenderedPageBreak/>
-        <w:t>возможность организовывать сколь угодно сложные связи между объектами. Таким образом, древовидная структура данных является основой реализации отношения </w:t>
+        <w:t>, состоящее из относительного пути до объекта и указателя на объект, дает возможность организовывать сколь угодно сложные связи между объектами. Таким образом, древовидная структура данных является основой реализации отношения </w:t>
       </w:r>
       <w:r>
         <w:rPr>
@@ -5782,7 +5977,11 @@
         <w:t xml:space="preserve">, </w:t>
       </w:r>
       <w:r>
-        <w:t xml:space="preserve">которая и осуществит  общение с эмбоссером и эмбоссирует карту как это было настроено внутри приложения. Во время эмбоссирования будут последовательно запускаться функции </w:t>
+        <w:t xml:space="preserve">которая и осуществит  общение с </w:t>
+      </w:r>
+      <w:r>
+        <w:lastRenderedPageBreak/>
+        <w:t xml:space="preserve">эмбоссером и эмбоссирует карту как это было настроено внутри приложения. Во время эмбоссирования будут последовательно запускаться функции </w:t>
       </w:r>
       <w:r>
         <w:rPr>
@@ -5815,264 +6014,264 @@
       </w:pPr>
       <w:bookmarkStart w:id="6" w:name="_Toc198558762"/>
       <w:r>
+        <w:t>1.3 Анализ существующего драйвера</w:t>
+      </w:r>
+      <w:bookmarkEnd w:id="6"/>
+    </w:p>
+    <w:p>
+      <w:pPr>
+        <w:ind w:firstLine="426"/>
+      </w:pPr>
+      <w:r>
+        <w:t>Подробное изучение программной платфофрмы и построенного на нем приложения поможет лучше понять уже разработанны</w:t>
+      </w:r>
+      <w:r>
+        <w:t>е</w:t>
+      </w:r>
+      <w:r>
+        <w:t xml:space="preserve"> драйве</w:t>
+      </w:r>
+      <w:r>
+        <w:t>ры для работы с эмбоссерами других производителей</w:t>
+      </w:r>
+      <w:r>
+        <w:t>. Анализ данн</w:t>
+      </w:r>
+      <w:r>
+        <w:t>ых</w:t>
+      </w:r>
+      <w:r>
+        <w:t xml:space="preserve"> драйвер</w:t>
+      </w:r>
+      <w:r>
+        <w:t>ов</w:t>
+      </w:r>
+      <w:r>
+        <w:t xml:space="preserve"> поможет лучше понять возмо</w:t>
+      </w:r>
+      <w:r>
+        <w:t xml:space="preserve">жности для разработки подобных драйверов, а также </w:t>
+      </w:r>
+      <w:r>
+        <w:t>понять как строится структура любого драйвера для взаимодействия с эмбоссерами.</w:t>
+      </w:r>
+    </w:p>
+    <w:p>
+      <w:pPr>
+        <w:ind w:firstLine="426"/>
+      </w:pPr>
+      <w:r>
+        <w:t>Изучая разработанный на платформ</w:t>
+      </w:r>
+      <w:r>
+        <w:t>е</w:t>
+      </w:r>
+      <w:r>
+        <w:t xml:space="preserve"> </w:t>
+      </w:r>
+      <w:proofErr w:type="spellStart"/>
+      <w:r>
+        <w:rPr>
+          <w:lang w:val="en-US"/>
+        </w:rPr>
+        <w:t>FloraWare</w:t>
+      </w:r>
+      <w:proofErr w:type="spellEnd"/>
+      <w:r>
+        <w:t xml:space="preserve"> </w:t>
+      </w:r>
+      <w:r>
+        <w:t>драйвер для работы с эмбоссер</w:t>
+      </w:r>
+      <w:r>
+        <w:t>ом «Вставьте название здесь»</w:t>
+      </w:r>
+      <w:r>
+        <w:t xml:space="preserve">, а также руководствуясь внутренней документацией компании по языку программирования </w:t>
+      </w:r>
+      <w:r>
+        <w:rPr>
+          <w:lang w:val="en-US"/>
+        </w:rPr>
+        <w:t>F</w:t>
+      </w:r>
+      <w:r>
+        <w:t>++</w:t>
+      </w:r>
+      <w:r>
+        <w:t xml:space="preserve">, </w:t>
+      </w:r>
+      <w:r>
+        <w:t xml:space="preserve">являющемся основой разработки ПО на вышеупомянутой технологической платформе, внутри драйвера были определены все элементы работы с эмбоссером, представленные в предыдущей главе. Частью драйвера являются функции: отправки сообщений эмбоссеру, получения ответа от эмбоссера, логирования выполненных действий, проверки подключения, получения информации о записываемой карте и т.д. Технологическая платформа </w:t>
+      </w:r>
+      <w:proofErr w:type="spellStart"/>
+      <w:r>
+        <w:rPr>
+          <w:lang w:val="en-US"/>
+        </w:rPr>
+        <w:t>FloraWare</w:t>
+      </w:r>
+      <w:proofErr w:type="spellEnd"/>
+      <w:r>
+        <w:t xml:space="preserve"> предоставляет все необходимые инструменты для реализации данных функций и обеспечения полноценной работы с эмбоссер</w:t>
+      </w:r>
+      <w:r>
+        <w:t>ами</w:t>
+      </w:r>
+      <w:r>
+        <w:t>.</w:t>
+      </w:r>
+    </w:p>
+    <w:p>
+      <w:pPr>
+        <w:ind w:firstLine="426"/>
+      </w:pPr>
+      <w:r>
+        <w:t xml:space="preserve">Данный драйвер является частью модуля </w:t>
+      </w:r>
+      <w:r>
+        <w:rPr>
+          <w:lang w:val="en-US"/>
+        </w:rPr>
+        <w:t>Chip</w:t>
+      </w:r>
+      <w:r>
+        <w:t xml:space="preserve"> </w:t>
+      </w:r>
+      <w:r>
+        <w:rPr>
+          <w:lang w:val="en-US"/>
+        </w:rPr>
+        <w:t>Writer</w:t>
+      </w:r>
+      <w:r>
+        <w:t xml:space="preserve"> </w:t>
+      </w:r>
+      <w:r>
+        <w:rPr>
+          <w:lang w:val="en-US"/>
+        </w:rPr>
+        <w:t>Driver</w:t>
+      </w:r>
+      <w:r>
+        <w:t xml:space="preserve"> </w:t>
+      </w:r>
+      <w:r>
+        <w:t>и реализует схему взаимодействия с эмбоссером, описанную в первой части данной главы.</w:t>
+      </w:r>
+      <w:r>
+        <w:t xml:space="preserve"> </w:t>
+      </w:r>
+      <w:r>
+        <w:t xml:space="preserve">Он отвечает за взаимодействия с эмбоссером на этапе персонализации карты. </w:t>
+      </w:r>
+      <w:r>
+        <w:t xml:space="preserve">Драйвер выступает в роли посредника, который осуществляет запись информации на физическую карту средствами специализированных драйверов для записи определенных типов карточных продуктов внутри </w:t>
+      </w:r>
+      <w:proofErr w:type="spellStart"/>
+      <w:r>
+        <w:rPr>
+          <w:lang w:val="en-US"/>
+        </w:rPr>
+        <w:t>TranzWare</w:t>
+      </w:r>
+      <w:proofErr w:type="spellEnd"/>
+      <w:r>
+        <w:t xml:space="preserve"> </w:t>
+      </w:r>
+      <w:proofErr w:type="spellStart"/>
+      <w:r>
+        <w:rPr>
+          <w:lang w:val="en-US"/>
+        </w:rPr>
+        <w:t>CardFactory</w:t>
+      </w:r>
+      <w:proofErr w:type="spellEnd"/>
+      <w:r>
+        <w:t>.</w:t>
+      </w:r>
+      <w:r>
+        <w:t xml:space="preserve"> Карточные драйвера предоставляют всю необходимую для записи на карту информацию и алгоритм записи этой информации, драйвер эмбоссера же является всего лишь интерфейсом взаимодействия, который предоставляет возможность </w:t>
+      </w:r>
+      <w:r>
+        <w:t>карточному драйверу установить связь с физической картой.</w:t>
+      </w:r>
+    </w:p>
+    <w:p>
+      <w:pPr>
+        <w:ind w:firstLine="426"/>
+      </w:pPr>
+      <w:r>
+        <w:t xml:space="preserve">Реализуемый драйвером эмбоссера интерфейс взаимодействия представляется двумя функциями </w:t>
+      </w:r>
+      <w:r>
+        <w:rPr>
+          <w:lang w:val="en-US"/>
+        </w:rPr>
+        <w:t>Send</w:t>
+      </w:r>
+      <w:r>
+        <w:t xml:space="preserve"> </w:t>
+      </w:r>
+      <w:r>
+        <w:t xml:space="preserve">и </w:t>
+      </w:r>
+      <w:r>
+        <w:rPr>
+          <w:lang w:val="en-US"/>
+        </w:rPr>
+        <w:t>Receive</w:t>
+      </w:r>
+      <w:r>
+        <w:t xml:space="preserve">, </w:t>
+      </w:r>
+      <w:r>
+        <w:t>которые реализуют отправку сообщений на карту и получения ответа с карты</w:t>
+      </w:r>
+      <w:r>
+        <w:t xml:space="preserve"> соответственно</w:t>
+      </w:r>
+      <w:r>
+        <w:t>. Во время персонализации карты, эти функции вызываются карточным драйвером и в функцию отправки при вызове передаются данные для отпраки на карту</w:t>
+      </w:r>
+      <w:r>
+        <w:t>, функция получения ответа же используется только для проверки положительного ответа об успешно завершенной операции записи с карты</w:t>
+      </w:r>
+      <w:r>
+        <w:t>.</w:t>
+      </w:r>
+    </w:p>
+    <w:p>
+      <w:pPr>
+        <w:ind w:firstLine="426"/>
+      </w:pPr>
+      <w:r>
         <w:lastRenderedPageBreak/>
-        <w:t>1.3 Анализ существующего драйвера</w:t>
-      </w:r>
-      <w:bookmarkEnd w:id="6"/>
-    </w:p>
-    <w:p>
-      <w:pPr>
-        <w:ind w:firstLine="426"/>
-      </w:pPr>
-      <w:r>
-        <w:t>Подробное изучение программной платфофрмы и построенного на нем приложения поможет лучше понять уже разработанны</w:t>
-      </w:r>
-      <w:r>
-        <w:t>е</w:t>
-      </w:r>
-      <w:r>
-        <w:t xml:space="preserve"> драйве</w:t>
-      </w:r>
-      <w:r>
-        <w:t>ры для работы с эмбоссерами других производителей</w:t>
-      </w:r>
-      <w:r>
-        <w:t>. Анализ данн</w:t>
-      </w:r>
-      <w:r>
-        <w:t>ых</w:t>
-      </w:r>
-      <w:r>
-        <w:t xml:space="preserve"> драйвер</w:t>
-      </w:r>
-      <w:r>
-        <w:t>ов</w:t>
-      </w:r>
-      <w:r>
-        <w:t xml:space="preserve"> поможет лучше понять возмо</w:t>
-      </w:r>
-      <w:r>
-        <w:t xml:space="preserve">жности для разработки подобных драйверов, а также </w:t>
-      </w:r>
-      <w:r>
-        <w:t>понять как строится структура любого драйвера для взаимодействия с эмбоссерами.</w:t>
-      </w:r>
-    </w:p>
-    <w:p>
-      <w:pPr>
-        <w:ind w:firstLine="426"/>
-      </w:pPr>
-      <w:r>
-        <w:t>Изучая разработанный на платформ</w:t>
-      </w:r>
-      <w:r>
-        <w:t>е</w:t>
-      </w:r>
-      <w:r>
-        <w:t xml:space="preserve"> </w:t>
+        <w:t xml:space="preserve">При запуске модуля обработки карты внутри </w:t>
       </w:r>
       <w:proofErr w:type="spellStart"/>
       <w:r>
         <w:rPr>
           <w:lang w:val="en-US"/>
         </w:rPr>
-        <w:t>FloraWare</w:t>
+        <w:t>TranzWare</w:t>
       </w:r>
       <w:proofErr w:type="spellEnd"/>
       <w:r>
         <w:t xml:space="preserve"> </w:t>
       </w:r>
-      <w:r>
-        <w:t>драйвер для работы с эмбоссер</w:t>
-      </w:r>
-      <w:r>
-        <w:t>ом «Вставьте название здесь»</w:t>
-      </w:r>
-      <w:r>
-        <w:t xml:space="preserve">, а также руководствуясь внутренней документацией компании по языку программирования </w:t>
-      </w:r>
-      <w:r>
-        <w:rPr>
-          <w:lang w:val="en-US"/>
-        </w:rPr>
-        <w:t>F</w:t>
-      </w:r>
-      <w:r>
-        <w:t>++</w:t>
-      </w:r>
+      <w:proofErr w:type="spellStart"/>
+      <w:r>
+        <w:rPr>
+          <w:lang w:val="en-US"/>
+        </w:rPr>
+        <w:t>CardFactory</w:t>
+      </w:r>
+      <w:proofErr w:type="spellEnd"/>
       <w:r>
         <w:t xml:space="preserve">, </w:t>
       </w:r>
       <w:r>
-        <w:t xml:space="preserve">являющемся основой разработки ПО на вышеупомянутой технологической платформе, внутри драйвера были определены все элементы работы с эмбоссером, представленные в предыдущей главе. Частью драйвера являются функции: отправки сообщений эмбоссеру, получения ответа от эмбоссера, логирования выполненных действий, проверки подключения, получения информации о записываемой карте и т.д. Технологическая платформа </w:t>
-      </w:r>
-      <w:proofErr w:type="spellStart"/>
-      <w:r>
-        <w:rPr>
-          <w:lang w:val="en-US"/>
-        </w:rPr>
-        <w:t>FloraWare</w:t>
-      </w:r>
-      <w:proofErr w:type="spellEnd"/>
-      <w:r>
-        <w:t xml:space="preserve"> предоставляет все необходимые инструменты для реализации данных функций и обеспечения полноценной работы с эмбоссер</w:t>
-      </w:r>
-      <w:r>
-        <w:t>ами</w:t>
-      </w:r>
-      <w:r>
-        <w:t>.</w:t>
-      </w:r>
-    </w:p>
-    <w:p>
-      <w:pPr>
-        <w:ind w:firstLine="426"/>
-      </w:pPr>
-      <w:r>
-        <w:t xml:space="preserve">Данный драйвер является частью модуля </w:t>
-      </w:r>
-      <w:r>
-        <w:rPr>
-          <w:lang w:val="en-US"/>
-        </w:rPr>
-        <w:t>Chip</w:t>
-      </w:r>
-      <w:r>
-        <w:t xml:space="preserve"> </w:t>
-      </w:r>
-      <w:r>
-        <w:rPr>
-          <w:lang w:val="en-US"/>
-        </w:rPr>
-        <w:t>Writer</w:t>
-      </w:r>
-      <w:r>
-        <w:t xml:space="preserve"> </w:t>
-      </w:r>
-      <w:r>
-        <w:rPr>
-          <w:lang w:val="en-US"/>
-        </w:rPr>
-        <w:t>Driver</w:t>
-      </w:r>
-      <w:r>
-        <w:t xml:space="preserve"> </w:t>
-      </w:r>
-      <w:r>
-        <w:t>и реализует схему взаимодействия с эмбоссером, описанную в первой части данной главы.</w:t>
-      </w:r>
-      <w:r>
-        <w:t xml:space="preserve"> </w:t>
-      </w:r>
-      <w:r>
-        <w:t xml:space="preserve">Он отвечает за взаимодействия с эмбоссером на этапе персонализации карты. </w:t>
-      </w:r>
-      <w:r>
-        <w:t xml:space="preserve">Драйвер выступает в роли посредника, который осуществляет запись информации на физическую карту средствами специализированных драйверов для записи определенных типов карточных продуктов внутри </w:t>
-      </w:r>
-      <w:proofErr w:type="spellStart"/>
-      <w:r>
-        <w:rPr>
-          <w:lang w:val="en-US"/>
-        </w:rPr>
-        <w:t>TranzWare</w:t>
-      </w:r>
-      <w:proofErr w:type="spellEnd"/>
-      <w:r>
-        <w:t xml:space="preserve"> </w:t>
-      </w:r>
-      <w:proofErr w:type="spellStart"/>
-      <w:r>
-        <w:rPr>
-          <w:lang w:val="en-US"/>
-        </w:rPr>
-        <w:t>CardFactory</w:t>
-      </w:r>
-      <w:proofErr w:type="spellEnd"/>
-      <w:r>
-        <w:t>.</w:t>
-      </w:r>
-      <w:r>
-        <w:t xml:space="preserve"> Карточные драйвера предоставляют всю необходимую для записи на карту информацию и алгоритм записи этой информации, драйвер эмбоссера же является всего лишь интерфейсом взаимодействия, который предоставляет возможность </w:t>
-      </w:r>
-      <w:r>
-        <w:t>карточному драйверу установить связь с физической картой.</w:t>
-      </w:r>
-    </w:p>
-    <w:p>
-      <w:pPr>
-        <w:ind w:firstLine="426"/>
-      </w:pPr>
-      <w:r>
-        <w:t xml:space="preserve">Реализуемый драйвером эмбоссера интерфейс взаимодействия представляется двумя функциями </w:t>
-      </w:r>
-      <w:r>
-        <w:rPr>
-          <w:lang w:val="en-US"/>
-        </w:rPr>
-        <w:t>Send</w:t>
-      </w:r>
-      <w:r>
-        <w:t xml:space="preserve"> </w:t>
-      </w:r>
-      <w:r>
-        <w:t xml:space="preserve">и </w:t>
-      </w:r>
-      <w:r>
-        <w:rPr>
-          <w:lang w:val="en-US"/>
-        </w:rPr>
-        <w:t>Receive</w:t>
-      </w:r>
-      <w:r>
-        <w:t xml:space="preserve">, </w:t>
-      </w:r>
-      <w:r>
-        <w:t>которые реализуют отправку сообщений на карту и получения ответа с карты</w:t>
-      </w:r>
-      <w:r>
-        <w:t xml:space="preserve"> соответственно</w:t>
-      </w:r>
-      <w:r>
-        <w:t>. Во время персонализации карты, эти функции вызываются карточным драйвером и в функцию отправки при вызове передаются данные для отпраки на карту</w:t>
-      </w:r>
-      <w:r>
-        <w:t>, функция получения ответа же используется только для проверки положительного ответа об успешно завершенной операции записи с карты</w:t>
-      </w:r>
-      <w:r>
-        <w:t>.</w:t>
-      </w:r>
-    </w:p>
-    <w:p>
-      <w:pPr>
-        <w:ind w:firstLine="426"/>
-      </w:pPr>
-      <w:r>
-        <w:t xml:space="preserve">При запуске модуля обработки карты внутри </w:t>
-      </w:r>
-      <w:proofErr w:type="spellStart"/>
-      <w:r>
-        <w:rPr>
-          <w:lang w:val="en-US"/>
-        </w:rPr>
-        <w:t>TranzWare</w:t>
-      </w:r>
-      <w:proofErr w:type="spellEnd"/>
-      <w:r>
-        <w:t xml:space="preserve"> </w:t>
-      </w:r>
-      <w:proofErr w:type="spellStart"/>
-      <w:r>
-        <w:rPr>
-          <w:lang w:val="en-US"/>
-        </w:rPr>
-        <w:t>CardFactory</w:t>
-      </w:r>
-      <w:proofErr w:type="spellEnd"/>
-      <w:r>
-        <w:t xml:space="preserve">, </w:t>
-      </w:r>
-      <w:r>
         <w:t>при условии, что во время настройки карточного продукта среди эмбоссеров был выбран</w:t>
       </w:r>
       <w:r>
@@ -6112,11 +6311,7 @@
         <w:t xml:space="preserve"> </w:t>
       </w:r>
       <w:r>
-        <w:t xml:space="preserve">которой реализован алгоритм </w:t>
-      </w:r>
-      <w:r>
-        <w:lastRenderedPageBreak/>
-        <w:t>записи карт</w:t>
+        <w:t>которой реализован алгоритм записи карт</w:t>
       </w:r>
       <w:r>
         <w:t xml:space="preserve">ы, который как раз таки использует функции </w:t>
@@ -10212,10 +10407,7 @@
         </w:numPr>
       </w:pPr>
       <w:r>
-        <w:t>Метка: «</w:t>
-      </w:r>
-      <w:r>
-        <w:t xml:space="preserve">настройки </w:t>
+        <w:t xml:space="preserve">Метка: «настройки </w:t>
       </w:r>
       <w:proofErr w:type="spellStart"/>
       <w:r>
@@ -10297,28 +10489,7 @@
         <w:t xml:space="preserve">. </w:t>
       </w:r>
       <w:r>
-        <w:t xml:space="preserve">Данное взаимодействие будет проявляться только при выборе </w:t>
-      </w:r>
-      <w:r>
-        <w:t>тип</w:t>
-      </w:r>
-      <w:r>
-        <w:t>а</w:t>
-      </w:r>
-      <w:r>
-        <w:t xml:space="preserve"> </w:t>
-      </w:r>
-      <w:r>
-        <w:t>кард</w:t>
-      </w:r>
-      <w:r>
-        <w:t>ридера</w:t>
-      </w:r>
-      <w:r>
-        <w:t xml:space="preserve"> в поле выбора контактного интерфейса взаимодействия. Если будет выбран </w:t>
-      </w:r>
-      <w:r>
-        <w:t>тип ридера «</w:t>
+        <w:t>Данное взаимодействие будет проявляться только при выборе типа кардридера в поле выбора контактного интерфейса взаимодействия. Если будет выбран тип ридера «</w:t>
       </w:r>
       <w:r>
         <w:rPr>
@@ -10350,21 +10521,13 @@
         <w:t xml:space="preserve"> </w:t>
       </w:r>
       <w:r>
-        <w:t>…»</w:t>
-      </w:r>
-      <w:r>
-        <w:t xml:space="preserve"> то флажок представленный выше станет активным, иначе же он будет не активен и не выствален.</w:t>
-      </w:r>
-      <w:r>
-        <w:t xml:space="preserve"> </w:t>
-      </w:r>
-    </w:p>
-    <w:p>
-      <w:pPr>
-        <w:rPr>
-          <w:lang w:val="en-US"/>
-        </w:rPr>
-      </w:pPr>
+        <w:t>…» то флажок представленный выше станет активным, иначе же он будет не активен и не выствален.</w:t>
+      </w:r>
+      <w:r>
+        <w:t xml:space="preserve"> </w:t>
+      </w:r>
+    </w:p>
+    <w:p>
       <w:r>
         <w:t>Представленные в данном разделе интерфейсные элементы будут использоваться для проектирования модели будущего интерфейса, который уже будет служить основой для доработки реального интерфейса модуля</w:t>
       </w:r>
@@ -10772,11 +10935,6 @@
       <w:bookmarkEnd w:id="28"/>
     </w:p>
     <w:p>
-      <w:pPr>
-        <w:rPr>
-          <w:lang w:val="en-US"/>
-        </w:rPr>
-      </w:pPr>
       <w:r>
         <w:t>Как было отмечено в прошлых главах, все драйверы для работы с кардридерами имеют одинаковую общую структуру, которой обязательно необходимо придерживаться, чтобы запускающий драйвер записи карты мог его подгрузить и использовать. В данном разделе сначала будет рассмотрена общая для всех таких драйверов структура и ее реализация в разработанном драйвере, а потом будут рассмотрены все дополнения к этой структуре, необходимые для работы драйвера.</w:t>
       </w:r>
@@ -13377,11 +13535,6 @@
       </w:r>
     </w:p>
     <w:p>
-      <w:pPr>
-        <w:rPr>
-          <w:lang w:val="en-US"/>
-        </w:rPr>
-      </w:pPr>
       <w:r>
         <w:rPr>
           <w:lang w:val="en-US"/>
@@ -13396,9 +13549,6 @@
         <w:t>std</w:t>
       </w:r>
       <w:r>
-        <w:rPr>
-          <w:lang w:val="en-US"/>
-        </w:rPr>
         <w:t>::</w:t>
       </w:r>
       <w:proofErr w:type="spellStart"/>
@@ -13411,36 +13561,24 @@
       </w:r>
       <w:proofErr w:type="spellEnd"/>
       <w:r>
-        <w:rPr>
-          <w:lang w:val="en-US"/>
-        </w:rPr>
         <w:t xml:space="preserve"> &lt;&lt; "</w:t>
       </w:r>
       <w:r>
         <w:t>Ошибка</w:t>
       </w:r>
       <w:r>
-        <w:rPr>
-          <w:lang w:val="en-US"/>
-        </w:rPr>
         <w:t xml:space="preserve"> </w:t>
       </w:r>
       <w:r>
         <w:t>получения</w:t>
       </w:r>
       <w:r>
-        <w:rPr>
-          <w:lang w:val="en-US"/>
-        </w:rPr>
         <w:t xml:space="preserve"> </w:t>
       </w:r>
       <w:r>
         <w:t>статуса</w:t>
       </w:r>
       <w:r>
-        <w:rPr>
-          <w:lang w:val="en-US"/>
-        </w:rPr>
         <w:t xml:space="preserve">: " &lt;&lt; </w:t>
       </w:r>
       <w:r>
@@ -13450,9 +13588,6 @@
         <w:t>result</w:t>
       </w:r>
       <w:r>
-        <w:rPr>
-          <w:lang w:val="en-US"/>
-        </w:rPr>
         <w:t xml:space="preserve"> &lt;&lt; </w:t>
       </w:r>
       <w:proofErr w:type="gramStart"/>
@@ -13463,9 +13598,6 @@
         <w:t>std</w:t>
       </w:r>
       <w:r>
-        <w:rPr>
-          <w:lang w:val="en-US"/>
-        </w:rPr>
         <w:t>::</w:t>
       </w:r>
       <w:proofErr w:type="spellStart"/>
@@ -13478,9 +13610,6 @@
       </w:r>
       <w:proofErr w:type="spellEnd"/>
       <w:r>
-        <w:rPr>
-          <w:lang w:val="en-US"/>
-        </w:rPr>
         <w:t>;</w:t>
       </w:r>
     </w:p>
@@ -13491,9 +13620,6 @@
         </w:rPr>
       </w:pPr>
       <w:r>
-        <w:rPr>
-          <w:lang w:val="en-US"/>
-        </w:rPr>
         <w:lastRenderedPageBreak/>
         <w:t xml:space="preserve">        </w:t>
       </w:r>
@@ -18426,7 +18552,6 @@
   <w:style w:type="character" w:default="1" w:styleId="DefaultParagraphFont">
     <w:name w:val="Default Paragraph Font"/>
     <w:uiPriority w:val="1"/>
-    <w:semiHidden/>
     <w:unhideWhenUsed/>
   </w:style>
   <w:style w:type="table" w:default="1" w:styleId="TableNormal">

</xml_diff>

<commit_message>
Completed part on embosser history, to make part about embosser structure.
</commit_message>
<xml_diff>
--- a/Diplom_Main.docx
+++ b/Diplom_Main.docx
@@ -1,6 +1,6 @@
 
 <file path=word/document.xml><?xml version="1.0" encoding="utf-8"?>
-<w:document xmlns:wpc="http://schemas.microsoft.com/office/word/2010/wordprocessingCanvas" xmlns:cx="http://schemas.microsoft.com/office/drawing/2014/chartex" xmlns:cx1="http://schemas.microsoft.com/office/drawing/2015/9/8/chartex" xmlns:mc="http://schemas.openxmlformats.org/markup-compatibility/2006" xmlns:o="urn:schemas-microsoft-com:office:office" xmlns:r="http://schemas.openxmlformats.org/officeDocument/2006/relationships" xmlns:m="http://schemas.openxmlformats.org/officeDocument/2006/math" xmlns:v="urn:schemas-microsoft-com:vml" xmlns:wp14="http://schemas.microsoft.com/office/word/2010/wordprocessingDrawing" xmlns:wp="http://schemas.openxmlformats.org/drawingml/2006/wordprocessingDrawing" xmlns:w10="urn:schemas-microsoft-com:office:word" xmlns:w="http://schemas.openxmlformats.org/wordprocessingml/2006/main" xmlns:w14="http://schemas.microsoft.com/office/word/2010/wordml" xmlns:w15="http://schemas.microsoft.com/office/word/2012/wordml" xmlns:w16se="http://schemas.microsoft.com/office/word/2015/wordml/symex" xmlns:wpg="http://schemas.microsoft.com/office/word/2010/wordprocessingGroup" xmlns:wpi="http://schemas.microsoft.com/office/word/2010/wordprocessingInk" xmlns:wne="http://schemas.microsoft.com/office/word/2006/wordml" xmlns:wps="http://schemas.microsoft.com/office/word/2010/wordprocessingShape" mc:Ignorable="w14 w15 w16se wp14">
+<w:document xmlns:wpc="http://schemas.microsoft.com/office/word/2010/wordprocessingCanvas" xmlns:cx="http://schemas.microsoft.com/office/drawing/2014/chartex" xmlns:cx1="http://schemas.microsoft.com/office/drawing/2015/9/8/chartex" xmlns:cx2="http://schemas.microsoft.com/office/drawing/2015/10/21/chartex" xmlns:cx3="http://schemas.microsoft.com/office/drawing/2016/5/9/chartex" xmlns:cx4="http://schemas.microsoft.com/office/drawing/2016/5/10/chartex" xmlns:cx5="http://schemas.microsoft.com/office/drawing/2016/5/11/chartex" xmlns:cx6="http://schemas.microsoft.com/office/drawing/2016/5/12/chartex" xmlns:cx7="http://schemas.microsoft.com/office/drawing/2016/5/13/chartex" xmlns:cx8="http://schemas.microsoft.com/office/drawing/2016/5/14/chartex" xmlns:mc="http://schemas.openxmlformats.org/markup-compatibility/2006" xmlns:aink="http://schemas.microsoft.com/office/drawing/2016/ink" xmlns:am3d="http://schemas.microsoft.com/office/drawing/2017/model3d" xmlns:o="urn:schemas-microsoft-com:office:office" xmlns:oel="http://schemas.microsoft.com/office/2019/extlst" xmlns:r="http://schemas.openxmlformats.org/officeDocument/2006/relationships" xmlns:m="http://schemas.openxmlformats.org/officeDocument/2006/math" xmlns:v="urn:schemas-microsoft-com:vml" xmlns:wp14="http://schemas.microsoft.com/office/word/2010/wordprocessingDrawing" xmlns:wp="http://schemas.openxmlformats.org/drawingml/2006/wordprocessingDrawing" xmlns:w10="urn:schemas-microsoft-com:office:word" xmlns:w="http://schemas.openxmlformats.org/wordprocessingml/2006/main" xmlns:w14="http://schemas.microsoft.com/office/word/2010/wordml" xmlns:w15="http://schemas.microsoft.com/office/word/2012/wordml" xmlns:w16cex="http://schemas.microsoft.com/office/word/2018/wordml/cex" xmlns:w16cid="http://schemas.microsoft.com/office/word/2016/wordml/cid" xmlns:w16="http://schemas.microsoft.com/office/word/2018/wordml" xmlns:w16du="http://schemas.microsoft.com/office/word/2023/wordml/word16du" xmlns:w16sdtdh="http://schemas.microsoft.com/office/word/2020/wordml/sdtdatahash" xmlns:w16sdtfl="http://schemas.microsoft.com/office/word/2024/wordml/sdtformatlock" xmlns:w16se="http://schemas.microsoft.com/office/word/2015/wordml/symex" xmlns:wpg="http://schemas.microsoft.com/office/word/2010/wordprocessingGroup" xmlns:wpi="http://schemas.microsoft.com/office/word/2010/wordprocessingInk" xmlns:wne="http://schemas.microsoft.com/office/word/2006/wordml" xmlns:wps="http://schemas.microsoft.com/office/word/2010/wordprocessingShape" mc:Ignorable="w14 w15 w16se w16cid w16 w16cex w16sdtdh w16sdtfl w16du wp14">
   <w:body>
     <w:p>
       <w:pPr>
@@ -4766,7 +4766,7 @@
     <w:p>
       <w:pPr>
         <w:pStyle w:val="Heading1"/>
-        <w:ind w:left="360"/>
+        <w:ind w:left="360" w:firstLine="0"/>
       </w:pPr>
       <w:bookmarkStart w:id="2" w:name="_Toc198558758"/>
       <w:r>
@@ -5041,13 +5041,136 @@
       <w:r>
         <w:t xml:space="preserve"> Такие кредитные жетоны были доступны только людям, которые были в состоянии совершать большие покупки в магазинах, остальным же жетоны не выдавались. </w:t>
       </w:r>
-      <w:bookmarkStart w:id="5" w:name="_GoBack"/>
-      <w:bookmarkEnd w:id="5"/>
+      <w:r>
+        <w:t xml:space="preserve">В 1924 году появились уже более похожие на карты экземпляры. Компания </w:t>
+      </w:r>
+      <w:r>
+        <w:rPr>
+          <w:lang w:val="en-US"/>
+        </w:rPr>
+        <w:t>Mobil</w:t>
+      </w:r>
+      <w:r>
+        <w:t xml:space="preserve"> </w:t>
+      </w:r>
+      <w:r>
+        <w:rPr>
+          <w:lang w:val="en-US"/>
+        </w:rPr>
+        <w:t>Oil</w:t>
+      </w:r>
+      <w:r>
+        <w:t xml:space="preserve"> </w:t>
+      </w:r>
+      <w:r>
+        <w:t>предлагала кредитные карты постоянного клиента, которые представляли из себя уже металлические карточки, на которых были выбиты номер карты, имя и адрес клиента.</w:t>
+      </w:r>
     </w:p>
     <w:p>
       <w:pPr>
         <w:ind w:firstLine="420"/>
       </w:pPr>
+      <w:r>
+        <w:t xml:space="preserve">Первые пластиковые кредитные карты были выпущены компанией </w:t>
+      </w:r>
+      <w:r>
+        <w:rPr>
+          <w:lang w:val="en-US"/>
+        </w:rPr>
+        <w:t>American</w:t>
+      </w:r>
+      <w:r>
+        <w:t xml:space="preserve"> </w:t>
+      </w:r>
+      <w:r>
+        <w:rPr>
+          <w:lang w:val="en-US"/>
+        </w:rPr>
+        <w:t>Express</w:t>
+      </w:r>
+      <w:r>
+        <w:t xml:space="preserve"> </w:t>
+      </w:r>
+      <w:r>
+        <w:t xml:space="preserve">в 1959 году. До этого они были бумажными и фиолетового цвета, как и дорожные чеки </w:t>
+      </w:r>
+      <w:r>
+        <w:rPr>
+          <w:lang w:val="en-US"/>
+        </w:rPr>
+        <w:t>American</w:t>
+      </w:r>
+      <w:r>
+        <w:t xml:space="preserve"> </w:t>
+      </w:r>
+      <w:r>
+        <w:rPr>
+          <w:lang w:val="en-US"/>
+        </w:rPr>
+        <w:t>Express</w:t>
+      </w:r>
+      <w:r>
+        <w:t xml:space="preserve">, </w:t>
+      </w:r>
+      <w:r>
+        <w:t xml:space="preserve">но через год, из соображений безопасности материал карт был изменен на пластик. Информация на них выдавливалась горячим прессом с вставками для необходимых букв и цифр. Также появление пластиковых карт ускорило процесс покупки в магазинах, ведь вместе с ними компания выпустила специальные импринтеры или же валидаторы, которые позволяли отпечатывать выдавленные данные с карты на лист бумаги. По сравнению с предыдущими методами, это значительно ускорило процесс покупки, отчего </w:t>
+      </w:r>
+      <w:r>
+        <w:t>такие</w:t>
+      </w:r>
+      <w:r>
+        <w:t xml:space="preserve"> карты в свое время пользовались большим спросом.</w:t>
+      </w:r>
+      <w:r>
+        <w:t xml:space="preserve"> Информация на таких картах выдавливалась с помощью специального пресса, под который подкладывалась карта. Эти прессы были первыми механическими эмбоссерами.</w:t>
+      </w:r>
+    </w:p>
+    <w:p>
+      <w:pPr>
+        <w:ind w:firstLine="420"/>
+      </w:pPr>
+      <w:r>
+        <w:lastRenderedPageBreak/>
+        <w:t xml:space="preserve">Технический прогресс не стоял на месте и на картах с 1968 года на банковские карты стали наносить магнитную полосу методом горячей штамповки. На полосу записывались данные клиента методом магнитной записи. Магнитная запись была изобретена еще в 1878 году и только через 20 лет была разработана магнитная полоса, которая первоначально служила для записи телефонных разговоров. Разработала технологию записи необходимой информации на магнитную полосу разработала компания </w:t>
+      </w:r>
+      <w:r>
+        <w:rPr>
+          <w:lang w:val="en-US"/>
+        </w:rPr>
+        <w:t>IBM</w:t>
+      </w:r>
+      <w:r>
+        <w:t xml:space="preserve">. </w:t>
+      </w:r>
+      <w:r>
+        <w:t>Указание на разработку было дано еще в 1966 году советом директоров. Целью того заседания была разработка технического решения для будущего предложения платежных карт.</w:t>
+      </w:r>
+      <w:r>
+        <w:t xml:space="preserve"> </w:t>
+      </w:r>
+      <w:r>
+        <w:t>Одним из первых в 1972 г. поддержал введение магнитной полосы на картах президент National BankAmericard Ди Хок. Он считал новую технологию дешевой и надежной. Американская банковская ассоциация тоже поддержала магнитную полосу, установила структуру записи на двух дорожках и в 1973 г. сделала полосу своим стандартом. К апрелю 1973 г. 85 % банковских карт уже имело магнитную полосу</w:t>
+      </w:r>
+      <w:r>
+        <w:t>.</w:t>
+      </w:r>
+      <w:r>
+        <w:t xml:space="preserve"> С появлением магнитной полосы необходимо было автоматизировать еще один из этапов выпуска карты, поэтому был создан дополнительный агрегат, который записывал информацию на магнитную полосу карты и ламинировал ее.</w:t>
+      </w:r>
+      <w:r>
+        <w:t xml:space="preserve"> В то же время, в эпоху компьютеризации, ближе к середине 1980-х годов, был разработан автоматический эмбоссер, который производил полноценную персонализацию карты, от эмбоссирования до записи информации на магнитную ленту. </w:t>
+      </w:r>
+      <w:r>
+        <w:t>Данная разработка была вызвана большим расширением карточной клиентуры, так как американские банки расширялись в европе, китае и японии, где их кредитные карты стали очень популярными среди населения. Такой эмбоссер позже модифицировался после выпуска карт со встроенным чипом, а также под влиянием разработок в области техники и компьютеризации.</w:t>
+      </w:r>
+    </w:p>
+    <w:p>
+      <w:pPr>
+        <w:pStyle w:val="Heading3"/>
+      </w:pPr>
+      <w:r>
+        <w:t xml:space="preserve">1.1.2 Общая структура эмбоссеров </w:t>
+      </w:r>
     </w:p>
     <w:p>
       <w:pPr>
@@ -5116,11 +5239,11 @@
         <w:ind w:firstLine="426"/>
       </w:pPr>
       <w:r>
-        <w:t xml:space="preserve">Загрузка карты представляет из себя введение карты в эмбоссер для дальнейшей обработки. Данный этап может быть выполнен как вручную, так и с помощью специального механизма подачи карт, который использует </w:t>
+        <w:t xml:space="preserve">Загрузка карты представляет из себя введение карты в эмбоссер для дальнейшей обработки. Данный этап может быть выполнен как вручную, так </w:t>
       </w:r>
       <w:r>
         <w:lastRenderedPageBreak/>
-        <w:t>ролики и захваты для переноса карт во внутреннюю часть эмбоссера. После этапа загрузки карты с помощью механизма поступают внутрь специального устройства - кардридера, который зажимает карту. Данное устройство имеет несколько подпружиненных контактов, которые соединяются с соответствующими контактами на карте. Целью кардридера является предоставление интерфейса взаимодействия с картой во время процесса персонализации</w:t>
+        <w:t>и с помощью специального механизма подачи карт, который использует ролики и захваты для переноса карт во внутреннюю часть эмбоссера. После этапа загрузки карты с помощью механизма поступают внутрь специального устройства - кардридера, который зажимает карту. Данное устройство имеет несколько подпружиненных контактов, которые соединяются с соответствующими контактами на карте. Целью кардридера является предоставление интерфейса взаимодействия с картой во время процесса персонализации</w:t>
       </w:r>
       <w:r>
         <w:t>, а именно возможность записи и считывания информации с чипа на карте. После поступления в кардридер карта проходит процесс персонализации, во время которого на карту записывается вся необходимая банку для работы этой самой карты информация. Далее карта вынимется из кардридера и поступает в эмбоссер, который в свою очередь наносит рисунок на карту и печатает необходимые символы на поверхностях карты с помощью выжигания или выдавливания. Выполнение всех операций производится ЭВМ, подключенной к данному эмбоссеру. После всех вышеперечисленных операций карта считается готовой к эксплуатации и выдается банком клиенту.</w:t>
@@ -5344,17 +5467,17 @@
         <w:t>» специально дл</w:t>
       </w:r>
       <w:r>
-        <w:t>я общения с эмбоссерами собственного производства. После передачи команды эмбоссеру он интерпретирует и выполняет ее</w:t>
-      </w:r>
-      <w:r>
-        <w:t xml:space="preserve"> </w:t>
-      </w:r>
-      <w:r>
-        <w:t xml:space="preserve">и после этого отправляет ответ </w:t>
+        <w:t xml:space="preserve">я общения с эмбоссерами собственного производства. После передачи команды </w:t>
       </w:r>
       <w:r>
         <w:lastRenderedPageBreak/>
-        <w:t xml:space="preserve">о выполненном действии по тому же каналу подключения. Последнее, что стоит упомянуть, так это возможность работы в многопоточном режиме, она осуществляется подключением к эмбоссеру нескольких кардридеров, каждый из которых будет иметь свой собственный </w:t>
+        <w:t>эмбоссеру он интерпретирует и выполняет ее</w:t>
+      </w:r>
+      <w:r>
+        <w:t xml:space="preserve"> </w:t>
+      </w:r>
+      <w:r>
+        <w:t xml:space="preserve">и после этого отправляет ответ о выполненном действии по тому же каналу подключения. Последнее, что стоит упомянуть, так это возможность работы в многопоточном режиме, она осуществляется подключением к эмбоссеру нескольких кардридеров, каждый из которых будет иметь свой собственный </w:t>
       </w:r>
       <w:r>
         <w:rPr>
@@ -5451,7 +5574,7 @@
       <w:pPr>
         <w:pStyle w:val="Heading2"/>
       </w:pPr>
-      <w:bookmarkStart w:id="6" w:name="_Toc198558761"/>
+      <w:bookmarkStart w:id="5" w:name="_Toc198558761"/>
       <w:r>
         <w:t>1.</w:t>
       </w:r>
@@ -5467,7 +5590,7 @@
       <w:r>
         <w:t xml:space="preserve"> и поддерживаемого приложения</w:t>
       </w:r>
-      <w:bookmarkEnd w:id="6"/>
+      <w:bookmarkEnd w:id="5"/>
     </w:p>
     <w:p>
       <w:pPr>
@@ -5544,6 +5667,7 @@
         <w:rPr>
           <w:lang w:val="en-US"/>
         </w:rPr>
+        <w:lastRenderedPageBreak/>
         <w:t>Driver</w:t>
       </w:r>
       <w:r>
@@ -5581,11 +5705,7 @@
         <w:t>о</w:t>
       </w:r>
       <w:r>
-        <w:t xml:space="preserve"> </w:t>
-      </w:r>
-      <w:r>
-        <w:lastRenderedPageBreak/>
-        <w:t xml:space="preserve">на основе программной платформы </w:t>
+        <w:t xml:space="preserve"> на основе программной платформы </w:t>
       </w:r>
       <w:proofErr w:type="spellStart"/>
       <w:r>
@@ -5698,7 +5818,11 @@
         <w:t>агрегации</w:t>
       </w:r>
       <w:r>
-        <w:t>. В объектной машине </w:t>
+        <w:t xml:space="preserve">. В объектной </w:t>
+      </w:r>
+      <w:r>
+        <w:lastRenderedPageBreak/>
+        <w:t>машине </w:t>
       </w:r>
       <w:r>
         <w:rPr>
@@ -5708,11 +5832,7 @@
         <w:t>FloraWare</w:t>
       </w:r>
       <w:r>
-        <w:t xml:space="preserve"> в качестве форматов данных выступают объекты, а </w:t>
-      </w:r>
-      <w:r>
-        <w:lastRenderedPageBreak/>
-        <w:t>алгоритм реализуется передачей сообщений между объектами и их реакцией на эти сообщения. Архитектурно объектная машина </w:t>
+        <w:t> в качестве форматов данных выступают объекты, а алгоритм реализуется передачей сообщений между объектами и их реакцией на эти сообщения. Архитектурно объектная машина </w:t>
       </w:r>
       <w:r>
         <w:rPr>
@@ -6062,11 +6182,11 @@
       <w:pPr>
         <w:pStyle w:val="Heading2"/>
       </w:pPr>
-      <w:bookmarkStart w:id="7" w:name="_Toc198558762"/>
+      <w:bookmarkStart w:id="6" w:name="_Toc198558762"/>
       <w:r>
         <w:t>1.3 Анализ существующего драйвера</w:t>
       </w:r>
-      <w:bookmarkEnd w:id="7"/>
+      <w:bookmarkEnd w:id="6"/>
     </w:p>
     <w:p>
       <w:pPr>
@@ -6419,11 +6539,11 @@
       <w:pPr>
         <w:pStyle w:val="Heading2"/>
       </w:pPr>
-      <w:bookmarkStart w:id="8" w:name="_Toc198558763"/>
+      <w:bookmarkStart w:id="7" w:name="_Toc198558763"/>
       <w:r>
         <w:t>1.4 Постановка целей и задач</w:t>
       </w:r>
-      <w:bookmarkEnd w:id="8"/>
+      <w:bookmarkEnd w:id="7"/>
     </w:p>
     <w:p>
       <w:r>
@@ -6547,11 +6667,11 @@
       <w:pPr>
         <w:pStyle w:val="Heading2"/>
       </w:pPr>
-      <w:bookmarkStart w:id="9" w:name="_Toc198558764"/>
+      <w:bookmarkStart w:id="8" w:name="_Toc198558764"/>
       <w:r>
         <w:t>1.5 Выводы</w:t>
       </w:r>
-      <w:bookmarkEnd w:id="9"/>
+      <w:bookmarkEnd w:id="8"/>
     </w:p>
     <w:p>
       <w:pPr>
@@ -6578,7 +6698,7 @@
         <w:pStyle w:val="Heading1"/>
         <w:ind w:firstLine="0"/>
       </w:pPr>
-      <w:bookmarkStart w:id="10" w:name="_Toc198558765"/>
+      <w:bookmarkStart w:id="9" w:name="_Toc198558765"/>
       <w:r>
         <w:lastRenderedPageBreak/>
         <w:t xml:space="preserve">2 </w:t>
@@ -6610,20 +6730,20 @@
         </w:rPr>
         <w:t>FloraWare</w:t>
       </w:r>
+      <w:bookmarkEnd w:id="9"/>
+    </w:p>
+    <w:p>
+      <w:pPr>
+        <w:pStyle w:val="Heading2"/>
+      </w:pPr>
+      <w:bookmarkStart w:id="10" w:name="_Toc198558766"/>
+      <w:r>
+        <w:t>2.1 Описание функциональных требований</w:t>
+      </w:r>
+      <w:r>
+        <w:t>, предъявляемых к разрабатываемому драйверу</w:t>
+      </w:r>
       <w:bookmarkEnd w:id="10"/>
-    </w:p>
-    <w:p>
-      <w:pPr>
-        <w:pStyle w:val="Heading2"/>
-      </w:pPr>
-      <w:bookmarkStart w:id="11" w:name="_Toc198558766"/>
-      <w:r>
-        <w:t>2.1 Описание функциональных требований</w:t>
-      </w:r>
-      <w:r>
-        <w:t>, предъявляемых к разрабатываемому драйверу</w:t>
-      </w:r>
-      <w:bookmarkEnd w:id="11"/>
     </w:p>
     <w:p>
       <w:r>
@@ -7164,14 +7284,14 @@
       <w:pPr>
         <w:pStyle w:val="Heading2"/>
       </w:pPr>
-      <w:bookmarkStart w:id="12" w:name="_Toc198558772"/>
+      <w:bookmarkStart w:id="11" w:name="_Toc198558772"/>
       <w:r>
         <w:t xml:space="preserve">2.2 Функциональная схема разрабатываемого </w:t>
       </w:r>
       <w:r>
         <w:t>драйвера</w:t>
       </w:r>
-      <w:bookmarkEnd w:id="12"/>
+      <w:bookmarkEnd w:id="11"/>
     </w:p>
     <w:p>
       <w:r>
@@ -7194,11 +7314,11 @@
       <w:pPr>
         <w:pStyle w:val="Heading3"/>
       </w:pPr>
-      <w:bookmarkStart w:id="13" w:name="_Toc198558773"/>
+      <w:bookmarkStart w:id="12" w:name="_Toc198558773"/>
       <w:r>
         <w:t>2.2.1. Общее описание функциональной схемы</w:t>
       </w:r>
-      <w:bookmarkEnd w:id="13"/>
+      <w:bookmarkEnd w:id="12"/>
     </w:p>
     <w:p>
       <w:r>
@@ -7343,11 +7463,11 @@
       <w:pPr>
         <w:pStyle w:val="Heading3"/>
       </w:pPr>
-      <w:bookmarkStart w:id="14" w:name="_Toc198558774"/>
+      <w:bookmarkStart w:id="13" w:name="_Toc198558774"/>
       <w:r>
         <w:t>2.2.2. Описание компонентов функциональной схемы (и элементы на схеме)</w:t>
       </w:r>
-      <w:bookmarkEnd w:id="14"/>
+      <w:bookmarkEnd w:id="13"/>
     </w:p>
     <w:p>
       <w:r>
@@ -7877,11 +7997,11 @@
       <w:pPr>
         <w:pStyle w:val="Heading3"/>
       </w:pPr>
-      <w:bookmarkStart w:id="15" w:name="_Toc198558775"/>
+      <w:bookmarkStart w:id="14" w:name="_Toc198558775"/>
       <w:r>
         <w:t>2.2.3. Поток данных и управления</w:t>
       </w:r>
-      <w:bookmarkEnd w:id="15"/>
+      <w:bookmarkEnd w:id="14"/>
     </w:p>
     <w:p>
       <w:pPr>
@@ -7964,11 +8084,11 @@
       <w:pPr>
         <w:pStyle w:val="Heading3"/>
       </w:pPr>
-      <w:bookmarkStart w:id="16" w:name="_Toc198558776"/>
+      <w:bookmarkStart w:id="15" w:name="_Toc198558776"/>
       <w:r>
         <w:t>2.2.4. Альтернативные сценарии</w:t>
       </w:r>
-      <w:bookmarkEnd w:id="16"/>
+      <w:bookmarkEnd w:id="15"/>
     </w:p>
     <w:p>
       <w:pPr>
@@ -8029,77 +8149,77 @@
       <w:pPr>
         <w:pStyle w:val="Heading3"/>
       </w:pPr>
-      <w:bookmarkStart w:id="17" w:name="_Toc198558777"/>
+      <w:bookmarkStart w:id="16" w:name="_Toc198558777"/>
       <w:r>
         <w:t>2.2.5. Заключение</w:t>
       </w:r>
+      <w:bookmarkEnd w:id="16"/>
+    </w:p>
+    <w:p>
+      <w:r>
+        <w:t>Эта функциональная схема обеспечивает четкое представление архитектуры разрабатываемого драйвера. Она демонстрирует взаимодействие между различными компонентами и поток данных и управления. Эта схема будет использована в следующих разделах для более детального описания реализации драйвера. В следующем разделе будут определены нефункциональные требования к драйверу.</w:t>
+      </w:r>
+    </w:p>
+    <w:p>
+      <w:pPr>
+        <w:pStyle w:val="Heading2"/>
+      </w:pPr>
+      <w:bookmarkStart w:id="17" w:name="_Toc198558778"/>
+      <w:r>
+        <w:t>2.3 Обоснование выбора инструментальных средств разработки</w:t>
+      </w:r>
       <w:bookmarkEnd w:id="17"/>
     </w:p>
     <w:p>
       <w:r>
-        <w:t>Эта функциональная схема обеспечивает четкое представление архитектуры разрабатываемого драйвера. Она демонстрирует взаимодействие между различными компонентами и поток данных и управления. Эта схема будет использована в следующих разделах для более детального описания реализации драйвера. В следующем разделе будут определены нефункциональные требования к драйверу.</w:t>
-      </w:r>
-    </w:p>
-    <w:p>
-      <w:pPr>
-        <w:pStyle w:val="Heading2"/>
-      </w:pPr>
-      <w:bookmarkStart w:id="18" w:name="_Toc198558778"/>
-      <w:r>
-        <w:t>2.3 Обоснование выбора инструментальных средств разработки</w:t>
+        <w:t>Выбор</w:t>
+      </w:r>
+      <w:r>
+        <w:t xml:space="preserve"> всех</w:t>
+      </w:r>
+      <w:r>
+        <w:t xml:space="preserve"> </w:t>
+      </w:r>
+      <w:r>
+        <w:t xml:space="preserve">инструментальных средств разработки </w:t>
+      </w:r>
+      <w:r>
+        <w:t xml:space="preserve">был продиктован требованиями поставленного технического задания. В данном разделе будет рассмотрен список </w:t>
+      </w:r>
+      <w:r>
+        <w:t xml:space="preserve">таких </w:t>
+      </w:r>
+      <w:r>
+        <w:t>средств</w:t>
+      </w:r>
+      <w:r>
+        <w:t>, а также рассмотрены свойства</w:t>
+      </w:r>
+      <w:r>
+        <w:t xml:space="preserve">, </w:t>
+      </w:r>
+      <w:r>
+        <w:t>парметры и функционал</w:t>
+      </w:r>
+      <w:r>
+        <w:t xml:space="preserve"> данных средств, которые</w:t>
+      </w:r>
+      <w:r>
+        <w:t xml:space="preserve"> непосредственно влияют на разработку и дальнейшее распространение готового программного продукта</w:t>
+      </w:r>
+      <w:r>
+        <w:t>.</w:t>
+      </w:r>
+    </w:p>
+    <w:p>
+      <w:pPr>
+        <w:pStyle w:val="Heading3"/>
+      </w:pPr>
+      <w:bookmarkStart w:id="18" w:name="_Toc198558779"/>
+      <w:r>
+        <w:t>2.3.1 Описние использованных инструментальных средств</w:t>
       </w:r>
       <w:bookmarkEnd w:id="18"/>
-    </w:p>
-    <w:p>
-      <w:r>
-        <w:t>Выбор</w:t>
-      </w:r>
-      <w:r>
-        <w:t xml:space="preserve"> всех</w:t>
-      </w:r>
-      <w:r>
-        <w:t xml:space="preserve"> </w:t>
-      </w:r>
-      <w:r>
-        <w:t xml:space="preserve">инструментальных средств разработки </w:t>
-      </w:r>
-      <w:r>
-        <w:t xml:space="preserve">был продиктован требованиями поставленного технического задания. В данном разделе будет рассмотрен список </w:t>
-      </w:r>
-      <w:r>
-        <w:t xml:space="preserve">таких </w:t>
-      </w:r>
-      <w:r>
-        <w:t>средств</w:t>
-      </w:r>
-      <w:r>
-        <w:t>, а также рассмотрены свойства</w:t>
-      </w:r>
-      <w:r>
-        <w:t xml:space="preserve">, </w:t>
-      </w:r>
-      <w:r>
-        <w:t>парметры и функционал</w:t>
-      </w:r>
-      <w:r>
-        <w:t xml:space="preserve"> данных средств, которые</w:t>
-      </w:r>
-      <w:r>
-        <w:t xml:space="preserve"> непосредственно влияют на разработку и дальнейшее распространение готового программного продукта</w:t>
-      </w:r>
-      <w:r>
-        <w:t>.</w:t>
-      </w:r>
-    </w:p>
-    <w:p>
-      <w:pPr>
-        <w:pStyle w:val="Heading3"/>
-      </w:pPr>
-      <w:bookmarkStart w:id="19" w:name="_Toc198558779"/>
-      <w:r>
-        <w:t>2.3.1 Описние использованных инструментальных средств</w:t>
-      </w:r>
-      <w:bookmarkEnd w:id="19"/>
     </w:p>
     <w:p>
       <w:r>
@@ -9620,59 +9740,59 @@
       <w:pPr>
         <w:pStyle w:val="Heading3"/>
       </w:pPr>
-      <w:bookmarkStart w:id="20" w:name="_Toc198558780"/>
+      <w:bookmarkStart w:id="19" w:name="_Toc198558780"/>
       <w:r>
         <w:t>2.3.2</w:t>
       </w:r>
       <w:r>
         <w:t xml:space="preserve"> Заключение</w:t>
       </w:r>
+      <w:bookmarkEnd w:id="19"/>
+    </w:p>
+    <w:p>
+      <w:r>
+        <w:t>Набор инструментальных средств разработки является основополагающим фактором для разработки</w:t>
+      </w:r>
+      <w:r>
+        <w:t xml:space="preserve"> любого программного продукта</w:t>
+      </w:r>
+      <w:r>
+        <w:t>. Определение такого набора напрямую влияет на скорость разработки, количество допускаемых ошибок и возникаемых багов, масштабируемость проекта, способы распространения проекта и т.д. Инструментальные средства должны быть обязательно определены до начала процесса разработки для того, чтобы четко выбрать самые эффективные для поставленной задачи средства и не останавливать процесс разработки для подбора необходимых инструментов. А иначе возможна такая ситуация, что в процессе разработки проекта будут выявлены недостатки того или иного инструмента и возникнет необходимость перехода на другой. В больших проектах такие переходы могут быть очень трудозатратными, поэтому необходимо по возможности их избегать</w:t>
+      </w:r>
+      <w:r>
+        <w:t xml:space="preserve"> и четко определять набор инструментов, который будет использоваться на протяжении всей жизни проекта, еще на этапе планирования. </w:t>
+      </w:r>
+      <w:r>
+        <w:t xml:space="preserve">Конечно, присутствует возможность оставить уже используемые инструменты, но в таком случае разработчикам придется мириться с их недостатками, что существенно снизит производительность. </w:t>
+      </w:r>
+      <w:r>
+        <w:t xml:space="preserve">Представленный в предыдущем разделе инструментарий удовлетворяет все требованиям для осуществления полноценной разработки и тестирования драйвера прямого управления эмбоссером </w:t>
+      </w:r>
+      <w:r>
+        <w:rPr>
+          <w:lang w:val="en-US"/>
+        </w:rPr>
+        <w:t>MATICA</w:t>
+      </w:r>
+      <w:r>
+        <w:t>.</w:t>
+      </w:r>
+      <w:r>
+        <w:t xml:space="preserve"> Часть представленного инструментария будет использована в следующем разделе для описания процесса проектирования пользовательского интерфейса.</w:t>
+      </w:r>
+    </w:p>
+    <w:p>
+      <w:pPr>
+        <w:pStyle w:val="Heading2"/>
+      </w:pPr>
+      <w:bookmarkStart w:id="20" w:name="_Toc198558781"/>
+      <w:r>
+        <w:t>2.4 Проектирование пользовательского интерфейса</w:t>
+      </w:r>
       <w:bookmarkEnd w:id="20"/>
     </w:p>
     <w:p>
       <w:r>
-        <w:t>Набор инструментальных средств разработки является основополагающим фактором для разработки</w:t>
-      </w:r>
-      <w:r>
-        <w:t xml:space="preserve"> любого программного продукта</w:t>
-      </w:r>
-      <w:r>
-        <w:t>. Определение такого набора напрямую влияет на скорость разработки, количество допускаемых ошибок и возникаемых багов, масштабируемость проекта, способы распространения проекта и т.д. Инструментальные средства должны быть обязательно определены до начала процесса разработки для того, чтобы четко выбрать самые эффективные для поставленной задачи средства и не останавливать процесс разработки для подбора необходимых инструментов. А иначе возможна такая ситуация, что в процессе разработки проекта будут выявлены недостатки того или иного инструмента и возникнет необходимость перехода на другой. В больших проектах такие переходы могут быть очень трудозатратными, поэтому необходимо по возможности их избегать</w:t>
-      </w:r>
-      <w:r>
-        <w:t xml:space="preserve"> и четко определять набор инструментов, который будет использоваться на протяжении всей жизни проекта, еще на этапе планирования. </w:t>
-      </w:r>
-      <w:r>
-        <w:t xml:space="preserve">Конечно, присутствует возможность оставить уже используемые инструменты, но в таком случае разработчикам придется мириться с их недостатками, что существенно снизит производительность. </w:t>
-      </w:r>
-      <w:r>
-        <w:t xml:space="preserve">Представленный в предыдущем разделе инструментарий удовлетворяет все требованиям для осуществления полноценной разработки и тестирования драйвера прямого управления эмбоссером </w:t>
-      </w:r>
-      <w:r>
-        <w:rPr>
-          <w:lang w:val="en-US"/>
-        </w:rPr>
-        <w:t>MATICA</w:t>
-      </w:r>
-      <w:r>
-        <w:t>.</w:t>
-      </w:r>
-      <w:r>
-        <w:t xml:space="preserve"> Часть представленного инструментария будет использована в следующем разделе для описания процесса проектирования пользовательского интерфейса.</w:t>
-      </w:r>
-    </w:p>
-    <w:p>
-      <w:pPr>
-        <w:pStyle w:val="Heading2"/>
-      </w:pPr>
-      <w:bookmarkStart w:id="21" w:name="_Toc198558781"/>
-      <w:r>
-        <w:t>2.4 Проектирование пользовательского интерфейса</w:t>
-      </w:r>
-      <w:bookmarkEnd w:id="21"/>
-    </w:p>
-    <w:p>
-      <w:r>
         <w:t xml:space="preserve">В данном разделе описывается проектирование </w:t>
       </w:r>
       <w:r>
@@ -9698,12 +9818,12 @@
       <w:pPr>
         <w:pStyle w:val="Heading3"/>
       </w:pPr>
-      <w:bookmarkStart w:id="22" w:name="_Toc198558782"/>
+      <w:bookmarkStart w:id="21" w:name="_Toc198558782"/>
       <w:r>
         <w:lastRenderedPageBreak/>
         <w:t>2.4.1. Общие принципы проектирования интерфейса</w:t>
       </w:r>
-      <w:bookmarkEnd w:id="22"/>
+      <w:bookmarkEnd w:id="21"/>
     </w:p>
     <w:p>
       <w:r>
@@ -9861,11 +9981,11 @@
       <w:pPr>
         <w:pStyle w:val="Heading3"/>
       </w:pPr>
-      <w:bookmarkStart w:id="23" w:name="_Toc198558783"/>
+      <w:bookmarkStart w:id="22" w:name="_Toc198558783"/>
       <w:r>
         <w:t xml:space="preserve">2.4.2 </w:t>
       </w:r>
-      <w:bookmarkEnd w:id="23"/>
+      <w:bookmarkEnd w:id="22"/>
       <w:r>
         <w:t>Планирование интерфейсных доработок</w:t>
       </w:r>
@@ -10593,11 +10713,11 @@
       <w:pPr>
         <w:pStyle w:val="Heading3"/>
       </w:pPr>
-      <w:bookmarkStart w:id="24" w:name="_Toc198558784"/>
+      <w:bookmarkStart w:id="23" w:name="_Toc198558784"/>
       <w:r>
         <w:t>2.4.3. Визуализация интерфейса</w:t>
       </w:r>
-      <w:bookmarkEnd w:id="24"/>
+      <w:bookmarkEnd w:id="23"/>
     </w:p>
     <w:p>
       <w:pPr>
@@ -10656,11 +10776,11 @@
       <w:pPr>
         <w:pStyle w:val="Heading3"/>
       </w:pPr>
-      <w:bookmarkStart w:id="25" w:name="_Toc198558785"/>
+      <w:bookmarkStart w:id="24" w:name="_Toc198558785"/>
       <w:r>
         <w:t>2.4.4. Обработка ошибок в UI</w:t>
       </w:r>
-      <w:bookmarkEnd w:id="25"/>
+      <w:bookmarkEnd w:id="24"/>
     </w:p>
     <w:p>
       <w:r>
@@ -10713,27 +10833,27 @@
       <w:pPr>
         <w:pStyle w:val="Heading3"/>
       </w:pPr>
-      <w:bookmarkStart w:id="26" w:name="_Toc198558786"/>
+      <w:bookmarkStart w:id="25" w:name="_Toc198558786"/>
       <w:r>
         <w:lastRenderedPageBreak/>
         <w:t>2.4.5. Заключение</w:t>
       </w:r>
+      <w:bookmarkEnd w:id="25"/>
+    </w:p>
+    <w:p>
+      <w:r>
+        <w:t>В этом разделе было представлено проектирование пользовательского интерфейса для модуля ChipWriterDriver, включая добавление поля для ввода IP-адреса и флажка для выбора режима подключения по IP. В следующих разделах будут рассмотрены аспекты реализации драйвера и результаты его тестирования.</w:t>
+      </w:r>
+    </w:p>
+    <w:p>
+      <w:pPr>
+        <w:pStyle w:val="Heading2"/>
+      </w:pPr>
+      <w:bookmarkStart w:id="26" w:name="_Toc198558787"/>
+      <w:r>
+        <w:t>2.5 Выводы</w:t>
+      </w:r>
       <w:bookmarkEnd w:id="26"/>
-    </w:p>
-    <w:p>
-      <w:r>
-        <w:t>В этом разделе было представлено проектирование пользовательского интерфейса для модуля ChipWriterDriver, включая добавление поля для ввода IP-адреса и флажка для выбора режима подключения по IP. В следующих разделах будут рассмотрены аспекты реализации драйвера и результаты его тестирования.</w:t>
-      </w:r>
-    </w:p>
-    <w:p>
-      <w:pPr>
-        <w:pStyle w:val="Heading2"/>
-      </w:pPr>
-      <w:bookmarkStart w:id="27" w:name="_Toc198558787"/>
-      <w:r>
-        <w:t>2.5 Выводы</w:t>
-      </w:r>
-      <w:bookmarkEnd w:id="27"/>
     </w:p>
     <w:p>
       <w:r>
@@ -10952,7 +11072,7 @@
       <w:pPr>
         <w:pStyle w:val="Heading1"/>
       </w:pPr>
-      <w:bookmarkStart w:id="28" w:name="_Toc198558788"/>
+      <w:bookmarkStart w:id="27" w:name="_Toc198558788"/>
       <w:r>
         <w:lastRenderedPageBreak/>
         <w:t xml:space="preserve">3 </w:t>
@@ -10960,33 +11080,33 @@
       <w:r>
         <w:t>Описание и порядок работы с разработанным программным обеспечением</w:t>
       </w:r>
+      <w:bookmarkEnd w:id="27"/>
+    </w:p>
+    <w:p>
+      <w:r>
+        <w:t>Эта глава посвящена подробному описанию разработанного драйвера прямого управления эмбоссером. В ней будут рассмотрены архитектура драйвера, его компоненты, интерфейс программирования (API), процесс установки и настройки, а также приме</w:t>
+      </w:r>
+      <w:r>
+        <w:t>ры использования для выполнения записи информации на карту</w:t>
+      </w:r>
+      <w:r>
+        <w:t>. Целью этой главы является предоставление полного руководства для разработчиков и пользователей, желающих интегрировать и использовать разработанный драйвер в своих приложениях.</w:t>
+      </w:r>
+    </w:p>
+    <w:p>
+      <w:r>
+        <w:t>-- порядок работы общее описание --</w:t>
+      </w:r>
+    </w:p>
+    <w:p>
+      <w:pPr>
+        <w:pStyle w:val="Heading2"/>
+      </w:pPr>
+      <w:bookmarkStart w:id="28" w:name="_Toc198558789"/>
+      <w:r>
+        <w:t>3.1. Архитектура драйвера</w:t>
+      </w:r>
       <w:bookmarkEnd w:id="28"/>
-    </w:p>
-    <w:p>
-      <w:r>
-        <w:t>Эта глава посвящена подробному описанию разработанного драйвера прямого управления эмбоссером. В ней будут рассмотрены архитектура драйвера, его компоненты, интерфейс программирования (API), процесс установки и настройки, а также приме</w:t>
-      </w:r>
-      <w:r>
-        <w:t>ры использования для выполнения записи информации на карту</w:t>
-      </w:r>
-      <w:r>
-        <w:t>. Целью этой главы является предоставление полного руководства для разработчиков и пользователей, желающих интегрировать и использовать разработанный драйвер в своих приложениях.</w:t>
-      </w:r>
-    </w:p>
-    <w:p>
-      <w:r>
-        <w:t>-- порядок работы общее описание --</w:t>
-      </w:r>
-    </w:p>
-    <w:p>
-      <w:pPr>
-        <w:pStyle w:val="Heading2"/>
-      </w:pPr>
-      <w:bookmarkStart w:id="29" w:name="_Toc198558789"/>
-      <w:r>
-        <w:t>3.1. Архитектура драйвера</w:t>
-      </w:r>
-      <w:bookmarkEnd w:id="29"/>
     </w:p>
     <w:p>
       <w:r>
@@ -11287,6 +11407,7 @@
         </w:numPr>
       </w:pPr>
       <w:proofErr w:type="spellStart"/>
+      <w:proofErr w:type="gramStart"/>
       <w:r>
         <w:rPr>
           <w:lang w:val="en-US"/>
@@ -11298,7 +11419,14 @@
         <w:rPr>
           <w:lang w:val="en-US"/>
         </w:rPr>
-        <w:t>()</w:t>
+        <w:t>(</w:t>
+      </w:r>
+      <w:proofErr w:type="gramEnd"/>
+      <w:r>
+        <w:rPr>
+          <w:lang w:val="en-US"/>
+        </w:rPr>
+        <w:t>)</w:t>
       </w:r>
       <w:r>
         <w:t xml:space="preserve"> - </w:t>
@@ -11371,6 +11499,7 @@
         </w:numPr>
       </w:pPr>
       <w:proofErr w:type="spellStart"/>
+      <w:proofErr w:type="gramStart"/>
       <w:r>
         <w:rPr>
           <w:lang w:val="en-US"/>
@@ -11383,7 +11512,14 @@
         <w:rPr>
           <w:lang w:val="en-US"/>
         </w:rPr>
-        <w:t>()</w:t>
+        <w:t>(</w:t>
+      </w:r>
+      <w:proofErr w:type="gramEnd"/>
+      <w:r>
+        <w:rPr>
+          <w:lang w:val="en-US"/>
+        </w:rPr>
+        <w:t>)</w:t>
       </w:r>
     </w:p>
     <w:p>
@@ -11394,6 +11530,7 @@
           <w:numId w:val="22"/>
         </w:numPr>
       </w:pPr>
+      <w:proofErr w:type="gramStart"/>
       <w:r>
         <w:rPr>
           <w:lang w:val="en-US"/>
@@ -11401,7 +11538,11 @@
         <w:t>Reset</w:t>
       </w:r>
       <w:r>
-        <w:t>()</w:t>
+        <w:t>(</w:t>
+      </w:r>
+      <w:proofErr w:type="gramEnd"/>
+      <w:r>
+        <w:t>)</w:t>
       </w:r>
       <w:r>
         <w:t xml:space="preserve"> – </w:t>
@@ -11454,6 +11595,7 @@
         </w:numPr>
       </w:pPr>
       <w:proofErr w:type="spellStart"/>
+      <w:proofErr w:type="gramStart"/>
       <w:r>
         <w:rPr>
           <w:lang w:val="en-US"/>
@@ -11462,7 +11604,11 @@
       </w:r>
       <w:proofErr w:type="spellEnd"/>
       <w:r>
-        <w:t>()</w:t>
+        <w:t>(</w:t>
+      </w:r>
+      <w:proofErr w:type="gramEnd"/>
+      <w:r>
+        <w:t>)</w:t>
       </w:r>
       <w:r>
         <w:t xml:space="preserve"> – составление скриптов записи и отправка сообщений </w:t>
@@ -11477,6 +11623,7 @@
         </w:numPr>
       </w:pPr>
       <w:proofErr w:type="spellStart"/>
+      <w:proofErr w:type="gramStart"/>
       <w:r>
         <w:rPr>
           <w:lang w:val="en-US"/>
@@ -11488,7 +11635,14 @@
         <w:rPr>
           <w:lang w:val="en-US"/>
         </w:rPr>
-        <w:t>()</w:t>
+        <w:t>(</w:t>
+      </w:r>
+      <w:proofErr w:type="gramEnd"/>
+      <w:r>
+        <w:rPr>
+          <w:lang w:val="en-US"/>
+        </w:rPr>
+        <w:t>)</w:t>
       </w:r>
     </w:p>
     <w:p>
@@ -11535,29 +11689,29 @@
       <w:pPr>
         <w:pStyle w:val="Heading2"/>
       </w:pPr>
-      <w:bookmarkStart w:id="30" w:name="_Toc198558790"/>
+      <w:bookmarkStart w:id="29" w:name="_Toc198558790"/>
       <w:r>
         <w:t>3.2. Описание API (Интерфейса программирования)</w:t>
       </w:r>
+      <w:bookmarkEnd w:id="29"/>
+    </w:p>
+    <w:p>
+      <w:r>
+        <w:t>В этом разделе подробно описывается API драйвера, предоставляющий набор функций для управления эмбоссером.</w:t>
+      </w:r>
+    </w:p>
+    <w:p>
+      <w:pPr>
+        <w:pStyle w:val="Heading3"/>
+      </w:pPr>
+      <w:bookmarkStart w:id="30" w:name="_Toc198558791"/>
+      <w:r>
+        <w:t>3.2.1. Обзор классов и функций API</w:t>
+      </w:r>
       <w:bookmarkEnd w:id="30"/>
     </w:p>
     <w:p>
       <w:r>
-        <w:t>В этом разделе подробно описывается API драйвера, предоставляющий набор функций для управления эмбоссером.</w:t>
-      </w:r>
-    </w:p>
-    <w:p>
-      <w:pPr>
-        <w:pStyle w:val="Heading3"/>
-      </w:pPr>
-      <w:bookmarkStart w:id="31" w:name="_Toc198558791"/>
-      <w:r>
-        <w:t>3.2.1. Обзор классов и функций API</w:t>
-      </w:r>
-      <w:bookmarkEnd w:id="31"/>
-    </w:p>
-    <w:p>
-      <w:r>
         <w:t>(Перечислите основные классы и функции API с кратким описанием их назначения и параметров.)</w:t>
       </w:r>
     </w:p>
@@ -11580,11 +11734,6 @@
       </w:r>
     </w:p>
     <w:p>
-      <w:pPr>
-        <w:rPr>
-          <w:lang w:val="en-US"/>
-        </w:rPr>
-      </w:pPr>
       <w:proofErr w:type="gramStart"/>
       <w:r>
         <w:rPr>
@@ -11593,9 +11742,6 @@
         <w:t>Connect</w:t>
       </w:r>
       <w:r>
-        <w:rPr>
-          <w:lang w:val="en-US"/>
-        </w:rPr>
         <w:t>(</w:t>
       </w:r>
       <w:proofErr w:type="spellStart"/>
@@ -11608,9 +11754,6 @@
       </w:r>
       <w:proofErr w:type="spellEnd"/>
       <w:r>
-        <w:rPr>
-          <w:lang w:val="en-US"/>
-        </w:rPr>
         <w:t xml:space="preserve"> </w:t>
       </w:r>
       <w:proofErr w:type="spellStart"/>
@@ -11622,9 +11765,6 @@
       </w:r>
       <w:proofErr w:type="spellEnd"/>
       <w:r>
-        <w:rPr>
-          <w:lang w:val="en-US"/>
-        </w:rPr>
         <w:t xml:space="preserve">, </w:t>
       </w:r>
       <w:r>
@@ -11634,57 +11774,41 @@
         <w:t>Configuration</w:t>
       </w:r>
       <w:r>
-        <w:rPr>
-          <w:lang w:val="en-US"/>
-        </w:rPr>
-        <w:t xml:space="preserve"> </w:t>
-      </w:r>
+        <w:t xml:space="preserve"> </w:t>
+      </w:r>
+      <w:proofErr w:type="spellStart"/>
       <w:r>
         <w:rPr>
           <w:lang w:val="en-US"/>
         </w:rPr>
         <w:t>configuration</w:t>
       </w:r>
-      <w:r>
-        <w:rPr>
-          <w:lang w:val="en-US"/>
-        </w:rPr>
+      <w:proofErr w:type="spellEnd"/>
+      <w:r>
         <w:t xml:space="preserve">): </w:t>
       </w:r>
       <w:r>
         <w:t>Устанавливает</w:t>
       </w:r>
       <w:r>
-        <w:rPr>
-          <w:lang w:val="en-US"/>
-        </w:rPr>
         <w:t xml:space="preserve"> </w:t>
       </w:r>
       <w:r>
         <w:t>соединение</w:t>
       </w:r>
       <w:r>
-        <w:rPr>
-          <w:lang w:val="en-US"/>
-        </w:rPr>
         <w:t xml:space="preserve"> </w:t>
       </w:r>
       <w:r>
         <w:t>с</w:t>
       </w:r>
       <w:r>
-        <w:rPr>
-          <w:lang w:val="en-US"/>
-        </w:rPr>
         <w:t xml:space="preserve"> </w:t>
       </w:r>
       <w:r>
         <w:t>эмбоссером</w:t>
       </w:r>
       <w:r>
-        <w:rPr>
-          <w:lang w:val="en-US"/>
-        </w:rPr>
         <w:t>.</w:t>
       </w:r>
     </w:p>
@@ -12109,11 +12233,11 @@
       <w:pPr>
         <w:pStyle w:val="Heading2"/>
       </w:pPr>
-      <w:bookmarkStart w:id="32" w:name="_Toc198558792"/>
+      <w:bookmarkStart w:id="31" w:name="_Toc198558792"/>
       <w:r>
         <w:t>3.2.2. Подробное описание наиболее важных функций</w:t>
       </w:r>
-      <w:bookmarkEnd w:id="32"/>
+      <w:bookmarkEnd w:id="31"/>
     </w:p>
     <w:p>
       <w:r>
@@ -12429,76 +12553,48 @@
         <w:rPr>
           <w:lang w:val="en-US"/>
         </w:rPr>
-        <w:t xml:space="preserve"> Serial: </w:t>
+        <w:t xml:space="preserve"> Serial: struct </w:t>
       </w:r>
       <w:proofErr w:type="spellStart"/>
       <w:r>
         <w:rPr>
           <w:lang w:val="en-US"/>
         </w:rPr>
-        <w:t>struct</w:t>
+        <w:t>SerialConfiguration</w:t>
       </w:r>
       <w:proofErr w:type="spellEnd"/>
       <w:r>
         <w:rPr>
           <w:lang w:val="en-US"/>
         </w:rPr>
-        <w:t xml:space="preserve"> </w:t>
+        <w:t xml:space="preserve"> { string </w:t>
       </w:r>
       <w:proofErr w:type="spellStart"/>
       <w:r>
         <w:rPr>
           <w:lang w:val="en-US"/>
         </w:rPr>
-        <w:t>SerialConfiguration</w:t>
+        <w:t>ComPort</w:t>
       </w:r>
       <w:proofErr w:type="spellEnd"/>
       <w:r>
         <w:rPr>
           <w:lang w:val="en-US"/>
         </w:rPr>
-        <w:t xml:space="preserve"> { string </w:t>
+        <w:t xml:space="preserve">; int </w:t>
       </w:r>
       <w:proofErr w:type="spellStart"/>
       <w:r>
         <w:rPr>
           <w:lang w:val="en-US"/>
         </w:rPr>
-        <w:t>ComPort</w:t>
+        <w:t>BaudRate</w:t>
       </w:r>
       <w:proofErr w:type="spellEnd"/>
       <w:r>
         <w:rPr>
           <w:lang w:val="en-US"/>
         </w:rPr>
-        <w:t xml:space="preserve">; </w:t>
-      </w:r>
-      <w:proofErr w:type="spellStart"/>
-      <w:r>
-        <w:rPr>
-          <w:lang w:val="en-US"/>
-        </w:rPr>
-        <w:t>int</w:t>
-      </w:r>
-      <w:proofErr w:type="spellEnd"/>
-      <w:r>
-        <w:rPr>
-          <w:lang w:val="en-US"/>
-        </w:rPr>
-        <w:t xml:space="preserve"> </w:t>
-      </w:r>
-      <w:proofErr w:type="spellStart"/>
-      <w:r>
-        <w:rPr>
-          <w:lang w:val="en-US"/>
-        </w:rPr>
-        <w:t>BaudRate</w:t>
-      </w:r>
-      <w:proofErr w:type="spellEnd"/>
-      <w:r>
-        <w:rPr>
-          <w:lang w:val="en-US"/>
-        </w:rPr>
         <w:t>; }.</w:t>
       </w:r>
     </w:p>
@@ -12533,32 +12629,32 @@
           <w:lang w:val="en-US"/>
         </w:rPr>
       </w:pPr>
+      <w:r>
+        <w:rPr>
+          <w:lang w:val="en-US"/>
+        </w:rPr>
+        <w:t xml:space="preserve">int </w:t>
+      </w:r>
       <w:proofErr w:type="gramStart"/>
       <w:r>
         <w:rPr>
-          <w:lang w:val="en-US"/>
-        </w:rPr>
-        <w:t>int</w:t>
+          <w:bCs/>
+          <w:lang w:val="en-US"/>
+        </w:rPr>
+        <w:t>main</w:t>
+      </w:r>
+      <w:r>
+        <w:rPr>
+          <w:lang w:val="en-US"/>
+        </w:rPr>
+        <w:t>(</w:t>
       </w:r>
       <w:proofErr w:type="gramEnd"/>
       <w:r>
         <w:rPr>
           <w:lang w:val="en-US"/>
         </w:rPr>
-        <w:t xml:space="preserve"> </w:t>
-      </w:r>
-      <w:r>
-        <w:rPr>
-          <w:bCs/>
-          <w:lang w:val="en-US"/>
-        </w:rPr>
-        <w:t>main</w:t>
-      </w:r>
-      <w:r>
-        <w:rPr>
-          <w:lang w:val="en-US"/>
-        </w:rPr>
-        <w:t>() {</w:t>
+        <w:t>) {</w:t>
       </w:r>
     </w:p>
     <w:p>
@@ -12725,11 +12821,673 @@
         <w:t>driver.Connect</w:t>
       </w:r>
       <w:proofErr w:type="spellEnd"/>
+      <w:proofErr w:type="gramEnd"/>
       <w:r>
         <w:rPr>
           <w:lang w:val="en-US"/>
         </w:rPr>
         <w:t>(</w:t>
+      </w:r>
+      <w:proofErr w:type="spellStart"/>
+      <w:proofErr w:type="gramStart"/>
+      <w:r>
+        <w:rPr>
+          <w:lang w:val="en-US"/>
+        </w:rPr>
+        <w:t>InterfaceType</w:t>
+      </w:r>
+      <w:proofErr w:type="spellEnd"/>
+      <w:r>
+        <w:rPr>
+          <w:lang w:val="en-US"/>
+        </w:rPr>
+        <w:t>::</w:t>
+      </w:r>
+      <w:proofErr w:type="gramEnd"/>
+      <w:r>
+        <w:rPr>
+          <w:lang w:val="en-US"/>
+        </w:rPr>
+        <w:t xml:space="preserve">Serial, </w:t>
+      </w:r>
+      <w:proofErr w:type="spellStart"/>
+      <w:r>
+        <w:rPr>
+          <w:lang w:val="en-US"/>
+        </w:rPr>
+        <w:t>serialConfig</w:t>
+      </w:r>
+      <w:proofErr w:type="spellEnd"/>
+      <w:r>
+        <w:rPr>
+          <w:lang w:val="en-US"/>
+        </w:rPr>
+        <w:t>);</w:t>
+      </w:r>
+    </w:p>
+    <w:p>
+      <w:pPr>
+        <w:rPr>
+          <w:lang w:val="en-US"/>
+        </w:rPr>
+      </w:pPr>
+    </w:p>
+    <w:p>
+      <w:r>
+        <w:rPr>
+          <w:lang w:val="en-US"/>
+        </w:rPr>
+        <w:t xml:space="preserve">    </w:t>
+      </w:r>
+      <w:r>
+        <w:rPr>
+          <w:bCs/>
+        </w:rPr>
+        <w:t>if</w:t>
+      </w:r>
+      <w:r>
+        <w:t xml:space="preserve"> (result == DRV_SUCCESS) {</w:t>
+      </w:r>
+    </w:p>
+    <w:p>
+      <w:r>
+        <w:t xml:space="preserve">        std::cout &lt;&lt; "Соединение установлено успешно!" &lt;&lt; std::endl;</w:t>
+      </w:r>
+    </w:p>
+    <w:p>
+      <w:r>
+        <w:lastRenderedPageBreak/>
+        <w:t xml:space="preserve">    } </w:t>
+      </w:r>
+      <w:r>
+        <w:rPr>
+          <w:bCs/>
+        </w:rPr>
+        <w:t>else</w:t>
+      </w:r>
+      <w:r>
+        <w:t xml:space="preserve"> {</w:t>
+      </w:r>
+    </w:p>
+    <w:p>
+      <w:r>
+        <w:t xml:space="preserve">        std::cerr &lt;&lt; "Ошибка соединения: " &lt;&lt; result &lt;&lt; std::endl;</w:t>
+      </w:r>
+    </w:p>
+    <w:p>
+      <w:r>
+        <w:t xml:space="preserve">    }</w:t>
+      </w:r>
+    </w:p>
+    <w:p/>
+    <w:p>
+      <w:r>
+        <w:t xml:space="preserve">    </w:t>
+      </w:r>
+      <w:r>
+        <w:rPr>
+          <w:bCs/>
+        </w:rPr>
+        <w:t>return</w:t>
+      </w:r>
+      <w:r>
+        <w:t xml:space="preserve"> 0;</w:t>
+      </w:r>
+    </w:p>
+    <w:p>
+      <w:r>
+        <w:t>}</w:t>
+      </w:r>
+    </w:p>
+    <w:p>
+      <w:r>
+        <w:t>c++</w:t>
+      </w:r>
+    </w:p>
+    <w:p>
+      <w:r>
+        <w:rPr>
+          <w:bCs/>
+        </w:rPr>
+        <w:t>(Пример кода для EmbossCharacter или другой ключевой функции)</w:t>
+      </w:r>
+    </w:p>
+    <w:p>
+      <w:pPr>
+        <w:pStyle w:val="Heading2"/>
+      </w:pPr>
+      <w:bookmarkStart w:id="32" w:name="_Toc198558793"/>
+      <w:r>
+        <w:t>3.3. Процесс установки и настройки драйвера</w:t>
+      </w:r>
+      <w:bookmarkEnd w:id="32"/>
+    </w:p>
+    <w:p>
+      <w:r>
+        <w:t>В этом разделе описывается процесс установки и настройки разработанного драйвера в операционной системе.</w:t>
+      </w:r>
+    </w:p>
+    <w:p>
+      <w:pPr>
+        <w:pStyle w:val="Heading3"/>
+      </w:pPr>
+      <w:bookmarkStart w:id="33" w:name="_Toc198558794"/>
+      <w:r>
+        <w:t>3.3.1. Системные требования:</w:t>
+      </w:r>
+      <w:bookmarkEnd w:id="33"/>
+    </w:p>
+    <w:p>
+      <w:r>
+        <w:t>Операционная система: (Укажите поддерживаемые операционные системы)</w:t>
+      </w:r>
+    </w:p>
+    <w:p>
+      <w:r>
+        <w:t>Аппаратное обеспечение: (Укажите минимальные требования к аппаратному обеспечению)</w:t>
+      </w:r>
+    </w:p>
+    <w:p>
+      <w:r>
+        <w:t>Зависимости: (Укажите необходимые библиотеки или компоненты, которые должны быть установлены)</w:t>
+      </w:r>
+    </w:p>
+    <w:p>
+      <w:pPr>
+        <w:pStyle w:val="Heading3"/>
+      </w:pPr>
+      <w:bookmarkStart w:id="34" w:name="_Toc198558795"/>
+      <w:r>
+        <w:t>3.3.2. Порядок установки:</w:t>
+      </w:r>
+      <w:bookmarkEnd w:id="34"/>
+    </w:p>
+    <w:p>
+      <w:r>
+        <w:t>(Опишите шаги по установке драйвера. Например:</w:t>
+      </w:r>
+    </w:p>
+    <w:p>
+      <w:r>
+        <w:t>Запустите установочный файл setup.exe.</w:t>
+      </w:r>
+    </w:p>
+    <w:p>
+      <w:r>
+        <w:t>Следуйте инструкциям на экране.</w:t>
+      </w:r>
+    </w:p>
+    <w:p>
+      <w:r>
+        <w:t>Выберите каталог установки.</w:t>
+      </w:r>
+    </w:p>
+    <w:p>
+      <w:r>
+        <w:t>Подключите эмбоссер к компьютеру.</w:t>
+      </w:r>
+    </w:p>
+    <w:p>
+      <w:r>
+        <w:t>Операционная система должна автоматически обнаружить новое устройство и установить драйвер.</w:t>
+      </w:r>
+    </w:p>
+    <w:p>
+      <w:r>
+        <w:t>Если драйвер не устанавливается автоматически, укажите путь к каталогу с драйвером вручную через диспетчер устройств.</w:t>
+      </w:r>
+    </w:p>
+    <w:p>
+      <w:r>
+        <w:t>)</w:t>
+      </w:r>
+    </w:p>
+    <w:p>
+      <w:pPr>
+        <w:pStyle w:val="Heading3"/>
+      </w:pPr>
+      <w:bookmarkStart w:id="35" w:name="_Toc198558796"/>
+      <w:r>
+        <w:t>3.3.3. Настройка драйвера:</w:t>
+      </w:r>
+      <w:bookmarkEnd w:id="35"/>
+    </w:p>
+    <w:p>
+      <w:r>
+        <w:t>(Опишите способы настройки драйвера. Например:</w:t>
+      </w:r>
+    </w:p>
+    <w:p>
+      <w:r>
+        <w:lastRenderedPageBreak/>
+        <w:t>Настройка параметров соединения: Укажите COM-порт, скорость передачи данных или IP-адрес эмбоссера через графический интерфейс настройки (если таковой имеется), или через конфигурационный файл.</w:t>
+      </w:r>
+    </w:p>
+    <w:p>
+      <w:r>
+        <w:t>Настройка параметров инициализации: При необходимости, укажите параметры инициализации эмбоссера, специфичные для конкретной модели.</w:t>
+      </w:r>
+    </w:p>
+    <w:p>
+      <w:r>
+        <w:t>)</w:t>
+      </w:r>
+    </w:p>
+    <w:p>
+      <w:pPr>
+        <w:pStyle w:val="Heading2"/>
+      </w:pPr>
+      <w:bookmarkStart w:id="36" w:name="_Toc198558797"/>
+      <w:r>
+        <w:t>3.4. Примеры использования драйвера</w:t>
+      </w:r>
+      <w:bookmarkEnd w:id="36"/>
+    </w:p>
+    <w:p>
+      <w:r>
+        <w:t>В этом разделе приводятся примеры кода на языке </w:t>
+      </w:r>
+      <w:r>
+        <w:rPr>
+          <w:i/>
+          <w:iCs/>
+        </w:rPr>
+        <w:t>(Укажите язык, например, C++)</w:t>
+      </w:r>
+      <w:r>
+        <w:t>, демонстрирующие использование драйвера для выполнения основных операций с эмбоссером.</w:t>
+      </w:r>
+    </w:p>
+    <w:p>
+      <w:pPr>
+        <w:pStyle w:val="Heading3"/>
+      </w:pPr>
+      <w:bookmarkStart w:id="37" w:name="_Toc198558798"/>
+      <w:r>
+        <w:t>3.4.1. Установление соединения и получение статуса:</w:t>
+      </w:r>
+      <w:bookmarkEnd w:id="37"/>
+    </w:p>
+    <w:p>
+      <w:pPr>
+        <w:rPr>
+          <w:lang w:val="en-US"/>
+        </w:rPr>
+      </w:pPr>
+      <w:r>
+        <w:rPr>
+          <w:lang w:val="en-US"/>
+        </w:rPr>
+        <w:t>#</w:t>
+      </w:r>
+      <w:r>
+        <w:rPr>
+          <w:bCs/>
+          <w:lang w:val="en-US"/>
+        </w:rPr>
+        <w:t>include</w:t>
+      </w:r>
+      <w:r>
+        <w:rPr>
+          <w:lang w:val="en-US"/>
+        </w:rPr>
+        <w:t xml:space="preserve"> "</w:t>
+      </w:r>
+      <w:proofErr w:type="spellStart"/>
+      <w:r>
+        <w:rPr>
+          <w:lang w:val="en-US"/>
+        </w:rPr>
+        <w:t>EmbosserDriver.h</w:t>
+      </w:r>
+      <w:proofErr w:type="spellEnd"/>
+      <w:r>
+        <w:rPr>
+          <w:lang w:val="en-US"/>
+        </w:rPr>
+        <w:t>"</w:t>
+      </w:r>
+    </w:p>
+    <w:p>
+      <w:pPr>
+        <w:rPr>
+          <w:lang w:val="en-US"/>
+        </w:rPr>
+      </w:pPr>
+      <w:r>
+        <w:rPr>
+          <w:lang w:val="en-US"/>
+        </w:rPr>
+        <w:t>#</w:t>
+      </w:r>
+      <w:r>
+        <w:rPr>
+          <w:bCs/>
+          <w:lang w:val="en-US"/>
+        </w:rPr>
+        <w:t>include</w:t>
+      </w:r>
+      <w:r>
+        <w:rPr>
+          <w:lang w:val="en-US"/>
+        </w:rPr>
+        <w:t xml:space="preserve"> &lt;iostream&gt;</w:t>
+      </w:r>
+    </w:p>
+    <w:p>
+      <w:pPr>
+        <w:rPr>
+          <w:lang w:val="en-US"/>
+        </w:rPr>
+      </w:pPr>
+    </w:p>
+    <w:p>
+      <w:pPr>
+        <w:rPr>
+          <w:lang w:val="en-US"/>
+        </w:rPr>
+      </w:pPr>
+      <w:r>
+        <w:rPr>
+          <w:lang w:val="en-US"/>
+        </w:rPr>
+        <w:t xml:space="preserve">int </w:t>
+      </w:r>
+      <w:proofErr w:type="gramStart"/>
+      <w:r>
+        <w:rPr>
+          <w:bCs/>
+          <w:lang w:val="en-US"/>
+        </w:rPr>
+        <w:t>main</w:t>
+      </w:r>
+      <w:r>
+        <w:rPr>
+          <w:lang w:val="en-US"/>
+        </w:rPr>
+        <w:t>(</w:t>
+      </w:r>
+      <w:proofErr w:type="gramEnd"/>
+      <w:r>
+        <w:rPr>
+          <w:lang w:val="en-US"/>
+        </w:rPr>
+        <w:t>) {</w:t>
+      </w:r>
+    </w:p>
+    <w:p>
+      <w:pPr>
+        <w:rPr>
+          <w:lang w:val="en-US"/>
+        </w:rPr>
+      </w:pPr>
+      <w:r>
+        <w:rPr>
+          <w:lang w:val="en-US"/>
+        </w:rPr>
+        <w:t xml:space="preserve">    </w:t>
+      </w:r>
+      <w:proofErr w:type="spellStart"/>
+      <w:r>
+        <w:rPr>
+          <w:lang w:val="en-US"/>
+        </w:rPr>
+        <w:t>EmbosserDriver</w:t>
+      </w:r>
+      <w:proofErr w:type="spellEnd"/>
+      <w:r>
+        <w:rPr>
+          <w:lang w:val="en-US"/>
+        </w:rPr>
+        <w:t xml:space="preserve"> driver;</w:t>
+      </w:r>
+    </w:p>
+    <w:p>
+      <w:pPr>
+        <w:rPr>
+          <w:lang w:val="en-US"/>
+        </w:rPr>
+      </w:pPr>
+      <w:r>
+        <w:rPr>
+          <w:lang w:val="en-US"/>
+        </w:rPr>
+        <w:t xml:space="preserve">    </w:t>
+      </w:r>
+      <w:proofErr w:type="spellStart"/>
+      <w:r>
+        <w:rPr>
+          <w:lang w:val="en-US"/>
+        </w:rPr>
+        <w:t>SerialConfiguration</w:t>
+      </w:r>
+      <w:proofErr w:type="spellEnd"/>
+      <w:r>
+        <w:rPr>
+          <w:lang w:val="en-US"/>
+        </w:rPr>
+        <w:t xml:space="preserve"> </w:t>
+      </w:r>
+      <w:proofErr w:type="spellStart"/>
+      <w:r>
+        <w:rPr>
+          <w:lang w:val="en-US"/>
+        </w:rPr>
+        <w:t>serialConfig</w:t>
+      </w:r>
+      <w:proofErr w:type="spellEnd"/>
+      <w:r>
+        <w:rPr>
+          <w:lang w:val="en-US"/>
+        </w:rPr>
+        <w:t>;</w:t>
+      </w:r>
+    </w:p>
+    <w:p>
+      <w:pPr>
+        <w:rPr>
+          <w:lang w:val="en-US"/>
+        </w:rPr>
+      </w:pPr>
+      <w:r>
+        <w:rPr>
+          <w:lang w:val="en-US"/>
+        </w:rPr>
+        <w:t xml:space="preserve">    </w:t>
+      </w:r>
+      <w:proofErr w:type="spellStart"/>
+      <w:r>
+        <w:rPr>
+          <w:lang w:val="en-US"/>
+        </w:rPr>
+        <w:t>serialConfig.ComPort</w:t>
+      </w:r>
+      <w:proofErr w:type="spellEnd"/>
+      <w:r>
+        <w:rPr>
+          <w:lang w:val="en-US"/>
+        </w:rPr>
+        <w:t xml:space="preserve"> = "COM1";</w:t>
+      </w:r>
+    </w:p>
+    <w:p>
+      <w:pPr>
+        <w:rPr>
+          <w:lang w:val="en-US"/>
+        </w:rPr>
+      </w:pPr>
+      <w:r>
+        <w:rPr>
+          <w:lang w:val="en-US"/>
+        </w:rPr>
+        <w:t xml:space="preserve">    </w:t>
+      </w:r>
+      <w:proofErr w:type="spellStart"/>
+      <w:r>
+        <w:rPr>
+          <w:lang w:val="en-US"/>
+        </w:rPr>
+        <w:t>serialConfig.BaudRate</w:t>
+      </w:r>
+      <w:proofErr w:type="spellEnd"/>
+      <w:r>
+        <w:rPr>
+          <w:lang w:val="en-US"/>
+        </w:rPr>
+        <w:t xml:space="preserve"> = 9600;</w:t>
+      </w:r>
+    </w:p>
+    <w:p>
+      <w:pPr>
+        <w:rPr>
+          <w:lang w:val="en-US"/>
+        </w:rPr>
+      </w:pPr>
+    </w:p>
+    <w:p>
+      <w:pPr>
+        <w:rPr>
+          <w:lang w:val="en-US"/>
+        </w:rPr>
+      </w:pPr>
+      <w:r>
+        <w:rPr>
+          <w:lang w:val="en-US"/>
+        </w:rPr>
+        <w:t xml:space="preserve">    </w:t>
+      </w:r>
+      <w:proofErr w:type="spellStart"/>
+      <w:r>
+        <w:rPr>
+          <w:lang w:val="en-US"/>
+        </w:rPr>
+        <w:t>ErrorCode</w:t>
+      </w:r>
+      <w:proofErr w:type="spellEnd"/>
+      <w:r>
+        <w:rPr>
+          <w:lang w:val="en-US"/>
+        </w:rPr>
+        <w:t xml:space="preserve"> result = </w:t>
+      </w:r>
+      <w:proofErr w:type="spellStart"/>
+      <w:proofErr w:type="gramStart"/>
+      <w:r>
+        <w:rPr>
+          <w:lang w:val="en-US"/>
+        </w:rPr>
+        <w:t>driver.Connect</w:t>
+      </w:r>
+      <w:proofErr w:type="spellEnd"/>
+      <w:proofErr w:type="gramEnd"/>
+      <w:r>
+        <w:rPr>
+          <w:lang w:val="en-US"/>
+        </w:rPr>
+        <w:t>(</w:t>
+      </w:r>
+      <w:proofErr w:type="spellStart"/>
+      <w:proofErr w:type="gramStart"/>
+      <w:r>
+        <w:rPr>
+          <w:lang w:val="en-US"/>
+        </w:rPr>
+        <w:t>InterfaceType</w:t>
+      </w:r>
+      <w:proofErr w:type="spellEnd"/>
+      <w:r>
+        <w:rPr>
+          <w:lang w:val="en-US"/>
+        </w:rPr>
+        <w:t>::</w:t>
+      </w:r>
+      <w:proofErr w:type="gramEnd"/>
+      <w:r>
+        <w:rPr>
+          <w:lang w:val="en-US"/>
+        </w:rPr>
+        <w:t xml:space="preserve">Serial, </w:t>
+      </w:r>
+      <w:proofErr w:type="spellStart"/>
+      <w:r>
+        <w:rPr>
+          <w:lang w:val="en-US"/>
+        </w:rPr>
+        <w:t>serialConfig</w:t>
+      </w:r>
+      <w:proofErr w:type="spellEnd"/>
+      <w:r>
+        <w:rPr>
+          <w:lang w:val="en-US"/>
+        </w:rPr>
+        <w:t>);</w:t>
+      </w:r>
+    </w:p>
+    <w:p>
+      <w:pPr>
+        <w:rPr>
+          <w:lang w:val="en-US"/>
+        </w:rPr>
+      </w:pPr>
+    </w:p>
+    <w:p>
+      <w:pPr>
+        <w:rPr>
+          <w:lang w:val="en-US"/>
+        </w:rPr>
+      </w:pPr>
+      <w:r>
+        <w:rPr>
+          <w:lang w:val="en-US"/>
+        </w:rPr>
+        <w:t xml:space="preserve">    </w:t>
+      </w:r>
+      <w:r>
+        <w:rPr>
+          <w:bCs/>
+          <w:lang w:val="en-US"/>
+        </w:rPr>
+        <w:t>if</w:t>
+      </w:r>
+      <w:r>
+        <w:rPr>
+          <w:lang w:val="en-US"/>
+        </w:rPr>
+        <w:t xml:space="preserve"> (</w:t>
+      </w:r>
+      <w:proofErr w:type="gramStart"/>
+      <w:r>
+        <w:rPr>
+          <w:lang w:val="en-US"/>
+        </w:rPr>
+        <w:t>result !</w:t>
+      </w:r>
+      <w:proofErr w:type="gramEnd"/>
+      <w:r>
+        <w:rPr>
+          <w:lang w:val="en-US"/>
+        </w:rPr>
+        <w:t>= DRV_SUCCESS) {</w:t>
+      </w:r>
+    </w:p>
+    <w:p>
+      <w:pPr>
+        <w:rPr>
+          <w:lang w:val="en-US"/>
+        </w:rPr>
+      </w:pPr>
+      <w:r>
+        <w:rPr>
+          <w:lang w:val="en-US"/>
+        </w:rPr>
+        <w:t xml:space="preserve">        </w:t>
+      </w:r>
+      <w:proofErr w:type="gramStart"/>
+      <w:r>
+        <w:rPr>
+          <w:lang w:val="en-US"/>
+        </w:rPr>
+        <w:t>std::</w:t>
       </w:r>
       <w:proofErr w:type="spellStart"/>
       <w:proofErr w:type="gramEnd"/>
@@ -12737,534 +13495,140 @@
         <w:rPr>
           <w:lang w:val="en-US"/>
         </w:rPr>
-        <w:t>InterfaceType</w:t>
+        <w:t>cerr</w:t>
       </w:r>
       <w:proofErr w:type="spellEnd"/>
       <w:r>
         <w:rPr>
           <w:lang w:val="en-US"/>
         </w:rPr>
-        <w:t xml:space="preserve">::Serial, </w:t>
+        <w:t xml:space="preserve"> &lt;&lt; "</w:t>
+      </w:r>
+      <w:r>
+        <w:t>Ошибка</w:t>
+      </w:r>
+      <w:r>
+        <w:rPr>
+          <w:lang w:val="en-US"/>
+        </w:rPr>
+        <w:t xml:space="preserve"> </w:t>
+      </w:r>
+      <w:r>
+        <w:t>соединения</w:t>
+      </w:r>
+      <w:r>
+        <w:rPr>
+          <w:lang w:val="en-US"/>
+        </w:rPr>
+        <w:t xml:space="preserve">: " &lt;&lt; result &lt;&lt; </w:t>
+      </w:r>
+      <w:proofErr w:type="gramStart"/>
+      <w:r>
+        <w:rPr>
+          <w:lang w:val="en-US"/>
+        </w:rPr>
+        <w:t>std::</w:t>
       </w:r>
       <w:proofErr w:type="spellStart"/>
-      <w:r>
-        <w:rPr>
-          <w:lang w:val="en-US"/>
-        </w:rPr>
-        <w:t>serialConfig</w:t>
+      <w:proofErr w:type="gramEnd"/>
+      <w:r>
+        <w:rPr>
+          <w:lang w:val="en-US"/>
+        </w:rPr>
+        <w:t>endl</w:t>
       </w:r>
       <w:proofErr w:type="spellEnd"/>
       <w:r>
         <w:rPr>
           <w:lang w:val="en-US"/>
         </w:rPr>
-        <w:t>);</w:t>
-      </w:r>
-    </w:p>
-    <w:p>
-      <w:pPr>
-        <w:rPr>
-          <w:lang w:val="en-US"/>
-        </w:rPr>
-      </w:pPr>
-    </w:p>
-    <w:p>
+        <w:t>;</w:t>
+      </w:r>
+    </w:p>
+    <w:p>
+      <w:pPr>
+        <w:rPr>
+          <w:lang w:val="en-US"/>
+        </w:rPr>
+      </w:pPr>
+      <w:r>
+        <w:rPr>
+          <w:lang w:val="en-US"/>
+        </w:rPr>
+        <w:t xml:space="preserve">        </w:t>
+      </w:r>
+      <w:r>
+        <w:rPr>
+          <w:bCs/>
+          <w:lang w:val="en-US"/>
+        </w:rPr>
+        <w:t>return</w:t>
+      </w:r>
+      <w:r>
+        <w:rPr>
+          <w:lang w:val="en-US"/>
+        </w:rPr>
+        <w:t xml:space="preserve"> 1;</w:t>
+      </w:r>
+    </w:p>
+    <w:p>
+      <w:pPr>
+        <w:rPr>
+          <w:lang w:val="en-US"/>
+        </w:rPr>
+      </w:pPr>
+      <w:r>
+        <w:rPr>
+          <w:lang w:val="en-US"/>
+        </w:rPr>
+        <w:t xml:space="preserve">    }</w:t>
+      </w:r>
+    </w:p>
+    <w:p>
+      <w:pPr>
+        <w:rPr>
+          <w:lang w:val="en-US"/>
+        </w:rPr>
+      </w:pPr>
+    </w:p>
+    <w:p>
+      <w:pPr>
+        <w:rPr>
+          <w:lang w:val="en-US"/>
+        </w:rPr>
+      </w:pPr>
       <w:r>
         <w:rPr>
           <w:lang w:val="en-US"/>
         </w:rPr>
         <w:t xml:space="preserve">    </w:t>
       </w:r>
-      <w:r>
-        <w:rPr>
-          <w:bCs/>
-        </w:rPr>
-        <w:t>if</w:t>
-      </w:r>
-      <w:r>
-        <w:t xml:space="preserve"> (result == DRV_SUCCESS) {</w:t>
-      </w:r>
-    </w:p>
-    <w:p>
-      <w:r>
-        <w:t xml:space="preserve">        std::cout &lt;&lt; "Соединение установлено успешно!" &lt;&lt; std::endl;</w:t>
-      </w:r>
-    </w:p>
-    <w:p>
-      <w:r>
-        <w:lastRenderedPageBreak/>
-        <w:t xml:space="preserve">    } </w:t>
-      </w:r>
-      <w:r>
-        <w:rPr>
-          <w:bCs/>
-        </w:rPr>
-        <w:t>else</w:t>
-      </w:r>
-      <w:r>
-        <w:t xml:space="preserve"> {</w:t>
-      </w:r>
-    </w:p>
-    <w:p>
-      <w:r>
-        <w:t xml:space="preserve">        std::cerr &lt;&lt; "Ошибка соединения: " &lt;&lt; result &lt;&lt; std::endl;</w:t>
-      </w:r>
-    </w:p>
-    <w:p>
-      <w:r>
-        <w:t xml:space="preserve">    }</w:t>
-      </w:r>
-    </w:p>
-    <w:p/>
-    <w:p>
-      <w:r>
-        <w:t xml:space="preserve">    </w:t>
-      </w:r>
-      <w:r>
-        <w:rPr>
-          <w:bCs/>
-        </w:rPr>
-        <w:t>return</w:t>
-      </w:r>
-      <w:r>
-        <w:t xml:space="preserve"> 0;</w:t>
-      </w:r>
-    </w:p>
-    <w:p>
-      <w:r>
-        <w:t>}</w:t>
-      </w:r>
-    </w:p>
-    <w:p>
-      <w:r>
-        <w:t>c++</w:t>
-      </w:r>
-    </w:p>
-    <w:p>
-      <w:r>
-        <w:rPr>
-          <w:bCs/>
-        </w:rPr>
-        <w:t>(Пример кода для EmbossCharacter или другой ключевой функции)</w:t>
-      </w:r>
-    </w:p>
-    <w:p>
-      <w:pPr>
-        <w:pStyle w:val="Heading2"/>
-      </w:pPr>
-      <w:bookmarkStart w:id="33" w:name="_Toc198558793"/>
-      <w:r>
-        <w:t>3.3. Процесс установки и настройки драйвера</w:t>
-      </w:r>
-      <w:bookmarkEnd w:id="33"/>
-    </w:p>
-    <w:p>
-      <w:r>
-        <w:t>В этом разделе описывается процесс установки и настройки разработанного драйвера в операционной системе.</w:t>
-      </w:r>
-    </w:p>
-    <w:p>
-      <w:pPr>
-        <w:pStyle w:val="Heading3"/>
-      </w:pPr>
-      <w:bookmarkStart w:id="34" w:name="_Toc198558794"/>
-      <w:r>
-        <w:t>3.3.1. Системные требования:</w:t>
-      </w:r>
-      <w:bookmarkEnd w:id="34"/>
-    </w:p>
-    <w:p>
-      <w:r>
-        <w:t>Операционная система: (Укажите поддерживаемые операционные системы)</w:t>
-      </w:r>
-    </w:p>
-    <w:p>
-      <w:r>
-        <w:t>Аппаратное обеспечение: (Укажите минимальные требования к аппаратному обеспечению)</w:t>
-      </w:r>
-    </w:p>
-    <w:p>
-      <w:r>
-        <w:t>Зависимости: (Укажите необходимые библиотеки или компоненты, которые должны быть установлены)</w:t>
-      </w:r>
-    </w:p>
-    <w:p>
-      <w:pPr>
-        <w:pStyle w:val="Heading3"/>
-      </w:pPr>
-      <w:bookmarkStart w:id="35" w:name="_Toc198558795"/>
-      <w:r>
-        <w:t>3.3.2. Порядок установки:</w:t>
-      </w:r>
-      <w:bookmarkEnd w:id="35"/>
-    </w:p>
-    <w:p>
-      <w:r>
-        <w:t>(Опишите шаги по установке драйвера. Например:</w:t>
-      </w:r>
-    </w:p>
-    <w:p>
-      <w:r>
-        <w:t>Запустите установочный файл setup.exe.</w:t>
-      </w:r>
-    </w:p>
-    <w:p>
-      <w:r>
-        <w:t>Следуйте инструкциям на экране.</w:t>
-      </w:r>
-    </w:p>
-    <w:p>
-      <w:r>
-        <w:t>Выберите каталог установки.</w:t>
-      </w:r>
-    </w:p>
-    <w:p>
-      <w:r>
-        <w:t>Подключите эмбоссер к компьютеру.</w:t>
-      </w:r>
-    </w:p>
-    <w:p>
-      <w:r>
-        <w:t>Операционная система должна автоматически обнаружить новое устройство и установить драйвер.</w:t>
-      </w:r>
-    </w:p>
-    <w:p>
-      <w:r>
-        <w:t>Если драйвер не устанавливается автоматически, укажите путь к каталогу с драйвером вручную через диспетчер устройств.</w:t>
-      </w:r>
-    </w:p>
-    <w:p>
-      <w:r>
-        <w:t>)</w:t>
-      </w:r>
-    </w:p>
-    <w:p>
-      <w:pPr>
-        <w:pStyle w:val="Heading3"/>
-      </w:pPr>
-      <w:bookmarkStart w:id="36" w:name="_Toc198558796"/>
-      <w:r>
-        <w:t>3.3.3. Настройка драйвера:</w:t>
-      </w:r>
-      <w:bookmarkEnd w:id="36"/>
-    </w:p>
-    <w:p>
-      <w:r>
-        <w:t>(Опишите способы настройки драйвера. Например:</w:t>
-      </w:r>
-    </w:p>
-    <w:p>
-      <w:r>
-        <w:lastRenderedPageBreak/>
-        <w:t>Настройка параметров соединения: Укажите COM-порт, скорость передачи данных или IP-адрес эмбоссера через графический интерфейс настройки (если таковой имеется), или через конфигурационный файл.</w:t>
-      </w:r>
-    </w:p>
-    <w:p>
-      <w:r>
-        <w:t>Настройка параметров инициализации: При необходимости, укажите параметры инициализации эмбоссера, специфичные для конкретной модели.</w:t>
-      </w:r>
-    </w:p>
-    <w:p>
-      <w:r>
-        <w:t>)</w:t>
-      </w:r>
-    </w:p>
-    <w:p>
-      <w:pPr>
-        <w:pStyle w:val="Heading2"/>
-      </w:pPr>
-      <w:bookmarkStart w:id="37" w:name="_Toc198558797"/>
-      <w:r>
-        <w:t>3.4. Примеры использования драйвера</w:t>
-      </w:r>
-      <w:bookmarkEnd w:id="37"/>
-    </w:p>
-    <w:p>
-      <w:r>
-        <w:t>В этом разделе приводятся примеры кода на языке </w:t>
-      </w:r>
-      <w:r>
-        <w:rPr>
-          <w:i/>
-          <w:iCs/>
-        </w:rPr>
-        <w:t>(Укажите язык, например, C++)</w:t>
-      </w:r>
-      <w:r>
-        <w:t>, демонстрирующие использование драйвера для выполнения основных операций с эмбоссером.</w:t>
-      </w:r>
-    </w:p>
-    <w:p>
-      <w:pPr>
-        <w:pStyle w:val="Heading3"/>
-      </w:pPr>
-      <w:bookmarkStart w:id="38" w:name="_Toc198558798"/>
-      <w:r>
-        <w:t>3.4.1. Установление соединения и получение статуса:</w:t>
-      </w:r>
-      <w:bookmarkEnd w:id="38"/>
-    </w:p>
-    <w:p>
-      <w:pPr>
-        <w:rPr>
-          <w:lang w:val="en-US"/>
-        </w:rPr>
-      </w:pPr>
-      <w:r>
-        <w:rPr>
-          <w:lang w:val="en-US"/>
-        </w:rPr>
-        <w:t>#</w:t>
-      </w:r>
-      <w:r>
-        <w:rPr>
-          <w:bCs/>
-          <w:lang w:val="en-US"/>
-        </w:rPr>
-        <w:t>include</w:t>
-      </w:r>
-      <w:r>
-        <w:rPr>
-          <w:lang w:val="en-US"/>
-        </w:rPr>
-        <w:t xml:space="preserve"> "</w:t>
-      </w:r>
       <w:proofErr w:type="spellStart"/>
       <w:r>
         <w:rPr>
           <w:lang w:val="en-US"/>
         </w:rPr>
-        <w:t>EmbosserDriver.h</w:t>
+        <w:t>EmbosserStatus</w:t>
       </w:r>
       <w:proofErr w:type="spellEnd"/>
       <w:r>
         <w:rPr>
           <w:lang w:val="en-US"/>
         </w:rPr>
-        <w:t>"</w:t>
-      </w:r>
-    </w:p>
-    <w:p>
-      <w:pPr>
-        <w:rPr>
-          <w:lang w:val="en-US"/>
-        </w:rPr>
-      </w:pPr>
-      <w:r>
-        <w:rPr>
-          <w:lang w:val="en-US"/>
-        </w:rPr>
-        <w:t>#</w:t>
-      </w:r>
-      <w:r>
-        <w:rPr>
-          <w:bCs/>
-          <w:lang w:val="en-US"/>
-        </w:rPr>
-        <w:t>include</w:t>
-      </w:r>
-      <w:r>
-        <w:rPr>
-          <w:lang w:val="en-US"/>
-        </w:rPr>
-        <w:t xml:space="preserve"> &lt;iostream&gt;</w:t>
-      </w:r>
-    </w:p>
-    <w:p>
-      <w:pPr>
-        <w:rPr>
-          <w:lang w:val="en-US"/>
-        </w:rPr>
-      </w:pPr>
-    </w:p>
-    <w:p>
-      <w:pPr>
-        <w:rPr>
-          <w:lang w:val="en-US"/>
-        </w:rPr>
-      </w:pPr>
-      <w:proofErr w:type="gramStart"/>
-      <w:r>
-        <w:rPr>
-          <w:lang w:val="en-US"/>
-        </w:rPr>
-        <w:t>int</w:t>
-      </w:r>
-      <w:proofErr w:type="gramEnd"/>
-      <w:r>
-        <w:rPr>
-          <w:lang w:val="en-US"/>
-        </w:rPr>
-        <w:t xml:space="preserve"> </w:t>
-      </w:r>
-      <w:r>
-        <w:rPr>
-          <w:bCs/>
-          <w:lang w:val="en-US"/>
-        </w:rPr>
-        <w:t>main</w:t>
-      </w:r>
-      <w:r>
-        <w:rPr>
-          <w:lang w:val="en-US"/>
-        </w:rPr>
-        <w:t>() {</w:t>
-      </w:r>
-    </w:p>
-    <w:p>
-      <w:pPr>
-        <w:rPr>
-          <w:lang w:val="en-US"/>
-        </w:rPr>
-      </w:pPr>
-      <w:r>
-        <w:rPr>
-          <w:lang w:val="en-US"/>
-        </w:rPr>
-        <w:t xml:space="preserve">    </w:t>
-      </w:r>
-      <w:proofErr w:type="spellStart"/>
-      <w:r>
-        <w:rPr>
-          <w:lang w:val="en-US"/>
-        </w:rPr>
-        <w:t>EmbosserDriver</w:t>
-      </w:r>
-      <w:proofErr w:type="spellEnd"/>
-      <w:r>
-        <w:rPr>
-          <w:lang w:val="en-US"/>
-        </w:rPr>
-        <w:t xml:space="preserve"> driver;</w:t>
-      </w:r>
-    </w:p>
-    <w:p>
-      <w:pPr>
-        <w:rPr>
-          <w:lang w:val="en-US"/>
-        </w:rPr>
-      </w:pPr>
-      <w:r>
-        <w:rPr>
-          <w:lang w:val="en-US"/>
-        </w:rPr>
-        <w:t xml:space="preserve">    </w:t>
-      </w:r>
-      <w:proofErr w:type="spellStart"/>
-      <w:r>
-        <w:rPr>
-          <w:lang w:val="en-US"/>
-        </w:rPr>
-        <w:t>SerialConfiguration</w:t>
-      </w:r>
-      <w:proofErr w:type="spellEnd"/>
-      <w:r>
-        <w:rPr>
-          <w:lang w:val="en-US"/>
-        </w:rPr>
-        <w:t xml:space="preserve"> </w:t>
-      </w:r>
-      <w:proofErr w:type="spellStart"/>
-      <w:r>
-        <w:rPr>
-          <w:lang w:val="en-US"/>
-        </w:rPr>
-        <w:t>serialConfig</w:t>
-      </w:r>
-      <w:proofErr w:type="spellEnd"/>
-      <w:r>
-        <w:rPr>
-          <w:lang w:val="en-US"/>
-        </w:rPr>
-        <w:t>;</w:t>
-      </w:r>
-    </w:p>
-    <w:p>
-      <w:pPr>
-        <w:rPr>
-          <w:lang w:val="en-US"/>
-        </w:rPr>
-      </w:pPr>
-      <w:r>
-        <w:rPr>
-          <w:lang w:val="en-US"/>
-        </w:rPr>
-        <w:t xml:space="preserve">    </w:t>
-      </w:r>
-      <w:proofErr w:type="spellStart"/>
-      <w:r>
-        <w:rPr>
-          <w:lang w:val="en-US"/>
-        </w:rPr>
-        <w:t>serialConfig.ComPort</w:t>
-      </w:r>
-      <w:proofErr w:type="spellEnd"/>
-      <w:r>
-        <w:rPr>
-          <w:lang w:val="en-US"/>
-        </w:rPr>
-        <w:t xml:space="preserve"> = "COM1";</w:t>
-      </w:r>
-    </w:p>
-    <w:p>
-      <w:pPr>
-        <w:rPr>
-          <w:lang w:val="en-US"/>
-        </w:rPr>
-      </w:pPr>
-      <w:r>
-        <w:rPr>
-          <w:lang w:val="en-US"/>
-        </w:rPr>
-        <w:t xml:space="preserve">    </w:t>
-      </w:r>
-      <w:proofErr w:type="spellStart"/>
-      <w:r>
-        <w:rPr>
-          <w:lang w:val="en-US"/>
-        </w:rPr>
-        <w:t>serialConfig.BaudRate</w:t>
-      </w:r>
-      <w:proofErr w:type="spellEnd"/>
-      <w:r>
-        <w:rPr>
-          <w:lang w:val="en-US"/>
-        </w:rPr>
-        <w:t xml:space="preserve"> = 9600;</w:t>
-      </w:r>
-    </w:p>
-    <w:p>
-      <w:pPr>
-        <w:rPr>
-          <w:lang w:val="en-US"/>
-        </w:rPr>
-      </w:pPr>
-    </w:p>
-    <w:p>
-      <w:pPr>
-        <w:rPr>
-          <w:lang w:val="en-US"/>
-        </w:rPr>
-      </w:pPr>
-      <w:r>
-        <w:rPr>
-          <w:lang w:val="en-US"/>
-        </w:rPr>
-        <w:t xml:space="preserve">    </w:t>
-      </w:r>
-      <w:proofErr w:type="spellStart"/>
-      <w:r>
-        <w:rPr>
-          <w:lang w:val="en-US"/>
-        </w:rPr>
-        <w:t>ErrorCode</w:t>
-      </w:r>
-      <w:proofErr w:type="spellEnd"/>
-      <w:r>
-        <w:rPr>
-          <w:lang w:val="en-US"/>
-        </w:rPr>
-        <w:t xml:space="preserve"> result = </w:t>
+        <w:t xml:space="preserve"> status;</w:t>
+      </w:r>
+    </w:p>
+    <w:p>
+      <w:pPr>
+        <w:rPr>
+          <w:lang w:val="en-US"/>
+        </w:rPr>
+      </w:pPr>
+      <w:r>
+        <w:rPr>
+          <w:lang w:val="en-US"/>
+        </w:rPr>
+        <w:t xml:space="preserve">    result = </w:t>
       </w:r>
       <w:proofErr w:type="spellStart"/>
       <w:proofErr w:type="gramStart"/>
@@ -13272,14 +13636,80 @@
         <w:rPr>
           <w:lang w:val="en-US"/>
         </w:rPr>
-        <w:t>driver.Connect</w:t>
+        <w:t>driver.GetStatus</w:t>
       </w:r>
       <w:proofErr w:type="spellEnd"/>
-      <w:r>
-        <w:rPr>
-          <w:lang w:val="en-US"/>
-        </w:rPr>
-        <w:t>(</w:t>
+      <w:proofErr w:type="gramEnd"/>
+      <w:r>
+        <w:rPr>
+          <w:lang w:val="en-US"/>
+        </w:rPr>
+        <w:t>(status);</w:t>
+      </w:r>
+    </w:p>
+    <w:p>
+      <w:pPr>
+        <w:rPr>
+          <w:lang w:val="en-US"/>
+        </w:rPr>
+      </w:pPr>
+    </w:p>
+    <w:p>
+      <w:pPr>
+        <w:rPr>
+          <w:lang w:val="en-US"/>
+        </w:rPr>
+      </w:pPr>
+      <w:r>
+        <w:rPr>
+          <w:lang w:val="en-US"/>
+        </w:rPr>
+        <w:t xml:space="preserve">    </w:t>
+      </w:r>
+      <w:r>
+        <w:rPr>
+          <w:bCs/>
+          <w:lang w:val="en-US"/>
+        </w:rPr>
+        <w:t>if</w:t>
+      </w:r>
+      <w:r>
+        <w:rPr>
+          <w:lang w:val="en-US"/>
+        </w:rPr>
+        <w:t xml:space="preserve"> (</w:t>
+      </w:r>
+      <w:proofErr w:type="gramStart"/>
+      <w:r>
+        <w:rPr>
+          <w:lang w:val="en-US"/>
+        </w:rPr>
+        <w:t>result !</w:t>
+      </w:r>
+      <w:proofErr w:type="gramEnd"/>
+      <w:r>
+        <w:rPr>
+          <w:lang w:val="en-US"/>
+        </w:rPr>
+        <w:t>= DRV_SUCCESS) {</w:t>
+      </w:r>
+    </w:p>
+    <w:p>
+      <w:r>
+        <w:rPr>
+          <w:lang w:val="en-US"/>
+        </w:rPr>
+        <w:t xml:space="preserve">        </w:t>
+      </w:r>
+      <w:proofErr w:type="gramStart"/>
+      <w:r>
+        <w:rPr>
+          <w:lang w:val="en-US"/>
+        </w:rPr>
+        <w:t>std</w:t>
+      </w:r>
+      <w:r>
+        <w:t>::</w:t>
       </w:r>
       <w:proofErr w:type="spellStart"/>
       <w:proofErr w:type="gramEnd"/>
@@ -13287,369 +13717,51 @@
         <w:rPr>
           <w:lang w:val="en-US"/>
         </w:rPr>
-        <w:t>InterfaceType</w:t>
+        <w:t>cerr</w:t>
       </w:r>
       <w:proofErr w:type="spellEnd"/>
       <w:r>
-        <w:rPr>
-          <w:lang w:val="en-US"/>
-        </w:rPr>
-        <w:t xml:space="preserve">::Serial, </w:t>
+        <w:t xml:space="preserve"> &lt;&lt; "</w:t>
+      </w:r>
+      <w:r>
+        <w:t>Ошибка</w:t>
+      </w:r>
+      <w:r>
+        <w:t xml:space="preserve"> </w:t>
+      </w:r>
+      <w:r>
+        <w:t>получения</w:t>
+      </w:r>
+      <w:r>
+        <w:t xml:space="preserve"> </w:t>
+      </w:r>
+      <w:r>
+        <w:t>статуса</w:t>
+      </w:r>
+      <w:r>
+        <w:t xml:space="preserve">: " &lt;&lt; </w:t>
+      </w:r>
+      <w:r>
+        <w:rPr>
+          <w:lang w:val="en-US"/>
+        </w:rPr>
+        <w:t>result</w:t>
+      </w:r>
+      <w:r>
+        <w:t xml:space="preserve"> &lt;&lt; </w:t>
+      </w:r>
+      <w:proofErr w:type="gramStart"/>
+      <w:r>
+        <w:rPr>
+          <w:lang w:val="en-US"/>
+        </w:rPr>
+        <w:t>std</w:t>
+      </w:r>
+      <w:r>
+        <w:t>::</w:t>
       </w:r>
       <w:proofErr w:type="spellStart"/>
-      <w:r>
-        <w:rPr>
-          <w:lang w:val="en-US"/>
-        </w:rPr>
-        <w:t>serialConfig</w:t>
-      </w:r>
-      <w:proofErr w:type="spellEnd"/>
-      <w:r>
-        <w:rPr>
-          <w:lang w:val="en-US"/>
-        </w:rPr>
-        <w:t>);</w:t>
-      </w:r>
-    </w:p>
-    <w:p>
-      <w:pPr>
-        <w:rPr>
-          <w:lang w:val="en-US"/>
-        </w:rPr>
-      </w:pPr>
-    </w:p>
-    <w:p>
-      <w:pPr>
-        <w:rPr>
-          <w:lang w:val="en-US"/>
-        </w:rPr>
-      </w:pPr>
-      <w:r>
-        <w:rPr>
-          <w:lang w:val="en-US"/>
-        </w:rPr>
-        <w:t xml:space="preserve">    </w:t>
-      </w:r>
-      <w:proofErr w:type="gramStart"/>
-      <w:r>
-        <w:rPr>
-          <w:bCs/>
-          <w:lang w:val="en-US"/>
-        </w:rPr>
-        <w:t>if</w:t>
-      </w:r>
       <w:proofErr w:type="gramEnd"/>
-      <w:r>
-        <w:rPr>
-          <w:lang w:val="en-US"/>
-        </w:rPr>
-        <w:t xml:space="preserve"> (result != DRV_SUCCESS) {</w:t>
-      </w:r>
-    </w:p>
-    <w:p>
-      <w:pPr>
-        <w:rPr>
-          <w:lang w:val="en-US"/>
-        </w:rPr>
-      </w:pPr>
-      <w:r>
-        <w:rPr>
-          <w:lang w:val="en-US"/>
-        </w:rPr>
-        <w:t xml:space="preserve">        </w:t>
-      </w:r>
-      <w:proofErr w:type="spellStart"/>
-      <w:r>
-        <w:rPr>
-          <w:lang w:val="en-US"/>
-        </w:rPr>
-        <w:t>std</w:t>
-      </w:r>
-      <w:proofErr w:type="spellEnd"/>
-      <w:r>
-        <w:rPr>
-          <w:lang w:val="en-US"/>
-        </w:rPr>
-        <w:t>::</w:t>
-      </w:r>
-      <w:proofErr w:type="spellStart"/>
-      <w:r>
-        <w:rPr>
-          <w:lang w:val="en-US"/>
-        </w:rPr>
-        <w:t>cerr</w:t>
-      </w:r>
-      <w:proofErr w:type="spellEnd"/>
-      <w:r>
-        <w:rPr>
-          <w:lang w:val="en-US"/>
-        </w:rPr>
-        <w:t xml:space="preserve"> &lt;&lt; "</w:t>
-      </w:r>
-      <w:r>
-        <w:t>Ошибка</w:t>
-      </w:r>
-      <w:r>
-        <w:rPr>
-          <w:lang w:val="en-US"/>
-        </w:rPr>
-        <w:t xml:space="preserve"> </w:t>
-      </w:r>
-      <w:r>
-        <w:t>соединения</w:t>
-      </w:r>
-      <w:r>
-        <w:rPr>
-          <w:lang w:val="en-US"/>
-        </w:rPr>
-        <w:t xml:space="preserve">: " &lt;&lt; result &lt;&lt; </w:t>
-      </w:r>
-      <w:proofErr w:type="spellStart"/>
-      <w:r>
-        <w:rPr>
-          <w:lang w:val="en-US"/>
-        </w:rPr>
-        <w:t>std</w:t>
-      </w:r>
-      <w:proofErr w:type="spellEnd"/>
-      <w:r>
-        <w:rPr>
-          <w:lang w:val="en-US"/>
-        </w:rPr>
-        <w:t>::</w:t>
-      </w:r>
-      <w:proofErr w:type="spellStart"/>
-      <w:r>
-        <w:rPr>
-          <w:lang w:val="en-US"/>
-        </w:rPr>
-        <w:t>endl</w:t>
-      </w:r>
-      <w:proofErr w:type="spellEnd"/>
-      <w:r>
-        <w:rPr>
-          <w:lang w:val="en-US"/>
-        </w:rPr>
-        <w:t>;</w:t>
-      </w:r>
-    </w:p>
-    <w:p>
-      <w:pPr>
-        <w:rPr>
-          <w:lang w:val="en-US"/>
-        </w:rPr>
-      </w:pPr>
-      <w:r>
-        <w:rPr>
-          <w:lang w:val="en-US"/>
-        </w:rPr>
-        <w:t xml:space="preserve">        </w:t>
-      </w:r>
-      <w:r>
-        <w:rPr>
-          <w:bCs/>
-          <w:lang w:val="en-US"/>
-        </w:rPr>
-        <w:t>return</w:t>
-      </w:r>
-      <w:r>
-        <w:rPr>
-          <w:lang w:val="en-US"/>
-        </w:rPr>
-        <w:t xml:space="preserve"> 1;</w:t>
-      </w:r>
-    </w:p>
-    <w:p>
-      <w:pPr>
-        <w:rPr>
-          <w:lang w:val="en-US"/>
-        </w:rPr>
-      </w:pPr>
-      <w:r>
-        <w:rPr>
-          <w:lang w:val="en-US"/>
-        </w:rPr>
-        <w:t xml:space="preserve">    }</w:t>
-      </w:r>
-    </w:p>
-    <w:p>
-      <w:pPr>
-        <w:rPr>
-          <w:lang w:val="en-US"/>
-        </w:rPr>
-      </w:pPr>
-    </w:p>
-    <w:p>
-      <w:pPr>
-        <w:rPr>
-          <w:lang w:val="en-US"/>
-        </w:rPr>
-      </w:pPr>
-      <w:r>
-        <w:rPr>
-          <w:lang w:val="en-US"/>
-        </w:rPr>
-        <w:t xml:space="preserve">    </w:t>
-      </w:r>
-      <w:proofErr w:type="spellStart"/>
-      <w:r>
-        <w:rPr>
-          <w:lang w:val="en-US"/>
-        </w:rPr>
-        <w:t>EmbosserStatus</w:t>
-      </w:r>
-      <w:proofErr w:type="spellEnd"/>
-      <w:r>
-        <w:rPr>
-          <w:lang w:val="en-US"/>
-        </w:rPr>
-        <w:t xml:space="preserve"> status;</w:t>
-      </w:r>
-    </w:p>
-    <w:p>
-      <w:pPr>
-        <w:rPr>
-          <w:lang w:val="en-US"/>
-        </w:rPr>
-      </w:pPr>
-      <w:r>
-        <w:rPr>
-          <w:lang w:val="en-US"/>
-        </w:rPr>
-        <w:t xml:space="preserve">    </w:t>
-      </w:r>
-      <w:proofErr w:type="gramStart"/>
-      <w:r>
-        <w:rPr>
-          <w:lang w:val="en-US"/>
-        </w:rPr>
-        <w:t>result</w:t>
-      </w:r>
-      <w:proofErr w:type="gramEnd"/>
-      <w:r>
-        <w:rPr>
-          <w:lang w:val="en-US"/>
-        </w:rPr>
-        <w:t xml:space="preserve"> = </w:t>
-      </w:r>
-      <w:proofErr w:type="spellStart"/>
-      <w:r>
-        <w:rPr>
-          <w:lang w:val="en-US"/>
-        </w:rPr>
-        <w:t>driver.GetStatus</w:t>
-      </w:r>
-      <w:proofErr w:type="spellEnd"/>
-      <w:r>
-        <w:rPr>
-          <w:lang w:val="en-US"/>
-        </w:rPr>
-        <w:t>(status);</w:t>
-      </w:r>
-    </w:p>
-    <w:p>
-      <w:pPr>
-        <w:rPr>
-          <w:lang w:val="en-US"/>
-        </w:rPr>
-      </w:pPr>
-    </w:p>
-    <w:p>
-      <w:pPr>
-        <w:rPr>
-          <w:lang w:val="en-US"/>
-        </w:rPr>
-      </w:pPr>
-      <w:r>
-        <w:rPr>
-          <w:lang w:val="en-US"/>
-        </w:rPr>
-        <w:t xml:space="preserve">    </w:t>
-      </w:r>
-      <w:proofErr w:type="gramStart"/>
-      <w:r>
-        <w:rPr>
-          <w:bCs/>
-          <w:lang w:val="en-US"/>
-        </w:rPr>
-        <w:t>if</w:t>
-      </w:r>
-      <w:proofErr w:type="gramEnd"/>
-      <w:r>
-        <w:rPr>
-          <w:lang w:val="en-US"/>
-        </w:rPr>
-        <w:t xml:space="preserve"> (result != DRV_SUCCESS) {</w:t>
-      </w:r>
-    </w:p>
-    <w:p>
-      <w:r>
-        <w:rPr>
-          <w:lang w:val="en-US"/>
-        </w:rPr>
-        <w:t xml:space="preserve">        </w:t>
-      </w:r>
-      <w:proofErr w:type="spellStart"/>
-      <w:r>
-        <w:rPr>
-          <w:lang w:val="en-US"/>
-        </w:rPr>
-        <w:t>std</w:t>
-      </w:r>
-      <w:proofErr w:type="spellEnd"/>
-      <w:r>
-        <w:t>::</w:t>
-      </w:r>
-      <w:proofErr w:type="spellStart"/>
-      <w:r>
-        <w:rPr>
-          <w:lang w:val="en-US"/>
-        </w:rPr>
-        <w:t>cerr</w:t>
-      </w:r>
-      <w:proofErr w:type="spellEnd"/>
-      <w:r>
-        <w:t xml:space="preserve"> &lt;&lt; "</w:t>
-      </w:r>
-      <w:r>
-        <w:t>Ошибка</w:t>
-      </w:r>
-      <w:r>
-        <w:t xml:space="preserve"> </w:t>
-      </w:r>
-      <w:r>
-        <w:t>получения</w:t>
-      </w:r>
-      <w:r>
-        <w:t xml:space="preserve"> </w:t>
-      </w:r>
-      <w:r>
-        <w:t>статуса</w:t>
-      </w:r>
-      <w:r>
-        <w:t xml:space="preserve">: " &lt;&lt; </w:t>
-      </w:r>
-      <w:r>
-        <w:rPr>
-          <w:lang w:val="en-US"/>
-        </w:rPr>
-        <w:t>result</w:t>
-      </w:r>
-      <w:r>
-        <w:t xml:space="preserve"> &lt;&lt; </w:t>
-      </w:r>
-      <w:proofErr w:type="spellStart"/>
-      <w:r>
-        <w:rPr>
-          <w:lang w:val="en-US"/>
-        </w:rPr>
-        <w:t>std</w:t>
-      </w:r>
-      <w:proofErr w:type="spellEnd"/>
-      <w:r>
-        <w:t>::</w:t>
-      </w:r>
-      <w:proofErr w:type="spellStart"/>
       <w:r>
         <w:rPr>
           <w:lang w:val="en-US"/>
@@ -13680,18 +13792,12 @@
         <w:t>driver.Disconnect</w:t>
       </w:r>
       <w:proofErr w:type="spellEnd"/>
-      <w:r>
-        <w:rPr>
-          <w:lang w:val="en-US"/>
-        </w:rPr>
-        <w:t>(</w:t>
-      </w:r>
       <w:proofErr w:type="gramEnd"/>
       <w:r>
         <w:rPr>
           <w:lang w:val="en-US"/>
         </w:rPr>
-        <w:t>);</w:t>
+        <w:t>();</w:t>
       </w:r>
     </w:p>
     <w:p>
@@ -13752,21 +13858,85 @@
         </w:rPr>
         <w:t xml:space="preserve">    </w:t>
       </w:r>
+      <w:proofErr w:type="gramStart"/>
+      <w:r>
+        <w:rPr>
+          <w:lang w:val="en-US"/>
+        </w:rPr>
+        <w:t>std::</w:t>
+      </w:r>
       <w:proofErr w:type="spellStart"/>
-      <w:r>
-        <w:rPr>
-          <w:lang w:val="en-US"/>
-        </w:rPr>
-        <w:t>std</w:t>
+      <w:proofErr w:type="gramEnd"/>
+      <w:r>
+        <w:rPr>
+          <w:lang w:val="en-US"/>
+        </w:rPr>
+        <w:t>cout</w:t>
       </w:r>
       <w:proofErr w:type="spellEnd"/>
       <w:r>
         <w:rPr>
           <w:lang w:val="en-US"/>
         </w:rPr>
-        <w:t>::</w:t>
+        <w:t xml:space="preserve"> &lt;&lt; "</w:t>
+      </w:r>
+      <w:r>
+        <w:t>Статус</w:t>
+      </w:r>
+      <w:r>
+        <w:rPr>
+          <w:lang w:val="en-US"/>
+        </w:rPr>
+        <w:t xml:space="preserve"> </w:t>
+      </w:r>
+      <w:r>
+        <w:t>эмбоссера</w:t>
+      </w:r>
+      <w:r>
+        <w:rPr>
+          <w:lang w:val="en-US"/>
+        </w:rPr>
+        <w:t xml:space="preserve">:" &lt;&lt; </w:t>
+      </w:r>
+      <w:proofErr w:type="gramStart"/>
+      <w:r>
+        <w:rPr>
+          <w:lang w:val="en-US"/>
+        </w:rPr>
+        <w:t>std::</w:t>
       </w:r>
       <w:proofErr w:type="spellStart"/>
+      <w:proofErr w:type="gramEnd"/>
+      <w:r>
+        <w:rPr>
+          <w:lang w:val="en-US"/>
+        </w:rPr>
+        <w:t>endl</w:t>
+      </w:r>
+      <w:proofErr w:type="spellEnd"/>
+      <w:r>
+        <w:rPr>
+          <w:lang w:val="en-US"/>
+        </w:rPr>
+        <w:t>;</w:t>
+      </w:r>
+    </w:p>
+    <w:p>
+      <w:r>
+        <w:rPr>
+          <w:lang w:val="en-US"/>
+        </w:rPr>
+        <w:t xml:space="preserve">    </w:t>
+      </w:r>
+      <w:proofErr w:type="gramStart"/>
+      <w:r>
+        <w:rPr>
+          <w:lang w:val="en-US"/>
+        </w:rPr>
+        <w:t>std::</w:t>
+      </w:r>
+      <w:proofErr w:type="spellStart"/>
+      <w:proofErr w:type="gramEnd"/>
       <w:r>
         <w:rPr>
           <w:lang w:val="en-US"/>
@@ -13778,88 +13948,6 @@
         <w:rPr>
           <w:lang w:val="en-US"/>
         </w:rPr>
-        <w:t xml:space="preserve"> &lt;&lt; "</w:t>
-      </w:r>
-      <w:r>
-        <w:t>Статус</w:t>
-      </w:r>
-      <w:r>
-        <w:rPr>
-          <w:lang w:val="en-US"/>
-        </w:rPr>
-        <w:t xml:space="preserve"> </w:t>
-      </w:r>
-      <w:r>
-        <w:t>эмбоссера</w:t>
-      </w:r>
-      <w:r>
-        <w:rPr>
-          <w:lang w:val="en-US"/>
-        </w:rPr>
-        <w:t xml:space="preserve">:" &lt;&lt; </w:t>
-      </w:r>
-      <w:proofErr w:type="spellStart"/>
-      <w:r>
-        <w:rPr>
-          <w:lang w:val="en-US"/>
-        </w:rPr>
-        <w:t>std</w:t>
-      </w:r>
-      <w:proofErr w:type="spellEnd"/>
-      <w:r>
-        <w:rPr>
-          <w:lang w:val="en-US"/>
-        </w:rPr>
-        <w:t>::</w:t>
-      </w:r>
-      <w:proofErr w:type="spellStart"/>
-      <w:r>
-        <w:rPr>
-          <w:lang w:val="en-US"/>
-        </w:rPr>
-        <w:t>endl</w:t>
-      </w:r>
-      <w:proofErr w:type="spellEnd"/>
-      <w:r>
-        <w:rPr>
-          <w:lang w:val="en-US"/>
-        </w:rPr>
-        <w:t>;</w:t>
-      </w:r>
-    </w:p>
-    <w:p>
-      <w:r>
-        <w:rPr>
-          <w:lang w:val="en-US"/>
-        </w:rPr>
-        <w:t xml:space="preserve">    </w:t>
-      </w:r>
-      <w:proofErr w:type="spellStart"/>
-      <w:r>
-        <w:rPr>
-          <w:lang w:val="en-US"/>
-        </w:rPr>
-        <w:t>std</w:t>
-      </w:r>
-      <w:proofErr w:type="spellEnd"/>
-      <w:r>
-        <w:rPr>
-          <w:lang w:val="en-US"/>
-        </w:rPr>
-        <w:t>::</w:t>
-      </w:r>
-      <w:proofErr w:type="spellStart"/>
-      <w:r>
-        <w:rPr>
-          <w:lang w:val="en-US"/>
-        </w:rPr>
-        <w:t>cout</w:t>
-      </w:r>
-      <w:proofErr w:type="spellEnd"/>
-      <w:r>
-        <w:rPr>
-          <w:lang w:val="en-US"/>
-        </w:rPr>
         <w:t xml:space="preserve"> &lt;&lt; </w:t>
       </w:r>
       <w:proofErr w:type="gramStart"/>
@@ -13878,113 +13966,6 @@
           <w:lang w:val="en-US"/>
         </w:rPr>
         <w:t>: " &lt;&lt; (</w:t>
-      </w:r>
-      <w:proofErr w:type="spellStart"/>
-      <w:r>
-        <w:rPr>
-          <w:lang w:val="en-US"/>
-        </w:rPr>
-        <w:t>status.IsReady</w:t>
-      </w:r>
-      <w:proofErr w:type="spellEnd"/>
-      <w:r>
-        <w:rPr>
-          <w:lang w:val="en-US"/>
-        </w:rPr>
-        <w:t xml:space="preserve"> ? </w:t>
-      </w:r>
-      <w:r>
-        <w:t>"Да" : "Нет") &lt;&lt; std::endl;</w:t>
-      </w:r>
-    </w:p>
-    <w:p>
-      <w:pPr>
-        <w:rPr>
-          <w:lang w:val="en-US"/>
-        </w:rPr>
-      </w:pPr>
-      <w:r>
-        <w:t xml:space="preserve">    std::cout &lt;&lt; "  Карта в устройстве: " &lt;&lt; (status.HasCard ? </w:t>
-      </w:r>
-      <w:r>
-        <w:rPr>
-          <w:lang w:val="en-US"/>
-        </w:rPr>
-        <w:t>"</w:t>
-      </w:r>
-      <w:r>
-        <w:t>Да</w:t>
-      </w:r>
-      <w:proofErr w:type="gramStart"/>
-      <w:r>
-        <w:rPr>
-          <w:lang w:val="en-US"/>
-        </w:rPr>
-        <w:t>" :</w:t>
-      </w:r>
-      <w:proofErr w:type="gramEnd"/>
-      <w:r>
-        <w:rPr>
-          <w:lang w:val="en-US"/>
-        </w:rPr>
-        <w:t xml:space="preserve"> "</w:t>
-      </w:r>
-      <w:r>
-        <w:t>Нет</w:t>
-      </w:r>
-      <w:r>
-        <w:rPr>
-          <w:lang w:val="en-US"/>
-        </w:rPr>
-        <w:t xml:space="preserve">") &lt;&lt; </w:t>
-      </w:r>
-      <w:proofErr w:type="spellStart"/>
-      <w:r>
-        <w:rPr>
-          <w:lang w:val="en-US"/>
-        </w:rPr>
-        <w:t>std</w:t>
-      </w:r>
-      <w:proofErr w:type="spellEnd"/>
-      <w:r>
-        <w:rPr>
-          <w:lang w:val="en-US"/>
-        </w:rPr>
-        <w:t>::</w:t>
-      </w:r>
-      <w:proofErr w:type="spellStart"/>
-      <w:r>
-        <w:rPr>
-          <w:lang w:val="en-US"/>
-        </w:rPr>
-        <w:t>endl</w:t>
-      </w:r>
-      <w:proofErr w:type="spellEnd"/>
-      <w:r>
-        <w:rPr>
-          <w:lang w:val="en-US"/>
-        </w:rPr>
-        <w:t>;</w:t>
-      </w:r>
-    </w:p>
-    <w:p>
-      <w:pPr>
-        <w:rPr>
-          <w:lang w:val="en-US"/>
-        </w:rPr>
-      </w:pPr>
-    </w:p>
-    <w:p>
-      <w:pPr>
-        <w:rPr>
-          <w:lang w:val="en-US"/>
-        </w:rPr>
-      </w:pPr>
-      <w:r>
-        <w:rPr>
-          <w:lang w:val="en-US"/>
-        </w:rPr>
-        <w:t xml:space="preserve">    </w:t>
       </w:r>
       <w:proofErr w:type="spellStart"/>
       <w:proofErr w:type="gramStart"/>
@@ -13992,203 +13973,102 @@
         <w:rPr>
           <w:lang w:val="en-US"/>
         </w:rPr>
-        <w:t>driver.Disconnect</w:t>
+        <w:t>status.IsReady</w:t>
       </w:r>
       <w:proofErr w:type="spellEnd"/>
-      <w:r>
-        <w:rPr>
-          <w:lang w:val="en-US"/>
-        </w:rPr>
-        <w:t>(</w:t>
-      </w:r>
       <w:proofErr w:type="gramEnd"/>
       <w:r>
         <w:rPr>
           <w:lang w:val="en-US"/>
         </w:rPr>
-        <w:t>);</w:t>
-      </w:r>
-    </w:p>
-    <w:p>
+        <w:t xml:space="preserve"> ? </w:t>
+      </w:r>
+      <w:r>
+        <w:t>"Да" : "Нет") &lt;&lt; std::endl;</w:t>
+      </w:r>
+    </w:p>
+    <w:p>
+      <w:pPr>
+        <w:rPr>
+          <w:lang w:val="en-US"/>
+        </w:rPr>
+      </w:pPr>
+      <w:r>
+        <w:t xml:space="preserve">    std::cout &lt;&lt; "  Карта в устройстве: " &lt;&lt; (status.HasCard ? </w:t>
+      </w:r>
+      <w:r>
+        <w:rPr>
+          <w:lang w:val="en-US"/>
+        </w:rPr>
+        <w:t>"</w:t>
+      </w:r>
+      <w:r>
+        <w:t>Да</w:t>
+      </w:r>
+      <w:proofErr w:type="gramStart"/>
+      <w:r>
+        <w:rPr>
+          <w:lang w:val="en-US"/>
+        </w:rPr>
+        <w:t>" :</w:t>
+      </w:r>
+      <w:proofErr w:type="gramEnd"/>
+      <w:r>
+        <w:rPr>
+          <w:lang w:val="en-US"/>
+        </w:rPr>
+        <w:t xml:space="preserve"> "</w:t>
+      </w:r>
+      <w:r>
+        <w:t>Нет</w:t>
+      </w:r>
+      <w:r>
+        <w:rPr>
+          <w:lang w:val="en-US"/>
+        </w:rPr>
+        <w:t xml:space="preserve">") &lt;&lt; </w:t>
+      </w:r>
+      <w:proofErr w:type="gramStart"/>
+      <w:r>
+        <w:rPr>
+          <w:lang w:val="en-US"/>
+        </w:rPr>
+        <w:t>std::</w:t>
+      </w:r>
+      <w:proofErr w:type="spellStart"/>
+      <w:proofErr w:type="gramEnd"/>
+      <w:r>
+        <w:rPr>
+          <w:lang w:val="en-US"/>
+        </w:rPr>
+        <w:t>endl</w:t>
+      </w:r>
+      <w:proofErr w:type="spellEnd"/>
+      <w:r>
+        <w:rPr>
+          <w:lang w:val="en-US"/>
+        </w:rPr>
+        <w:t>;</w:t>
+      </w:r>
+    </w:p>
+    <w:p>
+      <w:pPr>
+        <w:rPr>
+          <w:lang w:val="en-US"/>
+        </w:rPr>
+      </w:pPr>
+    </w:p>
+    <w:p>
+      <w:pPr>
+        <w:rPr>
+          <w:lang w:val="en-US"/>
+        </w:rPr>
+      </w:pPr>
       <w:r>
         <w:rPr>
           <w:lang w:val="en-US"/>
         </w:rPr>
         <w:t xml:space="preserve">    </w:t>
-      </w:r>
-      <w:r>
-        <w:rPr>
-          <w:bCs/>
-        </w:rPr>
-        <w:t>return</w:t>
-      </w:r>
-      <w:r>
-        <w:t xml:space="preserve"> 0;</w:t>
-      </w:r>
-    </w:p>
-    <w:p>
-      <w:r>
-        <w:t>}</w:t>
-      </w:r>
-    </w:p>
-    <w:p>
-      <w:r>
-        <w:t>c++</w:t>
-      </w:r>
-    </w:p>
-    <w:p>
-      <w:pPr>
-        <w:pStyle w:val="Heading2"/>
-      </w:pPr>
-      <w:bookmarkStart w:id="39" w:name="_Toc198558799"/>
-      <w:r>
-        <w:t>3.4.2. Загрузка карты и эмбоссирование символа:</w:t>
-      </w:r>
-      <w:bookmarkEnd w:id="39"/>
-    </w:p>
-    <w:p>
-      <w:r>
-        <w:t>// ... (Предыдущий код для соединения) ...</w:t>
-      </w:r>
-    </w:p>
-    <w:p/>
-    <w:p>
-      <w:r>
-        <w:t xml:space="preserve">    result = driver.LoadCard();</w:t>
-      </w:r>
-    </w:p>
-    <w:p>
-      <w:pPr>
-        <w:rPr>
-          <w:lang w:val="en-US"/>
-        </w:rPr>
-      </w:pPr>
-      <w:r>
-        <w:t xml:space="preserve">    </w:t>
-      </w:r>
-      <w:proofErr w:type="gramStart"/>
-      <w:r>
-        <w:rPr>
-          <w:bCs/>
-          <w:lang w:val="en-US"/>
-        </w:rPr>
-        <w:t>if</w:t>
-      </w:r>
-      <w:proofErr w:type="gramEnd"/>
-      <w:r>
-        <w:rPr>
-          <w:lang w:val="en-US"/>
-        </w:rPr>
-        <w:t xml:space="preserve"> (result != DRV_SUCCESS) {</w:t>
-      </w:r>
-    </w:p>
-    <w:p>
-      <w:pPr>
-        <w:rPr>
-          <w:lang w:val="en-US"/>
-        </w:rPr>
-      </w:pPr>
-      <w:r>
-        <w:rPr>
-          <w:lang w:val="en-US"/>
-        </w:rPr>
-        <w:t xml:space="preserve">        </w:t>
-      </w:r>
-      <w:proofErr w:type="spellStart"/>
-      <w:r>
-        <w:rPr>
-          <w:lang w:val="en-US"/>
-        </w:rPr>
-        <w:t>std</w:t>
-      </w:r>
-      <w:proofErr w:type="spellEnd"/>
-      <w:r>
-        <w:rPr>
-          <w:lang w:val="en-US"/>
-        </w:rPr>
-        <w:t>::</w:t>
-      </w:r>
-      <w:proofErr w:type="spellStart"/>
-      <w:r>
-        <w:rPr>
-          <w:lang w:val="en-US"/>
-        </w:rPr>
-        <w:t>cerr</w:t>
-      </w:r>
-      <w:proofErr w:type="spellEnd"/>
-      <w:r>
-        <w:rPr>
-          <w:lang w:val="en-US"/>
-        </w:rPr>
-        <w:t xml:space="preserve"> &lt;&lt; "</w:t>
-      </w:r>
-      <w:r>
-        <w:t>Ошибка</w:t>
-      </w:r>
-      <w:r>
-        <w:rPr>
-          <w:lang w:val="en-US"/>
-        </w:rPr>
-        <w:t xml:space="preserve"> </w:t>
-      </w:r>
-      <w:r>
-        <w:t>загрузки</w:t>
-      </w:r>
-      <w:r>
-        <w:rPr>
-          <w:lang w:val="en-US"/>
-        </w:rPr>
-        <w:t xml:space="preserve"> </w:t>
-      </w:r>
-      <w:r>
-        <w:t>карты</w:t>
-      </w:r>
-      <w:r>
-        <w:rPr>
-          <w:lang w:val="en-US"/>
-        </w:rPr>
-        <w:t xml:space="preserve">: " &lt;&lt; result &lt;&lt; </w:t>
-      </w:r>
-      <w:proofErr w:type="spellStart"/>
-      <w:r>
-        <w:rPr>
-          <w:lang w:val="en-US"/>
-        </w:rPr>
-        <w:t>std</w:t>
-      </w:r>
-      <w:proofErr w:type="spellEnd"/>
-      <w:r>
-        <w:rPr>
-          <w:lang w:val="en-US"/>
-        </w:rPr>
-        <w:t>::</w:t>
-      </w:r>
-      <w:proofErr w:type="spellStart"/>
-      <w:r>
-        <w:rPr>
-          <w:lang w:val="en-US"/>
-        </w:rPr>
-        <w:t>endl</w:t>
-      </w:r>
-      <w:proofErr w:type="spellEnd"/>
-      <w:r>
-        <w:rPr>
-          <w:lang w:val="en-US"/>
-        </w:rPr>
-        <w:t>;</w:t>
-      </w:r>
-    </w:p>
-    <w:p>
-      <w:pPr>
-        <w:rPr>
-          <w:lang w:val="en-US"/>
-        </w:rPr>
-      </w:pPr>
-      <w:r>
-        <w:rPr>
-          <w:lang w:val="en-US"/>
-        </w:rPr>
-        <w:t xml:space="preserve">        </w:t>
       </w:r>
       <w:proofErr w:type="spellStart"/>
       <w:proofErr w:type="gramStart"/>
@@ -14199,18 +14079,97 @@
         <w:t>driver.Disconnect</w:t>
       </w:r>
       <w:proofErr w:type="spellEnd"/>
-      <w:r>
-        <w:rPr>
-          <w:lang w:val="en-US"/>
-        </w:rPr>
-        <w:t>(</w:t>
-      </w:r>
       <w:proofErr w:type="gramEnd"/>
       <w:r>
         <w:rPr>
           <w:lang w:val="en-US"/>
         </w:rPr>
-        <w:t>);</w:t>
+        <w:t>();</w:t>
+      </w:r>
+    </w:p>
+    <w:p>
+      <w:r>
+        <w:rPr>
+          <w:lang w:val="en-US"/>
+        </w:rPr>
+        <w:t xml:space="preserve">    </w:t>
+      </w:r>
+      <w:r>
+        <w:rPr>
+          <w:bCs/>
+        </w:rPr>
+        <w:t>return</w:t>
+      </w:r>
+      <w:r>
+        <w:t xml:space="preserve"> 0;</w:t>
+      </w:r>
+    </w:p>
+    <w:p>
+      <w:r>
+        <w:t>}</w:t>
+      </w:r>
+    </w:p>
+    <w:p>
+      <w:r>
+        <w:t>c++</w:t>
+      </w:r>
+    </w:p>
+    <w:p>
+      <w:pPr>
+        <w:pStyle w:val="Heading2"/>
+      </w:pPr>
+      <w:bookmarkStart w:id="38" w:name="_Toc198558799"/>
+      <w:r>
+        <w:t>3.4.2. Загрузка карты и эмбоссирование символа:</w:t>
+      </w:r>
+      <w:bookmarkEnd w:id="38"/>
+    </w:p>
+    <w:p>
+      <w:r>
+        <w:t>// ... (Предыдущий код для соединения) ...</w:t>
+      </w:r>
+    </w:p>
+    <w:p/>
+    <w:p>
+      <w:r>
+        <w:t xml:space="preserve">    result = driver.LoadCard();</w:t>
+      </w:r>
+    </w:p>
+    <w:p>
+      <w:pPr>
+        <w:rPr>
+          <w:lang w:val="en-US"/>
+        </w:rPr>
+      </w:pPr>
+      <w:r>
+        <w:t xml:space="preserve">    </w:t>
+      </w:r>
+      <w:r>
+        <w:rPr>
+          <w:bCs/>
+          <w:lang w:val="en-US"/>
+        </w:rPr>
+        <w:t>if</w:t>
+      </w:r>
+      <w:r>
+        <w:rPr>
+          <w:lang w:val="en-US"/>
+        </w:rPr>
+        <w:t xml:space="preserve"> (</w:t>
+      </w:r>
+      <w:proofErr w:type="gramStart"/>
+      <w:r>
+        <w:rPr>
+          <w:lang w:val="en-US"/>
+        </w:rPr>
+        <w:t>result !</w:t>
+      </w:r>
+      <w:proofErr w:type="gramEnd"/>
+      <w:r>
+        <w:rPr>
+          <w:lang w:val="en-US"/>
+        </w:rPr>
+        <w:t>= DRV_SUCCESS) {</w:t>
       </w:r>
     </w:p>
     <w:p>
@@ -14225,6 +14184,119 @@
         </w:rPr>
         <w:t xml:space="preserve">        </w:t>
       </w:r>
+      <w:proofErr w:type="gramStart"/>
+      <w:r>
+        <w:rPr>
+          <w:lang w:val="en-US"/>
+        </w:rPr>
+        <w:t>std::</w:t>
+      </w:r>
+      <w:proofErr w:type="spellStart"/>
+      <w:proofErr w:type="gramEnd"/>
+      <w:r>
+        <w:rPr>
+          <w:lang w:val="en-US"/>
+        </w:rPr>
+        <w:t>cerr</w:t>
+      </w:r>
+      <w:proofErr w:type="spellEnd"/>
+      <w:r>
+        <w:rPr>
+          <w:lang w:val="en-US"/>
+        </w:rPr>
+        <w:t xml:space="preserve"> &lt;&lt; "</w:t>
+      </w:r>
+      <w:r>
+        <w:t>Ошибка</w:t>
+      </w:r>
+      <w:r>
+        <w:rPr>
+          <w:lang w:val="en-US"/>
+        </w:rPr>
+        <w:t xml:space="preserve"> </w:t>
+      </w:r>
+      <w:r>
+        <w:t>загрузки</w:t>
+      </w:r>
+      <w:r>
+        <w:rPr>
+          <w:lang w:val="en-US"/>
+        </w:rPr>
+        <w:t xml:space="preserve"> </w:t>
+      </w:r>
+      <w:r>
+        <w:t>карты</w:t>
+      </w:r>
+      <w:r>
+        <w:rPr>
+          <w:lang w:val="en-US"/>
+        </w:rPr>
+        <w:t xml:space="preserve">: " &lt;&lt; result &lt;&lt; </w:t>
+      </w:r>
+      <w:proofErr w:type="gramStart"/>
+      <w:r>
+        <w:rPr>
+          <w:lang w:val="en-US"/>
+        </w:rPr>
+        <w:t>std::</w:t>
+      </w:r>
+      <w:proofErr w:type="spellStart"/>
+      <w:proofErr w:type="gramEnd"/>
+      <w:r>
+        <w:rPr>
+          <w:lang w:val="en-US"/>
+        </w:rPr>
+        <w:t>endl</w:t>
+      </w:r>
+      <w:proofErr w:type="spellEnd"/>
+      <w:r>
+        <w:rPr>
+          <w:lang w:val="en-US"/>
+        </w:rPr>
+        <w:t>;</w:t>
+      </w:r>
+    </w:p>
+    <w:p>
+      <w:pPr>
+        <w:rPr>
+          <w:lang w:val="en-US"/>
+        </w:rPr>
+      </w:pPr>
+      <w:r>
+        <w:rPr>
+          <w:lang w:val="en-US"/>
+        </w:rPr>
+        <w:t xml:space="preserve">        </w:t>
+      </w:r>
+      <w:proofErr w:type="spellStart"/>
+      <w:proofErr w:type="gramStart"/>
+      <w:r>
+        <w:rPr>
+          <w:lang w:val="en-US"/>
+        </w:rPr>
+        <w:t>driver.Disconnect</w:t>
+      </w:r>
+      <w:proofErr w:type="spellEnd"/>
+      <w:proofErr w:type="gramEnd"/>
+      <w:r>
+        <w:rPr>
+          <w:lang w:val="en-US"/>
+        </w:rPr>
+        <w:t>();</w:t>
+      </w:r>
+    </w:p>
+    <w:p>
+      <w:pPr>
+        <w:rPr>
+          <w:lang w:val="en-US"/>
+        </w:rPr>
+      </w:pPr>
+      <w:r>
+        <w:rPr>
+          <w:lang w:val="en-US"/>
+        </w:rPr>
+        <w:t xml:space="preserve">        </w:t>
+      </w:r>
       <w:r>
         <w:rPr>
           <w:bCs/>
@@ -14326,6 +14398,7 @@
         <w:t xml:space="preserve">    </w:t>
       </w:r>
       <w:proofErr w:type="spellStart"/>
+      <w:proofErr w:type="gramStart"/>
       <w:r>
         <w:rPr>
           <w:lang w:val="en-US"/>
@@ -14333,6 +14406,7 @@
         <w:t>position.Y</w:t>
       </w:r>
       <w:proofErr w:type="spellEnd"/>
+      <w:proofErr w:type="gramEnd"/>
       <w:r>
         <w:rPr>
           <w:lang w:val="en-US"/>
@@ -14357,138 +14431,126 @@
         <w:rPr>
           <w:lang w:val="en-US"/>
         </w:rPr>
+        <w:t xml:space="preserve">    result = </w:t>
+      </w:r>
+      <w:proofErr w:type="spellStart"/>
+      <w:proofErr w:type="gramStart"/>
+      <w:r>
+        <w:rPr>
+          <w:lang w:val="en-US"/>
+        </w:rPr>
+        <w:t>driver.EmbossCharacter</w:t>
+      </w:r>
+      <w:proofErr w:type="spellEnd"/>
+      <w:proofErr w:type="gramEnd"/>
+      <w:r>
+        <w:rPr>
+          <w:lang w:val="en-US"/>
+        </w:rPr>
+        <w:t>('A', position);</w:t>
+      </w:r>
+    </w:p>
+    <w:p>
+      <w:pPr>
+        <w:rPr>
+          <w:lang w:val="en-US"/>
+        </w:rPr>
+      </w:pPr>
+      <w:r>
+        <w:rPr>
+          <w:lang w:val="en-US"/>
+        </w:rPr>
         <w:t xml:space="preserve">    </w:t>
       </w:r>
+      <w:r>
+        <w:rPr>
+          <w:bCs/>
+          <w:lang w:val="en-US"/>
+        </w:rPr>
+        <w:t>if</w:t>
+      </w:r>
+      <w:r>
+        <w:rPr>
+          <w:lang w:val="en-US"/>
+        </w:rPr>
+        <w:t xml:space="preserve"> (</w:t>
+      </w:r>
       <w:proofErr w:type="gramStart"/>
       <w:r>
         <w:rPr>
           <w:lang w:val="en-US"/>
         </w:rPr>
-        <w:t>result</w:t>
+        <w:t>result !</w:t>
       </w:r>
       <w:proofErr w:type="gramEnd"/>
       <w:r>
         <w:rPr>
           <w:lang w:val="en-US"/>
         </w:rPr>
-        <w:t xml:space="preserve"> = </w:t>
+        <w:t>= DRV_SUCCESS) {</w:t>
+      </w:r>
+    </w:p>
+    <w:p>
+      <w:pPr>
+        <w:rPr>
+          <w:lang w:val="en-US"/>
+        </w:rPr>
+      </w:pPr>
+      <w:r>
+        <w:rPr>
+          <w:lang w:val="en-US"/>
+        </w:rPr>
+        <w:t xml:space="preserve">        </w:t>
+      </w:r>
+      <w:proofErr w:type="gramStart"/>
+      <w:r>
+        <w:rPr>
+          <w:lang w:val="en-US"/>
+        </w:rPr>
+        <w:t>std::</w:t>
       </w:r>
       <w:proofErr w:type="spellStart"/>
-      <w:r>
-        <w:rPr>
-          <w:lang w:val="en-US"/>
-        </w:rPr>
-        <w:t>driver.EmbossCharacter</w:t>
+      <w:proofErr w:type="gramEnd"/>
+      <w:r>
+        <w:rPr>
+          <w:lang w:val="en-US"/>
+        </w:rPr>
+        <w:t>cerr</w:t>
       </w:r>
       <w:proofErr w:type="spellEnd"/>
       <w:r>
         <w:rPr>
           <w:lang w:val="en-US"/>
         </w:rPr>
-        <w:t>('A', position);</w:t>
-      </w:r>
-    </w:p>
-    <w:p>
-      <w:pPr>
-        <w:rPr>
-          <w:lang w:val="en-US"/>
-        </w:rPr>
-      </w:pPr>
-      <w:r>
-        <w:rPr>
-          <w:lang w:val="en-US"/>
-        </w:rPr>
-        <w:t xml:space="preserve">    </w:t>
+        <w:t xml:space="preserve"> &lt;&lt; "</w:t>
+      </w:r>
+      <w:r>
+        <w:t>Ошибка</w:t>
+      </w:r>
+      <w:r>
+        <w:rPr>
+          <w:lang w:val="en-US"/>
+        </w:rPr>
+        <w:t xml:space="preserve"> </w:t>
+      </w:r>
+      <w:r>
+        <w:t>эмбоссирования</w:t>
+      </w:r>
+      <w:r>
+        <w:rPr>
+          <w:lang w:val="en-US"/>
+        </w:rPr>
+        <w:t xml:space="preserve">: " &lt;&lt; result &lt;&lt; </w:t>
       </w:r>
       <w:proofErr w:type="gramStart"/>
       <w:r>
         <w:rPr>
-          <w:bCs/>
-          <w:lang w:val="en-US"/>
-        </w:rPr>
-        <w:t>if</w:t>
-      </w:r>
+          <w:lang w:val="en-US"/>
+        </w:rPr>
+        <w:t>std::</w:t>
+      </w:r>
+      <w:proofErr w:type="spellStart"/>
       <w:proofErr w:type="gramEnd"/>
-      <w:r>
-        <w:rPr>
-          <w:lang w:val="en-US"/>
-        </w:rPr>
-        <w:t xml:space="preserve"> (result != DRV_SUCCESS) {</w:t>
-      </w:r>
-    </w:p>
-    <w:p>
-      <w:pPr>
-        <w:rPr>
-          <w:lang w:val="en-US"/>
-        </w:rPr>
-      </w:pPr>
-      <w:r>
-        <w:rPr>
-          <w:lang w:val="en-US"/>
-        </w:rPr>
-        <w:t xml:space="preserve">        </w:t>
-      </w:r>
-      <w:proofErr w:type="spellStart"/>
-      <w:r>
-        <w:rPr>
-          <w:lang w:val="en-US"/>
-        </w:rPr>
-        <w:t>std</w:t>
-      </w:r>
-      <w:proofErr w:type="spellEnd"/>
-      <w:r>
-        <w:rPr>
-          <w:lang w:val="en-US"/>
-        </w:rPr>
-        <w:t>::</w:t>
-      </w:r>
-      <w:proofErr w:type="spellStart"/>
-      <w:r>
-        <w:rPr>
-          <w:lang w:val="en-US"/>
-        </w:rPr>
-        <w:t>cerr</w:t>
-      </w:r>
-      <w:proofErr w:type="spellEnd"/>
-      <w:r>
-        <w:rPr>
-          <w:lang w:val="en-US"/>
-        </w:rPr>
-        <w:t xml:space="preserve"> &lt;&lt; "</w:t>
-      </w:r>
-      <w:r>
-        <w:t>Ошибка</w:t>
-      </w:r>
-      <w:r>
-        <w:rPr>
-          <w:lang w:val="en-US"/>
-        </w:rPr>
-        <w:t xml:space="preserve"> </w:t>
-      </w:r>
-      <w:r>
-        <w:t>эмбоссирования</w:t>
-      </w:r>
-      <w:r>
-        <w:rPr>
-          <w:lang w:val="en-US"/>
-        </w:rPr>
-        <w:t xml:space="preserve">: " &lt;&lt; result &lt;&lt; </w:t>
-      </w:r>
-      <w:proofErr w:type="spellStart"/>
-      <w:r>
-        <w:rPr>
-          <w:lang w:val="en-US"/>
-        </w:rPr>
-        <w:t>std</w:t>
-      </w:r>
-      <w:proofErr w:type="spellEnd"/>
-      <w:r>
-        <w:rPr>
-          <w:lang w:val="en-US"/>
-        </w:rPr>
-        <w:t>::</w:t>
-      </w:r>
-      <w:proofErr w:type="spellStart"/>
       <w:r>
         <w:rPr>
           <w:lang w:val="en-US"/>
@@ -14525,18 +14587,12 @@
         <w:t>driver.EjectCard</w:t>
       </w:r>
       <w:proofErr w:type="spellEnd"/>
-      <w:r>
-        <w:rPr>
-          <w:lang w:val="en-US"/>
-        </w:rPr>
-        <w:t>(</w:t>
-      </w:r>
       <w:proofErr w:type="gramEnd"/>
       <w:r>
         <w:rPr>
           <w:lang w:val="en-US"/>
         </w:rPr>
-        <w:t>);</w:t>
+        <w:t>();</w:t>
       </w:r>
     </w:p>
     <w:p>
@@ -14560,18 +14616,12 @@
         <w:t>driver.Disconnect</w:t>
       </w:r>
       <w:proofErr w:type="spellEnd"/>
-      <w:r>
-        <w:rPr>
-          <w:lang w:val="en-US"/>
-        </w:rPr>
-        <w:t>(</w:t>
-      </w:r>
       <w:proofErr w:type="gramEnd"/>
       <w:r>
         <w:rPr>
           <w:lang w:val="en-US"/>
         </w:rPr>
-        <w:t>);</w:t>
+        <w:t>();</w:t>
       </w:r>
     </w:p>
     <w:p>
@@ -14634,74 +14684,74 @@
       <w:pPr>
         <w:pStyle w:val="Heading2"/>
       </w:pPr>
-      <w:bookmarkStart w:id="40" w:name="_Toc198558800"/>
+      <w:bookmarkStart w:id="39" w:name="_Toc198558800"/>
       <w:r>
         <w:t>3.5. Обработка ошибок</w:t>
       </w:r>
+      <w:bookmarkEnd w:id="39"/>
+    </w:p>
+    <w:p>
+      <w:r>
+        <w:t>(Опишите, как драйвер сообщает об ошибках, какие коды ошибок используются, и как вызывающее приложение должно обрабатывать ошибки.)</w:t>
+      </w:r>
+    </w:p>
+    <w:p>
+      <w:r>
+        <w:t>3.5.1. Коды ошибок:</w:t>
+      </w:r>
+    </w:p>
+    <w:p>
+      <w:r>
+        <w:t>(Приведите таблицу с кодами ошибок и их описанием)</w:t>
+      </w:r>
+    </w:p>
+    <w:p>
+      <w:r>
+        <w:rPr>
+          <w:bCs/>
+        </w:rPr>
+        <w:t>3.5.2. Функция обратного вызова (Callback):</w:t>
+      </w:r>
+    </w:p>
+    <w:p>
+      <w:r>
+        <w:t>(Опишите, как можно использовать функцию обратного вызова для асинхронной обработки ошибок)</w:t>
+      </w:r>
+    </w:p>
+    <w:p>
+      <w:pPr>
+        <w:pStyle w:val="Heading2"/>
+      </w:pPr>
+      <w:bookmarkStart w:id="40" w:name="_Toc198558801"/>
+      <w:r>
+        <w:t>3.6. Заключение</w:t>
+      </w:r>
       <w:bookmarkEnd w:id="40"/>
     </w:p>
     <w:p>
       <w:r>
-        <w:t>(Опишите, как драйвер сообщает об ошибках, какие коды ошибок используются, и как вызывающее приложение должно обрабатывать ошибки.)</w:t>
-      </w:r>
-    </w:p>
-    <w:p>
-      <w:r>
-        <w:t>3.5.1. Коды ошибок:</w:t>
-      </w:r>
-    </w:p>
-    <w:p>
-      <w:r>
-        <w:t>(Приведите таблицу с кодами ошибок и их описанием)</w:t>
-      </w:r>
-    </w:p>
-    <w:p>
-      <w:r>
-        <w:rPr>
-          <w:bCs/>
-        </w:rPr>
-        <w:t>3.5.2. Функция обратного вызова (Callback):</w:t>
-      </w:r>
-    </w:p>
-    <w:p>
-      <w:r>
-        <w:t>(Опишите, как можно использовать функцию обратного вызова для асинхронной обработки ошибок)</w:t>
+        <w:t>В этой главе было в своих приложениях. В следующей главе будут представлены результаты тестирования драйвера и оценка его производительности.</w:t>
       </w:r>
     </w:p>
     <w:p>
       <w:pPr>
         <w:pStyle w:val="Heading2"/>
       </w:pPr>
-      <w:bookmarkStart w:id="41" w:name="_Toc198558801"/>
-      <w:r>
-        <w:t>3.6. Заключение</w:t>
+    </w:p>
+    <w:p>
+      <w:pPr>
+        <w:pStyle w:val="Heading2"/>
+      </w:pPr>
+    </w:p>
+    <w:p>
+      <w:pPr>
+        <w:pStyle w:val="Heading2"/>
+      </w:pPr>
+      <w:bookmarkStart w:id="41" w:name="_Toc198558802"/>
+      <w:r>
+        <w:t>3.1 Качественный анализ разработанного драйвера в тестовой среде</w:t>
       </w:r>
       <w:bookmarkEnd w:id="41"/>
-    </w:p>
-    <w:p>
-      <w:r>
-        <w:t>В этой главе было в своих приложениях. В следующей главе будут представлены результаты тестирования драйвера и оценка его производительности.</w:t>
-      </w:r>
-    </w:p>
-    <w:p>
-      <w:pPr>
-        <w:pStyle w:val="Heading2"/>
-      </w:pPr>
-    </w:p>
-    <w:p>
-      <w:pPr>
-        <w:pStyle w:val="Heading2"/>
-      </w:pPr>
-    </w:p>
-    <w:p>
-      <w:pPr>
-        <w:pStyle w:val="Heading2"/>
-      </w:pPr>
-      <w:bookmarkStart w:id="42" w:name="_Toc198558802"/>
-      <w:r>
-        <w:t>3.1 Качественный анализ разработанного драйвера в тестовой среде</w:t>
-      </w:r>
-      <w:bookmarkEnd w:id="42"/>
     </w:p>
     <w:p>
       <w:r>
@@ -14766,33 +14816,33 @@
           <w:numId w:val="4"/>
         </w:numPr>
       </w:pPr>
-      <w:bookmarkStart w:id="43" w:name="_Toc198558803"/>
+      <w:bookmarkStart w:id="42" w:name="_Toc198558803"/>
       <w:r>
         <w:lastRenderedPageBreak/>
         <w:t>Передача драйвера клиентам для тестирования</w:t>
       </w:r>
+      <w:bookmarkEnd w:id="42"/>
+    </w:p>
+    <w:p>
+      <w:r>
+        <w:t xml:space="preserve">После того, как драйвер был успешно разработан и протестирован внутри компании, необходимо будет внести данный драйвер </w:t>
+      </w:r>
+      <w:r>
+        <w:t>в ближайшую новую версию приложения для передачи клиентам</w:t>
+      </w:r>
+      <w:r>
+        <w:t>. После внесения и тестирования приложения в клиентской среде, клиентами будут переданы логи обработки для дальнейшего анализа. После проведения финального анализа продукта, прошедшего проверку в клиентской среде, можно будет считать, что продукт успешно разработан и выпущен в работу и теперь войдет в фазу поддержки</w:t>
+      </w:r>
+    </w:p>
+    <w:p>
+      <w:pPr>
+        <w:pStyle w:val="Heading3"/>
+      </w:pPr>
+      <w:bookmarkStart w:id="43" w:name="_Toc198558804"/>
+      <w:r>
+        <w:t>2.3.6. Дополнительные инструменты</w:t>
+      </w:r>
       <w:bookmarkEnd w:id="43"/>
-    </w:p>
-    <w:p>
-      <w:r>
-        <w:t xml:space="preserve">После того, как драйвер был успешно разработан и протестирован внутри компании, необходимо будет внести данный драйвер </w:t>
-      </w:r>
-      <w:r>
-        <w:t>в ближайшую новую версию приложения для передачи клиентам</w:t>
-      </w:r>
-      <w:r>
-        <w:t>. После внесения и тестирования приложения в клиентской среде, клиентами будут переданы логи обработки для дальнейшего анализа. После проведения финального анализа продукта, прошедшего проверку в клиентской среде, можно будет считать, что продукт успешно разработан и выпущен в работу и теперь войдет в фазу поддержки</w:t>
-      </w:r>
-    </w:p>
-    <w:p>
-      <w:pPr>
-        <w:pStyle w:val="Heading3"/>
-      </w:pPr>
-      <w:bookmarkStart w:id="44" w:name="_Toc198558804"/>
-      <w:r>
-        <w:t>2.3.6. Дополнительные инструменты</w:t>
-      </w:r>
-      <w:bookmarkEnd w:id="44"/>
     </w:p>
     <w:p>
       <w:r>
@@ -14809,14 +14859,14 @@
       <w:pPr>
         <w:pStyle w:val="Heading2"/>
       </w:pPr>
-      <w:bookmarkStart w:id="45" w:name="_Toc198558805"/>
+      <w:bookmarkStart w:id="44" w:name="_Toc198558805"/>
       <w:r>
         <w:t xml:space="preserve">2.1 </w:t>
       </w:r>
       <w:r>
         <w:t>Анализ имеющихся средств разработки драйверов</w:t>
       </w:r>
-      <w:bookmarkEnd w:id="45"/>
+      <w:bookmarkEnd w:id="44"/>
     </w:p>
     <w:p>
       <w:pPr>
@@ -14963,111 +15013,111 @@
       <w:pPr>
         <w:pStyle w:val="Heading2"/>
       </w:pPr>
-      <w:bookmarkStart w:id="46" w:name="_Toc198558806"/>
+      <w:bookmarkStart w:id="45" w:name="_Toc198558806"/>
       <w:r>
         <w:lastRenderedPageBreak/>
         <w:t>2.2 Разработка драйвера взаимодействия с эмбоссером</w:t>
       </w:r>
+      <w:bookmarkEnd w:id="45"/>
+    </w:p>
+    <w:p>
+      <w:pPr>
+        <w:ind w:firstLine="426"/>
+      </w:pPr>
+      <w:r>
+        <w:t xml:space="preserve">Разработка драйвера взаимодействия с эмбоссером будет проходить в два этапа – проектирование и разработка в Дизайнере, за которыми будут следовать подключение драйвера в </w:t>
+      </w:r>
+      <w:r>
+        <w:t xml:space="preserve">CardFactory </w:t>
+      </w:r>
+      <w:r>
+        <w:t>и тестирование как внутри компании, так и на стороне клиентов. На этапах проектирования и разработки будет учитываться структура уже существующих драйверов взаимодействия с эмбоссерами, а также информация, представленная в документации компании «</w:t>
+      </w:r>
+      <w:r>
+        <w:rPr>
+          <w:lang w:val="en-US"/>
+        </w:rPr>
+        <w:t>MATICA</w:t>
+      </w:r>
+      <w:r>
+        <w:t>», описанная в первой главе.</w:t>
+      </w:r>
+    </w:p>
+    <w:p>
+      <w:pPr>
+        <w:ind w:firstLine="426"/>
+      </w:pPr>
+      <w:r>
+        <w:t xml:space="preserve">Проектирование структуры драйвера предполагает понимание роли драйвера в схеме взаимодействия с эмбоссером. Драйвер по большому счету будет представлять из себя только модуль передачи команд эмбоссеру от приложения, то есть на вход драйвер будет получать передаваемое карте сообщение, после будет вносить это сообщение в подготовленную строку кода на языке </w:t>
+      </w:r>
+      <w:proofErr w:type="spellStart"/>
+      <w:r>
+        <w:rPr>
+          <w:lang w:val="en-US"/>
+        </w:rPr>
+        <w:t>TCPScript</w:t>
+      </w:r>
+      <w:proofErr w:type="spellEnd"/>
+      <w:r>
+        <w:t xml:space="preserve"> и отправлять ее на эмбоссер по сетевому протоколу. Выходом же драйвера будет полученное в результате выполнения операции сообщение от карты в виде двух байт, которые определяют успешность выполнения операции или же наличие возникших в результате выполнения ошибок.</w:t>
+      </w:r>
+    </w:p>
+    <w:p>
+      <w:pPr>
+        <w:ind w:firstLine="426"/>
+      </w:pPr>
+      <w:r>
+        <w:t xml:space="preserve">Анализируя структуру схожих драйверов, можно определить, что внутри драйвера обязательно необходимо иметь два объекта-функции </w:t>
+      </w:r>
+      <w:r>
+        <w:rPr>
+          <w:lang w:val="en-US"/>
+        </w:rPr>
+        <w:t>send</w:t>
+      </w:r>
+      <w:r>
+        <w:t xml:space="preserve"> </w:t>
+      </w:r>
+      <w:r>
+        <w:t xml:space="preserve">и </w:t>
+      </w:r>
+      <w:r>
+        <w:rPr>
+          <w:lang w:val="en-US"/>
+        </w:rPr>
+        <w:t>receive</w:t>
+      </w:r>
+      <w:r>
+        <w:t xml:space="preserve">, </w:t>
+      </w:r>
+      <w:r>
+        <w:t>которые будут осуществлять отправку данных эмбоссеру и принятие ответа от него. Эти функции будут использоваться внешним модулем, который будет подгружать драйвер и использовать их при выборе эмбоссера</w:t>
+      </w:r>
+      <w:r>
+        <w:t xml:space="preserve"> </w:t>
+      </w:r>
+      <w:r>
+        <w:rPr>
+          <w:lang w:val="en-US"/>
+        </w:rPr>
+        <w:t>MATICA</w:t>
+      </w:r>
+      <w:r>
+        <w:t xml:space="preserve"> </w:t>
+      </w:r>
+      <w:r>
+        <w:t>как основного эмбоссера для записи.</w:t>
+      </w:r>
+    </w:p>
+    <w:p>
+      <w:pPr>
+        <w:pStyle w:val="Heading2"/>
+      </w:pPr>
+      <w:bookmarkStart w:id="46" w:name="_Toc198558807"/>
+      <w:r>
+        <w:t>2.3 Подключение драйвера в приложение</w:t>
+      </w:r>
       <w:bookmarkEnd w:id="46"/>
-    </w:p>
-    <w:p>
-      <w:pPr>
-        <w:ind w:firstLine="426"/>
-      </w:pPr>
-      <w:r>
-        <w:t xml:space="preserve">Разработка драйвера взаимодействия с эмбоссером будет проходить в два этапа – проектирование и разработка в Дизайнере, за которыми будут следовать подключение драйвера в </w:t>
-      </w:r>
-      <w:r>
-        <w:t xml:space="preserve">CardFactory </w:t>
-      </w:r>
-      <w:r>
-        <w:t>и тестирование как внутри компании, так и на стороне клиентов. На этапах проектирования и разработки будет учитываться структура уже существующих драйверов взаимодействия с эмбоссерами, а также информация, представленная в документации компании «</w:t>
-      </w:r>
-      <w:r>
-        <w:rPr>
-          <w:lang w:val="en-US"/>
-        </w:rPr>
-        <w:t>MATICA</w:t>
-      </w:r>
-      <w:r>
-        <w:t>», описанная в первой главе.</w:t>
-      </w:r>
-    </w:p>
-    <w:p>
-      <w:pPr>
-        <w:ind w:firstLine="426"/>
-      </w:pPr>
-      <w:r>
-        <w:t xml:space="preserve">Проектирование структуры драйвера предполагает понимание роли драйвера в схеме взаимодействия с эмбоссером. Драйвер по большому счету будет представлять из себя только модуль передачи команд эмбоссеру от приложения, то есть на вход драйвер будет получать передаваемое карте сообщение, после будет вносить это сообщение в подготовленную строку кода на языке </w:t>
-      </w:r>
-      <w:proofErr w:type="spellStart"/>
-      <w:r>
-        <w:rPr>
-          <w:lang w:val="en-US"/>
-        </w:rPr>
-        <w:t>TCPScript</w:t>
-      </w:r>
-      <w:proofErr w:type="spellEnd"/>
-      <w:r>
-        <w:t xml:space="preserve"> и отправлять ее на эмбоссер по сетевому протоколу. Выходом же драйвера будет полученное в результате выполнения операции сообщение от карты в виде двух байт, которые определяют успешность выполнения операции или же наличие возникших в результате выполнения ошибок.</w:t>
-      </w:r>
-    </w:p>
-    <w:p>
-      <w:pPr>
-        <w:ind w:firstLine="426"/>
-      </w:pPr>
-      <w:r>
-        <w:t xml:space="preserve">Анализируя структуру схожих драйверов, можно определить, что внутри драйвера обязательно необходимо иметь два объекта-функции </w:t>
-      </w:r>
-      <w:r>
-        <w:rPr>
-          <w:lang w:val="en-US"/>
-        </w:rPr>
-        <w:t>send</w:t>
-      </w:r>
-      <w:r>
-        <w:t xml:space="preserve"> </w:t>
-      </w:r>
-      <w:r>
-        <w:t xml:space="preserve">и </w:t>
-      </w:r>
-      <w:r>
-        <w:rPr>
-          <w:lang w:val="en-US"/>
-        </w:rPr>
-        <w:t>receive</w:t>
-      </w:r>
-      <w:r>
-        <w:t xml:space="preserve">, </w:t>
-      </w:r>
-      <w:r>
-        <w:t>которые будут осуществлять отправку данных эмбоссеру и принятие ответа от него. Эти функции будут использоваться внешним модулем, который будет подгружать драйвер и использовать их при выборе эмбоссера</w:t>
-      </w:r>
-      <w:r>
-        <w:t xml:space="preserve"> </w:t>
-      </w:r>
-      <w:r>
-        <w:rPr>
-          <w:lang w:val="en-US"/>
-        </w:rPr>
-        <w:t>MATICA</w:t>
-      </w:r>
-      <w:r>
-        <w:t xml:space="preserve"> </w:t>
-      </w:r>
-      <w:r>
-        <w:t>как основного эмбоссера для записи.</w:t>
-      </w:r>
-    </w:p>
-    <w:p>
-      <w:pPr>
-        <w:pStyle w:val="Heading2"/>
-      </w:pPr>
-      <w:bookmarkStart w:id="47" w:name="_Toc198558807"/>
-      <w:r>
-        <w:t>2.3 Подключение драйвера в приложение</w:t>
-      </w:r>
-      <w:bookmarkEnd w:id="47"/>
     </w:p>
     <w:p>
       <w:r>
@@ -15206,12 +15256,12 @@
       <w:pPr>
         <w:pStyle w:val="Heading1"/>
       </w:pPr>
-      <w:bookmarkStart w:id="48" w:name="_Toc198558808"/>
+      <w:bookmarkStart w:id="47" w:name="_Toc198558808"/>
       <w:r>
         <w:lastRenderedPageBreak/>
         <w:t>Заключение</w:t>
       </w:r>
-      <w:bookmarkEnd w:id="48"/>
+      <w:bookmarkEnd w:id="47"/>
     </w:p>
     <w:p>
       <w:pPr>
@@ -15227,11 +15277,11 @@
       <w:pPr>
         <w:pStyle w:val="Heading1"/>
       </w:pPr>
-      <w:bookmarkStart w:id="49" w:name="_Toc198558809"/>
+      <w:bookmarkStart w:id="48" w:name="_Toc198558809"/>
       <w:r>
         <w:t>Список используемой литературы</w:t>
       </w:r>
-      <w:bookmarkEnd w:id="49"/>
+      <w:bookmarkEnd w:id="48"/>
     </w:p>
     <w:p>
       <w:pPr>
@@ -15247,11 +15297,11 @@
       <w:pPr>
         <w:pStyle w:val="Heading1"/>
       </w:pPr>
-      <w:bookmarkStart w:id="50" w:name="_Toc198558810"/>
+      <w:bookmarkStart w:id="49" w:name="_Toc198558810"/>
       <w:r>
         <w:t>Приложения</w:t>
       </w:r>
-      <w:bookmarkEnd w:id="50"/>
+      <w:bookmarkEnd w:id="49"/>
     </w:p>
     <w:p>
       <w:pPr>
@@ -15276,7 +15326,7 @@
 </file>
 
 <file path=word/endnotes.xml><?xml version="1.0" encoding="utf-8"?>
-<w:endnotes xmlns:wpc="http://schemas.microsoft.com/office/word/2010/wordprocessingCanvas" xmlns:cx="http://schemas.microsoft.com/office/drawing/2014/chartex" xmlns:cx1="http://schemas.microsoft.com/office/drawing/2015/9/8/chartex" xmlns:mc="http://schemas.openxmlformats.org/markup-compatibility/2006" xmlns:o="urn:schemas-microsoft-com:office:office" xmlns:r="http://schemas.openxmlformats.org/officeDocument/2006/relationships" xmlns:m="http://schemas.openxmlformats.org/officeDocument/2006/math" xmlns:v="urn:schemas-microsoft-com:vml" xmlns:wp14="http://schemas.microsoft.com/office/word/2010/wordprocessingDrawing" xmlns:wp="http://schemas.openxmlformats.org/drawingml/2006/wordprocessingDrawing" xmlns:w10="urn:schemas-microsoft-com:office:word" xmlns:w="http://schemas.openxmlformats.org/wordprocessingml/2006/main" xmlns:w14="http://schemas.microsoft.com/office/word/2010/wordml" xmlns:w15="http://schemas.microsoft.com/office/word/2012/wordml" xmlns:w16se="http://schemas.microsoft.com/office/word/2015/wordml/symex" xmlns:wpg="http://schemas.microsoft.com/office/word/2010/wordprocessingGroup" xmlns:wpi="http://schemas.microsoft.com/office/word/2010/wordprocessingInk" xmlns:wne="http://schemas.microsoft.com/office/word/2006/wordml" xmlns:wps="http://schemas.microsoft.com/office/word/2010/wordprocessingShape" mc:Ignorable="w14 w15 w16se wp14">
+<w:endnotes xmlns:wpc="http://schemas.microsoft.com/office/word/2010/wordprocessingCanvas" xmlns:cx="http://schemas.microsoft.com/office/drawing/2014/chartex" xmlns:cx1="http://schemas.microsoft.com/office/drawing/2015/9/8/chartex" xmlns:cx2="http://schemas.microsoft.com/office/drawing/2015/10/21/chartex" xmlns:cx3="http://schemas.microsoft.com/office/drawing/2016/5/9/chartex" xmlns:cx4="http://schemas.microsoft.com/office/drawing/2016/5/10/chartex" xmlns:cx5="http://schemas.microsoft.com/office/drawing/2016/5/11/chartex" xmlns:cx6="http://schemas.microsoft.com/office/drawing/2016/5/12/chartex" xmlns:cx7="http://schemas.microsoft.com/office/drawing/2016/5/13/chartex" xmlns:cx8="http://schemas.microsoft.com/office/drawing/2016/5/14/chartex" xmlns:mc="http://schemas.openxmlformats.org/markup-compatibility/2006" xmlns:aink="http://schemas.microsoft.com/office/drawing/2016/ink" xmlns:am3d="http://schemas.microsoft.com/office/drawing/2017/model3d" xmlns:o="urn:schemas-microsoft-com:office:office" xmlns:oel="http://schemas.microsoft.com/office/2019/extlst" xmlns:r="http://schemas.openxmlformats.org/officeDocument/2006/relationships" xmlns:m="http://schemas.openxmlformats.org/officeDocument/2006/math" xmlns:v="urn:schemas-microsoft-com:vml" xmlns:wp14="http://schemas.microsoft.com/office/word/2010/wordprocessingDrawing" xmlns:wp="http://schemas.openxmlformats.org/drawingml/2006/wordprocessingDrawing" xmlns:w10="urn:schemas-microsoft-com:office:word" xmlns:w="http://schemas.openxmlformats.org/wordprocessingml/2006/main" xmlns:w14="http://schemas.microsoft.com/office/word/2010/wordml" xmlns:w15="http://schemas.microsoft.com/office/word/2012/wordml" xmlns:w16cex="http://schemas.microsoft.com/office/word/2018/wordml/cex" xmlns:w16cid="http://schemas.microsoft.com/office/word/2016/wordml/cid" xmlns:w16="http://schemas.microsoft.com/office/word/2018/wordml" xmlns:w16du="http://schemas.microsoft.com/office/word/2023/wordml/word16du" xmlns:w16sdtdh="http://schemas.microsoft.com/office/word/2020/wordml/sdtdatahash" xmlns:w16sdtfl="http://schemas.microsoft.com/office/word/2024/wordml/sdtformatlock" xmlns:w16se="http://schemas.microsoft.com/office/word/2015/wordml/symex" xmlns:wpg="http://schemas.microsoft.com/office/word/2010/wordprocessingGroup" xmlns:wpi="http://schemas.microsoft.com/office/word/2010/wordprocessingInk" xmlns:wne="http://schemas.microsoft.com/office/word/2006/wordml" xmlns:wps="http://schemas.microsoft.com/office/word/2010/wordprocessingShape" mc:Ignorable="w14 w15 w16se w16cid w16 w16cex w16sdtdh w16sdtfl w16du wp14">
   <w:endnote w:type="separator" w:id="-1">
     <w:p>
       <w:pPr>
@@ -15301,7 +15351,7 @@
 </file>
 
 <file path=word/footer1.xml><?xml version="1.0" encoding="utf-8"?>
-<w:ftr xmlns:wpc="http://schemas.microsoft.com/office/word/2010/wordprocessingCanvas" xmlns:cx="http://schemas.microsoft.com/office/drawing/2014/chartex" xmlns:cx1="http://schemas.microsoft.com/office/drawing/2015/9/8/chartex" xmlns:mc="http://schemas.openxmlformats.org/markup-compatibility/2006" xmlns:o="urn:schemas-microsoft-com:office:office" xmlns:r="http://schemas.openxmlformats.org/officeDocument/2006/relationships" xmlns:m="http://schemas.openxmlformats.org/officeDocument/2006/math" xmlns:v="urn:schemas-microsoft-com:vml" xmlns:wp14="http://schemas.microsoft.com/office/word/2010/wordprocessingDrawing" xmlns:wp="http://schemas.openxmlformats.org/drawingml/2006/wordprocessingDrawing" xmlns:w10="urn:schemas-microsoft-com:office:word" xmlns:w="http://schemas.openxmlformats.org/wordprocessingml/2006/main" xmlns:w14="http://schemas.microsoft.com/office/word/2010/wordml" xmlns:w15="http://schemas.microsoft.com/office/word/2012/wordml" xmlns:w16se="http://schemas.microsoft.com/office/word/2015/wordml/symex" xmlns:wpg="http://schemas.microsoft.com/office/word/2010/wordprocessingGroup" xmlns:wpi="http://schemas.microsoft.com/office/word/2010/wordprocessingInk" xmlns:wne="http://schemas.microsoft.com/office/word/2006/wordml" xmlns:wps="http://schemas.microsoft.com/office/word/2010/wordprocessingShape" mc:Ignorable="w14 w15 w16se wp14">
+<w:ftr xmlns:wpc="http://schemas.microsoft.com/office/word/2010/wordprocessingCanvas" xmlns:cx="http://schemas.microsoft.com/office/drawing/2014/chartex" xmlns:cx1="http://schemas.microsoft.com/office/drawing/2015/9/8/chartex" xmlns:cx2="http://schemas.microsoft.com/office/drawing/2015/10/21/chartex" xmlns:cx3="http://schemas.microsoft.com/office/drawing/2016/5/9/chartex" xmlns:cx4="http://schemas.microsoft.com/office/drawing/2016/5/10/chartex" xmlns:cx5="http://schemas.microsoft.com/office/drawing/2016/5/11/chartex" xmlns:cx6="http://schemas.microsoft.com/office/drawing/2016/5/12/chartex" xmlns:cx7="http://schemas.microsoft.com/office/drawing/2016/5/13/chartex" xmlns:cx8="http://schemas.microsoft.com/office/drawing/2016/5/14/chartex" xmlns:mc="http://schemas.openxmlformats.org/markup-compatibility/2006" xmlns:aink="http://schemas.microsoft.com/office/drawing/2016/ink" xmlns:am3d="http://schemas.microsoft.com/office/drawing/2017/model3d" xmlns:o="urn:schemas-microsoft-com:office:office" xmlns:oel="http://schemas.microsoft.com/office/2019/extlst" xmlns:r="http://schemas.openxmlformats.org/officeDocument/2006/relationships" xmlns:m="http://schemas.openxmlformats.org/officeDocument/2006/math" xmlns:v="urn:schemas-microsoft-com:vml" xmlns:wp14="http://schemas.microsoft.com/office/word/2010/wordprocessingDrawing" xmlns:wp="http://schemas.openxmlformats.org/drawingml/2006/wordprocessingDrawing" xmlns:w10="urn:schemas-microsoft-com:office:word" xmlns:w="http://schemas.openxmlformats.org/wordprocessingml/2006/main" xmlns:w14="http://schemas.microsoft.com/office/word/2010/wordml" xmlns:w15="http://schemas.microsoft.com/office/word/2012/wordml" xmlns:w16cex="http://schemas.microsoft.com/office/word/2018/wordml/cex" xmlns:w16cid="http://schemas.microsoft.com/office/word/2016/wordml/cid" xmlns:w16="http://schemas.microsoft.com/office/word/2018/wordml" xmlns:w16du="http://schemas.microsoft.com/office/word/2023/wordml/word16du" xmlns:w16sdtdh="http://schemas.microsoft.com/office/word/2020/wordml/sdtdatahash" xmlns:w16sdtfl="http://schemas.microsoft.com/office/word/2024/wordml/sdtformatlock" xmlns:w16se="http://schemas.microsoft.com/office/word/2015/wordml/symex" xmlns:wpg="http://schemas.microsoft.com/office/word/2010/wordprocessingGroup" xmlns:wpi="http://schemas.microsoft.com/office/word/2010/wordprocessingInk" xmlns:wne="http://schemas.microsoft.com/office/word/2006/wordml" xmlns:wps="http://schemas.microsoft.com/office/word/2010/wordprocessingShape" mc:Ignorable="w14 w15 w16se w16cid w16 w16cex w16sdtdh w16sdtfl w16du wp14">
   <w:sdt>
     <w:sdtPr>
       <w:id w:val="-384414388"/>
@@ -15346,7 +15396,7 @@
 </file>
 
 <file path=word/footnotes.xml><?xml version="1.0" encoding="utf-8"?>
-<w:footnotes xmlns:wpc="http://schemas.microsoft.com/office/word/2010/wordprocessingCanvas" xmlns:cx="http://schemas.microsoft.com/office/drawing/2014/chartex" xmlns:cx1="http://schemas.microsoft.com/office/drawing/2015/9/8/chartex" xmlns:mc="http://schemas.openxmlformats.org/markup-compatibility/2006" xmlns:o="urn:schemas-microsoft-com:office:office" xmlns:r="http://schemas.openxmlformats.org/officeDocument/2006/relationships" xmlns:m="http://schemas.openxmlformats.org/officeDocument/2006/math" xmlns:v="urn:schemas-microsoft-com:vml" xmlns:wp14="http://schemas.microsoft.com/office/word/2010/wordprocessingDrawing" xmlns:wp="http://schemas.openxmlformats.org/drawingml/2006/wordprocessingDrawing" xmlns:w10="urn:schemas-microsoft-com:office:word" xmlns:w="http://schemas.openxmlformats.org/wordprocessingml/2006/main" xmlns:w14="http://schemas.microsoft.com/office/word/2010/wordml" xmlns:w15="http://schemas.microsoft.com/office/word/2012/wordml" xmlns:w16se="http://schemas.microsoft.com/office/word/2015/wordml/symex" xmlns:wpg="http://schemas.microsoft.com/office/word/2010/wordprocessingGroup" xmlns:wpi="http://schemas.microsoft.com/office/word/2010/wordprocessingInk" xmlns:wne="http://schemas.microsoft.com/office/word/2006/wordml" xmlns:wps="http://schemas.microsoft.com/office/word/2010/wordprocessingShape" mc:Ignorable="w14 w15 w16se wp14">
+<w:footnotes xmlns:wpc="http://schemas.microsoft.com/office/word/2010/wordprocessingCanvas" xmlns:cx="http://schemas.microsoft.com/office/drawing/2014/chartex" xmlns:cx1="http://schemas.microsoft.com/office/drawing/2015/9/8/chartex" xmlns:cx2="http://schemas.microsoft.com/office/drawing/2015/10/21/chartex" xmlns:cx3="http://schemas.microsoft.com/office/drawing/2016/5/9/chartex" xmlns:cx4="http://schemas.microsoft.com/office/drawing/2016/5/10/chartex" xmlns:cx5="http://schemas.microsoft.com/office/drawing/2016/5/11/chartex" xmlns:cx6="http://schemas.microsoft.com/office/drawing/2016/5/12/chartex" xmlns:cx7="http://schemas.microsoft.com/office/drawing/2016/5/13/chartex" xmlns:cx8="http://schemas.microsoft.com/office/drawing/2016/5/14/chartex" xmlns:mc="http://schemas.openxmlformats.org/markup-compatibility/2006" xmlns:aink="http://schemas.microsoft.com/office/drawing/2016/ink" xmlns:am3d="http://schemas.microsoft.com/office/drawing/2017/model3d" xmlns:o="urn:schemas-microsoft-com:office:office" xmlns:oel="http://schemas.microsoft.com/office/2019/extlst" xmlns:r="http://schemas.openxmlformats.org/officeDocument/2006/relationships" xmlns:m="http://schemas.openxmlformats.org/officeDocument/2006/math" xmlns:v="urn:schemas-microsoft-com:vml" xmlns:wp14="http://schemas.microsoft.com/office/word/2010/wordprocessingDrawing" xmlns:wp="http://schemas.openxmlformats.org/drawingml/2006/wordprocessingDrawing" xmlns:w10="urn:schemas-microsoft-com:office:word" xmlns:w="http://schemas.openxmlformats.org/wordprocessingml/2006/main" xmlns:w14="http://schemas.microsoft.com/office/word/2010/wordml" xmlns:w15="http://schemas.microsoft.com/office/word/2012/wordml" xmlns:w16cex="http://schemas.microsoft.com/office/word/2018/wordml/cex" xmlns:w16cid="http://schemas.microsoft.com/office/word/2016/wordml/cid" xmlns:w16="http://schemas.microsoft.com/office/word/2018/wordml" xmlns:w16du="http://schemas.microsoft.com/office/word/2023/wordml/word16du" xmlns:w16sdtdh="http://schemas.microsoft.com/office/word/2020/wordml/sdtdatahash" xmlns:w16sdtfl="http://schemas.microsoft.com/office/word/2024/wordml/sdtformatlock" xmlns:w16se="http://schemas.microsoft.com/office/word/2015/wordml/symex" xmlns:wpg="http://schemas.microsoft.com/office/word/2010/wordprocessingGroup" xmlns:wpi="http://schemas.microsoft.com/office/word/2010/wordprocessingInk" xmlns:wne="http://schemas.microsoft.com/office/word/2006/wordml" xmlns:wps="http://schemas.microsoft.com/office/word/2010/wordprocessingShape" mc:Ignorable="w14 w15 w16se w16cid w16 w16cex w16sdtdh w16sdtfl w16du wp14">
   <w:footnote w:type="separator" w:id="-1">
     <w:p>
       <w:pPr>
@@ -15371,7 +15421,7 @@
 </file>
 
 <file path=word/numbering.xml><?xml version="1.0" encoding="utf-8"?>
-<w:numbering xmlns:wpc="http://schemas.microsoft.com/office/word/2010/wordprocessingCanvas" xmlns:cx="http://schemas.microsoft.com/office/drawing/2014/chartex" xmlns:cx1="http://schemas.microsoft.com/office/drawing/2015/9/8/chartex" xmlns:mc="http://schemas.openxmlformats.org/markup-compatibility/2006" xmlns:o="urn:schemas-microsoft-com:office:office" xmlns:r="http://schemas.openxmlformats.org/officeDocument/2006/relationships" xmlns:m="http://schemas.openxmlformats.org/officeDocument/2006/math" xmlns:v="urn:schemas-microsoft-com:vml" xmlns:wp14="http://schemas.microsoft.com/office/word/2010/wordprocessingDrawing" xmlns:wp="http://schemas.openxmlformats.org/drawingml/2006/wordprocessingDrawing" xmlns:w10="urn:schemas-microsoft-com:office:word" xmlns:w="http://schemas.openxmlformats.org/wordprocessingml/2006/main" xmlns:w14="http://schemas.microsoft.com/office/word/2010/wordml" xmlns:w15="http://schemas.microsoft.com/office/word/2012/wordml" xmlns:w16se="http://schemas.microsoft.com/office/word/2015/wordml/symex" xmlns:wpg="http://schemas.microsoft.com/office/word/2010/wordprocessingGroup" xmlns:wpi="http://schemas.microsoft.com/office/word/2010/wordprocessingInk" xmlns:wne="http://schemas.microsoft.com/office/word/2006/wordml" xmlns:wps="http://schemas.microsoft.com/office/word/2010/wordprocessingShape" mc:Ignorable="w14 w15 w16se wp14">
+<w:numbering xmlns:wpc="http://schemas.microsoft.com/office/word/2010/wordprocessingCanvas" xmlns:cx="http://schemas.microsoft.com/office/drawing/2014/chartex" xmlns:cx1="http://schemas.microsoft.com/office/drawing/2015/9/8/chartex" xmlns:cx2="http://schemas.microsoft.com/office/drawing/2015/10/21/chartex" xmlns:cx3="http://schemas.microsoft.com/office/drawing/2016/5/9/chartex" xmlns:cx4="http://schemas.microsoft.com/office/drawing/2016/5/10/chartex" xmlns:cx5="http://schemas.microsoft.com/office/drawing/2016/5/11/chartex" xmlns:cx6="http://schemas.microsoft.com/office/drawing/2016/5/12/chartex" xmlns:cx7="http://schemas.microsoft.com/office/drawing/2016/5/13/chartex" xmlns:cx8="http://schemas.microsoft.com/office/drawing/2016/5/14/chartex" xmlns:mc="http://schemas.openxmlformats.org/markup-compatibility/2006" xmlns:aink="http://schemas.microsoft.com/office/drawing/2016/ink" xmlns:am3d="http://schemas.microsoft.com/office/drawing/2017/model3d" xmlns:o="urn:schemas-microsoft-com:office:office" xmlns:oel="http://schemas.microsoft.com/office/2019/extlst" xmlns:r="http://schemas.openxmlformats.org/officeDocument/2006/relationships" xmlns:m="http://schemas.openxmlformats.org/officeDocument/2006/math" xmlns:v="urn:schemas-microsoft-com:vml" xmlns:wp14="http://schemas.microsoft.com/office/word/2010/wordprocessingDrawing" xmlns:wp="http://schemas.openxmlformats.org/drawingml/2006/wordprocessingDrawing" xmlns:w10="urn:schemas-microsoft-com:office:word" xmlns:w="http://schemas.openxmlformats.org/wordprocessingml/2006/main" xmlns:w14="http://schemas.microsoft.com/office/word/2010/wordml" xmlns:w15="http://schemas.microsoft.com/office/word/2012/wordml" xmlns:w16cex="http://schemas.microsoft.com/office/word/2018/wordml/cex" xmlns:w16cid="http://schemas.microsoft.com/office/word/2016/wordml/cid" xmlns:w16="http://schemas.microsoft.com/office/word/2018/wordml" xmlns:w16du="http://schemas.microsoft.com/office/word/2023/wordml/word16du" xmlns:w16sdtdh="http://schemas.microsoft.com/office/word/2020/wordml/sdtdatahash" xmlns:w16sdtfl="http://schemas.microsoft.com/office/word/2024/wordml/sdtformatlock" xmlns:w16se="http://schemas.microsoft.com/office/word/2015/wordml/symex" xmlns:wpg="http://schemas.microsoft.com/office/word/2010/wordprocessingGroup" xmlns:wpi="http://schemas.microsoft.com/office/word/2010/wordprocessingInk" xmlns:wne="http://schemas.microsoft.com/office/word/2006/wordml" xmlns:wps="http://schemas.microsoft.com/office/word/2010/wordprocessingShape" mc:Ignorable="w14 w15 w16se w16cid w16 w16cex w16sdtdh w16sdtfl w16du wp14">
   <w:abstractNum w:abstractNumId="0" w15:restartNumberingAfterBreak="0">
     <w:nsid w:val="07B7395C"/>
     <w:multiLevelType w:val="hybridMultilevel"/>
@@ -18163,70 +18213,70 @@
       </w:rPr>
     </w:lvl>
   </w:abstractNum>
-  <w:num w:numId="1">
+  <w:num w:numId="1" w16cid:durableId="2037585064">
     <w:abstractNumId w:val="16"/>
   </w:num>
-  <w:num w:numId="2">
+  <w:num w:numId="2" w16cid:durableId="1333948679">
     <w:abstractNumId w:val="6"/>
   </w:num>
-  <w:num w:numId="3">
+  <w:num w:numId="3" w16cid:durableId="751857597">
     <w:abstractNumId w:val="11"/>
   </w:num>
-  <w:num w:numId="4">
+  <w:num w:numId="4" w16cid:durableId="2080013720">
     <w:abstractNumId w:val="9"/>
   </w:num>
-  <w:num w:numId="5">
+  <w:num w:numId="5" w16cid:durableId="1313094920">
     <w:abstractNumId w:val="10"/>
   </w:num>
-  <w:num w:numId="6">
+  <w:num w:numId="6" w16cid:durableId="1689527742">
     <w:abstractNumId w:val="19"/>
   </w:num>
-  <w:num w:numId="7">
+  <w:num w:numId="7" w16cid:durableId="285622589">
     <w:abstractNumId w:val="2"/>
   </w:num>
-  <w:num w:numId="8">
+  <w:num w:numId="8" w16cid:durableId="628822219">
     <w:abstractNumId w:val="7"/>
   </w:num>
-  <w:num w:numId="9">
+  <w:num w:numId="9" w16cid:durableId="1227840197">
     <w:abstractNumId w:val="5"/>
   </w:num>
-  <w:num w:numId="10">
+  <w:num w:numId="10" w16cid:durableId="2069330590">
     <w:abstractNumId w:val="0"/>
   </w:num>
-  <w:num w:numId="11">
+  <w:num w:numId="11" w16cid:durableId="787548495">
     <w:abstractNumId w:val="8"/>
   </w:num>
-  <w:num w:numId="12">
+  <w:num w:numId="12" w16cid:durableId="1736471717">
     <w:abstractNumId w:val="15"/>
   </w:num>
-  <w:num w:numId="13">
+  <w:num w:numId="13" w16cid:durableId="1042483398">
     <w:abstractNumId w:val="4"/>
   </w:num>
-  <w:num w:numId="14">
+  <w:num w:numId="14" w16cid:durableId="735206222">
     <w:abstractNumId w:val="3"/>
   </w:num>
-  <w:num w:numId="15">
+  <w:num w:numId="15" w16cid:durableId="709844938">
     <w:abstractNumId w:val="14"/>
   </w:num>
-  <w:num w:numId="16">
+  <w:num w:numId="16" w16cid:durableId="2127656173">
     <w:abstractNumId w:val="21"/>
   </w:num>
-  <w:num w:numId="17">
+  <w:num w:numId="17" w16cid:durableId="600258774">
     <w:abstractNumId w:val="1"/>
   </w:num>
-  <w:num w:numId="18">
+  <w:num w:numId="18" w16cid:durableId="199975936">
     <w:abstractNumId w:val="13"/>
   </w:num>
-  <w:num w:numId="19">
+  <w:num w:numId="19" w16cid:durableId="1695224626">
     <w:abstractNumId w:val="17"/>
   </w:num>
-  <w:num w:numId="20">
+  <w:num w:numId="20" w16cid:durableId="321008220">
     <w:abstractNumId w:val="12"/>
   </w:num>
-  <w:num w:numId="21">
+  <w:num w:numId="21" w16cid:durableId="662201108">
     <w:abstractNumId w:val="18"/>
   </w:num>
-  <w:num w:numId="22">
+  <w:num w:numId="22" w16cid:durableId="1307011346">
     <w:abstractNumId w:val="20"/>
   </w:num>
   <w:numIdMacAtCleanup w:val="20"/>
@@ -18234,7 +18284,7 @@
 </file>
 
 <file path=word/styles.xml><?xml version="1.0" encoding="utf-8"?>
-<w:styles xmlns:mc="http://schemas.openxmlformats.org/markup-compatibility/2006" xmlns:r="http://schemas.openxmlformats.org/officeDocument/2006/relationships" xmlns:w="http://schemas.openxmlformats.org/wordprocessingml/2006/main" xmlns:w14="http://schemas.microsoft.com/office/word/2010/wordml" xmlns:w15="http://schemas.microsoft.com/office/word/2012/wordml" xmlns:w16se="http://schemas.microsoft.com/office/word/2015/wordml/symex" mc:Ignorable="w14 w15 w16se">
+<w:styles xmlns:mc="http://schemas.openxmlformats.org/markup-compatibility/2006" xmlns:r="http://schemas.openxmlformats.org/officeDocument/2006/relationships" xmlns:w="http://schemas.openxmlformats.org/wordprocessingml/2006/main" xmlns:w14="http://schemas.microsoft.com/office/word/2010/wordml" xmlns:w15="http://schemas.microsoft.com/office/word/2012/wordml" xmlns:w16cex="http://schemas.microsoft.com/office/word/2018/wordml/cex" xmlns:w16cid="http://schemas.microsoft.com/office/word/2016/wordml/cid" xmlns:w16="http://schemas.microsoft.com/office/word/2018/wordml" xmlns:w16du="http://schemas.microsoft.com/office/word/2023/wordml/word16du" xmlns:w16sdtdh="http://schemas.microsoft.com/office/word/2020/wordml/sdtdatahash" xmlns:w16sdtfl="http://schemas.microsoft.com/office/word/2024/wordml/sdtformatlock" xmlns:w16se="http://schemas.microsoft.com/office/word/2015/wordml/symex" mc:Ignorable="w14 w15 w16se w16cid w16 w16cex w16sdtdh w16sdtfl w16du">
   <w:docDefaults>
     <w:rPrDefault>
       <w:rPr>
@@ -18250,7 +18300,7 @@
       </w:pPr>
     </w:pPrDefault>
   </w:docDefaults>
-  <w:latentStyles w:defLockedState="0" w:defUIPriority="99" w:defSemiHidden="0" w:defUnhideWhenUsed="0" w:defQFormat="0" w:count="371">
+  <w:latentStyles w:defLockedState="0" w:defUIPriority="99" w:defSemiHidden="0" w:defUnhideWhenUsed="0" w:defQFormat="0" w:count="376">
     <w:lsdException w:name="Normal" w:uiPriority="0" w:qFormat="1"/>
     <w:lsdException w:name="heading 1" w:uiPriority="9" w:qFormat="1"/>
     <w:lsdException w:name="heading 2" w:semiHidden="1" w:uiPriority="9" w:unhideWhenUsed="1" w:qFormat="1"/>
@@ -18622,6 +18672,11 @@
     <w:lsdException w:name="List Table 5 Dark Accent 6" w:uiPriority="50"/>
     <w:lsdException w:name="List Table 6 Colorful Accent 6" w:uiPriority="51"/>
     <w:lsdException w:name="List Table 7 Colorful Accent 6" w:uiPriority="52"/>
+    <w:lsdException w:name="Mention" w:semiHidden="1" w:unhideWhenUsed="1"/>
+    <w:lsdException w:name="Smart Hyperlink" w:semiHidden="1" w:unhideWhenUsed="1"/>
+    <w:lsdException w:name="Hashtag" w:semiHidden="1" w:unhideWhenUsed="1"/>
+    <w:lsdException w:name="Unresolved Mention" w:semiHidden="1" w:unhideWhenUsed="1"/>
+    <w:lsdException w:name="Smart Link" w:semiHidden="1" w:unhideWhenUsed="1"/>
   </w:latentStyles>
   <w:style w:type="paragraph" w:default="1" w:styleId="Normal">
     <w:name w:val="Normal"/>

</xml_diff>

<commit_message>
More additions to chapter 1.
</commit_message>
<xml_diff>
--- a/Diplom_Main.docx
+++ b/Diplom_Main.docx
@@ -4807,7 +4807,13 @@
     </w:p>
     <w:p>
       <w:r>
-        <w:t xml:space="preserve">Прежде чем приступать к планированию и разработке любых проектных решений необходимо досконально проанализировать компоненты эмбоссера, с которыми и посредством которых необходимо будет взаимодействовать с ним. Анализ является необходимой частью, с которой начинается любое исследование, разработка и любая другая большая работа. Это вдвойне справедливо при осуществлении работы с любыми сложными механическими комплексами, такими как, например, эмбоссер, ведь необходимо проанализировать все методы взаимодействия с этим комплексом, порядок работы с ним, его составляющие и т.д. для </w:t>
+        <w:t xml:space="preserve">Прежде чем приступать к планированию и разработке любых проектных решений необходимо досконально проанализировать компоненты эмбоссера, с которыми и посредством которых необходимо будет взаимодействовать с ним. Анализ является необходимой частью, с которой начинается любое исследование, разработка и любая другая большая работа. Это вдвойне справедливо при осуществлении работы с любыми сложными </w:t>
+      </w:r>
+      <w:r>
+        <w:t xml:space="preserve">техническими </w:t>
+      </w:r>
+      <w:r>
+        <w:t xml:space="preserve">комплексами, такими как, например, эмбоссер, ведь необходимо проанализировать все методы взаимодействия с этим комплексом, порядок работы с ним, его составляющие и т.д. для </w:t>
       </w:r>
       <w:r>
         <w:t xml:space="preserve">того, чтобы не упустить любые важные детали, которые могут пригодится в дальнейшей разработке. </w:t>
@@ -5169,18 +5175,280 @@
         <w:pStyle w:val="Heading3"/>
       </w:pPr>
       <w:r>
-        <w:t xml:space="preserve">1.1.2 Общая структура эмбоссеров </w:t>
+        <w:t xml:space="preserve">1.1.2 </w:t>
+      </w:r>
+      <w:r>
+        <w:t>Общее описание работы</w:t>
+      </w:r>
+      <w:r>
+        <w:t xml:space="preserve"> эмбоссеров </w:t>
       </w:r>
     </w:p>
     <w:p>
       <w:pPr>
         <w:ind w:firstLine="420"/>
       </w:pPr>
+      <w:r>
+        <w:t>Как была упомянуто в начале данной главы, эмбоссер представляет из себя сложный технический комплекс</w:t>
+      </w:r>
+      <w:r>
+        <w:t xml:space="preserve">. Он состоит из нескольких модулей, каждый из которых выполняет определенную функцию. Модули не имеют определенных названий, так что в рамках работы они будут обозначены по выполняемым функциям. Весь процесс прохождения пластиковой банковской карты через эмбоссер и подстройки ее под клиента называется персонализацией. Весь процесс персонализации в эмбоссере можно разбить на два этапа: запись информации на чип карты и непосредственно эмбоссирование. Оба этапа должны идти непосредственно друг за другом, запись информации никогда не производится посреди процесса эмбоссирования. </w:t>
+      </w:r>
+      <w:r>
+        <w:t>Между всеми этапами и модулями карта перемещается по специальным салазкам с прорезиненными краями для хорошего сцепления с картой</w:t>
+      </w:r>
+      <w:r>
+        <w:t xml:space="preserve">. </w:t>
+      </w:r>
     </w:p>
     <w:p>
       <w:pPr>
         <w:ind w:firstLine="420"/>
       </w:pPr>
+      <w:r>
+        <w:lastRenderedPageBreak/>
+        <w:t>Весь этап з</w:t>
+      </w:r>
+      <w:r>
+        <w:t>апись информации производится в од</w:t>
+      </w:r>
+      <w:r>
+        <w:t>ном модуле – кардридерном.</w:t>
+      </w:r>
+      <w:r>
+        <w:t xml:space="preserve"> </w:t>
+      </w:r>
+      <w:r>
+        <w:t xml:space="preserve">Карта помещается туда с салазок </w:t>
+      </w:r>
+      <w:r>
+        <w:t>с</w:t>
+      </w:r>
+      <w:r>
+        <w:t>пециальным манипулятором, который заталкивает ее в кардридер. Внутри кардридера присутствует набор металлических контактов, которые прижимаются к контактной площадке чипа карты и обеспечивают надежное соединение с чипом карты.</w:t>
+      </w:r>
+    </w:p>
+    <w:p>
+      <w:pPr>
+        <w:ind w:firstLine="420"/>
+      </w:pPr>
+      <w:r>
+        <w:t>Этап эмбоссирования же выполняется несколькими последовательными модулями, которые могут идти в различной последовательности в зависимости от требований к выпуску карты и строения самого эмбоссера. Этапы которые должна обязательно пройти пластиковая карта для завершения эмбоссирования это:</w:t>
+      </w:r>
+    </w:p>
+    <w:p>
+      <w:pPr>
+        <w:pStyle w:val="ListParagraph"/>
+        <w:numPr>
+          <w:ilvl w:val="0"/>
+          <w:numId w:val="23"/>
+        </w:numPr>
+      </w:pPr>
+      <w:r>
+        <w:t>Печать изображений на поверхностях карты специальными красками</w:t>
+      </w:r>
+    </w:p>
+    <w:p>
+      <w:pPr>
+        <w:pStyle w:val="ListParagraph"/>
+        <w:numPr>
+          <w:ilvl w:val="0"/>
+          <w:numId w:val="23"/>
+        </w:numPr>
+      </w:pPr>
+      <w:r>
+        <w:t xml:space="preserve">Выдавливание, выжигание или печать информации о клиенте, номера карты, и </w:t>
+      </w:r>
+      <w:r>
+        <w:rPr>
+          <w:lang w:val="en-US"/>
+        </w:rPr>
+        <w:t>CVC</w:t>
+      </w:r>
+      <w:r>
+        <w:t>/</w:t>
+      </w:r>
+      <w:r>
+        <w:rPr>
+          <w:lang w:val="en-US"/>
+        </w:rPr>
+        <w:t>CVV</w:t>
+      </w:r>
+    </w:p>
+    <w:p>
+      <w:pPr>
+        <w:pStyle w:val="ListParagraph"/>
+        <w:numPr>
+          <w:ilvl w:val="0"/>
+          <w:numId w:val="23"/>
+        </w:numPr>
+      </w:pPr>
+      <w:r>
+        <w:t>Ламинирование карты</w:t>
+      </w:r>
+    </w:p>
+    <w:p>
+      <w:pPr>
+        <w:ind w:firstLine="0"/>
+      </w:pPr>
+      <w:r>
+        <w:t>В начале этапа эмбоссирования, карта поступает на салазки абсолютно белая и по прохождению всех необходимых модулей приобретает тот вид, в котором мы привыкли ее видеть.</w:t>
+      </w:r>
+    </w:p>
+    <w:p>
+      <w:r>
+        <w:t>Стоит упомянуть, что хотя эмбоссер и является сложным техническим комплексом, он не предоставляет абсолютно всех средств для осуществления полноценной работы с ним. Для точного управления такой системой необходимо иметь ЭВМ, на которой должно быть установлено необходимое ПО для работы с эмбоссером. Такая управляющая ЭВМ в совокупности с установленными программными средствами позволяет полностью управлять процессом эмбоссирования и посредством внесения предварительных настроек определять вид будущей карты.</w:t>
+      </w:r>
+    </w:p>
+    <w:p>
+      <w:r>
+        <w:t xml:space="preserve">Эмбоссеры компании </w:t>
+      </w:r>
+      <w:r>
+        <w:rPr>
+          <w:lang w:val="en-US"/>
+        </w:rPr>
+        <w:t>MATICA</w:t>
+      </w:r>
+      <w:r>
+        <w:t xml:space="preserve"> </w:t>
+      </w:r>
+      <w:r>
+        <w:t xml:space="preserve">не являются исключением из тех общих положений, описанных в данном подразделе. Конечно, так как </w:t>
+      </w:r>
+      <w:r>
+        <w:t>для осуществления разработки не был предоставлен полноценный эмбоссер с документацией, а только его кардридерный модуль для осуществления поддержки прямого управления. В ходе работы были исследованы и раскрыты только методы взаимодействия именно с ним и в дальнейшем работа с эмбоссером будет рассматриваться только в контексте взаимодействия с его кардридерным модулем.</w:t>
+      </w:r>
+    </w:p>
+    <w:p>
+      <w:pPr>
+        <w:pStyle w:val="Heading3"/>
+        <w:rPr>
+          <w:lang w:val="en-US"/>
+        </w:rPr>
+      </w:pPr>
+      <w:r>
+        <w:t xml:space="preserve">1.1.3 Теоретические основы работы с кардридерным модулем эмбоссеров </w:t>
+      </w:r>
+      <w:r>
+        <w:rPr>
+          <w:lang w:val="en-US"/>
+        </w:rPr>
+        <w:t>MATICA</w:t>
+      </w:r>
+    </w:p>
+    <w:p>
+      <w:r>
+        <w:t xml:space="preserve">Предоставленный для разработки и тестирования кардридерный модуль представляет из себя электронную плату на микроконтроллерной основе с подключенными к ней необходимыми периферийными устройствами. Всего в модуль входит три основных компонента: блок питания, управляющая плата </w:t>
+      </w:r>
+      <w:r>
+        <w:lastRenderedPageBreak/>
+        <w:t>и кардридеры. Все компоненты соединены между собой необходимыми кабелями и проводами</w:t>
+      </w:r>
+      <w:r>
+        <w:t>. Блок питания подключается к управляющей плате тремя проводами для питания, а кардридеры подключены к управляющей плате через специальную дополнительную плату, которая устанавливается поверх управляющей платы, с несколькими коннекторами, к которым собственно и подключаются ридеры.</w:t>
+      </w:r>
+      <w:r>
+        <w:t xml:space="preserve"> </w:t>
+      </w:r>
+      <w:r>
+        <w:t xml:space="preserve">В модуле может присутствовать любое количество кардридеров, это зависит от модели выпускаемой платы. В тестовой же плате присутствует два кардридера, чего вполне достаточно для полноценной разработки и тестирования разрабатываемого драйвера. </w:t>
+      </w:r>
+    </w:p>
+    <w:p>
+      <w:r>
+        <w:t xml:space="preserve">Для соединения с управляющей ЭВМ на плате предусмотрен порт </w:t>
+      </w:r>
+      <w:r>
+        <w:rPr>
+          <w:lang w:val="en-US"/>
+        </w:rPr>
+        <w:t>Ethernet</w:t>
+      </w:r>
+      <w:r>
+        <w:t>.</w:t>
+      </w:r>
+      <w:r>
+        <w:t xml:space="preserve"> Сама плата должна подключаться к ЭВМ через</w:t>
+      </w:r>
+      <w:r>
+        <w:t xml:space="preserve"> маршрутизатор и принимать сообщения через</w:t>
+      </w:r>
+      <w:r>
+        <w:t xml:space="preserve"> внутреннюю локальную сеть или же</w:t>
+      </w:r>
+      <w:r>
+        <w:t xml:space="preserve"> подключаться</w:t>
+      </w:r>
+      <w:r>
+        <w:t xml:space="preserve"> напрямую через </w:t>
+      </w:r>
+      <w:r>
+        <w:rPr>
+          <w:lang w:val="en-US"/>
+        </w:rPr>
+        <w:t>Ethernet</w:t>
+      </w:r>
+      <w:r>
+        <w:t xml:space="preserve"> </w:t>
+      </w:r>
+      <w:r>
+        <w:t>кабель</w:t>
+      </w:r>
+      <w:r>
+        <w:t>, хотя производителем рекомендуется именно последний вариант подключения</w:t>
+      </w:r>
+      <w:r>
+        <w:t xml:space="preserve">. Используя предоставленную документацию модуля, было выявлено, что любое взаимодействие с модулем необходимо осуществлять по протоколу </w:t>
+      </w:r>
+      <w:r>
+        <w:rPr>
+          <w:lang w:val="en-US"/>
+        </w:rPr>
+        <w:t>TCP</w:t>
+      </w:r>
+      <w:r>
+        <w:t>/</w:t>
+      </w:r>
+      <w:r>
+        <w:rPr>
+          <w:lang w:val="en-US"/>
+        </w:rPr>
+        <w:t>IP</w:t>
+      </w:r>
+      <w:r>
+        <w:t xml:space="preserve">. </w:t>
+      </w:r>
+      <w:r>
+        <w:t xml:space="preserve">Любые команды обязательно нужно передавать в кардридерный модуль только по зарезервированным в нем </w:t>
+      </w:r>
+      <w:r>
+        <w:rPr>
+          <w:lang w:val="en-US"/>
+        </w:rPr>
+        <w:t>IP</w:t>
+      </w:r>
+      <w:r>
+        <w:t>-</w:t>
+      </w:r>
+      <w:r>
+        <w:t>адресам. Модуль обязательно имеет адрес управляющей платы, по которому можно обращаться только к ней, в данном случае его называют базовым адресом. Каждый</w:t>
+      </w:r>
+      <w:r>
+        <w:t xml:space="preserve"> подключенный</w:t>
+      </w:r>
+      <w:r>
+        <w:t xml:space="preserve"> кардридер также имеет свой собственный зарезервированный </w:t>
+      </w:r>
+      <w:r>
+        <w:t>адрес, его можно вычислить путем добавления номера ридера к младшему байту базового адреса платы. Адреса ридеров используются для осуществления управления ими, которое включает в себя настройку ридеров, запись данных на вставленную пластиковую карту и считывание данных с карты. Стоит упомянуть, что номера кардридеров начинаются с единиц</w:t>
+      </w:r>
+      <w:r>
+        <w:t>ы</w:t>
+      </w:r>
+      <w:r>
+        <w:t xml:space="preserve"> и нумерция ридеров идет слева направо, учитывая только расположение коннекторов, к которым подключены ридеры. </w:t>
+      </w:r>
     </w:p>
     <w:p>
       <w:pPr>
@@ -5239,11 +5507,11 @@
         <w:ind w:firstLine="426"/>
       </w:pPr>
       <w:r>
-        <w:t xml:space="preserve">Загрузка карты представляет из себя введение карты в эмбоссер для дальнейшей обработки. Данный этап может быть выполнен как вручную, так </w:t>
+        <w:t xml:space="preserve">Загрузка карты представляет из себя введение карты в эмбоссер для дальнейшей обработки. Данный этап может быть выполнен как вручную, так и с помощью специального механизма подачи карт, который использует ролики и захваты для переноса карт во внутреннюю часть эмбоссера. После этапа загрузки карты с помощью механизма поступают внутрь специального устройства - кардридера, который зажимает карту. Данное устройство имеет </w:t>
       </w:r>
       <w:r>
         <w:lastRenderedPageBreak/>
-        <w:t>и с помощью специального механизма подачи карт, который использует ролики и захваты для переноса карт во внутреннюю часть эмбоссера. После этапа загрузки карты с помощью механизма поступают внутрь специального устройства - кардридера, который зажимает карту. Данное устройство имеет несколько подпружиненных контактов, которые соединяются с соответствующими контактами на карте. Целью кардридера является предоставление интерфейса взаимодействия с картой во время процесса персонализации</w:t>
+        <w:t>несколько подпружиненных контактов, которые соединяются с соответствующими контактами на карте. Целью кардридера является предоставление интерфейса взаимодействия с картой во время процесса персонализации</w:t>
       </w:r>
       <w:r>
         <w:t>, а именно возможность записи и считывания информации с чипа на карте. После поступления в кардридер карта проходит процесс персонализации, во время которого на карту записывается вся необходимая банку для работы этой самой карты информация. Далее карта вынимется из кардридера и поступает в эмбоссер, который в свою очередь наносит рисунок на карту и печатает необходимые символы на поверхностях карты с помощью выжигания или выдавливания. Выполнение всех операций производится ЭВМ, подключенной к данному эмбоссеру. После всех вышеперечисленных операций карта считается готовой к эксплуатации и выдается банком клиенту.</w:t>
@@ -5467,17 +5735,17 @@
         <w:t>» специально дл</w:t>
       </w:r>
       <w:r>
-        <w:t xml:space="preserve">я общения с эмбоссерами собственного производства. После передачи команды </w:t>
+        <w:t>я общения с эмбоссерами собственного производства. После передачи команды эмбоссеру он интерпретирует и выполняет ее</w:t>
+      </w:r>
+      <w:r>
+        <w:t xml:space="preserve"> </w:t>
+      </w:r>
+      <w:r>
+        <w:t xml:space="preserve">и после этого отправляет ответ о выполненном действии по тому же каналу подключения. Последнее, что стоит упомянуть, так это возможность работы в многопоточном режиме, она осуществляется подключением к эмбоссеру нескольких кардридеров, каждый </w:t>
       </w:r>
       <w:r>
         <w:lastRenderedPageBreak/>
-        <w:t>эмбоссеру он интерпретирует и выполняет ее</w:t>
-      </w:r>
-      <w:r>
-        <w:t xml:space="preserve"> </w:t>
-      </w:r>
-      <w:r>
-        <w:t xml:space="preserve">и после этого отправляет ответ о выполненном действии по тому же каналу подключения. Последнее, что стоит упомянуть, так это возможность работы в многопоточном режиме, она осуществляется подключением к эмбоссеру нескольких кардридеров, каждый из которых будет иметь свой собственный </w:t>
+        <w:t xml:space="preserve">из которых будет иметь свой собственный </w:t>
       </w:r>
       <w:r>
         <w:rPr>
@@ -5667,66 +5935,66 @@
         <w:rPr>
           <w:lang w:val="en-US"/>
         </w:rPr>
+        <w:t>Driver</w:t>
+      </w:r>
+      <w:r>
+        <w:t xml:space="preserve"> </w:t>
+      </w:r>
+      <w:r>
+        <w:t xml:space="preserve">приложения </w:t>
+      </w:r>
+      <w:proofErr w:type="spellStart"/>
+      <w:r>
+        <w:rPr>
+          <w:lang w:val="en-US"/>
+        </w:rPr>
+        <w:t>TranzWare</w:t>
+      </w:r>
+      <w:proofErr w:type="spellEnd"/>
+      <w:r>
+        <w:t xml:space="preserve"> </w:t>
+      </w:r>
+      <w:proofErr w:type="spellStart"/>
+      <w:r>
+        <w:rPr>
+          <w:lang w:val="en-US"/>
+        </w:rPr>
+        <w:t>CardFactory</w:t>
+      </w:r>
+      <w:proofErr w:type="spellEnd"/>
+      <w:r>
+        <w:t xml:space="preserve">. Данное приложение </w:t>
+      </w:r>
+      <w:r>
+        <w:t>разработан</w:t>
+      </w:r>
+      <w:r>
+        <w:t>о</w:t>
+      </w:r>
+      <w:r>
+        <w:t xml:space="preserve"> на основе программной платформы </w:t>
+      </w:r>
+      <w:proofErr w:type="spellStart"/>
+      <w:r>
+        <w:rPr>
+          <w:lang w:val="en-US"/>
+        </w:rPr>
+        <w:t>FloraWare</w:t>
+      </w:r>
+      <w:proofErr w:type="spellEnd"/>
+      <w:r>
+        <w:t xml:space="preserve">, </w:t>
+      </w:r>
+      <w:r>
+        <w:t>которая предоставляет широкие возможности для разработки программных продуктов разной сложности.</w:t>
+      </w:r>
+    </w:p>
+    <w:p>
+      <w:pPr>
+        <w:ind w:firstLine="426"/>
+      </w:pPr>
+      <w:r>
         <w:lastRenderedPageBreak/>
-        <w:t>Driver</w:t>
-      </w:r>
-      <w:r>
-        <w:t xml:space="preserve"> </w:t>
-      </w:r>
-      <w:r>
-        <w:t xml:space="preserve">приложения </w:t>
-      </w:r>
-      <w:proofErr w:type="spellStart"/>
-      <w:r>
-        <w:rPr>
-          <w:lang w:val="en-US"/>
-        </w:rPr>
-        <w:t>TranzWare</w:t>
-      </w:r>
-      <w:proofErr w:type="spellEnd"/>
-      <w:r>
-        <w:t xml:space="preserve"> </w:t>
-      </w:r>
-      <w:proofErr w:type="spellStart"/>
-      <w:r>
-        <w:rPr>
-          <w:lang w:val="en-US"/>
-        </w:rPr>
-        <w:t>CardFactory</w:t>
-      </w:r>
-      <w:proofErr w:type="spellEnd"/>
-      <w:r>
-        <w:t xml:space="preserve">. Данное приложение </w:t>
-      </w:r>
-      <w:r>
-        <w:t>разработан</w:t>
-      </w:r>
-      <w:r>
-        <w:t>о</w:t>
-      </w:r>
-      <w:r>
-        <w:t xml:space="preserve"> на основе программной платформы </w:t>
-      </w:r>
-      <w:proofErr w:type="spellStart"/>
-      <w:r>
-        <w:rPr>
-          <w:lang w:val="en-US"/>
-        </w:rPr>
-        <w:t>FloraWare</w:t>
-      </w:r>
-      <w:proofErr w:type="spellEnd"/>
-      <w:r>
-        <w:t xml:space="preserve">, </w:t>
-      </w:r>
-      <w:r>
-        <w:t>которая предоставляет широкие возможности для разработки программных продуктов разной сложности.</w:t>
-      </w:r>
-    </w:p>
-    <w:p>
-      <w:pPr>
-        <w:ind w:firstLine="426"/>
-      </w:pPr>
-      <w:r>
         <w:t xml:space="preserve">Чтобы ясно понять технологическую составляющую работы, обратим свое внимание на центральное ПО, на основе которого будет проводится вся дальнейшая разработка – программная платформа </w:t>
       </w:r>
       <w:proofErr w:type="spellStart"/>
@@ -5818,11 +6086,7 @@
         <w:t>агрегации</w:t>
       </w:r>
       <w:r>
-        <w:t xml:space="preserve">. В объектной </w:t>
-      </w:r>
-      <w:r>
-        <w:lastRenderedPageBreak/>
-        <w:t>машине </w:t>
+        <w:t>. В объектной машине </w:t>
       </w:r>
       <w:r>
         <w:rPr>
@@ -5850,6 +6114,7 @@
         <w:ind w:firstLine="426"/>
       </w:pPr>
       <w:r>
+        <w:lastRenderedPageBreak/>
         <w:t>На самом нижнем уровне реализован аппарат работы со свойствами объектов, которые относятся к четырем базовым типам: целое, действительное, строка и указатель на объект, эти свойства могут отличаться набором индексов базовых типов. Свойства объекта это инструмент поддержки его </w:t>
       </w:r>
       <w:r>
@@ -6067,11 +6332,7 @@
         <w:t xml:space="preserve">разработано множество модулей, отвечающих за настройку и реализацию определенных </w:t>
       </w:r>
       <w:r>
-        <w:t xml:space="preserve">этапов обработки карты. Так как в контексе данной работы нас не интересуют все имеющиеся на данный момент модули, мы рассмотрим только минимальный и достаточный набор модулей для успешной обработки </w:t>
-      </w:r>
-      <w:r>
-        <w:lastRenderedPageBreak/>
-        <w:t xml:space="preserve">и эмбоссирования карты. </w:t>
+        <w:t xml:space="preserve">этапов обработки карты. Так как в контексе данной работы нас не интересуют все имеющиеся на данный момент модули, мы рассмотрим только минимальный и достаточный набор модулей для успешной обработки и эмбоссирования карты. </w:t>
       </w:r>
       <w:r>
         <w:t>Необходимый и минимальный набор модулей для наших целей дожен состоять из:</w:t>
@@ -6091,6 +6352,7 @@
         <w:ind w:firstLine="426"/>
       </w:pPr>
       <w:r>
+        <w:lastRenderedPageBreak/>
         <w:t>Анализируя имеющееся приложение для работы с банковскими картами, частью которого и является вышеупомянутый драйвер, было выяснено, что для корректной работы драйвера и его регистрации приложением недостаточно его наличия, необходимо также, чтобы существование драйвера было зарегистрировано в базе данных, используемой приложением для хранения данных о большинстве собственных модулей.</w:t>
       </w:r>
     </w:p>
@@ -6336,36 +6598,36 @@
         <w:t xml:space="preserve">Он отвечает за взаимодействия с эмбоссером на этапе персонализации карты. </w:t>
       </w:r>
       <w:r>
-        <w:t xml:space="preserve">Драйвер выступает в роли посредника, который осуществляет запись </w:t>
+        <w:t xml:space="preserve">Драйвер выступает в роли посредника, который осуществляет запись информации на физическую карту средствами специализированных драйверов для записи определенных типов карточных продуктов внутри </w:t>
+      </w:r>
+      <w:proofErr w:type="spellStart"/>
+      <w:r>
+        <w:rPr>
+          <w:lang w:val="en-US"/>
+        </w:rPr>
+        <w:t>TranzWare</w:t>
+      </w:r>
+      <w:proofErr w:type="spellEnd"/>
+      <w:r>
+        <w:t xml:space="preserve"> </w:t>
+      </w:r>
+      <w:proofErr w:type="spellStart"/>
+      <w:r>
+        <w:rPr>
+          <w:lang w:val="en-US"/>
+        </w:rPr>
+        <w:t>CardFactory</w:t>
+      </w:r>
+      <w:proofErr w:type="spellEnd"/>
+      <w:r>
+        <w:t>.</w:t>
+      </w:r>
+      <w:r>
+        <w:t xml:space="preserve"> Карточные драйвера предоставляют всю необходимую для записи на карту информацию и алгоритм записи этой информации, драйвер </w:t>
       </w:r>
       <w:r>
         <w:lastRenderedPageBreak/>
-        <w:t xml:space="preserve">информации на физическую карту средствами специализированных драйверов для записи определенных типов карточных продуктов внутри </w:t>
-      </w:r>
-      <w:proofErr w:type="spellStart"/>
-      <w:r>
-        <w:rPr>
-          <w:lang w:val="en-US"/>
-        </w:rPr>
-        <w:t>TranzWare</w:t>
-      </w:r>
-      <w:proofErr w:type="spellEnd"/>
-      <w:r>
-        <w:t xml:space="preserve"> </w:t>
-      </w:r>
-      <w:proofErr w:type="spellStart"/>
-      <w:r>
-        <w:rPr>
-          <w:lang w:val="en-US"/>
-        </w:rPr>
-        <w:t>CardFactory</w:t>
-      </w:r>
-      <w:proofErr w:type="spellEnd"/>
-      <w:r>
-        <w:t>.</w:t>
-      </w:r>
-      <w:r>
-        <w:t xml:space="preserve"> Карточные драйвера предоставляют всю необходимую для записи на карту информацию и алгоритм записи этой информации, драйвер эмбоссера же является всего лишь интерфейсом взаимодействия, который предоставляет возможность </w:t>
+        <w:t xml:space="preserve">эмбоссера же является всего лишь интерфейсом взаимодействия, который предоставляет возможность </w:t>
       </w:r>
       <w:r>
         <w:t>карточному драйверу установить связь с физической картой.</w:t>
@@ -6635,7 +6897,6 @@
         </w:numPr>
       </w:pPr>
       <w:r>
-        <w:lastRenderedPageBreak/>
         <w:t>Изменение существующих алгоритмов для соответствия методике работы с эмбоссером</w:t>
       </w:r>
     </w:p>
@@ -6660,6 +6921,7 @@
         </w:numPr>
       </w:pPr>
       <w:r>
+        <w:lastRenderedPageBreak/>
         <w:t>Проверка работоспособности разработанного драйвера в тестовой среде, а также на реальном эмбоссере</w:t>
       </w:r>
     </w:p>
@@ -11351,7 +11613,6 @@
         </w:numPr>
       </w:pPr>
       <w:proofErr w:type="spellStart"/>
-      <w:proofErr w:type="gramStart"/>
       <w:r>
         <w:rPr>
           <w:lang w:val="en-US"/>
@@ -11360,11 +11621,7 @@
       </w:r>
       <w:proofErr w:type="spellEnd"/>
       <w:r>
-        <w:t>(</w:t>
-      </w:r>
-      <w:proofErr w:type="gramEnd"/>
-      <w:r>
-        <w:t>)</w:t>
+        <w:t>()</w:t>
       </w:r>
       <w:r>
         <w:t xml:space="preserve"> – собирает и отправляет на плату команды инициализации и настройки ридера.</w:t>
@@ -11379,7 +11636,6 @@
         </w:numPr>
       </w:pPr>
       <w:proofErr w:type="spellStart"/>
-      <w:proofErr w:type="gramStart"/>
       <w:r>
         <w:rPr>
           <w:lang w:val="en-US"/>
@@ -11388,11 +11644,7 @@
       </w:r>
       <w:proofErr w:type="spellEnd"/>
       <w:r>
-        <w:t>(</w:t>
-      </w:r>
-      <w:proofErr w:type="gramEnd"/>
-      <w:r>
-        <w:t>)</w:t>
+        <w:t>()</w:t>
       </w:r>
       <w:r>
         <w:t xml:space="preserve"> – собирает и отправляет на плату команду отключения ридера и сброса его настроек.</w:t>
@@ -11407,7 +11659,6 @@
         </w:numPr>
       </w:pPr>
       <w:proofErr w:type="spellStart"/>
-      <w:proofErr w:type="gramStart"/>
       <w:r>
         <w:rPr>
           <w:lang w:val="en-US"/>
@@ -11419,14 +11670,7 @@
         <w:rPr>
           <w:lang w:val="en-US"/>
         </w:rPr>
-        <w:t>(</w:t>
-      </w:r>
-      <w:proofErr w:type="gramEnd"/>
-      <w:r>
-        <w:rPr>
-          <w:lang w:val="en-US"/>
-        </w:rPr>
-        <w:t>)</w:t>
+        <w:t>()</w:t>
       </w:r>
       <w:r>
         <w:t xml:space="preserve"> - </w:t>
@@ -11499,7 +11743,6 @@
         </w:numPr>
       </w:pPr>
       <w:proofErr w:type="spellStart"/>
-      <w:proofErr w:type="gramStart"/>
       <w:r>
         <w:rPr>
           <w:lang w:val="en-US"/>
@@ -11512,14 +11755,7 @@
         <w:rPr>
           <w:lang w:val="en-US"/>
         </w:rPr>
-        <w:t>(</w:t>
-      </w:r>
-      <w:proofErr w:type="gramEnd"/>
-      <w:r>
-        <w:rPr>
-          <w:lang w:val="en-US"/>
-        </w:rPr>
-        <w:t>)</w:t>
+        <w:t>()</w:t>
       </w:r>
     </w:p>
     <w:p>
@@ -11530,7 +11766,6 @@
           <w:numId w:val="22"/>
         </w:numPr>
       </w:pPr>
-      <w:proofErr w:type="gramStart"/>
       <w:r>
         <w:rPr>
           <w:lang w:val="en-US"/>
@@ -11538,11 +11773,7 @@
         <w:t>Reset</w:t>
       </w:r>
       <w:r>
-        <w:t>(</w:t>
-      </w:r>
-      <w:proofErr w:type="gramEnd"/>
-      <w:r>
-        <w:t>)</w:t>
+        <w:t>()</w:t>
       </w:r>
       <w:r>
         <w:t xml:space="preserve"> – </w:t>
@@ -11595,7 +11826,6 @@
         </w:numPr>
       </w:pPr>
       <w:proofErr w:type="spellStart"/>
-      <w:proofErr w:type="gramStart"/>
       <w:r>
         <w:rPr>
           <w:lang w:val="en-US"/>
@@ -11604,11 +11834,7 @@
       </w:r>
       <w:proofErr w:type="spellEnd"/>
       <w:r>
-        <w:t>(</w:t>
-      </w:r>
-      <w:proofErr w:type="gramEnd"/>
-      <w:r>
-        <w:t>)</w:t>
+        <w:t>()</w:t>
       </w:r>
       <w:r>
         <w:t xml:space="preserve"> – составление скриптов записи и отправка сообщений </w:t>
@@ -11623,7 +11849,6 @@
         </w:numPr>
       </w:pPr>
       <w:proofErr w:type="spellStart"/>
-      <w:proofErr w:type="gramStart"/>
       <w:r>
         <w:rPr>
           <w:lang w:val="en-US"/>
@@ -11635,117 +11860,116 @@
         <w:rPr>
           <w:lang w:val="en-US"/>
         </w:rPr>
+        <w:t>()</w:t>
+      </w:r>
+    </w:p>
+    <w:p>
+      <w:r>
+        <w:t>(Повторите кратко архитектуру драйвера, которая была подробно описана в предыдущей главе. Это необходимо для контекста. Пример:</w:t>
+      </w:r>
+    </w:p>
+    <w:p>
+      <w:r>
+        <w:t>Разработанный драйвер имеет модульную архитектуру, состоящую из следующих основных компонентов:</w:t>
+      </w:r>
+    </w:p>
+    <w:p>
+      <w:r>
+        <w:t>Менеджер соединений: Управляет установлением и завершением соединения с эмбоссером.</w:t>
+      </w:r>
+    </w:p>
+    <w:p>
+      <w:r>
+        <w:t>Обработчик команд: Преобразует команды API в специфичные для эмбоссера команды.</w:t>
+      </w:r>
+    </w:p>
+    <w:p>
+      <w:r>
+        <w:t>Драйвер устройства (Device Driver): Непосредственно взаимодействует с аппаратным интерфейсом.</w:t>
+      </w:r>
+    </w:p>
+    <w:p>
+      <w:r>
+        <w:t>Обработчик ошибок: Обрабатывает ошибки и уведомляет вызывающее приложение.</w:t>
+      </w:r>
+    </w:p>
+    <w:p>
+      <w:r>
+        <w:t>Менеджер конфигурации: Управляет настройками конфигурации драйвера.</w:t>
+      </w:r>
+    </w:p>
+    <w:p>
+      <w:r>
+        <w:t>Каждый компонент выполняет определенную функцию и взаимодействует с другими компонентами через четко определенные интерфейсы.</w:t>
+      </w:r>
+    </w:p>
+    <w:p>
+      <w:pPr>
+        <w:pStyle w:val="Heading2"/>
+      </w:pPr>
+      <w:bookmarkStart w:id="29" w:name="_Toc198558790"/>
+      <w:r>
+        <w:t>3.2. Описание API (Интерфейса программирования)</w:t>
+      </w:r>
+      <w:bookmarkEnd w:id="29"/>
+    </w:p>
+    <w:p>
+      <w:r>
+        <w:t>В этом разделе подробно описывается API драйвера, предоставляющий набор функций для управления эмбоссером.</w:t>
+      </w:r>
+    </w:p>
+    <w:p>
+      <w:pPr>
+        <w:pStyle w:val="Heading3"/>
+      </w:pPr>
+      <w:bookmarkStart w:id="30" w:name="_Toc198558791"/>
+      <w:r>
+        <w:t>3.2.1. Обзор классов и функций API</w:t>
+      </w:r>
+      <w:bookmarkEnd w:id="30"/>
+    </w:p>
+    <w:p>
+      <w:r>
+        <w:t>(Перечислите основные классы и функции API с кратким описанием их назначения и параметров.)</w:t>
+      </w:r>
+    </w:p>
+    <w:p>
+      <w:r>
+        <w:rPr>
+          <w:bCs/>
+        </w:rPr>
+        <w:t>EmbosserDriver (Класс):</w:t>
+      </w:r>
+    </w:p>
+    <w:p>
+      <w:r>
+        <w:t>EmbosserDriver(): Конструктор класса.</w:t>
+      </w:r>
+    </w:p>
+    <w:p>
+      <w:r>
+        <w:t>~EmbosserDriver(): Деструктор класса.</w:t>
+      </w:r>
+    </w:p>
+    <w:p>
+      <w:pPr>
+        <w:rPr>
+          <w:lang w:val="en-US"/>
+        </w:rPr>
+      </w:pPr>
+      <w:r>
+        <w:rPr>
+          <w:lang w:val="en-US"/>
+        </w:rPr>
+        <w:t>Connect</w:t>
+      </w:r>
+      <w:r>
+        <w:rPr>
+          <w:lang w:val="en-US"/>
+        </w:rPr>
         <w:t>(</w:t>
       </w:r>
-      <w:proofErr w:type="gramEnd"/>
-      <w:r>
-        <w:rPr>
-          <w:lang w:val="en-US"/>
-        </w:rPr>
-        <w:t>)</w:t>
-      </w:r>
-    </w:p>
-    <w:p>
-      <w:r>
-        <w:t>(Повторите кратко архитектуру драйвера, которая была подробно описана в предыдущей главе. Это необходимо для контекста. Пример:</w:t>
-      </w:r>
-    </w:p>
-    <w:p>
-      <w:r>
-        <w:t>Разработанный драйвер имеет модульную архитектуру, состоящую из следующих основных компонентов:</w:t>
-      </w:r>
-    </w:p>
-    <w:p>
-      <w:r>
-        <w:t>Менеджер соединений: Управляет установлением и завершением соединения с эмбоссером.</w:t>
-      </w:r>
-    </w:p>
-    <w:p>
-      <w:r>
-        <w:t>Обработчик команд: Преобразует команды API в специфичные для эмбоссера команды.</w:t>
-      </w:r>
-    </w:p>
-    <w:p>
-      <w:r>
-        <w:t>Драйвер устройства (Device Driver): Непосредственно взаимодействует с аппаратным интерфейсом.</w:t>
-      </w:r>
-    </w:p>
-    <w:p>
-      <w:r>
-        <w:t>Обработчик ошибок: Обрабатывает ошибки и уведомляет вызывающее приложение.</w:t>
-      </w:r>
-    </w:p>
-    <w:p>
-      <w:r>
-        <w:t>Менеджер конфигурации: Управляет настройками конфигурации драйвера.</w:t>
-      </w:r>
-    </w:p>
-    <w:p>
-      <w:r>
-        <w:t>Каждый компонент выполняет определенную функцию и взаимодействует с другими компонентами через четко определенные интерфейсы.</w:t>
-      </w:r>
-    </w:p>
-    <w:p>
-      <w:pPr>
-        <w:pStyle w:val="Heading2"/>
-      </w:pPr>
-      <w:bookmarkStart w:id="29" w:name="_Toc198558790"/>
-      <w:r>
-        <w:t>3.2. Описание API (Интерфейса программирования)</w:t>
-      </w:r>
-      <w:bookmarkEnd w:id="29"/>
-    </w:p>
-    <w:p>
-      <w:r>
-        <w:t>В этом разделе подробно описывается API драйвера, предоставляющий набор функций для управления эмбоссером.</w:t>
-      </w:r>
-    </w:p>
-    <w:p>
-      <w:pPr>
-        <w:pStyle w:val="Heading3"/>
-      </w:pPr>
-      <w:bookmarkStart w:id="30" w:name="_Toc198558791"/>
-      <w:r>
-        <w:t>3.2.1. Обзор классов и функций API</w:t>
-      </w:r>
-      <w:bookmarkEnd w:id="30"/>
-    </w:p>
-    <w:p>
-      <w:r>
-        <w:t>(Перечислите основные классы и функции API с кратким описанием их назначения и параметров.)</w:t>
-      </w:r>
-    </w:p>
-    <w:p>
-      <w:r>
-        <w:rPr>
-          <w:bCs/>
-        </w:rPr>
-        <w:t>EmbosserDriver (Класс):</w:t>
-      </w:r>
-    </w:p>
-    <w:p>
-      <w:r>
-        <w:t>EmbosserDriver(): Конструктор класса.</w:t>
-      </w:r>
-    </w:p>
-    <w:p>
-      <w:r>
-        <w:t>~EmbosserDriver(): Деструктор класса.</w:t>
-      </w:r>
-    </w:p>
-    <w:p>
-      <w:proofErr w:type="gramStart"/>
-      <w:r>
-        <w:rPr>
-          <w:lang w:val="en-US"/>
-        </w:rPr>
-        <w:t>Connect</w:t>
-      </w:r>
-      <w:r>
-        <w:t>(</w:t>
-      </w:r>
       <w:proofErr w:type="spellStart"/>
-      <w:proofErr w:type="gramEnd"/>
       <w:r>
         <w:rPr>
           <w:lang w:val="en-US"/>
@@ -11754,6 +11978,9 @@
       </w:r>
       <w:proofErr w:type="spellEnd"/>
       <w:r>
+        <w:rPr>
+          <w:lang w:val="en-US"/>
+        </w:rPr>
         <w:t xml:space="preserve"> </w:t>
       </w:r>
       <w:proofErr w:type="spellStart"/>
@@ -11765,6 +11992,9 @@
       </w:r>
       <w:proofErr w:type="spellEnd"/>
       <w:r>
+        <w:rPr>
+          <w:lang w:val="en-US"/>
+        </w:rPr>
         <w:t xml:space="preserve">, </w:t>
       </w:r>
       <w:r>
@@ -11774,41 +12004,57 @@
         <w:t>Configuration</w:t>
       </w:r>
       <w:r>
-        <w:t xml:space="preserve"> </w:t>
-      </w:r>
-      <w:proofErr w:type="spellStart"/>
+        <w:rPr>
+          <w:lang w:val="en-US"/>
+        </w:rPr>
+        <w:t xml:space="preserve"> </w:t>
+      </w:r>
       <w:r>
         <w:rPr>
           <w:lang w:val="en-US"/>
         </w:rPr>
         <w:t>configuration</w:t>
       </w:r>
-      <w:proofErr w:type="spellEnd"/>
-      <w:r>
+      <w:r>
+        <w:rPr>
+          <w:lang w:val="en-US"/>
+        </w:rPr>
         <w:t xml:space="preserve">): </w:t>
       </w:r>
       <w:r>
         <w:t>Устанавливает</w:t>
       </w:r>
       <w:r>
+        <w:rPr>
+          <w:lang w:val="en-US"/>
+        </w:rPr>
         <w:t xml:space="preserve"> </w:t>
       </w:r>
       <w:r>
         <w:t>соединение</w:t>
       </w:r>
       <w:r>
+        <w:rPr>
+          <w:lang w:val="en-US"/>
+        </w:rPr>
         <w:t xml:space="preserve"> </w:t>
       </w:r>
       <w:r>
         <w:t>с</w:t>
       </w:r>
       <w:r>
+        <w:rPr>
+          <w:lang w:val="en-US"/>
+        </w:rPr>
         <w:t xml:space="preserve"> </w:t>
       </w:r>
       <w:r>
         <w:t>эмбоссером</w:t>
       </w:r>
       <w:r>
+        <w:rPr>
+          <w:lang w:val="en-US"/>
+        </w:rPr>
         <w:t>.</w:t>
       </w:r>
     </w:p>
@@ -11915,7 +12161,6 @@
         </w:rPr>
       </w:pPr>
       <w:proofErr w:type="spellStart"/>
-      <w:proofErr w:type="gramStart"/>
       <w:r>
         <w:rPr>
           <w:lang w:val="en-US"/>
@@ -11927,53 +12172,128 @@
         <w:rPr>
           <w:lang w:val="en-US"/>
         </w:rPr>
+        <w:t xml:space="preserve">(char character, Position position): </w:t>
+      </w:r>
+      <w:r>
+        <w:t>Эмбоссирует</w:t>
+      </w:r>
+      <w:r>
+        <w:rPr>
+          <w:lang w:val="en-US"/>
+        </w:rPr>
+        <w:t xml:space="preserve"> </w:t>
+      </w:r>
+      <w:r>
+        <w:t>символ</w:t>
+      </w:r>
+      <w:r>
+        <w:rPr>
+          <w:lang w:val="en-US"/>
+        </w:rPr>
+        <w:t xml:space="preserve"> </w:t>
+      </w:r>
+      <w:r>
+        <w:t>в</w:t>
+      </w:r>
+      <w:r>
+        <w:rPr>
+          <w:lang w:val="en-US"/>
+        </w:rPr>
+        <w:t xml:space="preserve"> </w:t>
+      </w:r>
+      <w:r>
+        <w:t>указанной</w:t>
+      </w:r>
+      <w:r>
+        <w:rPr>
+          <w:lang w:val="en-US"/>
+        </w:rPr>
+        <w:t xml:space="preserve"> </w:t>
+      </w:r>
+      <w:r>
+        <w:t>позиции</w:t>
+      </w:r>
+      <w:r>
+        <w:rPr>
+          <w:lang w:val="en-US"/>
+        </w:rPr>
+        <w:t>.</w:t>
+      </w:r>
+    </w:p>
+    <w:p>
+      <w:r>
+        <w:t>Параметры:</w:t>
+      </w:r>
+    </w:p>
+    <w:p>
+      <w:r>
+        <w:t>character: Символ для эмбоссирования.</w:t>
+      </w:r>
+    </w:p>
+    <w:p>
+      <w:r>
+        <w:t>position: Объект, определяющий позицию символа на карте (x, y).</w:t>
+      </w:r>
+    </w:p>
+    <w:p>
+      <w:r>
+        <w:t>Возвращает: Код успеха или код ошибки.</w:t>
+      </w:r>
+    </w:p>
+    <w:p>
+      <w:pPr>
+        <w:rPr>
+          <w:lang w:val="en-US"/>
+        </w:rPr>
+      </w:pPr>
+      <w:proofErr w:type="spellStart"/>
+      <w:r>
+        <w:rPr>
+          <w:lang w:val="en-US"/>
+        </w:rPr>
+        <w:t>GetStatus</w:t>
+      </w:r>
+      <w:proofErr w:type="spellEnd"/>
+      <w:r>
+        <w:rPr>
+          <w:lang w:val="en-US"/>
+        </w:rPr>
         <w:t>(</w:t>
       </w:r>
-      <w:proofErr w:type="gramEnd"/>
-      <w:r>
-        <w:rPr>
-          <w:lang w:val="en-US"/>
-        </w:rPr>
-        <w:t xml:space="preserve">char character, Position position): </w:t>
-      </w:r>
-      <w:r>
-        <w:t>Эмбоссирует</w:t>
-      </w:r>
-      <w:r>
-        <w:rPr>
-          <w:lang w:val="en-US"/>
-        </w:rPr>
-        <w:t xml:space="preserve"> </w:t>
-      </w:r>
-      <w:r>
-        <w:t>символ</w:t>
-      </w:r>
-      <w:r>
-        <w:rPr>
-          <w:lang w:val="en-US"/>
-        </w:rPr>
-        <w:t xml:space="preserve"> </w:t>
-      </w:r>
-      <w:r>
-        <w:t>в</w:t>
-      </w:r>
-      <w:r>
-        <w:rPr>
-          <w:lang w:val="en-US"/>
-        </w:rPr>
-        <w:t xml:space="preserve"> </w:t>
-      </w:r>
-      <w:r>
-        <w:t>указанной</w:t>
-      </w:r>
-      <w:r>
-        <w:rPr>
-          <w:lang w:val="en-US"/>
-        </w:rPr>
-        <w:t xml:space="preserve"> </w:t>
-      </w:r>
-      <w:r>
-        <w:t>позиции</w:t>
+      <w:proofErr w:type="spellStart"/>
+      <w:r>
+        <w:rPr>
+          <w:lang w:val="en-US"/>
+        </w:rPr>
+        <w:t>EmbosserStatus</w:t>
+      </w:r>
+      <w:proofErr w:type="spellEnd"/>
+      <w:r>
+        <w:rPr>
+          <w:lang w:val="en-US"/>
+        </w:rPr>
+        <w:t xml:space="preserve">&amp; status): </w:t>
+      </w:r>
+      <w:r>
+        <w:t>Получает</w:t>
+      </w:r>
+      <w:r>
+        <w:rPr>
+          <w:lang w:val="en-US"/>
+        </w:rPr>
+        <w:t xml:space="preserve"> </w:t>
+      </w:r>
+      <w:r>
+        <w:t>статус</w:t>
+      </w:r>
+      <w:r>
+        <w:rPr>
+          <w:lang w:val="en-US"/>
+        </w:rPr>
+        <w:t xml:space="preserve"> </w:t>
+      </w:r>
+      <w:r>
+        <w:t>эмбоссера</w:t>
       </w:r>
       <w:r>
         <w:rPr>
@@ -11989,12 +12309,7 @@
     </w:p>
     <w:p>
       <w:r>
-        <w:t>character: Символ для эмбоссирования.</w:t>
-      </w:r>
-    </w:p>
-    <w:p>
-      <w:r>
-        <w:t>position: Объект, определяющий позицию символа на карте (x, y).</w:t>
+        <w:t>status: Ссылка на объект EmbosserStatus, в который будет записан статус.</w:t>
       </w:r>
     </w:p>
     <w:p>
@@ -12008,98 +12323,11 @@
           <w:lang w:val="en-US"/>
         </w:rPr>
       </w:pPr>
-      <w:proofErr w:type="spellStart"/>
-      <w:proofErr w:type="gramStart"/>
-      <w:r>
-        <w:rPr>
-          <w:lang w:val="en-US"/>
-        </w:rPr>
-        <w:t>GetStatus</w:t>
-      </w:r>
-      <w:proofErr w:type="spellEnd"/>
-      <w:r>
-        <w:rPr>
-          <w:lang w:val="en-US"/>
-        </w:rPr>
-        <w:t>(</w:t>
-      </w:r>
-      <w:proofErr w:type="spellStart"/>
-      <w:proofErr w:type="gramEnd"/>
-      <w:r>
-        <w:rPr>
-          <w:lang w:val="en-US"/>
-        </w:rPr>
-        <w:t>EmbosserStatus</w:t>
-      </w:r>
-      <w:proofErr w:type="spellEnd"/>
-      <w:r>
-        <w:rPr>
-          <w:lang w:val="en-US"/>
-        </w:rPr>
-        <w:t xml:space="preserve">&amp; status): </w:t>
-      </w:r>
-      <w:r>
-        <w:t>Получает</w:t>
-      </w:r>
-      <w:r>
-        <w:rPr>
-          <w:lang w:val="en-US"/>
-        </w:rPr>
-        <w:t xml:space="preserve"> </w:t>
-      </w:r>
-      <w:r>
-        <w:t>статус</w:t>
-      </w:r>
-      <w:r>
-        <w:rPr>
-          <w:lang w:val="en-US"/>
-        </w:rPr>
-        <w:t xml:space="preserve"> </w:t>
-      </w:r>
-      <w:r>
-        <w:t>эмбоссера</w:t>
-      </w:r>
-      <w:r>
-        <w:rPr>
-          <w:lang w:val="en-US"/>
-        </w:rPr>
-        <w:t>.</w:t>
-      </w:r>
-    </w:p>
-    <w:p>
-      <w:r>
-        <w:t>Параметры:</w:t>
-      </w:r>
-    </w:p>
-    <w:p>
-      <w:r>
-        <w:t>status: Ссылка на объект EmbosserStatus, в который будет записан статус.</w:t>
-      </w:r>
-    </w:p>
-    <w:p>
-      <w:r>
-        <w:t>Возвращает: Код успеха или код ошибки.</w:t>
-      </w:r>
-    </w:p>
-    <w:p>
-      <w:pPr>
-        <w:rPr>
-          <w:lang w:val="en-US"/>
-        </w:rPr>
-      </w:pPr>
-      <w:proofErr w:type="gramStart"/>
-      <w:r>
-        <w:rPr>
-          <w:lang w:val="en-US"/>
-        </w:rPr>
-        <w:t>Configure(</w:t>
-      </w:r>
-      <w:proofErr w:type="gramEnd"/>
-      <w:r>
-        <w:rPr>
-          <w:lang w:val="en-US"/>
-        </w:rPr>
-        <w:t xml:space="preserve">Parameter </w:t>
+      <w:r>
+        <w:rPr>
+          <w:lang w:val="en-US"/>
+        </w:rPr>
+        <w:t xml:space="preserve">Configure(Parameter </w:t>
       </w:r>
       <w:proofErr w:type="spellStart"/>
       <w:r>
@@ -12250,7 +12478,6 @@
           <w:lang w:val="en-US"/>
         </w:rPr>
       </w:pPr>
-      <w:proofErr w:type="gramStart"/>
       <w:r>
         <w:rPr>
           <w:bCs/>
@@ -12259,7 +12486,6 @@
         <w:t>Connect(</w:t>
       </w:r>
       <w:proofErr w:type="spellStart"/>
-      <w:proofErr w:type="gramEnd"/>
       <w:r>
         <w:rPr>
           <w:bCs/>
@@ -12635,7 +12861,6 @@
         </w:rPr>
         <w:t xml:space="preserve">int </w:t>
       </w:r>
-      <w:proofErr w:type="gramStart"/>
       <w:r>
         <w:rPr>
           <w:bCs/>
@@ -12647,208 +12872,191 @@
         <w:rPr>
           <w:lang w:val="en-US"/>
         </w:rPr>
+        <w:t>() {</w:t>
+      </w:r>
+    </w:p>
+    <w:p>
+      <w:pPr>
+        <w:rPr>
+          <w:lang w:val="en-US"/>
+        </w:rPr>
+      </w:pPr>
+      <w:r>
+        <w:rPr>
+          <w:lang w:val="en-US"/>
+        </w:rPr>
+        <w:t xml:space="preserve">    </w:t>
+      </w:r>
+      <w:proofErr w:type="spellStart"/>
+      <w:r>
+        <w:rPr>
+          <w:lang w:val="en-US"/>
+        </w:rPr>
+        <w:t>EmbosserDriver</w:t>
+      </w:r>
+      <w:proofErr w:type="spellEnd"/>
+      <w:r>
+        <w:rPr>
+          <w:lang w:val="en-US"/>
+        </w:rPr>
+        <w:t xml:space="preserve"> driver;</w:t>
+      </w:r>
+    </w:p>
+    <w:p>
+      <w:pPr>
+        <w:rPr>
+          <w:lang w:val="en-US"/>
+        </w:rPr>
+      </w:pPr>
+      <w:r>
+        <w:rPr>
+          <w:lang w:val="en-US"/>
+        </w:rPr>
+        <w:t xml:space="preserve">    </w:t>
+      </w:r>
+      <w:proofErr w:type="spellStart"/>
+      <w:r>
+        <w:rPr>
+          <w:lang w:val="en-US"/>
+        </w:rPr>
+        <w:t>SerialConfiguration</w:t>
+      </w:r>
+      <w:proofErr w:type="spellEnd"/>
+      <w:r>
+        <w:rPr>
+          <w:lang w:val="en-US"/>
+        </w:rPr>
+        <w:t xml:space="preserve"> </w:t>
+      </w:r>
+      <w:proofErr w:type="spellStart"/>
+      <w:r>
+        <w:rPr>
+          <w:lang w:val="en-US"/>
+        </w:rPr>
+        <w:t>serialConfig</w:t>
+      </w:r>
+      <w:proofErr w:type="spellEnd"/>
+      <w:r>
+        <w:rPr>
+          <w:lang w:val="en-US"/>
+        </w:rPr>
+        <w:t>;</w:t>
+      </w:r>
+    </w:p>
+    <w:p>
+      <w:pPr>
+        <w:rPr>
+          <w:lang w:val="en-US"/>
+        </w:rPr>
+      </w:pPr>
+      <w:r>
+        <w:rPr>
+          <w:lang w:val="en-US"/>
+        </w:rPr>
+        <w:t xml:space="preserve">    </w:t>
+      </w:r>
+      <w:proofErr w:type="spellStart"/>
+      <w:r>
+        <w:rPr>
+          <w:lang w:val="en-US"/>
+        </w:rPr>
+        <w:t>serialConfig.ComPort</w:t>
+      </w:r>
+      <w:proofErr w:type="spellEnd"/>
+      <w:r>
+        <w:rPr>
+          <w:lang w:val="en-US"/>
+        </w:rPr>
+        <w:t xml:space="preserve"> = "COM1";</w:t>
+      </w:r>
+    </w:p>
+    <w:p>
+      <w:pPr>
+        <w:rPr>
+          <w:lang w:val="en-US"/>
+        </w:rPr>
+      </w:pPr>
+      <w:r>
+        <w:rPr>
+          <w:lang w:val="en-US"/>
+        </w:rPr>
+        <w:t xml:space="preserve">    </w:t>
+      </w:r>
+      <w:proofErr w:type="spellStart"/>
+      <w:r>
+        <w:rPr>
+          <w:lang w:val="en-US"/>
+        </w:rPr>
+        <w:t>serialConfig.BaudRate</w:t>
+      </w:r>
+      <w:proofErr w:type="spellEnd"/>
+      <w:r>
+        <w:rPr>
+          <w:lang w:val="en-US"/>
+        </w:rPr>
+        <w:t xml:space="preserve"> = 9600;</w:t>
+      </w:r>
+    </w:p>
+    <w:p>
+      <w:pPr>
+        <w:rPr>
+          <w:lang w:val="en-US"/>
+        </w:rPr>
+      </w:pPr>
+    </w:p>
+    <w:p>
+      <w:pPr>
+        <w:rPr>
+          <w:lang w:val="en-US"/>
+        </w:rPr>
+      </w:pPr>
+      <w:r>
+        <w:rPr>
+          <w:lang w:val="en-US"/>
+        </w:rPr>
+        <w:t xml:space="preserve">    </w:t>
+      </w:r>
+      <w:proofErr w:type="spellStart"/>
+      <w:r>
+        <w:rPr>
+          <w:lang w:val="en-US"/>
+        </w:rPr>
+        <w:t>ErrorCode</w:t>
+      </w:r>
+      <w:proofErr w:type="spellEnd"/>
+      <w:r>
+        <w:rPr>
+          <w:lang w:val="en-US"/>
+        </w:rPr>
+        <w:t xml:space="preserve"> result = </w:t>
+      </w:r>
+      <w:proofErr w:type="spellStart"/>
+      <w:r>
+        <w:rPr>
+          <w:lang w:val="en-US"/>
+        </w:rPr>
+        <w:t>driver.Connect</w:t>
+      </w:r>
+      <w:proofErr w:type="spellEnd"/>
+      <w:r>
+        <w:rPr>
+          <w:lang w:val="en-US"/>
+        </w:rPr>
         <w:t>(</w:t>
       </w:r>
-      <w:proofErr w:type="gramEnd"/>
-      <w:r>
-        <w:rPr>
-          <w:lang w:val="en-US"/>
-        </w:rPr>
-        <w:t>) {</w:t>
-      </w:r>
-    </w:p>
-    <w:p>
-      <w:pPr>
-        <w:rPr>
-          <w:lang w:val="en-US"/>
-        </w:rPr>
-      </w:pPr>
-      <w:r>
-        <w:rPr>
-          <w:lang w:val="en-US"/>
-        </w:rPr>
-        <w:t xml:space="preserve">    </w:t>
-      </w:r>
       <w:proofErr w:type="spellStart"/>
       <w:r>
         <w:rPr>
           <w:lang w:val="en-US"/>
         </w:rPr>
-        <w:t>EmbosserDriver</w:t>
+        <w:t>InterfaceType</w:t>
       </w:r>
       <w:proofErr w:type="spellEnd"/>
       <w:r>
         <w:rPr>
           <w:lang w:val="en-US"/>
         </w:rPr>
-        <w:t xml:space="preserve"> driver;</w:t>
-      </w:r>
-    </w:p>
-    <w:p>
-      <w:pPr>
-        <w:rPr>
-          <w:lang w:val="en-US"/>
-        </w:rPr>
-      </w:pPr>
-      <w:r>
-        <w:rPr>
-          <w:lang w:val="en-US"/>
-        </w:rPr>
-        <w:t xml:space="preserve">    </w:t>
-      </w:r>
-      <w:proofErr w:type="spellStart"/>
-      <w:r>
-        <w:rPr>
-          <w:lang w:val="en-US"/>
-        </w:rPr>
-        <w:t>SerialConfiguration</w:t>
-      </w:r>
-      <w:proofErr w:type="spellEnd"/>
-      <w:r>
-        <w:rPr>
-          <w:lang w:val="en-US"/>
-        </w:rPr>
-        <w:t xml:space="preserve"> </w:t>
-      </w:r>
-      <w:proofErr w:type="spellStart"/>
-      <w:r>
-        <w:rPr>
-          <w:lang w:val="en-US"/>
-        </w:rPr>
-        <w:t>serialConfig</w:t>
-      </w:r>
-      <w:proofErr w:type="spellEnd"/>
-      <w:r>
-        <w:rPr>
-          <w:lang w:val="en-US"/>
-        </w:rPr>
-        <w:t>;</w:t>
-      </w:r>
-    </w:p>
-    <w:p>
-      <w:pPr>
-        <w:rPr>
-          <w:lang w:val="en-US"/>
-        </w:rPr>
-      </w:pPr>
-      <w:r>
-        <w:rPr>
-          <w:lang w:val="en-US"/>
-        </w:rPr>
-        <w:t xml:space="preserve">    </w:t>
-      </w:r>
-      <w:proofErr w:type="spellStart"/>
-      <w:r>
-        <w:rPr>
-          <w:lang w:val="en-US"/>
-        </w:rPr>
-        <w:t>serialConfig.ComPort</w:t>
-      </w:r>
-      <w:proofErr w:type="spellEnd"/>
-      <w:r>
-        <w:rPr>
-          <w:lang w:val="en-US"/>
-        </w:rPr>
-        <w:t xml:space="preserve"> = "COM1";</w:t>
-      </w:r>
-    </w:p>
-    <w:p>
-      <w:pPr>
-        <w:rPr>
-          <w:lang w:val="en-US"/>
-        </w:rPr>
-      </w:pPr>
-      <w:r>
-        <w:rPr>
-          <w:lang w:val="en-US"/>
-        </w:rPr>
-        <w:t xml:space="preserve">    </w:t>
-      </w:r>
-      <w:proofErr w:type="spellStart"/>
-      <w:r>
-        <w:rPr>
-          <w:lang w:val="en-US"/>
-        </w:rPr>
-        <w:t>serialConfig.BaudRate</w:t>
-      </w:r>
-      <w:proofErr w:type="spellEnd"/>
-      <w:r>
-        <w:rPr>
-          <w:lang w:val="en-US"/>
-        </w:rPr>
-        <w:t xml:space="preserve"> = 9600;</w:t>
-      </w:r>
-    </w:p>
-    <w:p>
-      <w:pPr>
-        <w:rPr>
-          <w:lang w:val="en-US"/>
-        </w:rPr>
-      </w:pPr>
-    </w:p>
-    <w:p>
-      <w:pPr>
-        <w:rPr>
-          <w:lang w:val="en-US"/>
-        </w:rPr>
-      </w:pPr>
-      <w:r>
-        <w:rPr>
-          <w:lang w:val="en-US"/>
-        </w:rPr>
-        <w:t xml:space="preserve">    </w:t>
-      </w:r>
-      <w:proofErr w:type="spellStart"/>
-      <w:r>
-        <w:rPr>
-          <w:lang w:val="en-US"/>
-        </w:rPr>
-        <w:t>ErrorCode</w:t>
-      </w:r>
-      <w:proofErr w:type="spellEnd"/>
-      <w:r>
-        <w:rPr>
-          <w:lang w:val="en-US"/>
-        </w:rPr>
-        <w:t xml:space="preserve"> result = </w:t>
-      </w:r>
-      <w:proofErr w:type="spellStart"/>
-      <w:proofErr w:type="gramStart"/>
-      <w:r>
-        <w:rPr>
-          <w:lang w:val="en-US"/>
-        </w:rPr>
-        <w:t>driver.Connect</w:t>
-      </w:r>
-      <w:proofErr w:type="spellEnd"/>
-      <w:proofErr w:type="gramEnd"/>
-      <w:r>
-        <w:rPr>
-          <w:lang w:val="en-US"/>
-        </w:rPr>
-        <w:t>(</w:t>
-      </w:r>
-      <w:proofErr w:type="spellStart"/>
-      <w:proofErr w:type="gramStart"/>
-      <w:r>
-        <w:rPr>
-          <w:lang w:val="en-US"/>
-        </w:rPr>
-        <w:t>InterfaceType</w:t>
-      </w:r>
-      <w:proofErr w:type="spellEnd"/>
-      <w:r>
-        <w:rPr>
-          <w:lang w:val="en-US"/>
-        </w:rPr>
-        <w:t>::</w:t>
-      </w:r>
-      <w:proofErr w:type="gramEnd"/>
-      <w:r>
-        <w:rPr>
-          <w:lang w:val="en-US"/>
-        </w:rPr>
-        <w:t xml:space="preserve">Serial, </w:t>
+        <w:t xml:space="preserve">::Serial, </w:t>
       </w:r>
       <w:proofErr w:type="spellStart"/>
       <w:r>
@@ -13193,7 +13401,6 @@
         </w:rPr>
         <w:t xml:space="preserve">int </w:t>
       </w:r>
-      <w:proofErr w:type="gramStart"/>
       <w:r>
         <w:rPr>
           <w:bCs/>
@@ -13205,15 +13412,213 @@
         <w:rPr>
           <w:lang w:val="en-US"/>
         </w:rPr>
+        <w:t>() {</w:t>
+      </w:r>
+    </w:p>
+    <w:p>
+      <w:pPr>
+        <w:rPr>
+          <w:lang w:val="en-US"/>
+        </w:rPr>
+      </w:pPr>
+      <w:r>
+        <w:rPr>
+          <w:lang w:val="en-US"/>
+        </w:rPr>
+        <w:t xml:space="preserve">    </w:t>
+      </w:r>
+      <w:proofErr w:type="spellStart"/>
+      <w:r>
+        <w:rPr>
+          <w:lang w:val="en-US"/>
+        </w:rPr>
+        <w:t>EmbosserDriver</w:t>
+      </w:r>
+      <w:proofErr w:type="spellEnd"/>
+      <w:r>
+        <w:rPr>
+          <w:lang w:val="en-US"/>
+        </w:rPr>
+        <w:t xml:space="preserve"> driver;</w:t>
+      </w:r>
+    </w:p>
+    <w:p>
+      <w:pPr>
+        <w:rPr>
+          <w:lang w:val="en-US"/>
+        </w:rPr>
+      </w:pPr>
+      <w:r>
+        <w:rPr>
+          <w:lang w:val="en-US"/>
+        </w:rPr>
+        <w:t xml:space="preserve">    </w:t>
+      </w:r>
+      <w:proofErr w:type="spellStart"/>
+      <w:r>
+        <w:rPr>
+          <w:lang w:val="en-US"/>
+        </w:rPr>
+        <w:t>SerialConfiguration</w:t>
+      </w:r>
+      <w:proofErr w:type="spellEnd"/>
+      <w:r>
+        <w:rPr>
+          <w:lang w:val="en-US"/>
+        </w:rPr>
+        <w:t xml:space="preserve"> </w:t>
+      </w:r>
+      <w:proofErr w:type="spellStart"/>
+      <w:r>
+        <w:rPr>
+          <w:lang w:val="en-US"/>
+        </w:rPr>
+        <w:t>serialConfig</w:t>
+      </w:r>
+      <w:proofErr w:type="spellEnd"/>
+      <w:r>
+        <w:rPr>
+          <w:lang w:val="en-US"/>
+        </w:rPr>
+        <w:t>;</w:t>
+      </w:r>
+    </w:p>
+    <w:p>
+      <w:pPr>
+        <w:rPr>
+          <w:lang w:val="en-US"/>
+        </w:rPr>
+      </w:pPr>
+      <w:r>
+        <w:rPr>
+          <w:lang w:val="en-US"/>
+        </w:rPr>
+        <w:t xml:space="preserve">    </w:t>
+      </w:r>
+      <w:proofErr w:type="spellStart"/>
+      <w:r>
+        <w:rPr>
+          <w:lang w:val="en-US"/>
+        </w:rPr>
+        <w:t>serialConfig.ComPort</w:t>
+      </w:r>
+      <w:proofErr w:type="spellEnd"/>
+      <w:r>
+        <w:rPr>
+          <w:lang w:val="en-US"/>
+        </w:rPr>
+        <w:t xml:space="preserve"> = "COM1";</w:t>
+      </w:r>
+    </w:p>
+    <w:p>
+      <w:pPr>
+        <w:rPr>
+          <w:lang w:val="en-US"/>
+        </w:rPr>
+      </w:pPr>
+      <w:r>
+        <w:rPr>
+          <w:lang w:val="en-US"/>
+        </w:rPr>
+        <w:t xml:space="preserve">    </w:t>
+      </w:r>
+      <w:proofErr w:type="spellStart"/>
+      <w:r>
+        <w:rPr>
+          <w:lang w:val="en-US"/>
+        </w:rPr>
+        <w:t>serialConfig.BaudRate</w:t>
+      </w:r>
+      <w:proofErr w:type="spellEnd"/>
+      <w:r>
+        <w:rPr>
+          <w:lang w:val="en-US"/>
+        </w:rPr>
+        <w:t xml:space="preserve"> = 9600;</w:t>
+      </w:r>
+    </w:p>
+    <w:p>
+      <w:pPr>
+        <w:rPr>
+          <w:lang w:val="en-US"/>
+        </w:rPr>
+      </w:pPr>
+    </w:p>
+    <w:p>
+      <w:pPr>
+        <w:rPr>
+          <w:lang w:val="en-US"/>
+        </w:rPr>
+      </w:pPr>
+      <w:r>
+        <w:rPr>
+          <w:lang w:val="en-US"/>
+        </w:rPr>
+        <w:t xml:space="preserve">    </w:t>
+      </w:r>
+      <w:proofErr w:type="spellStart"/>
+      <w:r>
+        <w:rPr>
+          <w:lang w:val="en-US"/>
+        </w:rPr>
+        <w:t>ErrorCode</w:t>
+      </w:r>
+      <w:proofErr w:type="spellEnd"/>
+      <w:r>
+        <w:rPr>
+          <w:lang w:val="en-US"/>
+        </w:rPr>
+        <w:t xml:space="preserve"> result = </w:t>
+      </w:r>
+      <w:proofErr w:type="spellStart"/>
+      <w:r>
+        <w:rPr>
+          <w:lang w:val="en-US"/>
+        </w:rPr>
+        <w:t>driver.Connect</w:t>
+      </w:r>
+      <w:proofErr w:type="spellEnd"/>
+      <w:r>
+        <w:rPr>
+          <w:lang w:val="en-US"/>
+        </w:rPr>
         <w:t>(</w:t>
       </w:r>
-      <w:proofErr w:type="gramEnd"/>
-      <w:r>
-        <w:rPr>
-          <w:lang w:val="en-US"/>
-        </w:rPr>
-        <w:t>) {</w:t>
-      </w:r>
+      <w:proofErr w:type="spellStart"/>
+      <w:r>
+        <w:rPr>
+          <w:lang w:val="en-US"/>
+        </w:rPr>
+        <w:t>InterfaceType</w:t>
+      </w:r>
+      <w:proofErr w:type="spellEnd"/>
+      <w:r>
+        <w:rPr>
+          <w:lang w:val="en-US"/>
+        </w:rPr>
+        <w:t xml:space="preserve">::Serial, </w:t>
+      </w:r>
+      <w:proofErr w:type="spellStart"/>
+      <w:r>
+        <w:rPr>
+          <w:lang w:val="en-US"/>
+        </w:rPr>
+        <w:t>serialConfig</w:t>
+      </w:r>
+      <w:proofErr w:type="spellEnd"/>
+      <w:r>
+        <w:rPr>
+          <w:lang w:val="en-US"/>
+        </w:rPr>
+        <w:t>);</w:t>
+      </w:r>
+    </w:p>
+    <w:p>
+      <w:pPr>
+        <w:rPr>
+          <w:lang w:val="en-US"/>
+        </w:rPr>
+      </w:pPr>
     </w:p>
     <w:p>
       <w:pPr>
@@ -13227,20 +13632,124 @@
         </w:rPr>
         <w:t xml:space="preserve">    </w:t>
       </w:r>
+      <w:r>
+        <w:rPr>
+          <w:bCs/>
+          <w:lang w:val="en-US"/>
+        </w:rPr>
+        <w:t>if</w:t>
+      </w:r>
+      <w:r>
+        <w:rPr>
+          <w:lang w:val="en-US"/>
+        </w:rPr>
+        <w:t xml:space="preserve"> (result != DRV_SUCCESS) {</w:t>
+      </w:r>
+    </w:p>
+    <w:p>
+      <w:pPr>
+        <w:rPr>
+          <w:lang w:val="en-US"/>
+        </w:rPr>
+      </w:pPr>
+      <w:r>
+        <w:rPr>
+          <w:lang w:val="en-US"/>
+        </w:rPr>
+        <w:t xml:space="preserve">        std::</w:t>
+      </w:r>
       <w:proofErr w:type="spellStart"/>
       <w:r>
         <w:rPr>
           <w:lang w:val="en-US"/>
         </w:rPr>
-        <w:t>EmbosserDriver</w:t>
+        <w:t>cerr</w:t>
       </w:r>
       <w:proofErr w:type="spellEnd"/>
       <w:r>
         <w:rPr>
           <w:lang w:val="en-US"/>
         </w:rPr>
-        <w:t xml:space="preserve"> driver;</w:t>
-      </w:r>
+        <w:t xml:space="preserve"> &lt;&lt; "</w:t>
+      </w:r>
+      <w:r>
+        <w:t>Ошибка</w:t>
+      </w:r>
+      <w:r>
+        <w:rPr>
+          <w:lang w:val="en-US"/>
+        </w:rPr>
+        <w:t xml:space="preserve"> </w:t>
+      </w:r>
+      <w:r>
+        <w:t>соединения</w:t>
+      </w:r>
+      <w:r>
+        <w:rPr>
+          <w:lang w:val="en-US"/>
+        </w:rPr>
+        <w:t>: " &lt;&lt; result &lt;&lt; std::</w:t>
+      </w:r>
+      <w:proofErr w:type="spellStart"/>
+      <w:r>
+        <w:rPr>
+          <w:lang w:val="en-US"/>
+        </w:rPr>
+        <w:t>endl</w:t>
+      </w:r>
+      <w:proofErr w:type="spellEnd"/>
+      <w:r>
+        <w:rPr>
+          <w:lang w:val="en-US"/>
+        </w:rPr>
+        <w:t>;</w:t>
+      </w:r>
+    </w:p>
+    <w:p>
+      <w:pPr>
+        <w:rPr>
+          <w:lang w:val="en-US"/>
+        </w:rPr>
+      </w:pPr>
+      <w:r>
+        <w:rPr>
+          <w:lang w:val="en-US"/>
+        </w:rPr>
+        <w:t xml:space="preserve">        </w:t>
+      </w:r>
+      <w:r>
+        <w:rPr>
+          <w:bCs/>
+          <w:lang w:val="en-US"/>
+        </w:rPr>
+        <w:t>return</w:t>
+      </w:r>
+      <w:r>
+        <w:rPr>
+          <w:lang w:val="en-US"/>
+        </w:rPr>
+        <w:t xml:space="preserve"> 1;</w:t>
+      </w:r>
+    </w:p>
+    <w:p>
+      <w:pPr>
+        <w:rPr>
+          <w:lang w:val="en-US"/>
+        </w:rPr>
+      </w:pPr>
+      <w:r>
+        <w:rPr>
+          <w:lang w:val="en-US"/>
+        </w:rPr>
+        <w:t xml:space="preserve">    }</w:t>
+      </w:r>
+    </w:p>
+    <w:p>
+      <w:pPr>
+        <w:rPr>
+          <w:lang w:val="en-US"/>
+        </w:rPr>
+      </w:pPr>
     </w:p>
     <w:p>
       <w:pPr>
@@ -13259,29 +13768,49 @@
         <w:rPr>
           <w:lang w:val="en-US"/>
         </w:rPr>
-        <w:t>SerialConfiguration</w:t>
+        <w:t>EmbosserStatus</w:t>
       </w:r>
       <w:proofErr w:type="spellEnd"/>
       <w:r>
         <w:rPr>
           <w:lang w:val="en-US"/>
         </w:rPr>
-        <w:t xml:space="preserve"> </w:t>
+        <w:t xml:space="preserve"> status;</w:t>
+      </w:r>
+    </w:p>
+    <w:p>
+      <w:pPr>
+        <w:rPr>
+          <w:lang w:val="en-US"/>
+        </w:rPr>
+      </w:pPr>
+      <w:r>
+        <w:rPr>
+          <w:lang w:val="en-US"/>
+        </w:rPr>
+        <w:t xml:space="preserve">    result = </w:t>
       </w:r>
       <w:proofErr w:type="spellStart"/>
       <w:r>
         <w:rPr>
           <w:lang w:val="en-US"/>
         </w:rPr>
-        <w:t>serialConfig</w:t>
+        <w:t>driver.GetStatus</w:t>
       </w:r>
       <w:proofErr w:type="spellEnd"/>
       <w:r>
         <w:rPr>
           <w:lang w:val="en-US"/>
         </w:rPr>
-        <w:t>;</w:t>
-      </w:r>
+        <w:t>(status);</w:t>
+      </w:r>
+    </w:p>
+    <w:p>
+      <w:pPr>
+        <w:rPr>
+          <w:lang w:val="en-US"/>
+        </w:rPr>
+      </w:pPr>
     </w:p>
     <w:p>
       <w:pPr>
@@ -13295,473 +13824,78 @@
         </w:rPr>
         <w:t xml:space="preserve">    </w:t>
       </w:r>
+      <w:r>
+        <w:rPr>
+          <w:bCs/>
+          <w:lang w:val="en-US"/>
+        </w:rPr>
+        <w:t>if</w:t>
+      </w:r>
+      <w:r>
+        <w:rPr>
+          <w:lang w:val="en-US"/>
+        </w:rPr>
+        <w:t xml:space="preserve"> (result != DRV_SUCCESS) {</w:t>
+      </w:r>
+    </w:p>
+    <w:p>
+      <w:r>
+        <w:rPr>
+          <w:lang w:val="en-US"/>
+        </w:rPr>
+        <w:t xml:space="preserve">        std</w:t>
+      </w:r>
+      <w:r>
+        <w:t>::</w:t>
+      </w:r>
       <w:proofErr w:type="spellStart"/>
       <w:r>
         <w:rPr>
           <w:lang w:val="en-US"/>
         </w:rPr>
-        <w:t>serialConfig.ComPort</w:t>
+        <w:t>cerr</w:t>
       </w:r>
       <w:proofErr w:type="spellEnd"/>
       <w:r>
-        <w:rPr>
-          <w:lang w:val="en-US"/>
-        </w:rPr>
-        <w:t xml:space="preserve"> = "COM1";</w:t>
-      </w:r>
-    </w:p>
-    <w:p>
-      <w:pPr>
-        <w:rPr>
-          <w:lang w:val="en-US"/>
-        </w:rPr>
-      </w:pPr>
-      <w:r>
-        <w:rPr>
-          <w:lang w:val="en-US"/>
-        </w:rPr>
-        <w:t xml:space="preserve">    </w:t>
+        <w:t xml:space="preserve"> &lt;&lt; "</w:t>
+      </w:r>
+      <w:r>
+        <w:t>Ошибка</w:t>
+      </w:r>
+      <w:r>
+        <w:t xml:space="preserve"> </w:t>
+      </w:r>
+      <w:r>
+        <w:t>получения</w:t>
+      </w:r>
+      <w:r>
+        <w:t xml:space="preserve"> </w:t>
+      </w:r>
+      <w:r>
+        <w:t>статуса</w:t>
+      </w:r>
+      <w:r>
+        <w:t xml:space="preserve">: " &lt;&lt; </w:t>
+      </w:r>
+      <w:r>
+        <w:rPr>
+          <w:lang w:val="en-US"/>
+        </w:rPr>
+        <w:t>result</w:t>
+      </w:r>
+      <w:r>
+        <w:t xml:space="preserve"> &lt;&lt; </w:t>
+      </w:r>
+      <w:r>
+        <w:rPr>
+          <w:lang w:val="en-US"/>
+        </w:rPr>
+        <w:t>std</w:t>
+      </w:r>
+      <w:r>
+        <w:t>::</w:t>
       </w:r>
       <w:proofErr w:type="spellStart"/>
-      <w:r>
-        <w:rPr>
-          <w:lang w:val="en-US"/>
-        </w:rPr>
-        <w:t>serialConfig.BaudRate</w:t>
-      </w:r>
-      <w:proofErr w:type="spellEnd"/>
-      <w:r>
-        <w:rPr>
-          <w:lang w:val="en-US"/>
-        </w:rPr>
-        <w:t xml:space="preserve"> = 9600;</w:t>
-      </w:r>
-    </w:p>
-    <w:p>
-      <w:pPr>
-        <w:rPr>
-          <w:lang w:val="en-US"/>
-        </w:rPr>
-      </w:pPr>
-    </w:p>
-    <w:p>
-      <w:pPr>
-        <w:rPr>
-          <w:lang w:val="en-US"/>
-        </w:rPr>
-      </w:pPr>
-      <w:r>
-        <w:rPr>
-          <w:lang w:val="en-US"/>
-        </w:rPr>
-        <w:t xml:space="preserve">    </w:t>
-      </w:r>
-      <w:proofErr w:type="spellStart"/>
-      <w:r>
-        <w:rPr>
-          <w:lang w:val="en-US"/>
-        </w:rPr>
-        <w:t>ErrorCode</w:t>
-      </w:r>
-      <w:proofErr w:type="spellEnd"/>
-      <w:r>
-        <w:rPr>
-          <w:lang w:val="en-US"/>
-        </w:rPr>
-        <w:t xml:space="preserve"> result = </w:t>
-      </w:r>
-      <w:proofErr w:type="spellStart"/>
-      <w:proofErr w:type="gramStart"/>
-      <w:r>
-        <w:rPr>
-          <w:lang w:val="en-US"/>
-        </w:rPr>
-        <w:t>driver.Connect</w:t>
-      </w:r>
-      <w:proofErr w:type="spellEnd"/>
-      <w:proofErr w:type="gramEnd"/>
-      <w:r>
-        <w:rPr>
-          <w:lang w:val="en-US"/>
-        </w:rPr>
-        <w:t>(</w:t>
-      </w:r>
-      <w:proofErr w:type="spellStart"/>
-      <w:proofErr w:type="gramStart"/>
-      <w:r>
-        <w:rPr>
-          <w:lang w:val="en-US"/>
-        </w:rPr>
-        <w:t>InterfaceType</w:t>
-      </w:r>
-      <w:proofErr w:type="spellEnd"/>
-      <w:r>
-        <w:rPr>
-          <w:lang w:val="en-US"/>
-        </w:rPr>
-        <w:t>::</w:t>
-      </w:r>
-      <w:proofErr w:type="gramEnd"/>
-      <w:r>
-        <w:rPr>
-          <w:lang w:val="en-US"/>
-        </w:rPr>
-        <w:t xml:space="preserve">Serial, </w:t>
-      </w:r>
-      <w:proofErr w:type="spellStart"/>
-      <w:r>
-        <w:rPr>
-          <w:lang w:val="en-US"/>
-        </w:rPr>
-        <w:t>serialConfig</w:t>
-      </w:r>
-      <w:proofErr w:type="spellEnd"/>
-      <w:r>
-        <w:rPr>
-          <w:lang w:val="en-US"/>
-        </w:rPr>
-        <w:t>);</w:t>
-      </w:r>
-    </w:p>
-    <w:p>
-      <w:pPr>
-        <w:rPr>
-          <w:lang w:val="en-US"/>
-        </w:rPr>
-      </w:pPr>
-    </w:p>
-    <w:p>
-      <w:pPr>
-        <w:rPr>
-          <w:lang w:val="en-US"/>
-        </w:rPr>
-      </w:pPr>
-      <w:r>
-        <w:rPr>
-          <w:lang w:val="en-US"/>
-        </w:rPr>
-        <w:t xml:space="preserve">    </w:t>
-      </w:r>
-      <w:r>
-        <w:rPr>
-          <w:bCs/>
-          <w:lang w:val="en-US"/>
-        </w:rPr>
-        <w:t>if</w:t>
-      </w:r>
-      <w:r>
-        <w:rPr>
-          <w:lang w:val="en-US"/>
-        </w:rPr>
-        <w:t xml:space="preserve"> (</w:t>
-      </w:r>
-      <w:proofErr w:type="gramStart"/>
-      <w:r>
-        <w:rPr>
-          <w:lang w:val="en-US"/>
-        </w:rPr>
-        <w:t>result !</w:t>
-      </w:r>
-      <w:proofErr w:type="gramEnd"/>
-      <w:r>
-        <w:rPr>
-          <w:lang w:val="en-US"/>
-        </w:rPr>
-        <w:t>= DRV_SUCCESS) {</w:t>
-      </w:r>
-    </w:p>
-    <w:p>
-      <w:pPr>
-        <w:rPr>
-          <w:lang w:val="en-US"/>
-        </w:rPr>
-      </w:pPr>
-      <w:r>
-        <w:rPr>
-          <w:lang w:val="en-US"/>
-        </w:rPr>
-        <w:t xml:space="preserve">        </w:t>
-      </w:r>
-      <w:proofErr w:type="gramStart"/>
-      <w:r>
-        <w:rPr>
-          <w:lang w:val="en-US"/>
-        </w:rPr>
-        <w:t>std::</w:t>
-      </w:r>
-      <w:proofErr w:type="spellStart"/>
-      <w:proofErr w:type="gramEnd"/>
-      <w:r>
-        <w:rPr>
-          <w:lang w:val="en-US"/>
-        </w:rPr>
-        <w:t>cerr</w:t>
-      </w:r>
-      <w:proofErr w:type="spellEnd"/>
-      <w:r>
-        <w:rPr>
-          <w:lang w:val="en-US"/>
-        </w:rPr>
-        <w:t xml:space="preserve"> &lt;&lt; "</w:t>
-      </w:r>
-      <w:r>
-        <w:t>Ошибка</w:t>
-      </w:r>
-      <w:r>
-        <w:rPr>
-          <w:lang w:val="en-US"/>
-        </w:rPr>
-        <w:t xml:space="preserve"> </w:t>
-      </w:r>
-      <w:r>
-        <w:t>соединения</w:t>
-      </w:r>
-      <w:r>
-        <w:rPr>
-          <w:lang w:val="en-US"/>
-        </w:rPr>
-        <w:t xml:space="preserve">: " &lt;&lt; result &lt;&lt; </w:t>
-      </w:r>
-      <w:proofErr w:type="gramStart"/>
-      <w:r>
-        <w:rPr>
-          <w:lang w:val="en-US"/>
-        </w:rPr>
-        <w:t>std::</w:t>
-      </w:r>
-      <w:proofErr w:type="spellStart"/>
-      <w:proofErr w:type="gramEnd"/>
-      <w:r>
-        <w:rPr>
-          <w:lang w:val="en-US"/>
-        </w:rPr>
-        <w:t>endl</w:t>
-      </w:r>
-      <w:proofErr w:type="spellEnd"/>
-      <w:r>
-        <w:rPr>
-          <w:lang w:val="en-US"/>
-        </w:rPr>
-        <w:t>;</w:t>
-      </w:r>
-    </w:p>
-    <w:p>
-      <w:pPr>
-        <w:rPr>
-          <w:lang w:val="en-US"/>
-        </w:rPr>
-      </w:pPr>
-      <w:r>
-        <w:rPr>
-          <w:lang w:val="en-US"/>
-        </w:rPr>
-        <w:t xml:space="preserve">        </w:t>
-      </w:r>
-      <w:r>
-        <w:rPr>
-          <w:bCs/>
-          <w:lang w:val="en-US"/>
-        </w:rPr>
-        <w:t>return</w:t>
-      </w:r>
-      <w:r>
-        <w:rPr>
-          <w:lang w:val="en-US"/>
-        </w:rPr>
-        <w:t xml:space="preserve"> 1;</w:t>
-      </w:r>
-    </w:p>
-    <w:p>
-      <w:pPr>
-        <w:rPr>
-          <w:lang w:val="en-US"/>
-        </w:rPr>
-      </w:pPr>
-      <w:r>
-        <w:rPr>
-          <w:lang w:val="en-US"/>
-        </w:rPr>
-        <w:t xml:space="preserve">    }</w:t>
-      </w:r>
-    </w:p>
-    <w:p>
-      <w:pPr>
-        <w:rPr>
-          <w:lang w:val="en-US"/>
-        </w:rPr>
-      </w:pPr>
-    </w:p>
-    <w:p>
-      <w:pPr>
-        <w:rPr>
-          <w:lang w:val="en-US"/>
-        </w:rPr>
-      </w:pPr>
-      <w:r>
-        <w:rPr>
-          <w:lang w:val="en-US"/>
-        </w:rPr>
-        <w:t xml:space="preserve">    </w:t>
-      </w:r>
-      <w:proofErr w:type="spellStart"/>
-      <w:r>
-        <w:rPr>
-          <w:lang w:val="en-US"/>
-        </w:rPr>
-        <w:t>EmbosserStatus</w:t>
-      </w:r>
-      <w:proofErr w:type="spellEnd"/>
-      <w:r>
-        <w:rPr>
-          <w:lang w:val="en-US"/>
-        </w:rPr>
-        <w:t xml:space="preserve"> status;</w:t>
-      </w:r>
-    </w:p>
-    <w:p>
-      <w:pPr>
-        <w:rPr>
-          <w:lang w:val="en-US"/>
-        </w:rPr>
-      </w:pPr>
-      <w:r>
-        <w:rPr>
-          <w:lang w:val="en-US"/>
-        </w:rPr>
-        <w:t xml:space="preserve">    result = </w:t>
-      </w:r>
-      <w:proofErr w:type="spellStart"/>
-      <w:proofErr w:type="gramStart"/>
-      <w:r>
-        <w:rPr>
-          <w:lang w:val="en-US"/>
-        </w:rPr>
-        <w:t>driver.GetStatus</w:t>
-      </w:r>
-      <w:proofErr w:type="spellEnd"/>
-      <w:proofErr w:type="gramEnd"/>
-      <w:r>
-        <w:rPr>
-          <w:lang w:val="en-US"/>
-        </w:rPr>
-        <w:t>(status);</w:t>
-      </w:r>
-    </w:p>
-    <w:p>
-      <w:pPr>
-        <w:rPr>
-          <w:lang w:val="en-US"/>
-        </w:rPr>
-      </w:pPr>
-    </w:p>
-    <w:p>
-      <w:pPr>
-        <w:rPr>
-          <w:lang w:val="en-US"/>
-        </w:rPr>
-      </w:pPr>
-      <w:r>
-        <w:rPr>
-          <w:lang w:val="en-US"/>
-        </w:rPr>
-        <w:t xml:space="preserve">    </w:t>
-      </w:r>
-      <w:r>
-        <w:rPr>
-          <w:bCs/>
-          <w:lang w:val="en-US"/>
-        </w:rPr>
-        <w:t>if</w:t>
-      </w:r>
-      <w:r>
-        <w:rPr>
-          <w:lang w:val="en-US"/>
-        </w:rPr>
-        <w:t xml:space="preserve"> (</w:t>
-      </w:r>
-      <w:proofErr w:type="gramStart"/>
-      <w:r>
-        <w:rPr>
-          <w:lang w:val="en-US"/>
-        </w:rPr>
-        <w:t>result !</w:t>
-      </w:r>
-      <w:proofErr w:type="gramEnd"/>
-      <w:r>
-        <w:rPr>
-          <w:lang w:val="en-US"/>
-        </w:rPr>
-        <w:t>= DRV_SUCCESS) {</w:t>
-      </w:r>
-    </w:p>
-    <w:p>
-      <w:r>
-        <w:rPr>
-          <w:lang w:val="en-US"/>
-        </w:rPr>
-        <w:t xml:space="preserve">        </w:t>
-      </w:r>
-      <w:proofErr w:type="gramStart"/>
-      <w:r>
-        <w:rPr>
-          <w:lang w:val="en-US"/>
-        </w:rPr>
-        <w:t>std</w:t>
-      </w:r>
-      <w:r>
-        <w:t>::</w:t>
-      </w:r>
-      <w:proofErr w:type="spellStart"/>
-      <w:proofErr w:type="gramEnd"/>
-      <w:r>
-        <w:rPr>
-          <w:lang w:val="en-US"/>
-        </w:rPr>
-        <w:t>cerr</w:t>
-      </w:r>
-      <w:proofErr w:type="spellEnd"/>
-      <w:r>
-        <w:t xml:space="preserve"> &lt;&lt; "</w:t>
-      </w:r>
-      <w:r>
-        <w:t>Ошибка</w:t>
-      </w:r>
-      <w:r>
-        <w:t xml:space="preserve"> </w:t>
-      </w:r>
-      <w:r>
-        <w:t>получения</w:t>
-      </w:r>
-      <w:r>
-        <w:t xml:space="preserve"> </w:t>
-      </w:r>
-      <w:r>
-        <w:t>статуса</w:t>
-      </w:r>
-      <w:r>
-        <w:t xml:space="preserve">: " &lt;&lt; </w:t>
-      </w:r>
-      <w:r>
-        <w:rPr>
-          <w:lang w:val="en-US"/>
-        </w:rPr>
-        <w:t>result</w:t>
-      </w:r>
-      <w:r>
-        <w:t xml:space="preserve"> &lt;&lt; </w:t>
-      </w:r>
-      <w:proofErr w:type="gramStart"/>
-      <w:r>
-        <w:rPr>
-          <w:lang w:val="en-US"/>
-        </w:rPr>
-        <w:t>std</w:t>
-      </w:r>
-      <w:r>
-        <w:t>::</w:t>
-      </w:r>
-      <w:proofErr w:type="spellStart"/>
-      <w:proofErr w:type="gramEnd"/>
       <w:r>
         <w:rPr>
           <w:lang w:val="en-US"/>
@@ -13784,7 +13918,6 @@
         <w:t xml:space="preserve">        </w:t>
       </w:r>
       <w:proofErr w:type="spellStart"/>
-      <w:proofErr w:type="gramStart"/>
       <w:r>
         <w:rPr>
           <w:lang w:val="en-US"/>
@@ -13792,7 +13925,6 @@
         <w:t>driver.Disconnect</w:t>
       </w:r>
       <w:proofErr w:type="spellEnd"/>
-      <w:proofErr w:type="gramEnd"/>
       <w:r>
         <w:rPr>
           <w:lang w:val="en-US"/>
@@ -13856,57 +13988,310 @@
         <w:rPr>
           <w:lang w:val="en-US"/>
         </w:rPr>
+        <w:t xml:space="preserve">    std::</w:t>
+      </w:r>
+      <w:proofErr w:type="spellStart"/>
+      <w:r>
+        <w:rPr>
+          <w:lang w:val="en-US"/>
+        </w:rPr>
+        <w:t>cout</w:t>
+      </w:r>
+      <w:proofErr w:type="spellEnd"/>
+      <w:r>
+        <w:rPr>
+          <w:lang w:val="en-US"/>
+        </w:rPr>
+        <w:t xml:space="preserve"> &lt;&lt; "</w:t>
+      </w:r>
+      <w:r>
+        <w:t>Статус</w:t>
+      </w:r>
+      <w:r>
+        <w:rPr>
+          <w:lang w:val="en-US"/>
+        </w:rPr>
+        <w:t xml:space="preserve"> </w:t>
+      </w:r>
+      <w:r>
+        <w:t>эмбоссера</w:t>
+      </w:r>
+      <w:r>
+        <w:rPr>
+          <w:lang w:val="en-US"/>
+        </w:rPr>
+        <w:t>:" &lt;&lt; std::</w:t>
+      </w:r>
+      <w:proofErr w:type="spellStart"/>
+      <w:r>
+        <w:rPr>
+          <w:lang w:val="en-US"/>
+        </w:rPr>
+        <w:t>endl</w:t>
+      </w:r>
+      <w:proofErr w:type="spellEnd"/>
+      <w:r>
+        <w:rPr>
+          <w:lang w:val="en-US"/>
+        </w:rPr>
+        <w:t>;</w:t>
+      </w:r>
+    </w:p>
+    <w:p>
+      <w:r>
+        <w:rPr>
+          <w:lang w:val="en-US"/>
+        </w:rPr>
+        <w:t xml:space="preserve">    std::</w:t>
+      </w:r>
+      <w:proofErr w:type="spellStart"/>
+      <w:r>
+        <w:rPr>
+          <w:lang w:val="en-US"/>
+        </w:rPr>
+        <w:t>cout</w:t>
+      </w:r>
+      <w:proofErr w:type="spellEnd"/>
+      <w:r>
+        <w:rPr>
+          <w:lang w:val="en-US"/>
+        </w:rPr>
+        <w:t xml:space="preserve"> &lt;&lt; "  </w:t>
+      </w:r>
+      <w:r>
+        <w:t>Готов</w:t>
+      </w:r>
+      <w:r>
+        <w:rPr>
+          <w:lang w:val="en-US"/>
+        </w:rPr>
+        <w:t>: " &lt;&lt; (</w:t>
+      </w:r>
+      <w:proofErr w:type="spellStart"/>
+      <w:r>
+        <w:rPr>
+          <w:lang w:val="en-US"/>
+        </w:rPr>
+        <w:t>status.IsReady</w:t>
+      </w:r>
+      <w:proofErr w:type="spellEnd"/>
+      <w:r>
+        <w:rPr>
+          <w:lang w:val="en-US"/>
+        </w:rPr>
+        <w:t xml:space="preserve"> ? </w:t>
+      </w:r>
+      <w:r>
+        <w:t>"Да" : "Нет") &lt;&lt; std::endl;</w:t>
+      </w:r>
+    </w:p>
+    <w:p>
+      <w:pPr>
+        <w:rPr>
+          <w:lang w:val="en-US"/>
+        </w:rPr>
+      </w:pPr>
+      <w:r>
+        <w:t xml:space="preserve">    std::cout &lt;&lt; "  Карта в устройстве: " &lt;&lt; (status.HasCard ? </w:t>
+      </w:r>
+      <w:r>
+        <w:rPr>
+          <w:lang w:val="en-US"/>
+        </w:rPr>
+        <w:t>"</w:t>
+      </w:r>
+      <w:r>
+        <w:t>Да</w:t>
+      </w:r>
+      <w:r>
+        <w:rPr>
+          <w:lang w:val="en-US"/>
+        </w:rPr>
+        <w:t>" : "</w:t>
+      </w:r>
+      <w:r>
+        <w:t>Нет</w:t>
+      </w:r>
+      <w:r>
+        <w:rPr>
+          <w:lang w:val="en-US"/>
+        </w:rPr>
+        <w:t>") &lt;&lt; std::</w:t>
+      </w:r>
+      <w:proofErr w:type="spellStart"/>
+      <w:r>
+        <w:rPr>
+          <w:lang w:val="en-US"/>
+        </w:rPr>
+        <w:t>endl</w:t>
+      </w:r>
+      <w:proofErr w:type="spellEnd"/>
+      <w:r>
+        <w:rPr>
+          <w:lang w:val="en-US"/>
+        </w:rPr>
+        <w:t>;</w:t>
+      </w:r>
+    </w:p>
+    <w:p>
+      <w:pPr>
+        <w:rPr>
+          <w:lang w:val="en-US"/>
+        </w:rPr>
+      </w:pPr>
+    </w:p>
+    <w:p>
+      <w:pPr>
+        <w:rPr>
+          <w:lang w:val="en-US"/>
+        </w:rPr>
+      </w:pPr>
+      <w:r>
+        <w:rPr>
+          <w:lang w:val="en-US"/>
+        </w:rPr>
         <w:t xml:space="preserve">    </w:t>
       </w:r>
-      <w:proofErr w:type="gramStart"/>
-      <w:r>
-        <w:rPr>
-          <w:lang w:val="en-US"/>
-        </w:rPr>
-        <w:t>std::</w:t>
-      </w:r>
       <w:proofErr w:type="spellStart"/>
-      <w:proofErr w:type="gramEnd"/>
-      <w:r>
-        <w:rPr>
-          <w:lang w:val="en-US"/>
-        </w:rPr>
-        <w:t>cout</w:t>
+      <w:r>
+        <w:rPr>
+          <w:lang w:val="en-US"/>
+        </w:rPr>
+        <w:t>driver.Disconnect</w:t>
       </w:r>
       <w:proofErr w:type="spellEnd"/>
       <w:r>
         <w:rPr>
           <w:lang w:val="en-US"/>
         </w:rPr>
+        <w:t>();</w:t>
+      </w:r>
+    </w:p>
+    <w:p>
+      <w:r>
+        <w:rPr>
+          <w:lang w:val="en-US"/>
+        </w:rPr>
+        <w:t xml:space="preserve">    </w:t>
+      </w:r>
+      <w:r>
+        <w:rPr>
+          <w:bCs/>
+        </w:rPr>
+        <w:t>return</w:t>
+      </w:r>
+      <w:r>
+        <w:t xml:space="preserve"> 0;</w:t>
+      </w:r>
+    </w:p>
+    <w:p>
+      <w:r>
+        <w:t>}</w:t>
+      </w:r>
+    </w:p>
+    <w:p>
+      <w:r>
+        <w:t>c++</w:t>
+      </w:r>
+    </w:p>
+    <w:p>
+      <w:pPr>
+        <w:pStyle w:val="Heading2"/>
+      </w:pPr>
+      <w:bookmarkStart w:id="38" w:name="_Toc198558799"/>
+      <w:r>
+        <w:t>3.4.2. Загрузка карты и эмбоссирование символа:</w:t>
+      </w:r>
+      <w:bookmarkEnd w:id="38"/>
+    </w:p>
+    <w:p>
+      <w:r>
+        <w:t>// ... (Предыдущий код для соединения) ...</w:t>
+      </w:r>
+    </w:p>
+    <w:p/>
+    <w:p>
+      <w:r>
+        <w:t xml:space="preserve">    result = driver.LoadCard();</w:t>
+      </w:r>
+    </w:p>
+    <w:p>
+      <w:pPr>
+        <w:rPr>
+          <w:lang w:val="en-US"/>
+        </w:rPr>
+      </w:pPr>
+      <w:r>
+        <w:t xml:space="preserve">    </w:t>
+      </w:r>
+      <w:r>
+        <w:rPr>
+          <w:bCs/>
+          <w:lang w:val="en-US"/>
+        </w:rPr>
+        <w:t>if</w:t>
+      </w:r>
+      <w:r>
+        <w:rPr>
+          <w:lang w:val="en-US"/>
+        </w:rPr>
+        <w:t xml:space="preserve"> (result != DRV_SUCCESS) {</w:t>
+      </w:r>
+    </w:p>
+    <w:p>
+      <w:pPr>
+        <w:rPr>
+          <w:lang w:val="en-US"/>
+        </w:rPr>
+      </w:pPr>
+      <w:r>
+        <w:rPr>
+          <w:lang w:val="en-US"/>
+        </w:rPr>
+        <w:t xml:space="preserve">        std::</w:t>
+      </w:r>
+      <w:proofErr w:type="spellStart"/>
+      <w:r>
+        <w:rPr>
+          <w:lang w:val="en-US"/>
+        </w:rPr>
+        <w:t>cerr</w:t>
+      </w:r>
+      <w:proofErr w:type="spellEnd"/>
+      <w:r>
+        <w:rPr>
+          <w:lang w:val="en-US"/>
+        </w:rPr>
         <w:t xml:space="preserve"> &lt;&lt; "</w:t>
       </w:r>
       <w:r>
-        <w:t>Статус</w:t>
-      </w:r>
-      <w:r>
-        <w:rPr>
-          <w:lang w:val="en-US"/>
-        </w:rPr>
-        <w:t xml:space="preserve"> </w:t>
-      </w:r>
-      <w:r>
-        <w:t>эмбоссера</w:t>
-      </w:r>
-      <w:r>
-        <w:rPr>
-          <w:lang w:val="en-US"/>
-        </w:rPr>
-        <w:t xml:space="preserve">:" &lt;&lt; </w:t>
-      </w:r>
-      <w:proofErr w:type="gramStart"/>
-      <w:r>
-        <w:rPr>
-          <w:lang w:val="en-US"/>
-        </w:rPr>
-        <w:t>std::</w:t>
+        <w:t>Ошибка</w:t>
+      </w:r>
+      <w:r>
+        <w:rPr>
+          <w:lang w:val="en-US"/>
+        </w:rPr>
+        <w:t xml:space="preserve"> </w:t>
+      </w:r>
+      <w:r>
+        <w:t>загрузки</w:t>
+      </w:r>
+      <w:r>
+        <w:rPr>
+          <w:lang w:val="en-US"/>
+        </w:rPr>
+        <w:t xml:space="preserve"> </w:t>
+      </w:r>
+      <w:r>
+        <w:t>карты</w:t>
+      </w:r>
+      <w:r>
+        <w:rPr>
+          <w:lang w:val="en-US"/>
+        </w:rPr>
+        <w:t>: " &lt;&lt; result &lt;&lt; std::</w:t>
       </w:r>
       <w:proofErr w:type="spellStart"/>
-      <w:proofErr w:type="gramEnd"/>
       <w:r>
         <w:rPr>
           <w:lang w:val="en-US"/>
@@ -13922,141 +14307,192 @@
       </w:r>
     </w:p>
     <w:p>
+      <w:pPr>
+        <w:rPr>
+          <w:lang w:val="en-US"/>
+        </w:rPr>
+      </w:pPr>
+      <w:r>
+        <w:rPr>
+          <w:lang w:val="en-US"/>
+        </w:rPr>
+        <w:t xml:space="preserve">        </w:t>
+      </w:r>
+      <w:proofErr w:type="spellStart"/>
+      <w:r>
+        <w:rPr>
+          <w:lang w:val="en-US"/>
+        </w:rPr>
+        <w:t>driver.Disconnect</w:t>
+      </w:r>
+      <w:proofErr w:type="spellEnd"/>
+      <w:r>
+        <w:rPr>
+          <w:lang w:val="en-US"/>
+        </w:rPr>
+        <w:t>();</w:t>
+      </w:r>
+    </w:p>
+    <w:p>
+      <w:pPr>
+        <w:rPr>
+          <w:lang w:val="en-US"/>
+        </w:rPr>
+      </w:pPr>
+      <w:r>
+        <w:rPr>
+          <w:lang w:val="en-US"/>
+        </w:rPr>
+        <w:t xml:space="preserve">        </w:t>
+      </w:r>
+      <w:r>
+        <w:rPr>
+          <w:bCs/>
+          <w:lang w:val="en-US"/>
+        </w:rPr>
+        <w:t>return</w:t>
+      </w:r>
+      <w:r>
+        <w:rPr>
+          <w:lang w:val="en-US"/>
+        </w:rPr>
+        <w:t xml:space="preserve"> 1;</w:t>
+      </w:r>
+    </w:p>
+    <w:p>
+      <w:pPr>
+        <w:rPr>
+          <w:lang w:val="en-US"/>
+        </w:rPr>
+      </w:pPr>
+      <w:r>
+        <w:rPr>
+          <w:lang w:val="en-US"/>
+        </w:rPr>
+        <w:t xml:space="preserve">    }</w:t>
+      </w:r>
+    </w:p>
+    <w:p>
+      <w:pPr>
+        <w:rPr>
+          <w:lang w:val="en-US"/>
+        </w:rPr>
+      </w:pPr>
+    </w:p>
+    <w:p>
+      <w:pPr>
+        <w:rPr>
+          <w:lang w:val="en-US"/>
+        </w:rPr>
+      </w:pPr>
+      <w:r>
+        <w:rPr>
+          <w:lang w:val="en-US"/>
+        </w:rPr>
+        <w:t xml:space="preserve">    Position </w:t>
+      </w:r>
+      <w:proofErr w:type="spellStart"/>
+      <w:r>
+        <w:rPr>
+          <w:lang w:val="en-US"/>
+        </w:rPr>
+        <w:t>position</w:t>
+      </w:r>
+      <w:proofErr w:type="spellEnd"/>
+      <w:r>
+        <w:rPr>
+          <w:lang w:val="en-US"/>
+        </w:rPr>
+        <w:t>;</w:t>
+      </w:r>
+    </w:p>
+    <w:p>
+      <w:pPr>
+        <w:rPr>
+          <w:lang w:val="en-US"/>
+        </w:rPr>
+      </w:pPr>
       <w:r>
         <w:rPr>
           <w:lang w:val="en-US"/>
         </w:rPr>
         <w:t xml:space="preserve">    </w:t>
       </w:r>
-      <w:proofErr w:type="gramStart"/>
-      <w:r>
-        <w:rPr>
-          <w:lang w:val="en-US"/>
-        </w:rPr>
-        <w:t>std::</w:t>
-      </w:r>
       <w:proofErr w:type="spellStart"/>
-      <w:proofErr w:type="gramEnd"/>
-      <w:r>
-        <w:rPr>
-          <w:lang w:val="en-US"/>
-        </w:rPr>
-        <w:t>cout</w:t>
+      <w:r>
+        <w:rPr>
+          <w:lang w:val="en-US"/>
+        </w:rPr>
+        <w:t>position.X</w:t>
       </w:r>
       <w:proofErr w:type="spellEnd"/>
       <w:r>
         <w:rPr>
           <w:lang w:val="en-US"/>
         </w:rPr>
-        <w:t xml:space="preserve"> &lt;&lt; </w:t>
-      </w:r>
-      <w:proofErr w:type="gramStart"/>
-      <w:r>
-        <w:rPr>
-          <w:lang w:val="en-US"/>
-        </w:rPr>
-        <w:t xml:space="preserve">"  </w:t>
-      </w:r>
-      <w:r>
-        <w:t>Готов</w:t>
-      </w:r>
-      <w:proofErr w:type="gramEnd"/>
-      <w:r>
-        <w:rPr>
-          <w:lang w:val="en-US"/>
-        </w:rPr>
-        <w:t>: " &lt;&lt; (</w:t>
+        <w:t xml:space="preserve"> = 10;</w:t>
+      </w:r>
+    </w:p>
+    <w:p>
+      <w:pPr>
+        <w:rPr>
+          <w:lang w:val="en-US"/>
+        </w:rPr>
+      </w:pPr>
+      <w:r>
+        <w:rPr>
+          <w:lang w:val="en-US"/>
+        </w:rPr>
+        <w:t xml:space="preserve">    </w:t>
       </w:r>
       <w:proofErr w:type="spellStart"/>
-      <w:proofErr w:type="gramStart"/>
-      <w:r>
-        <w:rPr>
-          <w:lang w:val="en-US"/>
-        </w:rPr>
-        <w:t>status.IsReady</w:t>
+      <w:r>
+        <w:rPr>
+          <w:lang w:val="en-US"/>
+        </w:rPr>
+        <w:t>position.Y</w:t>
       </w:r>
       <w:proofErr w:type="spellEnd"/>
-      <w:proofErr w:type="gramEnd"/>
-      <w:r>
-        <w:rPr>
-          <w:lang w:val="en-US"/>
-        </w:rPr>
-        <w:t xml:space="preserve"> ? </w:t>
-      </w:r>
-      <w:r>
-        <w:t>"Да" : "Нет") &lt;&lt; std::endl;</w:t>
-      </w:r>
-    </w:p>
-    <w:p>
-      <w:pPr>
-        <w:rPr>
-          <w:lang w:val="en-US"/>
-        </w:rPr>
-      </w:pPr>
-      <w:r>
-        <w:t xml:space="preserve">    std::cout &lt;&lt; "  Карта в устройстве: " &lt;&lt; (status.HasCard ? </w:t>
-      </w:r>
-      <w:r>
-        <w:rPr>
-          <w:lang w:val="en-US"/>
-        </w:rPr>
-        <w:t>"</w:t>
-      </w:r>
-      <w:r>
-        <w:t>Да</w:t>
-      </w:r>
-      <w:proofErr w:type="gramStart"/>
-      <w:r>
-        <w:rPr>
-          <w:lang w:val="en-US"/>
-        </w:rPr>
-        <w:t>" :</w:t>
-      </w:r>
-      <w:proofErr w:type="gramEnd"/>
-      <w:r>
-        <w:rPr>
-          <w:lang w:val="en-US"/>
-        </w:rPr>
-        <w:t xml:space="preserve"> "</w:t>
-      </w:r>
-      <w:r>
-        <w:t>Нет</w:t>
-      </w:r>
-      <w:r>
-        <w:rPr>
-          <w:lang w:val="en-US"/>
-        </w:rPr>
-        <w:t xml:space="preserve">") &lt;&lt; </w:t>
-      </w:r>
-      <w:proofErr w:type="gramStart"/>
-      <w:r>
-        <w:rPr>
-          <w:lang w:val="en-US"/>
-        </w:rPr>
-        <w:t>std::</w:t>
+      <w:r>
+        <w:rPr>
+          <w:lang w:val="en-US"/>
+        </w:rPr>
+        <w:t xml:space="preserve"> = 20;</w:t>
+      </w:r>
+    </w:p>
+    <w:p>
+      <w:pPr>
+        <w:rPr>
+          <w:lang w:val="en-US"/>
+        </w:rPr>
+      </w:pPr>
+    </w:p>
+    <w:p>
+      <w:pPr>
+        <w:rPr>
+          <w:lang w:val="en-US"/>
+        </w:rPr>
+      </w:pPr>
+      <w:r>
+        <w:rPr>
+          <w:lang w:val="en-US"/>
+        </w:rPr>
+        <w:t xml:space="preserve">    result = </w:t>
       </w:r>
       <w:proofErr w:type="spellStart"/>
-      <w:proofErr w:type="gramEnd"/>
-      <w:r>
-        <w:rPr>
-          <w:lang w:val="en-US"/>
-        </w:rPr>
-        <w:t>endl</w:t>
+      <w:r>
+        <w:rPr>
+          <w:lang w:val="en-US"/>
+        </w:rPr>
+        <w:t>driver.EmbossCharacter</w:t>
       </w:r>
       <w:proofErr w:type="spellEnd"/>
       <w:r>
         <w:rPr>
           <w:lang w:val="en-US"/>
         </w:rPr>
-        <w:t>;</w:t>
-      </w:r>
-    </w:p>
-    <w:p>
-      <w:pPr>
-        <w:rPr>
-          <w:lang w:val="en-US"/>
-        </w:rPr>
-      </w:pPr>
+        <w:t>('A', position);</w:t>
+      </w:r>
     </w:p>
     <w:p>
       <w:pPr>
@@ -14070,487 +14506,65 @@
         </w:rPr>
         <w:t xml:space="preserve">    </w:t>
       </w:r>
+      <w:r>
+        <w:rPr>
+          <w:bCs/>
+          <w:lang w:val="en-US"/>
+        </w:rPr>
+        <w:t>if</w:t>
+      </w:r>
+      <w:r>
+        <w:rPr>
+          <w:lang w:val="en-US"/>
+        </w:rPr>
+        <w:t xml:space="preserve"> (result != DRV_SUCCESS) {</w:t>
+      </w:r>
+    </w:p>
+    <w:p>
+      <w:pPr>
+        <w:rPr>
+          <w:lang w:val="en-US"/>
+        </w:rPr>
+      </w:pPr>
+      <w:r>
+        <w:rPr>
+          <w:lang w:val="en-US"/>
+        </w:rPr>
+        <w:t xml:space="preserve">        std::</w:t>
+      </w:r>
       <w:proofErr w:type="spellStart"/>
-      <w:proofErr w:type="gramStart"/>
-      <w:r>
-        <w:rPr>
-          <w:lang w:val="en-US"/>
-        </w:rPr>
-        <w:t>driver.Disconnect</w:t>
+      <w:r>
+        <w:rPr>
+          <w:lang w:val="en-US"/>
+        </w:rPr>
+        <w:t>cerr</w:t>
       </w:r>
       <w:proofErr w:type="spellEnd"/>
-      <w:proofErr w:type="gramEnd"/>
-      <w:r>
-        <w:rPr>
-          <w:lang w:val="en-US"/>
-        </w:rPr>
-        <w:t>();</w:t>
-      </w:r>
-    </w:p>
-    <w:p>
-      <w:r>
-        <w:rPr>
-          <w:lang w:val="en-US"/>
-        </w:rPr>
-        <w:t xml:space="preserve">    </w:t>
-      </w:r>
-      <w:r>
-        <w:rPr>
-          <w:bCs/>
-        </w:rPr>
-        <w:t>return</w:t>
-      </w:r>
-      <w:r>
-        <w:t xml:space="preserve"> 0;</w:t>
-      </w:r>
-    </w:p>
-    <w:p>
-      <w:r>
-        <w:t>}</w:t>
-      </w:r>
-    </w:p>
-    <w:p>
-      <w:r>
-        <w:t>c++</w:t>
-      </w:r>
-    </w:p>
-    <w:p>
-      <w:pPr>
-        <w:pStyle w:val="Heading2"/>
-      </w:pPr>
-      <w:bookmarkStart w:id="38" w:name="_Toc198558799"/>
-      <w:r>
-        <w:t>3.4.2. Загрузка карты и эмбоссирование символа:</w:t>
-      </w:r>
-      <w:bookmarkEnd w:id="38"/>
-    </w:p>
-    <w:p>
-      <w:r>
-        <w:t>// ... (Предыдущий код для соединения) ...</w:t>
-      </w:r>
-    </w:p>
-    <w:p/>
-    <w:p>
-      <w:r>
-        <w:t xml:space="preserve">    result = driver.LoadCard();</w:t>
-      </w:r>
-    </w:p>
-    <w:p>
-      <w:pPr>
-        <w:rPr>
-          <w:lang w:val="en-US"/>
-        </w:rPr>
-      </w:pPr>
-      <w:r>
-        <w:t xml:space="preserve">    </w:t>
-      </w:r>
-      <w:r>
-        <w:rPr>
-          <w:bCs/>
-          <w:lang w:val="en-US"/>
-        </w:rPr>
-        <w:t>if</w:t>
-      </w:r>
-      <w:r>
-        <w:rPr>
-          <w:lang w:val="en-US"/>
-        </w:rPr>
-        <w:t xml:space="preserve"> (</w:t>
-      </w:r>
-      <w:proofErr w:type="gramStart"/>
-      <w:r>
-        <w:rPr>
-          <w:lang w:val="en-US"/>
-        </w:rPr>
-        <w:t>result !</w:t>
-      </w:r>
-      <w:proofErr w:type="gramEnd"/>
-      <w:r>
-        <w:rPr>
-          <w:lang w:val="en-US"/>
-        </w:rPr>
-        <w:t>= DRV_SUCCESS) {</w:t>
-      </w:r>
-    </w:p>
-    <w:p>
-      <w:pPr>
-        <w:rPr>
-          <w:lang w:val="en-US"/>
-        </w:rPr>
-      </w:pPr>
-      <w:r>
-        <w:rPr>
-          <w:lang w:val="en-US"/>
-        </w:rPr>
-        <w:t xml:space="preserve">        </w:t>
-      </w:r>
-      <w:proofErr w:type="gramStart"/>
-      <w:r>
-        <w:rPr>
-          <w:lang w:val="en-US"/>
-        </w:rPr>
-        <w:t>std::</w:t>
+      <w:r>
+        <w:rPr>
+          <w:lang w:val="en-US"/>
+        </w:rPr>
+        <w:t xml:space="preserve"> &lt;&lt; "</w:t>
+      </w:r>
+      <w:r>
+        <w:t>Ошибка</w:t>
+      </w:r>
+      <w:r>
+        <w:rPr>
+          <w:lang w:val="en-US"/>
+        </w:rPr>
+        <w:t xml:space="preserve"> </w:t>
+      </w:r>
+      <w:r>
+        <w:t>эмбоссирования</w:t>
+      </w:r>
+      <w:r>
+        <w:rPr>
+          <w:lang w:val="en-US"/>
+        </w:rPr>
+        <w:t>: " &lt;&lt; result &lt;&lt; std::</w:t>
       </w:r>
       <w:proofErr w:type="spellStart"/>
-      <w:proofErr w:type="gramEnd"/>
-      <w:r>
-        <w:rPr>
-          <w:lang w:val="en-US"/>
-        </w:rPr>
-        <w:t>cerr</w:t>
-      </w:r>
-      <w:proofErr w:type="spellEnd"/>
-      <w:r>
-        <w:rPr>
-          <w:lang w:val="en-US"/>
-        </w:rPr>
-        <w:t xml:space="preserve"> &lt;&lt; "</w:t>
-      </w:r>
-      <w:r>
-        <w:t>Ошибка</w:t>
-      </w:r>
-      <w:r>
-        <w:rPr>
-          <w:lang w:val="en-US"/>
-        </w:rPr>
-        <w:t xml:space="preserve"> </w:t>
-      </w:r>
-      <w:r>
-        <w:t>загрузки</w:t>
-      </w:r>
-      <w:r>
-        <w:rPr>
-          <w:lang w:val="en-US"/>
-        </w:rPr>
-        <w:t xml:space="preserve"> </w:t>
-      </w:r>
-      <w:r>
-        <w:t>карты</w:t>
-      </w:r>
-      <w:r>
-        <w:rPr>
-          <w:lang w:val="en-US"/>
-        </w:rPr>
-        <w:t xml:space="preserve">: " &lt;&lt; result &lt;&lt; </w:t>
-      </w:r>
-      <w:proofErr w:type="gramStart"/>
-      <w:r>
-        <w:rPr>
-          <w:lang w:val="en-US"/>
-        </w:rPr>
-        <w:t>std::</w:t>
-      </w:r>
-      <w:proofErr w:type="spellStart"/>
-      <w:proofErr w:type="gramEnd"/>
-      <w:r>
-        <w:rPr>
-          <w:lang w:val="en-US"/>
-        </w:rPr>
-        <w:t>endl</w:t>
-      </w:r>
-      <w:proofErr w:type="spellEnd"/>
-      <w:r>
-        <w:rPr>
-          <w:lang w:val="en-US"/>
-        </w:rPr>
-        <w:t>;</w:t>
-      </w:r>
-    </w:p>
-    <w:p>
-      <w:pPr>
-        <w:rPr>
-          <w:lang w:val="en-US"/>
-        </w:rPr>
-      </w:pPr>
-      <w:r>
-        <w:rPr>
-          <w:lang w:val="en-US"/>
-        </w:rPr>
-        <w:t xml:space="preserve">        </w:t>
-      </w:r>
-      <w:proofErr w:type="spellStart"/>
-      <w:proofErr w:type="gramStart"/>
-      <w:r>
-        <w:rPr>
-          <w:lang w:val="en-US"/>
-        </w:rPr>
-        <w:t>driver.Disconnect</w:t>
-      </w:r>
-      <w:proofErr w:type="spellEnd"/>
-      <w:proofErr w:type="gramEnd"/>
-      <w:r>
-        <w:rPr>
-          <w:lang w:val="en-US"/>
-        </w:rPr>
-        <w:t>();</w:t>
-      </w:r>
-    </w:p>
-    <w:p>
-      <w:pPr>
-        <w:rPr>
-          <w:lang w:val="en-US"/>
-        </w:rPr>
-      </w:pPr>
-      <w:r>
-        <w:rPr>
-          <w:lang w:val="en-US"/>
-        </w:rPr>
-        <w:t xml:space="preserve">        </w:t>
-      </w:r>
-      <w:r>
-        <w:rPr>
-          <w:bCs/>
-          <w:lang w:val="en-US"/>
-        </w:rPr>
-        <w:t>return</w:t>
-      </w:r>
-      <w:r>
-        <w:rPr>
-          <w:lang w:val="en-US"/>
-        </w:rPr>
-        <w:t xml:space="preserve"> 1;</w:t>
-      </w:r>
-    </w:p>
-    <w:p>
-      <w:pPr>
-        <w:rPr>
-          <w:lang w:val="en-US"/>
-        </w:rPr>
-      </w:pPr>
-      <w:r>
-        <w:rPr>
-          <w:lang w:val="en-US"/>
-        </w:rPr>
-        <w:t xml:space="preserve">    }</w:t>
-      </w:r>
-    </w:p>
-    <w:p>
-      <w:pPr>
-        <w:rPr>
-          <w:lang w:val="en-US"/>
-        </w:rPr>
-      </w:pPr>
-    </w:p>
-    <w:p>
-      <w:pPr>
-        <w:rPr>
-          <w:lang w:val="en-US"/>
-        </w:rPr>
-      </w:pPr>
-      <w:r>
-        <w:rPr>
-          <w:lang w:val="en-US"/>
-        </w:rPr>
-        <w:t xml:space="preserve">    Position </w:t>
-      </w:r>
-      <w:proofErr w:type="spellStart"/>
-      <w:r>
-        <w:rPr>
-          <w:lang w:val="en-US"/>
-        </w:rPr>
-        <w:t>position</w:t>
-      </w:r>
-      <w:proofErr w:type="spellEnd"/>
-      <w:r>
-        <w:rPr>
-          <w:lang w:val="en-US"/>
-        </w:rPr>
-        <w:t>;</w:t>
-      </w:r>
-    </w:p>
-    <w:p>
-      <w:pPr>
-        <w:rPr>
-          <w:lang w:val="en-US"/>
-        </w:rPr>
-      </w:pPr>
-      <w:r>
-        <w:rPr>
-          <w:lang w:val="en-US"/>
-        </w:rPr>
-        <w:t xml:space="preserve">    </w:t>
-      </w:r>
-      <w:proofErr w:type="spellStart"/>
-      <w:r>
-        <w:rPr>
-          <w:lang w:val="en-US"/>
-        </w:rPr>
-        <w:t>position.X</w:t>
-      </w:r>
-      <w:proofErr w:type="spellEnd"/>
-      <w:r>
-        <w:rPr>
-          <w:lang w:val="en-US"/>
-        </w:rPr>
-        <w:t xml:space="preserve"> = 10;</w:t>
-      </w:r>
-    </w:p>
-    <w:p>
-      <w:pPr>
-        <w:rPr>
-          <w:lang w:val="en-US"/>
-        </w:rPr>
-      </w:pPr>
-      <w:r>
-        <w:rPr>
-          <w:lang w:val="en-US"/>
-        </w:rPr>
-        <w:t xml:space="preserve">    </w:t>
-      </w:r>
-      <w:proofErr w:type="spellStart"/>
-      <w:proofErr w:type="gramStart"/>
-      <w:r>
-        <w:rPr>
-          <w:lang w:val="en-US"/>
-        </w:rPr>
-        <w:t>position.Y</w:t>
-      </w:r>
-      <w:proofErr w:type="spellEnd"/>
-      <w:proofErr w:type="gramEnd"/>
-      <w:r>
-        <w:rPr>
-          <w:lang w:val="en-US"/>
-        </w:rPr>
-        <w:t xml:space="preserve"> = 20;</w:t>
-      </w:r>
-    </w:p>
-    <w:p>
-      <w:pPr>
-        <w:rPr>
-          <w:lang w:val="en-US"/>
-        </w:rPr>
-      </w:pPr>
-    </w:p>
-    <w:p>
-      <w:pPr>
-        <w:rPr>
-          <w:lang w:val="en-US"/>
-        </w:rPr>
-      </w:pPr>
-      <w:r>
-        <w:rPr>
-          <w:lang w:val="en-US"/>
-        </w:rPr>
-        <w:t xml:space="preserve">    result = </w:t>
-      </w:r>
-      <w:proofErr w:type="spellStart"/>
-      <w:proofErr w:type="gramStart"/>
-      <w:r>
-        <w:rPr>
-          <w:lang w:val="en-US"/>
-        </w:rPr>
-        <w:t>driver.EmbossCharacter</w:t>
-      </w:r>
-      <w:proofErr w:type="spellEnd"/>
-      <w:proofErr w:type="gramEnd"/>
-      <w:r>
-        <w:rPr>
-          <w:lang w:val="en-US"/>
-        </w:rPr>
-        <w:t>('A', position);</w:t>
-      </w:r>
-    </w:p>
-    <w:p>
-      <w:pPr>
-        <w:rPr>
-          <w:lang w:val="en-US"/>
-        </w:rPr>
-      </w:pPr>
-      <w:r>
-        <w:rPr>
-          <w:lang w:val="en-US"/>
-        </w:rPr>
-        <w:t xml:space="preserve">    </w:t>
-      </w:r>
-      <w:r>
-        <w:rPr>
-          <w:bCs/>
-          <w:lang w:val="en-US"/>
-        </w:rPr>
-        <w:t>if</w:t>
-      </w:r>
-      <w:r>
-        <w:rPr>
-          <w:lang w:val="en-US"/>
-        </w:rPr>
-        <w:t xml:space="preserve"> (</w:t>
-      </w:r>
-      <w:proofErr w:type="gramStart"/>
-      <w:r>
-        <w:rPr>
-          <w:lang w:val="en-US"/>
-        </w:rPr>
-        <w:t>result !</w:t>
-      </w:r>
-      <w:proofErr w:type="gramEnd"/>
-      <w:r>
-        <w:rPr>
-          <w:lang w:val="en-US"/>
-        </w:rPr>
-        <w:t>= DRV_SUCCESS) {</w:t>
-      </w:r>
-    </w:p>
-    <w:p>
-      <w:pPr>
-        <w:rPr>
-          <w:lang w:val="en-US"/>
-        </w:rPr>
-      </w:pPr>
-      <w:r>
-        <w:rPr>
-          <w:lang w:val="en-US"/>
-        </w:rPr>
-        <w:t xml:space="preserve">        </w:t>
-      </w:r>
-      <w:proofErr w:type="gramStart"/>
-      <w:r>
-        <w:rPr>
-          <w:lang w:val="en-US"/>
-        </w:rPr>
-        <w:t>std::</w:t>
-      </w:r>
-      <w:proofErr w:type="spellStart"/>
-      <w:proofErr w:type="gramEnd"/>
-      <w:r>
-        <w:rPr>
-          <w:lang w:val="en-US"/>
-        </w:rPr>
-        <w:t>cerr</w:t>
-      </w:r>
-      <w:proofErr w:type="spellEnd"/>
-      <w:r>
-        <w:rPr>
-          <w:lang w:val="en-US"/>
-        </w:rPr>
-        <w:t xml:space="preserve"> &lt;&lt; "</w:t>
-      </w:r>
-      <w:r>
-        <w:t>Ошибка</w:t>
-      </w:r>
-      <w:r>
-        <w:rPr>
-          <w:lang w:val="en-US"/>
-        </w:rPr>
-        <w:t xml:space="preserve"> </w:t>
-      </w:r>
-      <w:r>
-        <w:t>эмбоссирования</w:t>
-      </w:r>
-      <w:r>
-        <w:rPr>
-          <w:lang w:val="en-US"/>
-        </w:rPr>
-        <w:t xml:space="preserve">: " &lt;&lt; result &lt;&lt; </w:t>
-      </w:r>
-      <w:proofErr w:type="gramStart"/>
-      <w:r>
-        <w:rPr>
-          <w:lang w:val="en-US"/>
-        </w:rPr>
-        <w:t>std::</w:t>
-      </w:r>
-      <w:proofErr w:type="spellStart"/>
-      <w:proofErr w:type="gramEnd"/>
       <w:r>
         <w:rPr>
           <w:lang w:val="en-US"/>
@@ -14579,7 +14593,6 @@
         <w:t xml:space="preserve">        </w:t>
       </w:r>
       <w:proofErr w:type="spellStart"/>
-      <w:proofErr w:type="gramStart"/>
       <w:r>
         <w:rPr>
           <w:lang w:val="en-US"/>
@@ -14587,7 +14600,6 @@
         <w:t>driver.EjectCard</w:t>
       </w:r>
       <w:proofErr w:type="spellEnd"/>
-      <w:proofErr w:type="gramEnd"/>
       <w:r>
         <w:rPr>
           <w:lang w:val="en-US"/>
@@ -14608,7 +14620,6 @@
         <w:t xml:space="preserve">        </w:t>
       </w:r>
       <w:proofErr w:type="spellStart"/>
-      <w:proofErr w:type="gramStart"/>
       <w:r>
         <w:rPr>
           <w:lang w:val="en-US"/>
@@ -14616,7 +14627,6 @@
         <w:t>driver.Disconnect</w:t>
       </w:r>
       <w:proofErr w:type="spellEnd"/>
-      <w:proofErr w:type="gramEnd"/>
       <w:r>
         <w:rPr>
           <w:lang w:val="en-US"/>
@@ -15947,6 +15957,119 @@
     </w:lvl>
   </w:abstractNum>
   <w:abstractNum w:abstractNumId="4" w15:restartNumberingAfterBreak="0">
+    <w:nsid w:val="1BA70762"/>
+    <w:multiLevelType w:val="hybridMultilevel"/>
+    <w:tmpl w:val="BDB2FCDC"/>
+    <w:lvl w:ilvl="0" w:tplc="04190001">
+      <w:start w:val="1"/>
+      <w:numFmt w:val="bullet"/>
+      <w:lvlText w:val=""/>
+      <w:lvlJc w:val="left"/>
+      <w:pPr>
+        <w:ind w:left="1140" w:hanging="360"/>
+      </w:pPr>
+      <w:rPr>
+        <w:rFonts w:ascii="Symbol" w:hAnsi="Symbol" w:hint="default"/>
+      </w:rPr>
+    </w:lvl>
+    <w:lvl w:ilvl="1" w:tplc="04190003" w:tentative="1">
+      <w:start w:val="1"/>
+      <w:numFmt w:val="bullet"/>
+      <w:lvlText w:val="o"/>
+      <w:lvlJc w:val="left"/>
+      <w:pPr>
+        <w:ind w:left="1860" w:hanging="360"/>
+      </w:pPr>
+      <w:rPr>
+        <w:rFonts w:ascii="Courier New" w:hAnsi="Courier New" w:cs="Courier New" w:hint="default"/>
+      </w:rPr>
+    </w:lvl>
+    <w:lvl w:ilvl="2" w:tplc="04190005" w:tentative="1">
+      <w:start w:val="1"/>
+      <w:numFmt w:val="bullet"/>
+      <w:lvlText w:val=""/>
+      <w:lvlJc w:val="left"/>
+      <w:pPr>
+        <w:ind w:left="2580" w:hanging="360"/>
+      </w:pPr>
+      <w:rPr>
+        <w:rFonts w:ascii="Wingdings" w:hAnsi="Wingdings" w:hint="default"/>
+      </w:rPr>
+    </w:lvl>
+    <w:lvl w:ilvl="3" w:tplc="04190001" w:tentative="1">
+      <w:start w:val="1"/>
+      <w:numFmt w:val="bullet"/>
+      <w:lvlText w:val=""/>
+      <w:lvlJc w:val="left"/>
+      <w:pPr>
+        <w:ind w:left="3300" w:hanging="360"/>
+      </w:pPr>
+      <w:rPr>
+        <w:rFonts w:ascii="Symbol" w:hAnsi="Symbol" w:hint="default"/>
+      </w:rPr>
+    </w:lvl>
+    <w:lvl w:ilvl="4" w:tplc="04190003" w:tentative="1">
+      <w:start w:val="1"/>
+      <w:numFmt w:val="bullet"/>
+      <w:lvlText w:val="o"/>
+      <w:lvlJc w:val="left"/>
+      <w:pPr>
+        <w:ind w:left="4020" w:hanging="360"/>
+      </w:pPr>
+      <w:rPr>
+        <w:rFonts w:ascii="Courier New" w:hAnsi="Courier New" w:cs="Courier New" w:hint="default"/>
+      </w:rPr>
+    </w:lvl>
+    <w:lvl w:ilvl="5" w:tplc="04190005" w:tentative="1">
+      <w:start w:val="1"/>
+      <w:numFmt w:val="bullet"/>
+      <w:lvlText w:val=""/>
+      <w:lvlJc w:val="left"/>
+      <w:pPr>
+        <w:ind w:left="4740" w:hanging="360"/>
+      </w:pPr>
+      <w:rPr>
+        <w:rFonts w:ascii="Wingdings" w:hAnsi="Wingdings" w:hint="default"/>
+      </w:rPr>
+    </w:lvl>
+    <w:lvl w:ilvl="6" w:tplc="04190001" w:tentative="1">
+      <w:start w:val="1"/>
+      <w:numFmt w:val="bullet"/>
+      <w:lvlText w:val=""/>
+      <w:lvlJc w:val="left"/>
+      <w:pPr>
+        <w:ind w:left="5460" w:hanging="360"/>
+      </w:pPr>
+      <w:rPr>
+        <w:rFonts w:ascii="Symbol" w:hAnsi="Symbol" w:hint="default"/>
+      </w:rPr>
+    </w:lvl>
+    <w:lvl w:ilvl="7" w:tplc="04190003" w:tentative="1">
+      <w:start w:val="1"/>
+      <w:numFmt w:val="bullet"/>
+      <w:lvlText w:val="o"/>
+      <w:lvlJc w:val="left"/>
+      <w:pPr>
+        <w:ind w:left="6180" w:hanging="360"/>
+      </w:pPr>
+      <w:rPr>
+        <w:rFonts w:ascii="Courier New" w:hAnsi="Courier New" w:cs="Courier New" w:hint="default"/>
+      </w:rPr>
+    </w:lvl>
+    <w:lvl w:ilvl="8" w:tplc="04190005" w:tentative="1">
+      <w:start w:val="1"/>
+      <w:numFmt w:val="bullet"/>
+      <w:lvlText w:val=""/>
+      <w:lvlJc w:val="left"/>
+      <w:pPr>
+        <w:ind w:left="6900" w:hanging="360"/>
+      </w:pPr>
+      <w:rPr>
+        <w:rFonts w:ascii="Wingdings" w:hAnsi="Wingdings" w:hint="default"/>
+      </w:rPr>
+    </w:lvl>
+  </w:abstractNum>
+  <w:abstractNum w:abstractNumId="5" w15:restartNumberingAfterBreak="0">
     <w:nsid w:val="23D30147"/>
     <w:multiLevelType w:val="hybridMultilevel"/>
     <w:tmpl w:val="42A65116"/>
@@ -16059,7 +16182,7 @@
       </w:rPr>
     </w:lvl>
   </w:abstractNum>
-  <w:abstractNum w:abstractNumId="5" w15:restartNumberingAfterBreak="0">
+  <w:abstractNum w:abstractNumId="6" w15:restartNumberingAfterBreak="0">
     <w:nsid w:val="258C2E3F"/>
     <w:multiLevelType w:val="hybridMultilevel"/>
     <w:tmpl w:val="E8AEE392"/>
@@ -16172,7 +16295,7 @@
       </w:rPr>
     </w:lvl>
   </w:abstractNum>
-  <w:abstractNum w:abstractNumId="6" w15:restartNumberingAfterBreak="0">
+  <w:abstractNum w:abstractNumId="7" w15:restartNumberingAfterBreak="0">
     <w:nsid w:val="287A0840"/>
     <w:multiLevelType w:val="multilevel"/>
     <w:tmpl w:val="4BA45A16"/>
@@ -16285,7 +16408,7 @@
       </w:rPr>
     </w:lvl>
   </w:abstractNum>
-  <w:abstractNum w:abstractNumId="7" w15:restartNumberingAfterBreak="0">
+  <w:abstractNum w:abstractNumId="8" w15:restartNumberingAfterBreak="0">
     <w:nsid w:val="2AFD71BD"/>
     <w:multiLevelType w:val="multilevel"/>
     <w:tmpl w:val="3E4C440E"/>
@@ -16434,7 +16557,7 @@
       </w:rPr>
     </w:lvl>
   </w:abstractNum>
-  <w:abstractNum w:abstractNumId="8" w15:restartNumberingAfterBreak="0">
+  <w:abstractNum w:abstractNumId="9" w15:restartNumberingAfterBreak="0">
     <w:nsid w:val="34876A9C"/>
     <w:multiLevelType w:val="hybridMultilevel"/>
     <w:tmpl w:val="447497B2"/>
@@ -16547,7 +16670,7 @@
       </w:rPr>
     </w:lvl>
   </w:abstractNum>
-  <w:abstractNum w:abstractNumId="9" w15:restartNumberingAfterBreak="0">
+  <w:abstractNum w:abstractNumId="10" w15:restartNumberingAfterBreak="0">
     <w:nsid w:val="358866D1"/>
     <w:multiLevelType w:val="multilevel"/>
     <w:tmpl w:val="CE366DEA"/>
@@ -16668,7 +16791,7 @@
       </w:rPr>
     </w:lvl>
   </w:abstractNum>
-  <w:abstractNum w:abstractNumId="10" w15:restartNumberingAfterBreak="0">
+  <w:abstractNum w:abstractNumId="11" w15:restartNumberingAfterBreak="0">
     <w:nsid w:val="4C297760"/>
     <w:multiLevelType w:val="multilevel"/>
     <w:tmpl w:val="F52069F4"/>
@@ -16817,7 +16940,7 @@
       </w:rPr>
     </w:lvl>
   </w:abstractNum>
-  <w:abstractNum w:abstractNumId="11" w15:restartNumberingAfterBreak="0">
+  <w:abstractNum w:abstractNumId="12" w15:restartNumberingAfterBreak="0">
     <w:nsid w:val="4FB93BFE"/>
     <w:multiLevelType w:val="hybridMultilevel"/>
     <w:tmpl w:val="3A16B434"/>
@@ -16930,7 +17053,7 @@
       </w:rPr>
     </w:lvl>
   </w:abstractNum>
-  <w:abstractNum w:abstractNumId="12" w15:restartNumberingAfterBreak="0">
+  <w:abstractNum w:abstractNumId="13" w15:restartNumberingAfterBreak="0">
     <w:nsid w:val="53411D7A"/>
     <w:multiLevelType w:val="hybridMultilevel"/>
     <w:tmpl w:val="2CDC40FC"/>
@@ -17043,7 +17166,7 @@
       </w:rPr>
     </w:lvl>
   </w:abstractNum>
-  <w:abstractNum w:abstractNumId="13" w15:restartNumberingAfterBreak="0">
+  <w:abstractNum w:abstractNumId="14" w15:restartNumberingAfterBreak="0">
     <w:nsid w:val="5E0B1C30"/>
     <w:multiLevelType w:val="multilevel"/>
     <w:tmpl w:val="027A742C"/>
@@ -17192,7 +17315,7 @@
       </w:rPr>
     </w:lvl>
   </w:abstractNum>
-  <w:abstractNum w:abstractNumId="14" w15:restartNumberingAfterBreak="0">
+  <w:abstractNum w:abstractNumId="15" w15:restartNumberingAfterBreak="0">
     <w:nsid w:val="5F1A2C85"/>
     <w:multiLevelType w:val="multilevel"/>
     <w:tmpl w:val="67A0FAC2"/>
@@ -17341,7 +17464,7 @@
       </w:rPr>
     </w:lvl>
   </w:abstractNum>
-  <w:abstractNum w:abstractNumId="15" w15:restartNumberingAfterBreak="0">
+  <w:abstractNum w:abstractNumId="16" w15:restartNumberingAfterBreak="0">
     <w:nsid w:val="5FC3088A"/>
     <w:multiLevelType w:val="hybridMultilevel"/>
     <w:tmpl w:val="8A0C6CEE"/>
@@ -17454,7 +17577,7 @@
       </w:rPr>
     </w:lvl>
   </w:abstractNum>
-  <w:abstractNum w:abstractNumId="16" w15:restartNumberingAfterBreak="0">
+  <w:abstractNum w:abstractNumId="17" w15:restartNumberingAfterBreak="0">
     <w:nsid w:val="6AAE5FCD"/>
     <w:multiLevelType w:val="hybridMultilevel"/>
     <w:tmpl w:val="FA366D80"/>
@@ -17540,7 +17663,7 @@
       </w:pPr>
     </w:lvl>
   </w:abstractNum>
-  <w:abstractNum w:abstractNumId="17" w15:restartNumberingAfterBreak="0">
+  <w:abstractNum w:abstractNumId="18" w15:restartNumberingAfterBreak="0">
     <w:nsid w:val="6AB85B89"/>
     <w:multiLevelType w:val="multilevel"/>
     <w:tmpl w:val="C9A44B3C"/>
@@ -17689,7 +17812,7 @@
       </w:rPr>
     </w:lvl>
   </w:abstractNum>
-  <w:abstractNum w:abstractNumId="18" w15:restartNumberingAfterBreak="0">
+  <w:abstractNum w:abstractNumId="19" w15:restartNumberingAfterBreak="0">
     <w:nsid w:val="6B641711"/>
     <w:multiLevelType w:val="hybridMultilevel"/>
     <w:tmpl w:val="5A4C9C80"/>
@@ -17802,7 +17925,7 @@
       </w:rPr>
     </w:lvl>
   </w:abstractNum>
-  <w:abstractNum w:abstractNumId="19" w15:restartNumberingAfterBreak="0">
+  <w:abstractNum w:abstractNumId="20" w15:restartNumberingAfterBreak="0">
     <w:nsid w:val="753E0B8F"/>
     <w:multiLevelType w:val="multilevel"/>
     <w:tmpl w:val="2CDE92C6"/>
@@ -17951,7 +18074,7 @@
       </w:rPr>
     </w:lvl>
   </w:abstractNum>
-  <w:abstractNum w:abstractNumId="20" w15:restartNumberingAfterBreak="0">
+  <w:abstractNum w:abstractNumId="21" w15:restartNumberingAfterBreak="0">
     <w:nsid w:val="7E525A96"/>
     <w:multiLevelType w:val="hybridMultilevel"/>
     <w:tmpl w:val="FBBC0A7A"/>
@@ -18064,7 +18187,7 @@
       </w:rPr>
     </w:lvl>
   </w:abstractNum>
-  <w:abstractNum w:abstractNumId="21" w15:restartNumberingAfterBreak="0">
+  <w:abstractNum w:abstractNumId="22" w15:restartNumberingAfterBreak="0">
     <w:nsid w:val="7EC64BAE"/>
     <w:multiLevelType w:val="multilevel"/>
     <w:tmpl w:val="3C2CD0FC"/>
@@ -18214,70 +18337,73 @@
     </w:lvl>
   </w:abstractNum>
   <w:num w:numId="1" w16cid:durableId="2037585064">
-    <w:abstractNumId w:val="16"/>
+    <w:abstractNumId w:val="17"/>
   </w:num>
   <w:num w:numId="2" w16cid:durableId="1333948679">
-    <w:abstractNumId w:val="6"/>
+    <w:abstractNumId w:val="7"/>
   </w:num>
   <w:num w:numId="3" w16cid:durableId="751857597">
+    <w:abstractNumId w:val="12"/>
+  </w:num>
+  <w:num w:numId="4" w16cid:durableId="2080013720">
+    <w:abstractNumId w:val="10"/>
+  </w:num>
+  <w:num w:numId="5" w16cid:durableId="1313094920">
     <w:abstractNumId w:val="11"/>
   </w:num>
-  <w:num w:numId="4" w16cid:durableId="2080013720">
-    <w:abstractNumId w:val="9"/>
-  </w:num>
-  <w:num w:numId="5" w16cid:durableId="1313094920">
-    <w:abstractNumId w:val="10"/>
-  </w:num>
   <w:num w:numId="6" w16cid:durableId="1689527742">
-    <w:abstractNumId w:val="19"/>
+    <w:abstractNumId w:val="20"/>
   </w:num>
   <w:num w:numId="7" w16cid:durableId="285622589">
     <w:abstractNumId w:val="2"/>
   </w:num>
   <w:num w:numId="8" w16cid:durableId="628822219">
-    <w:abstractNumId w:val="7"/>
+    <w:abstractNumId w:val="8"/>
   </w:num>
   <w:num w:numId="9" w16cid:durableId="1227840197">
-    <w:abstractNumId w:val="5"/>
+    <w:abstractNumId w:val="6"/>
   </w:num>
   <w:num w:numId="10" w16cid:durableId="2069330590">
     <w:abstractNumId w:val="0"/>
   </w:num>
   <w:num w:numId="11" w16cid:durableId="787548495">
-    <w:abstractNumId w:val="8"/>
+    <w:abstractNumId w:val="9"/>
   </w:num>
   <w:num w:numId="12" w16cid:durableId="1736471717">
-    <w:abstractNumId w:val="15"/>
+    <w:abstractNumId w:val="16"/>
   </w:num>
   <w:num w:numId="13" w16cid:durableId="1042483398">
-    <w:abstractNumId w:val="4"/>
+    <w:abstractNumId w:val="5"/>
   </w:num>
   <w:num w:numId="14" w16cid:durableId="735206222">
     <w:abstractNumId w:val="3"/>
   </w:num>
   <w:num w:numId="15" w16cid:durableId="709844938">
-    <w:abstractNumId w:val="14"/>
+    <w:abstractNumId w:val="15"/>
   </w:num>
   <w:num w:numId="16" w16cid:durableId="2127656173">
-    <w:abstractNumId w:val="21"/>
+    <w:abstractNumId w:val="22"/>
   </w:num>
   <w:num w:numId="17" w16cid:durableId="600258774">
     <w:abstractNumId w:val="1"/>
   </w:num>
   <w:num w:numId="18" w16cid:durableId="199975936">
+    <w:abstractNumId w:val="14"/>
+  </w:num>
+  <w:num w:numId="19" w16cid:durableId="1695224626">
+    <w:abstractNumId w:val="18"/>
+  </w:num>
+  <w:num w:numId="20" w16cid:durableId="321008220">
     <w:abstractNumId w:val="13"/>
   </w:num>
-  <w:num w:numId="19" w16cid:durableId="1695224626">
-    <w:abstractNumId w:val="17"/>
-  </w:num>
-  <w:num w:numId="20" w16cid:durableId="321008220">
-    <w:abstractNumId w:val="12"/>
-  </w:num>
   <w:num w:numId="21" w16cid:durableId="662201108">
-    <w:abstractNumId w:val="18"/>
+    <w:abstractNumId w:val="19"/>
   </w:num>
   <w:num w:numId="22" w16cid:durableId="1307011346">
-    <w:abstractNumId w:val="20"/>
+    <w:abstractNumId w:val="21"/>
+  </w:num>
+  <w:num w:numId="23" w16cid:durableId="1411267234">
+    <w:abstractNumId w:val="4"/>
   </w:num>
   <w:numIdMacAtCleanup w:val="20"/>
 </w:numbering>

</xml_diff>

<commit_message>
Completed 1.1 working on 1.2
</commit_message>
<xml_diff>
--- a/Diplom_Main.docx
+++ b/Diplom_Main.docx
@@ -1,6 +1,6 @@
 
 <file path=word/document.xml><?xml version="1.0" encoding="utf-8"?>
-<w:document xmlns:wpc="http://schemas.microsoft.com/office/word/2010/wordprocessingCanvas" xmlns:cx="http://schemas.microsoft.com/office/drawing/2014/chartex" xmlns:cx1="http://schemas.microsoft.com/office/drawing/2015/9/8/chartex" xmlns:cx2="http://schemas.microsoft.com/office/drawing/2015/10/21/chartex" xmlns:cx3="http://schemas.microsoft.com/office/drawing/2016/5/9/chartex" xmlns:cx4="http://schemas.microsoft.com/office/drawing/2016/5/10/chartex" xmlns:cx5="http://schemas.microsoft.com/office/drawing/2016/5/11/chartex" xmlns:cx6="http://schemas.microsoft.com/office/drawing/2016/5/12/chartex" xmlns:cx7="http://schemas.microsoft.com/office/drawing/2016/5/13/chartex" xmlns:cx8="http://schemas.microsoft.com/office/drawing/2016/5/14/chartex" xmlns:mc="http://schemas.openxmlformats.org/markup-compatibility/2006" xmlns:aink="http://schemas.microsoft.com/office/drawing/2016/ink" xmlns:am3d="http://schemas.microsoft.com/office/drawing/2017/model3d" xmlns:o="urn:schemas-microsoft-com:office:office" xmlns:oel="http://schemas.microsoft.com/office/2019/extlst" xmlns:r="http://schemas.openxmlformats.org/officeDocument/2006/relationships" xmlns:m="http://schemas.openxmlformats.org/officeDocument/2006/math" xmlns:v="urn:schemas-microsoft-com:vml" xmlns:wp14="http://schemas.microsoft.com/office/word/2010/wordprocessingDrawing" xmlns:wp="http://schemas.openxmlformats.org/drawingml/2006/wordprocessingDrawing" xmlns:w10="urn:schemas-microsoft-com:office:word" xmlns:w="http://schemas.openxmlformats.org/wordprocessingml/2006/main" xmlns:w14="http://schemas.microsoft.com/office/word/2010/wordml" xmlns:w15="http://schemas.microsoft.com/office/word/2012/wordml" xmlns:w16cex="http://schemas.microsoft.com/office/word/2018/wordml/cex" xmlns:w16cid="http://schemas.microsoft.com/office/word/2016/wordml/cid" xmlns:w16="http://schemas.microsoft.com/office/word/2018/wordml" xmlns:w16du="http://schemas.microsoft.com/office/word/2023/wordml/word16du" xmlns:w16sdtdh="http://schemas.microsoft.com/office/word/2020/wordml/sdtdatahash" xmlns:w16sdtfl="http://schemas.microsoft.com/office/word/2024/wordml/sdtformatlock" xmlns:w16se="http://schemas.microsoft.com/office/word/2015/wordml/symex" xmlns:wpg="http://schemas.microsoft.com/office/word/2010/wordprocessingGroup" xmlns:wpi="http://schemas.microsoft.com/office/word/2010/wordprocessingInk" xmlns:wne="http://schemas.microsoft.com/office/word/2006/wordml" xmlns:wps="http://schemas.microsoft.com/office/word/2010/wordprocessingShape" mc:Ignorable="w14 w15 w16se w16cid w16 w16cex w16sdtdh w16sdtfl w16du wp14">
+<w:document xmlns:wpc="http://schemas.microsoft.com/office/word/2010/wordprocessingCanvas" xmlns:cx="http://schemas.microsoft.com/office/drawing/2014/chartex" xmlns:cx1="http://schemas.microsoft.com/office/drawing/2015/9/8/chartex" xmlns:mc="http://schemas.openxmlformats.org/markup-compatibility/2006" xmlns:o="urn:schemas-microsoft-com:office:office" xmlns:r="http://schemas.openxmlformats.org/officeDocument/2006/relationships" xmlns:m="http://schemas.openxmlformats.org/officeDocument/2006/math" xmlns:v="urn:schemas-microsoft-com:vml" xmlns:wp14="http://schemas.microsoft.com/office/word/2010/wordprocessingDrawing" xmlns:wp="http://schemas.openxmlformats.org/drawingml/2006/wordprocessingDrawing" xmlns:w10="urn:schemas-microsoft-com:office:word" xmlns:w="http://schemas.openxmlformats.org/wordprocessingml/2006/main" xmlns:w14="http://schemas.microsoft.com/office/word/2010/wordml" xmlns:w15="http://schemas.microsoft.com/office/word/2012/wordml" xmlns:w16se="http://schemas.microsoft.com/office/word/2015/wordml/symex" xmlns:wpg="http://schemas.microsoft.com/office/word/2010/wordprocessingGroup" xmlns:wpi="http://schemas.microsoft.com/office/word/2010/wordprocessingInk" xmlns:wne="http://schemas.microsoft.com/office/word/2006/wordml" xmlns:wps="http://schemas.microsoft.com/office/word/2010/wordprocessingShape" mc:Ignorable="w14 w15 w16se wp14">
   <w:body>
     <w:p>
       <w:pPr>
@@ -5323,9 +5323,6 @@
     <w:p>
       <w:pPr>
         <w:pStyle w:val="Heading3"/>
-        <w:rPr>
-          <w:lang w:val="en-US"/>
-        </w:rPr>
       </w:pPr>
       <w:r>
         <w:t xml:space="preserve">1.1.3 Теоретические основы работы с кардридерным модулем эмбоссеров </w:t>
@@ -5451,11 +5448,275 @@
       </w:r>
     </w:p>
     <w:p>
+      <w:r>
+        <w:t xml:space="preserve">Все команды модулю в обязательном порядке необходимо передавать в виде набора символов, оканчивающегося символом конца последовательности. В наборе обязательно должны содеражться элементы кода на специализированном языке программирования </w:t>
+      </w:r>
+      <w:proofErr w:type="spellStart"/>
+      <w:r>
+        <w:rPr>
+          <w:lang w:val="en-US"/>
+        </w:rPr>
+        <w:t>TCPScript</w:t>
+      </w:r>
+      <w:proofErr w:type="spellEnd"/>
+      <w:r>
+        <w:t xml:space="preserve">. </w:t>
+      </w:r>
+      <w:r>
+        <w:t xml:space="preserve">Данный язык был разработан компанией </w:t>
+      </w:r>
+      <w:r>
+        <w:rPr>
+          <w:lang w:val="en-US"/>
+        </w:rPr>
+        <w:t>MATICA</w:t>
+      </w:r>
+      <w:r>
+        <w:t xml:space="preserve"> </w:t>
+      </w:r>
+      <w:r>
+        <w:t xml:space="preserve">для использования в своих эмбоссерах. Язык имеет </w:t>
+      </w:r>
+      <w:r>
+        <w:rPr>
+          <w:lang w:val="en-US"/>
+        </w:rPr>
+        <w:t>C</w:t>
+      </w:r>
+      <w:r>
+        <w:t>-</w:t>
+      </w:r>
+      <w:r>
+        <w:t xml:space="preserve">подобный синтаксис и обширную документацию, предоставляемую все той же команией </w:t>
+      </w:r>
+      <w:r>
+        <w:rPr>
+          <w:lang w:val="en-US"/>
+        </w:rPr>
+        <w:t>MATICA</w:t>
+      </w:r>
+      <w:r>
+        <w:t xml:space="preserve">. </w:t>
+      </w:r>
+      <w:r>
+        <w:t xml:space="preserve">При получении строки текста по сети, управляющий модуль анализирует код, находящийся в ней, и </w:t>
+      </w:r>
+      <w:r>
+        <w:t>выполняет его. Если команды отправляются по адресу одного из ридеров модуля, то код все равно выполняется управляющей платой, если же в коде в таком случае присутствуют элементы управления кардридером, то они выполняются платой для выбранного по адресу кардридера.</w:t>
+      </w:r>
+      <w:r>
+        <w:t xml:space="preserve"> Ответ на переданные команды моуль возвращает также в виде строки текста, в которой присутствует результат выполнения последней операции или же код </w:t>
+      </w:r>
+      <w:r>
+        <w:lastRenderedPageBreak/>
+        <w:t>выполнения, который сигнализирует или об успешном выполнении кода или о присутствии ошибки.</w:t>
+      </w:r>
+    </w:p>
+    <w:p>
+      <w:pPr>
+        <w:pStyle w:val="Heading2"/>
+      </w:pPr>
+      <w:bookmarkStart w:id="5" w:name="_Toc198558761"/>
+      <w:r>
+        <w:t>1.</w:t>
+      </w:r>
+      <w:r>
+        <w:t>2</w:t>
+      </w:r>
+      <w:r>
+        <w:t xml:space="preserve"> </w:t>
+      </w:r>
+      <w:r>
+        <w:t xml:space="preserve">Анализ программного обеспечения для осуществления персонализации средствами эмбоссеров </w:t>
+      </w:r>
+      <w:r>
+        <w:rPr>
+          <w:lang w:val="en-US"/>
+        </w:rPr>
+        <w:t>MATICA</w:t>
+      </w:r>
+      <w:bookmarkEnd w:id="5"/>
+    </w:p>
+    <w:p>
       <w:pPr>
         <w:ind w:firstLine="426"/>
       </w:pPr>
       <w:r>
-        <w:t>Вся суть работы любого эмбоссера состоит из нескольких этапов, по прохождению которых карта приобретает все присущие ей элементы:</w:t>
+        <w:t>В</w:t>
+      </w:r>
+      <w:r>
+        <w:t xml:space="preserve"> первом</w:t>
+      </w:r>
+      <w:r>
+        <w:t xml:space="preserve"> </w:t>
+      </w:r>
+      <w:r>
+        <w:t xml:space="preserve">разделе </w:t>
+      </w:r>
+      <w:r>
+        <w:t xml:space="preserve">данной главы были рассмотрены все теоретические основы работы с эмбоссерами и в частности эмбоссером </w:t>
+      </w:r>
+      <w:r>
+        <w:rPr>
+          <w:lang w:val="en-US"/>
+        </w:rPr>
+        <w:t>MATICA</w:t>
+      </w:r>
+      <w:r>
+        <w:t xml:space="preserve"> </w:t>
+      </w:r>
+      <w:r>
+        <w:t xml:space="preserve">и </w:t>
+      </w:r>
+      <w:r>
+        <w:t xml:space="preserve">его кардридерным модулем, которые необходимы для понимания контекста работы. В данном же разделе будут рассмотрены элементы, находящиеся по другую сторону процесса эмбоссирования, а именно все программное обеспечение, необходимое для управления эмбоссером и осуществления персонализации пластиковых банковских карт. Так как в процессе персонализации с использованием эмбоссеров </w:t>
+      </w:r>
+      <w:r>
+        <w:rPr>
+          <w:lang w:val="en-US"/>
+        </w:rPr>
+        <w:t>MATICA</w:t>
+      </w:r>
+      <w:r>
+        <w:t xml:space="preserve"> используется не одно единственное ПО, данный раздел разделен на несколько подразделов для каждого из использованных в ходе работы программных средств.</w:t>
+      </w:r>
+    </w:p>
+    <w:p>
+      <w:pPr>
+        <w:pStyle w:val="Heading3"/>
+        <w:rPr>
+          <w:lang w:val="en-US"/>
+        </w:rPr>
+      </w:pPr>
+      <w:r>
+        <w:t xml:space="preserve">1.2.1 </w:t>
+      </w:r>
+      <w:r>
+        <w:t xml:space="preserve"> </w:t>
+      </w:r>
+      <w:r>
+        <w:t xml:space="preserve">Платформа </w:t>
+      </w:r>
+      <w:proofErr w:type="spellStart"/>
+      <w:r>
+        <w:rPr>
+          <w:lang w:val="en-US"/>
+        </w:rPr>
+        <w:t>FloraWare</w:t>
+      </w:r>
+      <w:proofErr w:type="spellEnd"/>
+    </w:p>
+    <w:p>
+      <w:r>
+        <w:t xml:space="preserve">Программная платформа </w:t>
+      </w:r>
+      <w:proofErr w:type="spellStart"/>
+      <w:r>
+        <w:rPr>
+          <w:lang w:val="en-US"/>
+        </w:rPr>
+        <w:t>Floraware</w:t>
+      </w:r>
+      <w:proofErr w:type="spellEnd"/>
+      <w:r>
+        <w:t xml:space="preserve"> </w:t>
+      </w:r>
+      <w:r>
+        <w:t xml:space="preserve">является основой, на которой полностью разработан разработан программный продукт </w:t>
+      </w:r>
+      <w:proofErr w:type="spellStart"/>
+      <w:r>
+        <w:rPr>
+          <w:lang w:val="en-US"/>
+        </w:rPr>
+        <w:t>TranzWare</w:t>
+      </w:r>
+      <w:proofErr w:type="spellEnd"/>
+      <w:r>
+        <w:t xml:space="preserve"> </w:t>
+      </w:r>
+      <w:proofErr w:type="spellStart"/>
+      <w:r>
+        <w:rPr>
+          <w:lang w:val="en-US"/>
+        </w:rPr>
+        <w:t>CardFactory</w:t>
+      </w:r>
+      <w:proofErr w:type="spellEnd"/>
+      <w:r>
+        <w:t xml:space="preserve">, </w:t>
+      </w:r>
+      <w:r>
+        <w:t xml:space="preserve">предназначенный для управления процессом персонализации банковских карт. Сам продукт </w:t>
+      </w:r>
+      <w:proofErr w:type="spellStart"/>
+      <w:r>
+        <w:rPr>
+          <w:lang w:val="en-US"/>
+        </w:rPr>
+        <w:t>CardFactory</w:t>
+      </w:r>
+      <w:proofErr w:type="spellEnd"/>
+      <w:r>
+        <w:t xml:space="preserve"> </w:t>
+      </w:r>
+      <w:r>
+        <w:t xml:space="preserve">будет рассмотрен подробнее в следующем подразделе. В данном же разделе будет подробно рассмотрена структура платформы </w:t>
+      </w:r>
+      <w:proofErr w:type="spellStart"/>
+      <w:r>
+        <w:rPr>
+          <w:lang w:val="en-US"/>
+        </w:rPr>
+        <w:t>FloraWare</w:t>
+      </w:r>
+      <w:proofErr w:type="spellEnd"/>
+      <w:r>
+        <w:t xml:space="preserve">, а также все средства разработки, которые она предлагает </w:t>
+      </w:r>
+      <w:r>
+        <w:t>для осуществления сетевого взаимодействия с другими устройствами, что необходимо для управления кардридерным модулем эмбоссера как это была описано в предыдущем разделе, и для разработки интерфейсов, что пригодится при доработке модуля настроек.</w:t>
+      </w:r>
+    </w:p>
+    <w:p>
+      <w:r>
+        <w:t xml:space="preserve">Не смотря на то, что </w:t>
+      </w:r>
+      <w:proofErr w:type="spellStart"/>
+      <w:r>
+        <w:rPr>
+          <w:lang w:val="en-US"/>
+        </w:rPr>
+        <w:t>FloraWare</w:t>
+      </w:r>
+      <w:proofErr w:type="spellEnd"/>
+      <w:r>
+        <w:t xml:space="preserve"> </w:t>
+      </w:r>
+      <w:r>
+        <w:t xml:space="preserve">была обозначена как платформа, по своей сути она представляет целую экосистему для разработки и исполнения приложений. </w:t>
+      </w:r>
+      <w:r>
+        <w:t xml:space="preserve">Вместе с ней поставляются разработанные для нее и на ее основе все необходимые средства для разработки, отладки и тестирования приложений. Внутри своей экосистемы, </w:t>
+      </w:r>
+      <w:proofErr w:type="spellStart"/>
+      <w:r>
+        <w:rPr>
+          <w:lang w:val="en-US"/>
+        </w:rPr>
+        <w:t>FloraWare</w:t>
+      </w:r>
+      <w:proofErr w:type="spellEnd"/>
+      <w:r>
+        <w:t xml:space="preserve"> </w:t>
+      </w:r>
+      <w:r>
+        <w:t>предлагает уникальный в своем роде способ разработки и исполнения приложений.</w:t>
+      </w:r>
+      <w:bookmarkStart w:id="6" w:name="_GoBack"/>
+      <w:bookmarkEnd w:id="6"/>
+      <w:r>
+        <w:t xml:space="preserve"> </w:t>
       </w:r>
     </w:p>
     <w:p>
@@ -5463,11 +5724,7 @@
         <w:ind w:firstLine="426"/>
       </w:pPr>
       <w:r>
-        <w:t>-</w:t>
-      </w:r>
-      <w:r>
-        <w:tab/>
-        <w:t>Загрузка карты;</w:t>
+        <w:t>В первой части данной главы были рассмотрены теоретические основы процесса эмбоссирования и подробно описана схема работы эмбоссера. Мы определили ключевые механизмы и этапы, которые необходимо учитывать при разработке программного обеспечения для управления данным оборудованием. Теперь, когда мы имеем четкое представление о физических принципах работы эмбоссера, нам необходимо перейти к анализу существующего программного обеспечения, используемого для управления этими устройствами.</w:t>
       </w:r>
     </w:p>
     <w:p>
@@ -5475,11 +5732,11 @@
         <w:ind w:firstLine="426"/>
       </w:pPr>
       <w:r>
-        <w:t>-</w:t>
-      </w:r>
-      <w:r>
-        <w:tab/>
-        <w:t>Персонализация;</w:t>
+        <w:t xml:space="preserve">Как правило, эмбоссеры не работают автономно и требуют программного обеспечения, которое выполняет роль посредника между пользовательским </w:t>
+      </w:r>
+      <w:r>
+        <w:lastRenderedPageBreak/>
+        <w:t>интерфейсом (например, банковской системой) и самим оборудованием. Такое программное обеспечение обычно представлено в виде драйвера, который обеспечивает необходимый интерфейс для взаимодействия с аппаратным обеспечением. Существующие драйверы могут быть разработаны производителями эмбоссеров или сторонними компаниями, и они могут отличаться по архитектуре, функциональности и производительности.</w:t>
       </w:r>
     </w:p>
     <w:p>
@@ -5487,11 +5744,112 @@
         <w:ind w:firstLine="426"/>
       </w:pPr>
       <w:r>
-        <w:t>-</w:t>
-      </w:r>
-      <w:r>
-        <w:tab/>
-        <w:t>Эмбоссирование;</w:t>
+        <w:t xml:space="preserve">Итальянская компания </w:t>
+      </w:r>
+      <w:r>
+        <w:rPr>
+          <w:lang w:val="en-US"/>
+        </w:rPr>
+        <w:t>MATICA</w:t>
+      </w:r>
+      <w:r>
+        <w:t xml:space="preserve"> поставляет драйверы и приложения для управления в комплекте с эмбоссерами, но компания «</w:t>
+      </w:r>
+      <w:r>
+        <w:rPr>
+          <w:lang w:val="en-US"/>
+        </w:rPr>
+        <w:t>Compass</w:t>
+      </w:r>
+      <w:r>
+        <w:t xml:space="preserve"> </w:t>
+      </w:r>
+      <w:r>
+        <w:rPr>
+          <w:lang w:val="en-US"/>
+        </w:rPr>
+        <w:t>Plus</w:t>
+      </w:r>
+      <w:r>
+        <w:t>»</w:t>
+      </w:r>
+      <w:r>
+        <w:t xml:space="preserve"> </w:t>
+      </w:r>
+      <w:r>
+        <w:t xml:space="preserve">имеет собственное приложение, осуществляющее работу с эмбоссером. Нас интересует драйвер, ранее разработанный </w:t>
+      </w:r>
+      <w:r>
+        <w:t xml:space="preserve">бюро продуктов персонализации внутри компании. Данный драйвер был разработан </w:t>
+      </w:r>
+      <w:r>
+        <w:t xml:space="preserve">как часть модуля </w:t>
+      </w:r>
+      <w:r>
+        <w:rPr>
+          <w:lang w:val="en-US"/>
+        </w:rPr>
+        <w:t>Embosser</w:t>
+      </w:r>
+      <w:r>
+        <w:t xml:space="preserve"> </w:t>
+      </w:r>
+      <w:r>
+        <w:rPr>
+          <w:lang w:val="en-US"/>
+        </w:rPr>
+        <w:t>Driver</w:t>
+      </w:r>
+      <w:r>
+        <w:t xml:space="preserve"> </w:t>
+      </w:r>
+      <w:r>
+        <w:t xml:space="preserve">приложения </w:t>
+      </w:r>
+      <w:proofErr w:type="spellStart"/>
+      <w:r>
+        <w:rPr>
+          <w:lang w:val="en-US"/>
+        </w:rPr>
+        <w:t>TranzWare</w:t>
+      </w:r>
+      <w:proofErr w:type="spellEnd"/>
+      <w:r>
+        <w:t xml:space="preserve"> </w:t>
+      </w:r>
+      <w:proofErr w:type="spellStart"/>
+      <w:r>
+        <w:rPr>
+          <w:lang w:val="en-US"/>
+        </w:rPr>
+        <w:t>CardFactory</w:t>
+      </w:r>
+      <w:proofErr w:type="spellEnd"/>
+      <w:r>
+        <w:t xml:space="preserve">. Данное приложение </w:t>
+      </w:r>
+      <w:r>
+        <w:t>разработан</w:t>
+      </w:r>
+      <w:r>
+        <w:t>о</w:t>
+      </w:r>
+      <w:r>
+        <w:t xml:space="preserve"> на основе программной платформы </w:t>
+      </w:r>
+      <w:proofErr w:type="spellStart"/>
+      <w:r>
+        <w:rPr>
+          <w:lang w:val="en-US"/>
+        </w:rPr>
+        <w:t>FloraWare</w:t>
+      </w:r>
+      <w:proofErr w:type="spellEnd"/>
+      <w:r>
+        <w:t xml:space="preserve">, </w:t>
+      </w:r>
+      <w:r>
+        <w:t>которая предоставляет широкие возможности для разработки программных продуктов разной сложности.</w:t>
       </w:r>
     </w:p>
     <w:p>
@@ -5499,7 +5857,24 @@
         <w:ind w:firstLine="426"/>
       </w:pPr>
       <w:r>
-        <w:t xml:space="preserve">Для лучшего понимания работы эмоссера рассмотрим приведенные выше этапы подробнее. </w:t>
+        <w:t xml:space="preserve">Чтобы ясно понять технологическую составляющую работы, обратим свое внимание на центральное ПО, на основе которого будет проводится вся дальнейшая разработка – программная платформа </w:t>
+      </w:r>
+      <w:proofErr w:type="spellStart"/>
+      <w:r>
+        <w:rPr>
+          <w:lang w:val="en-US"/>
+        </w:rPr>
+        <w:t>FloraWare</w:t>
+      </w:r>
+      <w:proofErr w:type="spellEnd"/>
+      <w:r>
+        <w:t>.</w:t>
+      </w:r>
+      <w:r>
+        <w:t xml:space="preserve"> </w:t>
+      </w:r>
+      <w:r>
+        <w:t>Вопрос стоит в надобности данной платформы, так как для разработки приложений могут использоваться и более распространенные и современные средства разработки.</w:t>
       </w:r>
     </w:p>
     <w:p>
@@ -5507,527 +5882,15 @@
         <w:ind w:firstLine="426"/>
       </w:pPr>
       <w:r>
-        <w:t xml:space="preserve">Загрузка карты представляет из себя введение карты в эмбоссер для дальнейшей обработки. Данный этап может быть выполнен как вручную, так и с помощью специального механизма подачи карт, который использует ролики и захваты для переноса карт во внутреннюю часть эмбоссера. После этапа загрузки карты с помощью механизма поступают внутрь специального устройства - кардридера, который зажимает карту. Данное устройство имеет </w:t>
-      </w:r>
+        <w:t>Попытки создания полноценной объектной машины и замены текстового представления программы предпринимались неоднократно, однако все они ограничивались полумерами. Это можно объяснить несколькими причинами. Технология, меняющая что-то кардинально, требует отбрасывания существующих программных компонентов, созданных по другим технологиям. Поэтому она обязана предложить весь спектр инструментальных средств, либо как запасной вариант, предоставить инструменты поддержки других технологий, и то и другое требует больших усилий. С другой стороны ОО языки программирования создавались с учетом универсальности объектов и полного контроля над ними со стороны пользовательской программы. Даже если технология предполагает наличие некой виртуальной машины, назвать ее объектной можно только с большой натяжкой, на откуп ей в лучшем случае отдается сборка мусора. Тогда как наибольшие преимущества объектной машины сказываются при максимальном ее контроле над объектами. Попытки заменить текстовое представление алгоритма, в большинстве случаев, сводятся к генерации текста части программы на основе ее графического представления с последующей трансляцией, интересным же является полное исключение теста программы. Избавиться от перечисленных недостатков можно, отказавшись от архитектуры машины с потоком команд и линейной памятью, и перейдя к архитектуре с древовидной объектной памятью, с управлением объектами собственно объектной машиной.</w:t>
+      </w:r>
+    </w:p>
+    <w:p>
+      <w:pPr>
+        <w:ind w:firstLine="426"/>
+      </w:pPr>
       <w:r>
         <w:lastRenderedPageBreak/>
-        <w:t>несколько подпружиненных контактов, которые соединяются с соответствующими контактами на карте. Целью кардридера является предоставление интерфейса взаимодействия с картой во время процесса персонализации</w:t>
-      </w:r>
-      <w:r>
-        <w:t>, а именно возможность записи и считывания информации с чипа на карте. После поступления в кардридер карта проходит процесс персонализации, во время которого на карту записывается вся необходимая банку для работы этой самой карты информация. Далее карта вынимется из кардридера и поступает в эмбоссер, который в свою очередь наносит рисунок на карту и печатает необходимые символы на поверхностях карты с помощью выжигания или выдавливания. Выполнение всех операций производится ЭВМ, подключенной к данному эмбоссеру. После всех вышеперечисленных операций карта считается готовой к эксплуатации и выдается банком клиенту.</w:t>
-      </w:r>
-    </w:p>
-    <w:p>
-      <w:pPr>
-        <w:ind w:firstLine="426"/>
-      </w:pPr>
-      <w:r>
-        <w:t xml:space="preserve">Для выяснения схемы взаимодействия эмбоссера </w:t>
-      </w:r>
-      <w:r>
-        <w:rPr>
-          <w:lang w:val="en-US"/>
-        </w:rPr>
-        <w:t>MATICA</w:t>
-      </w:r>
-      <w:r>
-        <w:t xml:space="preserve"> </w:t>
-      </w:r>
-      <w:r>
-        <w:t>с управляющим приложением, а также выяснения схемы и алгоритма его работы использовалась внутренняя документация компании</w:t>
-      </w:r>
-      <w:r>
-        <w:t>-производителя</w:t>
-      </w:r>
-      <w:r>
-        <w:t>. Деталь</w:t>
-      </w:r>
-      <w:r>
-        <w:t>но проанализировав схему взаимодействия эмбоссер</w:t>
-      </w:r>
-      <w:r>
-        <w:t>а</w:t>
-      </w:r>
-      <w:r>
-        <w:t xml:space="preserve"> с внешним ПО, было выявлено несколько ключевых элементов:</w:t>
-      </w:r>
-    </w:p>
-    <w:p>
-      <w:pPr>
-        <w:pStyle w:val="ListParagraph"/>
-        <w:numPr>
-          <w:ilvl w:val="0"/>
-          <w:numId w:val="1"/>
-        </w:numPr>
-        <w:ind w:left="426"/>
-      </w:pPr>
-      <w:r>
-        <w:t xml:space="preserve">При работе с эмбоссером, он должен находится в одной сети с рабочей станцией, следовательно, кабель </w:t>
-      </w:r>
-      <w:r>
-        <w:rPr>
-          <w:lang w:val="en-US"/>
-        </w:rPr>
-        <w:t>Ethernet</w:t>
-      </w:r>
-      <w:r>
-        <w:t xml:space="preserve">, </w:t>
-      </w:r>
-      <w:r>
-        <w:t>идущий от эмбоссера, подключается через маршрутизатор или же напрямую к рабочей станции</w:t>
-      </w:r>
-    </w:p>
-    <w:p>
-      <w:pPr>
-        <w:pStyle w:val="ListParagraph"/>
-        <w:numPr>
-          <w:ilvl w:val="0"/>
-          <w:numId w:val="1"/>
-        </w:numPr>
-        <w:ind w:left="426"/>
-      </w:pPr>
-      <w:r>
-        <w:t xml:space="preserve">Передача команд и информации эмбоссеру происходит по протоколу </w:t>
-      </w:r>
-      <w:r>
-        <w:rPr>
-          <w:lang w:val="en-US"/>
-        </w:rPr>
-        <w:t>TCP</w:t>
-      </w:r>
-      <w:r>
-        <w:t>/</w:t>
-      </w:r>
-      <w:r>
-        <w:rPr>
-          <w:lang w:val="en-US"/>
-        </w:rPr>
-        <w:t>IP</w:t>
-      </w:r>
-    </w:p>
-    <w:p>
-      <w:pPr>
-        <w:pStyle w:val="ListParagraph"/>
-        <w:numPr>
-          <w:ilvl w:val="0"/>
-          <w:numId w:val="1"/>
-        </w:numPr>
-        <w:ind w:left="426"/>
-      </w:pPr>
-      <w:r>
-        <w:t xml:space="preserve">Все команды и информация передаются эмбоссеру в виде кода, написанного на скриптовом языке программирования </w:t>
-      </w:r>
-      <w:proofErr w:type="spellStart"/>
-      <w:r>
-        <w:rPr>
-          <w:lang w:val="en-US"/>
-        </w:rPr>
-        <w:t>TCPscript</w:t>
-      </w:r>
-      <w:proofErr w:type="spellEnd"/>
-      <w:r>
-        <w:t xml:space="preserve"> </w:t>
-      </w:r>
-    </w:p>
-    <w:p>
-      <w:pPr>
-        <w:pStyle w:val="ListParagraph"/>
-        <w:numPr>
-          <w:ilvl w:val="0"/>
-          <w:numId w:val="1"/>
-        </w:numPr>
-        <w:ind w:left="426"/>
-      </w:pPr>
-      <w:r>
-        <w:t>Если к эмбоссеру подключено несколько станций для записи банковских карт, то он может работать в многопоточном режиме</w:t>
-      </w:r>
-    </w:p>
-    <w:p>
-      <w:pPr>
-        <w:ind w:firstLine="426"/>
-      </w:pPr>
-      <w:r>
-        <w:t xml:space="preserve">Углубляясь в значение представленных выше ключевых элементов работы с эмбоссером, а также руководствуясь </w:t>
-      </w:r>
-      <w:r>
-        <w:t xml:space="preserve">соответствующей документацией, оказывается, что работа с эмбоссером представляет из себя достаточно простую последовательность действий. Во-первых, происходит подключение эмбоссера к рабочей станции, в большинстве случаев это ПК, на котором имеется необходимое ПО, через кабель </w:t>
-      </w:r>
-      <w:r>
-        <w:rPr>
-          <w:lang w:val="en-US"/>
-        </w:rPr>
-        <w:t>Ethernet</w:t>
-      </w:r>
-      <w:r>
-        <w:t xml:space="preserve"> </w:t>
-      </w:r>
-      <w:r>
-        <w:t xml:space="preserve">одним из представленных выше способов. Далее по данному сетевому подключению по протоколу </w:t>
-      </w:r>
-      <w:r>
-        <w:rPr>
-          <w:lang w:val="en-US"/>
-        </w:rPr>
-        <w:t>TCP</w:t>
-      </w:r>
-      <w:r>
-        <w:t>/</w:t>
-      </w:r>
-      <w:r>
-        <w:rPr>
-          <w:lang w:val="en-US"/>
-        </w:rPr>
-        <w:t>IP</w:t>
-      </w:r>
-      <w:r>
-        <w:t xml:space="preserve"> </w:t>
-      </w:r>
-      <w:r>
-        <w:t xml:space="preserve">команды и данные в виде непрерывной строки символов с кодом на языке </w:t>
-      </w:r>
-      <w:proofErr w:type="spellStart"/>
-      <w:r>
-        <w:rPr>
-          <w:lang w:val="en-US"/>
-        </w:rPr>
-        <w:t>TCPscript</w:t>
-      </w:r>
-      <w:proofErr w:type="spellEnd"/>
-      <w:r>
-        <w:t xml:space="preserve"> передаются эмбоссеру для интерпретации и выполнения</w:t>
-      </w:r>
-      <w:r>
-        <w:t xml:space="preserve">. </w:t>
-      </w:r>
-      <w:r>
-        <w:t xml:space="preserve">Стоит упомянуть, что скриптовый язык программирования </w:t>
-      </w:r>
-      <w:proofErr w:type="spellStart"/>
-      <w:r>
-        <w:rPr>
-          <w:lang w:val="en-US"/>
-        </w:rPr>
-        <w:t>TCPscript</w:t>
-      </w:r>
-      <w:proofErr w:type="spellEnd"/>
-      <w:r>
-        <w:t xml:space="preserve"> имеет </w:t>
-      </w:r>
-      <w:r>
-        <w:rPr>
-          <w:lang w:val="en-US"/>
-        </w:rPr>
-        <w:t>C</w:t>
-      </w:r>
-      <w:r>
-        <w:t>-</w:t>
-      </w:r>
-      <w:r>
-        <w:t>подобный синтаксис и был разработан компанией «</w:t>
-      </w:r>
-      <w:r>
-        <w:rPr>
-          <w:lang w:val="en-US"/>
-        </w:rPr>
-        <w:t>MATICA</w:t>
-      </w:r>
-      <w:r>
-        <w:t>» специально дл</w:t>
-      </w:r>
-      <w:r>
-        <w:t>я общения с эмбоссерами собственного производства. После передачи команды эмбоссеру он интерпретирует и выполняет ее</w:t>
-      </w:r>
-      <w:r>
-        <w:t xml:space="preserve"> </w:t>
-      </w:r>
-      <w:r>
-        <w:t xml:space="preserve">и после этого отправляет ответ о выполненном действии по тому же каналу подключения. Последнее, что стоит упомянуть, так это возможность работы в многопоточном режиме, она осуществляется подключением к эмбоссеру нескольких кардридеров, каждый </w:t>
-      </w:r>
-      <w:r>
-        <w:lastRenderedPageBreak/>
-        <w:t xml:space="preserve">из которых будет иметь свой собственный </w:t>
-      </w:r>
-      <w:r>
-        <w:rPr>
-          <w:lang w:val="en-US"/>
-        </w:rPr>
-        <w:t>IP</w:t>
-      </w:r>
-      <w:r>
-        <w:t xml:space="preserve"> </w:t>
-      </w:r>
-      <w:r>
-        <w:t xml:space="preserve">адрес, по которому к нему можно будет обращаться. </w:t>
-      </w:r>
-      <w:r>
-        <w:rPr>
-          <w:lang w:val="en-US"/>
-        </w:rPr>
-        <w:t>IP</w:t>
-      </w:r>
-      <w:r>
-        <w:t xml:space="preserve"> </w:t>
-      </w:r>
-      <w:r>
-        <w:t xml:space="preserve">адрес каждого отдельного кардридера можно определить по базовому адресу, который прописан в документации и является общим для всех эмбоссеров </w:t>
-      </w:r>
-      <w:r>
-        <w:rPr>
-          <w:lang w:val="en-US"/>
-        </w:rPr>
-        <w:t>MATICA</w:t>
-      </w:r>
-      <w:r>
-        <w:t xml:space="preserve">, </w:t>
-      </w:r>
-      <w:r>
-        <w:t xml:space="preserve">адрес первого подключенного ридера является базовым адресом, </w:t>
-      </w:r>
-      <w:r>
-        <w:t>адрес второго – базовый адрес + 1 и т.д</w:t>
-      </w:r>
-      <w:r>
-        <w:t>.</w:t>
-      </w:r>
-    </w:p>
-    <w:p>
-      <w:pPr>
-        <w:ind w:firstLine="426"/>
-      </w:pPr>
-      <w:r>
-        <w:t>Кроме вышеперечисленных ключевых элементов в документации также была представлена схема работы эмбоссера и схема его взаимодействия с управляющим ПО на рабочей станции</w:t>
-      </w:r>
-      <w:r>
-        <w:t>. Так как все эмбоссеры работают схожим образом, схема работы нас интересует не так сильно, как схема его взаимодействия, поэтому разберем ее подробнее.</w:t>
-      </w:r>
-    </w:p>
-    <w:p>
-      <w:pPr>
-        <w:ind w:firstLine="426"/>
-      </w:pPr>
-      <w:r>
-        <w:t xml:space="preserve">Схема взаимодействия эмбоссера с ПО, предоставляемым команией </w:t>
-      </w:r>
-      <w:r>
-        <w:t>“</w:t>
-      </w:r>
-      <w:r>
-        <w:rPr>
-          <w:lang w:val="en-US"/>
-        </w:rPr>
-        <w:t>Compass</w:t>
-      </w:r>
-      <w:r>
-        <w:t xml:space="preserve"> </w:t>
-      </w:r>
-      <w:r>
-        <w:rPr>
-          <w:lang w:val="en-US"/>
-        </w:rPr>
-        <w:t>Plus</w:t>
-      </w:r>
-      <w:r>
-        <w:t>”</w:t>
-      </w:r>
-      <w:r>
-        <w:t>:</w:t>
-      </w:r>
-    </w:p>
-    <w:p>
-      <w:pPr>
-        <w:ind w:firstLine="0"/>
-      </w:pPr>
-    </w:p>
-    <w:p>
-      <w:pPr>
-        <w:pStyle w:val="Heading2"/>
-      </w:pPr>
-      <w:bookmarkStart w:id="5" w:name="_Toc198558761"/>
-      <w:r>
-        <w:t>1.</w:t>
-      </w:r>
-      <w:r>
-        <w:t>2</w:t>
-      </w:r>
-      <w:r>
-        <w:t xml:space="preserve"> </w:t>
-      </w:r>
-      <w:r>
-        <w:t>Изучение программной платформы</w:t>
-      </w:r>
-      <w:r>
-        <w:t xml:space="preserve"> и поддерживаемого приложения</w:t>
-      </w:r>
-      <w:bookmarkEnd w:id="5"/>
-    </w:p>
-    <w:p>
-      <w:pPr>
-        <w:ind w:firstLine="426"/>
-      </w:pPr>
-      <w:r>
-        <w:t>В первой части данной главы были рассмотрены теоретические основы процесса эмбоссирования и подробно описана схема работы эмбоссера. Мы определили ключевые механизмы и этапы, которые необходимо учитывать при разработке программного обеспечения для управления данным оборудованием. Теперь, когда мы имеем четкое представление о физических принципах работы эмбоссера, нам необходимо перейти к анализу существующего программного обеспечения, используемого для управления этими устройствами.</w:t>
-      </w:r>
-    </w:p>
-    <w:p>
-      <w:pPr>
-        <w:ind w:firstLine="426"/>
-      </w:pPr>
-      <w:r>
-        <w:t>Как правило, эмбоссеры не работают автономно и требуют программного обеспечения, которое выполняет роль посредника между пользовательским интерфейсом (например, банковской системой) и самим оборудованием. Такое программное обеспечение обычно представлено в виде драйвера, который обеспечивает необходимый интерфейс для взаимодействия с аппаратным обеспечением. Существующие драйверы могут быть разработаны производителями эмбоссеров или сторонними компаниями, и они могут отличаться по архитектуре, функциональности и производительности.</w:t>
-      </w:r>
-    </w:p>
-    <w:p>
-      <w:pPr>
-        <w:ind w:firstLine="426"/>
-      </w:pPr>
-      <w:r>
-        <w:t xml:space="preserve">Итальянская компания </w:t>
-      </w:r>
-      <w:r>
-        <w:rPr>
-          <w:lang w:val="en-US"/>
-        </w:rPr>
-        <w:t>MATICA</w:t>
-      </w:r>
-      <w:r>
-        <w:t xml:space="preserve"> поставляет драйверы и приложения для управления в комплекте с эмбоссерами, но компания «</w:t>
-      </w:r>
-      <w:r>
-        <w:rPr>
-          <w:lang w:val="en-US"/>
-        </w:rPr>
-        <w:t>Compass</w:t>
-      </w:r>
-      <w:r>
-        <w:t xml:space="preserve"> </w:t>
-      </w:r>
-      <w:r>
-        <w:rPr>
-          <w:lang w:val="en-US"/>
-        </w:rPr>
-        <w:t>Plus</w:t>
-      </w:r>
-      <w:r>
-        <w:t>»</w:t>
-      </w:r>
-      <w:r>
-        <w:t xml:space="preserve"> </w:t>
-      </w:r>
-      <w:r>
-        <w:t xml:space="preserve">имеет собственное приложение, осуществляющее работу с эмбоссером. Нас интересует драйвер, ранее разработанный </w:t>
-      </w:r>
-      <w:r>
-        <w:t xml:space="preserve">бюро продуктов персонализации внутри компании. Данный драйвер был разработан </w:t>
-      </w:r>
-      <w:r>
-        <w:t xml:space="preserve">как часть модуля </w:t>
-      </w:r>
-      <w:r>
-        <w:rPr>
-          <w:lang w:val="en-US"/>
-        </w:rPr>
-        <w:t>Embosser</w:t>
-      </w:r>
-      <w:r>
-        <w:t xml:space="preserve"> </w:t>
-      </w:r>
-      <w:r>
-        <w:rPr>
-          <w:lang w:val="en-US"/>
-        </w:rPr>
-        <w:t>Driver</w:t>
-      </w:r>
-      <w:r>
-        <w:t xml:space="preserve"> </w:t>
-      </w:r>
-      <w:r>
-        <w:t xml:space="preserve">приложения </w:t>
-      </w:r>
-      <w:proofErr w:type="spellStart"/>
-      <w:r>
-        <w:rPr>
-          <w:lang w:val="en-US"/>
-        </w:rPr>
-        <w:t>TranzWare</w:t>
-      </w:r>
-      <w:proofErr w:type="spellEnd"/>
-      <w:r>
-        <w:t xml:space="preserve"> </w:t>
-      </w:r>
-      <w:proofErr w:type="spellStart"/>
-      <w:r>
-        <w:rPr>
-          <w:lang w:val="en-US"/>
-        </w:rPr>
-        <w:t>CardFactory</w:t>
-      </w:r>
-      <w:proofErr w:type="spellEnd"/>
-      <w:r>
-        <w:t xml:space="preserve">. Данное приложение </w:t>
-      </w:r>
-      <w:r>
-        <w:t>разработан</w:t>
-      </w:r>
-      <w:r>
-        <w:t>о</w:t>
-      </w:r>
-      <w:r>
-        <w:t xml:space="preserve"> на основе программной платформы </w:t>
-      </w:r>
-      <w:proofErr w:type="spellStart"/>
-      <w:r>
-        <w:rPr>
-          <w:lang w:val="en-US"/>
-        </w:rPr>
-        <w:t>FloraWare</w:t>
-      </w:r>
-      <w:proofErr w:type="spellEnd"/>
-      <w:r>
-        <w:t xml:space="preserve">, </w:t>
-      </w:r>
-      <w:r>
-        <w:t>которая предоставляет широкие возможности для разработки программных продуктов разной сложности.</w:t>
-      </w:r>
-    </w:p>
-    <w:p>
-      <w:pPr>
-        <w:ind w:firstLine="426"/>
-      </w:pPr>
-      <w:r>
-        <w:lastRenderedPageBreak/>
-        <w:t xml:space="preserve">Чтобы ясно понять технологическую составляющую работы, обратим свое внимание на центральное ПО, на основе которого будет проводится вся дальнейшая разработка – программная платформа </w:t>
-      </w:r>
-      <w:proofErr w:type="spellStart"/>
-      <w:r>
-        <w:rPr>
-          <w:lang w:val="en-US"/>
-        </w:rPr>
-        <w:t>FloraWare</w:t>
-      </w:r>
-      <w:proofErr w:type="spellEnd"/>
-      <w:r>
-        <w:t>.</w:t>
-      </w:r>
-      <w:r>
-        <w:t xml:space="preserve"> </w:t>
-      </w:r>
-      <w:r>
-        <w:t>Вопрос стоит в надобности данной платформы, так как для разработки приложений могут использоваться и более распространенные и современные средства разработки.</w:t>
-      </w:r>
-    </w:p>
-    <w:p>
-      <w:pPr>
-        <w:ind w:firstLine="426"/>
-      </w:pPr>
-      <w:r>
-        <w:t>Попытки создания полноценной объектной машины и замены текстового представления программы предпринимались неоднократно, однако все они ограничивались полумерами. Это можно объяснить несколькими причинами. Технология, меняющая что-то кардинально, требует отбрасывания существующих программных компонентов, созданных по другим технологиям. Поэтому она обязана предложить весь спектр инструментальных средств, либо как запасной вариант, предоставить инструменты поддержки других технологий, и то и другое требует больших усилий. С другой стороны ОО языки программирования создавались с учетом универсальности объектов и полного контроля над ними со стороны пользовательской программы. Даже если технология предполагает наличие некой виртуальной машины, назвать ее объектной можно только с большой натяжкой, на откуп ей в лучшем случае отдается сборка мусора. Тогда как наибольшие преимущества объектной машины сказываются при максимальном ее контроле над объектами. Попытки заменить текстовое представление алгоритма, в большинстве случаев, сводятся к генерации текста части программы на основе ее графического представления с последующей трансляцией, интересным же является полное исключение теста программы. Избавиться от перечисленных недостатков можно, отказавшись от архитектуры машины с потоком команд и линейной памятью, и перейдя к архитектуре с древовидной объектной памятью, с управлением объектами собственно объектной машиной.</w:t>
-      </w:r>
-    </w:p>
-    <w:p>
-      <w:pPr>
-        <w:ind w:firstLine="426"/>
-      </w:pPr>
-      <w:r>
         <w:t>На примере технологии программирования FloraWare сделана попытка реализации полноценной объектной машины как основы реализации объектного метода. С практической точки зрения, целью создания FloraWare было построение простой и удобной объектно-ориентированной среды разработки и исполнения приложений для больших программных систем со средствами коллективной разработки и удаленной отладки приложений.</w:t>
       </w:r>
     </w:p>
@@ -6114,7 +5977,6 @@
         <w:ind w:firstLine="426"/>
       </w:pPr>
       <w:r>
-        <w:lastRenderedPageBreak/>
         <w:t>На самом нижнем уровне реализован аппарат работы со свойствами объектов, которые относятся к четырем базовым типам: целое, действительное, строка и указатель на объект, эти свойства могут отличаться набором индексов базовых типов. Свойства объекта это инструмент поддержки его </w:t>
       </w:r>
       <w:r>
@@ -6261,6 +6123,7 @@
         <w:rPr>
           <w:lang w:val="en-US"/>
         </w:rPr>
+        <w:lastRenderedPageBreak/>
         <w:t>CardFactory</w:t>
       </w:r>
       <w:proofErr w:type="spellEnd"/>
@@ -6352,8 +6215,209 @@
         <w:ind w:firstLine="426"/>
       </w:pPr>
       <w:r>
+        <w:t>Анализируя имеющееся приложение для работы с банковскими картами, частью которого и является вышеупомянутый драйвер, было выяснено, что для корректной работы драйвера и его регистрации приложением недостаточно его наличия, необходимо также, чтобы существование драйвера было зарегистрировано в базе данных, используемой приложением для хранения данных о большинстве собственных модулей.</w:t>
+      </w:r>
+    </w:p>
+    <w:p>
+      <w:pPr>
+        <w:ind w:firstLine="426"/>
+      </w:pPr>
+      <w:r>
+        <w:t xml:space="preserve">При запуске модуля обработки карты внутри </w:t>
+      </w:r>
+      <w:proofErr w:type="spellStart"/>
+      <w:r>
+        <w:rPr>
+          <w:lang w:val="en-US"/>
+        </w:rPr>
+        <w:t>TranzWare</w:t>
+      </w:r>
+      <w:proofErr w:type="spellEnd"/>
+      <w:r>
+        <w:t xml:space="preserve"> </w:t>
+      </w:r>
+      <w:proofErr w:type="spellStart"/>
+      <w:r>
+        <w:rPr>
+          <w:lang w:val="en-US"/>
+        </w:rPr>
+        <w:t>CardFactory</w:t>
+      </w:r>
+      <w:proofErr w:type="spellEnd"/>
+      <w:r>
+        <w:t xml:space="preserve">, </w:t>
+      </w:r>
+      <w:r>
+        <w:t xml:space="preserve">при условии, что во время настройки карточного продукта среди эмбоссеров был выбран эмбоссер компании </w:t>
+      </w:r>
+      <w:r>
+        <w:rPr>
+          <w:lang w:val="en-US"/>
+        </w:rPr>
+        <w:t>MATICA</w:t>
+      </w:r>
+      <w:r>
+        <w:t xml:space="preserve">. </w:t>
+      </w:r>
+      <w:r>
+        <w:t xml:space="preserve">Данный драйвер подключится к модулю урпавления эмбоссерами, когда он начнет свою работу. После этого </w:t>
+      </w:r>
+      <w:r>
+        <w:t xml:space="preserve">внутри модуля будет запущена функция </w:t>
+      </w:r>
+      <w:r>
+        <w:rPr>
+          <w:lang w:val="en-US"/>
+        </w:rPr>
+        <w:t>Start</w:t>
+      </w:r>
+      <w:r>
+        <w:t xml:space="preserve">, </w:t>
+      </w:r>
+      <w:r>
+        <w:t xml:space="preserve">которая и осуществит  общение с эмбоссером и эмбоссирует карту как это было настроено внутри приложения. Во время эмбоссирования будут последовательно запускаться функции </w:t>
+      </w:r>
+      <w:r>
+        <w:rPr>
+          <w:lang w:val="en-US"/>
+        </w:rPr>
+        <w:t>Send</w:t>
+      </w:r>
+      <w:r>
+        <w:t xml:space="preserve"> </w:t>
+      </w:r>
+      <w:r>
+        <w:t xml:space="preserve">и </w:t>
+      </w:r>
+      <w:r>
+        <w:rPr>
+          <w:lang w:val="en-US"/>
+        </w:rPr>
+        <w:t>Receive</w:t>
+      </w:r>
+      <w:r>
+        <w:t xml:space="preserve">, </w:t>
+      </w:r>
+      <w:r>
+        <w:t>которые непосредственно осуществляют обмен информации с эмбоссером.</w:t>
+      </w:r>
+    </w:p>
+    <w:p>
+      <w:pPr>
+        <w:pStyle w:val="Heading2"/>
+      </w:pPr>
+      <w:bookmarkStart w:id="7" w:name="_Toc198558762"/>
+      <w:r>
+        <w:t>1.3 Анализ существующего драйвера</w:t>
+      </w:r>
+      <w:bookmarkEnd w:id="7"/>
+    </w:p>
+    <w:p>
+      <w:pPr>
+        <w:ind w:firstLine="426"/>
+      </w:pPr>
+      <w:r>
+        <w:t>Подробное изучение программной платфофрмы и построенного на нем приложения поможет лучше понять уже разработанны</w:t>
+      </w:r>
+      <w:r>
+        <w:t>е</w:t>
+      </w:r>
+      <w:r>
+        <w:t xml:space="preserve"> драйве</w:t>
+      </w:r>
+      <w:r>
+        <w:t>ры для работы с эмбоссерами других производителей</w:t>
+      </w:r>
+      <w:r>
+        <w:t>. Анализ данн</w:t>
+      </w:r>
+      <w:r>
+        <w:t>ых</w:t>
+      </w:r>
+      <w:r>
+        <w:t xml:space="preserve"> драйвер</w:t>
+      </w:r>
+      <w:r>
+        <w:t>ов</w:t>
+      </w:r>
+      <w:r>
+        <w:t xml:space="preserve"> поможет лучше понять возмо</w:t>
+      </w:r>
+      <w:r>
+        <w:t xml:space="preserve">жности для разработки подобных драйверов, а также </w:t>
+      </w:r>
+      <w:r>
+        <w:t>понять как строится структура любого драйвера для взаимодействия с эмбоссерами.</w:t>
+      </w:r>
+    </w:p>
+    <w:p>
+      <w:pPr>
+        <w:ind w:firstLine="426"/>
+      </w:pPr>
+      <w:r>
+        <w:t>Изучая разработанный на платформ</w:t>
+      </w:r>
+      <w:r>
+        <w:t>е</w:t>
+      </w:r>
+      <w:r>
+        <w:t xml:space="preserve"> </w:t>
+      </w:r>
+      <w:proofErr w:type="spellStart"/>
+      <w:r>
+        <w:rPr>
+          <w:lang w:val="en-US"/>
+        </w:rPr>
+        <w:t>FloraWare</w:t>
+      </w:r>
+      <w:proofErr w:type="spellEnd"/>
+      <w:r>
+        <w:t xml:space="preserve"> </w:t>
+      </w:r>
+      <w:r>
+        <w:t>драйвер для работы с эмбоссер</w:t>
+      </w:r>
+      <w:r>
+        <w:t>ом «Вставьте название здесь»</w:t>
+      </w:r>
+      <w:r>
+        <w:t xml:space="preserve">, а также руководствуясь внутренней документацией компании по языку программирования </w:t>
+      </w:r>
+      <w:r>
+        <w:rPr>
+          <w:lang w:val="en-US"/>
+        </w:rPr>
+        <w:t>F</w:t>
+      </w:r>
+      <w:r>
+        <w:t>++</w:t>
+      </w:r>
+      <w:r>
+        <w:t xml:space="preserve">, </w:t>
+      </w:r>
+      <w:r>
+        <w:t xml:space="preserve">являющемся основой разработки ПО на вышеупомянутой технологической платформе, внутри драйвера были определены все элементы работы с эмбоссером, представленные в предыдущей главе. Частью драйвера являются функции: </w:t>
+      </w:r>
+      <w:r>
         <w:lastRenderedPageBreak/>
-        <w:t>Анализируя имеющееся приложение для работы с банковскими картами, частью которого и является вышеупомянутый драйвер, было выяснено, что для корректной работы драйвера и его регистрации приложением недостаточно его наличия, необходимо также, чтобы существование драйвера было зарегистрировано в базе данных, используемой приложением для хранения данных о большинстве собственных модулей.</w:t>
+        <w:t xml:space="preserve">отправки сообщений эмбоссеру, получения ответа от эмбоссера, логирования выполненных действий, проверки подключения, получения информации о записываемой карте и т.д. Технологическая платформа </w:t>
+      </w:r>
+      <w:proofErr w:type="spellStart"/>
+      <w:r>
+        <w:rPr>
+          <w:lang w:val="en-US"/>
+        </w:rPr>
+        <w:t>FloraWare</w:t>
+      </w:r>
+      <w:proofErr w:type="spellEnd"/>
+      <w:r>
+        <w:t xml:space="preserve"> предоставляет все необходимые инструменты для реализации данных функций и обеспечения полноценной работы с эмбоссер</w:t>
+      </w:r>
+      <w:r>
+        <w:t>ами</w:t>
+      </w:r>
+      <w:r>
+        <w:t>.</w:t>
       </w:r>
     </w:p>
     <w:p>
@@ -6361,6 +6425,125 @@
         <w:ind w:firstLine="426"/>
       </w:pPr>
       <w:r>
+        <w:t xml:space="preserve">Данный драйвер является частью модуля </w:t>
+      </w:r>
+      <w:r>
+        <w:rPr>
+          <w:lang w:val="en-US"/>
+        </w:rPr>
+        <w:t>Chip</w:t>
+      </w:r>
+      <w:r>
+        <w:t xml:space="preserve"> </w:t>
+      </w:r>
+      <w:r>
+        <w:rPr>
+          <w:lang w:val="en-US"/>
+        </w:rPr>
+        <w:t>Writer</w:t>
+      </w:r>
+      <w:r>
+        <w:t xml:space="preserve"> </w:t>
+      </w:r>
+      <w:r>
+        <w:rPr>
+          <w:lang w:val="en-US"/>
+        </w:rPr>
+        <w:t>Driver</w:t>
+      </w:r>
+      <w:r>
+        <w:t xml:space="preserve"> </w:t>
+      </w:r>
+      <w:r>
+        <w:t>и реализует схему взаимодействия с эмбоссером, описанную в первой части данной главы.</w:t>
+      </w:r>
+      <w:r>
+        <w:t xml:space="preserve"> </w:t>
+      </w:r>
+      <w:r>
+        <w:t xml:space="preserve">Он отвечает за взаимодействия с эмбоссером на этапе персонализации карты. </w:t>
+      </w:r>
+      <w:r>
+        <w:t xml:space="preserve">Драйвер выступает в роли посредника, который осуществляет запись информации на физическую карту средствами специализированных драйверов для записи определенных типов карточных продуктов внутри </w:t>
+      </w:r>
+      <w:proofErr w:type="spellStart"/>
+      <w:r>
+        <w:rPr>
+          <w:lang w:val="en-US"/>
+        </w:rPr>
+        <w:t>TranzWare</w:t>
+      </w:r>
+      <w:proofErr w:type="spellEnd"/>
+      <w:r>
+        <w:t xml:space="preserve"> </w:t>
+      </w:r>
+      <w:proofErr w:type="spellStart"/>
+      <w:r>
+        <w:rPr>
+          <w:lang w:val="en-US"/>
+        </w:rPr>
+        <w:t>CardFactory</w:t>
+      </w:r>
+      <w:proofErr w:type="spellEnd"/>
+      <w:r>
+        <w:t>.</w:t>
+      </w:r>
+      <w:r>
+        <w:t xml:space="preserve"> Карточные драйвера предоставляют всю необходимую для записи на карту информацию и алгоритм записи этой информации, драйвер эмбоссера же является всего лишь интерфейсом взаимодействия, который предоставляет возможность </w:t>
+      </w:r>
+      <w:r>
+        <w:t>карточному драйверу установить связь с физической картой.</w:t>
+      </w:r>
+    </w:p>
+    <w:p>
+      <w:pPr>
+        <w:ind w:firstLine="426"/>
+      </w:pPr>
+      <w:r>
+        <w:t xml:space="preserve">Реализуемый драйвером эмбоссера интерфейс взаимодействия представляется двумя функциями </w:t>
+      </w:r>
+      <w:r>
+        <w:rPr>
+          <w:lang w:val="en-US"/>
+        </w:rPr>
+        <w:t>Send</w:t>
+      </w:r>
+      <w:r>
+        <w:t xml:space="preserve"> </w:t>
+      </w:r>
+      <w:r>
+        <w:t xml:space="preserve">и </w:t>
+      </w:r>
+      <w:r>
+        <w:rPr>
+          <w:lang w:val="en-US"/>
+        </w:rPr>
+        <w:t>Receive</w:t>
+      </w:r>
+      <w:r>
+        <w:t xml:space="preserve">, </w:t>
+      </w:r>
+      <w:r>
+        <w:t>которые реализуют отправку сообщений на карту и получения ответа с карты</w:t>
+      </w:r>
+      <w:r>
+        <w:t xml:space="preserve"> соответственно</w:t>
+      </w:r>
+      <w:r>
+        <w:t>. Во время персонализации карты, эти функции вызываются карточным драйвером и в функцию отправки при вызове передаются данные для отпраки на карту</w:t>
+      </w:r>
+      <w:r>
+        <w:t>, функция получения ответа же используется только для проверки положительного ответа об успешно завершенной операции записи с карты</w:t>
+      </w:r>
+      <w:r>
+        <w:t>.</w:t>
+      </w:r>
+    </w:p>
+    <w:p>
+      <w:pPr>
+        <w:ind w:firstLine="426"/>
+      </w:pPr>
+      <w:r>
         <w:t xml:space="preserve">При запуске модуля обработки карты внутри </w:t>
       </w:r>
       <w:proofErr w:type="spellStart"/>
@@ -6386,22 +6569,28 @@
         <w:t xml:space="preserve">, </w:t>
       </w:r>
       <w:r>
-        <w:t xml:space="preserve">при условии, что во время настройки карточного продукта среди эмбоссеров был выбран эмбоссер компании </w:t>
-      </w:r>
-      <w:r>
-        <w:rPr>
-          <w:lang w:val="en-US"/>
-        </w:rPr>
-        <w:t>MATICA</w:t>
+        <w:t>при условии, что во время настройки карточного продукта среди эмбоссеров был выбран</w:t>
+      </w:r>
+      <w:r>
+        <w:t xml:space="preserve"> необходимый</w:t>
+      </w:r>
+      <w:r>
+        <w:t xml:space="preserve"> эмбоссе</w:t>
+      </w:r>
+      <w:r>
+        <w:t>р</w:t>
       </w:r>
       <w:r>
         <w:t xml:space="preserve">. </w:t>
       </w:r>
       <w:r>
-        <w:t xml:space="preserve">Данный драйвер подключится к модулю урпавления эмбоссерами, когда он начнет свою работу. После этого </w:t>
-      </w:r>
-      <w:r>
-        <w:t xml:space="preserve">внутри модуля будет запущена функция </w:t>
+        <w:t>Данный драйвер подключится к модулю у</w:t>
+      </w:r>
+      <w:r>
+        <w:t>пр</w:t>
+      </w:r>
+      <w:r>
+        <w:t xml:space="preserve">авления эмбоссерами, когда он начнет свою работу. После этого внутри модуля будет запущена функция </w:t>
       </w:r>
       <w:r>
         <w:rPr>
@@ -6410,412 +6599,89 @@
         <w:t>Start</w:t>
       </w:r>
       <w:r>
+        <w:t>,</w:t>
+      </w:r>
+      <w:r>
+        <w:t xml:space="preserve"> внутри</w:t>
+      </w:r>
+      <w:r>
+        <w:t xml:space="preserve"> </w:t>
+      </w:r>
+      <w:r>
+        <w:t>которой реализован алгоритм записи карт</w:t>
+      </w:r>
+      <w:r>
+        <w:t xml:space="preserve">ы, который как раз таки использует функции </w:t>
+      </w:r>
+      <w:r>
+        <w:rPr>
+          <w:lang w:val="en-US"/>
+        </w:rPr>
+        <w:t>Send</w:t>
+      </w:r>
+      <w:r>
+        <w:t xml:space="preserve"> </w:t>
+      </w:r>
+      <w:r>
+        <w:t xml:space="preserve">и </w:t>
+      </w:r>
+      <w:r>
+        <w:rPr>
+          <w:lang w:val="en-US"/>
+        </w:rPr>
+        <w:t>Receive</w:t>
+      </w:r>
+      <w:r>
+        <w:t xml:space="preserve"> при возникновении необходимости записи информации на карту. </w:t>
+      </w:r>
+      <w:r>
+        <w:t xml:space="preserve">Каждый запуск данных функций будет логироваться с помощью специальной функции </w:t>
+      </w:r>
+      <w:r>
+        <w:rPr>
+          <w:lang w:val="en-US"/>
+        </w:rPr>
+        <w:t>Log</w:t>
+      </w:r>
+      <w:r>
         <w:t xml:space="preserve">, </w:t>
       </w:r>
       <w:r>
-        <w:t xml:space="preserve">которая и осуществит  общение с эмбоссером и эмбоссирует карту как это было настроено внутри приложения. Во время эмбоссирования будут последовательно запускаться функции </w:t>
-      </w:r>
-      <w:r>
-        <w:rPr>
-          <w:lang w:val="en-US"/>
-        </w:rPr>
-        <w:t>Send</w:t>
-      </w:r>
-      <w:r>
-        <w:t xml:space="preserve"> </w:t>
-      </w:r>
-      <w:r>
-        <w:t xml:space="preserve">и </w:t>
-      </w:r>
-      <w:r>
-        <w:rPr>
-          <w:lang w:val="en-US"/>
-        </w:rPr>
-        <w:t>Receive</w:t>
-      </w:r>
-      <w:r>
-        <w:t xml:space="preserve">, </w:t>
-      </w:r>
-      <w:r>
-        <w:t>которые непосредственно осуществляют обмен информации с эмбоссером.</w:t>
+        <w:t>которая будет записывать логируемое сообщение</w:t>
+      </w:r>
+      <w:r>
+        <w:t xml:space="preserve"> в специальный буфер или же в текстовый файл, если был выствален соответствующий флаг в интерфейсе запуска обработки карты</w:t>
+      </w:r>
+      <w:r>
+        <w:t>.</w:t>
+      </w:r>
+      <w:r>
+        <w:t xml:space="preserve"> Логироваться будет только переданная на карту информация и полученное с карты сообщение.</w:t>
       </w:r>
     </w:p>
     <w:p>
       <w:pPr>
         <w:pStyle w:val="Heading2"/>
       </w:pPr>
-      <w:bookmarkStart w:id="6" w:name="_Toc198558762"/>
-      <w:r>
-        <w:t>1.3 Анализ существующего драйвера</w:t>
-      </w:r>
-      <w:bookmarkEnd w:id="6"/>
-    </w:p>
-    <w:p>
-      <w:pPr>
-        <w:ind w:firstLine="426"/>
-      </w:pPr>
-      <w:r>
-        <w:t>Подробное изучение программной платфофрмы и построенного на нем приложения поможет лучше понять уже разработанны</w:t>
-      </w:r>
-      <w:r>
-        <w:t>е</w:t>
-      </w:r>
-      <w:r>
-        <w:t xml:space="preserve"> драйве</w:t>
-      </w:r>
-      <w:r>
-        <w:t>ры для работы с эмбоссерами других производителей</w:t>
-      </w:r>
-      <w:r>
-        <w:t>. Анализ данн</w:t>
-      </w:r>
-      <w:r>
-        <w:t>ых</w:t>
-      </w:r>
-      <w:r>
-        <w:t xml:space="preserve"> драйвер</w:t>
-      </w:r>
-      <w:r>
-        <w:t>ов</w:t>
-      </w:r>
-      <w:r>
-        <w:t xml:space="preserve"> поможет лучше понять возмо</w:t>
-      </w:r>
-      <w:r>
-        <w:t xml:space="preserve">жности для разработки подобных драйверов, а также </w:t>
-      </w:r>
-      <w:r>
-        <w:t>понять как строится структура любого драйвера для взаимодействия с эмбоссерами.</w:t>
-      </w:r>
-    </w:p>
-    <w:p>
-      <w:pPr>
-        <w:ind w:firstLine="426"/>
-      </w:pPr>
-      <w:r>
-        <w:t>Изучая разработанный на платформ</w:t>
-      </w:r>
-      <w:r>
-        <w:t>е</w:t>
-      </w:r>
-      <w:r>
-        <w:t xml:space="preserve"> </w:t>
-      </w:r>
-      <w:proofErr w:type="spellStart"/>
-      <w:r>
-        <w:rPr>
-          <w:lang w:val="en-US"/>
-        </w:rPr>
-        <w:t>FloraWare</w:t>
-      </w:r>
-      <w:proofErr w:type="spellEnd"/>
-      <w:r>
-        <w:t xml:space="preserve"> </w:t>
-      </w:r>
-      <w:r>
-        <w:t>драйвер для работы с эмбоссер</w:t>
-      </w:r>
-      <w:r>
-        <w:t>ом «Вставьте название здесь»</w:t>
-      </w:r>
-      <w:r>
-        <w:t xml:space="preserve">, а также руководствуясь внутренней документацией компании по языку программирования </w:t>
-      </w:r>
-      <w:r>
-        <w:rPr>
-          <w:lang w:val="en-US"/>
-        </w:rPr>
-        <w:t>F</w:t>
-      </w:r>
-      <w:r>
-        <w:t>++</w:t>
-      </w:r>
-      <w:r>
-        <w:t xml:space="preserve">, </w:t>
-      </w:r>
-      <w:r>
-        <w:t xml:space="preserve">являющемся основой разработки ПО на вышеупомянутой технологической платформе, внутри драйвера были определены все элементы работы с эмбоссером, представленные в предыдущей главе. Частью драйвера являются функции: отправки сообщений эмбоссеру, получения ответа от эмбоссера, логирования выполненных действий, проверки подключения, получения информации о записываемой карте и т.д. Технологическая платформа </w:t>
-      </w:r>
-      <w:proofErr w:type="spellStart"/>
-      <w:r>
-        <w:rPr>
-          <w:lang w:val="en-US"/>
-        </w:rPr>
-        <w:t>FloraWare</w:t>
-      </w:r>
-      <w:proofErr w:type="spellEnd"/>
-      <w:r>
-        <w:t xml:space="preserve"> предоставляет все необходимые инструменты для реализации данных функций и обеспечения полноценной работы с эмбоссер</w:t>
-      </w:r>
-      <w:r>
-        <w:t>ами</w:t>
-      </w:r>
-      <w:r>
-        <w:t>.</w:t>
-      </w:r>
-    </w:p>
-    <w:p>
-      <w:pPr>
-        <w:ind w:firstLine="426"/>
-      </w:pPr>
-      <w:r>
-        <w:t xml:space="preserve">Данный драйвер является частью модуля </w:t>
-      </w:r>
-      <w:r>
-        <w:rPr>
-          <w:lang w:val="en-US"/>
-        </w:rPr>
-        <w:t>Chip</w:t>
-      </w:r>
-      <w:r>
-        <w:t xml:space="preserve"> </w:t>
-      </w:r>
-      <w:r>
-        <w:rPr>
-          <w:lang w:val="en-US"/>
-        </w:rPr>
-        <w:t>Writer</w:t>
-      </w:r>
-      <w:r>
-        <w:t xml:space="preserve"> </w:t>
-      </w:r>
-      <w:r>
-        <w:rPr>
-          <w:lang w:val="en-US"/>
-        </w:rPr>
-        <w:t>Driver</w:t>
-      </w:r>
-      <w:r>
-        <w:t xml:space="preserve"> </w:t>
-      </w:r>
-      <w:r>
-        <w:t>и реализует схему взаимодействия с эмбоссером, описанную в первой части данной главы.</w:t>
-      </w:r>
-      <w:r>
-        <w:t xml:space="preserve"> </w:t>
-      </w:r>
-      <w:r>
-        <w:t xml:space="preserve">Он отвечает за взаимодействия с эмбоссером на этапе персонализации карты. </w:t>
-      </w:r>
-      <w:r>
-        <w:t xml:space="preserve">Драйвер выступает в роли посредника, который осуществляет запись информации на физическую карту средствами специализированных драйверов для записи определенных типов карточных продуктов внутри </w:t>
-      </w:r>
-      <w:proofErr w:type="spellStart"/>
-      <w:r>
-        <w:rPr>
-          <w:lang w:val="en-US"/>
-        </w:rPr>
-        <w:t>TranzWare</w:t>
-      </w:r>
-      <w:proofErr w:type="spellEnd"/>
-      <w:r>
-        <w:t xml:space="preserve"> </w:t>
-      </w:r>
-      <w:proofErr w:type="spellStart"/>
-      <w:r>
-        <w:rPr>
-          <w:lang w:val="en-US"/>
-        </w:rPr>
-        <w:t>CardFactory</w:t>
-      </w:r>
-      <w:proofErr w:type="spellEnd"/>
-      <w:r>
-        <w:t>.</w:t>
-      </w:r>
-      <w:r>
-        <w:t xml:space="preserve"> Карточные драйвера предоставляют всю необходимую для записи на карту информацию и алгоритм записи этой информации, драйвер </w:t>
+      <w:bookmarkStart w:id="8" w:name="_Toc198558763"/>
+      <w:r>
+        <w:t>1.4 Постановка целей и задач</w:t>
+      </w:r>
+      <w:bookmarkEnd w:id="8"/>
+    </w:p>
+    <w:p>
+      <w:r>
+        <w:t>Разработка драйвера, подобного представленному выше, представляет из себя долгий и трудоемкий процесс,</w:t>
+      </w:r>
+      <w:r>
+        <w:t xml:space="preserve"> </w:t>
+      </w:r>
+      <w:r>
+        <w:t xml:space="preserve">который предполагает изучения как методов взаимодействия с эмбоссером, так и встроенных методов передачи комманд из программной платформы. Кроме того, необходимо необходимо правильно адаптировать передачу комманд под разрабатываемый эмбоссер, </w:t>
       </w:r>
       <w:r>
         <w:lastRenderedPageBreak/>
-        <w:t xml:space="preserve">эмбоссера же является всего лишь интерфейсом взаимодействия, который предоставляет возможность </w:t>
-      </w:r>
-      <w:r>
-        <w:t>карточному драйверу установить связь с физической картой.</w:t>
-      </w:r>
-    </w:p>
-    <w:p>
-      <w:pPr>
-        <w:ind w:firstLine="426"/>
-      </w:pPr>
-      <w:r>
-        <w:t xml:space="preserve">Реализуемый драйвером эмбоссера интерфейс взаимодействия представляется двумя функциями </w:t>
-      </w:r>
-      <w:r>
-        <w:rPr>
-          <w:lang w:val="en-US"/>
-        </w:rPr>
-        <w:t>Send</w:t>
-      </w:r>
-      <w:r>
-        <w:t xml:space="preserve"> </w:t>
-      </w:r>
-      <w:r>
-        <w:t xml:space="preserve">и </w:t>
-      </w:r>
-      <w:r>
-        <w:rPr>
-          <w:lang w:val="en-US"/>
-        </w:rPr>
-        <w:t>Receive</w:t>
-      </w:r>
-      <w:r>
-        <w:t xml:space="preserve">, </w:t>
-      </w:r>
-      <w:r>
-        <w:t>которые реализуют отправку сообщений на карту и получения ответа с карты</w:t>
-      </w:r>
-      <w:r>
-        <w:t xml:space="preserve"> соответственно</w:t>
-      </w:r>
-      <w:r>
-        <w:t>. Во время персонализации карты, эти функции вызываются карточным драйвером и в функцию отправки при вызове передаются данные для отпраки на карту</w:t>
-      </w:r>
-      <w:r>
-        <w:t>, функция получения ответа же используется только для проверки положительного ответа об успешно завершенной операции записи с карты</w:t>
-      </w:r>
-      <w:r>
-        <w:t>.</w:t>
-      </w:r>
-    </w:p>
-    <w:p>
-      <w:pPr>
-        <w:ind w:firstLine="426"/>
-      </w:pPr>
-      <w:r>
-        <w:t xml:space="preserve">При запуске модуля обработки карты внутри </w:t>
-      </w:r>
-      <w:proofErr w:type="spellStart"/>
-      <w:r>
-        <w:rPr>
-          <w:lang w:val="en-US"/>
-        </w:rPr>
-        <w:t>TranzWare</w:t>
-      </w:r>
-      <w:proofErr w:type="spellEnd"/>
-      <w:r>
-        <w:t xml:space="preserve"> </w:t>
-      </w:r>
-      <w:proofErr w:type="spellStart"/>
-      <w:r>
-        <w:rPr>
-          <w:lang w:val="en-US"/>
-        </w:rPr>
-        <w:t>CardFactory</w:t>
-      </w:r>
-      <w:proofErr w:type="spellEnd"/>
-      <w:r>
-        <w:t xml:space="preserve">, </w:t>
-      </w:r>
-      <w:r>
-        <w:t>при условии, что во время настройки карточного продукта среди эмбоссеров был выбран</w:t>
-      </w:r>
-      <w:r>
-        <w:t xml:space="preserve"> необходимый</w:t>
-      </w:r>
-      <w:r>
-        <w:t xml:space="preserve"> эмбоссе</w:t>
-      </w:r>
-      <w:r>
-        <w:t>р</w:t>
-      </w:r>
-      <w:r>
-        <w:t xml:space="preserve">. </w:t>
-      </w:r>
-      <w:r>
-        <w:t>Данный драйвер подключится к модулю у</w:t>
-      </w:r>
-      <w:r>
-        <w:t>пр</w:t>
-      </w:r>
-      <w:r>
-        <w:t xml:space="preserve">авления эмбоссерами, когда он начнет свою работу. После этого внутри модуля будет запущена функция </w:t>
-      </w:r>
-      <w:r>
-        <w:rPr>
-          <w:lang w:val="en-US"/>
-        </w:rPr>
-        <w:t>Start</w:t>
-      </w:r>
-      <w:r>
-        <w:t>,</w:t>
-      </w:r>
-      <w:r>
-        <w:t xml:space="preserve"> внутри</w:t>
-      </w:r>
-      <w:r>
-        <w:t xml:space="preserve"> </w:t>
-      </w:r>
-      <w:r>
-        <w:t>которой реализован алгоритм записи карт</w:t>
-      </w:r>
-      <w:r>
-        <w:t xml:space="preserve">ы, который как раз таки использует функции </w:t>
-      </w:r>
-      <w:r>
-        <w:rPr>
-          <w:lang w:val="en-US"/>
-        </w:rPr>
-        <w:t>Send</w:t>
-      </w:r>
-      <w:r>
-        <w:t xml:space="preserve"> </w:t>
-      </w:r>
-      <w:r>
-        <w:t xml:space="preserve">и </w:t>
-      </w:r>
-      <w:r>
-        <w:rPr>
-          <w:lang w:val="en-US"/>
-        </w:rPr>
-        <w:t>Receive</w:t>
-      </w:r>
-      <w:r>
-        <w:t xml:space="preserve"> при возникновении необходимости записи информации на карту. </w:t>
-      </w:r>
-      <w:r>
-        <w:t xml:space="preserve">Каждый запуск данных функций будет логироваться с помощью специальной функции </w:t>
-      </w:r>
-      <w:r>
-        <w:rPr>
-          <w:lang w:val="en-US"/>
-        </w:rPr>
-        <w:t>Log</w:t>
-      </w:r>
-      <w:r>
-        <w:t xml:space="preserve">, </w:t>
-      </w:r>
-      <w:r>
-        <w:t>которая будет записывать логируемое сообщение</w:t>
-      </w:r>
-      <w:r>
-        <w:t xml:space="preserve"> в специальный буфер или же в текстовый файл, если был выствален соответствующий флаг в интерфейсе запуска обработки карты</w:t>
-      </w:r>
-      <w:r>
-        <w:t>.</w:t>
-      </w:r>
-      <w:r>
-        <w:t xml:space="preserve"> Логироваться будет только переданная на карту информация и полученное с карты сообщение.</w:t>
-      </w:r>
-    </w:p>
-    <w:p>
-      <w:pPr>
-        <w:pStyle w:val="Heading2"/>
-      </w:pPr>
-      <w:bookmarkStart w:id="7" w:name="_Toc198558763"/>
-      <w:r>
-        <w:t>1.4 Постановка целей и задач</w:t>
-      </w:r>
-      <w:bookmarkEnd w:id="7"/>
-    </w:p>
-    <w:p>
-      <w:r>
-        <w:t>Разработка драйвера, подобного представленному выше, представляет из себя долгий и трудоемкий процесс,</w:t>
-      </w:r>
-      <w:r>
-        <w:t xml:space="preserve"> </w:t>
-      </w:r>
-      <w:r>
-        <w:t xml:space="preserve">который предполагает изучения как методов взаимодействия с эмбоссером, так и встроенных методов передачи комманд из программной платформы. Кроме того, необходимо необходимо правильно адаптировать передачу комманд под разрабатываемый эмбоссер, так как изначально в драйвер комманды поступают так, как они были записаны в </w:t>
+        <w:t xml:space="preserve">так как изначально в драйвер комманды поступают так, как они были записаны в </w:t>
       </w:r>
       <w:proofErr w:type="spellStart"/>
       <w:r>
@@ -6921,7 +6787,6 @@
         </w:numPr>
       </w:pPr>
       <w:r>
-        <w:lastRenderedPageBreak/>
         <w:t>Проверка работоспособности разработанного драйвера в тестовой среде, а также на реальном эмбоссере</w:t>
       </w:r>
     </w:p>
@@ -6929,11 +6794,11 @@
       <w:pPr>
         <w:pStyle w:val="Heading2"/>
       </w:pPr>
-      <w:bookmarkStart w:id="8" w:name="_Toc198558764"/>
+      <w:bookmarkStart w:id="9" w:name="_Toc198558764"/>
       <w:r>
         <w:t>1.5 Выводы</w:t>
       </w:r>
-      <w:bookmarkEnd w:id="8"/>
+      <w:bookmarkEnd w:id="9"/>
     </w:p>
     <w:p>
       <w:pPr>
@@ -6960,7 +6825,7 @@
         <w:pStyle w:val="Heading1"/>
         <w:ind w:firstLine="0"/>
       </w:pPr>
-      <w:bookmarkStart w:id="9" w:name="_Toc198558765"/>
+      <w:bookmarkStart w:id="10" w:name="_Toc198558765"/>
       <w:r>
         <w:lastRenderedPageBreak/>
         <w:t xml:space="preserve">2 </w:t>
@@ -6992,20 +6857,20 @@
         </w:rPr>
         <w:t>FloraWare</w:t>
       </w:r>
-      <w:bookmarkEnd w:id="9"/>
+      <w:bookmarkEnd w:id="10"/>
     </w:p>
     <w:p>
       <w:pPr>
         <w:pStyle w:val="Heading2"/>
       </w:pPr>
-      <w:bookmarkStart w:id="10" w:name="_Toc198558766"/>
+      <w:bookmarkStart w:id="11" w:name="_Toc198558766"/>
       <w:r>
         <w:t>2.1 Описание функциональных требований</w:t>
       </w:r>
       <w:r>
         <w:t>, предъявляемых к разрабатываемому драйверу</w:t>
       </w:r>
-      <w:bookmarkEnd w:id="10"/>
+      <w:bookmarkEnd w:id="11"/>
     </w:p>
     <w:p>
       <w:r>
@@ -7546,14 +7411,14 @@
       <w:pPr>
         <w:pStyle w:val="Heading2"/>
       </w:pPr>
-      <w:bookmarkStart w:id="11" w:name="_Toc198558772"/>
+      <w:bookmarkStart w:id="12" w:name="_Toc198558772"/>
       <w:r>
         <w:t xml:space="preserve">2.2 Функциональная схема разрабатываемого </w:t>
       </w:r>
       <w:r>
         <w:t>драйвера</w:t>
       </w:r>
-      <w:bookmarkEnd w:id="11"/>
+      <w:bookmarkEnd w:id="12"/>
     </w:p>
     <w:p>
       <w:r>
@@ -7576,11 +7441,11 @@
       <w:pPr>
         <w:pStyle w:val="Heading3"/>
       </w:pPr>
-      <w:bookmarkStart w:id="12" w:name="_Toc198558773"/>
+      <w:bookmarkStart w:id="13" w:name="_Toc198558773"/>
       <w:r>
         <w:t>2.2.1. Общее описание функциональной схемы</w:t>
       </w:r>
-      <w:bookmarkEnd w:id="12"/>
+      <w:bookmarkEnd w:id="13"/>
     </w:p>
     <w:p>
       <w:r>
@@ -7725,11 +7590,11 @@
       <w:pPr>
         <w:pStyle w:val="Heading3"/>
       </w:pPr>
-      <w:bookmarkStart w:id="13" w:name="_Toc198558774"/>
+      <w:bookmarkStart w:id="14" w:name="_Toc198558774"/>
       <w:r>
         <w:t>2.2.2. Описание компонентов функциональной схемы (и элементы на схеме)</w:t>
       </w:r>
-      <w:bookmarkEnd w:id="13"/>
+      <w:bookmarkEnd w:id="14"/>
     </w:p>
     <w:p>
       <w:r>
@@ -8259,11 +8124,11 @@
       <w:pPr>
         <w:pStyle w:val="Heading3"/>
       </w:pPr>
-      <w:bookmarkStart w:id="14" w:name="_Toc198558775"/>
+      <w:bookmarkStart w:id="15" w:name="_Toc198558775"/>
       <w:r>
         <w:t>2.2.3. Поток данных и управления</w:t>
       </w:r>
-      <w:bookmarkEnd w:id="14"/>
+      <w:bookmarkEnd w:id="15"/>
     </w:p>
     <w:p>
       <w:pPr>
@@ -8346,11 +8211,11 @@
       <w:pPr>
         <w:pStyle w:val="Heading3"/>
       </w:pPr>
-      <w:bookmarkStart w:id="15" w:name="_Toc198558776"/>
+      <w:bookmarkStart w:id="16" w:name="_Toc198558776"/>
       <w:r>
         <w:t>2.2.4. Альтернативные сценарии</w:t>
       </w:r>
-      <w:bookmarkEnd w:id="15"/>
+      <w:bookmarkEnd w:id="16"/>
     </w:p>
     <w:p>
       <w:pPr>
@@ -8411,11 +8276,11 @@
       <w:pPr>
         <w:pStyle w:val="Heading3"/>
       </w:pPr>
-      <w:bookmarkStart w:id="16" w:name="_Toc198558777"/>
+      <w:bookmarkStart w:id="17" w:name="_Toc198558777"/>
       <w:r>
         <w:t>2.2.5. Заключение</w:t>
       </w:r>
-      <w:bookmarkEnd w:id="16"/>
+      <w:bookmarkEnd w:id="17"/>
     </w:p>
     <w:p>
       <w:r>
@@ -8426,11 +8291,11 @@
       <w:pPr>
         <w:pStyle w:val="Heading2"/>
       </w:pPr>
-      <w:bookmarkStart w:id="17" w:name="_Toc198558778"/>
+      <w:bookmarkStart w:id="18" w:name="_Toc198558778"/>
       <w:r>
         <w:t>2.3 Обоснование выбора инструментальных средств разработки</w:t>
       </w:r>
-      <w:bookmarkEnd w:id="17"/>
+      <w:bookmarkEnd w:id="18"/>
     </w:p>
     <w:p>
       <w:r>
@@ -8477,11 +8342,11 @@
       <w:pPr>
         <w:pStyle w:val="Heading3"/>
       </w:pPr>
-      <w:bookmarkStart w:id="18" w:name="_Toc198558779"/>
+      <w:bookmarkStart w:id="19" w:name="_Toc198558779"/>
       <w:r>
         <w:t>2.3.1 Описние использованных инструментальных средств</w:t>
       </w:r>
-      <w:bookmarkEnd w:id="18"/>
+      <w:bookmarkEnd w:id="19"/>
     </w:p>
     <w:p>
       <w:r>
@@ -10002,14 +9867,14 @@
       <w:pPr>
         <w:pStyle w:val="Heading3"/>
       </w:pPr>
-      <w:bookmarkStart w:id="19" w:name="_Toc198558780"/>
+      <w:bookmarkStart w:id="20" w:name="_Toc198558780"/>
       <w:r>
         <w:t>2.3.2</w:t>
       </w:r>
       <w:r>
         <w:t xml:space="preserve"> Заключение</w:t>
       </w:r>
-      <w:bookmarkEnd w:id="19"/>
+      <w:bookmarkEnd w:id="20"/>
     </w:p>
     <w:p>
       <w:r>
@@ -10047,11 +9912,11 @@
       <w:pPr>
         <w:pStyle w:val="Heading2"/>
       </w:pPr>
-      <w:bookmarkStart w:id="20" w:name="_Toc198558781"/>
+      <w:bookmarkStart w:id="21" w:name="_Toc198558781"/>
       <w:r>
         <w:t>2.4 Проектирование пользовательского интерфейса</w:t>
       </w:r>
-      <w:bookmarkEnd w:id="20"/>
+      <w:bookmarkEnd w:id="21"/>
     </w:p>
     <w:p>
       <w:r>
@@ -10080,12 +9945,12 @@
       <w:pPr>
         <w:pStyle w:val="Heading3"/>
       </w:pPr>
-      <w:bookmarkStart w:id="21" w:name="_Toc198558782"/>
+      <w:bookmarkStart w:id="22" w:name="_Toc198558782"/>
       <w:r>
         <w:lastRenderedPageBreak/>
         <w:t>2.4.1. Общие принципы проектирования интерфейса</w:t>
       </w:r>
-      <w:bookmarkEnd w:id="21"/>
+      <w:bookmarkEnd w:id="22"/>
     </w:p>
     <w:p>
       <w:r>
@@ -10243,11 +10108,11 @@
       <w:pPr>
         <w:pStyle w:val="Heading3"/>
       </w:pPr>
-      <w:bookmarkStart w:id="22" w:name="_Toc198558783"/>
+      <w:bookmarkStart w:id="23" w:name="_Toc198558783"/>
       <w:r>
         <w:t xml:space="preserve">2.4.2 </w:t>
       </w:r>
-      <w:bookmarkEnd w:id="22"/>
+      <w:bookmarkEnd w:id="23"/>
       <w:r>
         <w:t>Планирование интерфейсных доработок</w:t>
       </w:r>
@@ -10975,11 +10840,11 @@
       <w:pPr>
         <w:pStyle w:val="Heading3"/>
       </w:pPr>
-      <w:bookmarkStart w:id="23" w:name="_Toc198558784"/>
+      <w:bookmarkStart w:id="24" w:name="_Toc198558784"/>
       <w:r>
         <w:t>2.4.3. Визуализация интерфейса</w:t>
       </w:r>
-      <w:bookmarkEnd w:id="23"/>
+      <w:bookmarkEnd w:id="24"/>
     </w:p>
     <w:p>
       <w:pPr>
@@ -11038,11 +10903,11 @@
       <w:pPr>
         <w:pStyle w:val="Heading3"/>
       </w:pPr>
-      <w:bookmarkStart w:id="24" w:name="_Toc198558785"/>
+      <w:bookmarkStart w:id="25" w:name="_Toc198558785"/>
       <w:r>
         <w:t>2.4.4. Обработка ошибок в UI</w:t>
       </w:r>
-      <w:bookmarkEnd w:id="24"/>
+      <w:bookmarkEnd w:id="25"/>
     </w:p>
     <w:p>
       <w:r>
@@ -11095,12 +10960,12 @@
       <w:pPr>
         <w:pStyle w:val="Heading3"/>
       </w:pPr>
-      <w:bookmarkStart w:id="25" w:name="_Toc198558786"/>
+      <w:bookmarkStart w:id="26" w:name="_Toc198558786"/>
       <w:r>
         <w:lastRenderedPageBreak/>
         <w:t>2.4.5. Заключение</w:t>
       </w:r>
-      <w:bookmarkEnd w:id="25"/>
+      <w:bookmarkEnd w:id="26"/>
     </w:p>
     <w:p>
       <w:r>
@@ -11111,11 +10976,11 @@
       <w:pPr>
         <w:pStyle w:val="Heading2"/>
       </w:pPr>
-      <w:bookmarkStart w:id="26" w:name="_Toc198558787"/>
+      <w:bookmarkStart w:id="27" w:name="_Toc198558787"/>
       <w:r>
         <w:t>2.5 Выводы</w:t>
       </w:r>
-      <w:bookmarkEnd w:id="26"/>
+      <w:bookmarkEnd w:id="27"/>
     </w:p>
     <w:p>
       <w:r>
@@ -11334,7 +11199,7 @@
       <w:pPr>
         <w:pStyle w:val="Heading1"/>
       </w:pPr>
-      <w:bookmarkStart w:id="27" w:name="_Toc198558788"/>
+      <w:bookmarkStart w:id="28" w:name="_Toc198558788"/>
       <w:r>
         <w:lastRenderedPageBreak/>
         <w:t xml:space="preserve">3 </w:t>
@@ -11342,7 +11207,7 @@
       <w:r>
         <w:t>Описание и порядок работы с разработанным программным обеспечением</w:t>
       </w:r>
-      <w:bookmarkEnd w:id="27"/>
+      <w:bookmarkEnd w:id="28"/>
     </w:p>
     <w:p>
       <w:r>
@@ -11364,11 +11229,11 @@
       <w:pPr>
         <w:pStyle w:val="Heading2"/>
       </w:pPr>
-      <w:bookmarkStart w:id="28" w:name="_Toc198558789"/>
+      <w:bookmarkStart w:id="29" w:name="_Toc198558789"/>
       <w:r>
         <w:t>3.1. Архитектура драйвера</w:t>
       </w:r>
-      <w:bookmarkEnd w:id="28"/>
+      <w:bookmarkEnd w:id="29"/>
     </w:p>
     <w:p>
       <w:r>
@@ -11613,6 +11478,7 @@
         </w:numPr>
       </w:pPr>
       <w:proofErr w:type="spellStart"/>
+      <w:proofErr w:type="gramStart"/>
       <w:r>
         <w:rPr>
           <w:lang w:val="en-US"/>
@@ -11621,7 +11487,11 @@
       </w:r>
       <w:proofErr w:type="spellEnd"/>
       <w:r>
-        <w:t>()</w:t>
+        <w:t>(</w:t>
+      </w:r>
+      <w:proofErr w:type="gramEnd"/>
+      <w:r>
+        <w:t>)</w:t>
       </w:r>
       <w:r>
         <w:t xml:space="preserve"> – собирает и отправляет на плату команды инициализации и настройки ридера.</w:t>
@@ -11636,6 +11506,7 @@
         </w:numPr>
       </w:pPr>
       <w:proofErr w:type="spellStart"/>
+      <w:proofErr w:type="gramStart"/>
       <w:r>
         <w:rPr>
           <w:lang w:val="en-US"/>
@@ -11644,7 +11515,11 @@
       </w:r>
       <w:proofErr w:type="spellEnd"/>
       <w:r>
-        <w:t>()</w:t>
+        <w:t>(</w:t>
+      </w:r>
+      <w:proofErr w:type="gramEnd"/>
+      <w:r>
+        <w:t>)</w:t>
       </w:r>
       <w:r>
         <w:t xml:space="preserve"> – собирает и отправляет на плату команду отключения ридера и сброса его настроек.</w:t>
@@ -11791,6 +11666,7 @@
         </w:numPr>
       </w:pPr>
       <w:proofErr w:type="spellStart"/>
+      <w:proofErr w:type="gramStart"/>
       <w:r>
         <w:rPr>
           <w:lang w:val="en-US"/>
@@ -11798,6 +11674,7 @@
         <w:t>sAddress</w:t>
       </w:r>
       <w:proofErr w:type="spellEnd"/>
+      <w:proofErr w:type="gramEnd"/>
       <w:r>
         <w:t xml:space="preserve"> – </w:t>
       </w:r>
@@ -11907,11 +11784,11 @@
       <w:pPr>
         <w:pStyle w:val="Heading2"/>
       </w:pPr>
-      <w:bookmarkStart w:id="29" w:name="_Toc198558790"/>
+      <w:bookmarkStart w:id="30" w:name="_Toc198558790"/>
       <w:r>
         <w:t>3.2. Описание API (Интерфейса программирования)</w:t>
       </w:r>
-      <w:bookmarkEnd w:id="29"/>
+      <w:bookmarkEnd w:id="30"/>
     </w:p>
     <w:p>
       <w:r>
@@ -11922,11 +11799,11 @@
       <w:pPr>
         <w:pStyle w:val="Heading3"/>
       </w:pPr>
-      <w:bookmarkStart w:id="30" w:name="_Toc198558791"/>
+      <w:bookmarkStart w:id="31" w:name="_Toc198558791"/>
       <w:r>
         <w:t>3.2.1. Обзор классов и функций API</w:t>
       </w:r>
-      <w:bookmarkEnd w:id="30"/>
+      <w:bookmarkEnd w:id="31"/>
     </w:p>
     <w:p>
       <w:r>
@@ -11952,11 +11829,7 @@
       </w:r>
     </w:p>
     <w:p>
-      <w:pPr>
-        <w:rPr>
-          <w:lang w:val="en-US"/>
-        </w:rPr>
-      </w:pPr>
+      <w:proofErr w:type="gramStart"/>
       <w:r>
         <w:rPr>
           <w:lang w:val="en-US"/>
@@ -11964,12 +11837,10 @@
         <w:t>Connect</w:t>
       </w:r>
       <w:r>
-        <w:rPr>
-          <w:lang w:val="en-US"/>
-        </w:rPr>
         <w:t>(</w:t>
       </w:r>
       <w:proofErr w:type="spellStart"/>
+      <w:proofErr w:type="gramEnd"/>
       <w:r>
         <w:rPr>
           <w:lang w:val="en-US"/>
@@ -11978,9 +11849,6 @@
       </w:r>
       <w:proofErr w:type="spellEnd"/>
       <w:r>
-        <w:rPr>
-          <w:lang w:val="en-US"/>
-        </w:rPr>
         <w:t xml:space="preserve"> </w:t>
       </w:r>
       <w:proofErr w:type="spellStart"/>
@@ -11992,9 +11860,6 @@
       </w:r>
       <w:proofErr w:type="spellEnd"/>
       <w:r>
-        <w:rPr>
-          <w:lang w:val="en-US"/>
-        </w:rPr>
         <w:t xml:space="preserve">, </w:t>
       </w:r>
       <w:r>
@@ -12004,57 +11869,41 @@
         <w:t>Configuration</w:t>
       </w:r>
       <w:r>
-        <w:rPr>
-          <w:lang w:val="en-US"/>
-        </w:rPr>
-        <w:t xml:space="preserve"> </w:t>
-      </w:r>
+        <w:t xml:space="preserve"> </w:t>
+      </w:r>
+      <w:proofErr w:type="spellStart"/>
       <w:r>
         <w:rPr>
           <w:lang w:val="en-US"/>
         </w:rPr>
         <w:t>configuration</w:t>
       </w:r>
-      <w:r>
-        <w:rPr>
-          <w:lang w:val="en-US"/>
-        </w:rPr>
+      <w:proofErr w:type="spellEnd"/>
+      <w:r>
         <w:t xml:space="preserve">): </w:t>
       </w:r>
       <w:r>
         <w:t>Устанавливает</w:t>
       </w:r>
       <w:r>
-        <w:rPr>
-          <w:lang w:val="en-US"/>
-        </w:rPr>
         <w:t xml:space="preserve"> </w:t>
       </w:r>
       <w:r>
         <w:t>соединение</w:t>
       </w:r>
       <w:r>
-        <w:rPr>
-          <w:lang w:val="en-US"/>
-        </w:rPr>
         <w:t xml:space="preserve"> </w:t>
       </w:r>
       <w:r>
         <w:t>с</w:t>
       </w:r>
       <w:r>
-        <w:rPr>
-          <w:lang w:val="en-US"/>
-        </w:rPr>
         <w:t xml:space="preserve"> </w:t>
       </w:r>
       <w:r>
         <w:t>эмбоссером</w:t>
       </w:r>
       <w:r>
-        <w:rPr>
-          <w:lang w:val="en-US"/>
-        </w:rPr>
         <w:t>.</w:t>
       </w:r>
     </w:p>
@@ -12161,6 +12010,7 @@
         </w:rPr>
       </w:pPr>
       <w:proofErr w:type="spellStart"/>
+      <w:proofErr w:type="gramStart"/>
       <w:r>
         <w:rPr>
           <w:lang w:val="en-US"/>
@@ -12172,7 +12022,14 @@
         <w:rPr>
           <w:lang w:val="en-US"/>
         </w:rPr>
-        <w:t xml:space="preserve">(char character, Position position): </w:t>
+        <w:t>(</w:t>
+      </w:r>
+      <w:proofErr w:type="gramEnd"/>
+      <w:r>
+        <w:rPr>
+          <w:lang w:val="en-US"/>
+        </w:rPr>
+        <w:t xml:space="preserve">char character, Position position): </w:t>
       </w:r>
       <w:r>
         <w:t>Эмбоссирует</w:t>
@@ -12247,6 +12104,7 @@
         </w:rPr>
       </w:pPr>
       <w:proofErr w:type="spellStart"/>
+      <w:proofErr w:type="gramStart"/>
       <w:r>
         <w:rPr>
           <w:lang w:val="en-US"/>
@@ -12261,6 +12119,7 @@
         <w:t>(</w:t>
       </w:r>
       <w:proofErr w:type="spellStart"/>
+      <w:proofErr w:type="gramEnd"/>
       <w:r>
         <w:rPr>
           <w:lang w:val="en-US"/>
@@ -12323,11 +12182,19 @@
           <w:lang w:val="en-US"/>
         </w:rPr>
       </w:pPr>
-      <w:r>
-        <w:rPr>
-          <w:lang w:val="en-US"/>
-        </w:rPr>
-        <w:t xml:space="preserve">Configure(Parameter </w:t>
+      <w:proofErr w:type="gramStart"/>
+      <w:r>
+        <w:rPr>
+          <w:lang w:val="en-US"/>
+        </w:rPr>
+        <w:t>Configure(</w:t>
+      </w:r>
+      <w:proofErr w:type="gramEnd"/>
+      <w:r>
+        <w:rPr>
+          <w:lang w:val="en-US"/>
+        </w:rPr>
+        <w:t xml:space="preserve">Parameter </w:t>
       </w:r>
       <w:proofErr w:type="spellStart"/>
       <w:r>
@@ -12461,11 +12328,11 @@
       <w:pPr>
         <w:pStyle w:val="Heading2"/>
       </w:pPr>
-      <w:bookmarkStart w:id="31" w:name="_Toc198558792"/>
+      <w:bookmarkStart w:id="32" w:name="_Toc198558792"/>
       <w:r>
         <w:t>3.2.2. Подробное описание наиболее важных функций</w:t>
       </w:r>
-      <w:bookmarkEnd w:id="31"/>
+      <w:bookmarkEnd w:id="32"/>
     </w:p>
     <w:p>
       <w:r>
@@ -12478,6 +12345,7 @@
           <w:lang w:val="en-US"/>
         </w:rPr>
       </w:pPr>
+      <w:proofErr w:type="gramStart"/>
       <w:r>
         <w:rPr>
           <w:bCs/>
@@ -12486,6 +12354,7 @@
         <w:t>Connect(</w:t>
       </w:r>
       <w:proofErr w:type="spellStart"/>
+      <w:proofErr w:type="gramEnd"/>
       <w:r>
         <w:rPr>
           <w:bCs/>
@@ -12779,13 +12648,27 @@
         <w:rPr>
           <w:lang w:val="en-US"/>
         </w:rPr>
-        <w:t xml:space="preserve"> Serial: struct </w:t>
+        <w:t xml:space="preserve"> Serial: </w:t>
       </w:r>
       <w:proofErr w:type="spellStart"/>
       <w:r>
         <w:rPr>
           <w:lang w:val="en-US"/>
         </w:rPr>
+        <w:t>struct</w:t>
+      </w:r>
+      <w:proofErr w:type="spellEnd"/>
+      <w:r>
+        <w:rPr>
+          <w:lang w:val="en-US"/>
+        </w:rPr>
+        <w:t xml:space="preserve"> </w:t>
+      </w:r>
+      <w:proofErr w:type="spellStart"/>
+      <w:r>
+        <w:rPr>
+          <w:lang w:val="en-US"/>
+        </w:rPr>
         <w:t>SerialConfiguration</w:t>
       </w:r>
       <w:proofErr w:type="spellEnd"/>
@@ -12807,13 +12690,27 @@
         <w:rPr>
           <w:lang w:val="en-US"/>
         </w:rPr>
-        <w:t xml:space="preserve">; int </w:t>
+        <w:t xml:space="preserve">; </w:t>
       </w:r>
       <w:proofErr w:type="spellStart"/>
       <w:r>
         <w:rPr>
           <w:lang w:val="en-US"/>
         </w:rPr>
+        <w:t>int</w:t>
+      </w:r>
+      <w:proofErr w:type="spellEnd"/>
+      <w:r>
+        <w:rPr>
+          <w:lang w:val="en-US"/>
+        </w:rPr>
+        <w:t xml:space="preserve"> </w:t>
+      </w:r>
+      <w:proofErr w:type="spellStart"/>
+      <w:r>
+        <w:rPr>
+          <w:lang w:val="en-US"/>
+        </w:rPr>
         <w:t>BaudRate</w:t>
       </w:r>
       <w:proofErr w:type="spellEnd"/>
@@ -12855,11 +12752,19 @@
           <w:lang w:val="en-US"/>
         </w:rPr>
       </w:pPr>
-      <w:r>
-        <w:rPr>
-          <w:lang w:val="en-US"/>
-        </w:rPr>
-        <w:t xml:space="preserve">int </w:t>
+      <w:proofErr w:type="gramStart"/>
+      <w:r>
+        <w:rPr>
+          <w:lang w:val="en-US"/>
+        </w:rPr>
+        <w:t>int</w:t>
+      </w:r>
+      <w:proofErr w:type="gramEnd"/>
+      <w:r>
+        <w:rPr>
+          <w:lang w:val="en-US"/>
+        </w:rPr>
+        <w:t xml:space="preserve"> </w:t>
       </w:r>
       <w:r>
         <w:rPr>
@@ -13031,6 +12936,7 @@
         <w:t xml:space="preserve"> result = </w:t>
       </w:r>
       <w:proofErr w:type="spellStart"/>
+      <w:proofErr w:type="gramStart"/>
       <w:r>
         <w:rPr>
           <w:lang w:val="en-US"/>
@@ -13045,6 +12951,7 @@
         <w:t>(</w:t>
       </w:r>
       <w:proofErr w:type="spellStart"/>
+      <w:proofErr w:type="gramEnd"/>
       <w:r>
         <w:rPr>
           <w:lang w:val="en-US"/>
@@ -13164,11 +13071,11 @@
       <w:pPr>
         <w:pStyle w:val="Heading2"/>
       </w:pPr>
-      <w:bookmarkStart w:id="32" w:name="_Toc198558793"/>
+      <w:bookmarkStart w:id="33" w:name="_Toc198558793"/>
       <w:r>
         <w:t>3.3. Процесс установки и настройки драйвера</w:t>
       </w:r>
-      <w:bookmarkEnd w:id="32"/>
+      <w:bookmarkEnd w:id="33"/>
     </w:p>
     <w:p>
       <w:r>
@@ -13179,11 +13086,11 @@
       <w:pPr>
         <w:pStyle w:val="Heading3"/>
       </w:pPr>
-      <w:bookmarkStart w:id="33" w:name="_Toc198558794"/>
+      <w:bookmarkStart w:id="34" w:name="_Toc198558794"/>
       <w:r>
         <w:t>3.3.1. Системные требования:</w:t>
       </w:r>
-      <w:bookmarkEnd w:id="33"/>
+      <w:bookmarkEnd w:id="34"/>
     </w:p>
     <w:p>
       <w:r>
@@ -13204,11 +13111,11 @@
       <w:pPr>
         <w:pStyle w:val="Heading3"/>
       </w:pPr>
-      <w:bookmarkStart w:id="34" w:name="_Toc198558795"/>
+      <w:bookmarkStart w:id="35" w:name="_Toc198558795"/>
       <w:r>
         <w:t>3.3.2. Порядок установки:</w:t>
       </w:r>
-      <w:bookmarkEnd w:id="34"/>
+      <w:bookmarkEnd w:id="35"/>
     </w:p>
     <w:p>
       <w:r>
@@ -13254,11 +13161,11 @@
       <w:pPr>
         <w:pStyle w:val="Heading3"/>
       </w:pPr>
-      <w:bookmarkStart w:id="35" w:name="_Toc198558796"/>
+      <w:bookmarkStart w:id="36" w:name="_Toc198558796"/>
       <w:r>
         <w:t>3.3.3. Настройка драйвера:</w:t>
       </w:r>
-      <w:bookmarkEnd w:id="35"/>
+      <w:bookmarkEnd w:id="36"/>
     </w:p>
     <w:p>
       <w:r>
@@ -13285,11 +13192,11 @@
       <w:pPr>
         <w:pStyle w:val="Heading2"/>
       </w:pPr>
-      <w:bookmarkStart w:id="36" w:name="_Toc198558797"/>
+      <w:bookmarkStart w:id="37" w:name="_Toc198558797"/>
       <w:r>
         <w:t>3.4. Примеры использования драйвера</w:t>
       </w:r>
-      <w:bookmarkEnd w:id="36"/>
+      <w:bookmarkEnd w:id="37"/>
     </w:p>
     <w:p>
       <w:r>
@@ -13310,11 +13217,11 @@
       <w:pPr>
         <w:pStyle w:val="Heading3"/>
       </w:pPr>
-      <w:bookmarkStart w:id="37" w:name="_Toc198558798"/>
+      <w:bookmarkStart w:id="38" w:name="_Toc198558798"/>
       <w:r>
         <w:t>3.4.1. Установление соединения и получение статуса:</w:t>
       </w:r>
-      <w:bookmarkEnd w:id="37"/>
+      <w:bookmarkEnd w:id="38"/>
     </w:p>
     <w:p>
       <w:pPr>
@@ -13395,11 +13302,19 @@
           <w:lang w:val="en-US"/>
         </w:rPr>
       </w:pPr>
-      <w:r>
-        <w:rPr>
-          <w:lang w:val="en-US"/>
-        </w:rPr>
-        <w:t xml:space="preserve">int </w:t>
+      <w:proofErr w:type="gramStart"/>
+      <w:r>
+        <w:rPr>
+          <w:lang w:val="en-US"/>
+        </w:rPr>
+        <w:t>int</w:t>
+      </w:r>
+      <w:proofErr w:type="gramEnd"/>
+      <w:r>
+        <w:rPr>
+          <w:lang w:val="en-US"/>
+        </w:rPr>
+        <w:t xml:space="preserve"> </w:t>
       </w:r>
       <w:r>
         <w:rPr>
@@ -13571,6 +13486,7 @@
         <w:t xml:space="preserve"> result = </w:t>
       </w:r>
       <w:proofErr w:type="spellStart"/>
+      <w:proofErr w:type="gramStart"/>
       <w:r>
         <w:rPr>
           <w:lang w:val="en-US"/>
@@ -13585,6 +13501,7 @@
         <w:t>(</w:t>
       </w:r>
       <w:proofErr w:type="spellStart"/>
+      <w:proofErr w:type="gramEnd"/>
       <w:r>
         <w:rPr>
           <w:lang w:val="en-US"/>
@@ -13632,6 +13549,7 @@
         </w:rPr>
         <w:t xml:space="preserve">    </w:t>
       </w:r>
+      <w:proofErr w:type="gramStart"/>
       <w:r>
         <w:rPr>
           <w:bCs/>
@@ -13639,6 +13557,7 @@
         </w:rPr>
         <w:t>if</w:t>
       </w:r>
+      <w:proofErr w:type="gramEnd"/>
       <w:r>
         <w:rPr>
           <w:lang w:val="en-US"/>
@@ -13656,13 +13575,27 @@
         <w:rPr>
           <w:lang w:val="en-US"/>
         </w:rPr>
-        <w:t xml:space="preserve">        std::</w:t>
+        <w:t xml:space="preserve">        </w:t>
       </w:r>
       <w:proofErr w:type="spellStart"/>
       <w:r>
         <w:rPr>
           <w:lang w:val="en-US"/>
         </w:rPr>
+        <w:t>std</w:t>
+      </w:r>
+      <w:proofErr w:type="spellEnd"/>
+      <w:r>
+        <w:rPr>
+          <w:lang w:val="en-US"/>
+        </w:rPr>
+        <w:t>::</w:t>
+      </w:r>
+      <w:proofErr w:type="spellStart"/>
+      <w:r>
+        <w:rPr>
+          <w:lang w:val="en-US"/>
+        </w:rPr>
         <w:t>cerr</w:t>
       </w:r>
       <w:proofErr w:type="spellEnd"/>
@@ -13688,13 +13621,27 @@
         <w:rPr>
           <w:lang w:val="en-US"/>
         </w:rPr>
-        <w:t>: " &lt;&lt; result &lt;&lt; std::</w:t>
+        <w:t xml:space="preserve">: " &lt;&lt; result &lt;&lt; </w:t>
       </w:r>
       <w:proofErr w:type="spellStart"/>
       <w:r>
         <w:rPr>
           <w:lang w:val="en-US"/>
         </w:rPr>
+        <w:t>std</w:t>
+      </w:r>
+      <w:proofErr w:type="spellEnd"/>
+      <w:r>
+        <w:rPr>
+          <w:lang w:val="en-US"/>
+        </w:rPr>
+        <w:t>::</w:t>
+      </w:r>
+      <w:proofErr w:type="spellStart"/>
+      <w:r>
+        <w:rPr>
+          <w:lang w:val="en-US"/>
+        </w:rPr>
         <w:t>endl</w:t>
       </w:r>
       <w:proofErr w:type="spellEnd"/>
@@ -13717,6 +13664,7 @@
         </w:rPr>
         <w:t xml:space="preserve">        </w:t>
       </w:r>
+      <w:proofErr w:type="gramStart"/>
       <w:r>
         <w:rPr>
           <w:bCs/>
@@ -13724,6 +13672,7 @@
         </w:rPr>
         <w:t>return</w:t>
       </w:r>
+      <w:proofErr w:type="gramEnd"/>
       <w:r>
         <w:rPr>
           <w:lang w:val="en-US"/>
@@ -13788,7 +13737,21 @@
         <w:rPr>
           <w:lang w:val="en-US"/>
         </w:rPr>
-        <w:t xml:space="preserve">    result = </w:t>
+        <w:t xml:space="preserve">    </w:t>
+      </w:r>
+      <w:proofErr w:type="gramStart"/>
+      <w:r>
+        <w:rPr>
+          <w:lang w:val="en-US"/>
+        </w:rPr>
+        <w:t>result</w:t>
+      </w:r>
+      <w:proofErr w:type="gramEnd"/>
+      <w:r>
+        <w:rPr>
+          <w:lang w:val="en-US"/>
+        </w:rPr>
+        <w:t xml:space="preserve"> = </w:t>
       </w:r>
       <w:proofErr w:type="spellStart"/>
       <w:r>
@@ -13824,6 +13787,7 @@
         </w:rPr>
         <w:t xml:space="preserve">    </w:t>
       </w:r>
+      <w:proofErr w:type="gramStart"/>
       <w:r>
         <w:rPr>
           <w:bCs/>
@@ -13831,6 +13795,7 @@
         </w:rPr>
         <w:t>if</w:t>
       </w:r>
+      <w:proofErr w:type="gramEnd"/>
       <w:r>
         <w:rPr>
           <w:lang w:val="en-US"/>
@@ -13843,8 +13808,16 @@
         <w:rPr>
           <w:lang w:val="en-US"/>
         </w:rPr>
-        <w:t xml:space="preserve">        std</w:t>
-      </w:r>
+        <w:t xml:space="preserve">        </w:t>
+      </w:r>
+      <w:proofErr w:type="spellStart"/>
+      <w:r>
+        <w:rPr>
+          <w:lang w:val="en-US"/>
+        </w:rPr>
+        <w:t>std</w:t>
+      </w:r>
+      <w:proofErr w:type="spellEnd"/>
       <w:r>
         <w:t>::</w:t>
       </w:r>
@@ -13886,12 +13859,14 @@
       <w:r>
         <w:t xml:space="preserve"> &lt;&lt; </w:t>
       </w:r>
+      <w:proofErr w:type="spellStart"/>
       <w:r>
         <w:rPr>
           <w:lang w:val="en-US"/>
         </w:rPr>
         <w:t>std</w:t>
       </w:r>
+      <w:proofErr w:type="spellEnd"/>
       <w:r>
         <w:t>::</w:t>
       </w:r>
@@ -13918,6 +13893,7 @@
         <w:t xml:space="preserve">        </w:t>
       </w:r>
       <w:proofErr w:type="spellStart"/>
+      <w:proofErr w:type="gramStart"/>
       <w:r>
         <w:rPr>
           <w:lang w:val="en-US"/>
@@ -13929,7 +13905,14 @@
         <w:rPr>
           <w:lang w:val="en-US"/>
         </w:rPr>
-        <w:t>();</w:t>
+        <w:t>(</w:t>
+      </w:r>
+      <w:proofErr w:type="gramEnd"/>
+      <w:r>
+        <w:rPr>
+          <w:lang w:val="en-US"/>
+        </w:rPr>
+        <w:t>);</w:t>
       </w:r>
     </w:p>
     <w:p>
@@ -13944,6 +13927,7 @@
         </w:rPr>
         <w:t xml:space="preserve">        </w:t>
       </w:r>
+      <w:proofErr w:type="gramStart"/>
       <w:r>
         <w:rPr>
           <w:bCs/>
@@ -13951,6 +13935,7 @@
         </w:rPr>
         <w:t>return</w:t>
       </w:r>
+      <w:proofErr w:type="gramEnd"/>
       <w:r>
         <w:rPr>
           <w:lang w:val="en-US"/>
@@ -13988,13 +13973,27 @@
         <w:rPr>
           <w:lang w:val="en-US"/>
         </w:rPr>
-        <w:t xml:space="preserve">    std::</w:t>
+        <w:t xml:space="preserve">    </w:t>
       </w:r>
       <w:proofErr w:type="spellStart"/>
       <w:r>
         <w:rPr>
           <w:lang w:val="en-US"/>
         </w:rPr>
+        <w:t>std</w:t>
+      </w:r>
+      <w:proofErr w:type="spellEnd"/>
+      <w:r>
+        <w:rPr>
+          <w:lang w:val="en-US"/>
+        </w:rPr>
+        <w:t>::</w:t>
+      </w:r>
+      <w:proofErr w:type="spellStart"/>
+      <w:r>
+        <w:rPr>
+          <w:lang w:val="en-US"/>
+        </w:rPr>
         <w:t>cout</w:t>
       </w:r>
       <w:proofErr w:type="spellEnd"/>
@@ -14020,13 +14019,27 @@
         <w:rPr>
           <w:lang w:val="en-US"/>
         </w:rPr>
-        <w:t>:" &lt;&lt; std::</w:t>
+        <w:t xml:space="preserve">:" &lt;&lt; </w:t>
       </w:r>
       <w:proofErr w:type="spellStart"/>
       <w:r>
         <w:rPr>
           <w:lang w:val="en-US"/>
         </w:rPr>
+        <w:t>std</w:t>
+      </w:r>
+      <w:proofErr w:type="spellEnd"/>
+      <w:r>
+        <w:rPr>
+          <w:lang w:val="en-US"/>
+        </w:rPr>
+        <w:t>::</w:t>
+      </w:r>
+      <w:proofErr w:type="spellStart"/>
+      <w:r>
+        <w:rPr>
+          <w:lang w:val="en-US"/>
+        </w:rPr>
         <w:t>endl</w:t>
       </w:r>
       <w:proofErr w:type="spellEnd"/>
@@ -14042,13 +14055,27 @@
         <w:rPr>
           <w:lang w:val="en-US"/>
         </w:rPr>
-        <w:t xml:space="preserve">    std::</w:t>
+        <w:t xml:space="preserve">    </w:t>
       </w:r>
       <w:proofErr w:type="spellStart"/>
       <w:r>
         <w:rPr>
           <w:lang w:val="en-US"/>
         </w:rPr>
+        <w:t>std</w:t>
+      </w:r>
+      <w:proofErr w:type="spellEnd"/>
+      <w:r>
+        <w:rPr>
+          <w:lang w:val="en-US"/>
+        </w:rPr>
+        <w:t>::</w:t>
+      </w:r>
+      <w:proofErr w:type="spellStart"/>
+      <w:r>
+        <w:rPr>
+          <w:lang w:val="en-US"/>
+        </w:rPr>
         <w:t>cout</w:t>
       </w:r>
       <w:proofErr w:type="spellEnd"/>
@@ -14056,11 +14083,19 @@
         <w:rPr>
           <w:lang w:val="en-US"/>
         </w:rPr>
-        <w:t xml:space="preserve"> &lt;&lt; "  </w:t>
+        <w:t xml:space="preserve"> &lt;&lt; </w:t>
+      </w:r>
+      <w:proofErr w:type="gramStart"/>
+      <w:r>
+        <w:rPr>
+          <w:lang w:val="en-US"/>
+        </w:rPr>
+        <w:t xml:space="preserve">"  </w:t>
       </w:r>
       <w:r>
         <w:t>Готов</w:t>
       </w:r>
+      <w:proofErr w:type="gramEnd"/>
       <w:r>
         <w:rPr>
           <w:lang w:val="en-US"/>
@@ -14103,11 +14138,19 @@
       <w:r>
         <w:t>Да</w:t>
       </w:r>
-      <w:r>
-        <w:rPr>
-          <w:lang w:val="en-US"/>
-        </w:rPr>
-        <w:t>" : "</w:t>
+      <w:proofErr w:type="gramStart"/>
+      <w:r>
+        <w:rPr>
+          <w:lang w:val="en-US"/>
+        </w:rPr>
+        <w:t>" :</w:t>
+      </w:r>
+      <w:proofErr w:type="gramEnd"/>
+      <w:r>
+        <w:rPr>
+          <w:lang w:val="en-US"/>
+        </w:rPr>
+        <w:t xml:space="preserve"> "</w:t>
       </w:r>
       <w:r>
         <w:t>Нет</w:t>
@@ -14116,13 +14159,27 @@
         <w:rPr>
           <w:lang w:val="en-US"/>
         </w:rPr>
-        <w:t>") &lt;&lt; std::</w:t>
+        <w:t xml:space="preserve">") &lt;&lt; </w:t>
       </w:r>
       <w:proofErr w:type="spellStart"/>
       <w:r>
         <w:rPr>
           <w:lang w:val="en-US"/>
         </w:rPr>
+        <w:t>std</w:t>
+      </w:r>
+      <w:proofErr w:type="spellEnd"/>
+      <w:r>
+        <w:rPr>
+          <w:lang w:val="en-US"/>
+        </w:rPr>
+        <w:t>::</w:t>
+      </w:r>
+      <w:proofErr w:type="spellStart"/>
+      <w:r>
+        <w:rPr>
+          <w:lang w:val="en-US"/>
+        </w:rPr>
         <w:t>endl</w:t>
       </w:r>
       <w:proofErr w:type="spellEnd"/>
@@ -14153,6 +14210,7 @@
         <w:t xml:space="preserve">    </w:t>
       </w:r>
       <w:proofErr w:type="spellStart"/>
+      <w:proofErr w:type="gramStart"/>
       <w:r>
         <w:rPr>
           <w:lang w:val="en-US"/>
@@ -14164,7 +14222,14 @@
         <w:rPr>
           <w:lang w:val="en-US"/>
         </w:rPr>
-        <w:t>();</w:t>
+        <w:t>(</w:t>
+      </w:r>
+      <w:proofErr w:type="gramEnd"/>
+      <w:r>
+        <w:rPr>
+          <w:lang w:val="en-US"/>
+        </w:rPr>
+        <w:t>);</w:t>
       </w:r>
     </w:p>
     <w:p>
@@ -14198,11 +14263,11 @@
       <w:pPr>
         <w:pStyle w:val="Heading2"/>
       </w:pPr>
-      <w:bookmarkStart w:id="38" w:name="_Toc198558799"/>
+      <w:bookmarkStart w:id="39" w:name="_Toc198558799"/>
       <w:r>
         <w:t>3.4.2. Загрузка карты и эмбоссирование символа:</w:t>
       </w:r>
-      <w:bookmarkEnd w:id="38"/>
+      <w:bookmarkEnd w:id="39"/>
     </w:p>
     <w:p>
       <w:r>
@@ -14224,6 +14289,7 @@
       <w:r>
         <w:t xml:space="preserve">    </w:t>
       </w:r>
+      <w:proofErr w:type="gramStart"/>
       <w:r>
         <w:rPr>
           <w:bCs/>
@@ -14231,6 +14297,7 @@
         </w:rPr>
         <w:t>if</w:t>
       </w:r>
+      <w:proofErr w:type="gramEnd"/>
       <w:r>
         <w:rPr>
           <w:lang w:val="en-US"/>
@@ -14248,13 +14315,27 @@
         <w:rPr>
           <w:lang w:val="en-US"/>
         </w:rPr>
-        <w:t xml:space="preserve">        std::</w:t>
+        <w:t xml:space="preserve">        </w:t>
       </w:r>
       <w:proofErr w:type="spellStart"/>
       <w:r>
         <w:rPr>
           <w:lang w:val="en-US"/>
         </w:rPr>
+        <w:t>std</w:t>
+      </w:r>
+      <w:proofErr w:type="spellEnd"/>
+      <w:r>
+        <w:rPr>
+          <w:lang w:val="en-US"/>
+        </w:rPr>
+        <w:t>::</w:t>
+      </w:r>
+      <w:proofErr w:type="spellStart"/>
+      <w:r>
+        <w:rPr>
+          <w:lang w:val="en-US"/>
+        </w:rPr>
         <w:t>cerr</w:t>
       </w:r>
       <w:proofErr w:type="spellEnd"/>
@@ -14289,13 +14370,27 @@
         <w:rPr>
           <w:lang w:val="en-US"/>
         </w:rPr>
-        <w:t>: " &lt;&lt; result &lt;&lt; std::</w:t>
+        <w:t xml:space="preserve">: " &lt;&lt; result &lt;&lt; </w:t>
       </w:r>
       <w:proofErr w:type="spellStart"/>
       <w:r>
         <w:rPr>
           <w:lang w:val="en-US"/>
         </w:rPr>
+        <w:t>std</w:t>
+      </w:r>
+      <w:proofErr w:type="spellEnd"/>
+      <w:r>
+        <w:rPr>
+          <w:lang w:val="en-US"/>
+        </w:rPr>
+        <w:t>::</w:t>
+      </w:r>
+      <w:proofErr w:type="spellStart"/>
+      <w:r>
+        <w:rPr>
+          <w:lang w:val="en-US"/>
+        </w:rPr>
         <w:t>endl</w:t>
       </w:r>
       <w:proofErr w:type="spellEnd"/>
@@ -14319,6 +14414,7 @@
         <w:t xml:space="preserve">        </w:t>
       </w:r>
       <w:proofErr w:type="spellStart"/>
+      <w:proofErr w:type="gramStart"/>
       <w:r>
         <w:rPr>
           <w:lang w:val="en-US"/>
@@ -14330,7 +14426,14 @@
         <w:rPr>
           <w:lang w:val="en-US"/>
         </w:rPr>
-        <w:t>();</w:t>
+        <w:t>(</w:t>
+      </w:r>
+      <w:proofErr w:type="gramEnd"/>
+      <w:r>
+        <w:rPr>
+          <w:lang w:val="en-US"/>
+        </w:rPr>
+        <w:t>);</w:t>
       </w:r>
     </w:p>
     <w:p>
@@ -14345,6 +14448,7 @@
         </w:rPr>
         <w:t xml:space="preserve">        </w:t>
       </w:r>
+      <w:proofErr w:type="gramStart"/>
       <w:r>
         <w:rPr>
           <w:bCs/>
@@ -14352,6 +14456,7 @@
         </w:rPr>
         <w:t>return</w:t>
       </w:r>
+      <w:proofErr w:type="gramEnd"/>
       <w:r>
         <w:rPr>
           <w:lang w:val="en-US"/>
@@ -14477,7 +14582,21 @@
         <w:rPr>
           <w:lang w:val="en-US"/>
         </w:rPr>
-        <w:t xml:space="preserve">    result = </w:t>
+        <w:t xml:space="preserve">    </w:t>
+      </w:r>
+      <w:proofErr w:type="gramStart"/>
+      <w:r>
+        <w:rPr>
+          <w:lang w:val="en-US"/>
+        </w:rPr>
+        <w:t>result</w:t>
+      </w:r>
+      <w:proofErr w:type="gramEnd"/>
+      <w:r>
+        <w:rPr>
+          <w:lang w:val="en-US"/>
+        </w:rPr>
+        <w:t xml:space="preserve"> = </w:t>
       </w:r>
       <w:proofErr w:type="spellStart"/>
       <w:r>
@@ -14506,6 +14625,7 @@
         </w:rPr>
         <w:t xml:space="preserve">    </w:t>
       </w:r>
+      <w:proofErr w:type="gramStart"/>
       <w:r>
         <w:rPr>
           <w:bCs/>
@@ -14513,6 +14633,7 @@
         </w:rPr>
         <w:t>if</w:t>
       </w:r>
+      <w:proofErr w:type="gramEnd"/>
       <w:r>
         <w:rPr>
           <w:lang w:val="en-US"/>
@@ -14530,13 +14651,27 @@
         <w:rPr>
           <w:lang w:val="en-US"/>
         </w:rPr>
-        <w:t xml:space="preserve">        std::</w:t>
+        <w:t xml:space="preserve">        </w:t>
       </w:r>
       <w:proofErr w:type="spellStart"/>
       <w:r>
         <w:rPr>
           <w:lang w:val="en-US"/>
         </w:rPr>
+        <w:t>std</w:t>
+      </w:r>
+      <w:proofErr w:type="spellEnd"/>
+      <w:r>
+        <w:rPr>
+          <w:lang w:val="en-US"/>
+        </w:rPr>
+        <w:t>::</w:t>
+      </w:r>
+      <w:proofErr w:type="spellStart"/>
+      <w:r>
+        <w:rPr>
+          <w:lang w:val="en-US"/>
+        </w:rPr>
         <w:t>cerr</w:t>
       </w:r>
       <w:proofErr w:type="spellEnd"/>
@@ -14562,7 +14697,21 @@
         <w:rPr>
           <w:lang w:val="en-US"/>
         </w:rPr>
-        <w:t>: " &lt;&lt; result &lt;&lt; std::</w:t>
+        <w:t xml:space="preserve">: " &lt;&lt; result &lt;&lt; </w:t>
+      </w:r>
+      <w:proofErr w:type="spellStart"/>
+      <w:r>
+        <w:rPr>
+          <w:lang w:val="en-US"/>
+        </w:rPr>
+        <w:t>std</w:t>
+      </w:r>
+      <w:proofErr w:type="spellEnd"/>
+      <w:r>
+        <w:rPr>
+          <w:lang w:val="en-US"/>
+        </w:rPr>
+        <w:t>::</w:t>
       </w:r>
       <w:proofErr w:type="spellStart"/>
       <w:r>
@@ -14593,6 +14742,7 @@
         <w:t xml:space="preserve">        </w:t>
       </w:r>
       <w:proofErr w:type="spellStart"/>
+      <w:proofErr w:type="gramStart"/>
       <w:r>
         <w:rPr>
           <w:lang w:val="en-US"/>
@@ -14604,7 +14754,14 @@
         <w:rPr>
           <w:lang w:val="en-US"/>
         </w:rPr>
-        <w:t>();</w:t>
+        <w:t>(</w:t>
+      </w:r>
+      <w:proofErr w:type="gramEnd"/>
+      <w:r>
+        <w:rPr>
+          <w:lang w:val="en-US"/>
+        </w:rPr>
+        <w:t>);</w:t>
       </w:r>
     </w:p>
     <w:p>
@@ -14620,6 +14777,7 @@
         <w:t xml:space="preserve">        </w:t>
       </w:r>
       <w:proofErr w:type="spellStart"/>
+      <w:proofErr w:type="gramStart"/>
       <w:r>
         <w:rPr>
           <w:lang w:val="en-US"/>
@@ -14631,7 +14789,14 @@
         <w:rPr>
           <w:lang w:val="en-US"/>
         </w:rPr>
-        <w:t>();</w:t>
+        <w:t>(</w:t>
+      </w:r>
+      <w:proofErr w:type="gramEnd"/>
+      <w:r>
+        <w:rPr>
+          <w:lang w:val="en-US"/>
+        </w:rPr>
+        <w:t>);</w:t>
       </w:r>
     </w:p>
     <w:p>
@@ -14646,6 +14811,7 @@
         </w:rPr>
         <w:t xml:space="preserve">        </w:t>
       </w:r>
+      <w:proofErr w:type="gramStart"/>
       <w:r>
         <w:rPr>
           <w:bCs/>
@@ -14653,6 +14819,7 @@
         </w:rPr>
         <w:t>return</w:t>
       </w:r>
+      <w:proofErr w:type="gramEnd"/>
       <w:r>
         <w:rPr>
           <w:lang w:val="en-US"/>
@@ -14694,11 +14861,11 @@
       <w:pPr>
         <w:pStyle w:val="Heading2"/>
       </w:pPr>
-      <w:bookmarkStart w:id="39" w:name="_Toc198558800"/>
+      <w:bookmarkStart w:id="40" w:name="_Toc198558800"/>
       <w:r>
         <w:t>3.5. Обработка ошибок</w:t>
       </w:r>
-      <w:bookmarkEnd w:id="39"/>
+      <w:bookmarkEnd w:id="40"/>
     </w:p>
     <w:p>
       <w:r>
@@ -14732,11 +14899,11 @@
       <w:pPr>
         <w:pStyle w:val="Heading2"/>
       </w:pPr>
-      <w:bookmarkStart w:id="40" w:name="_Toc198558801"/>
+      <w:bookmarkStart w:id="41" w:name="_Toc198558801"/>
       <w:r>
         <w:t>3.6. Заключение</w:t>
       </w:r>
-      <w:bookmarkEnd w:id="40"/>
+      <w:bookmarkEnd w:id="41"/>
     </w:p>
     <w:p>
       <w:r>
@@ -14757,11 +14924,11 @@
       <w:pPr>
         <w:pStyle w:val="Heading2"/>
       </w:pPr>
-      <w:bookmarkStart w:id="41" w:name="_Toc198558802"/>
+      <w:bookmarkStart w:id="42" w:name="_Toc198558802"/>
       <w:r>
         <w:t>3.1 Качественный анализ разработанного драйвера в тестовой среде</w:t>
       </w:r>
-      <w:bookmarkEnd w:id="41"/>
+      <w:bookmarkEnd w:id="42"/>
     </w:p>
     <w:p>
       <w:r>
@@ -14826,12 +14993,12 @@
           <w:numId w:val="4"/>
         </w:numPr>
       </w:pPr>
-      <w:bookmarkStart w:id="42" w:name="_Toc198558803"/>
+      <w:bookmarkStart w:id="43" w:name="_Toc198558803"/>
       <w:r>
         <w:lastRenderedPageBreak/>
         <w:t>Передача драйвера клиентам для тестирования</w:t>
       </w:r>
-      <w:bookmarkEnd w:id="42"/>
+      <w:bookmarkEnd w:id="43"/>
     </w:p>
     <w:p>
       <w:r>
@@ -14848,11 +15015,11 @@
       <w:pPr>
         <w:pStyle w:val="Heading3"/>
       </w:pPr>
-      <w:bookmarkStart w:id="43" w:name="_Toc198558804"/>
+      <w:bookmarkStart w:id="44" w:name="_Toc198558804"/>
       <w:r>
         <w:t>2.3.6. Дополнительные инструменты</w:t>
       </w:r>
-      <w:bookmarkEnd w:id="43"/>
+      <w:bookmarkEnd w:id="44"/>
     </w:p>
     <w:p>
       <w:r>
@@ -14869,14 +15036,14 @@
       <w:pPr>
         <w:pStyle w:val="Heading2"/>
       </w:pPr>
-      <w:bookmarkStart w:id="44" w:name="_Toc198558805"/>
+      <w:bookmarkStart w:id="45" w:name="_Toc198558805"/>
       <w:r>
         <w:t xml:space="preserve">2.1 </w:t>
       </w:r>
       <w:r>
         <w:t>Анализ имеющихся средств разработки драйверов</w:t>
       </w:r>
-      <w:bookmarkEnd w:id="44"/>
+      <w:bookmarkEnd w:id="45"/>
     </w:p>
     <w:p>
       <w:pPr>
@@ -15023,12 +15190,12 @@
       <w:pPr>
         <w:pStyle w:val="Heading2"/>
       </w:pPr>
-      <w:bookmarkStart w:id="45" w:name="_Toc198558806"/>
+      <w:bookmarkStart w:id="46" w:name="_Toc198558806"/>
       <w:r>
         <w:lastRenderedPageBreak/>
         <w:t>2.2 Разработка драйвера взаимодействия с эмбоссером</w:t>
       </w:r>
-      <w:bookmarkEnd w:id="45"/>
+      <w:bookmarkEnd w:id="46"/>
     </w:p>
     <w:p>
       <w:pPr>
@@ -15123,11 +15290,11 @@
       <w:pPr>
         <w:pStyle w:val="Heading2"/>
       </w:pPr>
-      <w:bookmarkStart w:id="46" w:name="_Toc198558807"/>
+      <w:bookmarkStart w:id="47" w:name="_Toc198558807"/>
       <w:r>
         <w:t>2.3 Подключение драйвера в приложение</w:t>
       </w:r>
-      <w:bookmarkEnd w:id="46"/>
+      <w:bookmarkEnd w:id="47"/>
     </w:p>
     <w:p>
       <w:r>
@@ -15266,12 +15433,12 @@
       <w:pPr>
         <w:pStyle w:val="Heading1"/>
       </w:pPr>
-      <w:bookmarkStart w:id="47" w:name="_Toc198558808"/>
+      <w:bookmarkStart w:id="48" w:name="_Toc198558808"/>
       <w:r>
         <w:lastRenderedPageBreak/>
         <w:t>Заключение</w:t>
       </w:r>
-      <w:bookmarkEnd w:id="47"/>
+      <w:bookmarkEnd w:id="48"/>
     </w:p>
     <w:p>
       <w:pPr>
@@ -15287,11 +15454,11 @@
       <w:pPr>
         <w:pStyle w:val="Heading1"/>
       </w:pPr>
-      <w:bookmarkStart w:id="48" w:name="_Toc198558809"/>
+      <w:bookmarkStart w:id="49" w:name="_Toc198558809"/>
       <w:r>
         <w:t>Список используемой литературы</w:t>
       </w:r>
-      <w:bookmarkEnd w:id="48"/>
+      <w:bookmarkEnd w:id="49"/>
     </w:p>
     <w:p>
       <w:pPr>
@@ -15307,11 +15474,11 @@
       <w:pPr>
         <w:pStyle w:val="Heading1"/>
       </w:pPr>
-      <w:bookmarkStart w:id="49" w:name="_Toc198558810"/>
+      <w:bookmarkStart w:id="50" w:name="_Toc198558810"/>
       <w:r>
         <w:t>Приложения</w:t>
       </w:r>
-      <w:bookmarkEnd w:id="49"/>
+      <w:bookmarkEnd w:id="50"/>
     </w:p>
     <w:p>
       <w:pPr>
@@ -15336,7 +15503,7 @@
 </file>
 
 <file path=word/endnotes.xml><?xml version="1.0" encoding="utf-8"?>
-<w:endnotes xmlns:wpc="http://schemas.microsoft.com/office/word/2010/wordprocessingCanvas" xmlns:cx="http://schemas.microsoft.com/office/drawing/2014/chartex" xmlns:cx1="http://schemas.microsoft.com/office/drawing/2015/9/8/chartex" xmlns:cx2="http://schemas.microsoft.com/office/drawing/2015/10/21/chartex" xmlns:cx3="http://schemas.microsoft.com/office/drawing/2016/5/9/chartex" xmlns:cx4="http://schemas.microsoft.com/office/drawing/2016/5/10/chartex" xmlns:cx5="http://schemas.microsoft.com/office/drawing/2016/5/11/chartex" xmlns:cx6="http://schemas.microsoft.com/office/drawing/2016/5/12/chartex" xmlns:cx7="http://schemas.microsoft.com/office/drawing/2016/5/13/chartex" xmlns:cx8="http://schemas.microsoft.com/office/drawing/2016/5/14/chartex" xmlns:mc="http://schemas.openxmlformats.org/markup-compatibility/2006" xmlns:aink="http://schemas.microsoft.com/office/drawing/2016/ink" xmlns:am3d="http://schemas.microsoft.com/office/drawing/2017/model3d" xmlns:o="urn:schemas-microsoft-com:office:office" xmlns:oel="http://schemas.microsoft.com/office/2019/extlst" xmlns:r="http://schemas.openxmlformats.org/officeDocument/2006/relationships" xmlns:m="http://schemas.openxmlformats.org/officeDocument/2006/math" xmlns:v="urn:schemas-microsoft-com:vml" xmlns:wp14="http://schemas.microsoft.com/office/word/2010/wordprocessingDrawing" xmlns:wp="http://schemas.openxmlformats.org/drawingml/2006/wordprocessingDrawing" xmlns:w10="urn:schemas-microsoft-com:office:word" xmlns:w="http://schemas.openxmlformats.org/wordprocessingml/2006/main" xmlns:w14="http://schemas.microsoft.com/office/word/2010/wordml" xmlns:w15="http://schemas.microsoft.com/office/word/2012/wordml" xmlns:w16cex="http://schemas.microsoft.com/office/word/2018/wordml/cex" xmlns:w16cid="http://schemas.microsoft.com/office/word/2016/wordml/cid" xmlns:w16="http://schemas.microsoft.com/office/word/2018/wordml" xmlns:w16du="http://schemas.microsoft.com/office/word/2023/wordml/word16du" xmlns:w16sdtdh="http://schemas.microsoft.com/office/word/2020/wordml/sdtdatahash" xmlns:w16sdtfl="http://schemas.microsoft.com/office/word/2024/wordml/sdtformatlock" xmlns:w16se="http://schemas.microsoft.com/office/word/2015/wordml/symex" xmlns:wpg="http://schemas.microsoft.com/office/word/2010/wordprocessingGroup" xmlns:wpi="http://schemas.microsoft.com/office/word/2010/wordprocessingInk" xmlns:wne="http://schemas.microsoft.com/office/word/2006/wordml" xmlns:wps="http://schemas.microsoft.com/office/word/2010/wordprocessingShape" mc:Ignorable="w14 w15 w16se w16cid w16 w16cex w16sdtdh w16sdtfl w16du wp14">
+<w:endnotes xmlns:wpc="http://schemas.microsoft.com/office/word/2010/wordprocessingCanvas" xmlns:cx="http://schemas.microsoft.com/office/drawing/2014/chartex" xmlns:cx1="http://schemas.microsoft.com/office/drawing/2015/9/8/chartex" xmlns:mc="http://schemas.openxmlformats.org/markup-compatibility/2006" xmlns:o="urn:schemas-microsoft-com:office:office" xmlns:r="http://schemas.openxmlformats.org/officeDocument/2006/relationships" xmlns:m="http://schemas.openxmlformats.org/officeDocument/2006/math" xmlns:v="urn:schemas-microsoft-com:vml" xmlns:wp14="http://schemas.microsoft.com/office/word/2010/wordprocessingDrawing" xmlns:wp="http://schemas.openxmlformats.org/drawingml/2006/wordprocessingDrawing" xmlns:w10="urn:schemas-microsoft-com:office:word" xmlns:w="http://schemas.openxmlformats.org/wordprocessingml/2006/main" xmlns:w14="http://schemas.microsoft.com/office/word/2010/wordml" xmlns:w15="http://schemas.microsoft.com/office/word/2012/wordml" xmlns:w16se="http://schemas.microsoft.com/office/word/2015/wordml/symex" xmlns:wpg="http://schemas.microsoft.com/office/word/2010/wordprocessingGroup" xmlns:wpi="http://schemas.microsoft.com/office/word/2010/wordprocessingInk" xmlns:wne="http://schemas.microsoft.com/office/word/2006/wordml" xmlns:wps="http://schemas.microsoft.com/office/word/2010/wordprocessingShape" mc:Ignorable="w14 w15 w16se wp14">
   <w:endnote w:type="separator" w:id="-1">
     <w:p>
       <w:pPr>
@@ -15361,7 +15528,7 @@
 </file>
 
 <file path=word/footer1.xml><?xml version="1.0" encoding="utf-8"?>
-<w:ftr xmlns:wpc="http://schemas.microsoft.com/office/word/2010/wordprocessingCanvas" xmlns:cx="http://schemas.microsoft.com/office/drawing/2014/chartex" xmlns:cx1="http://schemas.microsoft.com/office/drawing/2015/9/8/chartex" xmlns:cx2="http://schemas.microsoft.com/office/drawing/2015/10/21/chartex" xmlns:cx3="http://schemas.microsoft.com/office/drawing/2016/5/9/chartex" xmlns:cx4="http://schemas.microsoft.com/office/drawing/2016/5/10/chartex" xmlns:cx5="http://schemas.microsoft.com/office/drawing/2016/5/11/chartex" xmlns:cx6="http://schemas.microsoft.com/office/drawing/2016/5/12/chartex" xmlns:cx7="http://schemas.microsoft.com/office/drawing/2016/5/13/chartex" xmlns:cx8="http://schemas.microsoft.com/office/drawing/2016/5/14/chartex" xmlns:mc="http://schemas.openxmlformats.org/markup-compatibility/2006" xmlns:aink="http://schemas.microsoft.com/office/drawing/2016/ink" xmlns:am3d="http://schemas.microsoft.com/office/drawing/2017/model3d" xmlns:o="urn:schemas-microsoft-com:office:office" xmlns:oel="http://schemas.microsoft.com/office/2019/extlst" xmlns:r="http://schemas.openxmlformats.org/officeDocument/2006/relationships" xmlns:m="http://schemas.openxmlformats.org/officeDocument/2006/math" xmlns:v="urn:schemas-microsoft-com:vml" xmlns:wp14="http://schemas.microsoft.com/office/word/2010/wordprocessingDrawing" xmlns:wp="http://schemas.openxmlformats.org/drawingml/2006/wordprocessingDrawing" xmlns:w10="urn:schemas-microsoft-com:office:word" xmlns:w="http://schemas.openxmlformats.org/wordprocessingml/2006/main" xmlns:w14="http://schemas.microsoft.com/office/word/2010/wordml" xmlns:w15="http://schemas.microsoft.com/office/word/2012/wordml" xmlns:w16cex="http://schemas.microsoft.com/office/word/2018/wordml/cex" xmlns:w16cid="http://schemas.microsoft.com/office/word/2016/wordml/cid" xmlns:w16="http://schemas.microsoft.com/office/word/2018/wordml" xmlns:w16du="http://schemas.microsoft.com/office/word/2023/wordml/word16du" xmlns:w16sdtdh="http://schemas.microsoft.com/office/word/2020/wordml/sdtdatahash" xmlns:w16sdtfl="http://schemas.microsoft.com/office/word/2024/wordml/sdtformatlock" xmlns:w16se="http://schemas.microsoft.com/office/word/2015/wordml/symex" xmlns:wpg="http://schemas.microsoft.com/office/word/2010/wordprocessingGroup" xmlns:wpi="http://schemas.microsoft.com/office/word/2010/wordprocessingInk" xmlns:wne="http://schemas.microsoft.com/office/word/2006/wordml" xmlns:wps="http://schemas.microsoft.com/office/word/2010/wordprocessingShape" mc:Ignorable="w14 w15 w16se w16cid w16 w16cex w16sdtdh w16sdtfl w16du wp14">
+<w:ftr xmlns:wpc="http://schemas.microsoft.com/office/word/2010/wordprocessingCanvas" xmlns:cx="http://schemas.microsoft.com/office/drawing/2014/chartex" xmlns:cx1="http://schemas.microsoft.com/office/drawing/2015/9/8/chartex" xmlns:mc="http://schemas.openxmlformats.org/markup-compatibility/2006" xmlns:o="urn:schemas-microsoft-com:office:office" xmlns:r="http://schemas.openxmlformats.org/officeDocument/2006/relationships" xmlns:m="http://schemas.openxmlformats.org/officeDocument/2006/math" xmlns:v="urn:schemas-microsoft-com:vml" xmlns:wp14="http://schemas.microsoft.com/office/word/2010/wordprocessingDrawing" xmlns:wp="http://schemas.openxmlformats.org/drawingml/2006/wordprocessingDrawing" xmlns:w10="urn:schemas-microsoft-com:office:word" xmlns:w="http://schemas.openxmlformats.org/wordprocessingml/2006/main" xmlns:w14="http://schemas.microsoft.com/office/word/2010/wordml" xmlns:w15="http://schemas.microsoft.com/office/word/2012/wordml" xmlns:w16se="http://schemas.microsoft.com/office/word/2015/wordml/symex" xmlns:wpg="http://schemas.microsoft.com/office/word/2010/wordprocessingGroup" xmlns:wpi="http://schemas.microsoft.com/office/word/2010/wordprocessingInk" xmlns:wne="http://schemas.microsoft.com/office/word/2006/wordml" xmlns:wps="http://schemas.microsoft.com/office/word/2010/wordprocessingShape" mc:Ignorable="w14 w15 w16se wp14">
   <w:sdt>
     <w:sdtPr>
       <w:id w:val="-384414388"/>
@@ -15389,7 +15556,7 @@
           <w:rPr>
             <w:noProof/>
           </w:rPr>
-          <w:t>13</w:t>
+          <w:t>26</w:t>
         </w:r>
         <w:r>
           <w:fldChar w:fldCharType="end"/>
@@ -15406,7 +15573,7 @@
 </file>
 
 <file path=word/footnotes.xml><?xml version="1.0" encoding="utf-8"?>
-<w:footnotes xmlns:wpc="http://schemas.microsoft.com/office/word/2010/wordprocessingCanvas" xmlns:cx="http://schemas.microsoft.com/office/drawing/2014/chartex" xmlns:cx1="http://schemas.microsoft.com/office/drawing/2015/9/8/chartex" xmlns:cx2="http://schemas.microsoft.com/office/drawing/2015/10/21/chartex" xmlns:cx3="http://schemas.microsoft.com/office/drawing/2016/5/9/chartex" xmlns:cx4="http://schemas.microsoft.com/office/drawing/2016/5/10/chartex" xmlns:cx5="http://schemas.microsoft.com/office/drawing/2016/5/11/chartex" xmlns:cx6="http://schemas.microsoft.com/office/drawing/2016/5/12/chartex" xmlns:cx7="http://schemas.microsoft.com/office/drawing/2016/5/13/chartex" xmlns:cx8="http://schemas.microsoft.com/office/drawing/2016/5/14/chartex" xmlns:mc="http://schemas.openxmlformats.org/markup-compatibility/2006" xmlns:aink="http://schemas.microsoft.com/office/drawing/2016/ink" xmlns:am3d="http://schemas.microsoft.com/office/drawing/2017/model3d" xmlns:o="urn:schemas-microsoft-com:office:office" xmlns:oel="http://schemas.microsoft.com/office/2019/extlst" xmlns:r="http://schemas.openxmlformats.org/officeDocument/2006/relationships" xmlns:m="http://schemas.openxmlformats.org/officeDocument/2006/math" xmlns:v="urn:schemas-microsoft-com:vml" xmlns:wp14="http://schemas.microsoft.com/office/word/2010/wordprocessingDrawing" xmlns:wp="http://schemas.openxmlformats.org/drawingml/2006/wordprocessingDrawing" xmlns:w10="urn:schemas-microsoft-com:office:word" xmlns:w="http://schemas.openxmlformats.org/wordprocessingml/2006/main" xmlns:w14="http://schemas.microsoft.com/office/word/2010/wordml" xmlns:w15="http://schemas.microsoft.com/office/word/2012/wordml" xmlns:w16cex="http://schemas.microsoft.com/office/word/2018/wordml/cex" xmlns:w16cid="http://schemas.microsoft.com/office/word/2016/wordml/cid" xmlns:w16="http://schemas.microsoft.com/office/word/2018/wordml" xmlns:w16du="http://schemas.microsoft.com/office/word/2023/wordml/word16du" xmlns:w16sdtdh="http://schemas.microsoft.com/office/word/2020/wordml/sdtdatahash" xmlns:w16sdtfl="http://schemas.microsoft.com/office/word/2024/wordml/sdtformatlock" xmlns:w16se="http://schemas.microsoft.com/office/word/2015/wordml/symex" xmlns:wpg="http://schemas.microsoft.com/office/word/2010/wordprocessingGroup" xmlns:wpi="http://schemas.microsoft.com/office/word/2010/wordprocessingInk" xmlns:wne="http://schemas.microsoft.com/office/word/2006/wordml" xmlns:wps="http://schemas.microsoft.com/office/word/2010/wordprocessingShape" mc:Ignorable="w14 w15 w16se w16cid w16 w16cex w16sdtdh w16sdtfl w16du wp14">
+<w:footnotes xmlns:wpc="http://schemas.microsoft.com/office/word/2010/wordprocessingCanvas" xmlns:cx="http://schemas.microsoft.com/office/drawing/2014/chartex" xmlns:cx1="http://schemas.microsoft.com/office/drawing/2015/9/8/chartex" xmlns:mc="http://schemas.openxmlformats.org/markup-compatibility/2006" xmlns:o="urn:schemas-microsoft-com:office:office" xmlns:r="http://schemas.openxmlformats.org/officeDocument/2006/relationships" xmlns:m="http://schemas.openxmlformats.org/officeDocument/2006/math" xmlns:v="urn:schemas-microsoft-com:vml" xmlns:wp14="http://schemas.microsoft.com/office/word/2010/wordprocessingDrawing" xmlns:wp="http://schemas.openxmlformats.org/drawingml/2006/wordprocessingDrawing" xmlns:w10="urn:schemas-microsoft-com:office:word" xmlns:w="http://schemas.openxmlformats.org/wordprocessingml/2006/main" xmlns:w14="http://schemas.microsoft.com/office/word/2010/wordml" xmlns:w15="http://schemas.microsoft.com/office/word/2012/wordml" xmlns:w16se="http://schemas.microsoft.com/office/word/2015/wordml/symex" xmlns:wpg="http://schemas.microsoft.com/office/word/2010/wordprocessingGroup" xmlns:wpi="http://schemas.microsoft.com/office/word/2010/wordprocessingInk" xmlns:wne="http://schemas.microsoft.com/office/word/2006/wordml" xmlns:wps="http://schemas.microsoft.com/office/word/2010/wordprocessingShape" mc:Ignorable="w14 w15 w16se wp14">
   <w:footnote w:type="separator" w:id="-1">
     <w:p>
       <w:pPr>
@@ -15431,7 +15598,7 @@
 </file>
 
 <file path=word/numbering.xml><?xml version="1.0" encoding="utf-8"?>
-<w:numbering xmlns:wpc="http://schemas.microsoft.com/office/word/2010/wordprocessingCanvas" xmlns:cx="http://schemas.microsoft.com/office/drawing/2014/chartex" xmlns:cx1="http://schemas.microsoft.com/office/drawing/2015/9/8/chartex" xmlns:cx2="http://schemas.microsoft.com/office/drawing/2015/10/21/chartex" xmlns:cx3="http://schemas.microsoft.com/office/drawing/2016/5/9/chartex" xmlns:cx4="http://schemas.microsoft.com/office/drawing/2016/5/10/chartex" xmlns:cx5="http://schemas.microsoft.com/office/drawing/2016/5/11/chartex" xmlns:cx6="http://schemas.microsoft.com/office/drawing/2016/5/12/chartex" xmlns:cx7="http://schemas.microsoft.com/office/drawing/2016/5/13/chartex" xmlns:cx8="http://schemas.microsoft.com/office/drawing/2016/5/14/chartex" xmlns:mc="http://schemas.openxmlformats.org/markup-compatibility/2006" xmlns:aink="http://schemas.microsoft.com/office/drawing/2016/ink" xmlns:am3d="http://schemas.microsoft.com/office/drawing/2017/model3d" xmlns:o="urn:schemas-microsoft-com:office:office" xmlns:oel="http://schemas.microsoft.com/office/2019/extlst" xmlns:r="http://schemas.openxmlformats.org/officeDocument/2006/relationships" xmlns:m="http://schemas.openxmlformats.org/officeDocument/2006/math" xmlns:v="urn:schemas-microsoft-com:vml" xmlns:wp14="http://schemas.microsoft.com/office/word/2010/wordprocessingDrawing" xmlns:wp="http://schemas.openxmlformats.org/drawingml/2006/wordprocessingDrawing" xmlns:w10="urn:schemas-microsoft-com:office:word" xmlns:w="http://schemas.openxmlformats.org/wordprocessingml/2006/main" xmlns:w14="http://schemas.microsoft.com/office/word/2010/wordml" xmlns:w15="http://schemas.microsoft.com/office/word/2012/wordml" xmlns:w16cex="http://schemas.microsoft.com/office/word/2018/wordml/cex" xmlns:w16cid="http://schemas.microsoft.com/office/word/2016/wordml/cid" xmlns:w16="http://schemas.microsoft.com/office/word/2018/wordml" xmlns:w16du="http://schemas.microsoft.com/office/word/2023/wordml/word16du" xmlns:w16sdtdh="http://schemas.microsoft.com/office/word/2020/wordml/sdtdatahash" xmlns:w16sdtfl="http://schemas.microsoft.com/office/word/2024/wordml/sdtformatlock" xmlns:w16se="http://schemas.microsoft.com/office/word/2015/wordml/symex" xmlns:wpg="http://schemas.microsoft.com/office/word/2010/wordprocessingGroup" xmlns:wpi="http://schemas.microsoft.com/office/word/2010/wordprocessingInk" xmlns:wne="http://schemas.microsoft.com/office/word/2006/wordml" xmlns:wps="http://schemas.microsoft.com/office/word/2010/wordprocessingShape" mc:Ignorable="w14 w15 w16se w16cid w16 w16cex w16sdtdh w16sdtfl w16du wp14">
+<w:numbering xmlns:wpc="http://schemas.microsoft.com/office/word/2010/wordprocessingCanvas" xmlns:cx="http://schemas.microsoft.com/office/drawing/2014/chartex" xmlns:cx1="http://schemas.microsoft.com/office/drawing/2015/9/8/chartex" xmlns:mc="http://schemas.openxmlformats.org/markup-compatibility/2006" xmlns:o="urn:schemas-microsoft-com:office:office" xmlns:r="http://schemas.openxmlformats.org/officeDocument/2006/relationships" xmlns:m="http://schemas.openxmlformats.org/officeDocument/2006/math" xmlns:v="urn:schemas-microsoft-com:vml" xmlns:wp14="http://schemas.microsoft.com/office/word/2010/wordprocessingDrawing" xmlns:wp="http://schemas.openxmlformats.org/drawingml/2006/wordprocessingDrawing" xmlns:w10="urn:schemas-microsoft-com:office:word" xmlns:w="http://schemas.openxmlformats.org/wordprocessingml/2006/main" xmlns:w14="http://schemas.microsoft.com/office/word/2010/wordml" xmlns:w15="http://schemas.microsoft.com/office/word/2012/wordml" xmlns:w16se="http://schemas.microsoft.com/office/word/2015/wordml/symex" xmlns:wpg="http://schemas.microsoft.com/office/word/2010/wordprocessingGroup" xmlns:wpi="http://schemas.microsoft.com/office/word/2010/wordprocessingInk" xmlns:wne="http://schemas.microsoft.com/office/word/2006/wordml" xmlns:wps="http://schemas.microsoft.com/office/word/2010/wordprocessingShape" mc:Ignorable="w14 w15 w16se wp14">
   <w:abstractNum w:abstractNumId="0" w15:restartNumberingAfterBreak="0">
     <w:nsid w:val="07B7395C"/>
     <w:multiLevelType w:val="hybridMultilevel"/>
@@ -18336,73 +18503,73 @@
       </w:rPr>
     </w:lvl>
   </w:abstractNum>
-  <w:num w:numId="1" w16cid:durableId="2037585064">
+  <w:num w:numId="1">
     <w:abstractNumId w:val="17"/>
   </w:num>
-  <w:num w:numId="2" w16cid:durableId="1333948679">
+  <w:num w:numId="2">
     <w:abstractNumId w:val="7"/>
   </w:num>
-  <w:num w:numId="3" w16cid:durableId="751857597">
+  <w:num w:numId="3">
     <w:abstractNumId w:val="12"/>
   </w:num>
-  <w:num w:numId="4" w16cid:durableId="2080013720">
+  <w:num w:numId="4">
     <w:abstractNumId w:val="10"/>
   </w:num>
-  <w:num w:numId="5" w16cid:durableId="1313094920">
+  <w:num w:numId="5">
     <w:abstractNumId w:val="11"/>
   </w:num>
-  <w:num w:numId="6" w16cid:durableId="1689527742">
+  <w:num w:numId="6">
     <w:abstractNumId w:val="20"/>
   </w:num>
-  <w:num w:numId="7" w16cid:durableId="285622589">
+  <w:num w:numId="7">
     <w:abstractNumId w:val="2"/>
   </w:num>
-  <w:num w:numId="8" w16cid:durableId="628822219">
+  <w:num w:numId="8">
     <w:abstractNumId w:val="8"/>
   </w:num>
-  <w:num w:numId="9" w16cid:durableId="1227840197">
+  <w:num w:numId="9">
     <w:abstractNumId w:val="6"/>
   </w:num>
-  <w:num w:numId="10" w16cid:durableId="2069330590">
+  <w:num w:numId="10">
     <w:abstractNumId w:val="0"/>
   </w:num>
-  <w:num w:numId="11" w16cid:durableId="787548495">
+  <w:num w:numId="11">
     <w:abstractNumId w:val="9"/>
   </w:num>
-  <w:num w:numId="12" w16cid:durableId="1736471717">
+  <w:num w:numId="12">
     <w:abstractNumId w:val="16"/>
   </w:num>
-  <w:num w:numId="13" w16cid:durableId="1042483398">
+  <w:num w:numId="13">
     <w:abstractNumId w:val="5"/>
   </w:num>
-  <w:num w:numId="14" w16cid:durableId="735206222">
+  <w:num w:numId="14">
     <w:abstractNumId w:val="3"/>
   </w:num>
-  <w:num w:numId="15" w16cid:durableId="709844938">
+  <w:num w:numId="15">
     <w:abstractNumId w:val="15"/>
   </w:num>
-  <w:num w:numId="16" w16cid:durableId="2127656173">
+  <w:num w:numId="16">
     <w:abstractNumId w:val="22"/>
   </w:num>
-  <w:num w:numId="17" w16cid:durableId="600258774">
+  <w:num w:numId="17">
     <w:abstractNumId w:val="1"/>
   </w:num>
-  <w:num w:numId="18" w16cid:durableId="199975936">
+  <w:num w:numId="18">
     <w:abstractNumId w:val="14"/>
   </w:num>
-  <w:num w:numId="19" w16cid:durableId="1695224626">
+  <w:num w:numId="19">
     <w:abstractNumId w:val="18"/>
   </w:num>
-  <w:num w:numId="20" w16cid:durableId="321008220">
+  <w:num w:numId="20">
     <w:abstractNumId w:val="13"/>
   </w:num>
-  <w:num w:numId="21" w16cid:durableId="662201108">
+  <w:num w:numId="21">
     <w:abstractNumId w:val="19"/>
   </w:num>
-  <w:num w:numId="22" w16cid:durableId="1307011346">
+  <w:num w:numId="22">
     <w:abstractNumId w:val="21"/>
   </w:num>
-  <w:num w:numId="23" w16cid:durableId="1411267234">
+  <w:num w:numId="23">
     <w:abstractNumId w:val="4"/>
   </w:num>
   <w:numIdMacAtCleanup w:val="20"/>
@@ -18410,7 +18577,7 @@
 </file>
 
 <file path=word/styles.xml><?xml version="1.0" encoding="utf-8"?>
-<w:styles xmlns:mc="http://schemas.openxmlformats.org/markup-compatibility/2006" xmlns:r="http://schemas.openxmlformats.org/officeDocument/2006/relationships" xmlns:w="http://schemas.openxmlformats.org/wordprocessingml/2006/main" xmlns:w14="http://schemas.microsoft.com/office/word/2010/wordml" xmlns:w15="http://schemas.microsoft.com/office/word/2012/wordml" xmlns:w16cex="http://schemas.microsoft.com/office/word/2018/wordml/cex" xmlns:w16cid="http://schemas.microsoft.com/office/word/2016/wordml/cid" xmlns:w16="http://schemas.microsoft.com/office/word/2018/wordml" xmlns:w16du="http://schemas.microsoft.com/office/word/2023/wordml/word16du" xmlns:w16sdtdh="http://schemas.microsoft.com/office/word/2020/wordml/sdtdatahash" xmlns:w16sdtfl="http://schemas.microsoft.com/office/word/2024/wordml/sdtformatlock" xmlns:w16se="http://schemas.microsoft.com/office/word/2015/wordml/symex" mc:Ignorable="w14 w15 w16se w16cid w16 w16cex w16sdtdh w16sdtfl w16du">
+<w:styles xmlns:mc="http://schemas.openxmlformats.org/markup-compatibility/2006" xmlns:r="http://schemas.openxmlformats.org/officeDocument/2006/relationships" xmlns:w="http://schemas.openxmlformats.org/wordprocessingml/2006/main" xmlns:w14="http://schemas.microsoft.com/office/word/2010/wordml" xmlns:w15="http://schemas.microsoft.com/office/word/2012/wordml" xmlns:w16se="http://schemas.microsoft.com/office/word/2015/wordml/symex" mc:Ignorable="w14 w15 w16se">
   <w:docDefaults>
     <w:rPrDefault>
       <w:rPr>
@@ -18426,7 +18593,7 @@
       </w:pPr>
     </w:pPrDefault>
   </w:docDefaults>
-  <w:latentStyles w:defLockedState="0" w:defUIPriority="99" w:defSemiHidden="0" w:defUnhideWhenUsed="0" w:defQFormat="0" w:count="376">
+  <w:latentStyles w:defLockedState="0" w:defUIPriority="99" w:defSemiHidden="0" w:defUnhideWhenUsed="0" w:defQFormat="0" w:count="371">
     <w:lsdException w:name="Normal" w:uiPriority="0" w:qFormat="1"/>
     <w:lsdException w:name="heading 1" w:uiPriority="9" w:qFormat="1"/>
     <w:lsdException w:name="heading 2" w:semiHidden="1" w:uiPriority="9" w:unhideWhenUsed="1" w:qFormat="1"/>
@@ -18798,11 +18965,6 @@
     <w:lsdException w:name="List Table 5 Dark Accent 6" w:uiPriority="50"/>
     <w:lsdException w:name="List Table 6 Colorful Accent 6" w:uiPriority="51"/>
     <w:lsdException w:name="List Table 7 Colorful Accent 6" w:uiPriority="52"/>
-    <w:lsdException w:name="Mention" w:semiHidden="1" w:unhideWhenUsed="1"/>
-    <w:lsdException w:name="Smart Hyperlink" w:semiHidden="1" w:unhideWhenUsed="1"/>
-    <w:lsdException w:name="Hashtag" w:semiHidden="1" w:unhideWhenUsed="1"/>
-    <w:lsdException w:name="Unresolved Mention" w:semiHidden="1" w:unhideWhenUsed="1"/>
-    <w:lsdException w:name="Smart Link" w:semiHidden="1" w:unhideWhenUsed="1"/>
   </w:latentStyles>
   <w:style w:type="paragraph" w:default="1" w:styleId="Normal">
     <w:name w:val="Normal"/>
@@ -19369,7 +19531,7 @@
 </file>
 
 <file path=customXml/itemProps1.xml><?xml version="1.0" encoding="utf-8"?>
-<ds:datastoreItem xmlns:ds="http://schemas.openxmlformats.org/officeDocument/2006/customXml" ds:itemID="{585F5806-A952-4E63-AC6D-0D58798C81A5}">
+<ds:datastoreItem xmlns:ds="http://schemas.openxmlformats.org/officeDocument/2006/customXml" ds:itemID="{E03F217B-5105-4792-AD88-54D54ECC53C4}">
   <ds:schemaRefs>
     <ds:schemaRef ds:uri="http://schemas.openxmlformats.org/officeDocument/2006/bibliography"/>
   </ds:schemaRefs>

</xml_diff>

<commit_message>
More work on 3d chapter.
</commit_message>
<xml_diff>
--- a/Diplom_Main.docx
+++ b/Diplom_Main.docx
@@ -1,6 +1,6 @@
 
 <file path=word/document.xml><?xml version="1.0" encoding="utf-8"?>
-<w:document xmlns:wpc="http://schemas.microsoft.com/office/word/2010/wordprocessingCanvas" xmlns:cx="http://schemas.microsoft.com/office/drawing/2014/chartex" xmlns:cx1="http://schemas.microsoft.com/office/drawing/2015/9/8/chartex" xmlns:mc="http://schemas.openxmlformats.org/markup-compatibility/2006" xmlns:o="urn:schemas-microsoft-com:office:office" xmlns:r="http://schemas.openxmlformats.org/officeDocument/2006/relationships" xmlns:m="http://schemas.openxmlformats.org/officeDocument/2006/math" xmlns:v="urn:schemas-microsoft-com:vml" xmlns:wp14="http://schemas.microsoft.com/office/word/2010/wordprocessingDrawing" xmlns:wp="http://schemas.openxmlformats.org/drawingml/2006/wordprocessingDrawing" xmlns:w10="urn:schemas-microsoft-com:office:word" xmlns:w="http://schemas.openxmlformats.org/wordprocessingml/2006/main" xmlns:w14="http://schemas.microsoft.com/office/word/2010/wordml" xmlns:w15="http://schemas.microsoft.com/office/word/2012/wordml" xmlns:w16se="http://schemas.microsoft.com/office/word/2015/wordml/symex" xmlns:wpg="http://schemas.microsoft.com/office/word/2010/wordprocessingGroup" xmlns:wpi="http://schemas.microsoft.com/office/word/2010/wordprocessingInk" xmlns:wne="http://schemas.microsoft.com/office/word/2006/wordml" xmlns:wps="http://schemas.microsoft.com/office/word/2010/wordprocessingShape" mc:Ignorable="w14 w15 w16se wp14">
+<w:document xmlns:wpc="http://schemas.microsoft.com/office/word/2010/wordprocessingCanvas" xmlns:cx="http://schemas.microsoft.com/office/drawing/2014/chartex" xmlns:cx1="http://schemas.microsoft.com/office/drawing/2015/9/8/chartex" xmlns:cx2="http://schemas.microsoft.com/office/drawing/2015/10/21/chartex" xmlns:cx3="http://schemas.microsoft.com/office/drawing/2016/5/9/chartex" xmlns:cx4="http://schemas.microsoft.com/office/drawing/2016/5/10/chartex" xmlns:cx5="http://schemas.microsoft.com/office/drawing/2016/5/11/chartex" xmlns:cx6="http://schemas.microsoft.com/office/drawing/2016/5/12/chartex" xmlns:cx7="http://schemas.microsoft.com/office/drawing/2016/5/13/chartex" xmlns:cx8="http://schemas.microsoft.com/office/drawing/2016/5/14/chartex" xmlns:mc="http://schemas.openxmlformats.org/markup-compatibility/2006" xmlns:aink="http://schemas.microsoft.com/office/drawing/2016/ink" xmlns:am3d="http://schemas.microsoft.com/office/drawing/2017/model3d" xmlns:o="urn:schemas-microsoft-com:office:office" xmlns:oel="http://schemas.microsoft.com/office/2019/extlst" xmlns:r="http://schemas.openxmlformats.org/officeDocument/2006/relationships" xmlns:m="http://schemas.openxmlformats.org/officeDocument/2006/math" xmlns:v="urn:schemas-microsoft-com:vml" xmlns:wp14="http://schemas.microsoft.com/office/word/2010/wordprocessingDrawing" xmlns:wp="http://schemas.openxmlformats.org/drawingml/2006/wordprocessingDrawing" xmlns:w10="urn:schemas-microsoft-com:office:word" xmlns:w="http://schemas.openxmlformats.org/wordprocessingml/2006/main" xmlns:w14="http://schemas.microsoft.com/office/word/2010/wordml" xmlns:w15="http://schemas.microsoft.com/office/word/2012/wordml" xmlns:w16cex="http://schemas.microsoft.com/office/word/2018/wordml/cex" xmlns:w16cid="http://schemas.microsoft.com/office/word/2016/wordml/cid" xmlns:w16="http://schemas.microsoft.com/office/word/2018/wordml" xmlns:w16du="http://schemas.microsoft.com/office/word/2023/wordml/word16du" xmlns:w16sdtdh="http://schemas.microsoft.com/office/word/2020/wordml/sdtdatahash" xmlns:w16sdtfl="http://schemas.microsoft.com/office/word/2024/wordml/sdtformatlock" xmlns:w16se="http://schemas.microsoft.com/office/word/2015/wordml/symex" xmlns:wpg="http://schemas.microsoft.com/office/word/2010/wordprocessingGroup" xmlns:wpi="http://schemas.microsoft.com/office/word/2010/wordprocessingInk" xmlns:wne="http://schemas.microsoft.com/office/word/2006/wordml" xmlns:wps="http://schemas.microsoft.com/office/word/2010/wordprocessingShape" mc:Ignorable="w14 w15 w16se w16cid w16 w16cex w16sdtdh w16sdtfl w16du wp14">
   <w:body>
     <w:p>
       <w:pPr>
@@ -3405,21 +3405,25 @@
       <w:r>
         <w:t xml:space="preserve">используемый для управления процессом персонализации и эмбоссирования, </w:t>
       </w:r>
+      <w:proofErr w:type="spellStart"/>
       <w:r>
         <w:rPr>
           <w:lang w:val="en-US"/>
         </w:rPr>
         <w:t>TranzWare</w:t>
       </w:r>
-      <w:r>
-        <w:t xml:space="preserve"> </w:t>
-      </w:r>
+      <w:proofErr w:type="spellEnd"/>
+      <w:r>
+        <w:t xml:space="preserve"> </w:t>
+      </w:r>
+      <w:proofErr w:type="spellStart"/>
       <w:r>
         <w:rPr>
           <w:lang w:val="en-US"/>
         </w:rPr>
         <w:t>CardFactory</w:t>
       </w:r>
+      <w:proofErr w:type="spellEnd"/>
       <w:r>
         <w:t>.</w:t>
       </w:r>
@@ -3446,33 +3450,39 @@
       <w:r>
         <w:t xml:space="preserve">, изучить возможности программной платформы </w:t>
       </w:r>
+      <w:proofErr w:type="spellStart"/>
       <w:r>
         <w:rPr>
           <w:lang w:val="en-US"/>
         </w:rPr>
         <w:t>FloraWare</w:t>
       </w:r>
+      <w:proofErr w:type="spellEnd"/>
       <w:r>
         <w:t>, и</w:t>
       </w:r>
       <w:r>
         <w:t xml:space="preserve">зучить способы взаимодействия программного продукта </w:t>
       </w:r>
+      <w:proofErr w:type="spellStart"/>
       <w:r>
         <w:rPr>
           <w:lang w:val="en-US"/>
         </w:rPr>
         <w:t>TranzWare</w:t>
       </w:r>
-      <w:r>
-        <w:t xml:space="preserve"> </w:t>
-      </w:r>
+      <w:proofErr w:type="spellEnd"/>
+      <w:r>
+        <w:t xml:space="preserve"> </w:t>
+      </w:r>
+      <w:proofErr w:type="spellStart"/>
       <w:r>
         <w:rPr>
           <w:lang w:val="en-US"/>
         </w:rPr>
         <w:t>CardFactory</w:t>
       </w:r>
+      <w:proofErr w:type="spellEnd"/>
       <w:r>
         <w:t xml:space="preserve"> </w:t>
       </w:r>
@@ -3485,21 +3495,25 @@
       <w:r>
         <w:t xml:space="preserve">аскрыть структуру </w:t>
       </w:r>
+      <w:proofErr w:type="spellStart"/>
       <w:r>
         <w:rPr>
           <w:lang w:val="en-US"/>
         </w:rPr>
         <w:t>TranzWare</w:t>
       </w:r>
-      <w:r>
-        <w:t xml:space="preserve"> </w:t>
-      </w:r>
+      <w:proofErr w:type="spellEnd"/>
+      <w:r>
+        <w:t xml:space="preserve"> </w:t>
+      </w:r>
+      <w:proofErr w:type="spellStart"/>
       <w:r>
         <w:rPr>
           <w:lang w:val="en-US"/>
         </w:rPr>
         <w:t>CardFactory</w:t>
       </w:r>
+      <w:proofErr w:type="spellEnd"/>
       <w:r>
         <w:t xml:space="preserve">, </w:t>
       </w:r>
@@ -3530,21 +3544,25 @@
         <w:tab/>
         <w:t xml:space="preserve">Разработать новый модуль для </w:t>
       </w:r>
+      <w:proofErr w:type="spellStart"/>
       <w:r>
         <w:rPr>
           <w:lang w:val="en-US"/>
         </w:rPr>
         <w:t>TranzWare</w:t>
       </w:r>
-      <w:r>
-        <w:t xml:space="preserve"> </w:t>
-      </w:r>
+      <w:proofErr w:type="spellEnd"/>
+      <w:r>
+        <w:t xml:space="preserve"> </w:t>
+      </w:r>
+      <w:proofErr w:type="spellStart"/>
       <w:r>
         <w:rPr>
           <w:lang w:val="en-US"/>
         </w:rPr>
         <w:t>CardFactory</w:t>
       </w:r>
+      <w:proofErr w:type="spellEnd"/>
       <w:r>
         <w:t>, который будет осуществлять прямое управление эмбоссером с большей эффективностью;</w:t>
       </w:r>
@@ -3574,21 +3592,25 @@
       <w:r>
         <w:t xml:space="preserve"> а также возможности программного продукта </w:t>
       </w:r>
+      <w:proofErr w:type="spellStart"/>
       <w:r>
         <w:rPr>
           <w:lang w:val="en-US"/>
         </w:rPr>
         <w:t>TranzWare</w:t>
       </w:r>
-      <w:r>
-        <w:t xml:space="preserve"> </w:t>
-      </w:r>
+      <w:proofErr w:type="spellEnd"/>
+      <w:r>
+        <w:t xml:space="preserve"> </w:t>
+      </w:r>
+      <w:proofErr w:type="spellStart"/>
       <w:r>
         <w:rPr>
           <w:lang w:val="en-US"/>
         </w:rPr>
         <w:t>CardFactory</w:t>
       </w:r>
+      <w:proofErr w:type="spellEnd"/>
       <w:r>
         <w:t>.</w:t>
       </w:r>
@@ -3612,12 +3634,14 @@
       <w:r>
         <w:t xml:space="preserve">программная платформа </w:t>
       </w:r>
+      <w:proofErr w:type="spellStart"/>
       <w:r>
         <w:rPr>
           <w:lang w:val="en-US"/>
         </w:rPr>
         <w:t>FloraWare</w:t>
       </w:r>
+      <w:proofErr w:type="spellEnd"/>
       <w:r>
         <w:t xml:space="preserve"> </w:t>
       </w:r>
@@ -3630,21 +3654,25 @@
       <w:r>
         <w:t xml:space="preserve"> </w:t>
       </w:r>
+      <w:proofErr w:type="spellStart"/>
       <w:r>
         <w:rPr>
           <w:lang w:val="en-US"/>
         </w:rPr>
         <w:t>TranzWare</w:t>
       </w:r>
-      <w:r>
-        <w:t xml:space="preserve"> </w:t>
-      </w:r>
+      <w:proofErr w:type="spellEnd"/>
+      <w:r>
+        <w:t xml:space="preserve"> </w:t>
+      </w:r>
+      <w:proofErr w:type="spellStart"/>
       <w:r>
         <w:rPr>
           <w:lang w:val="en-US"/>
         </w:rPr>
         <w:t>CardFactory</w:t>
       </w:r>
+      <w:proofErr w:type="spellEnd"/>
       <w:r>
         <w:t>.</w:t>
       </w:r>
@@ -4374,12 +4402,14 @@
       <w:r>
         <w:t xml:space="preserve">Все команды модулю в обязательном порядке необходимо передавать в виде набора символов, оканчивающегося символом конца последовательности. В наборе обязательно должны содеражться элементы кода на специализированном языке программирования </w:t>
       </w:r>
+      <w:proofErr w:type="spellStart"/>
       <w:r>
         <w:rPr>
           <w:lang w:val="en-US"/>
         </w:rPr>
         <w:t>TCPScript</w:t>
       </w:r>
+      <w:proofErr w:type="spellEnd"/>
       <w:r>
         <w:t xml:space="preserve">. </w:t>
       </w:r>
@@ -4510,6 +4540,7 @@
       <w:r>
         <w:t xml:space="preserve">1.2.1 Платформа </w:t>
       </w:r>
+      <w:proofErr w:type="spellStart"/>
       <w:r>
         <w:rPr>
           <w:lang w:val="en-US"/>
@@ -4517,17 +4548,20 @@
         <w:t>FloraWare</w:t>
       </w:r>
       <w:bookmarkEnd w:id="8"/>
+      <w:proofErr w:type="spellEnd"/>
     </w:p>
     <w:p>
       <w:r>
         <w:t xml:space="preserve">Программная платформа </w:t>
       </w:r>
+      <w:proofErr w:type="spellStart"/>
       <w:r>
         <w:rPr>
           <w:lang w:val="en-US"/>
         </w:rPr>
         <w:t>Floraware</w:t>
       </w:r>
+      <w:proofErr w:type="spellEnd"/>
       <w:r>
         <w:t xml:space="preserve"> </w:t>
       </w:r>
@@ -4540,45 +4574,53 @@
       <w:r>
         <w:t xml:space="preserve">программный продукт </w:t>
       </w:r>
+      <w:proofErr w:type="spellStart"/>
       <w:r>
         <w:rPr>
           <w:lang w:val="en-US"/>
         </w:rPr>
         <w:t>TranzWare</w:t>
       </w:r>
-      <w:r>
-        <w:t xml:space="preserve"> </w:t>
-      </w:r>
+      <w:proofErr w:type="spellEnd"/>
+      <w:r>
+        <w:t xml:space="preserve"> </w:t>
+      </w:r>
+      <w:proofErr w:type="spellStart"/>
       <w:r>
         <w:rPr>
           <w:lang w:val="en-US"/>
         </w:rPr>
         <w:t>CardFactory</w:t>
       </w:r>
+      <w:proofErr w:type="spellEnd"/>
       <w:r>
         <w:t xml:space="preserve">, </w:t>
       </w:r>
       <w:r>
         <w:t xml:space="preserve">предназначенный для управления процессом персонализации банковских карт. Сам продукт </w:t>
       </w:r>
+      <w:proofErr w:type="spellStart"/>
       <w:r>
         <w:rPr>
           <w:lang w:val="en-US"/>
         </w:rPr>
         <w:t>CardFactory</w:t>
       </w:r>
+      <w:proofErr w:type="spellEnd"/>
       <w:r>
         <w:t xml:space="preserve"> </w:t>
       </w:r>
       <w:r>
         <w:t xml:space="preserve">будет рассмотрен подробнее в следующем подразделе. В данном же разделе будет подробно рассмотрена структура платформы </w:t>
       </w:r>
+      <w:proofErr w:type="spellStart"/>
       <w:r>
         <w:rPr>
           <w:lang w:val="en-US"/>
         </w:rPr>
         <w:t>FloraWare</w:t>
       </w:r>
+      <w:proofErr w:type="spellEnd"/>
       <w:r>
         <w:t xml:space="preserve">, а также все средства разработки, которые она предлагает </w:t>
       </w:r>
@@ -4590,12 +4632,14 @@
       <w:r>
         <w:t xml:space="preserve">Не смотря на то, что </w:t>
       </w:r>
+      <w:proofErr w:type="spellStart"/>
       <w:r>
         <w:rPr>
           <w:lang w:val="en-US"/>
         </w:rPr>
         <w:t>FloraWare</w:t>
       </w:r>
+      <w:proofErr w:type="spellEnd"/>
       <w:r>
         <w:t xml:space="preserve"> </w:t>
       </w:r>
@@ -4620,12 +4664,14 @@
       <w:r>
         <w:t xml:space="preserve">средства для разработки, отладки и тестирования приложений. </w:t>
       </w:r>
+      <w:proofErr w:type="spellStart"/>
       <w:r>
         <w:rPr>
           <w:lang w:val="en-US"/>
         </w:rPr>
         <w:t>FloraWare</w:t>
       </w:r>
+      <w:proofErr w:type="spellEnd"/>
       <w:r>
         <w:t xml:space="preserve"> </w:t>
       </w:r>
@@ -4652,12 +4698,14 @@
       <w:r>
         <w:t xml:space="preserve">причины возникновения  такой платформы как </w:t>
       </w:r>
+      <w:proofErr w:type="spellStart"/>
       <w:r>
         <w:rPr>
           <w:lang w:val="en-US"/>
         </w:rPr>
         <w:t>FloraWare</w:t>
       </w:r>
+      <w:proofErr w:type="spellEnd"/>
       <w:r>
         <w:t xml:space="preserve">. </w:t>
       </w:r>
@@ -4903,24 +4951,28 @@
       <w:r>
         <w:t xml:space="preserve">Конечно, </w:t>
       </w:r>
+      <w:proofErr w:type="spellStart"/>
       <w:r>
         <w:rPr>
           <w:lang w:val="en-US"/>
         </w:rPr>
         <w:t>FloraWare</w:t>
       </w:r>
+      <w:proofErr w:type="spellEnd"/>
       <w:r>
         <w:t xml:space="preserve"> </w:t>
       </w:r>
       <w:r>
         <w:t xml:space="preserve">не полностью отказалась от текстового представления программ в угоду объектному подходу. Внутри </w:t>
       </w:r>
+      <w:proofErr w:type="spellStart"/>
       <w:r>
         <w:rPr>
           <w:lang w:val="en-US"/>
         </w:rPr>
         <w:t>FloraWare</w:t>
       </w:r>
+      <w:proofErr w:type="spellEnd"/>
       <w:r>
         <w:t xml:space="preserve"> </w:t>
       </w:r>
@@ -4972,12 +5024,14 @@
       <w:r>
         <w:t xml:space="preserve">выполняются в пределах других программ как обычные функции в других языках программирования. Объекты-задачи же запускаются встроенным методом </w:t>
       </w:r>
+      <w:proofErr w:type="spellStart"/>
       <w:r>
         <w:rPr>
           <w:lang w:val="en-US"/>
         </w:rPr>
         <w:t>strob</w:t>
       </w:r>
+      <w:proofErr w:type="spellEnd"/>
       <w:r>
         <w:t xml:space="preserve">, </w:t>
       </w:r>
@@ -4996,12 +5050,14 @@
       <w:r>
         <w:t xml:space="preserve"> реализации многопоточности при разработке приложений в экосистеме </w:t>
       </w:r>
+      <w:proofErr w:type="spellStart"/>
       <w:r>
         <w:rPr>
           <w:lang w:val="en-US"/>
         </w:rPr>
         <w:t>FloraWare</w:t>
       </w:r>
+      <w:proofErr w:type="spellEnd"/>
       <w:r>
         <w:t>.</w:t>
       </w:r>
@@ -5032,21 +5088,25 @@
         <w:lastRenderedPageBreak/>
         <w:t xml:space="preserve">программный продукт </w:t>
       </w:r>
+      <w:proofErr w:type="spellStart"/>
       <w:r>
         <w:rPr>
           <w:lang w:val="en-US"/>
         </w:rPr>
         <w:t>FloraWare</w:t>
       </w:r>
+      <w:proofErr w:type="spellEnd"/>
       <w:r>
         <w:t xml:space="preserve">, выполнение которого всецело происходит посредством объектной машины. При выполнении любого приложения в среде </w:t>
       </w:r>
+      <w:proofErr w:type="spellStart"/>
       <w:r>
         <w:rPr>
           <w:lang w:val="en-US"/>
         </w:rPr>
         <w:t>FloraWare</w:t>
       </w:r>
+      <w:proofErr w:type="spellEnd"/>
       <w:r>
         <w:t xml:space="preserve"> </w:t>
       </w:r>
@@ -5074,12 +5134,14 @@
       <w:r>
         <w:t xml:space="preserve"> Объектная машина содержит внутри себя всю информацию об объектах </w:t>
       </w:r>
+      <w:proofErr w:type="spellStart"/>
       <w:r>
         <w:rPr>
           <w:lang w:val="en-US"/>
         </w:rPr>
         <w:t>FloraWare</w:t>
       </w:r>
+      <w:proofErr w:type="spellEnd"/>
       <w:r>
         <w:t xml:space="preserve">, </w:t>
       </w:r>
@@ -5089,12 +5151,14 @@
       <w:r>
         <w:t xml:space="preserve">установкой последней доступной версии </w:t>
       </w:r>
+      <w:proofErr w:type="spellStart"/>
       <w:r>
         <w:rPr>
           <w:lang w:val="en-US"/>
         </w:rPr>
         <w:t>FloraWare</w:t>
       </w:r>
+      <w:proofErr w:type="spellEnd"/>
       <w:r>
         <w:t xml:space="preserve"> </w:t>
       </w:r>
@@ -5120,12 +5184,14 @@
       <w:r>
         <w:t xml:space="preserve">Таким образом, платформа </w:t>
       </w:r>
+      <w:proofErr w:type="spellStart"/>
       <w:r>
         <w:rPr>
           <w:lang w:val="en-US"/>
         </w:rPr>
         <w:t>FloraWare</w:t>
       </w:r>
+      <w:proofErr w:type="spellEnd"/>
       <w:r>
         <w:t xml:space="preserve"> </w:t>
       </w:r>
@@ -5150,33 +5216,39 @@
       <w:r>
         <w:t xml:space="preserve">Не смотря на то, что помимо представленной платформы, компания параллельно разрабатывает еще несколько схожих по функциональности продуктов, </w:t>
       </w:r>
+      <w:proofErr w:type="spellStart"/>
       <w:r>
         <w:rPr>
           <w:lang w:val="en-US"/>
         </w:rPr>
         <w:t>FloraWare</w:t>
       </w:r>
+      <w:proofErr w:type="spellEnd"/>
       <w:r>
         <w:t xml:space="preserve"> </w:t>
       </w:r>
       <w:r>
         <w:t xml:space="preserve">не теряет своей актуальности как внутри компании, так и среди клиентов. В особенности, учитвыая что на основе данной платформы разработан однин из крупнейших программных продуктов компании – </w:t>
       </w:r>
+      <w:proofErr w:type="spellStart"/>
       <w:r>
         <w:rPr>
           <w:lang w:val="en-US"/>
         </w:rPr>
         <w:t>TranzWare</w:t>
       </w:r>
-      <w:r>
-        <w:t xml:space="preserve"> </w:t>
-      </w:r>
+      <w:proofErr w:type="spellEnd"/>
+      <w:r>
+        <w:t xml:space="preserve"> </w:t>
+      </w:r>
+      <w:proofErr w:type="spellStart"/>
       <w:r>
         <w:rPr>
           <w:lang w:val="en-US"/>
         </w:rPr>
         <w:t>CardFactory</w:t>
       </w:r>
+      <w:proofErr w:type="spellEnd"/>
       <w:r>
         <w:t>.</w:t>
       </w:r>
@@ -5195,15 +5267,18 @@
       <w:r>
         <w:t xml:space="preserve">Программный продукт </w:t>
       </w:r>
+      <w:proofErr w:type="spellStart"/>
       <w:r>
         <w:rPr>
           <w:lang w:val="en-US"/>
         </w:rPr>
         <w:t>TranzWare</w:t>
       </w:r>
-      <w:r>
-        <w:t xml:space="preserve"> </w:t>
-      </w:r>
+      <w:proofErr w:type="spellEnd"/>
+      <w:r>
+        <w:t xml:space="preserve"> </w:t>
+      </w:r>
+      <w:proofErr w:type="spellStart"/>
       <w:r>
         <w:rPr>
           <w:lang w:val="en-US"/>
@@ -5211,38 +5286,45 @@
         <w:t>CardFactory</w:t>
       </w:r>
       <w:bookmarkEnd w:id="9"/>
+      <w:proofErr w:type="spellEnd"/>
     </w:p>
     <w:p>
       <w:r>
         <w:t xml:space="preserve">Программный продукт </w:t>
       </w:r>
+      <w:proofErr w:type="spellStart"/>
       <w:r>
         <w:rPr>
           <w:lang w:val="en-US"/>
         </w:rPr>
         <w:t>TranzWare</w:t>
       </w:r>
-      <w:r>
-        <w:t xml:space="preserve"> </w:t>
-      </w:r>
+      <w:proofErr w:type="spellEnd"/>
+      <w:r>
+        <w:t xml:space="preserve"> </w:t>
+      </w:r>
+      <w:proofErr w:type="spellStart"/>
       <w:r>
         <w:rPr>
           <w:lang w:val="en-US"/>
         </w:rPr>
         <w:t>CardFactory</w:t>
       </w:r>
+      <w:proofErr w:type="spellEnd"/>
       <w:r>
         <w:t xml:space="preserve"> </w:t>
       </w:r>
       <w:r>
         <w:t xml:space="preserve">полностью разработан на платформе </w:t>
       </w:r>
+      <w:proofErr w:type="spellStart"/>
       <w:r>
         <w:rPr>
           <w:lang w:val="en-US"/>
         </w:rPr>
         <w:t>FloraWare</w:t>
       </w:r>
+      <w:proofErr w:type="spellEnd"/>
       <w:r>
         <w:t xml:space="preserve">. </w:t>
       </w:r>
@@ -5273,12 +5355,14 @@
       <w:r>
         <w:t xml:space="preserve">В данном подразделе будет рассмотрена общая структура программного комплекса </w:t>
       </w:r>
+      <w:proofErr w:type="spellStart"/>
       <w:r>
         <w:rPr>
           <w:lang w:val="en-US"/>
         </w:rPr>
         <w:t>CardFactory</w:t>
       </w:r>
+      <w:proofErr w:type="spellEnd"/>
       <w:r>
         <w:t xml:space="preserve">, а также методы осуществления настройки и обработки банковских карт его средствами. Кроме того будут вкратце описаны основные </w:t>
       </w:r>
@@ -5300,21 +5384,25 @@
       <w:r>
         <w:t xml:space="preserve">Как уже упоминалось выше, программный продукт </w:t>
       </w:r>
+      <w:proofErr w:type="spellStart"/>
       <w:r>
         <w:rPr>
           <w:lang w:val="en-US"/>
         </w:rPr>
         <w:t>TranzWare</w:t>
       </w:r>
-      <w:r>
-        <w:t xml:space="preserve"> </w:t>
-      </w:r>
+      <w:proofErr w:type="spellEnd"/>
+      <w:r>
+        <w:t xml:space="preserve"> </w:t>
+      </w:r>
+      <w:proofErr w:type="spellStart"/>
       <w:r>
         <w:rPr>
           <w:lang w:val="en-US"/>
         </w:rPr>
         <w:t>CardFactory</w:t>
       </w:r>
+      <w:proofErr w:type="spellEnd"/>
       <w:r>
         <w:t xml:space="preserve"> </w:t>
       </w:r>
@@ -5327,33 +5415,39 @@
       <w:r>
         <w:t xml:space="preserve">В </w:t>
       </w:r>
+      <w:proofErr w:type="spellStart"/>
       <w:r>
         <w:rPr>
           <w:lang w:val="en-US"/>
         </w:rPr>
         <w:t>CardFactory</w:t>
       </w:r>
+      <w:proofErr w:type="spellEnd"/>
       <w:r>
         <w:t xml:space="preserve"> </w:t>
       </w:r>
       <w:r>
         <w:t xml:space="preserve">присутствует главное вызывающее приложение, через которое применяются все модули, и непосредственно сам набор всевозможных модулей, предназначенных как для обработки карт, так и для выполнения других утилитарных функций внутри продукта. Внутри вызывающего приложения возможно осуществлять настройку этапов будущей обработки пластиковой банковской карты, это выполняется путем создания специального «карточного продукта». При создании любой карточный продукт внутри </w:t>
       </w:r>
+      <w:proofErr w:type="spellStart"/>
       <w:r>
         <w:rPr>
           <w:lang w:val="en-US"/>
         </w:rPr>
         <w:t>CardFactory</w:t>
       </w:r>
+      <w:proofErr w:type="spellEnd"/>
       <w:r>
         <w:t xml:space="preserve"> является абсолютно пустым. Пользователь наполняет его, добавляя в его внутренний список модули, которые в будущем будут использоваться для обработки карты. Каждому модулю внутри карточного продукта соответствуют специальные модули настроек и модули обработки в среде </w:t>
       </w:r>
+      <w:proofErr w:type="spellStart"/>
       <w:r>
         <w:rPr>
           <w:lang w:val="en-US"/>
         </w:rPr>
         <w:t>CardFactory</w:t>
       </w:r>
+      <w:proofErr w:type="spellEnd"/>
       <w:r>
         <w:t>.</w:t>
       </w:r>
@@ -5407,12 +5501,14 @@
       <w:r>
         <w:t xml:space="preserve">внутри </w:t>
       </w:r>
+      <w:proofErr w:type="spellStart"/>
       <w:r>
         <w:rPr>
           <w:lang w:val="en-US"/>
         </w:rPr>
         <w:t>CardFactory</w:t>
       </w:r>
+      <w:proofErr w:type="spellEnd"/>
       <w:r>
         <w:t xml:space="preserve"> </w:t>
       </w:r>
@@ -6057,12 +6153,14 @@
       <w:r>
         <w:t xml:space="preserve">, и видов карт которые используют клиенты компании, задачей разработчиков является осуществление поддержки работы </w:t>
       </w:r>
+      <w:proofErr w:type="spellStart"/>
       <w:r>
         <w:rPr>
           <w:lang w:val="en-US"/>
         </w:rPr>
         <w:t>CardFactory</w:t>
       </w:r>
+      <w:proofErr w:type="spellEnd"/>
       <w:r>
         <w:t xml:space="preserve"> </w:t>
       </w:r>
@@ -6182,21 +6280,25 @@
       <w:r>
         <w:t xml:space="preserve"> программный продукт </w:t>
       </w:r>
+      <w:proofErr w:type="spellStart"/>
       <w:r>
         <w:rPr>
           <w:lang w:val="en-US"/>
         </w:rPr>
         <w:t>TranzWare</w:t>
       </w:r>
-      <w:r>
-        <w:t xml:space="preserve"> </w:t>
-      </w:r>
+      <w:proofErr w:type="spellEnd"/>
+      <w:r>
+        <w:t xml:space="preserve"> </w:t>
+      </w:r>
+      <w:proofErr w:type="spellStart"/>
       <w:r>
         <w:rPr>
           <w:lang w:val="en-US"/>
         </w:rPr>
         <w:t>CardFactory</w:t>
       </w:r>
+      <w:proofErr w:type="spellEnd"/>
       <w:r>
         <w:t xml:space="preserve"> </w:t>
       </w:r>
@@ -6239,12 +6341,14 @@
       <w:r>
         <w:t xml:space="preserve"> </w:t>
       </w:r>
+      <w:proofErr w:type="spellStart"/>
       <w:r>
         <w:rPr>
           <w:lang w:val="en-US"/>
         </w:rPr>
         <w:t>Maticard</w:t>
       </w:r>
+      <w:proofErr w:type="spellEnd"/>
       <w:r>
         <w:t xml:space="preserve"> </w:t>
       </w:r>
@@ -6278,12 +6382,14 @@
       <w:r>
         <w:t xml:space="preserve">невозможо без специализированного ПО, а конкретнее утилиты </w:t>
       </w:r>
+      <w:proofErr w:type="spellStart"/>
       <w:r>
         <w:rPr>
           <w:lang w:val="en-US"/>
         </w:rPr>
         <w:t>Maticard</w:t>
       </w:r>
+      <w:proofErr w:type="spellEnd"/>
       <w:r>
         <w:t xml:space="preserve"> </w:t>
       </w:r>
@@ -6338,12 +6444,14 @@
       <w:r>
         <w:t xml:space="preserve"> и настройки этапов обработки карты на нем. По большому счету, оно очень похоже на продукт </w:t>
       </w:r>
+      <w:proofErr w:type="spellStart"/>
       <w:r>
         <w:rPr>
           <w:lang w:val="en-US"/>
         </w:rPr>
         <w:t>CardFactory</w:t>
       </w:r>
+      <w:proofErr w:type="spellEnd"/>
       <w:r>
         <w:t xml:space="preserve">, </w:t>
       </w:r>
@@ -6362,12 +6470,14 @@
       <w:r>
         <w:t xml:space="preserve"> Внутри него так же, как и в </w:t>
       </w:r>
+      <w:proofErr w:type="spellStart"/>
       <w:r>
         <w:rPr>
           <w:lang w:val="en-US"/>
         </w:rPr>
         <w:t>CardFactory</w:t>
       </w:r>
+      <w:proofErr w:type="spellEnd"/>
       <w:r>
         <w:t xml:space="preserve"> </w:t>
       </w:r>
@@ -6383,12 +6493,14 @@
       <w:r>
         <w:t xml:space="preserve"> Порядок запуска обработки карты через </w:t>
       </w:r>
+      <w:proofErr w:type="spellStart"/>
       <w:r>
         <w:rPr>
           <w:lang w:val="en-US"/>
         </w:rPr>
         <w:t>Maticard</w:t>
       </w:r>
+      <w:proofErr w:type="spellEnd"/>
       <w:r>
         <w:t xml:space="preserve"> </w:t>
       </w:r>
@@ -6404,21 +6516,25 @@
       <w:r>
         <w:t xml:space="preserve">и </w:t>
       </w:r>
+      <w:proofErr w:type="spellStart"/>
       <w:r>
         <w:rPr>
           <w:lang w:val="en-US"/>
         </w:rPr>
         <w:t>TranzWare</w:t>
       </w:r>
-      <w:r>
-        <w:t xml:space="preserve"> </w:t>
-      </w:r>
+      <w:proofErr w:type="spellEnd"/>
+      <w:r>
+        <w:t xml:space="preserve"> </w:t>
+      </w:r>
+      <w:proofErr w:type="spellStart"/>
       <w:r>
         <w:rPr>
           <w:lang w:val="en-US"/>
         </w:rPr>
         <w:t>CardFactory</w:t>
       </w:r>
+      <w:proofErr w:type="spellEnd"/>
       <w:r>
         <w:t xml:space="preserve"> </w:t>
       </w:r>
@@ -6437,36 +6553,42 @@
       <w:r>
         <w:t xml:space="preserve">выглядит следующим образом. Сначала запускается </w:t>
       </w:r>
+      <w:proofErr w:type="spellStart"/>
       <w:r>
         <w:rPr>
           <w:lang w:val="en-US"/>
         </w:rPr>
         <w:t>CardFactory</w:t>
       </w:r>
+      <w:proofErr w:type="spellEnd"/>
       <w:r>
         <w:t xml:space="preserve">, </w:t>
       </w:r>
       <w:r>
         <w:t xml:space="preserve">внутри которого запускается обработка карточного продукта. На одном из этапов обработки </w:t>
       </w:r>
+      <w:proofErr w:type="spellStart"/>
       <w:r>
         <w:rPr>
           <w:lang w:val="en-US"/>
         </w:rPr>
         <w:t>CardFactory</w:t>
       </w:r>
+      <w:proofErr w:type="spellEnd"/>
       <w:r>
         <w:t xml:space="preserve"> </w:t>
       </w:r>
       <w:r>
         <w:t xml:space="preserve">записывает данные для эмбоссирования карты в специальную базу данных, содержащую таблицу данных карт. После этого запускается ПО </w:t>
       </w:r>
+      <w:proofErr w:type="spellStart"/>
       <w:r>
         <w:rPr>
           <w:lang w:val="en-US"/>
         </w:rPr>
         <w:t>Maticard</w:t>
       </w:r>
+      <w:proofErr w:type="spellEnd"/>
       <w:r>
         <w:t xml:space="preserve"> </w:t>
       </w:r>
@@ -6479,24 +6601,28 @@
       <w:r>
         <w:t xml:space="preserve">, в котором также запускается обработка карты. </w:t>
       </w:r>
+      <w:proofErr w:type="spellStart"/>
       <w:r>
         <w:rPr>
           <w:lang w:val="en-US"/>
         </w:rPr>
         <w:t>Maticard</w:t>
       </w:r>
+      <w:proofErr w:type="spellEnd"/>
       <w:r>
         <w:t xml:space="preserve"> </w:t>
       </w:r>
       <w:r>
         <w:t xml:space="preserve">подгружает из базы все необходимые данные и производит последовательное эмбоссирование всех карт, содержащихся в базе. Кроме того, </w:t>
       </w:r>
+      <w:proofErr w:type="spellStart"/>
       <w:r>
         <w:rPr>
           <w:lang w:val="en-US"/>
         </w:rPr>
         <w:t>Maticard</w:t>
       </w:r>
+      <w:proofErr w:type="spellEnd"/>
       <w:r>
         <w:t xml:space="preserve"> </w:t>
       </w:r>
@@ -6506,24 +6632,28 @@
       <w:r>
         <w:t xml:space="preserve">процессом в </w:t>
       </w:r>
+      <w:proofErr w:type="spellStart"/>
       <w:r>
         <w:rPr>
           <w:lang w:val="en-US"/>
         </w:rPr>
         <w:t>CardFactory</w:t>
       </w:r>
+      <w:proofErr w:type="spellEnd"/>
       <w:r>
         <w:t xml:space="preserve">. </w:t>
       </w:r>
       <w:r>
         <w:t xml:space="preserve">Видите ли, внутри утилиты </w:t>
       </w:r>
+      <w:proofErr w:type="spellStart"/>
       <w:r>
         <w:rPr>
           <w:lang w:val="en-US"/>
         </w:rPr>
         <w:t>Maticard</w:t>
       </w:r>
+      <w:proofErr w:type="spellEnd"/>
       <w:r>
         <w:t xml:space="preserve"> </w:t>
       </w:r>
@@ -6554,12 +6684,14 @@
       <w:r>
         <w:t xml:space="preserve">Ее функции отправляют </w:t>
       </w:r>
+      <w:proofErr w:type="spellStart"/>
       <w:r>
         <w:rPr>
           <w:lang w:val="en-US"/>
         </w:rPr>
         <w:t>CardFactory</w:t>
       </w:r>
+      <w:proofErr w:type="spellEnd"/>
       <w:r>
         <w:t xml:space="preserve"> </w:t>
       </w:r>
@@ -6569,12 +6701,14 @@
       <w:r>
         <w:t xml:space="preserve">. В этот момент в </w:t>
       </w:r>
+      <w:proofErr w:type="spellStart"/>
       <w:r>
         <w:rPr>
           <w:lang w:val="en-US"/>
         </w:rPr>
         <w:t>CardFactory</w:t>
       </w:r>
+      <w:proofErr w:type="spellEnd"/>
       <w:r>
         <w:t xml:space="preserve"> </w:t>
       </w:r>
@@ -6608,12 +6742,14 @@
       <w:r>
         <w:t xml:space="preserve">. Он записывает данные на пластиковую карту и подает сигнал обратно о завершении процесса. По принятии сигнала </w:t>
       </w:r>
+      <w:proofErr w:type="spellStart"/>
       <w:r>
         <w:rPr>
           <w:lang w:val="en-US"/>
         </w:rPr>
         <w:t>Maticard</w:t>
       </w:r>
+      <w:proofErr w:type="spellEnd"/>
       <w:r>
         <w:t xml:space="preserve"> </w:t>
       </w:r>
@@ -6640,21 +6776,25 @@
       <w:r>
         <w:t xml:space="preserve">через продукт </w:t>
       </w:r>
+      <w:proofErr w:type="spellStart"/>
       <w:r>
         <w:rPr>
           <w:lang w:val="en-US"/>
         </w:rPr>
         <w:t>TranzWare</w:t>
       </w:r>
-      <w:r>
-        <w:t xml:space="preserve"> </w:t>
-      </w:r>
+      <w:proofErr w:type="spellEnd"/>
+      <w:r>
+        <w:t xml:space="preserve"> </w:t>
+      </w:r>
+      <w:proofErr w:type="spellStart"/>
       <w:r>
         <w:rPr>
           <w:lang w:val="en-US"/>
         </w:rPr>
         <w:t>CardFactory</w:t>
       </w:r>
+      <w:proofErr w:type="spellEnd"/>
       <w:r>
         <w:t xml:space="preserve">, </w:t>
       </w:r>
@@ -6673,12 +6813,14 @@
       <w:r>
         <w:t xml:space="preserve">по данному вопросу, было определено, что никакой документации компания предоставлять для осуществления таких целей не будет, как и разглашать способы прямого взаимодействия с эмбоссером. Компанией были предоставлены только ПО </w:t>
       </w:r>
+      <w:proofErr w:type="spellStart"/>
       <w:r>
         <w:rPr>
           <w:lang w:val="en-US"/>
         </w:rPr>
         <w:t>Maticard</w:t>
       </w:r>
+      <w:proofErr w:type="spellEnd"/>
       <w:r>
         <w:t xml:space="preserve"> </w:t>
       </w:r>
@@ -6742,21 +6884,25 @@
       <w:r>
         <w:t xml:space="preserve">с помощью </w:t>
       </w:r>
+      <w:proofErr w:type="spellStart"/>
       <w:r>
         <w:rPr>
           <w:lang w:val="en-US"/>
         </w:rPr>
         <w:t>TranzWare</w:t>
       </w:r>
-      <w:r>
-        <w:t xml:space="preserve"> </w:t>
-      </w:r>
+      <w:proofErr w:type="spellEnd"/>
+      <w:r>
+        <w:t xml:space="preserve"> </w:t>
+      </w:r>
+      <w:proofErr w:type="spellStart"/>
       <w:r>
         <w:rPr>
           <w:lang w:val="en-US"/>
         </w:rPr>
         <w:t>CardFactory</w:t>
       </w:r>
+      <w:proofErr w:type="spellEnd"/>
       <w:r>
         <w:t xml:space="preserve">, но ни одно из этих решений не взаимодействует с кардридерным модулем эмбоссера, отчего процесс выпуска </w:t>
       </w:r>
@@ -6779,12 +6925,14 @@
       <w:r>
         <w:t xml:space="preserve">а также схему работы таких решений. Кроме того в данном разделе будет проанализировано объектное дерево других крадридерных драйверов для выяснения общих компонентов, которые должны присутствовать внутри любого кардридерного драйвера внутри </w:t>
       </w:r>
+      <w:proofErr w:type="spellStart"/>
       <w:r>
         <w:rPr>
           <w:lang w:val="en-US"/>
         </w:rPr>
         <w:t>CardFactory</w:t>
       </w:r>
+      <w:proofErr w:type="spellEnd"/>
       <w:r>
         <w:t xml:space="preserve"> </w:t>
       </w:r>
@@ -6812,15 +6960,18 @@
       <w:r>
         <w:t xml:space="preserve">Анализ кардридерных драйверов продукта </w:t>
       </w:r>
+      <w:proofErr w:type="spellStart"/>
       <w:r>
         <w:rPr>
           <w:lang w:val="en-US"/>
         </w:rPr>
         <w:t>TranzWare</w:t>
       </w:r>
-      <w:r>
-        <w:t xml:space="preserve"> </w:t>
-      </w:r>
+      <w:proofErr w:type="spellEnd"/>
+      <w:r>
+        <w:t xml:space="preserve"> </w:t>
+      </w:r>
+      <w:proofErr w:type="spellStart"/>
       <w:r>
         <w:rPr>
           <w:lang w:val="en-US"/>
@@ -6828,6 +6979,7 @@
         <w:t>CardFactory</w:t>
       </w:r>
       <w:bookmarkEnd w:id="12"/>
+      <w:proofErr w:type="spellEnd"/>
     </w:p>
     <w:p>
       <w:pPr>
@@ -6836,21 +6988,25 @@
       <w:r>
         <w:t xml:space="preserve">Всего на текущий момент внутри продукта </w:t>
       </w:r>
+      <w:proofErr w:type="spellStart"/>
       <w:r>
         <w:rPr>
           <w:lang w:val="en-US"/>
         </w:rPr>
         <w:t>TranzWare</w:t>
       </w:r>
-      <w:r>
-        <w:t xml:space="preserve"> </w:t>
-      </w:r>
+      <w:proofErr w:type="spellEnd"/>
+      <w:r>
+        <w:t xml:space="preserve"> </w:t>
+      </w:r>
+      <w:proofErr w:type="spellStart"/>
       <w:r>
         <w:rPr>
           <w:lang w:val="en-US"/>
         </w:rPr>
         <w:t>CardFactory</w:t>
       </w:r>
+      <w:proofErr w:type="spellEnd"/>
       <w:r>
         <w:t xml:space="preserve"> </w:t>
       </w:r>
@@ -6875,12 +7031,14 @@
       <w:r>
         <w:t xml:space="preserve"> Конечно, каждый кардридер имеет свое собственную, уникальную, структуру, со всеми необходимыми функциями, объектами настроек и т.д., разработанным специально под кардридер. Не смотря на это, каждый кардридерный драйвер имеет общие с другими элементы, которые необходимы для работы драйверов записи карты. Как было упомянуто в прошлом разделе, все драйвера записи карты используют функции кардридерных драйверов для взаимодействия с картами через кардридеры, поэтому наличие стандартизированного интерфейса взаимодействия между обоими типами драйверов является обязательным условием для безошибочной обработки карты. Такой интерфейс взаимодействия, естественно, присутствует между драйверам, иначе средствами </w:t>
       </w:r>
+      <w:proofErr w:type="spellStart"/>
       <w:r>
         <w:rPr>
           <w:lang w:val="en-US"/>
         </w:rPr>
         <w:t>CardFactory</w:t>
       </w:r>
+      <w:proofErr w:type="spellEnd"/>
       <w:r>
         <w:t xml:space="preserve"> </w:t>
       </w:r>
@@ -6907,12 +7065,14 @@
       <w:r>
         <w:t xml:space="preserve">Анализируя имеющиеся внутри </w:t>
       </w:r>
+      <w:proofErr w:type="spellStart"/>
       <w:r>
         <w:rPr>
           <w:lang w:val="en-US"/>
         </w:rPr>
         <w:t>CardFactory</w:t>
       </w:r>
+      <w:proofErr w:type="spellEnd"/>
       <w:r>
         <w:t xml:space="preserve"> </w:t>
       </w:r>
@@ -6937,6 +7097,7 @@
           <w:numId w:val="28"/>
         </w:numPr>
       </w:pPr>
+      <w:proofErr w:type="spellStart"/>
       <w:proofErr w:type="gramStart"/>
       <w:r>
         <w:rPr>
@@ -6944,6 +7105,7 @@
         </w:rPr>
         <w:t>EjectCard</w:t>
       </w:r>
+      <w:proofErr w:type="spellEnd"/>
       <w:r>
         <w:t>(</w:t>
       </w:r>
@@ -7043,6 +7205,7 @@
           <w:numId w:val="28"/>
         </w:numPr>
       </w:pPr>
+      <w:proofErr w:type="spellStart"/>
       <w:proofErr w:type="gramStart"/>
       <w:r>
         <w:rPr>
@@ -7050,6 +7213,7 @@
         </w:rPr>
         <w:t>WaitCard</w:t>
       </w:r>
+      <w:proofErr w:type="spellEnd"/>
       <w:r>
         <w:t>(</w:t>
       </w:r>
@@ -7118,21 +7282,25 @@
       <w:r>
         <w:t xml:space="preserve">На текущий момент присутствует возможность персонализировать банковскую пластиковую карту средствами </w:t>
       </w:r>
+      <w:proofErr w:type="spellStart"/>
       <w:r>
         <w:rPr>
           <w:lang w:val="en-US"/>
         </w:rPr>
         <w:t>TranzWare</w:t>
       </w:r>
-      <w:r>
-        <w:t xml:space="preserve"> </w:t>
-      </w:r>
+      <w:proofErr w:type="spellEnd"/>
+      <w:r>
+        <w:t xml:space="preserve"> </w:t>
+      </w:r>
+      <w:proofErr w:type="spellStart"/>
       <w:r>
         <w:rPr>
           <w:lang w:val="en-US"/>
         </w:rPr>
         <w:t>CardFactory</w:t>
       </w:r>
+      <w:proofErr w:type="spellEnd"/>
       <w:r>
         <w:t xml:space="preserve"> </w:t>
       </w:r>
@@ -7151,24 +7319,28 @@
       <w:r>
         <w:t xml:space="preserve">К сожалению, средства продукта </w:t>
       </w:r>
+      <w:proofErr w:type="spellStart"/>
       <w:r>
         <w:rPr>
           <w:lang w:val="en-US"/>
         </w:rPr>
         <w:t>CardFactory</w:t>
       </w:r>
+      <w:proofErr w:type="spellEnd"/>
       <w:r>
         <w:t xml:space="preserve"> </w:t>
       </w:r>
       <w:r>
         <w:t xml:space="preserve">не позволяют осуществлять прямое управление процессом. Все управление осуществляется опосредованно, путем передачи необходимых для персонализации данных, которые впоследствии используются ПО </w:t>
       </w:r>
+      <w:proofErr w:type="spellStart"/>
       <w:r>
         <w:rPr>
           <w:lang w:val="en-US"/>
         </w:rPr>
         <w:t>Maticard</w:t>
       </w:r>
+      <w:proofErr w:type="spellEnd"/>
       <w:r>
         <w:t xml:space="preserve"> </w:t>
       </w:r>
@@ -7193,12 +7365,14 @@
       <w:r>
         <w:t xml:space="preserve"> Конечно, идельной ситуацией было бы полное управление процессом средствами </w:t>
       </w:r>
+      <w:proofErr w:type="spellStart"/>
       <w:r>
         <w:rPr>
           <w:lang w:val="en-US"/>
         </w:rPr>
         <w:t>CardFactory</w:t>
       </w:r>
+      <w:proofErr w:type="spellEnd"/>
       <w:r>
         <w:t xml:space="preserve">, </w:t>
       </w:r>
@@ -7221,33 +7395,39 @@
         <w:lastRenderedPageBreak/>
         <w:t xml:space="preserve">внутри продукта. В данном подразделе будет рассмотрен актуальный на сегодняшний день процесс персонализации пластиковой банковской карты средствами </w:t>
       </w:r>
+      <w:proofErr w:type="spellStart"/>
       <w:r>
         <w:rPr>
           <w:lang w:val="en-US"/>
         </w:rPr>
         <w:t>TranzWare</w:t>
       </w:r>
-      <w:r>
-        <w:t xml:space="preserve"> </w:t>
-      </w:r>
+      <w:proofErr w:type="spellEnd"/>
+      <w:r>
+        <w:t xml:space="preserve"> </w:t>
+      </w:r>
+      <w:proofErr w:type="spellStart"/>
       <w:r>
         <w:rPr>
           <w:lang w:val="en-US"/>
         </w:rPr>
         <w:t>CardFactory</w:t>
       </w:r>
+      <w:proofErr w:type="spellEnd"/>
       <w:r>
         <w:t xml:space="preserve"> </w:t>
       </w:r>
       <w:r>
         <w:t xml:space="preserve">и </w:t>
       </w:r>
+      <w:proofErr w:type="spellStart"/>
       <w:r>
         <w:rPr>
           <w:lang w:val="en-US"/>
         </w:rPr>
         <w:t>Maticard</w:t>
       </w:r>
+      <w:proofErr w:type="spellEnd"/>
       <w:r>
         <w:t xml:space="preserve"> </w:t>
       </w:r>
@@ -7295,36 +7475,42 @@
       <w:r>
         <w:t xml:space="preserve">, на управляющей ЭВМ пользователем запускается ПО </w:t>
       </w:r>
+      <w:proofErr w:type="spellStart"/>
       <w:r>
         <w:rPr>
           <w:lang w:val="en-US"/>
         </w:rPr>
         <w:t>CardFactory</w:t>
       </w:r>
+      <w:proofErr w:type="spellEnd"/>
       <w:r>
         <w:t xml:space="preserve"> </w:t>
       </w:r>
       <w:r>
         <w:t xml:space="preserve">и </w:t>
       </w:r>
+      <w:proofErr w:type="spellStart"/>
       <w:r>
         <w:rPr>
           <w:lang w:val="en-US"/>
         </w:rPr>
         <w:t>Maticard</w:t>
       </w:r>
+      <w:proofErr w:type="spellEnd"/>
       <w:r>
         <w:t xml:space="preserve">. </w:t>
       </w:r>
       <w:r>
         <w:t xml:space="preserve">Конечно, следующим этапом является создание и настройка карточного продукта для обработки внутри </w:t>
       </w:r>
+      <w:proofErr w:type="spellStart"/>
       <w:r>
         <w:rPr>
           <w:lang w:val="en-US"/>
         </w:rPr>
         <w:t>CardFactory</w:t>
       </w:r>
+      <w:proofErr w:type="spellEnd"/>
       <w:r>
         <w:t xml:space="preserve">, </w:t>
       </w:r>
@@ -7334,12 +7520,14 @@
       <w:r>
         <w:t xml:space="preserve"> необходимый карточный продукт был заблаговременно создан и настроен. После, запускается обработка карточного продукта внутри </w:t>
       </w:r>
+      <w:proofErr w:type="spellStart"/>
       <w:r>
         <w:rPr>
           <w:lang w:val="en-US"/>
         </w:rPr>
         <w:t>CardFactory</w:t>
       </w:r>
+      <w:proofErr w:type="spellEnd"/>
       <w:r>
         <w:t xml:space="preserve">. Процесс обработки приостанавливается на моменте запуска модуля обработки </w:t>
       </w:r>
@@ -7391,12 +7579,14 @@
       <w:r>
         <w:t xml:space="preserve">внутри </w:t>
       </w:r>
+      <w:proofErr w:type="spellStart"/>
       <w:r>
         <w:rPr>
           <w:lang w:val="en-US"/>
         </w:rPr>
         <w:t>Maticard</w:t>
       </w:r>
+      <w:proofErr w:type="spellEnd"/>
       <w:r>
         <w:t xml:space="preserve"> </w:t>
       </w:r>
@@ -7484,12 +7674,14 @@
       <w:r>
         <w:t xml:space="preserve">файл и записывают в него специально заготовленное сообщение. После завершения процесса эмбоссирования, когда внутри </w:t>
       </w:r>
+      <w:proofErr w:type="spellStart"/>
       <w:r>
         <w:rPr>
           <w:lang w:val="en-US"/>
         </w:rPr>
         <w:t>Maticard</w:t>
       </w:r>
+      <w:proofErr w:type="spellEnd"/>
       <w:r>
         <w:t xml:space="preserve"> </w:t>
       </w:r>
@@ -7514,12 +7706,14 @@
       <w:r>
         <w:t xml:space="preserve"> Как только оно записывается в файл, </w:t>
       </w:r>
+      <w:proofErr w:type="spellStart"/>
       <w:r>
         <w:rPr>
           <w:lang w:val="en-US"/>
         </w:rPr>
         <w:t>CardFactory</w:t>
       </w:r>
+      <w:proofErr w:type="spellEnd"/>
       <w:r>
         <w:t xml:space="preserve"> </w:t>
       </w:r>
@@ -7556,12 +7750,14 @@
       <w:r>
         <w:t xml:space="preserve">продолжает свою работу. В этот момент необходимо достать карты из эмбоссера и переместить их в отдельный кардридер. После этого </w:t>
       </w:r>
+      <w:proofErr w:type="spellStart"/>
       <w:r>
         <w:rPr>
           <w:lang w:val="en-US"/>
         </w:rPr>
         <w:t>CardFactory</w:t>
       </w:r>
+      <w:proofErr w:type="spellEnd"/>
       <w:r>
         <w:t xml:space="preserve"> </w:t>
       </w:r>
@@ -7631,12 +7827,14 @@
       <w:r>
         <w:t xml:space="preserve">После, она завершит свое выполнение, вследствии чего завершит выполнение обработки и </w:t>
       </w:r>
+      <w:proofErr w:type="spellStart"/>
       <w:r>
         <w:rPr>
           <w:lang w:val="en-US"/>
         </w:rPr>
         <w:t>Maticard</w:t>
       </w:r>
+      <w:proofErr w:type="spellEnd"/>
       <w:r>
         <w:t xml:space="preserve"> </w:t>
       </w:r>
@@ -7730,21 +7928,25 @@
       <w:r>
         <w:t xml:space="preserve">средствами </w:t>
       </w:r>
+      <w:proofErr w:type="spellStart"/>
       <w:r>
         <w:rPr>
           <w:lang w:val="en-US"/>
         </w:rPr>
         <w:t>TranzWare</w:t>
       </w:r>
-      <w:r>
-        <w:t xml:space="preserve"> </w:t>
-      </w:r>
+      <w:proofErr w:type="spellEnd"/>
+      <w:r>
+        <w:t xml:space="preserve"> </w:t>
+      </w:r>
+      <w:proofErr w:type="spellStart"/>
       <w:r>
         <w:rPr>
           <w:lang w:val="en-US"/>
         </w:rPr>
         <w:t>CardFactory</w:t>
       </w:r>
+      <w:proofErr w:type="spellEnd"/>
       <w:r>
         <w:t xml:space="preserve"> станет непрерывным.</w:t>
       </w:r>
@@ -7796,12 +7998,14 @@
       <w:r>
         <w:t xml:space="preserve">процесса взаимодействия между драйвером и кардридерным модулем, структуры кардридерных драйверов внутри </w:t>
       </w:r>
+      <w:proofErr w:type="spellStart"/>
       <w:r>
         <w:rPr>
           <w:lang w:val="en-US"/>
         </w:rPr>
         <w:t>CardFactory</w:t>
       </w:r>
+      <w:proofErr w:type="spellEnd"/>
       <w:r>
         <w:t xml:space="preserve"> </w:t>
       </w:r>
@@ -7880,21 +8084,25 @@
       <w:r>
         <w:t xml:space="preserve">Произвести разработку и включить драйвер в </w:t>
       </w:r>
+      <w:proofErr w:type="spellStart"/>
       <w:r>
         <w:rPr>
           <w:lang w:val="en-US"/>
         </w:rPr>
         <w:t>TranzWare</w:t>
       </w:r>
-      <w:r>
-        <w:t xml:space="preserve"> </w:t>
-      </w:r>
+      <w:proofErr w:type="spellEnd"/>
+      <w:r>
+        <w:t xml:space="preserve"> </w:t>
+      </w:r>
+      <w:proofErr w:type="spellStart"/>
       <w:r>
         <w:rPr>
           <w:lang w:val="en-US"/>
         </w:rPr>
         <w:t>CardFactory</w:t>
       </w:r>
+      <w:proofErr w:type="spellEnd"/>
     </w:p>
     <w:p>
       <w:pPr>
@@ -8029,21 +8237,25 @@
       <w:r>
         <w:t xml:space="preserve">По выполнению представленных выше задач, можно будет с уверенностью скзать, что драйвер прямого управления кардридерным модулем был успешно разработан и внедрен в программный продукт </w:t>
       </w:r>
+      <w:proofErr w:type="spellStart"/>
       <w:r>
         <w:rPr>
           <w:lang w:val="en-US"/>
         </w:rPr>
         <w:t>TranzWare</w:t>
       </w:r>
-      <w:r>
-        <w:t xml:space="preserve"> </w:t>
-      </w:r>
+      <w:proofErr w:type="spellEnd"/>
+      <w:r>
+        <w:t xml:space="preserve"> </w:t>
+      </w:r>
+      <w:proofErr w:type="spellStart"/>
       <w:r>
         <w:rPr>
           <w:lang w:val="en-US"/>
         </w:rPr>
         <w:t>CardFactory</w:t>
       </w:r>
+      <w:proofErr w:type="spellEnd"/>
       <w:r>
         <w:t xml:space="preserve">. </w:t>
       </w:r>
@@ -8182,12 +8394,14 @@
       <w:r>
         <w:t xml:space="preserve">адрес – адрес управляющей платы. Адреса каждого отдельного кардриедра вычисляются добавлением номера ридера к младшему байту базового адреса. Команды модулю отправляются строкой текста с кодом на языке </w:t>
       </w:r>
+      <w:proofErr w:type="spellStart"/>
       <w:r>
         <w:rPr>
           <w:lang w:val="en-US"/>
         </w:rPr>
         <w:t>TCPScript</w:t>
       </w:r>
+      <w:proofErr w:type="spellEnd"/>
       <w:r>
         <w:t xml:space="preserve">. </w:t>
       </w:r>
@@ -8221,12 +8435,14 @@
       <w:r>
         <w:t xml:space="preserve">Платформа </w:t>
       </w:r>
+      <w:proofErr w:type="spellStart"/>
       <w:r>
         <w:rPr>
           <w:lang w:val="en-US"/>
         </w:rPr>
         <w:t>FloraWare</w:t>
       </w:r>
+      <w:proofErr w:type="spellEnd"/>
       <w:r>
         <w:t xml:space="preserve"> – </w:t>
       </w:r>
@@ -8239,12 +8455,14 @@
       <w:r>
         <w:t xml:space="preserve">приложения, его объектное дерево полностью загружается в главное дерево системы </w:t>
       </w:r>
+      <w:proofErr w:type="spellStart"/>
       <w:r>
         <w:rPr>
           <w:lang w:val="en-US"/>
         </w:rPr>
         <w:t>FloraWare</w:t>
       </w:r>
+      <w:proofErr w:type="spellEnd"/>
       <w:r>
         <w:t>, где его уже анализирует и выполняет объектная машина.</w:t>
       </w:r>
@@ -8260,21 +8478,25 @@
       <w:r>
         <w:t xml:space="preserve">Программный продукт </w:t>
       </w:r>
+      <w:proofErr w:type="spellStart"/>
       <w:r>
         <w:rPr>
           <w:lang w:val="en-US"/>
         </w:rPr>
         <w:t>TranzWare</w:t>
       </w:r>
-      <w:r>
-        <w:t xml:space="preserve"> </w:t>
-      </w:r>
+      <w:proofErr w:type="spellEnd"/>
+      <w:r>
+        <w:t xml:space="preserve"> </w:t>
+      </w:r>
+      <w:proofErr w:type="spellStart"/>
       <w:r>
         <w:rPr>
           <w:lang w:val="en-US"/>
         </w:rPr>
         <w:t>CardFactory</w:t>
       </w:r>
+      <w:proofErr w:type="spellEnd"/>
       <w:r>
         <w:t xml:space="preserve"> </w:t>
       </w:r>
@@ -8290,12 +8512,14 @@
       <w:r>
         <w:t xml:space="preserve">настройка в пределах </w:t>
       </w:r>
+      <w:proofErr w:type="spellStart"/>
       <w:r>
         <w:rPr>
           <w:lang w:val="en-US"/>
         </w:rPr>
         <w:t>CardFactory</w:t>
       </w:r>
+      <w:proofErr w:type="spellEnd"/>
       <w:r>
         <w:t xml:space="preserve"> – </w:t>
       </w:r>
@@ -8330,12 +8554,14 @@
       <w:r>
         <w:t xml:space="preserve">Утилита </w:t>
       </w:r>
+      <w:proofErr w:type="spellStart"/>
       <w:r>
         <w:rPr>
           <w:lang w:val="en-US"/>
         </w:rPr>
         <w:t>Maticard</w:t>
       </w:r>
+      <w:proofErr w:type="spellEnd"/>
       <w:r>
         <w:t xml:space="preserve"> </w:t>
       </w:r>
@@ -8515,12 +8741,14 @@
       <w:r>
         <w:t xml:space="preserve"> на платформе </w:t>
       </w:r>
+      <w:proofErr w:type="spellStart"/>
       <w:r>
         <w:rPr>
           <w:lang w:val="en-US"/>
         </w:rPr>
         <w:t>FloraWare</w:t>
       </w:r>
+      <w:proofErr w:type="spellEnd"/>
       <w:r>
         <w:t xml:space="preserve"> </w:t>
       </w:r>
@@ -8533,21 +8761,25 @@
       <w:r>
         <w:t xml:space="preserve">программного продукта </w:t>
       </w:r>
+      <w:proofErr w:type="spellStart"/>
       <w:r>
         <w:rPr>
           <w:lang w:val="en-US"/>
         </w:rPr>
         <w:t>TranzWare</w:t>
       </w:r>
-      <w:r>
-        <w:t xml:space="preserve"> </w:t>
-      </w:r>
+      <w:proofErr w:type="spellEnd"/>
+      <w:r>
+        <w:t xml:space="preserve"> </w:t>
+      </w:r>
+      <w:proofErr w:type="spellStart"/>
       <w:r>
         <w:rPr>
           <w:lang w:val="en-US"/>
         </w:rPr>
         <w:t>CardFactory</w:t>
       </w:r>
+      <w:proofErr w:type="spellEnd"/>
       <w:r>
         <w:t>.</w:t>
       </w:r>
@@ -8688,12 +8920,14 @@
       <w:r>
         <w:t xml:space="preserve"> в виде строки символов, в которой будет содержаться команда передачи данных карте, написанная на языке </w:t>
       </w:r>
+      <w:proofErr w:type="spellStart"/>
       <w:r>
         <w:rPr>
           <w:lang w:val="en-US"/>
         </w:rPr>
         <w:t>TCPscript</w:t>
       </w:r>
+      <w:proofErr w:type="spellEnd"/>
       <w:r>
         <w:t>.</w:t>
       </w:r>
@@ -8794,12 +9028,14 @@
       <w:r>
         <w:t xml:space="preserve">указания их в интерфейсе модуля </w:t>
       </w:r>
+      <w:proofErr w:type="spellStart"/>
       <w:r>
         <w:rPr>
           <w:lang w:val="en-US"/>
         </w:rPr>
         <w:t>ChipWriterDriver</w:t>
       </w:r>
+      <w:proofErr w:type="spellEnd"/>
       <w:r>
         <w:t>.</w:t>
       </w:r>
@@ -8893,6 +9129,7 @@
       <w:r>
         <w:t xml:space="preserve">эмбоссер, разрабатываемый драйвер осуществляет управление только модулем кардридера, остальные же модули эмбоссера управляются программным модулем </w:t>
       </w:r>
+      <w:proofErr w:type="spellStart"/>
       <w:r>
         <w:rPr>
           <w:i/>
@@ -8901,12 +9138,14 @@
         </w:rPr>
         <w:t>EmbosserDriver</w:t>
       </w:r>
+      <w:proofErr w:type="spellEnd"/>
       <w:r>
         <w:t xml:space="preserve"> </w:t>
       </w:r>
       <w:r>
         <w:t xml:space="preserve">в </w:t>
       </w:r>
+      <w:proofErr w:type="spellStart"/>
       <w:r>
         <w:rPr>
           <w:i/>
@@ -8915,6 +9154,7 @@
         </w:rPr>
         <w:t>CardFactory</w:t>
       </w:r>
+      <w:proofErr w:type="spellEnd"/>
       <w:r>
         <w:t xml:space="preserve">. </w:t>
       </w:r>
@@ -9058,11 +9298,19 @@
       <w:r>
         <w:t xml:space="preserve">которым является приложение </w:t>
       </w:r>
-      <w:r>
-        <w:rPr>
-          <w:lang w:val="en-US"/>
-        </w:rPr>
-        <w:t>CardFactory.</w:t>
+      <w:proofErr w:type="spellStart"/>
+      <w:r>
+        <w:rPr>
+          <w:lang w:val="en-US"/>
+        </w:rPr>
+        <w:t>CardFactory</w:t>
+      </w:r>
+      <w:proofErr w:type="spellEnd"/>
+      <w:r>
+        <w:rPr>
+          <w:lang w:val="en-US"/>
+        </w:rPr>
+        <w:t>.</w:t>
       </w:r>
     </w:p>
     <w:p>
@@ -9950,12 +10198,14 @@
       <w:r>
         <w:t xml:space="preserve"> вся экосистема </w:t>
       </w:r>
+      <w:proofErr w:type="spellStart"/>
       <w:r>
         <w:rPr>
           <w:lang w:val="en-US"/>
         </w:rPr>
         <w:t>FloraWare</w:t>
       </w:r>
+      <w:proofErr w:type="spellEnd"/>
       <w:r>
         <w:t>,</w:t>
       </w:r>
@@ -9977,12 +10227,14 @@
       <w:r>
         <w:t xml:space="preserve"> </w:t>
       </w:r>
+      <w:proofErr w:type="spellStart"/>
       <w:r>
         <w:rPr>
           <w:lang w:val="en-US"/>
         </w:rPr>
         <w:t>FloraWare</w:t>
       </w:r>
+      <w:proofErr w:type="spellEnd"/>
       <w:r>
         <w:t>.</w:t>
       </w:r>
@@ -10073,12 +10325,14 @@
       <w:r>
         <w:t xml:space="preserve">нативно поддерживает программную платформу </w:t>
       </w:r>
+      <w:proofErr w:type="spellStart"/>
       <w:r>
         <w:rPr>
           <w:lang w:val="en-US"/>
         </w:rPr>
         <w:t>FloraWare</w:t>
       </w:r>
+      <w:proofErr w:type="spellEnd"/>
       <w:r>
         <w:t xml:space="preserve">, </w:t>
       </w:r>
@@ -10098,12 +10352,14 @@
       <w:r>
         <w:t xml:space="preserve">Популярность среди клиентов: подавляющее большинство клиентов </w:t>
       </w:r>
+      <w:proofErr w:type="spellStart"/>
       <w:r>
         <w:rPr>
           <w:lang w:val="en-US"/>
         </w:rPr>
         <w:t>CompassPlus</w:t>
       </w:r>
+      <w:proofErr w:type="spellEnd"/>
       <w:r>
         <w:t xml:space="preserve">, </w:t>
       </w:r>
@@ -10125,12 +10381,14 @@
       <w:r>
         <w:t xml:space="preserve"> </w:t>
       </w:r>
+      <w:proofErr w:type="spellStart"/>
       <w:r>
         <w:rPr>
           <w:lang w:val="en-US"/>
         </w:rPr>
         <w:t>CardFactory</w:t>
       </w:r>
+      <w:proofErr w:type="spellEnd"/>
       <w:r>
         <w:t xml:space="preserve">, используют </w:t>
       </w:r>
@@ -10149,12 +10407,14 @@
       <w:r>
         <w:t xml:space="preserve"> </w:t>
       </w:r>
+      <w:proofErr w:type="spellStart"/>
       <w:r>
         <w:rPr>
           <w:lang w:val="en-US"/>
         </w:rPr>
         <w:t>CardFactory</w:t>
       </w:r>
+      <w:proofErr w:type="spellEnd"/>
       <w:r>
         <w:t xml:space="preserve"> и эмбоссерами.</w:t>
       </w:r>
@@ -10211,21 +10471,25 @@
       <w:r>
         <w:t xml:space="preserve">который является встроенным в программную платформу </w:t>
       </w:r>
+      <w:proofErr w:type="spellStart"/>
       <w:r>
         <w:rPr>
           <w:lang w:val="en-US"/>
         </w:rPr>
         <w:t>FloraWare</w:t>
       </w:r>
+      <w:proofErr w:type="spellEnd"/>
       <w:r>
         <w:t xml:space="preserve">. Данный язык используется для разработки любого программного продукта на базе </w:t>
       </w:r>
+      <w:proofErr w:type="spellStart"/>
       <w:r>
         <w:rPr>
           <w:lang w:val="en-US"/>
         </w:rPr>
         <w:t>FloraWare</w:t>
       </w:r>
+      <w:proofErr w:type="spellEnd"/>
       <w:r>
         <w:t xml:space="preserve"> </w:t>
       </w:r>
@@ -10250,24 +10514,28 @@
       <w:r>
         <w:t xml:space="preserve"> построен на основе требований к инструментарию для разработки продуктов, разрабатываемых на основе </w:t>
       </w:r>
+      <w:proofErr w:type="spellStart"/>
       <w:r>
         <w:rPr>
           <w:lang w:val="en-US"/>
         </w:rPr>
         <w:t>FloraWare</w:t>
       </w:r>
+      <w:proofErr w:type="spellEnd"/>
       <w:r>
         <w:t xml:space="preserve">, </w:t>
       </w:r>
       <w:r>
         <w:t xml:space="preserve">таких как </w:t>
       </w:r>
+      <w:proofErr w:type="spellStart"/>
       <w:r>
         <w:rPr>
           <w:lang w:val="en-US"/>
         </w:rPr>
         <w:t>CardFactory</w:t>
       </w:r>
+      <w:proofErr w:type="spellEnd"/>
       <w:r>
         <w:t xml:space="preserve">. Любой язык программирования напрямую влияет на </w:t>
       </w:r>
@@ -10350,12 +10618,14 @@
       <w:r>
         <w:t xml:space="preserve">постоянно расширяется, пополняясь новыми встроенными функциями и объектами. Так как язык полностью поддерживается и дорабатывается компанией </w:t>
       </w:r>
+      <w:proofErr w:type="spellStart"/>
       <w:r>
         <w:rPr>
           <w:lang w:val="en-US"/>
         </w:rPr>
         <w:t>CompassPlus</w:t>
       </w:r>
+      <w:proofErr w:type="spellEnd"/>
       <w:r>
         <w:t xml:space="preserve">, </w:t>
       </w:r>
@@ -10365,11 +10635,19 @@
       <w:r>
         <w:t xml:space="preserve">сти в том или ином функционале присутствует возможность отправки запроса на добавление нового функционала, после чего данный запрос будет рассмотрен и при одобрении внесен в будущую версию </w:t>
       </w:r>
-      <w:r>
-        <w:rPr>
-          <w:lang w:val="en-US"/>
-        </w:rPr>
-        <w:t>FloraWare,</w:t>
+      <w:proofErr w:type="spellStart"/>
+      <w:r>
+        <w:rPr>
+          <w:lang w:val="en-US"/>
+        </w:rPr>
+        <w:t>FloraWare</w:t>
+      </w:r>
+      <w:proofErr w:type="spellEnd"/>
+      <w:r>
+        <w:rPr>
+          <w:lang w:val="en-US"/>
+        </w:rPr>
+        <w:t>,</w:t>
       </w:r>
     </w:p>
     <w:p>
@@ -10399,12 +10677,14 @@
       <w:r>
         <w:t xml:space="preserve"> встроенный в </w:t>
       </w:r>
+      <w:proofErr w:type="spellStart"/>
       <w:r>
         <w:rPr>
           <w:lang w:val="en-US"/>
         </w:rPr>
         <w:t>FloraWare</w:t>
       </w:r>
+      <w:proofErr w:type="spellEnd"/>
       <w:r>
         <w:t xml:space="preserve"> </w:t>
       </w:r>
@@ -10507,12 +10787,14 @@
       <w:r>
         <w:t xml:space="preserve">При разработке на базе программной платформы </w:t>
       </w:r>
+      <w:proofErr w:type="spellStart"/>
       <w:r>
         <w:rPr>
           <w:lang w:val="en-US"/>
         </w:rPr>
         <w:t>FloraWare</w:t>
       </w:r>
+      <w:proofErr w:type="spellEnd"/>
       <w:r>
         <w:t xml:space="preserve"> </w:t>
       </w:r>
@@ -10586,12 +10868,14 @@
         <w:lastRenderedPageBreak/>
         <w:t xml:space="preserve">служить ключевым средством разработки экосистемы </w:t>
       </w:r>
+      <w:proofErr w:type="spellStart"/>
       <w:r>
         <w:rPr>
           <w:lang w:val="en-US"/>
         </w:rPr>
         <w:t>FloraWare</w:t>
       </w:r>
+      <w:proofErr w:type="spellEnd"/>
       <w:r>
         <w:t xml:space="preserve"> </w:t>
       </w:r>
@@ -10774,12 +11058,14 @@
       <w:r>
         <w:t xml:space="preserve">Кроме средств разработки платформа </w:t>
       </w:r>
+      <w:proofErr w:type="spellStart"/>
       <w:r>
         <w:rPr>
           <w:lang w:val="en-US"/>
         </w:rPr>
         <w:t>FloraWare</w:t>
       </w:r>
+      <w:proofErr w:type="spellEnd"/>
       <w:r>
         <w:t xml:space="preserve"> </w:t>
       </w:r>
@@ -10840,12 +11126,14 @@
       <w:r>
         <w:t xml:space="preserve">обладает рядом свойств, которые делают его незамимым при осуществлении любых разработок в экосистеме </w:t>
       </w:r>
+      <w:proofErr w:type="spellStart"/>
       <w:r>
         <w:rPr>
           <w:lang w:val="en-US"/>
         </w:rPr>
         <w:t>FloraWare</w:t>
       </w:r>
+      <w:proofErr w:type="spellEnd"/>
       <w:r>
         <w:t xml:space="preserve">, </w:t>
       </w:r>
@@ -10881,12 +11169,14 @@
       <w:r>
         <w:t xml:space="preserve">при условии, что внутри кода какого-либо объекта-функции или объекта-задачи была установлена точка остановки с помощью утилиты </w:t>
       </w:r>
+      <w:proofErr w:type="spellStart"/>
       <w:r>
         <w:rPr>
           <w:lang w:val="en-US"/>
         </w:rPr>
         <w:t>Desiner</w:t>
       </w:r>
+      <w:proofErr w:type="spellEnd"/>
       <w:r>
         <w:t xml:space="preserve">, а также при условии, что запущена утилита </w:t>
       </w:r>
@@ -11035,12 +11325,14 @@
       <w:r>
         <w:t xml:space="preserve">Также, в продукте </w:t>
       </w:r>
+      <w:proofErr w:type="spellStart"/>
       <w:r>
         <w:rPr>
           <w:lang w:val="en-US"/>
         </w:rPr>
         <w:t>CardFactory</w:t>
       </w:r>
+      <w:proofErr w:type="spellEnd"/>
       <w:r>
         <w:t xml:space="preserve"> </w:t>
       </w:r>
@@ -11139,21 +11431,25 @@
       <w:r>
         <w:t xml:space="preserve">Она помогает командам разработчиков эффективнее вместе работать над одним проектом. С помощью таких систем любой разработчик в команде сможет отслеживать выполненную работу, а также сможет загружать свои изменения в общий репозиторий, причем современные системы управления версиями предупреждают разработчиков о пересекающихся изменениях, что позволяет избежать перетирания изменений. Для разработки программного продукта </w:t>
       </w:r>
+      <w:proofErr w:type="spellStart"/>
       <w:r>
         <w:rPr>
           <w:lang w:val="en-US"/>
         </w:rPr>
         <w:t>TranzWare</w:t>
       </w:r>
-      <w:r>
-        <w:t xml:space="preserve"> </w:t>
-      </w:r>
+      <w:proofErr w:type="spellEnd"/>
+      <w:r>
+        <w:t xml:space="preserve"> </w:t>
+      </w:r>
+      <w:proofErr w:type="spellStart"/>
       <w:r>
         <w:rPr>
           <w:lang w:val="en-US"/>
         </w:rPr>
         <w:t>CardFactory</w:t>
       </w:r>
+      <w:proofErr w:type="spellEnd"/>
       <w:r>
         <w:t xml:space="preserve"> </w:t>
       </w:r>
@@ -11235,12 +11531,14 @@
       <w:r>
         <w:t xml:space="preserve">напрямую влияют на процесс разработки продукта, а также на дальнейшее внесение готового решения в рабочую версию </w:t>
       </w:r>
+      <w:proofErr w:type="spellStart"/>
       <w:r>
         <w:rPr>
           <w:lang w:val="en-US"/>
         </w:rPr>
         <w:t>CardFactory</w:t>
       </w:r>
+      <w:proofErr w:type="spellEnd"/>
       <w:r>
         <w:t>, конкретнее:,</w:t>
       </w:r>
@@ -11626,12 +11924,14 @@
       <w:r>
         <w:t xml:space="preserve">В рамках данной дипломной работы планируется внести изменения в интерфейс модуля </w:t>
       </w:r>
+      <w:proofErr w:type="spellStart"/>
       <w:r>
         <w:rPr>
           <w:lang w:val="en-US"/>
         </w:rPr>
         <w:t>ChipWriterDriver</w:t>
       </w:r>
+      <w:proofErr w:type="spellEnd"/>
       <w:r>
         <w:t xml:space="preserve"> </w:t>
       </w:r>
@@ -11659,12 +11959,14 @@
       <w:r>
         <w:t xml:space="preserve"> Все представленные ниже элементы будут расположены все вместе, недалеко друг от друга, ориентировочно в нижней части модуля, в новом разделе, который будет отмечен рамкой под заголовком «настройки </w:t>
       </w:r>
+      <w:proofErr w:type="spellStart"/>
       <w:r>
         <w:rPr>
           <w:lang w:val="en-US"/>
         </w:rPr>
         <w:t>Smartware</w:t>
       </w:r>
+      <w:proofErr w:type="spellEnd"/>
       <w:r>
         <w:t>»</w:t>
       </w:r>
@@ -11677,12 +11979,14 @@
       <w:r>
         <w:t>и «</w:t>
       </w:r>
+      <w:proofErr w:type="spellStart"/>
       <w:r>
         <w:rPr>
           <w:lang w:val="en-US"/>
         </w:rPr>
         <w:t>Smartware</w:t>
       </w:r>
+      <w:proofErr w:type="spellEnd"/>
       <w:r>
         <w:t xml:space="preserve"> </w:t>
       </w:r>
@@ -11706,12 +12010,14 @@
       <w:r>
         <w:t xml:space="preserve">Список спроектированных элементов, планируемых к добавлению в интерфейс модуля </w:t>
       </w:r>
+      <w:proofErr w:type="spellStart"/>
       <w:r>
         <w:rPr>
           <w:lang w:val="en-US"/>
         </w:rPr>
         <w:t>ChipWriterDriver</w:t>
       </w:r>
+      <w:proofErr w:type="spellEnd"/>
       <w:r>
         <w:t xml:space="preserve"> </w:t>
       </w:r>
@@ -12207,21 +12513,25 @@
       <w:r>
         <w:t xml:space="preserve">Метка: «настройки </w:t>
       </w:r>
+      <w:proofErr w:type="spellStart"/>
       <w:r>
         <w:rPr>
           <w:lang w:val="en-US"/>
         </w:rPr>
         <w:t>Smartware</w:t>
       </w:r>
+      <w:proofErr w:type="spellEnd"/>
       <w:r>
         <w:t>» в русскоязычном интерфейсе и «</w:t>
       </w:r>
+      <w:proofErr w:type="spellStart"/>
       <w:r>
         <w:rPr>
           <w:lang w:val="en-US"/>
         </w:rPr>
         <w:t>Smartware</w:t>
       </w:r>
+      <w:proofErr w:type="spellEnd"/>
       <w:r>
         <w:t xml:space="preserve"> </w:t>
       </w:r>
@@ -12271,12 +12581,14 @@
       <w:r>
         <w:t xml:space="preserve"> взаимодействовать также и с другими элементами, которые уже присутствуют в интерфейсе модуля </w:t>
       </w:r>
+      <w:proofErr w:type="spellStart"/>
       <w:r>
         <w:rPr>
           <w:lang w:val="en-US"/>
         </w:rPr>
         <w:t>ChipWriterDriver</w:t>
       </w:r>
+      <w:proofErr w:type="spellEnd"/>
       <w:r>
         <w:t xml:space="preserve">. </w:t>
       </w:r>
@@ -12292,12 +12604,14 @@
       <w:r>
         <w:t xml:space="preserve"> </w:t>
       </w:r>
+      <w:proofErr w:type="spellStart"/>
       <w:r>
         <w:rPr>
           <w:lang w:val="en-US"/>
         </w:rPr>
         <w:t>smartware</w:t>
       </w:r>
+      <w:proofErr w:type="spellEnd"/>
       <w:r>
         <w:t xml:space="preserve"> </w:t>
       </w:r>
@@ -12875,12 +13189,14 @@
       <w:r>
         <w:t xml:space="preserve">и </w:t>
       </w:r>
+      <w:proofErr w:type="spellStart"/>
       <w:r>
         <w:rPr>
           <w:lang w:val="en-US"/>
         </w:rPr>
         <w:t>sAddress</w:t>
       </w:r>
+      <w:proofErr w:type="spellEnd"/>
       <w:r>
         <w:t xml:space="preserve">, </w:t>
       </w:r>
@@ -12890,24 +13206,28 @@
       <w:r>
         <w:t xml:space="preserve"> </w:t>
       </w:r>
+      <w:proofErr w:type="spellStart"/>
       <w:r>
         <w:rPr>
           <w:lang w:val="en-US"/>
         </w:rPr>
         <w:t>WaitCard</w:t>
       </w:r>
+      <w:proofErr w:type="spellEnd"/>
       <w:r>
         <w:t>,</w:t>
       </w:r>
       <w:r>
         <w:t xml:space="preserve"> </w:t>
       </w:r>
+      <w:proofErr w:type="spellStart"/>
       <w:r>
         <w:rPr>
           <w:lang w:val="en-US"/>
         </w:rPr>
         <w:t>CardConnect</w:t>
       </w:r>
+      <w:proofErr w:type="spellEnd"/>
       <w:r>
         <w:t xml:space="preserve"> </w:t>
       </w:r>
@@ -12941,24 +13261,28 @@
       <w:r>
         <w:t xml:space="preserve">представляет из себя объект вида </w:t>
       </w:r>
+      <w:proofErr w:type="spellStart"/>
       <w:r>
         <w:rPr>
           <w:lang w:val="en-US"/>
         </w:rPr>
         <w:t>NetPort</w:t>
       </w:r>
+      <w:proofErr w:type="spellEnd"/>
       <w:r>
         <w:t xml:space="preserve">. </w:t>
       </w:r>
       <w:r>
         <w:t xml:space="preserve">Внутри </w:t>
       </w:r>
+      <w:proofErr w:type="spellStart"/>
       <w:r>
         <w:rPr>
           <w:lang w:val="en-US"/>
         </w:rPr>
         <w:t>FloraWare</w:t>
       </w:r>
+      <w:proofErr w:type="spellEnd"/>
       <w:r>
         <w:t xml:space="preserve"> </w:t>
       </w:r>
@@ -12995,14 +13319,14 @@
       <w:r>
         <w:t xml:space="preserve">адреса подключения, передача и принятие сообщений, а также подключение осуществляются путем использования внутренних свойств и методов объекта. </w:t>
       </w:r>
-      <w:proofErr w:type="gramStart"/>
+      <w:proofErr w:type="spellStart"/>
       <w:r>
         <w:rPr>
           <w:lang w:val="en-US"/>
         </w:rPr>
         <w:t>sAddress</w:t>
       </w:r>
-      <w:proofErr w:type="gramEnd"/>
+      <w:proofErr w:type="spellEnd"/>
       <w:r>
         <w:t xml:space="preserve"> –</w:t>
       </w:r>
@@ -13117,24 +13441,28 @@
       <w:r>
         <w:t xml:space="preserve">драйвером записи карты обязательно вызывается метод </w:t>
       </w:r>
+      <w:proofErr w:type="spellStart"/>
       <w:r>
         <w:rPr>
           <w:lang w:val="en-US"/>
         </w:rPr>
         <w:t>WaitCard</w:t>
       </w:r>
+      <w:proofErr w:type="spellEnd"/>
       <w:r>
         <w:t>, который ожидает подключения карты, но, так как кроме непосредственного ожидания необходимо выполнить настройку кардридера, а также инициализацию необходимой переменной для управления картой,</w:t>
       </w:r>
       <w:r>
         <w:t xml:space="preserve"> для облегчения понимания разработчиками, весь процесс ожидания и настройки вынесен в отдельный объект-функцию </w:t>
       </w:r>
+      <w:proofErr w:type="spellStart"/>
       <w:r>
         <w:rPr>
           <w:lang w:val="en-US"/>
         </w:rPr>
         <w:t>CardConnect</w:t>
       </w:r>
+      <w:proofErr w:type="spellEnd"/>
       <w:r>
         <w:t>,</w:t>
       </w:r>
@@ -13164,12 +13492,14 @@
       <w:r>
         <w:t xml:space="preserve">и </w:t>
       </w:r>
+      <w:proofErr w:type="spellStart"/>
       <w:r>
         <w:rPr>
           <w:lang w:val="en-US"/>
         </w:rPr>
         <w:t>TCPSend</w:t>
       </w:r>
+      <w:proofErr w:type="spellEnd"/>
       <w:r>
         <w:t xml:space="preserve">. </w:t>
       </w:r>
@@ -13191,12 +13521,14 @@
       <w:r>
         <w:t xml:space="preserve">собирающий команды для отправки на кардридерный модуль. После сборки команды отправляются на ридер посредством вызова функции </w:t>
       </w:r>
+      <w:proofErr w:type="spellStart"/>
       <w:r>
         <w:rPr>
           <w:lang w:val="en-US"/>
         </w:rPr>
         <w:t>TCPSend</w:t>
       </w:r>
+      <w:proofErr w:type="spellEnd"/>
       <w:r>
         <w:t xml:space="preserve">. </w:t>
       </w:r>
@@ -13239,21 +13571,25 @@
       <w:r>
         <w:t xml:space="preserve">данные передаются по сетевому каналу на модуль. В завершении, функция ожидает сообщения от модуля и по готовности принимает его методом </w:t>
       </w:r>
+      <w:proofErr w:type="spellStart"/>
       <w:r>
         <w:rPr>
           <w:lang w:val="en-US"/>
         </w:rPr>
         <w:t>Recv</w:t>
       </w:r>
+      <w:proofErr w:type="spellEnd"/>
       <w:r>
         <w:t xml:space="preserve"> и возвращает в виде строки текста. Стоит упомянуть, что функция </w:t>
       </w:r>
+      <w:proofErr w:type="spellStart"/>
       <w:r>
         <w:rPr>
           <w:lang w:val="en-US"/>
         </w:rPr>
         <w:t>TCPSend</w:t>
       </w:r>
+      <w:proofErr w:type="spellEnd"/>
       <w:r>
         <w:t xml:space="preserve"> </w:t>
       </w:r>
@@ -13296,12 +13632,14 @@
         <w:lastRenderedPageBreak/>
         <w:t xml:space="preserve">функции для взаимодействия. Единственная исключительная ситуация в модуле возникает при вызове функции </w:t>
       </w:r>
+      <w:proofErr w:type="spellStart"/>
       <w:r>
         <w:rPr>
           <w:lang w:val="en-US"/>
         </w:rPr>
         <w:t>TCPSend</w:t>
       </w:r>
+      <w:proofErr w:type="spellEnd"/>
       <w:r>
         <w:t xml:space="preserve"> в случае получения строки с исключением от модуля. При этом выбрасывается исключение, которое отлавливается драйвером записи карты и он завершает обработку. Сообщение полученного исключения выводится в трассу и отображается пользователю в специальном окне.</w:t>
       </w:r>
@@ -13310,84 +13648,98 @@
       <w:r>
         <w:t xml:space="preserve">Механизм отключения составлен объектами-фукнциями </w:t>
       </w:r>
+      <w:proofErr w:type="spellStart"/>
       <w:r>
         <w:rPr>
           <w:lang w:val="en-US"/>
         </w:rPr>
         <w:t>EjectCard</w:t>
       </w:r>
+      <w:proofErr w:type="spellEnd"/>
       <w:r>
         <w:t xml:space="preserve"> </w:t>
       </w:r>
       <w:r>
         <w:t xml:space="preserve">и </w:t>
       </w:r>
+      <w:proofErr w:type="spellStart"/>
       <w:r>
         <w:rPr>
           <w:lang w:val="en-US"/>
         </w:rPr>
         <w:t>CardClose</w:t>
       </w:r>
+      <w:proofErr w:type="spellEnd"/>
       <w:r>
         <w:t xml:space="preserve">. В данном случае логика работы функций аналогична </w:t>
       </w:r>
       <w:r>
         <w:t xml:space="preserve">функциям </w:t>
       </w:r>
+      <w:proofErr w:type="spellStart"/>
       <w:r>
         <w:rPr>
           <w:lang w:val="en-US"/>
         </w:rPr>
         <w:t>WaitCard</w:t>
       </w:r>
+      <w:proofErr w:type="spellEnd"/>
       <w:r>
         <w:t xml:space="preserve"> </w:t>
       </w:r>
       <w:r>
         <w:t xml:space="preserve">и </w:t>
       </w:r>
+      <w:proofErr w:type="spellStart"/>
       <w:r>
         <w:rPr>
           <w:lang w:val="en-US"/>
         </w:rPr>
         <w:t>CardConnect</w:t>
       </w:r>
+      <w:proofErr w:type="spellEnd"/>
       <w:r>
         <w:t xml:space="preserve">, </w:t>
       </w:r>
       <w:r>
         <w:t xml:space="preserve">рассмотренным выше. Функция </w:t>
       </w:r>
+      <w:proofErr w:type="spellStart"/>
       <w:r>
         <w:rPr>
           <w:lang w:val="en-US"/>
         </w:rPr>
         <w:t>EjectCard</w:t>
       </w:r>
+      <w:proofErr w:type="spellEnd"/>
       <w:r>
         <w:t xml:space="preserve"> </w:t>
       </w:r>
       <w:r>
         <w:t xml:space="preserve">вызывается драйвером записи карты для завершения процесса записи карты. Так как ее название не отражает действительности, была создана функция </w:t>
       </w:r>
+      <w:proofErr w:type="spellStart"/>
       <w:r>
         <w:rPr>
           <w:lang w:val="en-US"/>
         </w:rPr>
         <w:t>CardClose</w:t>
       </w:r>
+      <w:proofErr w:type="spellEnd"/>
       <w:r>
         <w:t>,</w:t>
       </w:r>
       <w:r>
         <w:t xml:space="preserve"> которая вызывается ей. В этой функции передаются команды закрытия подключения и отключения кардридера. Чтобы обработка драйвера записи карты не прерывалась на этапе закрытия при появлении исключения, оно отлавливается внутри функции </w:t>
       </w:r>
+      <w:proofErr w:type="spellStart"/>
       <w:r>
         <w:rPr>
           <w:lang w:val="en-US"/>
         </w:rPr>
         <w:t>EjectCard</w:t>
       </w:r>
+      <w:proofErr w:type="spellEnd"/>
       <w:r>
         <w:t xml:space="preserve"> </w:t>
       </w:r>
@@ -13450,12 +13802,14 @@
       <w:r>
         <w:t xml:space="preserve"> </w:t>
       </w:r>
+      <w:proofErr w:type="spellStart"/>
       <w:r>
         <w:rPr>
           <w:lang w:val="en-US"/>
         </w:rPr>
         <w:t>Smartware</w:t>
       </w:r>
+      <w:proofErr w:type="spellEnd"/>
       <w:r>
         <w:t>»</w:t>
       </w:r>
@@ -13564,12 +13918,14 @@
       <w:r>
         <w:t>.</w:t>
       </w:r>
+      <w:proofErr w:type="spellStart"/>
       <w:r>
         <w:rPr>
           <w:lang w:val="en-US"/>
         </w:rPr>
         <w:t>ini</w:t>
       </w:r>
+      <w:proofErr w:type="spellEnd"/>
       <w:r>
         <w:t xml:space="preserve"> </w:t>
       </w:r>
@@ -13612,46 +13968,295 @@
       <w:r>
         <w:t xml:space="preserve">записывает считанные настройки адреса и порта из файла в объект драйвера </w:t>
       </w:r>
+      <w:proofErr w:type="spellStart"/>
       <w:r>
         <w:rPr>
           <w:lang w:val="en-US"/>
         </w:rPr>
         <w:t>sAddress</w:t>
       </w:r>
+      <w:proofErr w:type="spellEnd"/>
       <w:r>
         <w:t>, из которого позже драйвер их достает для инициализации подключения.</w:t>
       </w:r>
       <w:r>
-        <w:t xml:space="preserve"> Так происходит при выборе однопоточного режима записи, или же</w:t>
-      </w:r>
-      <w:bookmarkStart w:id="35" w:name="_GoBack"/>
+        <w:t xml:space="preserve"> </w:t>
+      </w:r>
+      <w:r>
+        <w:t xml:space="preserve">К тому же, в модуль настроек </w:t>
+      </w:r>
+      <w:r>
+        <w:rPr>
+          <w:lang w:val="en-US"/>
+        </w:rPr>
+        <w:t>Chip</w:t>
+      </w:r>
+      <w:r>
+        <w:t xml:space="preserve"> </w:t>
+      </w:r>
+      <w:r>
+        <w:rPr>
+          <w:lang w:val="en-US"/>
+        </w:rPr>
+        <w:t>Writer</w:t>
+      </w:r>
+      <w:r>
+        <w:t xml:space="preserve"> </w:t>
+      </w:r>
+      <w:r>
+        <w:rPr>
+          <w:lang w:val="en-US"/>
+        </w:rPr>
+        <w:t>Driver</w:t>
+      </w:r>
+      <w:r>
+        <w:t xml:space="preserve"> </w:t>
+      </w:r>
+      <w:r>
+        <w:t>было внесено два вида контактных кардридеров, это «</w:t>
+      </w:r>
+      <w:r>
+        <w:rPr>
+          <w:lang w:val="en-US"/>
+        </w:rPr>
+        <w:t>Embosser</w:t>
+      </w:r>
+      <w:r>
+        <w:t xml:space="preserve"> </w:t>
+      </w:r>
+      <w:r>
+        <w:rPr>
+          <w:lang w:val="en-US"/>
+        </w:rPr>
+        <w:t>via</w:t>
+      </w:r>
+      <w:r>
+        <w:t xml:space="preserve"> </w:t>
+      </w:r>
+      <w:proofErr w:type="spellStart"/>
+      <w:r>
+        <w:rPr>
+          <w:lang w:val="en-US"/>
+        </w:rPr>
+        <w:t>Smartware</w:t>
+      </w:r>
+      <w:proofErr w:type="spellEnd"/>
+      <w:r>
+        <w:t xml:space="preserve"> </w:t>
+      </w:r>
+      <w:r>
+        <w:rPr>
+          <w:lang w:val="en-US"/>
+        </w:rPr>
+        <w:t>interface</w:t>
+      </w:r>
+      <w:r>
+        <w:t>»</w:t>
+      </w:r>
+      <w:r>
+        <w:t xml:space="preserve"> </w:t>
+      </w:r>
+      <w:r>
+        <w:t>и «</w:t>
+      </w:r>
+      <w:r>
+        <w:rPr>
+          <w:lang w:val="en-US"/>
+        </w:rPr>
+        <w:t>Embosser</w:t>
+      </w:r>
+      <w:r>
+        <w:t xml:space="preserve"> </w:t>
+      </w:r>
+      <w:r>
+        <w:rPr>
+          <w:lang w:val="en-US"/>
+        </w:rPr>
+        <w:t>via</w:t>
+      </w:r>
+      <w:r>
+        <w:t xml:space="preserve"> </w:t>
+      </w:r>
+      <w:r>
+        <w:rPr>
+          <w:lang w:val="en-US"/>
+        </w:rPr>
+        <w:t>multiple</w:t>
+      </w:r>
+      <w:r>
+        <w:t xml:space="preserve"> </w:t>
+      </w:r>
+      <w:proofErr w:type="spellStart"/>
+      <w:r>
+        <w:rPr>
+          <w:lang w:val="en-US"/>
+        </w:rPr>
+        <w:t>Smartware</w:t>
+      </w:r>
+      <w:proofErr w:type="spellEnd"/>
+      <w:r>
+        <w:t xml:space="preserve"> </w:t>
+      </w:r>
+      <w:r>
+        <w:rPr>
+          <w:lang w:val="en-US"/>
+        </w:rPr>
+        <w:t>interfaces</w:t>
+      </w:r>
+      <w:r>
+        <w:t>»</w:t>
+      </w:r>
+      <w:r>
+        <w:t xml:space="preserve">. </w:t>
+      </w:r>
+      <w:r>
+        <w:t xml:space="preserve">Первый используется для выбора режима однопоточной записи, при которой используется один кардридер для записи карт. В таком режиме инициализация происходит так, как это было описано выше. Второй </w:t>
+      </w:r>
+      <w:r>
+        <w:lastRenderedPageBreak/>
+        <w:t>же используется для выбора многопоточного режима записи. Этот режим использует несколько кардридеров для параллельной записи карт.</w:t>
+      </w:r>
+      <w:r>
+        <w:t xml:space="preserve"> При условии выбора такого режима процесс передачи настроек и инициализации будет немного разнится. </w:t>
+      </w:r>
+      <w:r>
+        <w:t xml:space="preserve">При запуске модуля обработки </w:t>
+      </w:r>
+      <w:r>
+        <w:rPr>
+          <w:lang w:val="en-US"/>
+        </w:rPr>
+        <w:t>Chip</w:t>
+      </w:r>
+      <w:r>
+        <w:t xml:space="preserve"> </w:t>
+      </w:r>
+      <w:r>
+        <w:rPr>
+          <w:lang w:val="en-US"/>
+        </w:rPr>
+        <w:t>Writer</w:t>
+      </w:r>
+      <w:r>
+        <w:t xml:space="preserve"> </w:t>
+      </w:r>
+      <w:r>
+        <w:rPr>
+          <w:lang w:val="en-US"/>
+        </w:rPr>
+        <w:t>Driver</w:t>
+      </w:r>
+      <w:r>
+        <w:t xml:space="preserve">, </w:t>
+      </w:r>
+      <w:r>
+        <w:t xml:space="preserve">запускается функция </w:t>
+      </w:r>
+      <w:r>
+        <w:rPr>
+          <w:lang w:val="en-US"/>
+        </w:rPr>
+        <w:t>Start</w:t>
+      </w:r>
+      <w:r>
+        <w:t xml:space="preserve">, </w:t>
+      </w:r>
+      <w:r>
+        <w:t xml:space="preserve">в которой происходит инициализация всех необходимых составляющих и загрузка настроек. При выборе однопоточного режима записи, внутри функции </w:t>
+      </w:r>
+      <w:r>
+        <w:rPr>
+          <w:lang w:val="en-US"/>
+        </w:rPr>
+        <w:t>Start</w:t>
+      </w:r>
+      <w:r>
+        <w:t xml:space="preserve"> </w:t>
+      </w:r>
+      <w:r>
+        <w:t xml:space="preserve">происходит загрузка кардридерного драйвера в дерево и в него передаются считанные из файла настройки. В случае выбора многопоточного режима запускается функция </w:t>
+      </w:r>
+      <w:proofErr w:type="spellStart"/>
+      <w:r>
+        <w:rPr>
+          <w:lang w:val="en-US"/>
+        </w:rPr>
+        <w:t>StartReaderInterfaces</w:t>
+      </w:r>
+      <w:proofErr w:type="spellEnd"/>
+      <w:r>
+        <w:t xml:space="preserve">, </w:t>
+      </w:r>
+      <w:r>
+        <w:t xml:space="preserve">внутри которой для каждого потока записи создается свой отдельный раздел в дереве. В каждый такой раздел загружается инстанция кардридерного драйвера. В этой же функции вычисляется </w:t>
+      </w:r>
+      <w:r>
+        <w:rPr>
+          <w:lang w:val="en-US"/>
+        </w:rPr>
+        <w:t>IP</w:t>
+      </w:r>
+      <w:r>
+        <w:t>-</w:t>
+      </w:r>
+      <w:r>
+        <w:t>адрес для каждого кардридера и записывается в необходимый объект в каждой инстанции. В общем, инициализация драйвера для обоих режимов не сильно разнится. Отличие состоит только в необходимости передачи настроек в несколько инстанций драйверов в многопоточном режиме, вме</w:t>
+      </w:r>
+      <w:r>
+        <w:t>сто одного в однопоточном.</w:t>
+      </w:r>
+    </w:p>
+    <w:p>
+      <w:pPr>
+        <w:pStyle w:val="Heading3"/>
+      </w:pPr>
+      <w:bookmarkStart w:id="35" w:name="_Toc200020170"/>
+      <w:r>
+        <w:t>3.1.2 Объектное дерево драйвера</w:t>
+      </w:r>
       <w:bookmarkEnd w:id="35"/>
-      <w:r>
-        <w:t xml:space="preserve"> </w:t>
-      </w:r>
-    </w:p>
-    <w:p/>
-    <w:p/>
-    <w:p>
-      <w:pPr>
-        <w:pStyle w:val="Heading3"/>
-      </w:pPr>
-      <w:bookmarkStart w:id="36" w:name="_Toc200020170"/>
-      <w:r>
-        <w:lastRenderedPageBreak/>
-        <w:t>3.1.2 Объектное дерево драйвера</w:t>
-      </w:r>
-      <w:bookmarkEnd w:id="36"/>
-    </w:p>
-    <w:p>
-      <w:r>
-        <w:t>Общая для драйверов работы с кардридерами структура</w:t>
-      </w:r>
-      <w:r>
-        <w:t xml:space="preserve"> объектов</w:t>
-      </w:r>
-      <w:r>
-        <w:t>:</w:t>
+    </w:p>
+    <w:p>
+      <w:bookmarkStart w:id="36" w:name="_Toc200020171"/>
+      <w:r>
+        <w:t xml:space="preserve">Рассмотрение архитектуры драйвера необходимо для общего понимания структуры и внутренних механизмов разработанного решения. Описанная таким образом архитектура позволяет осознать только </w:t>
+      </w:r>
+      <w:r>
+        <w:t>поверхностно те основополагающие механизмы, которые стоят за работой драйвера. Для получения полной картины разработанного программного решения, необходимостью является описание программного кода</w:t>
+      </w:r>
+      <w:r>
+        <w:t xml:space="preserve"> решения</w:t>
+      </w:r>
+      <w:r>
+        <w:t xml:space="preserve"> и, в связи с тем, что продукт разработан на базе платформы </w:t>
+      </w:r>
+      <w:proofErr w:type="spellStart"/>
+      <w:r>
+        <w:rPr>
+          <w:lang w:val="en-US"/>
+        </w:rPr>
+        <w:t>FloraWare</w:t>
+      </w:r>
+      <w:proofErr w:type="spellEnd"/>
+      <w:r>
+        <w:t xml:space="preserve">, </w:t>
+      </w:r>
+      <w:r>
+        <w:t>описание объектного дерева. В данном подразделе будут в полной мере описаны оба представленных компонента для разработанного драйвера кардридерного модуля, а также для модулей, в которых</w:t>
+      </w:r>
+      <w:r>
+        <w:t xml:space="preserve"> в рамках данной работы</w:t>
+      </w:r>
+      <w:r>
+        <w:t xml:space="preserve"> производились доработки.</w:t>
+      </w:r>
+    </w:p>
+    <w:p>
+      <w:r>
+        <w:t>Начнем, естественно, с объектного дерева разработанного драйвера кардридерного модуля.</w:t>
+      </w:r>
+      <w:r>
+        <w:t xml:space="preserve"> Сначала приведем полный список объектов и дадим краткое описание каждому:</w:t>
       </w:r>
     </w:p>
     <w:p>
@@ -13659,74 +14264,42 @@
         <w:pStyle w:val="ListParagraph"/>
         <w:numPr>
           <w:ilvl w:val="0"/>
-          <w:numId w:val="21"/>
+          <w:numId w:val="30"/>
         </w:numPr>
       </w:pPr>
       <w:r>
-        <w:t xml:space="preserve">Функция </w:t>
-      </w:r>
-      <w:r>
-        <w:rPr>
-          <w:lang w:val="en-US"/>
-        </w:rPr>
-        <w:t>RInt</w:t>
-      </w:r>
-      <w:r>
-        <w:t xml:space="preserve"> </w:t>
-      </w:r>
-      <w:r>
-        <w:rPr>
-          <w:lang w:val="en-US"/>
-        </w:rPr>
-        <w:t>Send</w:t>
-      </w:r>
+        <w:rPr>
+          <w:lang w:val="en-US"/>
+        </w:rPr>
+        <w:t>void</w:t>
+      </w:r>
+      <w:r>
+        <w:t xml:space="preserve"> </w:t>
+      </w:r>
+      <w:proofErr w:type="spellStart"/>
+      <w:proofErr w:type="gramStart"/>
+      <w:r>
+        <w:rPr>
+          <w:lang w:val="en-US"/>
+        </w:rPr>
+        <w:t>CardClose</w:t>
+      </w:r>
+      <w:proofErr w:type="spellEnd"/>
       <w:r>
         <w:t>(</w:t>
       </w:r>
-      <w:r>
-        <w:rPr>
-          <w:lang w:val="en-US"/>
-        </w:rPr>
-        <w:t>RS</w:t>
-      </w:r>
-      <w:r>
-        <w:rPr>
-          <w:lang w:val="en-US"/>
-        </w:rPr>
-        <w:t>tr</w:t>
-      </w:r>
-      <w:r>
-        <w:t xml:space="preserve"> </w:t>
-      </w:r>
-      <w:r>
-        <w:rPr>
-          <w:lang w:val="en-US"/>
-        </w:rPr>
-        <w:t>sendData</w:t>
-      </w:r>
-      <w:r>
-        <w:t xml:space="preserve">, </w:t>
-      </w:r>
-      <w:r>
-        <w:rPr>
-          <w:lang w:val="en-US"/>
-        </w:rPr>
-        <w:t>LStr</w:t>
-      </w:r>
-      <w:r>
-        <w:t xml:space="preserve"> </w:t>
-      </w:r>
-      <w:r>
-        <w:rPr>
-          <w:lang w:val="en-US"/>
-        </w:rPr>
-        <w:t>recvData</w:t>
-      </w:r>
-      <w:r>
-        <w:t xml:space="preserve">) </w:t>
-      </w:r>
-      <w:r>
-        <w:t>для отправки данных на подключенный ридер.</w:t>
+      <w:proofErr w:type="gramEnd"/>
+      <w:r>
+        <w:t xml:space="preserve">) – </w:t>
+      </w:r>
+      <w:r>
+        <w:t>объект-функция. Используется для завершения работы с кардридером. Выключает кардридер и очищает</w:t>
+      </w:r>
+      <w:r>
+        <w:t xml:space="preserve"> настройки</w:t>
+      </w:r>
+      <w:r>
+        <w:t>.</w:t>
       </w:r>
     </w:p>
     <w:p>
@@ -13734,35 +14307,71 @@
         <w:pStyle w:val="ListParagraph"/>
         <w:numPr>
           <w:ilvl w:val="0"/>
-          <w:numId w:val="21"/>
+          <w:numId w:val="30"/>
         </w:numPr>
       </w:pPr>
       <w:r>
-        <w:t>Функция</w:t>
-      </w:r>
-      <w:r>
-        <w:t xml:space="preserve"> </w:t>
-      </w:r>
-      <w:r>
-        <w:rPr>
-          <w:lang w:val="en-US"/>
-        </w:rPr>
-        <w:t>void</w:t>
-      </w:r>
-      <w:r>
-        <w:t xml:space="preserve"> </w:t>
-      </w:r>
-      <w:r>
-        <w:rPr>
-          <w:lang w:val="en-US"/>
-        </w:rPr>
-        <w:t>Wait</w:t>
-      </w:r>
-      <w:r>
-        <w:t>()</w:t>
-      </w:r>
-      <w:r>
-        <w:t xml:space="preserve"> для приостановки обработки и ожидания продолжения</w:t>
+        <w:rPr>
+          <w:lang w:val="en-US"/>
+        </w:rPr>
+        <w:t xml:space="preserve">void </w:t>
+      </w:r>
+      <w:proofErr w:type="spellStart"/>
+      <w:proofErr w:type="gramStart"/>
+      <w:r>
+        <w:rPr>
+          <w:lang w:val="en-US"/>
+        </w:rPr>
+        <w:t>CardConnect</w:t>
+      </w:r>
+      <w:proofErr w:type="spellEnd"/>
+      <w:r>
+        <w:rPr>
+          <w:lang w:val="en-US"/>
+        </w:rPr>
+        <w:t>(</w:t>
+      </w:r>
+      <w:proofErr w:type="gramEnd"/>
+      <w:r>
+        <w:rPr>
+          <w:lang w:val="en-US"/>
+        </w:rPr>
+        <w:t xml:space="preserve">str </w:t>
+      </w:r>
+      <w:proofErr w:type="spellStart"/>
+      <w:r>
+        <w:rPr>
+          <w:lang w:val="en-US"/>
+        </w:rPr>
+        <w:t>interfaceType</w:t>
+      </w:r>
+      <w:proofErr w:type="spellEnd"/>
+      <w:r>
+        <w:rPr>
+          <w:lang w:val="en-US"/>
+        </w:rPr>
+        <w:t xml:space="preserve">) – </w:t>
+      </w:r>
+      <w:r>
+        <w:t>объект</w:t>
+      </w:r>
+      <w:r>
+        <w:rPr>
+          <w:lang w:val="en-US"/>
+        </w:rPr>
+        <w:t>-</w:t>
+      </w:r>
+      <w:r>
+        <w:t>функция</w:t>
+      </w:r>
+      <w:r>
+        <w:rPr>
+          <w:lang w:val="en-US"/>
+        </w:rPr>
+        <w:t xml:space="preserve">. </w:t>
+      </w:r>
+      <w:r>
+        <w:t>Используется для настройки кардридера и ожидания карты. Кроме того, осуществляет переподключение к кардридерному модулю, если соединение по какой-либо причине было разорвано.</w:t>
       </w:r>
     </w:p>
     <w:p>
@@ -13770,13 +14379,10 @@
         <w:pStyle w:val="ListParagraph"/>
         <w:numPr>
           <w:ilvl w:val="0"/>
-          <w:numId w:val="21"/>
+          <w:numId w:val="30"/>
         </w:numPr>
       </w:pPr>
       <w:r>
-        <w:t xml:space="preserve">Функция </w:t>
-      </w:r>
-      <w:r>
         <w:rPr>
           <w:lang w:val="en-US"/>
         </w:rPr>
@@ -13785,41 +14391,42 @@
       <w:r>
         <w:t xml:space="preserve"> </w:t>
       </w:r>
-      <w:r>
-        <w:rPr>
-          <w:lang w:val="en-US"/>
-        </w:rPr>
-        <w:t>Open</w:t>
-      </w:r>
+      <w:proofErr w:type="spellStart"/>
+      <w:proofErr w:type="gramStart"/>
+      <w:r>
+        <w:rPr>
+          <w:lang w:val="en-US"/>
+        </w:rPr>
+        <w:t>EjectCard</w:t>
+      </w:r>
+      <w:proofErr w:type="spellEnd"/>
       <w:r>
         <w:t>(</w:t>
       </w:r>
-      <w:r>
-        <w:rPr>
-          <w:lang w:val="en-US"/>
-        </w:rPr>
-        <w:t>RS</w:t>
-      </w:r>
-      <w:r>
-        <w:rPr>
-          <w:lang w:val="en-US"/>
-        </w:rPr>
-        <w:t>tr</w:t>
-      </w:r>
-      <w:r>
-        <w:t xml:space="preserve"> </w:t>
-      </w:r>
-      <w:r>
-        <w:rPr>
-          <w:lang w:val="en-US"/>
-        </w:rPr>
-        <w:t>address</w:t>
-      </w:r>
-      <w:r>
-        <w:t xml:space="preserve">) </w:t>
-      </w:r>
-      <w:r>
-        <w:t>для осуществления подключения к ридеру</w:t>
+      <w:proofErr w:type="gramEnd"/>
+      <w:r>
+        <w:t xml:space="preserve">) – </w:t>
+      </w:r>
+      <w:r>
+        <w:t xml:space="preserve">объект-функция. Часть интерфейса взаимодействия с драйвером записи карты. Используется для </w:t>
+      </w:r>
+      <w:r>
+        <w:lastRenderedPageBreak/>
+        <w:t xml:space="preserve">завершения работы с кардридером. В случае с разработанным драйвером вызывает функцию </w:t>
+      </w:r>
+      <w:proofErr w:type="spellStart"/>
+      <w:r>
+        <w:rPr>
+          <w:lang w:val="en-US"/>
+        </w:rPr>
+        <w:t>CardClose</w:t>
+      </w:r>
+      <w:proofErr w:type="spellEnd"/>
+      <w:r>
+        <w:rPr>
+          <w:lang w:val="en-US"/>
+        </w:rPr>
+        <w:t>.</w:t>
       </w:r>
     </w:p>
     <w:p>
@@ -13827,37 +14434,67 @@
         <w:pStyle w:val="ListParagraph"/>
         <w:numPr>
           <w:ilvl w:val="0"/>
-          <w:numId w:val="21"/>
+          <w:numId w:val="30"/>
         </w:numPr>
       </w:pPr>
       <w:r>
-        <w:t xml:space="preserve">Функция </w:t>
-      </w:r>
-      <w:r>
-        <w:rPr>
-          <w:lang w:val="en-US"/>
-        </w:rPr>
-        <w:t>void</w:t>
-      </w:r>
-      <w:r>
-        <w:t xml:space="preserve"> </w:t>
-      </w:r>
-      <w:r>
-        <w:rPr>
-          <w:lang w:val="en-US"/>
-        </w:rPr>
-        <w:t>Restart</w:t>
-      </w:r>
-      <w:r>
-        <w:t xml:space="preserve">() </w:t>
-      </w:r>
-      <w:r>
-        <w:t>для перезагрузки ридера и возврат его в изначальное состояние</w:t>
-      </w:r>
-    </w:p>
-    <w:p>
-      <w:r>
-        <w:t>Индивидуальные элементы разработанного драйвера, необходимые для его работы:</w:t>
+        <w:rPr>
+          <w:lang w:val="en-US"/>
+        </w:rPr>
+        <w:t>Str</w:t>
+      </w:r>
+      <w:r>
+        <w:t xml:space="preserve"> </w:t>
+      </w:r>
+      <w:proofErr w:type="spellStart"/>
+      <w:r>
+        <w:rPr>
+          <w:lang w:val="en-US"/>
+        </w:rPr>
+        <w:t>interfaceType</w:t>
+      </w:r>
+      <w:proofErr w:type="spellEnd"/>
+      <w:r>
+        <w:t xml:space="preserve"> – </w:t>
+      </w:r>
+      <w:r>
+        <w:t xml:space="preserve">объект-переменная типа </w:t>
+      </w:r>
+      <w:r>
+        <w:rPr>
+          <w:lang w:val="en-US"/>
+        </w:rPr>
+        <w:t>string</w:t>
+      </w:r>
+      <w:r>
+        <w:t xml:space="preserve">. </w:t>
+      </w:r>
+      <w:r>
+        <w:t>Представляет из себя строку текста с указанием типа кардридерного интерфейса. Может принимать значения «</w:t>
+      </w:r>
+      <w:r>
+        <w:rPr>
+          <w:lang w:val="en-US"/>
+        </w:rPr>
+        <w:t>contact</w:t>
+      </w:r>
+      <w:r>
+        <w:t>» или «</w:t>
+      </w:r>
+      <w:r>
+        <w:rPr>
+          <w:lang w:val="en-US"/>
+        </w:rPr>
+        <w:t>contactless</w:t>
+      </w:r>
+      <w:r>
+        <w:t>»</w:t>
+      </w:r>
+      <w:r>
+        <w:t xml:space="preserve">. </w:t>
+      </w:r>
+      <w:r>
+        <w:t>Используется в некоторых функциях.</w:t>
       </w:r>
     </w:p>
     <w:p>
@@ -13865,25 +14502,60 @@
         <w:pStyle w:val="ListParagraph"/>
         <w:numPr>
           <w:ilvl w:val="0"/>
-          <w:numId w:val="22"/>
+          <w:numId w:val="30"/>
         </w:numPr>
       </w:pPr>
+      <w:r>
+        <w:rPr>
+          <w:lang w:val="en-US"/>
+        </w:rPr>
+        <w:t>void</w:t>
+      </w:r>
+      <w:r>
+        <w:t xml:space="preserve"> </w:t>
+      </w:r>
       <w:proofErr w:type="gramStart"/>
       <w:r>
         <w:rPr>
           <w:lang w:val="en-US"/>
         </w:rPr>
-        <w:t>CardConnect</w:t>
+        <w:t>Open</w:t>
       </w:r>
       <w:r>
         <w:t>(</w:t>
       </w:r>
       <w:proofErr w:type="gramEnd"/>
       <w:r>
-        <w:t>)</w:t>
-      </w:r>
-      <w:r>
-        <w:t xml:space="preserve"> – собирает и отправляет на плату команды инициализации и настройки ридера.</w:t>
+        <w:t xml:space="preserve">) – </w:t>
+      </w:r>
+      <w:r>
+        <w:t xml:space="preserve">объект-функция. </w:t>
+      </w:r>
+      <w:r>
+        <w:t xml:space="preserve">Открывает подключение к кардридерному модулю используя методы объекта </w:t>
+      </w:r>
+      <w:r>
+        <w:rPr>
+          <w:lang w:val="en-US"/>
+        </w:rPr>
+        <w:t>port</w:t>
+      </w:r>
+      <w:r>
+        <w:t xml:space="preserve">. </w:t>
+      </w:r>
+      <w:r>
+        <w:t xml:space="preserve">Кроме того, выполняет предварительную настройку объекта, прописывая в него адрес подключения из объекта </w:t>
+      </w:r>
+      <w:proofErr w:type="spellStart"/>
+      <w:r>
+        <w:rPr>
+          <w:lang w:val="en-US"/>
+        </w:rPr>
+        <w:t>sAddress</w:t>
+      </w:r>
+      <w:proofErr w:type="spellEnd"/>
+      <w:r>
+        <w:t>.</w:t>
       </w:r>
     </w:p>
     <w:p>
@@ -13891,283 +14563,42 @@
         <w:pStyle w:val="ListParagraph"/>
         <w:numPr>
           <w:ilvl w:val="0"/>
-          <w:numId w:val="22"/>
+          <w:numId w:val="30"/>
         </w:numPr>
       </w:pPr>
-      <w:proofErr w:type="gramStart"/>
-      <w:r>
-        <w:rPr>
-          <w:lang w:val="en-US"/>
-        </w:rPr>
-        <w:t>CardClose</w:t>
-      </w:r>
-      <w:r>
-        <w:t>(</w:t>
-      </w:r>
-      <w:proofErr w:type="gramEnd"/>
-      <w:r>
-        <w:t>)</w:t>
-      </w:r>
-      <w:r>
-        <w:t xml:space="preserve"> – собирает и отправляет на плату команду отключения ридера и сброса его настроек.</w:t>
-      </w:r>
-    </w:p>
-    <w:p>
-      <w:pPr>
-        <w:pStyle w:val="ListParagraph"/>
-        <w:numPr>
-          <w:ilvl w:val="0"/>
-          <w:numId w:val="22"/>
-        </w:numPr>
-      </w:pPr>
-      <w:r>
-        <w:rPr>
-          <w:lang w:val="en-US"/>
-        </w:rPr>
-        <w:t>EjectCard()</w:t>
-      </w:r>
-      <w:r>
-        <w:t xml:space="preserve"> - </w:t>
-      </w:r>
-    </w:p>
-    <w:p>
-      <w:pPr>
-        <w:pStyle w:val="ListParagraph"/>
-        <w:numPr>
-          <w:ilvl w:val="0"/>
-          <w:numId w:val="22"/>
-        </w:numPr>
-      </w:pPr>
-      <w:r>
-        <w:rPr>
-          <w:lang w:val="en-US"/>
-        </w:rPr>
-        <w:t>Port</w:t>
-      </w:r>
-      <w:r>
-        <w:t xml:space="preserve"> – представляет из себя объект-сокет, который можно привязать к определенному удаленному </w:t>
-      </w:r>
-      <w:r>
-        <w:rPr>
-          <w:lang w:val="en-US"/>
-        </w:rPr>
-        <w:t>IP</w:t>
-      </w:r>
-      <w:r>
-        <w:t>-</w:t>
-      </w:r>
-      <w:r>
-        <w:t xml:space="preserve">адресу и управлять подключением к нему. В данном же случае объект привязывается к адресу и порту, указанным в строке </w:t>
-      </w:r>
-      <w:r>
-        <w:rPr>
-          <w:lang w:val="en-US"/>
-        </w:rPr>
-        <w:t>sAddress</w:t>
-      </w:r>
-      <w:r>
-        <w:t>;</w:t>
-      </w:r>
-    </w:p>
-    <w:p>
-      <w:pPr>
-        <w:pStyle w:val="ListParagraph"/>
-        <w:numPr>
-          <w:ilvl w:val="0"/>
-          <w:numId w:val="22"/>
-        </w:numPr>
-      </w:pPr>
-      <w:r>
-        <w:rPr>
-          <w:lang w:val="en-US"/>
-        </w:rPr>
-        <w:t>ReaderNum</w:t>
-      </w:r>
-    </w:p>
-    <w:p>
-      <w:pPr>
-        <w:pStyle w:val="ListParagraph"/>
-        <w:numPr>
-          <w:ilvl w:val="0"/>
-          <w:numId w:val="22"/>
-        </w:numPr>
-      </w:pPr>
-      <w:r>
-        <w:rPr>
-          <w:lang w:val="en-US"/>
-        </w:rPr>
-        <w:t>ReconnectSCR()</w:t>
-      </w:r>
-    </w:p>
-    <w:p>
-      <w:pPr>
-        <w:pStyle w:val="ListParagraph"/>
-        <w:numPr>
-          <w:ilvl w:val="0"/>
-          <w:numId w:val="22"/>
-        </w:numPr>
-      </w:pPr>
-      <w:r>
-        <w:rPr>
-          <w:lang w:val="en-US"/>
-        </w:rPr>
-        <w:t>Reset</w:t>
-      </w:r>
-      <w:r>
-        <w:t>()</w:t>
-      </w:r>
-      <w:r>
-        <w:t xml:space="preserve"> – </w:t>
-      </w:r>
-      <w:r>
-        <w:t>осуществляет сброс настроек ридера</w:t>
-      </w:r>
-    </w:p>
-    <w:p>
-      <w:pPr>
-        <w:pStyle w:val="ListParagraph"/>
-        <w:numPr>
-          <w:ilvl w:val="0"/>
-          <w:numId w:val="22"/>
-        </w:numPr>
-      </w:pPr>
-      <w:proofErr w:type="gramStart"/>
-      <w:r>
-        <w:rPr>
-          <w:lang w:val="en-US"/>
-        </w:rPr>
-        <w:t>sAddress</w:t>
-      </w:r>
-      <w:proofErr w:type="gramEnd"/>
-      <w:r>
-        <w:t xml:space="preserve"> – </w:t>
-      </w:r>
-      <w:r>
-        <w:t xml:space="preserve">строка, содержащая </w:t>
-      </w:r>
-      <w:r>
-        <w:rPr>
-          <w:lang w:val="en-US"/>
-        </w:rPr>
-        <w:t>IP</w:t>
-      </w:r>
-      <w:r>
-        <w:t>-</w:t>
-      </w:r>
-      <w:r>
-        <w:t>адрес кардридера, с которым данная инстанция драйвера производит работу.</w:t>
-      </w:r>
-    </w:p>
-    <w:p>
-      <w:pPr>
-        <w:pStyle w:val="ListParagraph"/>
-        <w:numPr>
-          <w:ilvl w:val="0"/>
-          <w:numId w:val="22"/>
-        </w:numPr>
-      </w:pPr>
-      <w:r>
-        <w:rPr>
-          <w:lang w:val="en-US"/>
-        </w:rPr>
-        <w:t>TCPSend</w:t>
-      </w:r>
-      <w:r>
-        <w:t>()</w:t>
-      </w:r>
-      <w:r>
-        <w:t xml:space="preserve"> – составление скриптов записи и отправка сообщений </w:t>
-      </w:r>
-    </w:p>
-    <w:p>
-      <w:pPr>
-        <w:pStyle w:val="ListParagraph"/>
-        <w:numPr>
-          <w:ilvl w:val="0"/>
-          <w:numId w:val="22"/>
-        </w:numPr>
-      </w:pPr>
-      <w:r>
-        <w:rPr>
-          <w:lang w:val="en-US"/>
-        </w:rPr>
-        <w:t>WaitCard()</w:t>
-      </w:r>
-    </w:p>
-    <w:p>
-      <w:r>
-        <w:t>(Повторите кратко архитектуру драйвера, которая была подробно описана в предыдущей главе. Это необходимо для контекста. Пример:</w:t>
-      </w:r>
-    </w:p>
-    <w:p>
-      <w:r>
-        <w:t>Разработанный драйвер имеет модульную архитектуру, состоящую из следующих основных компонентов:</w:t>
-      </w:r>
-    </w:p>
-    <w:p>
-      <w:r>
-        <w:t>Менеджер соединений: Управляет установлением и завершением соединения с эмбоссером.</w:t>
-      </w:r>
-    </w:p>
-    <w:p>
-      <w:r>
-        <w:t>Обработчик команд: Преобразует команды API в специфичные для эмбоссера команды.</w:t>
-      </w:r>
-    </w:p>
-    <w:p>
-      <w:r>
-        <w:t>Драйвер устройства (Device Driver): Непосредственно взаимодействует с аппаратным интерфейсом.</w:t>
-      </w:r>
-    </w:p>
-    <w:p>
-      <w:r>
-        <w:lastRenderedPageBreak/>
-        <w:t>Обработчик ошибок: Обрабатывает ошибки и уведомляет вызывающее приложение.</w:t>
-      </w:r>
-    </w:p>
-    <w:p>
-      <w:r>
-        <w:t>Менеджер конфигурации: Управляет настройками конфигурации драйвера.</w:t>
-      </w:r>
-    </w:p>
-    <w:p>
-      <w:r>
-        <w:t>Каждый компонент выполняет определенную функцию и взаимодействует с другими компонентами через четко определенные интерфейсы.</w:t>
-      </w:r>
     </w:p>
     <w:p>
       <w:pPr>
         <w:pStyle w:val="Heading2"/>
       </w:pPr>
-      <w:bookmarkStart w:id="37" w:name="_Toc200020171"/>
       <w:r>
         <w:t>3.2 Порядок работы с разработанным кардридерным драйвером</w:t>
       </w:r>
+      <w:bookmarkEnd w:id="36"/>
+      <w:r>
+        <w:t xml:space="preserve"> </w:t>
+      </w:r>
+    </w:p>
+    <w:p/>
+    <w:p>
+      <w:pPr>
+        <w:pStyle w:val="Heading3"/>
+      </w:pPr>
+      <w:bookmarkStart w:id="37" w:name="_Toc200020172"/>
+      <w:r>
+        <w:t>3.2.1 Порядок настройки карточного продукта</w:t>
+      </w:r>
       <w:bookmarkEnd w:id="37"/>
-      <w:r>
-        <w:t xml:space="preserve"> </w:t>
-      </w:r>
-    </w:p>
-    <w:p/>
+    </w:p>
     <w:p>
       <w:pPr>
         <w:pStyle w:val="Heading3"/>
       </w:pPr>
-      <w:bookmarkStart w:id="38" w:name="_Toc200020172"/>
-      <w:r>
-        <w:t>3.2.1 Порядок настройки карточного продукта</w:t>
+      <w:bookmarkStart w:id="38" w:name="_Toc200020173"/>
+      <w:r>
+        <w:t>3.2.2 Порядок запуска обработки</w:t>
       </w:r>
       <w:bookmarkEnd w:id="38"/>
-    </w:p>
-    <w:p>
-      <w:pPr>
-        <w:pStyle w:val="Heading3"/>
-      </w:pPr>
-      <w:bookmarkStart w:id="39" w:name="_Toc200020173"/>
-      <w:r>
-        <w:t>3.2.2 Порядок запуска обработки</w:t>
-      </w:r>
-      <w:bookmarkEnd w:id="39"/>
     </w:p>
     <w:p>
       <w:pPr>
@@ -14182,12 +14613,12 @@
       <w:pPr>
         <w:pStyle w:val="Heading1"/>
       </w:pPr>
-      <w:bookmarkStart w:id="40" w:name="_Toc200020174"/>
+      <w:bookmarkStart w:id="39" w:name="_Toc200020174"/>
       <w:r>
         <w:lastRenderedPageBreak/>
         <w:t>Заключение</w:t>
       </w:r>
-      <w:bookmarkEnd w:id="40"/>
+      <w:bookmarkEnd w:id="39"/>
     </w:p>
     <w:p>
       <w:pPr>
@@ -14202,12 +14633,12 @@
       <w:pPr>
         <w:pStyle w:val="Heading1"/>
       </w:pPr>
-      <w:bookmarkStart w:id="41" w:name="_Toc200020175"/>
+      <w:bookmarkStart w:id="40" w:name="_Toc200020175"/>
       <w:r>
         <w:lastRenderedPageBreak/>
         <w:t>Список используемой литературы</w:t>
       </w:r>
-      <w:bookmarkEnd w:id="41"/>
+      <w:bookmarkEnd w:id="40"/>
     </w:p>
     <w:p>
       <w:pPr>
@@ -14222,12 +14653,12 @@
       <w:pPr>
         <w:pStyle w:val="Heading1"/>
       </w:pPr>
-      <w:bookmarkStart w:id="42" w:name="_Toc200020176"/>
+      <w:bookmarkStart w:id="41" w:name="_Toc200020176"/>
       <w:r>
         <w:lastRenderedPageBreak/>
         <w:t>Приложения</w:t>
       </w:r>
-      <w:bookmarkEnd w:id="42"/>
+      <w:bookmarkEnd w:id="41"/>
     </w:p>
     <w:p>
       <w:pPr>
@@ -14252,7 +14683,7 @@
 </file>
 
 <file path=word/endnotes.xml><?xml version="1.0" encoding="utf-8"?>
-<w:endnotes xmlns:wpc="http://schemas.microsoft.com/office/word/2010/wordprocessingCanvas" xmlns:cx="http://schemas.microsoft.com/office/drawing/2014/chartex" xmlns:cx1="http://schemas.microsoft.com/office/drawing/2015/9/8/chartex" xmlns:mc="http://schemas.openxmlformats.org/markup-compatibility/2006" xmlns:o="urn:schemas-microsoft-com:office:office" xmlns:r="http://schemas.openxmlformats.org/officeDocument/2006/relationships" xmlns:m="http://schemas.openxmlformats.org/officeDocument/2006/math" xmlns:v="urn:schemas-microsoft-com:vml" xmlns:wp14="http://schemas.microsoft.com/office/word/2010/wordprocessingDrawing" xmlns:wp="http://schemas.openxmlformats.org/drawingml/2006/wordprocessingDrawing" xmlns:w10="urn:schemas-microsoft-com:office:word" xmlns:w="http://schemas.openxmlformats.org/wordprocessingml/2006/main" xmlns:w14="http://schemas.microsoft.com/office/word/2010/wordml" xmlns:w15="http://schemas.microsoft.com/office/word/2012/wordml" xmlns:w16se="http://schemas.microsoft.com/office/word/2015/wordml/symex" xmlns:wpg="http://schemas.microsoft.com/office/word/2010/wordprocessingGroup" xmlns:wpi="http://schemas.microsoft.com/office/word/2010/wordprocessingInk" xmlns:wne="http://schemas.microsoft.com/office/word/2006/wordml" xmlns:wps="http://schemas.microsoft.com/office/word/2010/wordprocessingShape" mc:Ignorable="w14 w15 w16se wp14">
+<w:endnotes xmlns:wpc="http://schemas.microsoft.com/office/word/2010/wordprocessingCanvas" xmlns:cx="http://schemas.microsoft.com/office/drawing/2014/chartex" xmlns:cx1="http://schemas.microsoft.com/office/drawing/2015/9/8/chartex" xmlns:cx2="http://schemas.microsoft.com/office/drawing/2015/10/21/chartex" xmlns:cx3="http://schemas.microsoft.com/office/drawing/2016/5/9/chartex" xmlns:cx4="http://schemas.microsoft.com/office/drawing/2016/5/10/chartex" xmlns:cx5="http://schemas.microsoft.com/office/drawing/2016/5/11/chartex" xmlns:cx6="http://schemas.microsoft.com/office/drawing/2016/5/12/chartex" xmlns:cx7="http://schemas.microsoft.com/office/drawing/2016/5/13/chartex" xmlns:cx8="http://schemas.microsoft.com/office/drawing/2016/5/14/chartex" xmlns:mc="http://schemas.openxmlformats.org/markup-compatibility/2006" xmlns:aink="http://schemas.microsoft.com/office/drawing/2016/ink" xmlns:am3d="http://schemas.microsoft.com/office/drawing/2017/model3d" xmlns:o="urn:schemas-microsoft-com:office:office" xmlns:oel="http://schemas.microsoft.com/office/2019/extlst" xmlns:r="http://schemas.openxmlformats.org/officeDocument/2006/relationships" xmlns:m="http://schemas.openxmlformats.org/officeDocument/2006/math" xmlns:v="urn:schemas-microsoft-com:vml" xmlns:wp14="http://schemas.microsoft.com/office/word/2010/wordprocessingDrawing" xmlns:wp="http://schemas.openxmlformats.org/drawingml/2006/wordprocessingDrawing" xmlns:w10="urn:schemas-microsoft-com:office:word" xmlns:w="http://schemas.openxmlformats.org/wordprocessingml/2006/main" xmlns:w14="http://schemas.microsoft.com/office/word/2010/wordml" xmlns:w15="http://schemas.microsoft.com/office/word/2012/wordml" xmlns:w16cex="http://schemas.microsoft.com/office/word/2018/wordml/cex" xmlns:w16cid="http://schemas.microsoft.com/office/word/2016/wordml/cid" xmlns:w16="http://schemas.microsoft.com/office/word/2018/wordml" xmlns:w16du="http://schemas.microsoft.com/office/word/2023/wordml/word16du" xmlns:w16sdtdh="http://schemas.microsoft.com/office/word/2020/wordml/sdtdatahash" xmlns:w16sdtfl="http://schemas.microsoft.com/office/word/2024/wordml/sdtformatlock" xmlns:w16se="http://schemas.microsoft.com/office/word/2015/wordml/symex" xmlns:wpg="http://schemas.microsoft.com/office/word/2010/wordprocessingGroup" xmlns:wpi="http://schemas.microsoft.com/office/word/2010/wordprocessingInk" xmlns:wne="http://schemas.microsoft.com/office/word/2006/wordml" xmlns:wps="http://schemas.microsoft.com/office/word/2010/wordprocessingShape" mc:Ignorable="w14 w15 w16se w16cid w16 w16cex w16sdtdh w16sdtfl w16du wp14">
   <w:endnote w:type="separator" w:id="-1">
     <w:p>
       <w:pPr>
@@ -14277,7 +14708,7 @@
 </file>
 
 <file path=word/footer1.xml><?xml version="1.0" encoding="utf-8"?>
-<w:ftr xmlns:wpc="http://schemas.microsoft.com/office/word/2010/wordprocessingCanvas" xmlns:cx="http://schemas.microsoft.com/office/drawing/2014/chartex" xmlns:cx1="http://schemas.microsoft.com/office/drawing/2015/9/8/chartex" xmlns:mc="http://schemas.openxmlformats.org/markup-compatibility/2006" xmlns:o="urn:schemas-microsoft-com:office:office" xmlns:r="http://schemas.openxmlformats.org/officeDocument/2006/relationships" xmlns:m="http://schemas.openxmlformats.org/officeDocument/2006/math" xmlns:v="urn:schemas-microsoft-com:vml" xmlns:wp14="http://schemas.microsoft.com/office/word/2010/wordprocessingDrawing" xmlns:wp="http://schemas.openxmlformats.org/drawingml/2006/wordprocessingDrawing" xmlns:w10="urn:schemas-microsoft-com:office:word" xmlns:w="http://schemas.openxmlformats.org/wordprocessingml/2006/main" xmlns:w14="http://schemas.microsoft.com/office/word/2010/wordml" xmlns:w15="http://schemas.microsoft.com/office/word/2012/wordml" xmlns:w16se="http://schemas.microsoft.com/office/word/2015/wordml/symex" xmlns:wpg="http://schemas.microsoft.com/office/word/2010/wordprocessingGroup" xmlns:wpi="http://schemas.microsoft.com/office/word/2010/wordprocessingInk" xmlns:wne="http://schemas.microsoft.com/office/word/2006/wordml" xmlns:wps="http://schemas.microsoft.com/office/word/2010/wordprocessingShape" mc:Ignorable="w14 w15 w16se wp14">
+<w:ftr xmlns:wpc="http://schemas.microsoft.com/office/word/2010/wordprocessingCanvas" xmlns:cx="http://schemas.microsoft.com/office/drawing/2014/chartex" xmlns:cx1="http://schemas.microsoft.com/office/drawing/2015/9/8/chartex" xmlns:cx2="http://schemas.microsoft.com/office/drawing/2015/10/21/chartex" xmlns:cx3="http://schemas.microsoft.com/office/drawing/2016/5/9/chartex" xmlns:cx4="http://schemas.microsoft.com/office/drawing/2016/5/10/chartex" xmlns:cx5="http://schemas.microsoft.com/office/drawing/2016/5/11/chartex" xmlns:cx6="http://schemas.microsoft.com/office/drawing/2016/5/12/chartex" xmlns:cx7="http://schemas.microsoft.com/office/drawing/2016/5/13/chartex" xmlns:cx8="http://schemas.microsoft.com/office/drawing/2016/5/14/chartex" xmlns:mc="http://schemas.openxmlformats.org/markup-compatibility/2006" xmlns:aink="http://schemas.microsoft.com/office/drawing/2016/ink" xmlns:am3d="http://schemas.microsoft.com/office/drawing/2017/model3d" xmlns:o="urn:schemas-microsoft-com:office:office" xmlns:oel="http://schemas.microsoft.com/office/2019/extlst" xmlns:r="http://schemas.openxmlformats.org/officeDocument/2006/relationships" xmlns:m="http://schemas.openxmlformats.org/officeDocument/2006/math" xmlns:v="urn:schemas-microsoft-com:vml" xmlns:wp14="http://schemas.microsoft.com/office/word/2010/wordprocessingDrawing" xmlns:wp="http://schemas.openxmlformats.org/drawingml/2006/wordprocessingDrawing" xmlns:w10="urn:schemas-microsoft-com:office:word" xmlns:w="http://schemas.openxmlformats.org/wordprocessingml/2006/main" xmlns:w14="http://schemas.microsoft.com/office/word/2010/wordml" xmlns:w15="http://schemas.microsoft.com/office/word/2012/wordml" xmlns:w16cex="http://schemas.microsoft.com/office/word/2018/wordml/cex" xmlns:w16cid="http://schemas.microsoft.com/office/word/2016/wordml/cid" xmlns:w16="http://schemas.microsoft.com/office/word/2018/wordml" xmlns:w16du="http://schemas.microsoft.com/office/word/2023/wordml/word16du" xmlns:w16sdtdh="http://schemas.microsoft.com/office/word/2020/wordml/sdtdatahash" xmlns:w16sdtfl="http://schemas.microsoft.com/office/word/2024/wordml/sdtformatlock" xmlns:w16se="http://schemas.microsoft.com/office/word/2015/wordml/symex" xmlns:wpg="http://schemas.microsoft.com/office/word/2010/wordprocessingGroup" xmlns:wpi="http://schemas.microsoft.com/office/word/2010/wordprocessingInk" xmlns:wne="http://schemas.microsoft.com/office/word/2006/wordml" xmlns:wps="http://schemas.microsoft.com/office/word/2010/wordprocessingShape" mc:Ignorable="w14 w15 w16se w16cid w16 w16cex w16sdtdh w16sdtfl w16du wp14">
   <w:sdt>
     <w:sdtPr>
       <w:id w:val="-384414388"/>
@@ -14322,7 +14753,7 @@
 </file>
 
 <file path=word/footnotes.xml><?xml version="1.0" encoding="utf-8"?>
-<w:footnotes xmlns:wpc="http://schemas.microsoft.com/office/word/2010/wordprocessingCanvas" xmlns:cx="http://schemas.microsoft.com/office/drawing/2014/chartex" xmlns:cx1="http://schemas.microsoft.com/office/drawing/2015/9/8/chartex" xmlns:mc="http://schemas.openxmlformats.org/markup-compatibility/2006" xmlns:o="urn:schemas-microsoft-com:office:office" xmlns:r="http://schemas.openxmlformats.org/officeDocument/2006/relationships" xmlns:m="http://schemas.openxmlformats.org/officeDocument/2006/math" xmlns:v="urn:schemas-microsoft-com:vml" xmlns:wp14="http://schemas.microsoft.com/office/word/2010/wordprocessingDrawing" xmlns:wp="http://schemas.openxmlformats.org/drawingml/2006/wordprocessingDrawing" xmlns:w10="urn:schemas-microsoft-com:office:word" xmlns:w="http://schemas.openxmlformats.org/wordprocessingml/2006/main" xmlns:w14="http://schemas.microsoft.com/office/word/2010/wordml" xmlns:w15="http://schemas.microsoft.com/office/word/2012/wordml" xmlns:w16se="http://schemas.microsoft.com/office/word/2015/wordml/symex" xmlns:wpg="http://schemas.microsoft.com/office/word/2010/wordprocessingGroup" xmlns:wpi="http://schemas.microsoft.com/office/word/2010/wordprocessingInk" xmlns:wne="http://schemas.microsoft.com/office/word/2006/wordml" xmlns:wps="http://schemas.microsoft.com/office/word/2010/wordprocessingShape" mc:Ignorable="w14 w15 w16se wp14">
+<w:footnotes xmlns:wpc="http://schemas.microsoft.com/office/word/2010/wordprocessingCanvas" xmlns:cx="http://schemas.microsoft.com/office/drawing/2014/chartex" xmlns:cx1="http://schemas.microsoft.com/office/drawing/2015/9/8/chartex" xmlns:cx2="http://schemas.microsoft.com/office/drawing/2015/10/21/chartex" xmlns:cx3="http://schemas.microsoft.com/office/drawing/2016/5/9/chartex" xmlns:cx4="http://schemas.microsoft.com/office/drawing/2016/5/10/chartex" xmlns:cx5="http://schemas.microsoft.com/office/drawing/2016/5/11/chartex" xmlns:cx6="http://schemas.microsoft.com/office/drawing/2016/5/12/chartex" xmlns:cx7="http://schemas.microsoft.com/office/drawing/2016/5/13/chartex" xmlns:cx8="http://schemas.microsoft.com/office/drawing/2016/5/14/chartex" xmlns:mc="http://schemas.openxmlformats.org/markup-compatibility/2006" xmlns:aink="http://schemas.microsoft.com/office/drawing/2016/ink" xmlns:am3d="http://schemas.microsoft.com/office/drawing/2017/model3d" xmlns:o="urn:schemas-microsoft-com:office:office" xmlns:oel="http://schemas.microsoft.com/office/2019/extlst" xmlns:r="http://schemas.openxmlformats.org/officeDocument/2006/relationships" xmlns:m="http://schemas.openxmlformats.org/officeDocument/2006/math" xmlns:v="urn:schemas-microsoft-com:vml" xmlns:wp14="http://schemas.microsoft.com/office/word/2010/wordprocessingDrawing" xmlns:wp="http://schemas.openxmlformats.org/drawingml/2006/wordprocessingDrawing" xmlns:w10="urn:schemas-microsoft-com:office:word" xmlns:w="http://schemas.openxmlformats.org/wordprocessingml/2006/main" xmlns:w14="http://schemas.microsoft.com/office/word/2010/wordml" xmlns:w15="http://schemas.microsoft.com/office/word/2012/wordml" xmlns:w16cex="http://schemas.microsoft.com/office/word/2018/wordml/cex" xmlns:w16cid="http://schemas.microsoft.com/office/word/2016/wordml/cid" xmlns:w16="http://schemas.microsoft.com/office/word/2018/wordml" xmlns:w16du="http://schemas.microsoft.com/office/word/2023/wordml/word16du" xmlns:w16sdtdh="http://schemas.microsoft.com/office/word/2020/wordml/sdtdatahash" xmlns:w16sdtfl="http://schemas.microsoft.com/office/word/2024/wordml/sdtformatlock" xmlns:w16se="http://schemas.microsoft.com/office/word/2015/wordml/symex" xmlns:wpg="http://schemas.microsoft.com/office/word/2010/wordprocessingGroup" xmlns:wpi="http://schemas.microsoft.com/office/word/2010/wordprocessingInk" xmlns:wne="http://schemas.microsoft.com/office/word/2006/wordml" xmlns:wps="http://schemas.microsoft.com/office/word/2010/wordprocessingShape" mc:Ignorable="w14 w15 w16se w16cid w16 w16cex w16sdtdh w16sdtfl w16du wp14">
   <w:footnote w:type="separator" w:id="-1">
     <w:p>
       <w:pPr>
@@ -14347,7 +14778,7 @@
 </file>
 
 <file path=word/numbering.xml><?xml version="1.0" encoding="utf-8"?>
-<w:numbering xmlns:wpc="http://schemas.microsoft.com/office/word/2010/wordprocessingCanvas" xmlns:cx="http://schemas.microsoft.com/office/drawing/2014/chartex" xmlns:cx1="http://schemas.microsoft.com/office/drawing/2015/9/8/chartex" xmlns:mc="http://schemas.openxmlformats.org/markup-compatibility/2006" xmlns:o="urn:schemas-microsoft-com:office:office" xmlns:r="http://schemas.openxmlformats.org/officeDocument/2006/relationships" xmlns:m="http://schemas.openxmlformats.org/officeDocument/2006/math" xmlns:v="urn:schemas-microsoft-com:vml" xmlns:wp14="http://schemas.microsoft.com/office/word/2010/wordprocessingDrawing" xmlns:wp="http://schemas.openxmlformats.org/drawingml/2006/wordprocessingDrawing" xmlns:w10="urn:schemas-microsoft-com:office:word" xmlns:w="http://schemas.openxmlformats.org/wordprocessingml/2006/main" xmlns:w14="http://schemas.microsoft.com/office/word/2010/wordml" xmlns:w15="http://schemas.microsoft.com/office/word/2012/wordml" xmlns:w16se="http://schemas.microsoft.com/office/word/2015/wordml/symex" xmlns:wpg="http://schemas.microsoft.com/office/word/2010/wordprocessingGroup" xmlns:wpi="http://schemas.microsoft.com/office/word/2010/wordprocessingInk" xmlns:wne="http://schemas.microsoft.com/office/word/2006/wordml" xmlns:wps="http://schemas.microsoft.com/office/word/2010/wordprocessingShape" mc:Ignorable="w14 w15 w16se wp14">
+<w:numbering xmlns:wpc="http://schemas.microsoft.com/office/word/2010/wordprocessingCanvas" xmlns:cx="http://schemas.microsoft.com/office/drawing/2014/chartex" xmlns:cx1="http://schemas.microsoft.com/office/drawing/2015/9/8/chartex" xmlns:cx2="http://schemas.microsoft.com/office/drawing/2015/10/21/chartex" xmlns:cx3="http://schemas.microsoft.com/office/drawing/2016/5/9/chartex" xmlns:cx4="http://schemas.microsoft.com/office/drawing/2016/5/10/chartex" xmlns:cx5="http://schemas.microsoft.com/office/drawing/2016/5/11/chartex" xmlns:cx6="http://schemas.microsoft.com/office/drawing/2016/5/12/chartex" xmlns:cx7="http://schemas.microsoft.com/office/drawing/2016/5/13/chartex" xmlns:cx8="http://schemas.microsoft.com/office/drawing/2016/5/14/chartex" xmlns:mc="http://schemas.openxmlformats.org/markup-compatibility/2006" xmlns:aink="http://schemas.microsoft.com/office/drawing/2016/ink" xmlns:am3d="http://schemas.microsoft.com/office/drawing/2017/model3d" xmlns:o="urn:schemas-microsoft-com:office:office" xmlns:oel="http://schemas.microsoft.com/office/2019/extlst" xmlns:r="http://schemas.openxmlformats.org/officeDocument/2006/relationships" xmlns:m="http://schemas.openxmlformats.org/officeDocument/2006/math" xmlns:v="urn:schemas-microsoft-com:vml" xmlns:wp14="http://schemas.microsoft.com/office/word/2010/wordprocessingDrawing" xmlns:wp="http://schemas.openxmlformats.org/drawingml/2006/wordprocessingDrawing" xmlns:w10="urn:schemas-microsoft-com:office:word" xmlns:w="http://schemas.openxmlformats.org/wordprocessingml/2006/main" xmlns:w14="http://schemas.microsoft.com/office/word/2010/wordml" xmlns:w15="http://schemas.microsoft.com/office/word/2012/wordml" xmlns:w16cex="http://schemas.microsoft.com/office/word/2018/wordml/cex" xmlns:w16cid="http://schemas.microsoft.com/office/word/2016/wordml/cid" xmlns:w16="http://schemas.microsoft.com/office/word/2018/wordml" xmlns:w16du="http://schemas.microsoft.com/office/word/2023/wordml/word16du" xmlns:w16sdtdh="http://schemas.microsoft.com/office/word/2020/wordml/sdtdatahash" xmlns:w16sdtfl="http://schemas.microsoft.com/office/word/2024/wordml/sdtformatlock" xmlns:w16se="http://schemas.microsoft.com/office/word/2015/wordml/symex" xmlns:wpg="http://schemas.microsoft.com/office/word/2010/wordprocessingGroup" xmlns:wpi="http://schemas.microsoft.com/office/word/2010/wordprocessingInk" xmlns:wne="http://schemas.microsoft.com/office/word/2006/wordml" xmlns:wps="http://schemas.microsoft.com/office/word/2010/wordprocessingShape" mc:Ignorable="w14 w15 w16se w16cid w16 w16cex w16sdtdh w16sdtfl w16du wp14">
   <w:abstractNum w:abstractNumId="0" w15:restartNumberingAfterBreak="0">
     <w:nsid w:val="07B7395C"/>
     <w:multiLevelType w:val="hybridMultilevel"/>
@@ -16422,6 +16853,119 @@
     </w:lvl>
   </w:abstractNum>
   <w:abstractNum w:abstractNumId="17" w15:restartNumberingAfterBreak="0">
+    <w:nsid w:val="54A16E9E"/>
+    <w:multiLevelType w:val="hybridMultilevel"/>
+    <w:tmpl w:val="ECE83E5E"/>
+    <w:lvl w:ilvl="0" w:tplc="04190001">
+      <w:start w:val="1"/>
+      <w:numFmt w:val="bullet"/>
+      <w:lvlText w:val=""/>
+      <w:lvlJc w:val="left"/>
+      <w:pPr>
+        <w:ind w:left="1145" w:hanging="360"/>
+      </w:pPr>
+      <w:rPr>
+        <w:rFonts w:ascii="Symbol" w:hAnsi="Symbol" w:hint="default"/>
+      </w:rPr>
+    </w:lvl>
+    <w:lvl w:ilvl="1" w:tplc="04190003" w:tentative="1">
+      <w:start w:val="1"/>
+      <w:numFmt w:val="bullet"/>
+      <w:lvlText w:val="o"/>
+      <w:lvlJc w:val="left"/>
+      <w:pPr>
+        <w:ind w:left="1865" w:hanging="360"/>
+      </w:pPr>
+      <w:rPr>
+        <w:rFonts w:ascii="Courier New" w:hAnsi="Courier New" w:cs="Courier New" w:hint="default"/>
+      </w:rPr>
+    </w:lvl>
+    <w:lvl w:ilvl="2" w:tplc="04190005" w:tentative="1">
+      <w:start w:val="1"/>
+      <w:numFmt w:val="bullet"/>
+      <w:lvlText w:val=""/>
+      <w:lvlJc w:val="left"/>
+      <w:pPr>
+        <w:ind w:left="2585" w:hanging="360"/>
+      </w:pPr>
+      <w:rPr>
+        <w:rFonts w:ascii="Wingdings" w:hAnsi="Wingdings" w:hint="default"/>
+      </w:rPr>
+    </w:lvl>
+    <w:lvl w:ilvl="3" w:tplc="04190001" w:tentative="1">
+      <w:start w:val="1"/>
+      <w:numFmt w:val="bullet"/>
+      <w:lvlText w:val=""/>
+      <w:lvlJc w:val="left"/>
+      <w:pPr>
+        <w:ind w:left="3305" w:hanging="360"/>
+      </w:pPr>
+      <w:rPr>
+        <w:rFonts w:ascii="Symbol" w:hAnsi="Symbol" w:hint="default"/>
+      </w:rPr>
+    </w:lvl>
+    <w:lvl w:ilvl="4" w:tplc="04190003" w:tentative="1">
+      <w:start w:val="1"/>
+      <w:numFmt w:val="bullet"/>
+      <w:lvlText w:val="o"/>
+      <w:lvlJc w:val="left"/>
+      <w:pPr>
+        <w:ind w:left="4025" w:hanging="360"/>
+      </w:pPr>
+      <w:rPr>
+        <w:rFonts w:ascii="Courier New" w:hAnsi="Courier New" w:cs="Courier New" w:hint="default"/>
+      </w:rPr>
+    </w:lvl>
+    <w:lvl w:ilvl="5" w:tplc="04190005" w:tentative="1">
+      <w:start w:val="1"/>
+      <w:numFmt w:val="bullet"/>
+      <w:lvlText w:val=""/>
+      <w:lvlJc w:val="left"/>
+      <w:pPr>
+        <w:ind w:left="4745" w:hanging="360"/>
+      </w:pPr>
+      <w:rPr>
+        <w:rFonts w:ascii="Wingdings" w:hAnsi="Wingdings" w:hint="default"/>
+      </w:rPr>
+    </w:lvl>
+    <w:lvl w:ilvl="6" w:tplc="04190001" w:tentative="1">
+      <w:start w:val="1"/>
+      <w:numFmt w:val="bullet"/>
+      <w:lvlText w:val=""/>
+      <w:lvlJc w:val="left"/>
+      <w:pPr>
+        <w:ind w:left="5465" w:hanging="360"/>
+      </w:pPr>
+      <w:rPr>
+        <w:rFonts w:ascii="Symbol" w:hAnsi="Symbol" w:hint="default"/>
+      </w:rPr>
+    </w:lvl>
+    <w:lvl w:ilvl="7" w:tplc="04190003" w:tentative="1">
+      <w:start w:val="1"/>
+      <w:numFmt w:val="bullet"/>
+      <w:lvlText w:val="o"/>
+      <w:lvlJc w:val="left"/>
+      <w:pPr>
+        <w:ind w:left="6185" w:hanging="360"/>
+      </w:pPr>
+      <w:rPr>
+        <w:rFonts w:ascii="Courier New" w:hAnsi="Courier New" w:cs="Courier New" w:hint="default"/>
+      </w:rPr>
+    </w:lvl>
+    <w:lvl w:ilvl="8" w:tplc="04190005" w:tentative="1">
+      <w:start w:val="1"/>
+      <w:numFmt w:val="bullet"/>
+      <w:lvlText w:val=""/>
+      <w:lvlJc w:val="left"/>
+      <w:pPr>
+        <w:ind w:left="6905" w:hanging="360"/>
+      </w:pPr>
+      <w:rPr>
+        <w:rFonts w:ascii="Wingdings" w:hAnsi="Wingdings" w:hint="default"/>
+      </w:rPr>
+    </w:lvl>
+  </w:abstractNum>
+  <w:abstractNum w:abstractNumId="18" w15:restartNumberingAfterBreak="0">
     <w:nsid w:val="5D7E0682"/>
     <w:multiLevelType w:val="hybridMultilevel"/>
     <w:tmpl w:val="C6BEE692"/>
@@ -16534,7 +17078,7 @@
       </w:rPr>
     </w:lvl>
   </w:abstractNum>
-  <w:abstractNum w:abstractNumId="18" w15:restartNumberingAfterBreak="0">
+  <w:abstractNum w:abstractNumId="19" w15:restartNumberingAfterBreak="0">
     <w:nsid w:val="5E0B1C30"/>
     <w:multiLevelType w:val="multilevel"/>
     <w:tmpl w:val="027A742C"/>
@@ -16683,7 +17227,7 @@
       </w:rPr>
     </w:lvl>
   </w:abstractNum>
-  <w:abstractNum w:abstractNumId="19" w15:restartNumberingAfterBreak="0">
+  <w:abstractNum w:abstractNumId="20" w15:restartNumberingAfterBreak="0">
     <w:nsid w:val="5F1A2C85"/>
     <w:multiLevelType w:val="multilevel"/>
     <w:tmpl w:val="67A0FAC2"/>
@@ -16832,7 +17376,7 @@
       </w:rPr>
     </w:lvl>
   </w:abstractNum>
-  <w:abstractNum w:abstractNumId="20" w15:restartNumberingAfterBreak="0">
+  <w:abstractNum w:abstractNumId="21" w15:restartNumberingAfterBreak="0">
     <w:nsid w:val="5FC3088A"/>
     <w:multiLevelType w:val="hybridMultilevel"/>
     <w:tmpl w:val="8A0C6CEE"/>
@@ -16945,7 +17489,7 @@
       </w:rPr>
     </w:lvl>
   </w:abstractNum>
-  <w:abstractNum w:abstractNumId="21" w15:restartNumberingAfterBreak="0">
+  <w:abstractNum w:abstractNumId="22" w15:restartNumberingAfterBreak="0">
     <w:nsid w:val="61210D53"/>
     <w:multiLevelType w:val="hybridMultilevel"/>
     <w:tmpl w:val="92961018"/>
@@ -17058,7 +17602,7 @@
       </w:rPr>
     </w:lvl>
   </w:abstractNum>
-  <w:abstractNum w:abstractNumId="22" w15:restartNumberingAfterBreak="0">
+  <w:abstractNum w:abstractNumId="23" w15:restartNumberingAfterBreak="0">
     <w:nsid w:val="6AAE5FCD"/>
     <w:multiLevelType w:val="hybridMultilevel"/>
     <w:tmpl w:val="FA366D80"/>
@@ -17144,7 +17688,7 @@
       </w:pPr>
     </w:lvl>
   </w:abstractNum>
-  <w:abstractNum w:abstractNumId="23" w15:restartNumberingAfterBreak="0">
+  <w:abstractNum w:abstractNumId="24" w15:restartNumberingAfterBreak="0">
     <w:nsid w:val="6AB85B89"/>
     <w:multiLevelType w:val="multilevel"/>
     <w:tmpl w:val="C9A44B3C"/>
@@ -17293,7 +17837,7 @@
       </w:rPr>
     </w:lvl>
   </w:abstractNum>
-  <w:abstractNum w:abstractNumId="24" w15:restartNumberingAfterBreak="0">
+  <w:abstractNum w:abstractNumId="25" w15:restartNumberingAfterBreak="0">
     <w:nsid w:val="6B641711"/>
     <w:multiLevelType w:val="hybridMultilevel"/>
     <w:tmpl w:val="5A4C9C80"/>
@@ -17406,7 +17950,7 @@
       </w:rPr>
     </w:lvl>
   </w:abstractNum>
-  <w:abstractNum w:abstractNumId="25" w15:restartNumberingAfterBreak="0">
+  <w:abstractNum w:abstractNumId="26" w15:restartNumberingAfterBreak="0">
     <w:nsid w:val="753E0B8F"/>
     <w:multiLevelType w:val="multilevel"/>
     <w:tmpl w:val="2CDE92C6"/>
@@ -17555,7 +18099,7 @@
       </w:rPr>
     </w:lvl>
   </w:abstractNum>
-  <w:abstractNum w:abstractNumId="26" w15:restartNumberingAfterBreak="0">
+  <w:abstractNum w:abstractNumId="27" w15:restartNumberingAfterBreak="0">
     <w:nsid w:val="769D344D"/>
     <w:multiLevelType w:val="hybridMultilevel"/>
     <w:tmpl w:val="3C921EC2"/>
@@ -17668,7 +18212,7 @@
       </w:rPr>
     </w:lvl>
   </w:abstractNum>
-  <w:abstractNum w:abstractNumId="27" w15:restartNumberingAfterBreak="0">
+  <w:abstractNum w:abstractNumId="28" w15:restartNumberingAfterBreak="0">
     <w:nsid w:val="7E525A96"/>
     <w:multiLevelType w:val="hybridMultilevel"/>
     <w:tmpl w:val="FBBC0A7A"/>
@@ -17781,7 +18325,7 @@
       </w:rPr>
     </w:lvl>
   </w:abstractNum>
-  <w:abstractNum w:abstractNumId="28" w15:restartNumberingAfterBreak="0">
+  <w:abstractNum w:abstractNumId="29" w15:restartNumberingAfterBreak="0">
     <w:nsid w:val="7EC64BAE"/>
     <w:multiLevelType w:val="multilevel"/>
     <w:tmpl w:val="3C2CD0FC"/>
@@ -17930,99 +18474,102 @@
       </w:rPr>
     </w:lvl>
   </w:abstractNum>
-  <w:num w:numId="1">
+  <w:num w:numId="1" w16cid:durableId="1732843177">
+    <w:abstractNumId w:val="23"/>
+  </w:num>
+  <w:num w:numId="2" w16cid:durableId="1099762973">
+    <w:abstractNumId w:val="8"/>
+  </w:num>
+  <w:num w:numId="3" w16cid:durableId="1423717424">
+    <w:abstractNumId w:val="15"/>
+  </w:num>
+  <w:num w:numId="4" w16cid:durableId="633408866">
+    <w:abstractNumId w:val="11"/>
+  </w:num>
+  <w:num w:numId="5" w16cid:durableId="1412582344">
+    <w:abstractNumId w:val="13"/>
+  </w:num>
+  <w:num w:numId="6" w16cid:durableId="1811048659">
+    <w:abstractNumId w:val="26"/>
+  </w:num>
+  <w:num w:numId="7" w16cid:durableId="752505664">
+    <w:abstractNumId w:val="2"/>
+  </w:num>
+  <w:num w:numId="8" w16cid:durableId="1009526062">
+    <w:abstractNumId w:val="9"/>
+  </w:num>
+  <w:num w:numId="9" w16cid:durableId="237904827">
+    <w:abstractNumId w:val="7"/>
+  </w:num>
+  <w:num w:numId="10" w16cid:durableId="1484199504">
+    <w:abstractNumId w:val="0"/>
+  </w:num>
+  <w:num w:numId="11" w16cid:durableId="1411078573">
+    <w:abstractNumId w:val="10"/>
+  </w:num>
+  <w:num w:numId="12" w16cid:durableId="803039022">
+    <w:abstractNumId w:val="21"/>
+  </w:num>
+  <w:num w:numId="13" w16cid:durableId="1956793262">
+    <w:abstractNumId w:val="6"/>
+  </w:num>
+  <w:num w:numId="14" w16cid:durableId="630673941">
+    <w:abstractNumId w:val="3"/>
+  </w:num>
+  <w:num w:numId="15" w16cid:durableId="1500071876">
+    <w:abstractNumId w:val="20"/>
+  </w:num>
+  <w:num w:numId="16" w16cid:durableId="35663043">
+    <w:abstractNumId w:val="29"/>
+  </w:num>
+  <w:num w:numId="17" w16cid:durableId="185405575">
+    <w:abstractNumId w:val="1"/>
+  </w:num>
+  <w:num w:numId="18" w16cid:durableId="1026559396">
+    <w:abstractNumId w:val="19"/>
+  </w:num>
+  <w:num w:numId="19" w16cid:durableId="1947536195">
+    <w:abstractNumId w:val="24"/>
+  </w:num>
+  <w:num w:numId="20" w16cid:durableId="2034720227">
+    <w:abstractNumId w:val="16"/>
+  </w:num>
+  <w:num w:numId="21" w16cid:durableId="2022120781">
+    <w:abstractNumId w:val="25"/>
+  </w:num>
+  <w:num w:numId="22" w16cid:durableId="1145077210">
+    <w:abstractNumId w:val="28"/>
+  </w:num>
+  <w:num w:numId="23" w16cid:durableId="895820888">
+    <w:abstractNumId w:val="4"/>
+  </w:num>
+  <w:num w:numId="24" w16cid:durableId="1976374841">
+    <w:abstractNumId w:val="5"/>
+  </w:num>
+  <w:num w:numId="25" w16cid:durableId="1951694817">
+    <w:abstractNumId w:val="12"/>
+  </w:num>
+  <w:num w:numId="26" w16cid:durableId="918831130">
     <w:abstractNumId w:val="22"/>
   </w:num>
-  <w:num w:numId="2">
-    <w:abstractNumId w:val="8"/>
-  </w:num>
-  <w:num w:numId="3">
-    <w:abstractNumId w:val="15"/>
-  </w:num>
-  <w:num w:numId="4">
-    <w:abstractNumId w:val="11"/>
-  </w:num>
-  <w:num w:numId="5">
-    <w:abstractNumId w:val="13"/>
-  </w:num>
-  <w:num w:numId="6">
-    <w:abstractNumId w:val="25"/>
-  </w:num>
-  <w:num w:numId="7">
-    <w:abstractNumId w:val="2"/>
-  </w:num>
-  <w:num w:numId="8">
-    <w:abstractNumId w:val="9"/>
-  </w:num>
-  <w:num w:numId="9">
-    <w:abstractNumId w:val="7"/>
-  </w:num>
-  <w:num w:numId="10">
-    <w:abstractNumId w:val="0"/>
-  </w:num>
-  <w:num w:numId="11">
-    <w:abstractNumId w:val="10"/>
-  </w:num>
-  <w:num w:numId="12">
-    <w:abstractNumId w:val="20"/>
-  </w:num>
-  <w:num w:numId="13">
-    <w:abstractNumId w:val="6"/>
-  </w:num>
-  <w:num w:numId="14">
-    <w:abstractNumId w:val="3"/>
-  </w:num>
-  <w:num w:numId="15">
-    <w:abstractNumId w:val="19"/>
-  </w:num>
-  <w:num w:numId="16">
-    <w:abstractNumId w:val="28"/>
-  </w:num>
-  <w:num w:numId="17">
-    <w:abstractNumId w:val="1"/>
-  </w:num>
-  <w:num w:numId="18">
+  <w:num w:numId="27" w16cid:durableId="1484740991">
     <w:abstractNumId w:val="18"/>
   </w:num>
-  <w:num w:numId="19">
-    <w:abstractNumId w:val="23"/>
+  <w:num w:numId="28" w16cid:durableId="613485954">
+    <w:abstractNumId w:val="14"/>
   </w:num>
-  <w:num w:numId="20">
-    <w:abstractNumId w:val="16"/>
-  </w:num>
-  <w:num w:numId="21">
-    <w:abstractNumId w:val="24"/>
-  </w:num>
-  <w:num w:numId="22">
+  <w:num w:numId="29" w16cid:durableId="1117409570">
     <w:abstractNumId w:val="27"/>
   </w:num>
-  <w:num w:numId="23">
-    <w:abstractNumId w:val="4"/>
-  </w:num>
-  <w:num w:numId="24">
-    <w:abstractNumId w:val="5"/>
-  </w:num>
-  <w:num w:numId="25">
-    <w:abstractNumId w:val="12"/>
-  </w:num>
-  <w:num w:numId="26">
-    <w:abstractNumId w:val="21"/>
-  </w:num>
-  <w:num w:numId="27">
+  <w:num w:numId="30" w16cid:durableId="2038188722">
     <w:abstractNumId w:val="17"/>
-  </w:num>
-  <w:num w:numId="28">
-    <w:abstractNumId w:val="14"/>
-  </w:num>
-  <w:num w:numId="29">
-    <w:abstractNumId w:val="26"/>
   </w:num>
   <w:numIdMacAtCleanup w:val="20"/>
 </w:numbering>
 </file>
 
 <file path=word/styles.xml><?xml version="1.0" encoding="utf-8"?>
-<w:styles xmlns:mc="http://schemas.openxmlformats.org/markup-compatibility/2006" xmlns:r="http://schemas.openxmlformats.org/officeDocument/2006/relationships" xmlns:w="http://schemas.openxmlformats.org/wordprocessingml/2006/main" xmlns:w14="http://schemas.microsoft.com/office/word/2010/wordml" xmlns:w15="http://schemas.microsoft.com/office/word/2012/wordml" xmlns:w16se="http://schemas.microsoft.com/office/word/2015/wordml/symex" mc:Ignorable="w14 w15 w16se">
+<w:styles xmlns:mc="http://schemas.openxmlformats.org/markup-compatibility/2006" xmlns:r="http://schemas.openxmlformats.org/officeDocument/2006/relationships" xmlns:w="http://schemas.openxmlformats.org/wordprocessingml/2006/main" xmlns:w14="http://schemas.microsoft.com/office/word/2010/wordml" xmlns:w15="http://schemas.microsoft.com/office/word/2012/wordml" xmlns:w16cex="http://schemas.microsoft.com/office/word/2018/wordml/cex" xmlns:w16cid="http://schemas.microsoft.com/office/word/2016/wordml/cid" xmlns:w16="http://schemas.microsoft.com/office/word/2018/wordml" xmlns:w16du="http://schemas.microsoft.com/office/word/2023/wordml/word16du" xmlns:w16sdtdh="http://schemas.microsoft.com/office/word/2020/wordml/sdtdatahash" xmlns:w16sdtfl="http://schemas.microsoft.com/office/word/2024/wordml/sdtformatlock" xmlns:w16se="http://schemas.microsoft.com/office/word/2015/wordml/symex" mc:Ignorable="w14 w15 w16se w16cid w16 w16cex w16sdtdh w16sdtfl w16du">
   <w:docDefaults>
     <w:rPrDefault>
       <w:rPr>
@@ -18038,7 +18585,7 @@
       </w:pPr>
     </w:pPrDefault>
   </w:docDefaults>
-  <w:latentStyles w:defLockedState="0" w:defUIPriority="99" w:defSemiHidden="0" w:defUnhideWhenUsed="0" w:defQFormat="0" w:count="371">
+  <w:latentStyles w:defLockedState="0" w:defUIPriority="99" w:defSemiHidden="0" w:defUnhideWhenUsed="0" w:defQFormat="0" w:count="376">
     <w:lsdException w:name="Normal" w:uiPriority="0" w:qFormat="1"/>
     <w:lsdException w:name="heading 1" w:uiPriority="9" w:qFormat="1"/>
     <w:lsdException w:name="heading 2" w:semiHidden="1" w:uiPriority="9" w:unhideWhenUsed="1" w:qFormat="1"/>
@@ -18410,6 +18957,11 @@
     <w:lsdException w:name="List Table 5 Dark Accent 6" w:uiPriority="50"/>
     <w:lsdException w:name="List Table 6 Colorful Accent 6" w:uiPriority="51"/>
     <w:lsdException w:name="List Table 7 Colorful Accent 6" w:uiPriority="52"/>
+    <w:lsdException w:name="Mention" w:semiHidden="1" w:unhideWhenUsed="1"/>
+    <w:lsdException w:name="Smart Hyperlink" w:semiHidden="1" w:unhideWhenUsed="1"/>
+    <w:lsdException w:name="Hashtag" w:semiHidden="1" w:unhideWhenUsed="1"/>
+    <w:lsdException w:name="Unresolved Mention" w:semiHidden="1" w:unhideWhenUsed="1"/>
+    <w:lsdException w:name="Smart Link" w:semiHidden="1" w:unhideWhenUsed="1"/>
   </w:latentStyles>
   <w:style w:type="paragraph" w:default="1" w:styleId="Normal">
     <w:name w:val="Normal"/>

</xml_diff>

<commit_message>
Written referat, to write conclusion
</commit_message>
<xml_diff>
--- a/Diplom_Main.docx
+++ b/Diplom_Main.docx
@@ -2304,35 +2304,432 @@
     </w:p>
     <w:p>
       <w:pPr>
-        <w:spacing w:line="360" w:lineRule="auto"/>
         <w:ind w:firstLine="0"/>
         <w:jc w:val="left"/>
         <w:rPr>
-          <w:szCs w:val="28"/>
-        </w:rPr>
-        <w:sectPr>
-          <w:pgSz w:w="11906" w:h="16838"/>
-          <w:pgMar w:top="426" w:right="850" w:bottom="1134" w:left="1701" w:header="708" w:footer="708" w:gutter="0"/>
-          <w:pgNumType w:start="1"/>
-          <w:cols w:space="708"/>
-          <w:titlePg/>
-          <w:docGrid w:linePitch="381"/>
-        </w:sectPr>
-      </w:pPr>
-    </w:p>
-    <w:p>
-      <w:pPr>
-        <w:ind w:firstLine="0"/>
-      </w:pPr>
+          <w:color w:val="000000"/>
+          <w:sz w:val="23"/>
+          <w:szCs w:val="23"/>
+        </w:rPr>
+      </w:pPr>
+      <w:r>
+        <w:rPr>
+          <w:color w:val="000000"/>
+          <w:sz w:val="23"/>
+          <w:szCs w:val="23"/>
+        </w:rPr>
+        <w:br w:type="page"/>
+      </w:r>
     </w:p>
     <w:p>
       <w:pPr>
         <w:pStyle w:val="Heading1"/>
         <w:ind w:firstLine="0"/>
         <w:jc w:val="center"/>
-        <w:rPr>
-          <w:lang w:val="en-US"/>
-        </w:rPr>
+      </w:pPr>
+      <w:r>
+        <w:lastRenderedPageBreak/>
+        <w:t>Реферат</w:t>
+      </w:r>
+    </w:p>
+    <w:p>
+      <w:r>
+        <w:t xml:space="preserve">Всего </w:t>
+      </w:r>
+      <w:r>
+        <w:t xml:space="preserve">ВКР выполнена на Х листах. </w:t>
+      </w:r>
+      <w:r>
+        <w:t xml:space="preserve">В работе содержится Х иллюстраций спроектированных функциональных схем, отражающих положение будущего программного решения и одна иллюстрация функциональной схемы процесса обработки карты средствами программного продукта </w:t>
+      </w:r>
+      <w:proofErr w:type="spellStart"/>
+      <w:r>
+        <w:rPr>
+          <w:lang w:val="en-US"/>
+        </w:rPr>
+        <w:t>TranzWare</w:t>
+      </w:r>
+      <w:proofErr w:type="spellEnd"/>
+      <w:r>
+        <w:t xml:space="preserve"> </w:t>
+      </w:r>
+      <w:proofErr w:type="spellStart"/>
+      <w:r>
+        <w:rPr>
+          <w:lang w:val="en-US"/>
+        </w:rPr>
+        <w:t>CardFactory</w:t>
+      </w:r>
+      <w:proofErr w:type="spellEnd"/>
+      <w:r>
+        <w:t xml:space="preserve">. </w:t>
+      </w:r>
+      <w:r>
+        <w:t>Всего работа содержит 4 приложения, содержащих листинги кодов разработанных функций</w:t>
+      </w:r>
+      <w:r>
+        <w:t xml:space="preserve"> программной библиотеки</w:t>
+      </w:r>
+      <w:r>
+        <w:t>.</w:t>
+      </w:r>
+    </w:p>
+    <w:p>
+      <w:pPr>
+        <w:ind w:firstLine="0"/>
+      </w:pPr>
+      <w:r>
+        <w:t>Эмбоссер</w:t>
+      </w:r>
+      <w:r>
+        <w:t xml:space="preserve">, </w:t>
+      </w:r>
+      <w:r>
+        <w:t>эмбоссер</w:t>
+      </w:r>
+      <w:r>
+        <w:t xml:space="preserve"> </w:t>
+      </w:r>
+      <w:r>
+        <w:rPr>
+          <w:lang w:val="en-US"/>
+        </w:rPr>
+        <w:t>MATICA</w:t>
+      </w:r>
+      <w:r>
+        <w:t xml:space="preserve">, </w:t>
+      </w:r>
+      <w:proofErr w:type="spellStart"/>
+      <w:r>
+        <w:rPr>
+          <w:lang w:val="en-US"/>
+        </w:rPr>
+        <w:t>TranzWare</w:t>
+      </w:r>
+      <w:proofErr w:type="spellEnd"/>
+      <w:r>
+        <w:t xml:space="preserve"> </w:t>
+      </w:r>
+      <w:proofErr w:type="spellStart"/>
+      <w:r>
+        <w:rPr>
+          <w:lang w:val="en-US"/>
+        </w:rPr>
+        <w:t>CardFactory</w:t>
+      </w:r>
+      <w:proofErr w:type="spellEnd"/>
+      <w:r>
+        <w:t xml:space="preserve">, </w:t>
+      </w:r>
+      <w:r>
+        <w:t>кардридер</w:t>
+      </w:r>
+      <w:r>
+        <w:t xml:space="preserve">, </w:t>
+      </w:r>
+      <w:r>
+        <w:t xml:space="preserve">кардридерный модуль эмбоссера, чип пластиковой карты, кардридерный драйвер, драйвер записи карты, </w:t>
+      </w:r>
+      <w:r>
+        <w:rPr>
+          <w:lang w:val="en-US"/>
+        </w:rPr>
+        <w:t>Chip</w:t>
+      </w:r>
+      <w:r>
+        <w:t xml:space="preserve"> </w:t>
+      </w:r>
+      <w:r>
+        <w:rPr>
+          <w:lang w:val="en-US"/>
+        </w:rPr>
+        <w:t>Writer</w:t>
+      </w:r>
+      <w:r>
+        <w:t xml:space="preserve"> </w:t>
+      </w:r>
+      <w:r>
+        <w:rPr>
+          <w:lang w:val="en-US"/>
+        </w:rPr>
+        <w:t>Driver</w:t>
+      </w:r>
+      <w:r>
+        <w:t xml:space="preserve">, </w:t>
+      </w:r>
+      <w:r>
+        <w:t>интерфейс модуля настроек</w:t>
+      </w:r>
+    </w:p>
+    <w:p>
+      <w:r>
+        <w:t xml:space="preserve">Объектом исследования работы послужил процесс записи данных на чип пластиковой карты средствами </w:t>
+      </w:r>
+      <w:proofErr w:type="spellStart"/>
+      <w:r>
+        <w:rPr>
+          <w:lang w:val="en-US"/>
+        </w:rPr>
+        <w:t>TranzWare</w:t>
+      </w:r>
+      <w:proofErr w:type="spellEnd"/>
+      <w:r>
+        <w:t xml:space="preserve"> </w:t>
+      </w:r>
+      <w:proofErr w:type="spellStart"/>
+      <w:r>
+        <w:rPr>
+          <w:lang w:val="en-US"/>
+        </w:rPr>
+        <w:t>CardFactory</w:t>
+      </w:r>
+      <w:proofErr w:type="spellEnd"/>
+      <w:r>
+        <w:t xml:space="preserve"> </w:t>
+      </w:r>
+      <w:r>
+        <w:t xml:space="preserve">с использованием </w:t>
+      </w:r>
+      <w:r>
+        <w:t xml:space="preserve">кардридерного модуля эмбоссеров </w:t>
+      </w:r>
+      <w:r>
+        <w:rPr>
+          <w:lang w:val="en-US"/>
+        </w:rPr>
+        <w:t>MATICA</w:t>
+      </w:r>
+      <w:r>
+        <w:t xml:space="preserve">. </w:t>
+      </w:r>
+      <w:r>
+        <w:t xml:space="preserve">Целью работы является создание дополнительного кардридерного драйвера для модуля обработки </w:t>
+      </w:r>
+      <w:r>
+        <w:rPr>
+          <w:lang w:val="en-US"/>
+        </w:rPr>
+        <w:t>Chip</w:t>
+      </w:r>
+      <w:r>
+        <w:t xml:space="preserve"> </w:t>
+      </w:r>
+      <w:r>
+        <w:rPr>
+          <w:lang w:val="en-US"/>
+        </w:rPr>
+        <w:t>Writer</w:t>
+      </w:r>
+      <w:r>
+        <w:t xml:space="preserve"> </w:t>
+      </w:r>
+      <w:r>
+        <w:rPr>
+          <w:lang w:val="en-US"/>
+        </w:rPr>
+        <w:t>Driver</w:t>
+      </w:r>
+      <w:r>
+        <w:t xml:space="preserve"> внутри продукта </w:t>
+      </w:r>
+      <w:proofErr w:type="spellStart"/>
+      <w:r>
+        <w:rPr>
+          <w:lang w:val="en-US"/>
+        </w:rPr>
+        <w:t>TranzWare</w:t>
+      </w:r>
+      <w:proofErr w:type="spellEnd"/>
+      <w:r>
+        <w:t xml:space="preserve"> </w:t>
+      </w:r>
+      <w:proofErr w:type="spellStart"/>
+      <w:r>
+        <w:rPr>
+          <w:lang w:val="en-US"/>
+        </w:rPr>
+        <w:t>CardFactory</w:t>
+      </w:r>
+      <w:proofErr w:type="spellEnd"/>
+      <w:r>
+        <w:t xml:space="preserve">, </w:t>
+      </w:r>
+      <w:r>
+        <w:t>который предоставит все необходимые функции для взаимодействия с кардридерным модулем эмбоссера. При выполнении работы проводилось исследование всех необходимых компонентов посредством изучения внутренней документации компании, выполнялось проектирование будущего проектного решения и планирование изменений</w:t>
+      </w:r>
+      <w:r>
+        <w:t xml:space="preserve"> </w:t>
+      </w:r>
+      <w:r>
+        <w:t xml:space="preserve">к внесению в </w:t>
+      </w:r>
+      <w:proofErr w:type="spellStart"/>
+      <w:r>
+        <w:rPr>
+          <w:lang w:val="en-US"/>
+        </w:rPr>
+        <w:t>TranzWare</w:t>
+      </w:r>
+      <w:proofErr w:type="spellEnd"/>
+      <w:r>
+        <w:t xml:space="preserve"> </w:t>
+      </w:r>
+      <w:proofErr w:type="spellStart"/>
+      <w:r>
+        <w:rPr>
+          <w:lang w:val="en-US"/>
+        </w:rPr>
+        <w:t>CardFactory</w:t>
+      </w:r>
+      <w:proofErr w:type="spellEnd"/>
+      <w:r>
+        <w:t xml:space="preserve"> </w:t>
+      </w:r>
+      <w:r>
+        <w:t xml:space="preserve">для интеграции будущего решения. Отличительной особенностью </w:t>
+      </w:r>
+      <w:r>
+        <w:t>разработки</w:t>
+      </w:r>
+      <w:r>
+        <w:t xml:space="preserve"> является обеспечение взаимодействия </w:t>
+      </w:r>
+      <w:r>
+        <w:t xml:space="preserve">с аппаратным интерфейсом кардридерного модуля эмбоссера программными средствами платформы </w:t>
+      </w:r>
+      <w:proofErr w:type="spellStart"/>
+      <w:r>
+        <w:rPr>
+          <w:lang w:val="en-US"/>
+        </w:rPr>
+        <w:t>FloraWare</w:t>
+      </w:r>
+      <w:proofErr w:type="spellEnd"/>
+      <w:r>
+        <w:t>.</w:t>
+      </w:r>
+      <w:r>
+        <w:t xml:space="preserve"> Ранее, процесс персонализации карты с использованием эмбоссеров </w:t>
+      </w:r>
+      <w:r>
+        <w:rPr>
+          <w:lang w:val="en-US"/>
+        </w:rPr>
+        <w:t>MATICA</w:t>
+      </w:r>
+      <w:r>
+        <w:t xml:space="preserve"> </w:t>
+      </w:r>
+      <w:r>
+        <w:t xml:space="preserve">проходил в два этапа, а именно этапы эмбоссирования и записи чипа. Разработка драйвера направлена на сокращение времени между этапами, объединении этапов в один непрерывный процесс при персонализации средствами </w:t>
+      </w:r>
+      <w:proofErr w:type="spellStart"/>
+      <w:r>
+        <w:rPr>
+          <w:lang w:val="en-US"/>
+        </w:rPr>
+        <w:t>TranzWare</w:t>
+      </w:r>
+      <w:proofErr w:type="spellEnd"/>
+      <w:r>
+        <w:t xml:space="preserve"> </w:t>
+      </w:r>
+      <w:proofErr w:type="spellStart"/>
+      <w:r>
+        <w:rPr>
+          <w:lang w:val="en-US"/>
+        </w:rPr>
+        <w:t>CardFactory</w:t>
+      </w:r>
+      <w:proofErr w:type="spellEnd"/>
+      <w:r>
+        <w:t xml:space="preserve">, </w:t>
+      </w:r>
+      <w:r>
+        <w:t>создание ситуации отсутствия надобности переноса карт между этапами, что уменьшит присутствие человеческого фактора в процессе персонализации.</w:t>
+      </w:r>
+      <w:r>
+        <w:t xml:space="preserve"> Результатом работы является внедренный в </w:t>
+      </w:r>
+      <w:proofErr w:type="spellStart"/>
+      <w:r>
+        <w:rPr>
+          <w:lang w:val="en-US"/>
+        </w:rPr>
+        <w:t>TranzWare</w:t>
+      </w:r>
+      <w:proofErr w:type="spellEnd"/>
+      <w:r>
+        <w:t xml:space="preserve"> </w:t>
+      </w:r>
+      <w:proofErr w:type="spellStart"/>
+      <w:r>
+        <w:rPr>
+          <w:lang w:val="en-US"/>
+        </w:rPr>
+        <w:t>CardFactory</w:t>
+      </w:r>
+      <w:proofErr w:type="spellEnd"/>
+      <w:r>
+        <w:t xml:space="preserve"> </w:t>
+      </w:r>
+      <w:r>
+        <w:t xml:space="preserve">кардридерный драйвер. Все результаты работы были внесены в актуальную версию продукта </w:t>
+      </w:r>
+      <w:proofErr w:type="spellStart"/>
+      <w:r>
+        <w:rPr>
+          <w:lang w:val="en-US"/>
+        </w:rPr>
+        <w:t>CardFactory</w:t>
+      </w:r>
+      <w:proofErr w:type="spellEnd"/>
+      <w:r>
+        <w:t xml:space="preserve"> </w:t>
+      </w:r>
+      <w:r>
+        <w:t xml:space="preserve">и уже используются в процессинговых центрах Нигерии для выпуска пластиковых банковских карт с использованием эмбоссеров компании </w:t>
+      </w:r>
+      <w:r>
+        <w:rPr>
+          <w:lang w:val="en-US"/>
+        </w:rPr>
+        <w:t>MATICA</w:t>
+      </w:r>
+      <w:r>
+        <w:t xml:space="preserve">. </w:t>
+      </w:r>
+      <w:r>
+        <w:t xml:space="preserve">В дальнейшем, при разработке компанией </w:t>
+      </w:r>
+      <w:r>
+        <w:rPr>
+          <w:lang w:val="en-US"/>
+        </w:rPr>
+        <w:t>MATICA</w:t>
+      </w:r>
+      <w:r>
+        <w:t xml:space="preserve"> </w:t>
+      </w:r>
+      <w:r>
+        <w:t>новых кардридерных модулей или по требованию клиентов, планируется доработка драйвера для добавления возможности внесения дополнительных настроек, поддержки работы с новыми режимами записи карты и т.д.</w:t>
+      </w:r>
+    </w:p>
+    <w:p>
+      <w:pPr>
+        <w:ind w:firstLine="0"/>
+        <w:jc w:val="left"/>
+      </w:pPr>
+      <w:r>
+        <w:br w:type="page"/>
+      </w:r>
+    </w:p>
+    <w:p/>
+    <w:p>
+      <w:pPr>
+        <w:pStyle w:val="Heading1"/>
+        <w:ind w:firstLine="0"/>
+        <w:jc w:val="center"/>
       </w:pPr>
       <w:bookmarkStart w:id="0" w:name="_Toc200373931"/>
       <w:r>
@@ -10818,7 +11215,13 @@
       </w:pPr>
       <w:bookmarkStart w:id="14" w:name="_Toc200373945"/>
       <w:r>
-        <w:t>1.4 Постановка целей и задач</w:t>
+        <w:t>1.4 Постановка цел</w:t>
+      </w:r>
+      <w:r>
+        <w:t>и</w:t>
+      </w:r>
+      <w:r>
+        <w:t xml:space="preserve"> и задач</w:t>
       </w:r>
       <w:bookmarkEnd w:id="14"/>
     </w:p>
@@ -10910,7 +11313,13 @@
         <w:t>и</w:t>
       </w:r>
       <w:r>
-        <w:t xml:space="preserve"> драйвера, и задачи, которые необходимо решить для полного выполнения поставленных целей. Без определения таких ключевых элементов невозможно адекватно начинать любые процессы, связанные с разработкой драйвера. В связи с этим, на основании материала первой главы возможно составить полные списки целей и задач работы. Ниже представлен список целей разработки драйвера прямого управления кардридерным модулем эмбоссера </w:t>
+        <w:t xml:space="preserve"> драйвера, и задачи, которые необходимо решить для полного выполнения поставленных целей. Без определения таких ключевых элементов невозможно адекватно начинать любые процессы, связанные с разработкой драйвера. В связи с этим, на основании материала первой главы возможно составить полные списки задач работы</w:t>
+      </w:r>
+      <w:r>
+        <w:t xml:space="preserve">, которые необходимо выполнить для </w:t>
+      </w:r>
+      <w:r>
+        <w:t xml:space="preserve">. Ниже представлен список целей разработки драйвера прямого управления кардридерным модулем эмбоссера </w:t>
       </w:r>
       <w:r>
         <w:rPr>
@@ -11027,6 +11436,7 @@
         </w:numPr>
       </w:pPr>
       <w:r>
+        <w:lastRenderedPageBreak/>
         <w:t xml:space="preserve">Спроектировать модель будущих дополнений к пользовательскому интерфейсу модуля настроек </w:t>
       </w:r>
       <w:r>
@@ -11063,7 +11473,6 @@
         </w:numPr>
       </w:pPr>
       <w:r>
-        <w:lastRenderedPageBreak/>
         <w:t>Описать архитектуру готового проектного решения драйвера</w:t>
       </w:r>
     </w:p>
@@ -11168,7 +11577,11 @@
         <w:t xml:space="preserve"> – </w:t>
       </w:r>
       <w:r>
-        <w:t xml:space="preserve">сложный технический комплекс, состоящий из нескольких модулей, каждый из которых выполняет определенную операцию с банковской пластиковой картой, целью которого является полноценная персонализация банковской карты для выдачи клиенту. Производится и поддерживается итальянской компанией </w:t>
+        <w:t xml:space="preserve">сложный технический комплекс, состоящий из нескольких модулей, каждый из которых выполняет определенную операцию с банковской пластиковой картой, целью которого является полноценная персонализация банковской карты для выдачи </w:t>
+      </w:r>
+      <w:r>
+        <w:lastRenderedPageBreak/>
+        <w:t xml:space="preserve">клиенту. Производится и поддерживается итальянской компанией </w:t>
       </w:r>
       <w:r>
         <w:rPr>
@@ -11186,7 +11599,6 @@
         </w:numPr>
       </w:pPr>
       <w:r>
-        <w:lastRenderedPageBreak/>
         <w:t xml:space="preserve">Кардридерный модуль эмбоссера </w:t>
       </w:r>
       <w:r>
@@ -11385,7 +11797,11 @@
         <w:t xml:space="preserve"> – </w:t>
       </w:r>
       <w:r>
-        <w:t xml:space="preserve">карточный продукт. Карточный продукт состоит из набора модулей – этапов обработки карты. Каждому модулю соответствуют модуль настройки и модуль обработки. Модули настройки имеют графический интерфейс для настройки параметров обработки. Все параметры могут записываться или в базу данных или в файлы. Модули обработки последовательно запускаются, когда запускается обработка модуле </w:t>
+        <w:t xml:space="preserve">карточный продукт. Карточный продукт состоит из набора модулей – этапов обработки карты. Каждому модулю соответствуют модуль настройки и модуль обработки. Модули настройки имеют графический интерфейс для настройки параметров обработки. Все параметры могут записываться или в базу данных или в файлы. Модули обработки последовательно </w:t>
+      </w:r>
+      <w:r>
+        <w:lastRenderedPageBreak/>
+        <w:t xml:space="preserve">запускаются, когда запускается обработка модуле </w:t>
       </w:r>
       <w:r>
         <w:rPr>
@@ -11397,11 +11813,7 @@
         <w:t xml:space="preserve">. </w:t>
       </w:r>
       <w:r>
-        <w:t xml:space="preserve">Каждый модуль обработки подгружает настройки и выполняет </w:t>
-      </w:r>
-      <w:r>
-        <w:lastRenderedPageBreak/>
-        <w:t>необходимые действия, после этого запускается следующий. Работа всех модулей записывается в специальную трассу.</w:t>
+        <w:t>Каждый модуль обработки подгружает настройки и выполняет необходимые действия, после этого запускается следующий. Работа всех модулей записывается в специальную трассу.</w:t>
       </w:r>
     </w:p>
     <w:p>
@@ -12463,11 +12875,6 @@
       <w:bookmarkEnd w:id="19"/>
     </w:p>
     <w:p>
-      <w:pPr>
-        <w:rPr>
-          <w:lang w:val="en-US"/>
-        </w:rPr>
-      </w:pPr>
       <w:r>
         <w:t>Общ</w:t>
       </w:r>
@@ -12929,11 +13336,6 @@
       </w:r>
     </w:p>
     <w:p>
-      <w:pPr>
-        <w:rPr>
-          <w:lang w:val="en-US"/>
-        </w:rPr>
-      </w:pPr>
       <w:r>
         <w:t xml:space="preserve">Поток данных и управления для функциональной схемы </w:t>
       </w:r>
@@ -13181,13 +13583,7 @@
     </w:p>
     <w:p>
       <w:r>
-        <w:t xml:space="preserve">Альтернативные сценарии процессов схемы </w:t>
-      </w:r>
-      <w:r>
-        <w:t>обработки карточного продукта</w:t>
-      </w:r>
-      <w:r>
-        <w:t>:</w:t>
+        <w:t>Альтернативные сценарии процессов схемы обработки карточного продукта:</w:t>
       </w:r>
     </w:p>
     <w:p>
@@ -13220,10 +13616,7 @@
     </w:p>
     <w:p>
       <w:r>
-        <w:t xml:space="preserve">Альтернативыне сценарии процессов схемы </w:t>
-      </w:r>
-      <w:r>
-        <w:t xml:space="preserve">работы модуля обработки </w:t>
+        <w:t xml:space="preserve">Альтернативыне сценарии процессов схемы работы модуля обработки </w:t>
       </w:r>
       <w:r>
         <w:rPr>
@@ -13265,10 +13658,7 @@
         <w:t xml:space="preserve">Ошибка загрузки драйверов: Драйверы были указаны неверно или же отсустсвуют файлы, содержащие </w:t>
       </w:r>
       <w:r>
-        <w:t xml:space="preserve">объектные деревья драйверов для загрузки. </w:t>
-      </w:r>
-      <w:r>
-        <w:t>Выбрасывается ошибка, обработка прекращается.</w:t>
+        <w:t>объектные деревья драйверов для загрузки. Выбрасывается ошибка, обработка прекращается.</w:t>
       </w:r>
     </w:p>
     <w:p>
@@ -13280,10 +13670,7 @@
         </w:numPr>
       </w:pPr>
       <w:r>
-        <w:t xml:space="preserve">Ошибка соединения: Не удалось установить соединение с кардридерным модулем по сетевому протоколу в отведенное время или же соединение прервалось после подключения в процессе передачи данных. </w:t>
-      </w:r>
-      <w:r>
-        <w:t>Выбрасывается ошибка, обработка прекращается.</w:t>
+        <w:t>Ошибка соединения: Не удалось установить соединение с кардридерным модулем по сетевому протоколу в отведенное время или же соединение прервалось после подключения в процессе передачи данных. Выбрасывается ошибка, обработка прекращается.</w:t>
       </w:r>
     </w:p>
     <w:p>
@@ -13295,10 +13682,7 @@
         </w:numPr>
       </w:pPr>
       <w:r>
-        <w:t xml:space="preserve">Ошибка карты: Ответ от карты на записанные данные пришел с кодом ошибки, из чего следует возможное наличие неисправности карты или неверно выставленные настройки. </w:t>
-      </w:r>
-      <w:r>
-        <w:t>Выбрасывается ошибка, обработка прекращается.</w:t>
+        <w:t>Ошибка карты: Ответ от карты на записанные данные пришел с кодом ошибки, из чего следует возможное наличие неисправности карты или неверно выставленные настройки. Выбрасывается ошибка, обработка прекращается.</w:t>
       </w:r>
     </w:p>
     <w:p>
@@ -13313,10 +13697,7 @@
         <w:t>Ошибка кардридерного модуля: Ответ кардридерного модуля пришел в виде строки текста с описанием ошибки, что сигнализирует о</w:t>
       </w:r>
       <w:r>
-        <w:t xml:space="preserve">б ошибке во время выполнения переданных команд или же неисправности модуля. </w:t>
-      </w:r>
-      <w:r>
-        <w:t>Выбрасывается ошибка, обработка прекращается.</w:t>
+        <w:t>б ошибке во время выполнения переданных команд или же неисправности модуля. Выбрасывается ошибка, обработка прекращается.</w:t>
       </w:r>
     </w:p>
     <w:p>
@@ -13328,21 +13709,12 @@
         </w:numPr>
       </w:pPr>
       <w:r>
-        <w:t xml:space="preserve">Ошибка ожидания: На посланный набор команд от кардридерного модуля за отведенное время не пришел ответ. </w:t>
-      </w:r>
-      <w:r>
-        <w:t>Выбрасывается ошибка, обработка прекращается.</w:t>
-      </w:r>
-    </w:p>
-    <w:p>
-      <w:r>
-        <w:t xml:space="preserve">В целом, это все возможные альтернативные случаи, которые могут произойти при выполнении процессов, представленных в функциональных схемах. Все альтернативные случаи </w:t>
-      </w:r>
-      <w:r>
-        <w:t>схемы работы драйвера записи карты</w:t>
-      </w:r>
-      <w:r>
-        <w:t xml:space="preserve"> были рассмотрены как часть</w:t>
+        <w:t>Ошибка ожидания: На посланный набор команд от кардридерного модуля за отведенное время не пришел ответ. Выбрасывается ошибка, обработка прекращается.</w:t>
+      </w:r>
+    </w:p>
+    <w:p>
+      <w:r>
+        <w:t>В целом, это все возможные альтернативные случаи, которые могут произойти при выполнении процессов, представленных в функциональных схемах. Все альтернативные случаи схемы работы драйвера записи карты были рассмотрены как часть</w:t>
       </w:r>
       <w:r>
         <w:t xml:space="preserve"> </w:t>
@@ -16068,9 +16440,6 @@
       <w:pPr>
         <w:ind w:firstLine="0"/>
         <w:jc w:val="center"/>
-        <w:rPr>
-          <w:lang w:val="en-US"/>
-        </w:rPr>
       </w:pPr>
       <w:r>
         <w:t xml:space="preserve">Рисунок 2.4 Упрощенная модель будущего интерфейса </w:t>
@@ -16104,18 +16473,12 @@
       <w:pPr>
         <w:ind w:firstLine="0"/>
         <w:jc w:val="center"/>
-        <w:rPr>
-          <w:lang w:val="en-US"/>
-        </w:rPr>
       </w:pPr>
     </w:p>
     <w:p>
       <w:pPr>
         <w:ind w:firstLine="0"/>
         <w:jc w:val="center"/>
-        <w:rPr>
-          <w:lang w:val="en-US"/>
-        </w:rPr>
       </w:pPr>
     </w:p>
     <w:p>

</xml_diff>

<commit_message>
Filled List of used bibliographic sources
</commit_message>
<xml_diff>
--- a/Diplom_Main.docx
+++ b/Diplom_Main.docx
@@ -3012,7 +3012,6 @@
         <w:ind w:firstLine="0"/>
         <w:rPr>
           <w:szCs w:val="28"/>
-          <w:lang w:val="en-US"/>
         </w:rPr>
       </w:pPr>
       <w:r>
@@ -3061,7 +3060,6 @@
         <w:rPr>
           <w:sz w:val="24"/>
           <w:szCs w:val="24"/>
-          <w:lang w:val="en-US"/>
         </w:rPr>
         <w:sectPr>
           <w:pgSz w:w="11906" w:h="16838"/>
@@ -3079,7 +3077,6 @@
         <w:rPr>
           <w:sz w:val="24"/>
           <w:szCs w:val="24"/>
-          <w:lang w:val="en-US"/>
         </w:rPr>
       </w:pPr>
     </w:p>
@@ -3544,14 +3541,8 @@
         <w:spacing w:line="259" w:lineRule="auto"/>
         <w:ind w:firstLine="0"/>
         <w:jc w:val="left"/>
-        <w:rPr>
-          <w:lang w:val="en-US"/>
-        </w:rPr>
-      </w:pPr>
-      <w:r>
-        <w:rPr>
-          <w:lang w:val="en-US"/>
-        </w:rPr>
+      </w:pPr>
+      <w:r>
         <w:br w:type="page"/>
       </w:r>
     </w:p>
@@ -7382,9 +7373,6 @@
     <w:p>
       <w:pPr>
         <w:pStyle w:val="Heading2"/>
-        <w:rPr>
-          <w:lang w:val="en-US"/>
-        </w:rPr>
       </w:pPr>
       <w:bookmarkStart w:id="13" w:name="_Toc200560464"/>
       <w:r>
@@ -19034,9 +19022,6 @@
         <w:t>Используется в некоторых функциях</w:t>
       </w:r>
       <w:r>
-        <w:rPr>
-          <w:lang w:val="en-US"/>
-        </w:rPr>
         <w:t>;</w:t>
       </w:r>
     </w:p>
@@ -25713,13 +25698,790 @@
       <w:r>
         <w:t>Платежные карты. Энциклопедия 1870–2006 / Павел Юржик; Пер. с чешск. — М.: Альпина Бизнес Букс, 2007. — 304 с.</w:t>
       </w:r>
+      <w:r>
+        <w:t xml:space="preserve"> </w:t>
+      </w:r>
+      <w:r>
+        <w:t>—</w:t>
+      </w:r>
+      <w:r>
+        <w:t xml:space="preserve"> </w:t>
+      </w:r>
+      <w:r>
+        <w:t>ISBN 5-9614-0436-6</w:t>
+      </w:r>
+    </w:p>
+    <w:p>
+      <w:pPr>
+        <w:pStyle w:val="ListParagraph"/>
+        <w:numPr>
+          <w:ilvl w:val="0"/>
+          <w:numId w:val="43"/>
+        </w:numPr>
+        <w:ind w:left="0" w:firstLine="0"/>
+      </w:pPr>
+      <w:r>
+        <w:t>Объектно-ориентированный анализ и проектирование с примерами приложений на C++ / Гради Буч; Пер. с англ. под ред. И. Романовского и Ф. Андреева. - 2-е изд. - Москва : Binom ; СПб. : Нев. диалект, 1998. - 558 с. : ил., табл.; 24 см.; ISBN 5-7989-0067-3</w:t>
+      </w:r>
+    </w:p>
+    <w:p>
+      <w:pPr>
+        <w:pStyle w:val="ListParagraph"/>
+        <w:numPr>
+          <w:ilvl w:val="0"/>
+          <w:numId w:val="43"/>
+        </w:numPr>
+        <w:ind w:left="0" w:firstLine="0"/>
+      </w:pPr>
+      <w:r>
+        <w:t>Унгер, А. Ю. Объектно-ориентированное программирование : учебник / А. Ю. Унгер. — Москва : РТУ МИРЭА, 2023. — ISBN 978-5-7339-2051-1.</w:t>
+      </w:r>
+    </w:p>
+    <w:p>
+      <w:pPr>
+        <w:pStyle w:val="ListParagraph"/>
+        <w:numPr>
+          <w:ilvl w:val="0"/>
+          <w:numId w:val="43"/>
+        </w:numPr>
+        <w:ind w:left="0" w:firstLine="0"/>
+      </w:pPr>
+      <w:r>
+        <w:t>Стаяно, Ф. Figma проектирование и прототипирование интерфейсов : руководство / Ф. Стаяно ; перевод с английского В. С. Яценкова. — Москва : ДМК Пресс, 2024. — 370 с. — ISBN 978-5-93700-302-7.</w:t>
+      </w:r>
+    </w:p>
+    <w:p>
+      <w:pPr>
+        <w:pStyle w:val="ListParagraph"/>
+        <w:numPr>
+          <w:ilvl w:val="0"/>
+          <w:numId w:val="43"/>
+        </w:numPr>
+        <w:ind w:left="0" w:firstLine="0"/>
+        <w:jc w:val="left"/>
+      </w:pPr>
+      <w:r>
+        <w:t>Остроух, А. В. Проектирование информационных систем : монография / А. В. Остроух, Н. Е. Суркова. — 2-е изд., стер. — Санкт-Петербург : Лань, 2021. — ISBN 978-5-8114-8377-8</w:t>
+      </w:r>
+      <w:r>
+        <w:t>.</w:t>
+      </w:r>
+    </w:p>
+    <w:p>
+      <w:pPr>
+        <w:pStyle w:val="ListParagraph"/>
+        <w:numPr>
+          <w:ilvl w:val="0"/>
+          <w:numId w:val="43"/>
+        </w:numPr>
+        <w:ind w:left="0" w:firstLine="0"/>
+        <w:jc w:val="left"/>
+      </w:pPr>
+      <w:r>
+        <w:t>Компаниец, В. С. Проектирование и юзабилити-исследование пользовательских интерфейсов : учебное пособие / В. С. Компаниец. — Ростов-на-Дону : ЮФУ, 2020. — 107 с. — ISBN 978-5-9275-3637-5.</w:t>
+      </w:r>
+    </w:p>
+    <w:p>
+      <w:pPr>
+        <w:pStyle w:val="ListParagraph"/>
+        <w:numPr>
+          <w:ilvl w:val="0"/>
+          <w:numId w:val="43"/>
+        </w:numPr>
+        <w:ind w:left="0" w:firstLine="0"/>
+        <w:jc w:val="left"/>
+      </w:pPr>
+      <w:r>
+        <w:t>Лыгина, Н. И. Разработка требований к программному продукту : учебное пособие / Н. И. Лыгина, О. В. Лауферман. — Новосибирск : НГТУ, 2023. — 76 с. — ISBN 978-5-7782-4987-5.</w:t>
+      </w:r>
+    </w:p>
+    <w:p>
+      <w:pPr>
+        <w:pStyle w:val="ListParagraph"/>
+        <w:numPr>
+          <w:ilvl w:val="0"/>
+          <w:numId w:val="43"/>
+        </w:numPr>
+        <w:ind w:left="0" w:firstLine="0"/>
+        <w:jc w:val="left"/>
+      </w:pPr>
+      <w:r>
+        <w:t>Туманова, М. Б. Проектирование программных систем : учебное пособие / М. Б. Туманова, Е. К. Михайлова, Е. А. Муравьева. — Москва : РТУ МИРЭА, 2023. — ISBN 978-5-7339-2050-4.</w:t>
+      </w:r>
+    </w:p>
+    <w:p>
+      <w:pPr>
+        <w:pStyle w:val="ListParagraph"/>
+        <w:numPr>
+          <w:ilvl w:val="0"/>
+          <w:numId w:val="43"/>
+        </w:numPr>
+        <w:ind w:left="0" w:firstLine="0"/>
+        <w:jc w:val="left"/>
+      </w:pPr>
+      <w:r>
+        <w:t>Малышенко, Ю. В. Платежные карты, электронные платежные системы и их использование в торговле и таможенном деле : учебное пособие / Ю. В. Малышенко. — Санкт-Петербург : Интермедия, 2017. — 228 с. — ISBN 978-5-4383-0110-3.</w:t>
+      </w:r>
+    </w:p>
+    <w:p>
+      <w:pPr>
+        <w:pStyle w:val="ListParagraph"/>
+        <w:numPr>
+          <w:ilvl w:val="0"/>
+          <w:numId w:val="43"/>
+        </w:numPr>
+        <w:ind w:left="0" w:firstLine="0"/>
+        <w:jc w:val="left"/>
+      </w:pPr>
+      <w:r>
+        <w:br w:type="page"/>
+      </w:r>
+    </w:p>
+    <w:p>
+      <w:pPr>
+        <w:pStyle w:val="Heading1"/>
+      </w:pPr>
+      <w:bookmarkStart w:id="48" w:name="_Toc200560499"/>
+      <w:r>
+        <w:lastRenderedPageBreak/>
+        <w:t>Приложени</w:t>
+      </w:r>
+      <w:r>
+        <w:t xml:space="preserve">е А </w:t>
+      </w:r>
+      <w:r>
+        <w:t xml:space="preserve">Листинг кода объекта-функции </w:t>
+      </w:r>
+      <w:r>
+        <w:rPr>
+          <w:lang w:val="en-US"/>
+        </w:rPr>
+        <w:t>Open</w:t>
+      </w:r>
+      <w:bookmarkEnd w:id="48"/>
+    </w:p>
+    <w:p>
+      <w:pPr>
+        <w:rPr>
+          <w:i/>
+          <w:lang w:val="en-US"/>
+        </w:rPr>
+      </w:pPr>
+      <w:r>
+        <w:rPr>
+          <w:i/>
+          <w:lang w:val="en-US"/>
+        </w:rPr>
+        <w:t>void</w:t>
+      </w:r>
+      <w:r>
+        <w:rPr>
+          <w:i/>
+          <w:lang w:val="en-US"/>
+        </w:rPr>
+        <w:t xml:space="preserve"> </w:t>
+      </w:r>
+      <w:proofErr w:type="gramStart"/>
+      <w:r>
+        <w:rPr>
+          <w:i/>
+          <w:lang w:val="en-US"/>
+        </w:rPr>
+        <w:t>Open</w:t>
+      </w:r>
+      <w:r>
+        <w:rPr>
+          <w:i/>
+          <w:lang w:val="en-US"/>
+        </w:rPr>
+        <w:t>(</w:t>
+      </w:r>
+      <w:proofErr w:type="spellStart"/>
+      <w:proofErr w:type="gramEnd"/>
+      <w:r>
+        <w:rPr>
+          <w:i/>
+          <w:lang w:val="en-US"/>
+        </w:rPr>
+        <w:t>RStr</w:t>
+      </w:r>
+      <w:proofErr w:type="spellEnd"/>
+      <w:r>
+        <w:rPr>
+          <w:i/>
+          <w:lang w:val="en-US"/>
+        </w:rPr>
+        <w:t xml:space="preserve"> </w:t>
+      </w:r>
+      <w:r>
+        <w:rPr>
+          <w:i/>
+          <w:lang w:val="en-US"/>
+        </w:rPr>
+        <w:t>address</w:t>
+      </w:r>
+      <w:r>
+        <w:rPr>
+          <w:i/>
+          <w:lang w:val="en-US"/>
+        </w:rPr>
+        <w:t>)</w:t>
+      </w:r>
+    </w:p>
+    <w:p>
+      <w:pPr>
+        <w:rPr>
+          <w:lang w:val="en-US"/>
+        </w:rPr>
+      </w:pPr>
+      <w:r>
+        <w:rPr>
+          <w:lang w:val="en-US"/>
+        </w:rPr>
+        <w:t>#</w:t>
+      </w:r>
+      <w:r>
+        <w:rPr>
+          <w:lang w:val="en-US"/>
+        </w:rPr>
+        <w:t>define</w:t>
+      </w:r>
+      <w:r>
+        <w:rPr>
+          <w:lang w:val="en-US"/>
+        </w:rPr>
+        <w:t xml:space="preserve"> </w:t>
+      </w:r>
+      <w:r>
+        <w:rPr>
+          <w:lang w:val="en-US"/>
+        </w:rPr>
+        <w:t>port</w:t>
+      </w:r>
+      <w:r>
+        <w:rPr>
+          <w:lang w:val="en-US"/>
+        </w:rPr>
+        <w:t xml:space="preserve"> `</w:t>
+      </w:r>
+      <w:proofErr w:type="spellStart"/>
+      <w:r>
+        <w:rPr>
+          <w:lang w:val="en-US"/>
+        </w:rPr>
+        <w:t>port</w:t>
+      </w:r>
+      <w:proofErr w:type="spellEnd"/>
+      <w:r>
+        <w:rPr>
+          <w:lang w:val="en-US"/>
+        </w:rPr>
+        <w:t>`</w:t>
+      </w:r>
+    </w:p>
+    <w:p>
+      <w:pPr>
+        <w:rPr>
+          <w:lang w:val="en-US"/>
+        </w:rPr>
+      </w:pPr>
+    </w:p>
+    <w:p>
+      <w:pPr>
+        <w:rPr>
+          <w:lang w:val="en-US"/>
+        </w:rPr>
+      </w:pPr>
+      <w:r>
+        <w:rPr>
+          <w:lang w:val="en-US"/>
+        </w:rPr>
+        <w:t xml:space="preserve">int </w:t>
+      </w:r>
+      <w:proofErr w:type="spellStart"/>
+      <w:r>
+        <w:rPr>
+          <w:lang w:val="en-US"/>
+        </w:rPr>
+        <w:t>delimeterPos</w:t>
+      </w:r>
+      <w:proofErr w:type="spellEnd"/>
+      <w:r>
+        <w:rPr>
+          <w:lang w:val="en-US"/>
+        </w:rPr>
+        <w:t xml:space="preserve"> = </w:t>
+      </w:r>
+      <w:proofErr w:type="spellStart"/>
+      <w:proofErr w:type="gramStart"/>
+      <w:r>
+        <w:rPr>
+          <w:lang w:val="en-US"/>
+        </w:rPr>
+        <w:t>address.Find</w:t>
+      </w:r>
+      <w:proofErr w:type="spellEnd"/>
+      <w:proofErr w:type="gramEnd"/>
+      <w:r>
+        <w:rPr>
+          <w:lang w:val="en-US"/>
+        </w:rPr>
+        <w:t>("-");</w:t>
+      </w:r>
+    </w:p>
+    <w:p>
+      <w:pPr>
+        <w:rPr>
+          <w:lang w:val="en-US"/>
+        </w:rPr>
+      </w:pPr>
+      <w:r>
+        <w:rPr>
+          <w:lang w:val="en-US"/>
+        </w:rPr>
+        <w:t>if (</w:t>
+      </w:r>
+      <w:proofErr w:type="spellStart"/>
+      <w:r>
+        <w:rPr>
+          <w:lang w:val="en-US"/>
+        </w:rPr>
+        <w:t>delimeterPos</w:t>
+      </w:r>
+      <w:proofErr w:type="spellEnd"/>
+      <w:r>
+        <w:rPr>
+          <w:lang w:val="en-US"/>
+        </w:rPr>
+        <w:t>) {</w:t>
+      </w:r>
+    </w:p>
+    <w:p>
+      <w:pPr>
+        <w:rPr>
+          <w:lang w:val="en-US"/>
+        </w:rPr>
+      </w:pPr>
+      <w:r>
+        <w:rPr>
+          <w:lang w:val="en-US"/>
+        </w:rPr>
+        <w:t xml:space="preserve">   *`</w:t>
+      </w:r>
+      <w:proofErr w:type="spellStart"/>
+      <w:r>
+        <w:rPr>
+          <w:lang w:val="en-US"/>
+        </w:rPr>
+        <w:t>sAddress</w:t>
+      </w:r>
+      <w:proofErr w:type="spellEnd"/>
+      <w:r>
+        <w:rPr>
+          <w:lang w:val="en-US"/>
+        </w:rPr>
+        <w:t xml:space="preserve">` = </w:t>
+      </w:r>
+      <w:proofErr w:type="spellStart"/>
+      <w:proofErr w:type="gramStart"/>
+      <w:r>
+        <w:rPr>
+          <w:lang w:val="en-US"/>
+        </w:rPr>
+        <w:t>SubStr</w:t>
+      </w:r>
+      <w:proofErr w:type="spellEnd"/>
+      <w:r>
+        <w:rPr>
+          <w:lang w:val="en-US"/>
+        </w:rPr>
+        <w:t>(</w:t>
+      </w:r>
+      <w:proofErr w:type="gramEnd"/>
+      <w:r>
+        <w:rPr>
+          <w:lang w:val="en-US"/>
+        </w:rPr>
+        <w:t xml:space="preserve">address, 1, </w:t>
+      </w:r>
+      <w:proofErr w:type="spellStart"/>
+      <w:r>
+        <w:rPr>
+          <w:lang w:val="en-US"/>
+        </w:rPr>
+        <w:t>delimeterPos</w:t>
+      </w:r>
+      <w:proofErr w:type="spellEnd"/>
+      <w:r>
+        <w:rPr>
+          <w:lang w:val="en-US"/>
+        </w:rPr>
+        <w:t xml:space="preserve"> - 1);</w:t>
+      </w:r>
+    </w:p>
+    <w:p>
+      <w:pPr>
+        <w:rPr>
+          <w:lang w:val="en-US"/>
+        </w:rPr>
+      </w:pPr>
+      <w:r>
+        <w:rPr>
+          <w:lang w:val="en-US"/>
+        </w:rPr>
+        <w:t xml:space="preserve">   *`</w:t>
+      </w:r>
+      <w:proofErr w:type="spellStart"/>
+      <w:r>
+        <w:rPr>
+          <w:lang w:val="en-US"/>
+        </w:rPr>
+        <w:t>interfaceType</w:t>
+      </w:r>
+      <w:proofErr w:type="spellEnd"/>
+      <w:r>
+        <w:rPr>
+          <w:lang w:val="en-US"/>
+        </w:rPr>
+        <w:t xml:space="preserve">` = </w:t>
+      </w:r>
+      <w:proofErr w:type="spellStart"/>
+      <w:proofErr w:type="gramStart"/>
+      <w:r>
+        <w:rPr>
+          <w:lang w:val="en-US"/>
+        </w:rPr>
+        <w:t>SubStr</w:t>
+      </w:r>
+      <w:proofErr w:type="spellEnd"/>
+      <w:r>
+        <w:rPr>
+          <w:lang w:val="en-US"/>
+        </w:rPr>
+        <w:t>(</w:t>
+      </w:r>
+      <w:proofErr w:type="gramEnd"/>
+      <w:r>
+        <w:rPr>
+          <w:lang w:val="en-US"/>
+        </w:rPr>
+        <w:t xml:space="preserve">address, </w:t>
+      </w:r>
+      <w:proofErr w:type="spellStart"/>
+      <w:r>
+        <w:rPr>
+          <w:lang w:val="en-US"/>
+        </w:rPr>
+        <w:t>delimeterPos</w:t>
+      </w:r>
+      <w:proofErr w:type="spellEnd"/>
+      <w:r>
+        <w:rPr>
+          <w:lang w:val="en-US"/>
+        </w:rPr>
+        <w:t xml:space="preserve"> + 1);</w:t>
+      </w:r>
+    </w:p>
+    <w:p>
+      <w:pPr>
+        <w:rPr>
+          <w:lang w:val="en-US"/>
+        </w:rPr>
+      </w:pPr>
+      <w:r>
+        <w:rPr>
+          <w:lang w:val="en-US"/>
+        </w:rPr>
+        <w:t>}</w:t>
+      </w:r>
+    </w:p>
+    <w:p>
+      <w:pPr>
+        <w:rPr>
+          <w:lang w:val="en-US"/>
+        </w:rPr>
+      </w:pPr>
+      <w:r>
+        <w:rPr>
+          <w:lang w:val="en-US"/>
+        </w:rPr>
+        <w:t>else {</w:t>
+      </w:r>
+    </w:p>
+    <w:p>
+      <w:pPr>
+        <w:rPr>
+          <w:lang w:val="en-US"/>
+        </w:rPr>
+      </w:pPr>
+      <w:r>
+        <w:rPr>
+          <w:lang w:val="en-US"/>
+        </w:rPr>
+        <w:t xml:space="preserve">   *`</w:t>
+      </w:r>
+      <w:proofErr w:type="spellStart"/>
+      <w:r>
+        <w:rPr>
+          <w:lang w:val="en-US"/>
+        </w:rPr>
+        <w:t>sAddress</w:t>
+      </w:r>
+      <w:proofErr w:type="spellEnd"/>
+      <w:r>
+        <w:rPr>
+          <w:lang w:val="en-US"/>
+        </w:rPr>
+        <w:t>` = address;</w:t>
+      </w:r>
+    </w:p>
+    <w:p>
+      <w:pPr>
+        <w:rPr>
+          <w:lang w:val="en-US"/>
+        </w:rPr>
+      </w:pPr>
+      <w:r>
+        <w:rPr>
+          <w:lang w:val="en-US"/>
+        </w:rPr>
+        <w:t xml:space="preserve">   *`</w:t>
+      </w:r>
+      <w:proofErr w:type="spellStart"/>
+      <w:r>
+        <w:rPr>
+          <w:lang w:val="en-US"/>
+        </w:rPr>
+        <w:t>interfaceType</w:t>
+      </w:r>
+      <w:proofErr w:type="spellEnd"/>
+      <w:r>
+        <w:rPr>
+          <w:lang w:val="en-US"/>
+        </w:rPr>
+        <w:t>` = "Contact";</w:t>
+      </w:r>
+    </w:p>
+    <w:p>
+      <w:pPr>
+        <w:rPr>
+          <w:lang w:val="en-US"/>
+        </w:rPr>
+      </w:pPr>
+      <w:r>
+        <w:rPr>
+          <w:lang w:val="en-US"/>
+        </w:rPr>
+        <w:t>}</w:t>
+      </w:r>
+    </w:p>
+    <w:p>
+      <w:pPr>
+        <w:rPr>
+          <w:lang w:val="en-US"/>
+        </w:rPr>
+      </w:pPr>
+    </w:p>
+    <w:p>
+      <w:pPr>
+        <w:rPr>
+          <w:lang w:val="en-US"/>
+        </w:rPr>
+      </w:pPr>
+      <w:r>
+        <w:rPr>
+          <w:lang w:val="en-US"/>
+        </w:rPr>
+        <w:t xml:space="preserve">if </w:t>
+      </w:r>
+      <w:proofErr w:type="gramStart"/>
+      <w:r>
+        <w:rPr>
+          <w:lang w:val="en-US"/>
+        </w:rPr>
+        <w:t>(!(</w:t>
+      </w:r>
+      <w:proofErr w:type="spellStart"/>
+      <w:r>
+        <w:rPr>
+          <w:lang w:val="en-US"/>
+        </w:rPr>
+        <w:t>port.Connected</w:t>
+      </w:r>
+      <w:proofErr w:type="spellEnd"/>
+      <w:proofErr w:type="gramEnd"/>
+      <w:r>
+        <w:rPr>
+          <w:lang w:val="en-US"/>
+        </w:rPr>
+        <w:t>)) {</w:t>
+      </w:r>
+    </w:p>
+    <w:p>
+      <w:pPr>
+        <w:rPr>
+          <w:lang w:val="en-US"/>
+        </w:rPr>
+      </w:pPr>
+      <w:r>
+        <w:rPr>
+          <w:lang w:val="en-US"/>
+        </w:rPr>
+        <w:t xml:space="preserve">   </w:t>
+      </w:r>
+      <w:proofErr w:type="spellStart"/>
+      <w:r>
+        <w:rPr>
+          <w:lang w:val="en-US"/>
+        </w:rPr>
+        <w:t>port.Protocol</w:t>
+      </w:r>
+      <w:proofErr w:type="spellEnd"/>
+      <w:r>
+        <w:rPr>
+          <w:lang w:val="en-US"/>
+        </w:rPr>
+        <w:t xml:space="preserve"> = </w:t>
+      </w:r>
+      <w:proofErr w:type="spellStart"/>
+      <w:r>
+        <w:rPr>
+          <w:lang w:val="en-US"/>
+        </w:rPr>
+        <w:t>NetProtocol</w:t>
+      </w:r>
+      <w:proofErr w:type="spellEnd"/>
+      <w:r>
+        <w:rPr>
+          <w:lang w:val="en-US"/>
+        </w:rPr>
+        <w:t>::TCP;</w:t>
+      </w:r>
+    </w:p>
+    <w:p>
+      <w:pPr>
+        <w:rPr>
+          <w:lang w:val="en-US"/>
+        </w:rPr>
+      </w:pPr>
+      <w:r>
+        <w:rPr>
+          <w:lang w:val="en-US"/>
+        </w:rPr>
+        <w:t xml:space="preserve">   </w:t>
+      </w:r>
+      <w:proofErr w:type="spellStart"/>
+      <w:r>
+        <w:rPr>
+          <w:lang w:val="en-US"/>
+        </w:rPr>
+        <w:t>port.Address</w:t>
+      </w:r>
+      <w:proofErr w:type="spellEnd"/>
+      <w:r>
+        <w:rPr>
+          <w:lang w:val="en-US"/>
+        </w:rPr>
+        <w:t xml:space="preserve"> = *`</w:t>
+      </w:r>
+      <w:proofErr w:type="spellStart"/>
+      <w:r>
+        <w:rPr>
+          <w:lang w:val="en-US"/>
+        </w:rPr>
+        <w:t>sAddress</w:t>
+      </w:r>
+      <w:proofErr w:type="spellEnd"/>
+      <w:r>
+        <w:rPr>
+          <w:lang w:val="en-US"/>
+        </w:rPr>
+        <w:t>`;</w:t>
+      </w:r>
+    </w:p>
+    <w:p>
+      <w:pPr>
+        <w:rPr>
+          <w:lang w:val="en-US"/>
+        </w:rPr>
+      </w:pPr>
+      <w:r>
+        <w:rPr>
+          <w:lang w:val="en-US"/>
+        </w:rPr>
+        <w:t xml:space="preserve">   </w:t>
+      </w:r>
+      <w:proofErr w:type="spellStart"/>
+      <w:proofErr w:type="gramStart"/>
+      <w:r>
+        <w:rPr>
+          <w:lang w:val="en-US"/>
+        </w:rPr>
+        <w:t>port.Start</w:t>
+      </w:r>
+      <w:proofErr w:type="spellEnd"/>
+      <w:proofErr w:type="gramEnd"/>
+      <w:r>
+        <w:rPr>
+          <w:lang w:val="en-US"/>
+        </w:rPr>
+        <w:t>();</w:t>
+      </w:r>
+    </w:p>
+    <w:p>
+      <w:pPr>
+        <w:rPr>
+          <w:lang w:val="en-US"/>
+        </w:rPr>
+      </w:pPr>
+      <w:r>
+        <w:rPr>
+          <w:lang w:val="en-US"/>
+        </w:rPr>
+        <w:t xml:space="preserve">   </w:t>
+      </w:r>
+      <w:proofErr w:type="spellStart"/>
+      <w:proofErr w:type="gramStart"/>
+      <w:r>
+        <w:rPr>
+          <w:lang w:val="en-US"/>
+        </w:rPr>
+        <w:t>port.Connect</w:t>
+      </w:r>
+      <w:proofErr w:type="spellEnd"/>
+      <w:proofErr w:type="gramEnd"/>
+      <w:r>
+        <w:rPr>
+          <w:lang w:val="en-US"/>
+        </w:rPr>
+        <w:t>(30);</w:t>
+      </w:r>
+    </w:p>
+    <w:p>
+      <w:pPr>
+        <w:rPr>
+          <w:lang w:val="en-US"/>
+        </w:rPr>
+      </w:pPr>
+      <w:r>
+        <w:rPr>
+          <w:lang w:val="en-US"/>
+        </w:rPr>
+        <w:t>}</w:t>
+      </w:r>
     </w:p>
     <w:p>
       <w:pPr>
         <w:ind w:firstLine="0"/>
         <w:jc w:val="left"/>
-      </w:pPr>
-      <w:r>
+        <w:rPr>
+          <w:lang w:val="en-US"/>
+        </w:rPr>
+      </w:pPr>
+      <w:r>
+        <w:rPr>
+          <w:lang w:val="en-US"/>
+        </w:rPr>
         <w:br w:type="page"/>
       </w:r>
     </w:p>
@@ -25727,24 +26489,48 @@
       <w:pPr>
         <w:pStyle w:val="Heading1"/>
       </w:pPr>
-      <w:bookmarkStart w:id="48" w:name="_Toc200560499"/>
+      <w:bookmarkStart w:id="49" w:name="_Toc200560500"/>
       <w:r>
         <w:lastRenderedPageBreak/>
-        <w:t>Приложени</w:t>
-      </w:r>
-      <w:r>
-        <w:t xml:space="preserve">е А </w:t>
-      </w:r>
-      <w:r>
-        <w:t xml:space="preserve">Листинг кода объекта-функции </w:t>
-      </w:r>
-      <w:r>
-        <w:rPr>
-          <w:lang w:val="en-US"/>
-        </w:rPr>
-        <w:t>Open</w:t>
-      </w:r>
-      <w:bookmarkEnd w:id="48"/>
+        <w:t xml:space="preserve">Приложение Б </w:t>
+      </w:r>
+      <w:r>
+        <w:t>Листинг</w:t>
+      </w:r>
+      <w:r>
+        <w:t>и</w:t>
+      </w:r>
+      <w:r>
+        <w:t xml:space="preserve"> кодов объектов-функций </w:t>
+      </w:r>
+      <w:r>
+        <w:rPr>
+          <w:lang w:val="en-US"/>
+        </w:rPr>
+        <w:t>WaitCard</w:t>
+      </w:r>
+      <w:r>
+        <w:t xml:space="preserve">, </w:t>
+      </w:r>
+      <w:r>
+        <w:rPr>
+          <w:lang w:val="en-US"/>
+        </w:rPr>
+        <w:t>Restart</w:t>
+      </w:r>
+      <w:r>
+        <w:t xml:space="preserve"> </w:t>
+      </w:r>
+      <w:r>
+        <w:t xml:space="preserve">и </w:t>
+      </w:r>
+      <w:r>
+        <w:rPr>
+          <w:lang w:val="en-US"/>
+        </w:rPr>
+        <w:t>CardConnect</w:t>
+      </w:r>
+      <w:bookmarkEnd w:id="49"/>
     </w:p>
     <w:p>
       <w:pPr>
@@ -25767,14 +26553,16 @@
         </w:rPr>
         <w:t xml:space="preserve"> </w:t>
       </w:r>
+      <w:proofErr w:type="spellStart"/>
       <w:proofErr w:type="gramStart"/>
       <w:r>
         <w:rPr>
           <w:i/>
           <w:lang w:val="en-US"/>
         </w:rPr>
-        <w:t>Open</w:t>
-      </w:r>
+        <w:t>WaitCard</w:t>
+      </w:r>
+      <w:proofErr w:type="spellEnd"/>
       <w:r>
         <w:rPr>
           <w:i/>
@@ -25782,35 +26570,99 @@
         </w:rPr>
         <w:t>(</w:t>
       </w:r>
-      <w:proofErr w:type="spellStart"/>
       <w:proofErr w:type="gramEnd"/>
       <w:r>
         <w:rPr>
           <w:i/>
           <w:lang w:val="en-US"/>
         </w:rPr>
-        <w:t>RStr</w:t>
-      </w:r>
-      <w:proofErr w:type="spellEnd"/>
-      <w:r>
+        <w:t>)</w:t>
+      </w:r>
+    </w:p>
+    <w:p>
+      <w:pPr>
+        <w:rPr>
+          <w:lang w:val="en-US"/>
+        </w:rPr>
+      </w:pPr>
+      <w:proofErr w:type="spellStart"/>
+      <w:r>
+        <w:rPr>
+          <w:lang w:val="en-US"/>
+        </w:rPr>
+        <w:t>CardConnect</w:t>
+      </w:r>
+      <w:proofErr w:type="spellEnd"/>
+      <w:r>
+        <w:rPr>
+          <w:lang w:val="en-US"/>
+        </w:rPr>
+        <w:t>(*`</w:t>
+      </w:r>
+      <w:proofErr w:type="spellStart"/>
+      <w:r>
+        <w:rPr>
+          <w:lang w:val="en-US"/>
+        </w:rPr>
+        <w:t>interfaceType</w:t>
+      </w:r>
+      <w:proofErr w:type="spellEnd"/>
+      <w:r>
+        <w:rPr>
+          <w:lang w:val="en-US"/>
+        </w:rPr>
+        <w:t>`);</w:t>
+      </w:r>
+    </w:p>
+    <w:p>
+      <w:pPr>
+        <w:rPr>
+          <w:lang w:val="en-US"/>
+        </w:rPr>
+      </w:pPr>
+    </w:p>
+    <w:p>
+      <w:pPr>
         <w:rPr>
           <w:i/>
           <w:lang w:val="en-US"/>
         </w:rPr>
-        <w:t xml:space="preserve"> </w:t>
-      </w:r>
+      </w:pPr>
       <w:r>
         <w:rPr>
           <w:i/>
           <w:lang w:val="en-US"/>
         </w:rPr>
-        <w:t>address</w:t>
+        <w:t>void</w:t>
       </w:r>
       <w:r>
         <w:rPr>
           <w:i/>
           <w:lang w:val="en-US"/>
         </w:rPr>
+        <w:t xml:space="preserve"> </w:t>
+      </w:r>
+      <w:proofErr w:type="gramStart"/>
+      <w:r>
+        <w:rPr>
+          <w:i/>
+          <w:lang w:val="en-US"/>
+        </w:rPr>
+        <w:t>Restart</w:t>
+      </w:r>
+      <w:r>
+        <w:rPr>
+          <w:i/>
+          <w:lang w:val="en-US"/>
+        </w:rPr>
+        <w:t>(</w:t>
+      </w:r>
+      <w:proofErr w:type="gramEnd"/>
+      <w:r>
+        <w:rPr>
+          <w:i/>
+          <w:lang w:val="en-US"/>
+        </w:rPr>
         <w:t>)</w:t>
       </w:r>
     </w:p>
@@ -25820,76 +26672,300 @@
           <w:lang w:val="en-US"/>
         </w:rPr>
       </w:pPr>
-      <w:r>
-        <w:rPr>
-          <w:lang w:val="en-US"/>
-        </w:rPr>
-        <w:t>#</w:t>
-      </w:r>
-      <w:r>
-        <w:rPr>
-          <w:lang w:val="en-US"/>
-        </w:rPr>
-        <w:t>define</w:t>
-      </w:r>
-      <w:r>
-        <w:rPr>
-          <w:lang w:val="en-US"/>
-        </w:rPr>
-        <w:t xml:space="preserve"> </w:t>
-      </w:r>
-      <w:r>
-        <w:rPr>
-          <w:lang w:val="en-US"/>
-        </w:rPr>
-        <w:t>port</w:t>
-      </w:r>
-      <w:r>
-        <w:rPr>
-          <w:lang w:val="en-US"/>
-        </w:rPr>
-        <w:t xml:space="preserve"> `</w:t>
-      </w:r>
-      <w:proofErr w:type="spellStart"/>
-      <w:r>
-        <w:rPr>
-          <w:lang w:val="en-US"/>
-        </w:rPr>
-        <w:t>port</w:t>
-      </w:r>
-      <w:proofErr w:type="spellEnd"/>
-      <w:r>
-        <w:rPr>
-          <w:lang w:val="en-US"/>
-        </w:rPr>
-        <w:t>`</w:t>
-      </w:r>
-    </w:p>
-    <w:p>
-      <w:pPr>
-        <w:rPr>
-          <w:lang w:val="en-US"/>
-        </w:rPr>
-      </w:pPr>
-    </w:p>
-    <w:p>
-      <w:pPr>
-        <w:rPr>
-          <w:lang w:val="en-US"/>
-        </w:rPr>
-      </w:pPr>
-      <w:r>
-        <w:rPr>
-          <w:lang w:val="en-US"/>
-        </w:rPr>
-        <w:t xml:space="preserve">int </w:t>
-      </w:r>
-      <w:proofErr w:type="spellStart"/>
-      <w:r>
-        <w:rPr>
-          <w:lang w:val="en-US"/>
-        </w:rPr>
-        <w:t>delimeterPos</w:t>
+      <w:proofErr w:type="spellStart"/>
+      <w:r>
+        <w:rPr>
+          <w:lang w:val="en-US"/>
+        </w:rPr>
+        <w:t>CardConnect</w:t>
+      </w:r>
+      <w:proofErr w:type="spellEnd"/>
+      <w:r>
+        <w:rPr>
+          <w:lang w:val="en-US"/>
+        </w:rPr>
+        <w:t>(*`</w:t>
+      </w:r>
+      <w:proofErr w:type="spellStart"/>
+      <w:r>
+        <w:rPr>
+          <w:lang w:val="en-US"/>
+        </w:rPr>
+        <w:t>interfaceType</w:t>
+      </w:r>
+      <w:proofErr w:type="spellEnd"/>
+      <w:r>
+        <w:rPr>
+          <w:lang w:val="en-US"/>
+        </w:rPr>
+        <w:t>`);</w:t>
+      </w:r>
+    </w:p>
+    <w:p>
+      <w:pPr>
+        <w:rPr>
+          <w:lang w:val="en-US"/>
+        </w:rPr>
+      </w:pPr>
+    </w:p>
+    <w:p>
+      <w:pPr>
+        <w:rPr>
+          <w:i/>
+          <w:lang w:val="en-US"/>
+        </w:rPr>
+      </w:pPr>
+      <w:r>
+        <w:rPr>
+          <w:i/>
+          <w:lang w:val="en-US"/>
+        </w:rPr>
+        <w:t xml:space="preserve">void </w:t>
+      </w:r>
+      <w:proofErr w:type="spellStart"/>
+      <w:proofErr w:type="gramStart"/>
+      <w:r>
+        <w:rPr>
+          <w:i/>
+          <w:lang w:val="en-US"/>
+        </w:rPr>
+        <w:t>CardConnect</w:t>
+      </w:r>
+      <w:proofErr w:type="spellEnd"/>
+      <w:r>
+        <w:rPr>
+          <w:i/>
+          <w:lang w:val="en-US"/>
+        </w:rPr>
+        <w:t>(</w:t>
+      </w:r>
+      <w:proofErr w:type="gramEnd"/>
+      <w:r>
+        <w:rPr>
+          <w:i/>
+          <w:lang w:val="en-US"/>
+        </w:rPr>
+        <w:t xml:space="preserve">str </w:t>
+      </w:r>
+      <w:proofErr w:type="spellStart"/>
+      <w:r>
+        <w:rPr>
+          <w:i/>
+          <w:lang w:val="en-US"/>
+        </w:rPr>
+        <w:t>interfaceType</w:t>
+      </w:r>
+      <w:proofErr w:type="spellEnd"/>
+      <w:r>
+        <w:rPr>
+          <w:i/>
+          <w:lang w:val="en-US"/>
+        </w:rPr>
+        <w:t>)</w:t>
+      </w:r>
+    </w:p>
+    <w:p>
+      <w:pPr>
+        <w:rPr>
+          <w:lang w:val="en-US"/>
+        </w:rPr>
+      </w:pPr>
+      <w:r>
+        <w:rPr>
+          <w:lang w:val="en-US"/>
+        </w:rPr>
+        <w:t>str req, res;</w:t>
+      </w:r>
+    </w:p>
+    <w:p>
+      <w:pPr>
+        <w:rPr>
+          <w:lang w:val="en-US"/>
+        </w:rPr>
+      </w:pPr>
+    </w:p>
+    <w:p>
+      <w:pPr>
+        <w:rPr>
+          <w:lang w:val="en-US"/>
+        </w:rPr>
+      </w:pPr>
+      <w:r>
+        <w:rPr>
+          <w:lang w:val="en-US"/>
+        </w:rPr>
+        <w:t>req = "\"\</w:t>
+      </w:r>
+      <w:proofErr w:type="gramStart"/>
+      <w:r>
+        <w:rPr>
+          <w:lang w:val="en-US"/>
+        </w:rPr>
+        <w:t>".</w:t>
+      </w:r>
+      <w:proofErr w:type="spellStart"/>
+      <w:r>
+        <w:rPr>
+          <w:lang w:val="en-US"/>
+        </w:rPr>
+        <w:t>PrintMode</w:t>
+      </w:r>
+      <w:proofErr w:type="spellEnd"/>
+      <w:proofErr w:type="gramEnd"/>
+      <w:r>
+        <w:rPr>
+          <w:lang w:val="en-US"/>
+        </w:rPr>
+        <w:t>(1</w:t>
+      </w:r>
+      <w:proofErr w:type="gramStart"/>
+      <w:r>
+        <w:rPr>
+          <w:lang w:val="en-US"/>
+        </w:rPr>
+        <w:t>);\</w:t>
+      </w:r>
+      <w:proofErr w:type="gramEnd"/>
+      <w:r>
+        <w:rPr>
+          <w:lang w:val="en-US"/>
+        </w:rPr>
+        <w:t>0";</w:t>
+      </w:r>
+    </w:p>
+    <w:p>
+      <w:pPr>
+        <w:rPr>
+          <w:lang w:val="en-US"/>
+        </w:rPr>
+      </w:pPr>
+      <w:r>
+        <w:rPr>
+          <w:lang w:val="en-US"/>
+        </w:rPr>
+        <w:t xml:space="preserve">res = </w:t>
+      </w:r>
+      <w:proofErr w:type="spellStart"/>
+      <w:r>
+        <w:rPr>
+          <w:lang w:val="en-US"/>
+        </w:rPr>
+        <w:t>TCPSend</w:t>
+      </w:r>
+      <w:proofErr w:type="spellEnd"/>
+      <w:r>
+        <w:rPr>
+          <w:lang w:val="en-US"/>
+        </w:rPr>
+        <w:t>(req);</w:t>
+      </w:r>
+    </w:p>
+    <w:p>
+      <w:pPr>
+        <w:rPr>
+          <w:lang w:val="en-US"/>
+        </w:rPr>
+      </w:pPr>
+    </w:p>
+    <w:p>
+      <w:pPr>
+        <w:rPr>
+          <w:lang w:val="en-US"/>
+        </w:rPr>
+      </w:pPr>
+      <w:r>
+        <w:rPr>
+          <w:lang w:val="en-US"/>
+        </w:rPr>
+        <w:t xml:space="preserve">str </w:t>
+      </w:r>
+      <w:proofErr w:type="spellStart"/>
+      <w:r>
+        <w:rPr>
+          <w:lang w:val="en-US"/>
+        </w:rPr>
+        <w:t>cardInit</w:t>
+      </w:r>
+      <w:proofErr w:type="spellEnd"/>
+      <w:r>
+        <w:rPr>
+          <w:lang w:val="en-US"/>
+        </w:rPr>
+        <w:t>;</w:t>
+      </w:r>
+    </w:p>
+    <w:p>
+      <w:pPr>
+        <w:rPr>
+          <w:lang w:val="en-US"/>
+        </w:rPr>
+      </w:pPr>
+      <w:r>
+        <w:rPr>
+          <w:lang w:val="en-US"/>
+        </w:rPr>
+        <w:t>switch (</w:t>
+      </w:r>
+      <w:proofErr w:type="spellStart"/>
+      <w:r>
+        <w:rPr>
+          <w:lang w:val="en-US"/>
+        </w:rPr>
+        <w:t>interfaceType</w:t>
+      </w:r>
+      <w:proofErr w:type="spellEnd"/>
+      <w:r>
+        <w:rPr>
+          <w:lang w:val="en-US"/>
+        </w:rPr>
+        <w:t>) {</w:t>
+      </w:r>
+    </w:p>
+    <w:p>
+      <w:pPr>
+        <w:rPr>
+          <w:lang w:val="en-US"/>
+        </w:rPr>
+      </w:pPr>
+      <w:r>
+        <w:rPr>
+          <w:lang w:val="en-US"/>
+        </w:rPr>
+        <w:t xml:space="preserve">   case "Contact":</w:t>
+      </w:r>
+    </w:p>
+    <w:p>
+      <w:pPr>
+        <w:rPr>
+          <w:lang w:val="en-US"/>
+        </w:rPr>
+      </w:pPr>
+      <w:r>
+        <w:rPr>
+          <w:lang w:val="en-US"/>
+        </w:rPr>
+        <w:t xml:space="preserve">      </w:t>
+      </w:r>
+      <w:proofErr w:type="spellStart"/>
+      <w:r>
+        <w:rPr>
+          <w:lang w:val="en-US"/>
+        </w:rPr>
+        <w:t>cardInit</w:t>
+      </w:r>
+      <w:proofErr w:type="spellEnd"/>
+      <w:r>
+        <w:rPr>
+          <w:lang w:val="en-US"/>
+        </w:rPr>
+        <w:t xml:space="preserve"> = "</w:t>
+      </w:r>
+      <w:proofErr w:type="spellStart"/>
+      <w:r>
+        <w:rPr>
+          <w:lang w:val="en-US"/>
+        </w:rPr>
+        <w:t>my_card</w:t>
       </w:r>
       <w:proofErr w:type="spellEnd"/>
       <w:r>
@@ -25898,1379 +26974,417 @@
         </w:rPr>
         <w:t xml:space="preserve"> = </w:t>
       </w:r>
-      <w:proofErr w:type="spellStart"/>
       <w:proofErr w:type="gramStart"/>
       <w:r>
         <w:rPr>
           <w:lang w:val="en-US"/>
         </w:rPr>
-        <w:t>address.Find</w:t>
-      </w:r>
-      <w:proofErr w:type="spellEnd"/>
+        <w:t>card(</w:t>
+      </w:r>
       <w:proofErr w:type="gramEnd"/>
       <w:r>
         <w:rPr>
           <w:lang w:val="en-US"/>
         </w:rPr>
-        <w:t>("-");</w:t>
-      </w:r>
-    </w:p>
-    <w:p>
-      <w:pPr>
-        <w:rPr>
-          <w:lang w:val="en-US"/>
-        </w:rPr>
-      </w:pPr>
-      <w:r>
-        <w:rPr>
-          <w:lang w:val="en-US"/>
-        </w:rPr>
-        <w:t>if (</w:t>
-      </w:r>
-      <w:proofErr w:type="spellStart"/>
-      <w:r>
-        <w:rPr>
-          <w:lang w:val="en-US"/>
-        </w:rPr>
-        <w:t>delimeterPos</w:t>
-      </w:r>
-      <w:proofErr w:type="spellEnd"/>
-      <w:r>
-        <w:rPr>
-          <w:lang w:val="en-US"/>
-        </w:rPr>
-        <w:t>) {</w:t>
-      </w:r>
-    </w:p>
-    <w:p>
-      <w:pPr>
-        <w:rPr>
-          <w:lang w:val="en-US"/>
-        </w:rPr>
-      </w:pPr>
-      <w:r>
-        <w:rPr>
-          <w:lang w:val="en-US"/>
-        </w:rPr>
-        <w:t xml:space="preserve">   *`</w:t>
-      </w:r>
-      <w:proofErr w:type="spellStart"/>
-      <w:r>
-        <w:rPr>
-          <w:lang w:val="en-US"/>
-        </w:rPr>
-        <w:t>sAddress</w:t>
-      </w:r>
-      <w:proofErr w:type="spellEnd"/>
-      <w:r>
-        <w:rPr>
-          <w:lang w:val="en-US"/>
-        </w:rPr>
-        <w:t xml:space="preserve">` = </w:t>
-      </w:r>
-      <w:proofErr w:type="spellStart"/>
+        <w:t>\"SC1\</w:t>
+      </w:r>
       <w:proofErr w:type="gramStart"/>
       <w:r>
         <w:rPr>
           <w:lang w:val="en-US"/>
         </w:rPr>
-        <w:t>SubStr</w:t>
-      </w:r>
-      <w:proofErr w:type="spellEnd"/>
+        <w:t>",\</w:t>
+      </w:r>
+      <w:proofErr w:type="gramEnd"/>
+      <w:r>
+        <w:rPr>
+          <w:lang w:val="en-US"/>
+        </w:rPr>
+        <w:t>"ISO7816-3\", 1</w:t>
+      </w:r>
+      <w:proofErr w:type="gramStart"/>
+      <w:r>
+        <w:rPr>
+          <w:lang w:val="en-US"/>
+        </w:rPr>
+        <w:t>);</w:t>
+      </w:r>
+      <w:proofErr w:type="spellStart"/>
+      <w:r>
+        <w:rPr>
+          <w:lang w:val="en-US"/>
+        </w:rPr>
+        <w:t>my</w:t>
+      </w:r>
+      <w:proofErr w:type="gramEnd"/>
+      <w:r>
+        <w:rPr>
+          <w:lang w:val="en-US"/>
+        </w:rPr>
+        <w:t>_</w:t>
+      </w:r>
+      <w:proofErr w:type="gramStart"/>
+      <w:r>
+        <w:rPr>
+          <w:lang w:val="en-US"/>
+        </w:rPr>
+        <w:t>card.VccDef</w:t>
+      </w:r>
+      <w:proofErr w:type="spellEnd"/>
+      <w:proofErr w:type="gramEnd"/>
+      <w:r>
+        <w:rPr>
+          <w:lang w:val="en-US"/>
+        </w:rPr>
+        <w:t xml:space="preserve"> (3000</w:t>
+      </w:r>
+      <w:proofErr w:type="gramStart"/>
+      <w:r>
+        <w:rPr>
+          <w:lang w:val="en-US"/>
+        </w:rPr>
+        <w:t>);</w:t>
+      </w:r>
+      <w:proofErr w:type="spellStart"/>
+      <w:r>
+        <w:rPr>
+          <w:lang w:val="en-US"/>
+        </w:rPr>
+        <w:t>my</w:t>
+      </w:r>
+      <w:proofErr w:type="gramEnd"/>
+      <w:r>
+        <w:rPr>
+          <w:lang w:val="en-US"/>
+        </w:rPr>
+        <w:t>_</w:t>
+      </w:r>
+      <w:proofErr w:type="gramStart"/>
+      <w:r>
+        <w:rPr>
+          <w:lang w:val="en-US"/>
+        </w:rPr>
+        <w:t>card.FreqXSet</w:t>
+      </w:r>
+      <w:proofErr w:type="spellEnd"/>
+      <w:proofErr w:type="gramEnd"/>
+      <w:r>
+        <w:rPr>
+          <w:lang w:val="en-US"/>
+        </w:rPr>
+        <w:t>(5000);";</w:t>
+      </w:r>
+    </w:p>
+    <w:p>
+      <w:pPr>
+        <w:rPr>
+          <w:lang w:val="en-US"/>
+        </w:rPr>
+      </w:pPr>
+      <w:r>
+        <w:rPr>
+          <w:lang w:val="en-US"/>
+        </w:rPr>
+        <w:t xml:space="preserve">      break;</w:t>
+      </w:r>
+    </w:p>
+    <w:p>
+      <w:pPr>
+        <w:rPr>
+          <w:lang w:val="en-US"/>
+        </w:rPr>
+      </w:pPr>
+      <w:r>
+        <w:rPr>
+          <w:lang w:val="en-US"/>
+        </w:rPr>
+        <w:t xml:space="preserve">   case "Contactless":</w:t>
+      </w:r>
+    </w:p>
+    <w:p>
+      <w:pPr>
+        <w:rPr>
+          <w:lang w:val="en-US"/>
+        </w:rPr>
+      </w:pPr>
+      <w:r>
+        <w:rPr>
+          <w:lang w:val="en-US"/>
+        </w:rPr>
+        <w:t xml:space="preserve">      throw </w:t>
+      </w:r>
+      <w:proofErr w:type="gramStart"/>
+      <w:r>
+        <w:rPr>
+          <w:lang w:val="en-US"/>
+        </w:rPr>
+        <w:t>Ex::</w:t>
+      </w:r>
+      <w:proofErr w:type="gramEnd"/>
+      <w:r>
+        <w:rPr>
+          <w:lang w:val="en-US"/>
+        </w:rPr>
+        <w:t>Error, 0, "Contactless personalization (ISO14443-A) not supported now\</w:t>
+      </w:r>
+      <w:proofErr w:type="spellStart"/>
+      <w:r>
+        <w:rPr>
+          <w:lang w:val="en-US"/>
+        </w:rPr>
+        <w:t>nInvalid</w:t>
+      </w:r>
+      <w:proofErr w:type="spellEnd"/>
+      <w:r>
+        <w:rPr>
+          <w:lang w:val="en-US"/>
+        </w:rPr>
+        <w:t xml:space="preserve"> reader interface type: " + </w:t>
+      </w:r>
+      <w:proofErr w:type="spellStart"/>
+      <w:r>
+        <w:rPr>
+          <w:lang w:val="en-US"/>
+        </w:rPr>
+        <w:t>interfaceType</w:t>
+      </w:r>
+      <w:proofErr w:type="spellEnd"/>
+      <w:r>
+        <w:rPr>
+          <w:lang w:val="en-US"/>
+        </w:rPr>
+        <w:t>;</w:t>
+      </w:r>
+    </w:p>
+    <w:p>
+      <w:pPr>
+        <w:rPr>
+          <w:lang w:val="en-US"/>
+        </w:rPr>
+      </w:pPr>
+      <w:r>
+        <w:rPr>
+          <w:lang w:val="en-US"/>
+        </w:rPr>
+        <w:t xml:space="preserve">      break;</w:t>
+      </w:r>
+    </w:p>
+    <w:p>
+      <w:pPr>
+        <w:rPr>
+          <w:lang w:val="en-US"/>
+        </w:rPr>
+      </w:pPr>
+      <w:r>
+        <w:rPr>
+          <w:lang w:val="en-US"/>
+        </w:rPr>
+        <w:t xml:space="preserve">   default:</w:t>
+      </w:r>
+    </w:p>
+    <w:p>
+      <w:pPr>
+        <w:rPr>
+          <w:lang w:val="en-US"/>
+        </w:rPr>
+      </w:pPr>
+      <w:r>
+        <w:rPr>
+          <w:lang w:val="en-US"/>
+        </w:rPr>
+        <w:t xml:space="preserve">      throw </w:t>
+      </w:r>
+      <w:proofErr w:type="gramStart"/>
+      <w:r>
+        <w:rPr>
+          <w:lang w:val="en-US"/>
+        </w:rPr>
+        <w:t>Ex::</w:t>
+      </w:r>
+      <w:proofErr w:type="gramEnd"/>
+      <w:r>
+        <w:rPr>
+          <w:lang w:val="en-US"/>
+        </w:rPr>
+        <w:t>Error, 0, "Invalid reader int</w:t>
+      </w:r>
+      <w:r>
+        <w:rPr>
+          <w:lang w:val="en-US"/>
+        </w:rPr>
+        <w:t xml:space="preserve">erface type: " + </w:t>
+      </w:r>
+      <w:proofErr w:type="spellStart"/>
+      <w:r>
+        <w:rPr>
+          <w:lang w:val="en-US"/>
+        </w:rPr>
+        <w:t>interfaceType</w:t>
+      </w:r>
+      <w:proofErr w:type="spellEnd"/>
+      <w:r>
+        <w:rPr>
+          <w:lang w:val="en-US"/>
+        </w:rPr>
+        <w:t>;</w:t>
+      </w:r>
+    </w:p>
+    <w:p>
+      <w:pPr>
+        <w:rPr>
+          <w:lang w:val="en-US"/>
+        </w:rPr>
+      </w:pPr>
+      <w:r>
+        <w:rPr>
+          <w:lang w:val="en-US"/>
+        </w:rPr>
+        <w:t>}</w:t>
+      </w:r>
+    </w:p>
+    <w:p>
+      <w:pPr>
+        <w:rPr>
+          <w:lang w:val="en-US"/>
+        </w:rPr>
+      </w:pPr>
+      <w:r>
+        <w:rPr>
+          <w:lang w:val="en-US"/>
+        </w:rPr>
+        <w:t>req = "</w:t>
+      </w:r>
+      <w:proofErr w:type="spellStart"/>
+      <w:r>
+        <w:rPr>
+          <w:lang w:val="en-US"/>
+        </w:rPr>
+        <w:t>my_</w:t>
+      </w:r>
+      <w:proofErr w:type="gramStart"/>
+      <w:r>
+        <w:rPr>
+          <w:lang w:val="en-US"/>
+        </w:rPr>
+        <w:t>card</w:t>
+      </w:r>
+      <w:proofErr w:type="spellEnd"/>
+      <w:r>
+        <w:rPr>
+          <w:lang w:val="en-US"/>
+        </w:rPr>
+        <w:t>:=0;where(){</w:t>
+      </w:r>
+      <w:proofErr w:type="spellStart"/>
+      <w:r>
+        <w:rPr>
+          <w:lang w:val="en-US"/>
+        </w:rPr>
+        <w:t>flow.Throw</w:t>
+      </w:r>
+      <w:proofErr w:type="spellEnd"/>
+      <w:proofErr w:type="gramEnd"/>
+      <w:r>
+        <w:rPr>
+          <w:lang w:val="en-US"/>
+        </w:rPr>
+        <w:t xml:space="preserve">(0, "");" + </w:t>
+      </w:r>
+      <w:proofErr w:type="spellStart"/>
+      <w:r>
+        <w:rPr>
+          <w:lang w:val="en-US"/>
+        </w:rPr>
+        <w:t>cardInit</w:t>
+      </w:r>
+      <w:proofErr w:type="spellEnd"/>
+      <w:r>
+        <w:rPr>
+          <w:lang w:val="en-US"/>
+        </w:rPr>
+        <w:t xml:space="preserve"> + "</w:t>
+      </w:r>
+      <w:proofErr w:type="spellStart"/>
+      <w:r>
+        <w:rPr>
+          <w:lang w:val="en-US"/>
+        </w:rPr>
+        <w:t>my_</w:t>
+      </w:r>
+      <w:proofErr w:type="gramStart"/>
+      <w:r>
+        <w:rPr>
+          <w:lang w:val="en-US"/>
+        </w:rPr>
+        <w:t>card.Reset</w:t>
+      </w:r>
+      <w:proofErr w:type="spellEnd"/>
+      <w:proofErr w:type="gramEnd"/>
       <w:r>
         <w:rPr>
           <w:lang w:val="en-US"/>
         </w:rPr>
         <w:t>(</w:t>
       </w:r>
+      <w:proofErr w:type="gramStart"/>
+      <w:r>
+        <w:rPr>
+          <w:lang w:val="en-US"/>
+        </w:rPr>
+        <w:t>).Hex</w:t>
+      </w:r>
       <w:proofErr w:type="gramEnd"/>
       <w:r>
         <w:rPr>
           <w:lang w:val="en-US"/>
         </w:rPr>
-        <w:t xml:space="preserve">address, 1, </w:t>
-      </w:r>
-      <w:proofErr w:type="spellStart"/>
-      <w:r>
-        <w:rPr>
-          <w:lang w:val="en-US"/>
-        </w:rPr>
-        <w:t>delimeterPos</w:t>
-      </w:r>
-      <w:proofErr w:type="spellEnd"/>
-      <w:r>
-        <w:rPr>
-          <w:lang w:val="en-US"/>
-        </w:rPr>
-        <w:t xml:space="preserve"> - 1);</w:t>
-      </w:r>
-    </w:p>
-    <w:p>
-      <w:pPr>
-        <w:rPr>
-          <w:lang w:val="en-US"/>
-        </w:rPr>
-      </w:pPr>
-      <w:r>
-        <w:rPr>
-          <w:lang w:val="en-US"/>
-        </w:rPr>
-        <w:t xml:space="preserve">   *`</w:t>
-      </w:r>
-      <w:proofErr w:type="spellStart"/>
-      <w:r>
-        <w:rPr>
-          <w:lang w:val="en-US"/>
-        </w:rPr>
-        <w:t>interfaceType</w:t>
-      </w:r>
-      <w:proofErr w:type="spellEnd"/>
-      <w:r>
-        <w:rPr>
-          <w:lang w:val="en-US"/>
-        </w:rPr>
-        <w:t xml:space="preserve">` = </w:t>
-      </w:r>
-      <w:proofErr w:type="spellStart"/>
-      <w:proofErr w:type="gramStart"/>
-      <w:r>
-        <w:rPr>
-          <w:lang w:val="en-US"/>
-        </w:rPr>
-        <w:t>SubStr</w:t>
-      </w:r>
-      <w:proofErr w:type="spellEnd"/>
-      <w:r>
-        <w:rPr>
-          <w:lang w:val="en-US"/>
-        </w:rPr>
+        <w:t>}\0";</w:t>
+      </w:r>
+    </w:p>
+    <w:p>
+      <w:r>
+        <w:rPr>
+          <w:lang w:val="en-US"/>
+        </w:rPr>
+        <w:t>str</w:t>
+      </w:r>
+      <w:r>
+        <w:t xml:space="preserve"> </w:t>
+      </w:r>
+      <w:r>
+        <w:rPr>
+          <w:lang w:val="en-US"/>
+        </w:rPr>
+        <w:t>ATR</w:t>
+      </w:r>
+      <w:r>
+        <w:t xml:space="preserve"> = </w:t>
+      </w:r>
+      <w:proofErr w:type="spellStart"/>
+      <w:r>
+        <w:rPr>
+          <w:lang w:val="en-US"/>
+        </w:rPr>
+        <w:t>TCPSend</w:t>
+      </w:r>
+      <w:proofErr w:type="spellEnd"/>
+      <w:r>
         <w:t>(</w:t>
       </w:r>
-      <w:proofErr w:type="gramEnd"/>
-      <w:r>
-        <w:rPr>
-          <w:lang w:val="en-US"/>
-        </w:rPr>
-        <w:t xml:space="preserve">address, </w:t>
-      </w:r>
-      <w:proofErr w:type="spellStart"/>
-      <w:r>
-        <w:rPr>
-          <w:lang w:val="en-US"/>
-        </w:rPr>
-        <w:t>delimeterPos</w:t>
-      </w:r>
-      <w:proofErr w:type="spellEnd"/>
-      <w:r>
-        <w:rPr>
-          <w:lang w:val="en-US"/>
-        </w:rPr>
-        <w:t xml:space="preserve"> + 1);</w:t>
-      </w:r>
-    </w:p>
-    <w:p>
-      <w:pPr>
-        <w:rPr>
-          <w:lang w:val="en-US"/>
-        </w:rPr>
-      </w:pPr>
-      <w:r>
-        <w:rPr>
-          <w:lang w:val="en-US"/>
-        </w:rPr>
-        <w:t>}</w:t>
-      </w:r>
-    </w:p>
-    <w:p>
-      <w:pPr>
-        <w:rPr>
-          <w:lang w:val="en-US"/>
-        </w:rPr>
-      </w:pPr>
-      <w:r>
-        <w:rPr>
-          <w:lang w:val="en-US"/>
-        </w:rPr>
-        <w:t>else {</w:t>
-      </w:r>
-    </w:p>
-    <w:p>
-      <w:pPr>
-        <w:rPr>
-          <w:lang w:val="en-US"/>
-        </w:rPr>
-      </w:pPr>
-      <w:r>
-        <w:rPr>
-          <w:lang w:val="en-US"/>
-        </w:rPr>
-        <w:t xml:space="preserve">   *`</w:t>
-      </w:r>
-      <w:proofErr w:type="spellStart"/>
-      <w:r>
-        <w:rPr>
-          <w:lang w:val="en-US"/>
-        </w:rPr>
-        <w:t>sAddress</w:t>
-      </w:r>
-      <w:proofErr w:type="spellEnd"/>
-      <w:r>
-        <w:rPr>
-          <w:lang w:val="en-US"/>
-        </w:rPr>
-        <w:t>` = address;</w:t>
-      </w:r>
-    </w:p>
-    <w:p>
-      <w:pPr>
-        <w:rPr>
-          <w:lang w:val="en-US"/>
-        </w:rPr>
-      </w:pPr>
-      <w:r>
-        <w:rPr>
-          <w:lang w:val="en-US"/>
-        </w:rPr>
-        <w:t xml:space="preserve">   *`</w:t>
-      </w:r>
-      <w:proofErr w:type="spellStart"/>
-      <w:r>
-        <w:rPr>
-          <w:lang w:val="en-US"/>
-        </w:rPr>
-        <w:t>interfaceType</w:t>
-      </w:r>
-      <w:proofErr w:type="spellEnd"/>
-      <w:r>
-        <w:rPr>
-          <w:lang w:val="en-US"/>
-        </w:rPr>
-        <w:t>` = "Contact";</w:t>
-      </w:r>
-    </w:p>
-    <w:p>
-      <w:pPr>
-        <w:rPr>
-          <w:lang w:val="en-US"/>
-        </w:rPr>
-      </w:pPr>
-      <w:r>
-        <w:rPr>
-          <w:lang w:val="en-US"/>
-        </w:rPr>
-        <w:t>}</w:t>
-      </w:r>
-    </w:p>
-    <w:p>
-      <w:pPr>
-        <w:rPr>
-          <w:lang w:val="en-US"/>
-        </w:rPr>
-      </w:pPr>
-    </w:p>
-    <w:p>
-      <w:pPr>
-        <w:rPr>
-          <w:lang w:val="en-US"/>
-        </w:rPr>
-      </w:pPr>
-      <w:r>
-        <w:rPr>
-          <w:lang w:val="en-US"/>
-        </w:rPr>
-        <w:t xml:space="preserve">if </w:t>
-      </w:r>
-      <w:proofErr w:type="gramStart"/>
-      <w:r>
-        <w:rPr>
-          <w:lang w:val="en-US"/>
-        </w:rPr>
-        <w:t>(!(</w:t>
-      </w:r>
-      <w:proofErr w:type="spellStart"/>
-      <w:r>
-        <w:rPr>
-          <w:lang w:val="en-US"/>
-        </w:rPr>
-        <w:t>port.Connected</w:t>
-      </w:r>
-      <w:proofErr w:type="spellEnd"/>
-      <w:proofErr w:type="gramEnd"/>
-      <w:r>
-        <w:rPr>
-          <w:lang w:val="en-US"/>
-        </w:rPr>
-        <w:t>)) {</w:t>
-      </w:r>
-    </w:p>
-    <w:p>
-      <w:pPr>
-        <w:rPr>
-          <w:lang w:val="en-US"/>
-        </w:rPr>
-      </w:pPr>
-      <w:r>
-        <w:rPr>
-          <w:lang w:val="en-US"/>
-        </w:rPr>
-        <w:t xml:space="preserve">   </w:t>
-      </w:r>
-      <w:proofErr w:type="spellStart"/>
-      <w:r>
-        <w:rPr>
-          <w:lang w:val="en-US"/>
-        </w:rPr>
-        <w:t>port.Protocol</w:t>
-      </w:r>
-      <w:proofErr w:type="spellEnd"/>
-      <w:r>
-        <w:rPr>
-          <w:lang w:val="en-US"/>
-        </w:rPr>
-        <w:t xml:space="preserve"> = </w:t>
-      </w:r>
-      <w:proofErr w:type="spellStart"/>
-      <w:r>
-        <w:rPr>
-          <w:lang w:val="en-US"/>
-        </w:rPr>
-        <w:t>NetProtocol</w:t>
-      </w:r>
-      <w:proofErr w:type="spellEnd"/>
-      <w:r>
-        <w:rPr>
-          <w:lang w:val="en-US"/>
-        </w:rPr>
-        <w:t>::TCP;</w:t>
-      </w:r>
-    </w:p>
-    <w:p>
-      <w:pPr>
-        <w:rPr>
-          <w:lang w:val="en-US"/>
-        </w:rPr>
-      </w:pPr>
-      <w:r>
-        <w:rPr>
-          <w:lang w:val="en-US"/>
-        </w:rPr>
-        <w:t xml:space="preserve">   </w:t>
-      </w:r>
-      <w:proofErr w:type="spellStart"/>
-      <w:r>
-        <w:rPr>
-          <w:lang w:val="en-US"/>
-        </w:rPr>
-        <w:t>port.Address</w:t>
-      </w:r>
-      <w:proofErr w:type="spellEnd"/>
-      <w:r>
-        <w:rPr>
-          <w:lang w:val="en-US"/>
-        </w:rPr>
-        <w:t xml:space="preserve"> = *`</w:t>
-      </w:r>
-      <w:proofErr w:type="spellStart"/>
-      <w:r>
-        <w:rPr>
-          <w:lang w:val="en-US"/>
-        </w:rPr>
-        <w:t>sAddress</w:t>
-      </w:r>
-      <w:proofErr w:type="spellEnd"/>
-      <w:r>
-        <w:rPr>
-          <w:lang w:val="en-US"/>
-        </w:rPr>
-        <w:t>`;</w:t>
-      </w:r>
-    </w:p>
-    <w:p>
-      <w:pPr>
-        <w:rPr>
-          <w:lang w:val="en-US"/>
-        </w:rPr>
-      </w:pPr>
-      <w:r>
-        <w:rPr>
-          <w:lang w:val="en-US"/>
-        </w:rPr>
-        <w:t xml:space="preserve">   </w:t>
-      </w:r>
-      <w:proofErr w:type="spellStart"/>
-      <w:proofErr w:type="gramStart"/>
-      <w:r>
-        <w:rPr>
-          <w:lang w:val="en-US"/>
-        </w:rPr>
-        <w:t>port.Start</w:t>
-      </w:r>
-      <w:proofErr w:type="spellEnd"/>
-      <w:proofErr w:type="gramEnd"/>
-      <w:r>
-        <w:rPr>
-          <w:lang w:val="en-US"/>
-        </w:rPr>
-        <w:t>();</w:t>
-      </w:r>
-    </w:p>
-    <w:p>
-      <w:pPr>
-        <w:rPr>
-          <w:lang w:val="en-US"/>
-        </w:rPr>
-      </w:pPr>
-      <w:r>
-        <w:rPr>
-          <w:lang w:val="en-US"/>
-        </w:rPr>
-        <w:t xml:space="preserve">   </w:t>
-      </w:r>
-      <w:proofErr w:type="spellStart"/>
-      <w:proofErr w:type="gramStart"/>
-      <w:r>
-        <w:rPr>
-          <w:lang w:val="en-US"/>
-        </w:rPr>
-        <w:t>port.Connect</w:t>
-      </w:r>
-      <w:proofErr w:type="spellEnd"/>
-      <w:proofErr w:type="gramEnd"/>
-      <w:r>
-        <w:rPr>
-          <w:lang w:val="en-US"/>
-        </w:rPr>
-        <w:t>(30);</w:t>
-      </w:r>
-    </w:p>
-    <w:p>
-      <w:pPr>
-        <w:rPr>
-          <w:lang w:val="en-US"/>
-        </w:rPr>
-      </w:pPr>
-      <w:r>
-        <w:rPr>
-          <w:lang w:val="en-US"/>
-        </w:rPr>
-        <w:t>}</w:t>
+      <w:r>
+        <w:rPr>
+          <w:lang w:val="en-US"/>
+        </w:rPr>
+        <w:t>req</w:t>
+      </w:r>
+      <w:r>
+        <w:t>);</w:t>
       </w:r>
     </w:p>
     <w:p>
       <w:pPr>
         <w:ind w:firstLine="0"/>
         <w:jc w:val="left"/>
-        <w:rPr>
-          <w:lang w:val="en-US"/>
-        </w:rPr>
-      </w:pPr>
-      <w:r>
-        <w:rPr>
-          <w:lang w:val="en-US"/>
-        </w:rPr>
-        <w:br w:type="page"/>
-      </w:r>
-    </w:p>
-    <w:p>
-      <w:pPr>
-        <w:pStyle w:val="Heading1"/>
-      </w:pPr>
-      <w:bookmarkStart w:id="49" w:name="_Toc200560500"/>
-      <w:r>
-        <w:lastRenderedPageBreak/>
-        <w:t xml:space="preserve">Приложение Б </w:t>
-      </w:r>
-      <w:r>
-        <w:t>Листинг</w:t>
-      </w:r>
-      <w:r>
-        <w:t>и</w:t>
-      </w:r>
-      <w:r>
-        <w:t xml:space="preserve"> кодов объектов-функций </w:t>
-      </w:r>
-      <w:r>
-        <w:rPr>
-          <w:lang w:val="en-US"/>
-        </w:rPr>
-        <w:t>WaitCard</w:t>
-      </w:r>
-      <w:r>
-        <w:t xml:space="preserve">, </w:t>
-      </w:r>
-      <w:r>
-        <w:rPr>
-          <w:lang w:val="en-US"/>
-        </w:rPr>
-        <w:t>Restart</w:t>
-      </w:r>
-      <w:r>
-        <w:t xml:space="preserve"> </w:t>
-      </w:r>
-      <w:r>
-        <w:t xml:space="preserve">и </w:t>
-      </w:r>
-      <w:r>
-        <w:rPr>
-          <w:lang w:val="en-US"/>
-        </w:rPr>
-        <w:t>CardConnect</w:t>
-      </w:r>
-      <w:bookmarkEnd w:id="49"/>
-    </w:p>
-    <w:p>
-      <w:pPr>
-        <w:rPr>
-          <w:i/>
-          <w:lang w:val="en-US"/>
-        </w:rPr>
-      </w:pPr>
-      <w:r>
-        <w:rPr>
-          <w:i/>
-          <w:lang w:val="en-US"/>
-        </w:rPr>
-        <w:t>void</w:t>
-      </w:r>
-      <w:r>
-        <w:rPr>
-          <w:i/>
-          <w:lang w:val="en-US"/>
-        </w:rPr>
-        <w:t xml:space="preserve"> </w:t>
-      </w:r>
-      <w:proofErr w:type="spellStart"/>
-      <w:proofErr w:type="gramStart"/>
-      <w:r>
-        <w:rPr>
-          <w:i/>
-          <w:lang w:val="en-US"/>
-        </w:rPr>
-        <w:t>WaitCard</w:t>
-      </w:r>
-      <w:proofErr w:type="spellEnd"/>
-      <w:r>
-        <w:rPr>
-          <w:i/>
-          <w:lang w:val="en-US"/>
-        </w:rPr>
-        <w:t>(</w:t>
-      </w:r>
-      <w:proofErr w:type="gramEnd"/>
-      <w:r>
-        <w:rPr>
-          <w:i/>
-          <w:lang w:val="en-US"/>
-        </w:rPr>
-        <w:t>)</w:t>
-      </w:r>
-    </w:p>
-    <w:p>
-      <w:pPr>
-        <w:rPr>
-          <w:lang w:val="en-US"/>
-        </w:rPr>
-      </w:pPr>
-      <w:proofErr w:type="spellStart"/>
-      <w:r>
-        <w:rPr>
-          <w:lang w:val="en-US"/>
-        </w:rPr>
-        <w:t>CardConnect</w:t>
-      </w:r>
-      <w:proofErr w:type="spellEnd"/>
-      <w:r>
-        <w:rPr>
-          <w:lang w:val="en-US"/>
-        </w:rPr>
-        <w:t>(*`</w:t>
-      </w:r>
-      <w:proofErr w:type="spellStart"/>
-      <w:r>
-        <w:rPr>
-          <w:lang w:val="en-US"/>
-        </w:rPr>
-        <w:t>interfaceType</w:t>
-      </w:r>
-      <w:proofErr w:type="spellEnd"/>
-      <w:r>
-        <w:rPr>
-          <w:lang w:val="en-US"/>
-        </w:rPr>
-        <w:t>`);</w:t>
-      </w:r>
-    </w:p>
-    <w:p>
-      <w:pPr>
-        <w:rPr>
-          <w:lang w:val="en-US"/>
-        </w:rPr>
-      </w:pPr>
-    </w:p>
-    <w:p>
-      <w:pPr>
-        <w:rPr>
-          <w:i/>
-          <w:lang w:val="en-US"/>
-        </w:rPr>
-      </w:pPr>
-      <w:r>
-        <w:rPr>
-          <w:i/>
-          <w:lang w:val="en-US"/>
-        </w:rPr>
-        <w:t>void</w:t>
-      </w:r>
-      <w:r>
-        <w:rPr>
-          <w:i/>
-          <w:lang w:val="en-US"/>
-        </w:rPr>
-        <w:t xml:space="preserve"> </w:t>
-      </w:r>
-      <w:proofErr w:type="gramStart"/>
-      <w:r>
-        <w:rPr>
-          <w:i/>
-          <w:lang w:val="en-US"/>
-        </w:rPr>
-        <w:t>Restart</w:t>
-      </w:r>
-      <w:r>
-        <w:rPr>
-          <w:i/>
-          <w:lang w:val="en-US"/>
-        </w:rPr>
-        <w:t>(</w:t>
-      </w:r>
-      <w:proofErr w:type="gramEnd"/>
-      <w:r>
-        <w:rPr>
-          <w:i/>
-          <w:lang w:val="en-US"/>
-        </w:rPr>
-        <w:t>)</w:t>
-      </w:r>
-    </w:p>
-    <w:p>
-      <w:pPr>
-        <w:rPr>
-          <w:lang w:val="en-US"/>
-        </w:rPr>
-      </w:pPr>
-      <w:proofErr w:type="spellStart"/>
-      <w:r>
-        <w:rPr>
-          <w:lang w:val="en-US"/>
-        </w:rPr>
-        <w:t>CardConnect</w:t>
-      </w:r>
-      <w:proofErr w:type="spellEnd"/>
-      <w:r>
-        <w:rPr>
-          <w:lang w:val="en-US"/>
-        </w:rPr>
-        <w:t>(*`</w:t>
-      </w:r>
-      <w:proofErr w:type="spellStart"/>
-      <w:r>
-        <w:rPr>
-          <w:lang w:val="en-US"/>
-        </w:rPr>
-        <w:t>interfaceType</w:t>
-      </w:r>
-      <w:proofErr w:type="spellEnd"/>
-      <w:r>
-        <w:rPr>
-          <w:lang w:val="en-US"/>
-        </w:rPr>
-        <w:t>`);</w:t>
-      </w:r>
-    </w:p>
-    <w:p>
-      <w:pPr>
-        <w:rPr>
-          <w:lang w:val="en-US"/>
-        </w:rPr>
-      </w:pPr>
-    </w:p>
-    <w:p>
-      <w:pPr>
-        <w:rPr>
-          <w:i/>
-          <w:lang w:val="en-US"/>
-        </w:rPr>
-      </w:pPr>
-      <w:r>
-        <w:rPr>
-          <w:i/>
-          <w:lang w:val="en-US"/>
-        </w:rPr>
-        <w:t xml:space="preserve">void </w:t>
-      </w:r>
-      <w:proofErr w:type="spellStart"/>
-      <w:proofErr w:type="gramStart"/>
-      <w:r>
-        <w:rPr>
-          <w:i/>
-          <w:lang w:val="en-US"/>
-        </w:rPr>
-        <w:t>CardConnect</w:t>
-      </w:r>
-      <w:proofErr w:type="spellEnd"/>
-      <w:r>
-        <w:rPr>
-          <w:i/>
-          <w:lang w:val="en-US"/>
-        </w:rPr>
-        <w:t>(</w:t>
-      </w:r>
-      <w:proofErr w:type="gramEnd"/>
-      <w:r>
-        <w:rPr>
-          <w:i/>
-          <w:lang w:val="en-US"/>
-        </w:rPr>
-        <w:t xml:space="preserve">str </w:t>
-      </w:r>
-      <w:proofErr w:type="spellStart"/>
-      <w:r>
-        <w:rPr>
-          <w:i/>
-          <w:lang w:val="en-US"/>
-        </w:rPr>
-        <w:t>interfaceType</w:t>
-      </w:r>
-      <w:proofErr w:type="spellEnd"/>
-      <w:r>
-        <w:rPr>
-          <w:i/>
-          <w:lang w:val="en-US"/>
-        </w:rPr>
-        <w:t>)</w:t>
-      </w:r>
-    </w:p>
-    <w:p>
-      <w:pPr>
-        <w:rPr>
-          <w:lang w:val="en-US"/>
-        </w:rPr>
-      </w:pPr>
-      <w:r>
-        <w:rPr>
-          <w:lang w:val="en-US"/>
-        </w:rPr>
-        <w:t>str req, res;</w:t>
-      </w:r>
-    </w:p>
-    <w:p>
-      <w:pPr>
-        <w:rPr>
-          <w:lang w:val="en-US"/>
-        </w:rPr>
-      </w:pPr>
-    </w:p>
-    <w:p>
-      <w:pPr>
-        <w:rPr>
-          <w:lang w:val="en-US"/>
-        </w:rPr>
-      </w:pPr>
-      <w:r>
-        <w:rPr>
-          <w:lang w:val="en-US"/>
-        </w:rPr>
-        <w:t>req = "\"\</w:t>
-      </w:r>
-      <w:proofErr w:type="gramStart"/>
-      <w:r>
-        <w:rPr>
-          <w:lang w:val="en-US"/>
-        </w:rPr>
-        <w:t>".</w:t>
-      </w:r>
-      <w:proofErr w:type="spellStart"/>
-      <w:r>
-        <w:rPr>
-          <w:lang w:val="en-US"/>
-        </w:rPr>
-        <w:t>PrintMode</w:t>
-      </w:r>
-      <w:proofErr w:type="spellEnd"/>
-      <w:proofErr w:type="gramEnd"/>
-      <w:r>
-        <w:rPr>
-          <w:lang w:val="en-US"/>
-        </w:rPr>
-        <w:t>(1</w:t>
-      </w:r>
-      <w:proofErr w:type="gramStart"/>
-      <w:r>
-        <w:rPr>
-          <w:lang w:val="en-US"/>
-        </w:rPr>
-        <w:t>);\</w:t>
-      </w:r>
-      <w:proofErr w:type="gramEnd"/>
-      <w:r>
-        <w:rPr>
-          <w:lang w:val="en-US"/>
-        </w:rPr>
-        <w:t>0";</w:t>
-      </w:r>
-    </w:p>
-    <w:p>
-      <w:pPr>
-        <w:rPr>
-          <w:lang w:val="en-US"/>
-        </w:rPr>
-      </w:pPr>
-      <w:r>
-        <w:rPr>
-          <w:lang w:val="en-US"/>
-        </w:rPr>
-        <w:t xml:space="preserve">res = </w:t>
-      </w:r>
-      <w:proofErr w:type="spellStart"/>
-      <w:r>
-        <w:rPr>
-          <w:lang w:val="en-US"/>
-        </w:rPr>
-        <w:t>TCPSend</w:t>
-      </w:r>
-      <w:proofErr w:type="spellEnd"/>
-      <w:r>
-        <w:rPr>
-          <w:lang w:val="en-US"/>
-        </w:rPr>
-        <w:t>(req);</w:t>
-      </w:r>
-    </w:p>
-    <w:p>
-      <w:pPr>
-        <w:rPr>
-          <w:lang w:val="en-US"/>
-        </w:rPr>
-      </w:pPr>
-    </w:p>
-    <w:p>
-      <w:pPr>
-        <w:rPr>
-          <w:lang w:val="en-US"/>
-        </w:rPr>
-      </w:pPr>
-      <w:r>
-        <w:rPr>
-          <w:lang w:val="en-US"/>
-        </w:rPr>
-        <w:t xml:space="preserve">str </w:t>
-      </w:r>
-      <w:proofErr w:type="spellStart"/>
-      <w:r>
-        <w:rPr>
-          <w:lang w:val="en-US"/>
-        </w:rPr>
-        <w:t>cardInit</w:t>
-      </w:r>
-      <w:proofErr w:type="spellEnd"/>
-      <w:r>
-        <w:rPr>
-          <w:lang w:val="en-US"/>
-        </w:rPr>
-        <w:t>;</w:t>
-      </w:r>
-    </w:p>
-    <w:p>
-      <w:pPr>
-        <w:rPr>
-          <w:lang w:val="en-US"/>
-        </w:rPr>
-      </w:pPr>
-      <w:r>
-        <w:rPr>
-          <w:lang w:val="en-US"/>
-        </w:rPr>
-        <w:t>switch (</w:t>
-      </w:r>
-      <w:proofErr w:type="spellStart"/>
-      <w:r>
-        <w:rPr>
-          <w:lang w:val="en-US"/>
-        </w:rPr>
-        <w:t>interfaceType</w:t>
-      </w:r>
-      <w:proofErr w:type="spellEnd"/>
-      <w:r>
-        <w:rPr>
-          <w:lang w:val="en-US"/>
-        </w:rPr>
-        <w:t>) {</w:t>
-      </w:r>
-    </w:p>
-    <w:p>
-      <w:pPr>
-        <w:rPr>
-          <w:lang w:val="en-US"/>
-        </w:rPr>
-      </w:pPr>
-      <w:r>
-        <w:rPr>
-          <w:lang w:val="en-US"/>
-        </w:rPr>
-        <w:t xml:space="preserve">   case "Contact":</w:t>
-      </w:r>
-    </w:p>
-    <w:p>
-      <w:pPr>
-        <w:rPr>
-          <w:lang w:val="en-US"/>
-        </w:rPr>
-      </w:pPr>
-      <w:r>
-        <w:rPr>
-          <w:lang w:val="en-US"/>
-        </w:rPr>
-        <w:t xml:space="preserve">      </w:t>
-      </w:r>
-      <w:proofErr w:type="spellStart"/>
-      <w:r>
-        <w:rPr>
-          <w:lang w:val="en-US"/>
-        </w:rPr>
-        <w:t>cardInit</w:t>
-      </w:r>
-      <w:proofErr w:type="spellEnd"/>
-      <w:r>
-        <w:rPr>
-          <w:lang w:val="en-US"/>
-        </w:rPr>
-        <w:t xml:space="preserve"> = "</w:t>
-      </w:r>
-      <w:proofErr w:type="spellStart"/>
-      <w:r>
-        <w:rPr>
-          <w:lang w:val="en-US"/>
-        </w:rPr>
-        <w:t>my_card</w:t>
-      </w:r>
-      <w:proofErr w:type="spellEnd"/>
-      <w:r>
-        <w:rPr>
-          <w:lang w:val="en-US"/>
-        </w:rPr>
-        <w:t xml:space="preserve"> = </w:t>
-      </w:r>
-      <w:proofErr w:type="gramStart"/>
-      <w:r>
-        <w:rPr>
-          <w:lang w:val="en-US"/>
-        </w:rPr>
-        <w:t>card(</w:t>
-      </w:r>
-      <w:proofErr w:type="gramEnd"/>
-      <w:r>
-        <w:rPr>
-          <w:lang w:val="en-US"/>
-        </w:rPr>
-        <w:t>\"SC1\</w:t>
-      </w:r>
-      <w:proofErr w:type="gramStart"/>
-      <w:r>
-        <w:rPr>
-          <w:lang w:val="en-US"/>
-        </w:rPr>
-        <w:t>",\</w:t>
-      </w:r>
-      <w:proofErr w:type="gramEnd"/>
-      <w:r>
-        <w:rPr>
-          <w:lang w:val="en-US"/>
-        </w:rPr>
-        <w:t>"ISO7816-3\", 1</w:t>
-      </w:r>
-      <w:proofErr w:type="gramStart"/>
-      <w:r>
-        <w:rPr>
-          <w:lang w:val="en-US"/>
-        </w:rPr>
-        <w:t>);</w:t>
-      </w:r>
-      <w:proofErr w:type="spellStart"/>
-      <w:r>
-        <w:rPr>
-          <w:lang w:val="en-US"/>
-        </w:rPr>
-        <w:t>my</w:t>
-      </w:r>
-      <w:proofErr w:type="gramEnd"/>
-      <w:r>
-        <w:rPr>
-          <w:lang w:val="en-US"/>
-        </w:rPr>
-        <w:t>_</w:t>
-      </w:r>
-      <w:proofErr w:type="gramStart"/>
-      <w:r>
-        <w:rPr>
-          <w:lang w:val="en-US"/>
-        </w:rPr>
-        <w:t>card.VccDef</w:t>
-      </w:r>
-      <w:proofErr w:type="spellEnd"/>
-      <w:proofErr w:type="gramEnd"/>
-      <w:r>
-        <w:rPr>
-          <w:lang w:val="en-US"/>
-        </w:rPr>
-        <w:t xml:space="preserve"> (3000</w:t>
-      </w:r>
-      <w:proofErr w:type="gramStart"/>
-      <w:r>
-        <w:rPr>
-          <w:lang w:val="en-US"/>
-        </w:rPr>
-        <w:t>);</w:t>
-      </w:r>
-      <w:proofErr w:type="spellStart"/>
-      <w:r>
-        <w:rPr>
-          <w:lang w:val="en-US"/>
-        </w:rPr>
-        <w:t>my</w:t>
-      </w:r>
-      <w:proofErr w:type="gramEnd"/>
-      <w:r>
-        <w:rPr>
-          <w:lang w:val="en-US"/>
-        </w:rPr>
-        <w:t>_</w:t>
-      </w:r>
-      <w:proofErr w:type="gramStart"/>
-      <w:r>
-        <w:rPr>
-          <w:lang w:val="en-US"/>
-        </w:rPr>
-        <w:t>card.FreqXSet</w:t>
-      </w:r>
-      <w:proofErr w:type="spellEnd"/>
-      <w:proofErr w:type="gramEnd"/>
-      <w:r>
-        <w:rPr>
-          <w:lang w:val="en-US"/>
-        </w:rPr>
-        <w:t>(5000);";</w:t>
-      </w:r>
-    </w:p>
-    <w:p>
-      <w:pPr>
-        <w:rPr>
-          <w:lang w:val="en-US"/>
-        </w:rPr>
-      </w:pPr>
-      <w:r>
-        <w:rPr>
-          <w:lang w:val="en-US"/>
-        </w:rPr>
-        <w:t xml:space="preserve">      break;</w:t>
-      </w:r>
-    </w:p>
-    <w:p>
-      <w:pPr>
-        <w:rPr>
-          <w:lang w:val="en-US"/>
-        </w:rPr>
-      </w:pPr>
-      <w:r>
-        <w:rPr>
-          <w:lang w:val="en-US"/>
-        </w:rPr>
-        <w:t xml:space="preserve">   case "Contactless":</w:t>
-      </w:r>
-    </w:p>
-    <w:p>
-      <w:pPr>
-        <w:rPr>
-          <w:lang w:val="en-US"/>
-        </w:rPr>
-      </w:pPr>
-      <w:r>
-        <w:rPr>
-          <w:lang w:val="en-US"/>
-        </w:rPr>
-        <w:t xml:space="preserve">      throw </w:t>
-      </w:r>
-      <w:proofErr w:type="gramStart"/>
-      <w:r>
-        <w:rPr>
-          <w:lang w:val="en-US"/>
-        </w:rPr>
-        <w:t>Ex::</w:t>
-      </w:r>
-      <w:proofErr w:type="gramEnd"/>
-      <w:r>
-        <w:rPr>
-          <w:lang w:val="en-US"/>
-        </w:rPr>
-        <w:t>Error, 0, "Contactless personalization (ISO14443-A) not supported now\</w:t>
-      </w:r>
-      <w:proofErr w:type="spellStart"/>
-      <w:r>
-        <w:rPr>
-          <w:lang w:val="en-US"/>
-        </w:rPr>
-        <w:t>nInvalid</w:t>
-      </w:r>
-      <w:proofErr w:type="spellEnd"/>
-      <w:r>
-        <w:rPr>
-          <w:lang w:val="en-US"/>
-        </w:rPr>
-        <w:t xml:space="preserve"> reader interface type: " + </w:t>
-      </w:r>
-      <w:proofErr w:type="spellStart"/>
-      <w:r>
-        <w:rPr>
-          <w:lang w:val="en-US"/>
-        </w:rPr>
-        <w:t>interfaceType</w:t>
-      </w:r>
-      <w:proofErr w:type="spellEnd"/>
-      <w:r>
-        <w:rPr>
-          <w:lang w:val="en-US"/>
-        </w:rPr>
-        <w:t>;</w:t>
-      </w:r>
-    </w:p>
-    <w:p>
-      <w:pPr>
-        <w:rPr>
-          <w:lang w:val="en-US"/>
-        </w:rPr>
-      </w:pPr>
-      <w:r>
-        <w:rPr>
-          <w:lang w:val="en-US"/>
-        </w:rPr>
-        <w:t xml:space="preserve">      break;</w:t>
-      </w:r>
-    </w:p>
-    <w:p>
-      <w:pPr>
-        <w:rPr>
-          <w:lang w:val="en-US"/>
-        </w:rPr>
-      </w:pPr>
-      <w:r>
-        <w:rPr>
-          <w:lang w:val="en-US"/>
-        </w:rPr>
-        <w:t xml:space="preserve">   default:</w:t>
-      </w:r>
-    </w:p>
-    <w:p>
-      <w:pPr>
-        <w:rPr>
-          <w:lang w:val="en-US"/>
-        </w:rPr>
-      </w:pPr>
-      <w:r>
-        <w:rPr>
-          <w:lang w:val="en-US"/>
-        </w:rPr>
-        <w:t xml:space="preserve">      throw </w:t>
-      </w:r>
-      <w:proofErr w:type="gramStart"/>
-      <w:r>
-        <w:rPr>
-          <w:lang w:val="en-US"/>
-        </w:rPr>
-        <w:t>Ex::</w:t>
-      </w:r>
-      <w:proofErr w:type="gramEnd"/>
-      <w:r>
-        <w:rPr>
-          <w:lang w:val="en-US"/>
-        </w:rPr>
-        <w:t>Error, 0, "Invalid reader int</w:t>
-      </w:r>
-      <w:r>
-        <w:rPr>
-          <w:lang w:val="en-US"/>
-        </w:rPr>
-        <w:t xml:space="preserve">erface type: " + </w:t>
-      </w:r>
-      <w:proofErr w:type="spellStart"/>
-      <w:r>
-        <w:rPr>
-          <w:lang w:val="en-US"/>
-        </w:rPr>
-        <w:t>interfaceType</w:t>
-      </w:r>
-      <w:proofErr w:type="spellEnd"/>
-      <w:r>
-        <w:rPr>
-          <w:lang w:val="en-US"/>
-        </w:rPr>
-        <w:t>;</w:t>
-      </w:r>
-    </w:p>
-    <w:p>
-      <w:pPr>
-        <w:rPr>
-          <w:lang w:val="en-US"/>
-        </w:rPr>
-      </w:pPr>
-      <w:r>
-        <w:rPr>
-          <w:lang w:val="en-US"/>
-        </w:rPr>
-        <w:t>}</w:t>
-      </w:r>
-    </w:p>
-    <w:p>
-      <w:pPr>
-        <w:rPr>
-          <w:lang w:val="en-US"/>
-        </w:rPr>
-      </w:pPr>
-      <w:r>
-        <w:rPr>
-          <w:lang w:val="en-US"/>
-        </w:rPr>
-        <w:t>req = "</w:t>
-      </w:r>
-      <w:proofErr w:type="spellStart"/>
-      <w:r>
-        <w:rPr>
-          <w:lang w:val="en-US"/>
-        </w:rPr>
-        <w:t>my_</w:t>
-      </w:r>
-      <w:proofErr w:type="gramStart"/>
-      <w:r>
-        <w:rPr>
-          <w:lang w:val="en-US"/>
-        </w:rPr>
-        <w:t>card</w:t>
-      </w:r>
-      <w:proofErr w:type="spellEnd"/>
-      <w:r>
-        <w:rPr>
-          <w:lang w:val="en-US"/>
-        </w:rPr>
-        <w:t>:=0;where(){</w:t>
-      </w:r>
-      <w:proofErr w:type="spellStart"/>
-      <w:r>
-        <w:rPr>
-          <w:lang w:val="en-US"/>
-        </w:rPr>
-        <w:t>flow.Throw</w:t>
-      </w:r>
-      <w:proofErr w:type="spellEnd"/>
-      <w:proofErr w:type="gramEnd"/>
-      <w:r>
-        <w:rPr>
-          <w:lang w:val="en-US"/>
-        </w:rPr>
-        <w:t xml:space="preserve">(0, "");" + </w:t>
-      </w:r>
-      <w:proofErr w:type="spellStart"/>
-      <w:r>
-        <w:rPr>
-          <w:lang w:val="en-US"/>
-        </w:rPr>
-        <w:t>cardInit</w:t>
-      </w:r>
-      <w:proofErr w:type="spellEnd"/>
-      <w:r>
-        <w:rPr>
-          <w:lang w:val="en-US"/>
-        </w:rPr>
-        <w:t xml:space="preserve"> + "</w:t>
-      </w:r>
-      <w:proofErr w:type="spellStart"/>
-      <w:r>
-        <w:rPr>
-          <w:lang w:val="en-US"/>
-        </w:rPr>
-        <w:t>my_</w:t>
-      </w:r>
-      <w:proofErr w:type="gramStart"/>
-      <w:r>
-        <w:rPr>
-          <w:lang w:val="en-US"/>
-        </w:rPr>
-        <w:t>card.Reset</w:t>
-      </w:r>
-      <w:proofErr w:type="spellEnd"/>
-      <w:proofErr w:type="gramEnd"/>
-      <w:r>
-        <w:rPr>
-          <w:lang w:val="en-US"/>
-        </w:rPr>
-        <w:t>(</w:t>
-      </w:r>
-      <w:proofErr w:type="gramStart"/>
-      <w:r>
-        <w:rPr>
-          <w:lang w:val="en-US"/>
-        </w:rPr>
-        <w:t>).Hex</w:t>
-      </w:r>
-      <w:proofErr w:type="gramEnd"/>
-      <w:r>
-        <w:rPr>
-          <w:lang w:val="en-US"/>
-        </w:rPr>
-        <w:t>}\0";</w:t>
-      </w:r>
-    </w:p>
-    <w:p>
-      <w:r>
-        <w:rPr>
-          <w:lang w:val="en-US"/>
-        </w:rPr>
-        <w:t>str</w:t>
-      </w:r>
-      <w:r>
-        <w:t xml:space="preserve"> </w:t>
-      </w:r>
-      <w:r>
-        <w:rPr>
-          <w:lang w:val="en-US"/>
-        </w:rPr>
-        <w:t>ATR</w:t>
-      </w:r>
-      <w:r>
-        <w:t xml:space="preserve"> = </w:t>
-      </w:r>
-      <w:proofErr w:type="spellStart"/>
-      <w:r>
-        <w:rPr>
-          <w:lang w:val="en-US"/>
-        </w:rPr>
-        <w:t>TCPSend</w:t>
-      </w:r>
-      <w:proofErr w:type="spellEnd"/>
-      <w:r>
-        <w:t>(</w:t>
-      </w:r>
-      <w:r>
-        <w:rPr>
-          <w:lang w:val="en-US"/>
-        </w:rPr>
-        <w:t>req</w:t>
-      </w:r>
-      <w:r>
-        <w:t>);</w:t>
-      </w:r>
-    </w:p>
-    <w:p>
-      <w:pPr>
-        <w:ind w:firstLine="0"/>
-        <w:jc w:val="left"/>
       </w:pPr>
       <w:r>
         <w:br w:type="page"/>
@@ -27932,6 +28046,11 @@
       </w:pPr>
     </w:p>
     <w:p>
+      <w:pPr>
+        <w:rPr>
+          <w:lang w:val="en-US"/>
+        </w:rPr>
+      </w:pPr>
       <w:r>
         <w:rPr>
           <w:lang w:val="en-US"/>
@@ -27939,7 +28058,13 @@
         <w:t>return res;</w:t>
       </w:r>
     </w:p>
-    <w:p/>
+    <w:p>
+      <w:pPr>
+        <w:rPr>
+          <w:lang w:val="en-US"/>
+        </w:rPr>
+      </w:pPr>
+    </w:p>
     <w:p>
       <w:pPr>
         <w:rPr>
@@ -35007,7 +35132,6 @@
   <w:style w:type="character" w:default="1" w:styleId="DefaultParagraphFont">
     <w:name w:val="Default Paragraph Font"/>
     <w:uiPriority w:val="1"/>
-    <w:semiHidden/>
     <w:unhideWhenUsed/>
   </w:style>
   <w:style w:type="table" w:default="1" w:styleId="TableNormal">

</xml_diff>